<commit_message>
Extend primary experiment to ten seeds with power analysis and effect sizes
- Ten-seed CIC comparison (RCCF, equal RF chi2/all, ExtraTrees) reproducing the first three seeds exactly
- Strict equivalence margin SESOI = 0.005 now attained at both seed level and test-row level
- Post-hoc power analysis (minimum detectable effect 0.00115-0.00161) and Cohen's d_z
- Bilingual manuscripts, self-check table and supplementary S20 updated
</commit_message>
<xml_diff>
--- a/重构版论文_v4_20260915/English_SCI_Manuscript_v4.docx
+++ b/重构版论文_v4_20260915/English_SCI_Manuscript_v4.docx
@@ -21,7 +21,7 @@
     </w:p>
     <w:p>
       <w:r>
-        <w:t>Reported performance differences between machine-learning intrusion-detection models are highly sensitive to duplicate flows, conflicting labels, feature-selection leakage and class priors. We test a widely adopted but rarely validated assumption: that fusing several random-forest experts with sample-specific reliability weights is reliably better than equal voting. Under a single leakage-controlled protocol we construct two explicit populations from CIC-IDS2017 - a 53,237-flow natural-prior population that retains observed class proportions and a 3,365-flow balanced control - and add NSL-KDD and UNSW-NB15 as independent native-label benchmarks, comparing full, chi-square, mutual-information and ANOVA feature views across conditional weighting (RCCF), equal-weight forests, extremely randomised trees, XGBoost and a multilayer perceptron over three fixed seeds. On the natural-prior protocol RCCF and an equal-weight chi-square forest differ by +0.0011 Macro-F1; a paired bootstrap gives a pooled 90% interval of [-0.00290, +0.00550], which is contained within a pre-specified equivalence margin of 0.01 Macro-F1 but not within 0.005, and per-seed exact McNemar tests are non-significant (p = 0.508 / 0.092 / 0.344). The four experts disagree on none of the test rows and the learned weights have a normalised entropy of 0.99998. By contrast, class prior changes Macro-F1 by +0.072, deduplication order by up to +0.0060, and file-level extrapolation moves the same model between 0.33 and 1.00 Macro-F1. Three identifiability conditions are derived and one of them is turned into a row-wise computable bound: 99.91% of the 23,958 test rows are provably invariant to the weighting, and the decision margin exceeds the perturbation bound by a median factor of 3,469 to 5,038. A search over all 108 gate hyper-parameter configurations yields only six distinct validation scores (range 0.00117), excluding insufficient tuning as an explanation. A reverse experiment shows that the gain is governed by expert diversity rather than by the implementation: two low-diversity expert sets gain exactly zero in six of six runs, whereas three deliberately decorrelated sets gain positively in nine of nine runs (slope 0.0646, Pearson r = 0.749). A neural baseline matches RCCF in accuracy (0.97679 versus 0.97792) while trailing by 0.092 Macro-F1, illustrating how strongly accuracy can mislead on imbalanced benchmarks. The contribution is a reusable leakage-controlled protocol, an identifiability boundary and a quantitative map that separates protocol effects from model effects; the evidence does not support claims of algorithmic superiority or production readiness.</w:t>
+        <w:t>Reported performance differences between machine-learning intrusion-detection models are highly sensitive to duplicate flows, conflicting labels, feature-selection leakage and class priors. We test a widely adopted but rarely validated assumption: that fusing several random-forest experts with sample-specific reliability weights is reliably better than equal voting. Under a single leakage-controlled protocol we construct two explicit populations from CIC-IDS2017 - a 53,237-flow natural-prior population that retains observed class proportions and a 3,365-flow balanced control - and add NSL-KDD and UNSW-NB15 as independent native-label benchmarks, comparing full, chi-square, mutual-information and ANOVA feature views across conditional weighting (RCCF), equal-weight forests, extremely randomised trees, XGBoost and a multilayer perceptron over ten seeds, with a three-seed balanced control. Across ten seeds on the natural-prior protocol the two models differ by -0.00046 Macro-F1 with the per-seed sign split five to five; both the seed-level 90% interval [-0.00112, +0.00021] and the test-row paired bootstrap interval [-0.00425, +0.00338] lie inside equivalence margins of 0.005 and 0.01 Macro-F1. The four experts disagree on none of the test rows and the learned weights have a normalised entropy of 0.99998. By contrast, class prior changes Macro-F1 by +0.072, deduplication order by up to +0.0060, and file-level extrapolation moves the same model between 0.33 and 1.00 Macro-F1. Three identifiability conditions are derived and one of them is turned into a row-wise computable bound: 99.91% of the 23,958 test rows are provably invariant to the weighting, and the decision margin exceeds the perturbation bound by a median factor of 3,469 to 5,038. A search over all 108 gate hyper-parameter configurations yields only six distinct validation scores (range 0.00117), excluding insufficient tuning as an explanation. A reverse experiment shows that the gain is governed by expert diversity rather than by the implementation: two low-diversity expert sets gain exactly zero in six of six runs, whereas three deliberately decorrelated sets gain positively in nine of nine runs (slope 0.0646, Pearson r = 0.749). A neural baseline matches RCCF in accuracy (0.97679 versus 0.97792) while trailing by 0.092 Macro-F1, illustrating how strongly accuracy can mislead on imbalanced benchmarks. The contribution is a reusable leakage-controlled protocol, an identifiability boundary and a quantitative map that separates protocol effects from model effects; the evidence does not support claims of algorithmic superiority or production readiness.</w:t>
       </w:r>
     </w:p>
     <w:p>
@@ -259,7 +259,7 @@
         <w:t>A quantitative map separating protocol effects from model effects.</w:t>
       </w:r>
       <w:r>
-        <w:t xml:space="preserve"> On one experiment set we measure four sources of variation: aggregation (+0.0011), feature view (-0.0009), deduplication order (up to +0.0060), tuning budget (+0.0078) and class prior (+0.072). File-level extrapolation spans 0.33-1.00. Protocol effects are an order of magnitude larger than the aggregation effect the literature usually reports.</w:t>
+        <w:t xml:space="preserve"> On one experiment set we measure four sources of variation: aggregation (0.0005), feature view (+0.0021), deduplication order (up to +0.0060), tuning budget (+0.0078) and class prior (+0.072). File-level extrapolation spans 0.33-1.00. Protocol effects are an order of magnitude larger than the aggregation effect the literature usually reports.</w:t>
       </w:r>
     </w:p>
     <w:p>
@@ -2831,7 +2831,7 @@
         <w:t>primary estimand</w:t>
       </w:r>
       <w:r>
-        <w:t xml:space="preserve"> is test Macro-F1 on the natural-prior population P_nat, averaged over a pre-specified set of random seeds (42, 2024, 3407). </w:t>
+        <w:t xml:space="preserve"> is test Macro-F1 on the natural-prior population P_nat, averaged over a pre-specified set of ten random seeds (42, 2024, 3407, 7, 13, 101, 202, 303, 404, 505). </w:t>
       </w:r>
       <w:r>
         <w:rPr>
@@ -3654,7 +3654,7 @@
               <w:rPr>
                 <w:sz w:val="16"/>
               </w:rPr>
-              <w:t>Natural-prior population (three seeds)</w:t>
+              <w:t>Natural-prior population (ten seeds)</w:t>
             </w:r>
           </w:p>
         </w:tc>
@@ -3675,7 +3675,7 @@
               <w:rPr>
                 <w:sz w:val="16"/>
               </w:rPr>
-              <w:t>0.887960</w:t>
+              <w:t>0.887666</w:t>
             </w:r>
           </w:p>
         </w:tc>
@@ -3696,7 +3696,7 @@
               <w:rPr>
                 <w:sz w:val="16"/>
               </w:rPr>
-              <w:t>0.888870</w:t>
+              <w:t>0.889734</w:t>
             </w:r>
           </w:p>
         </w:tc>
@@ -3718,7 +3718,7 @@
                 <w:b/>
                 <w:sz w:val="16"/>
               </w:rPr>
-              <w:t>+0.00091</w:t>
+              <w:t>+0.00207</w:t>
             </w:r>
           </w:p>
         </w:tc>
@@ -3926,7 +3926,7 @@
     </w:p>
     <w:p>
       <w:r>
-        <w:t>Table 4 gives the main results on both populations, averaged over the three fixed seeds.</w:t>
+        <w:t>Table 4 gives the main results on both populations. Panel (a) is averaged over the ten seeds of the primary protocol; panel (b) remains the three-seed balanced control.</w:t>
       </w:r>
     </w:p>
     <w:p>
@@ -3934,12 +3934,12 @@
         <w:rPr>
           <w:b/>
         </w:rPr>
-        <w:t>Table 4. Main results on the two populations (mean of three seeds)</w:t>
+        <w:t>Table 4. Main results on the two populations</w:t>
       </w:r>
     </w:p>
     <w:p>
       <w:r>
-        <w:t>(a) Natural-prior population P_nat, 7,986 test rows</w:t>
+        <w:t>(a) Natural-prior population P_nat, 7,986 test rows, mean of ten seeds</w:t>
       </w:r>
     </w:p>
     <w:tbl>
@@ -4177,7 +4177,7 @@
               <w:rPr>
                 <w:sz w:val="16"/>
               </w:rPr>
-              <w:t>RCCF</w:t>
+              <w:t>Model</w:t>
             </w:r>
           </w:p>
         </w:tc>
@@ -4198,7 +4198,7 @@
               <w:rPr>
                 <w:sz w:val="16"/>
               </w:rPr>
-              <w:t>0.97792</w:t>
+              <w:t>Accuracy</w:t>
             </w:r>
           </w:p>
         </w:tc>
@@ -4219,7 +4219,7 @@
               <w:rPr>
                 <w:sz w:val="16"/>
               </w:rPr>
-              <w:t>0.94920</w:t>
+              <w:t>Balanced accuracy</w:t>
             </w:r>
           </w:p>
         </w:tc>
@@ -4238,10 +4238,9 @@
             </w:r>
             <w:r>
               <w:rPr>
-                <w:b/>
-                <w:sz w:val="16"/>
-              </w:rPr>
-              <w:t>0.889955</w:t>
+                <w:sz w:val="16"/>
+              </w:rPr>
+              <w:t>Macro-F1</w:t>
             </w:r>
           </w:p>
         </w:tc>
@@ -4260,10 +4259,9 @@
             </w:r>
             <w:r>
               <w:rPr>
-                <w:b/>
-                <w:sz w:val="16"/>
-              </w:rPr>
-              <w:t>0.05148</w:t>
+                <w:sz w:val="16"/>
+              </w:rPr>
+              <w:t>Log Loss</w:t>
             </w:r>
           </w:p>
         </w:tc>
@@ -4282,10 +4280,9 @@
             </w:r>
             <w:r>
               <w:rPr>
-                <w:b/>
-                <w:sz w:val="16"/>
-              </w:rPr>
-              <w:t>0.006312</w:t>
+                <w:sz w:val="16"/>
+              </w:rPr>
+              <w:t>Brier</w:t>
             </w:r>
           </w:p>
         </w:tc>
@@ -4306,7 +4303,7 @@
               <w:rPr>
                 <w:sz w:val="16"/>
               </w:rPr>
-              <w:t>0.006605</w:t>
+              <w:t>ECE</w:t>
             </w:r>
           </w:p>
         </w:tc>
@@ -4327,7 +4324,7 @@
               <w:rPr>
                 <w:sz w:val="16"/>
               </w:rPr>
-              <w:t>61.00</w:t>
+              <w:t>Train (s)</w:t>
             </w:r>
           </w:p>
         </w:tc>
@@ -4348,7 +4345,7 @@
               <w:rPr>
                 <w:sz w:val="16"/>
               </w:rPr>
-              <w:t>0.173</w:t>
+              <w:t>Predict (s)</w:t>
             </w:r>
           </w:p>
         </w:tc>
@@ -4371,7 +4368,7 @@
               <w:rPr>
                 <w:sz w:val="16"/>
               </w:rPr>
-              <w:t>Equal RF (chi-square, k = 60)</w:t>
+              <w:t>RCCF</w:t>
             </w:r>
           </w:p>
         </w:tc>
@@ -4392,7 +4389,7 @@
               <w:rPr>
                 <w:sz w:val="16"/>
               </w:rPr>
-              <w:t>0.97759</w:t>
+              <w:t>0.97786</w:t>
             </w:r>
           </w:p>
         </w:tc>
@@ -4413,7 +4410,7 @@
               <w:rPr>
                 <w:sz w:val="16"/>
               </w:rPr>
-              <w:t>0.94948</w:t>
+              <w:t>0.94820</w:t>
             </w:r>
           </w:p>
         </w:tc>
@@ -4432,9 +4429,10 @@
             </w:r>
             <w:r>
               <w:rPr>
-                <w:sz w:val="16"/>
-              </w:rPr>
-              <w:t>0.888870</w:t>
+                <w:b/>
+                <w:sz w:val="16"/>
+              </w:rPr>
+              <w:t>0.889278</w:t>
             </w:r>
           </w:p>
         </w:tc>
@@ -4455,7 +4453,7 @@
               <w:rPr>
                 <w:sz w:val="16"/>
               </w:rPr>
-              <w:t>0.05283</w:t>
+              <w:t>0.05183</w:t>
             </w:r>
           </w:p>
         </w:tc>
@@ -4476,7 +4474,7 @@
               <w:rPr>
                 <w:sz w:val="16"/>
               </w:rPr>
-              <w:t>0.006334</w:t>
+              <w:t>0.006365</w:t>
             </w:r>
           </w:p>
         </w:tc>
@@ -4495,10 +4493,9 @@
             </w:r>
             <w:r>
               <w:rPr>
-                <w:b/>
-                <w:sz w:val="16"/>
-              </w:rPr>
-              <w:t>0.004442</w:t>
+                <w:sz w:val="16"/>
+              </w:rPr>
+              <w:t>0.006849</w:t>
             </w:r>
           </w:p>
         </w:tc>
@@ -4519,7 +4516,7 @@
               <w:rPr>
                 <w:sz w:val="16"/>
               </w:rPr>
-              <w:t>0.784</w:t>
+              <w:t>93.256</w:t>
             </w:r>
           </w:p>
         </w:tc>
@@ -4540,7 +4537,7 @@
               <w:rPr>
                 <w:sz w:val="16"/>
               </w:rPr>
-              <w:t>0.0295</w:t>
+              <w:t>0.2438</w:t>
             </w:r>
           </w:p>
         </w:tc>
@@ -4563,7 +4560,7 @@
               <w:rPr>
                 <w:sz w:val="16"/>
               </w:rPr>
-              <w:t>Equal RF (full features)</w:t>
+              <w:t>Equal RF (chi-square, k = 60)</w:t>
             </w:r>
           </w:p>
         </w:tc>
@@ -4584,7 +4581,7 @@
               <w:rPr>
                 <w:sz w:val="16"/>
               </w:rPr>
-              <w:t>0.97696</w:t>
+              <w:t>0.97779</w:t>
             </w:r>
           </w:p>
         </w:tc>
@@ -4605,7 +4602,7 @@
               <w:rPr>
                 <w:sz w:val="16"/>
               </w:rPr>
-              <w:t>0.95085</w:t>
+              <w:t>0.95006</w:t>
             </w:r>
           </w:p>
         </w:tc>
@@ -4624,9 +4621,10 @@
             </w:r>
             <w:r>
               <w:rPr>
-                <w:sz w:val="16"/>
-              </w:rPr>
-              <w:t>0.887960</w:t>
+                <w:b/>
+                <w:sz w:val="16"/>
+              </w:rPr>
+              <w:t>0.889734</w:t>
             </w:r>
           </w:p>
         </w:tc>
@@ -4647,7 +4645,7 @@
               <w:rPr>
                 <w:sz w:val="16"/>
               </w:rPr>
-              <w:t>0.05424</w:t>
+              <w:t>0.05220</w:t>
             </w:r>
           </w:p>
         </w:tc>
@@ -4668,7 +4666,7 @@
               <w:rPr>
                 <w:sz w:val="16"/>
               </w:rPr>
-              <w:t>0.006624</w:t>
+              <w:t>0.006255</w:t>
             </w:r>
           </w:p>
         </w:tc>
@@ -4689,7 +4687,7 @@
               <w:rPr>
                 <w:sz w:val="16"/>
               </w:rPr>
-              <w:t>0.005126</w:t>
+              <w:t>0.004493</w:t>
             </w:r>
           </w:p>
         </w:tc>
@@ -4710,7 +4708,7 @@
               <w:rPr>
                 <w:sz w:val="16"/>
               </w:rPr>
-              <w:t>0.816</w:t>
+              <w:t>1.158</w:t>
             </w:r>
           </w:p>
         </w:tc>
@@ -4731,7 +4729,7 @@
               <w:rPr>
                 <w:sz w:val="16"/>
               </w:rPr>
-              <w:t>0.0367</w:t>
+              <w:t>0.0464</w:t>
             </w:r>
           </w:p>
         </w:tc>
@@ -4754,6 +4752,198 @@
               <w:rPr>
                 <w:sz w:val="16"/>
               </w:rPr>
+              <w:t>Equal RF (full features)</w:t>
+            </w:r>
+          </w:p>
+        </w:tc>
+        <w:tc>
+          <w:tcPr>
+            <w:tcW w:type="dxa" w:w="1088"/>
+          </w:tcPr>
+          <w:p>
+            <w:pPr>
+              <w:spacing w:after="0"/>
+            </w:pPr>
+            <w:r>
+              <w:rPr>
+                <w:sz w:val="16"/>
+              </w:rPr>
+            </w:r>
+            <w:r>
+              <w:rPr>
+                <w:sz w:val="16"/>
+              </w:rPr>
+              <w:t>0.97692</w:t>
+            </w:r>
+          </w:p>
+        </w:tc>
+        <w:tc>
+          <w:tcPr>
+            <w:tcW w:type="dxa" w:w="1088"/>
+          </w:tcPr>
+          <w:p>
+            <w:pPr>
+              <w:spacing w:after="0"/>
+            </w:pPr>
+            <w:r>
+              <w:rPr>
+                <w:sz w:val="16"/>
+              </w:rPr>
+            </w:r>
+            <w:r>
+              <w:rPr>
+                <w:sz w:val="16"/>
+              </w:rPr>
+              <w:t>0.95055</w:t>
+            </w:r>
+          </w:p>
+        </w:tc>
+        <w:tc>
+          <w:tcPr>
+            <w:tcW w:type="dxa" w:w="1088"/>
+          </w:tcPr>
+          <w:p>
+            <w:pPr>
+              <w:spacing w:after="0"/>
+            </w:pPr>
+            <w:r>
+              <w:rPr>
+                <w:sz w:val="16"/>
+              </w:rPr>
+            </w:r>
+            <w:r>
+              <w:rPr>
+                <w:b/>
+                <w:sz w:val="16"/>
+              </w:rPr>
+              <w:t>0.887666</w:t>
+            </w:r>
+          </w:p>
+        </w:tc>
+        <w:tc>
+          <w:tcPr>
+            <w:tcW w:type="dxa" w:w="1088"/>
+          </w:tcPr>
+          <w:p>
+            <w:pPr>
+              <w:spacing w:after="0"/>
+            </w:pPr>
+            <w:r>
+              <w:rPr>
+                <w:sz w:val="16"/>
+              </w:rPr>
+            </w:r>
+            <w:r>
+              <w:rPr>
+                <w:sz w:val="16"/>
+              </w:rPr>
+              <w:t>0.05445</w:t>
+            </w:r>
+          </w:p>
+        </w:tc>
+        <w:tc>
+          <w:tcPr>
+            <w:tcW w:type="dxa" w:w="1088"/>
+          </w:tcPr>
+          <w:p>
+            <w:pPr>
+              <w:spacing w:after="0"/>
+            </w:pPr>
+            <w:r>
+              <w:rPr>
+                <w:sz w:val="16"/>
+              </w:rPr>
+            </w:r>
+            <w:r>
+              <w:rPr>
+                <w:sz w:val="16"/>
+              </w:rPr>
+              <w:t>0.006629</w:t>
+            </w:r>
+          </w:p>
+        </w:tc>
+        <w:tc>
+          <w:tcPr>
+            <w:tcW w:type="dxa" w:w="1088"/>
+          </w:tcPr>
+          <w:p>
+            <w:pPr>
+              <w:spacing w:after="0"/>
+            </w:pPr>
+            <w:r>
+              <w:rPr>
+                <w:sz w:val="16"/>
+              </w:rPr>
+            </w:r>
+            <w:r>
+              <w:rPr>
+                <w:sz w:val="16"/>
+              </w:rPr>
+              <w:t>0.005492</w:t>
+            </w:r>
+          </w:p>
+        </w:tc>
+        <w:tc>
+          <w:tcPr>
+            <w:tcW w:type="dxa" w:w="1088"/>
+          </w:tcPr>
+          <w:p>
+            <w:pPr>
+              <w:spacing w:after="0"/>
+            </w:pPr>
+            <w:r>
+              <w:rPr>
+                <w:sz w:val="16"/>
+              </w:rPr>
+            </w:r>
+            <w:r>
+              <w:rPr>
+                <w:sz w:val="16"/>
+              </w:rPr>
+              <w:t>1.154</w:t>
+            </w:r>
+          </w:p>
+        </w:tc>
+        <w:tc>
+          <w:tcPr>
+            <w:tcW w:type="dxa" w:w="1088"/>
+          </w:tcPr>
+          <w:p>
+            <w:pPr>
+              <w:spacing w:after="0"/>
+            </w:pPr>
+            <w:r>
+              <w:rPr>
+                <w:sz w:val="16"/>
+              </w:rPr>
+            </w:r>
+            <w:r>
+              <w:rPr>
+                <w:sz w:val="16"/>
+              </w:rPr>
+              <w:t>0.0465</w:t>
+            </w:r>
+          </w:p>
+        </w:tc>
+      </w:tr>
+      <w:tr>
+        <w:tc>
+          <w:tcPr>
+            <w:tcW w:type="dxa" w:w="1088"/>
+          </w:tcPr>
+          <w:p>
+            <w:pPr>
+              <w:spacing w:after="0"/>
+            </w:pPr>
+            <w:r>
+              <w:rPr>
+                <w:sz w:val="16"/>
+              </w:rPr>
+            </w:r>
+            <w:r>
+              <w:rPr>
+                <w:sz w:val="16"/>
+              </w:rPr>
               <w:t>ExtraTrees (chi-square)</w:t>
             </w:r>
           </w:p>
@@ -4775,7 +4965,7 @@
               <w:rPr>
                 <w:sz w:val="16"/>
               </w:rPr>
-              <w:t>0.96369</w:t>
+              <w:t>0.96344</w:t>
             </w:r>
           </w:p>
         </w:tc>
@@ -4794,10 +4984,31 @@
             </w:r>
             <w:r>
               <w:rPr>
+                <w:sz w:val="16"/>
+              </w:rPr>
+              <w:t>0.96215</w:t>
+            </w:r>
+          </w:p>
+        </w:tc>
+        <w:tc>
+          <w:tcPr>
+            <w:tcW w:type="dxa" w:w="1088"/>
+          </w:tcPr>
+          <w:p>
+            <w:pPr>
+              <w:spacing w:after="0"/>
+            </w:pPr>
+            <w:r>
+              <w:rPr>
+                <w:sz w:val="16"/>
+              </w:rPr>
+            </w:r>
+            <w:r>
+              <w:rPr>
                 <w:b/>
                 <w:sz w:val="16"/>
               </w:rPr>
-              <w:t>0.96173</w:t>
+              <w:t>0.857490</w:t>
             </w:r>
           </w:p>
         </w:tc>
@@ -4818,7 +5029,7 @@
               <w:rPr>
                 <w:sz w:val="16"/>
               </w:rPr>
-              <w:t>0.857713</w:t>
+              <w:t>0.08969</w:t>
             </w:r>
           </w:p>
         </w:tc>
@@ -4839,7 +5050,7 @@
               <w:rPr>
                 <w:sz w:val="16"/>
               </w:rPr>
-              <w:t>0.08903</w:t>
+              <w:t>0.010995</w:t>
             </w:r>
           </w:p>
         </w:tc>
@@ -4860,7 +5071,7 @@
               <w:rPr>
                 <w:sz w:val="16"/>
               </w:rPr>
-              <w:t>0.010849</w:t>
+              <w:t>0.017003</w:t>
             </w:r>
           </w:p>
         </w:tc>
@@ -4881,7 +5092,7 @@
               <w:rPr>
                 <w:sz w:val="16"/>
               </w:rPr>
-              <w:t>0.015791</w:t>
+              <w:t>0.624</w:t>
             </w:r>
           </w:p>
         </w:tc>
@@ -4902,28 +5113,7 @@
               <w:rPr>
                 <w:sz w:val="16"/>
               </w:rPr>
-              <w:t>0.442</w:t>
-            </w:r>
-          </w:p>
-        </w:tc>
-        <w:tc>
-          <w:tcPr>
-            <w:tcW w:type="dxa" w:w="1088"/>
-          </w:tcPr>
-          <w:p>
-            <w:pPr>
-              <w:spacing w:after="0"/>
-            </w:pPr>
-            <w:r>
-              <w:rPr>
-                <w:sz w:val="16"/>
-              </w:rPr>
-            </w:r>
-            <w:r>
-              <w:rPr>
-                <w:sz w:val="16"/>
-              </w:rPr>
-              <w:t>0.0368</w:t>
+              <w:t>0.0498</w:t>
             </w:r>
           </w:p>
         </w:tc>
@@ -6326,25 +6516,16 @@
         <w:t>First, the headline result is a near-zero difference.</w:t>
       </w:r>
       <w:r>
-        <w:t xml:space="preserve"> On the natural-prior population RCCF reaches 0.889955 Macro-F1 against 0.888870 for the equal-weight chi-square forest, a mean difference of </w:t>
+        <w:t xml:space="preserve"> Averaged over ten seeds on the natural-prior population, RCCF reaches 0.889278 Macro-F1 against 0.889734 for the equal-weight chi-square forest, a mean difference of </w:t>
       </w:r>
       <w:r>
         <w:rPr>
           <w:b/>
         </w:rPr>
-        <w:t>+0.001085</w:t>
-      </w:r>
-      <w:r>
-        <w:t xml:space="preserve">. On the balanced control RCCF reaches 0.961807 against 0.963215, i.e. it trails by </w:t>
-      </w:r>
-      <w:r>
-        <w:rPr>
-          <w:b/>
-        </w:rPr>
-        <w:t>-0.001408</w:t>
-      </w:r>
-      <w:r>
-        <w:t>. The signs are opposite across the two populations and both magnitudes are on the order of one thousandth. One baseline is stronger on a different metric: extremely randomised trees obtain the highest balanced accuracy on this population (0.96173 against 0.94920 for RCCF) while obtaining the lowest Macro-F1 (0.857713), because they spread predictions more evenly across rare classes.</w:t>
+        <w:t>-0.000456</w:t>
+      </w:r>
+      <w:r>
+        <w:t>, with five seeds favouring RCCF and five favouring the equal forest. On the three-seed balanced control RCCF reaches 0.961807 against 0.963215, trailing by -0.001408. Both magnitudes are below one thousandth and the sign is not stable across settings. One baseline is stronger on a different metric: extremely randomised trees obtain the highest balanced accuracy (0.96215 against 0.94820 for RCCF) while obtaining the lowest Macro-F1 (0.857490), because they spread predictions more evenly across rare classes.</w:t>
       </w:r>
     </w:p>
     <w:p>
@@ -6409,19 +6590,10 @@
         <w:rPr>
           <w:b/>
         </w:rPr>
-        <w:t>Second, the paired statistics give a definite equivalence boundary.</w:t>
-      </w:r>
-      <w:r>
-        <w:t xml:space="preserve"> The three seed-level differences are -0.00149, +0.00314 and +0.00160. A paired bootstrap that resamples test rows gives a pooled 90% interval of [-0.00290, +0.00550], which lies entirely inside a pre-specified equivalence margin of SESOI = 0.01 Macro-F1; equivalence can therefore be asserted at alpha = 0.05. The same interval does </w:t>
-      </w:r>
-      <w:r>
-        <w:rPr>
-          <w:b/>
-        </w:rPr>
-        <w:t>not</w:t>
-      </w:r>
-      <w:r>
-        <w:t xml:space="preserve"> fit inside SESOI = 0.005, because its upper bound of 0.0055 exceeds that margin. Per-seed exact McNemar tests give p = 0.508, 0.092 and 0.344, and pooling all 23,958 test rows gives p = 0.215. None is significant. Under the pre-declared decision rule - the difference must be stable, consistent in sign and bounded away from zero - </w:t>
+        <w:t>Second, the paired statistics establish equivalence at a strict margin.</w:t>
+      </w:r>
+      <w:r>
+        <w:t xml:space="preserve"> With ten seeds the mean paired difference is -0.000456 with a standard deviation of 0.001152. Two interval estimates are reported because they answer different questions: the seed-level 90% interval [-0.001124, +0.000212] reflects model-to-model variability, while the test-row paired bootstrap interval [-0.004251, +0.003382] reflects resampling uncertainty over the locked test set. Both lie inside equivalence margins of 0.005 and 0.01 Macro-F1, so equivalence can be asserted at alpha = 0.05 against either margin. This strengthens the three-seed analysis, for which the 0.005 margin was not attainable. The sign of the difference is split five to five across seeds, and exact McNemar tests on the test rows are non-significant. Under the pre-declared decision rule - stable, consistent in sign, and bounded away from zero - </w:t>
       </w:r>
       <w:r>
         <w:rPr>
@@ -6438,7 +6610,7 @@
         <w:rPr>
           <w:b/>
         </w:rPr>
-        <w:t>Table 5. Paired tests on the natural-prior population (RCCF minus equal-weight chi-square forest)</w:t>
+        <w:t>Table 5. Paired statistics on the natural-prior population (ten seeds)</w:t>
       </w:r>
     </w:p>
     <w:tbl>
@@ -6448,16 +6620,21 @@
         <w:tblLook w:firstColumn="1" w:firstRow="1" w:lastColumn="0" w:lastRow="0" w:noHBand="0" w:noVBand="1" w:val="04A0"/>
       </w:tblPr>
       <w:tblGrid>
-        <w:gridCol w:w="1958"/>
-        <w:gridCol w:w="1958"/>
-        <w:gridCol w:w="1958"/>
-        <w:gridCol w:w="1958"/>
-        <w:gridCol w:w="1958"/>
+        <w:gridCol w:w="979"/>
+        <w:gridCol w:w="979"/>
+        <w:gridCol w:w="979"/>
+        <w:gridCol w:w="979"/>
+        <w:gridCol w:w="979"/>
+        <w:gridCol w:w="979"/>
+        <w:gridCol w:w="979"/>
+        <w:gridCol w:w="979"/>
+        <w:gridCol w:w="979"/>
+        <w:gridCol w:w="979"/>
       </w:tblGrid>
       <w:tr>
         <w:tc>
           <w:tcPr>
-            <w:tcW w:type="dxa" w:w="1958"/>
+            <w:tcW w:type="dxa" w:w="979"/>
           </w:tcPr>
           <w:p>
             <w:pPr>
@@ -6473,13 +6650,13 @@
                 <w:b/>
                 <w:sz w:val="16"/>
               </w:rPr>
-              <w:t>Seed</w:t>
-            </w:r>
-          </w:p>
-        </w:tc>
-        <w:tc>
-          <w:tcPr>
-            <w:tcW w:type="dxa" w:w="1958"/>
+              <w:t>Comparison</w:t>
+            </w:r>
+          </w:p>
+        </w:tc>
+        <w:tc>
+          <w:tcPr>
+            <w:tcW w:type="dxa" w:w="979"/>
           </w:tcPr>
           <w:p>
             <w:pPr>
@@ -6495,13 +6672,13 @@
                 <w:b/>
                 <w:sz w:val="16"/>
               </w:rPr>
-              <w:t>Macro-F1 difference</w:t>
-            </w:r>
-          </w:p>
-        </w:tc>
-        <w:tc>
-          <w:tcPr>
-            <w:tcW w:type="dxa" w:w="1958"/>
+              <w:t>Mean difference</w:t>
+            </w:r>
+          </w:p>
+        </w:tc>
+        <w:tc>
+          <w:tcPr>
+            <w:tcW w:type="dxa" w:w="979"/>
           </w:tcPr>
           <w:p>
             <w:pPr>
@@ -6517,13 +6694,13 @@
                 <w:b/>
                 <w:sz w:val="16"/>
               </w:rPr>
-              <w:t>Paired bootstrap 90% interval</w:t>
-            </w:r>
-          </w:p>
-        </w:tc>
-        <w:tc>
-          <w:tcPr>
-            <w:tcW w:type="dxa" w:w="1958"/>
+              <w:t>SD</w:t>
+            </w:r>
+          </w:p>
+        </w:tc>
+        <w:tc>
+          <w:tcPr>
+            <w:tcW w:type="dxa" w:w="979"/>
           </w:tcPr>
           <w:p>
             <w:pPr>
@@ -6539,13 +6716,13 @@
                 <w:b/>
                 <w:sz w:val="16"/>
               </w:rPr>
-              <w:t>Inside +/- 0.01?</w:t>
-            </w:r>
-          </w:p>
-        </w:tc>
-        <w:tc>
-          <w:tcPr>
-            <w:tcW w:type="dxa" w:w="1958"/>
+              <w:t>Seed-level 95% interval</w:t>
+            </w:r>
+          </w:p>
+        </w:tc>
+        <w:tc>
+          <w:tcPr>
+            <w:tcW w:type="dxa" w:w="979"/>
           </w:tcPr>
           <w:p>
             <w:pPr>
@@ -6561,7 +6738,117 @@
                 <w:b/>
                 <w:sz w:val="16"/>
               </w:rPr>
-              <w:t>Exact McNemar p</w:t>
+              <w:t>Seed-level 90% interval</w:t>
+            </w:r>
+          </w:p>
+        </w:tc>
+        <w:tc>
+          <w:tcPr>
+            <w:tcW w:type="dxa" w:w="979"/>
+          </w:tcPr>
+          <w:p>
+            <w:pPr>
+              <w:spacing w:after="0"/>
+            </w:pPr>
+            <w:r>
+              <w:rPr>
+                <w:sz w:val="16"/>
+              </w:rPr>
+            </w:r>
+            <w:r>
+              <w:rPr>
+                <w:b/>
+                <w:sz w:val="16"/>
+              </w:rPr>
+              <w:t>TOST at 0.005</w:t>
+            </w:r>
+          </w:p>
+        </w:tc>
+        <w:tc>
+          <w:tcPr>
+            <w:tcW w:type="dxa" w:w="979"/>
+          </w:tcPr>
+          <w:p>
+            <w:pPr>
+              <w:spacing w:after="0"/>
+            </w:pPr>
+            <w:r>
+              <w:rPr>
+                <w:sz w:val="16"/>
+              </w:rPr>
+            </w:r>
+            <w:r>
+              <w:rPr>
+                <w:b/>
+                <w:sz w:val="16"/>
+              </w:rPr>
+              <w:t>TOST at 0.01</w:t>
+            </w:r>
+          </w:p>
+        </w:tc>
+        <w:tc>
+          <w:tcPr>
+            <w:tcW w:type="dxa" w:w="979"/>
+          </w:tcPr>
+          <w:p>
+            <w:pPr>
+              <w:spacing w:after="0"/>
+            </w:pPr>
+            <w:r>
+              <w:rPr>
+                <w:sz w:val="16"/>
+              </w:rPr>
+            </w:r>
+            <w:r>
+              <w:rPr>
+                <w:b/>
+                <w:sz w:val="16"/>
+              </w:rPr>
+              <w:t>Minimum detectable effect (80% power)</w:t>
+            </w:r>
+          </w:p>
+        </w:tc>
+        <w:tc>
+          <w:tcPr>
+            <w:tcW w:type="dxa" w:w="979"/>
+          </w:tcPr>
+          <w:p>
+            <w:pPr>
+              <w:spacing w:after="0"/>
+            </w:pPr>
+            <w:r>
+              <w:rPr>
+                <w:sz w:val="16"/>
+              </w:rPr>
+            </w:r>
+            <w:r>
+              <w:rPr>
+                <w:b/>
+                <w:sz w:val="16"/>
+              </w:rPr>
+              <w:t>Cohen's d_z</w:t>
+            </w:r>
+          </w:p>
+        </w:tc>
+        <w:tc>
+          <w:tcPr>
+            <w:tcW w:type="dxa" w:w="979"/>
+          </w:tcPr>
+          <w:p>
+            <w:pPr>
+              <w:spacing w:after="0"/>
+            </w:pPr>
+            <w:r>
+              <w:rPr>
+                <w:sz w:val="16"/>
+              </w:rPr>
+            </w:r>
+            <w:r>
+              <w:rPr>
+                <w:b/>
+                <w:sz w:val="16"/>
+              </w:rPr>
+              <w:t>Seeds favouring RCCF / baseline</w:t>
             </w:r>
           </w:p>
         </w:tc>
@@ -6569,106 +6856,211 @@
       <w:tr>
         <w:tc>
           <w:tcPr>
-            <w:tcW w:type="dxa" w:w="1958"/>
-          </w:tcPr>
-          <w:p>
-            <w:pPr>
-              <w:spacing w:after="0"/>
-            </w:pPr>
-            <w:r>
-              <w:rPr>
-                <w:sz w:val="16"/>
-              </w:rPr>
-            </w:r>
-            <w:r>
-              <w:rPr>
-                <w:sz w:val="16"/>
-              </w:rPr>
-              <w:t>42</w:t>
-            </w:r>
-          </w:p>
-        </w:tc>
-        <w:tc>
-          <w:tcPr>
-            <w:tcW w:type="dxa" w:w="1958"/>
-          </w:tcPr>
-          <w:p>
-            <w:pPr>
-              <w:spacing w:after="0"/>
-            </w:pPr>
-            <w:r>
-              <w:rPr>
-                <w:sz w:val="16"/>
-              </w:rPr>
-            </w:r>
-            <w:r>
-              <w:rPr>
-                <w:sz w:val="16"/>
-              </w:rPr>
-              <w:t>-0.001490</w:t>
-            </w:r>
-          </w:p>
-        </w:tc>
-        <w:tc>
-          <w:tcPr>
-            <w:tcW w:type="dxa" w:w="1958"/>
-          </w:tcPr>
-          <w:p>
-            <w:pPr>
-              <w:spacing w:after="0"/>
-            </w:pPr>
-            <w:r>
-              <w:rPr>
-                <w:sz w:val="16"/>
-              </w:rPr>
-            </w:r>
-            <w:r>
-              <w:rPr>
-                <w:sz w:val="16"/>
-              </w:rPr>
-              <w:t>[-0.003823, +0.000580]</w:t>
-            </w:r>
-          </w:p>
-        </w:tc>
-        <w:tc>
-          <w:tcPr>
-            <w:tcW w:type="dxa" w:w="1958"/>
-          </w:tcPr>
-          <w:p>
-            <w:pPr>
-              <w:spacing w:after="0"/>
-            </w:pPr>
-            <w:r>
-              <w:rPr>
-                <w:sz w:val="16"/>
-              </w:rPr>
-            </w:r>
-            <w:r>
-              <w:rPr>
-                <w:sz w:val="16"/>
-              </w:rPr>
-              <w:t>Yes</w:t>
-            </w:r>
-          </w:p>
-        </w:tc>
-        <w:tc>
-          <w:tcPr>
-            <w:tcW w:type="dxa" w:w="1958"/>
-          </w:tcPr>
-          <w:p>
-            <w:pPr>
-              <w:spacing w:after="0"/>
-            </w:pPr>
-            <w:r>
-              <w:rPr>
-                <w:sz w:val="16"/>
-              </w:rPr>
-            </w:r>
-            <w:r>
-              <w:rPr>
-                <w:sz w:val="16"/>
-              </w:rPr>
-              <w:t>0.508</w:t>
+            <w:tcW w:type="dxa" w:w="979"/>
+          </w:tcPr>
+          <w:p>
+            <w:pPr>
+              <w:spacing w:after="0"/>
+            </w:pPr>
+            <w:r>
+              <w:rPr>
+                <w:sz w:val="16"/>
+              </w:rPr>
+            </w:r>
+            <w:r>
+              <w:rPr>
+                <w:sz w:val="16"/>
+              </w:rPr>
+              <w:t>RCCF - equal RF (chi-square)</w:t>
+            </w:r>
+          </w:p>
+        </w:tc>
+        <w:tc>
+          <w:tcPr>
+            <w:tcW w:type="dxa" w:w="979"/>
+          </w:tcPr>
+          <w:p>
+            <w:pPr>
+              <w:spacing w:after="0"/>
+            </w:pPr>
+            <w:r>
+              <w:rPr>
+                <w:sz w:val="16"/>
+              </w:rPr>
+            </w:r>
+            <w:r>
+              <w:rPr>
+                <w:sz w:val="16"/>
+              </w:rPr>
+              <w:t>-0.000456</w:t>
+            </w:r>
+          </w:p>
+        </w:tc>
+        <w:tc>
+          <w:tcPr>
+            <w:tcW w:type="dxa" w:w="979"/>
+          </w:tcPr>
+          <w:p>
+            <w:pPr>
+              <w:spacing w:after="0"/>
+            </w:pPr>
+            <w:r>
+              <w:rPr>
+                <w:sz w:val="16"/>
+              </w:rPr>
+            </w:r>
+            <w:r>
+              <w:rPr>
+                <w:sz w:val="16"/>
+              </w:rPr>
+              <w:t>0.001152</w:t>
+            </w:r>
+          </w:p>
+        </w:tc>
+        <w:tc>
+          <w:tcPr>
+            <w:tcW w:type="dxa" w:w="979"/>
+          </w:tcPr>
+          <w:p>
+            <w:pPr>
+              <w:spacing w:after="0"/>
+            </w:pPr>
+            <w:r>
+              <w:rPr>
+                <w:sz w:val="16"/>
+              </w:rPr>
+            </w:r>
+            <w:r>
+              <w:rPr>
+                <w:sz w:val="16"/>
+              </w:rPr>
+              <w:t>[-0.001280, +0.000368]</w:t>
+            </w:r>
+          </w:p>
+        </w:tc>
+        <w:tc>
+          <w:tcPr>
+            <w:tcW w:type="dxa" w:w="979"/>
+          </w:tcPr>
+          <w:p>
+            <w:pPr>
+              <w:spacing w:after="0"/>
+            </w:pPr>
+            <w:r>
+              <w:rPr>
+                <w:sz w:val="16"/>
+              </w:rPr>
+            </w:r>
+            <w:r>
+              <w:rPr>
+                <w:sz w:val="16"/>
+              </w:rPr>
+              <w:t>[-0.001124, +0.000212]</w:t>
+            </w:r>
+          </w:p>
+        </w:tc>
+        <w:tc>
+          <w:tcPr>
+            <w:tcW w:type="dxa" w:w="979"/>
+          </w:tcPr>
+          <w:p>
+            <w:pPr>
+              <w:spacing w:after="0"/>
+            </w:pPr>
+            <w:r>
+              <w:rPr>
+                <w:sz w:val="16"/>
+              </w:rPr>
+            </w:r>
+            <w:r>
+              <w:rPr>
+                <w:sz w:val="16"/>
+              </w:rPr>
+              <w:t>equivalent</w:t>
+            </w:r>
+          </w:p>
+        </w:tc>
+        <w:tc>
+          <w:tcPr>
+            <w:tcW w:type="dxa" w:w="979"/>
+          </w:tcPr>
+          <w:p>
+            <w:pPr>
+              <w:spacing w:after="0"/>
+            </w:pPr>
+            <w:r>
+              <w:rPr>
+                <w:sz w:val="16"/>
+              </w:rPr>
+            </w:r>
+            <w:r>
+              <w:rPr>
+                <w:sz w:val="16"/>
+              </w:rPr>
+              <w:t>equivalent</w:t>
+            </w:r>
+          </w:p>
+        </w:tc>
+        <w:tc>
+          <w:tcPr>
+            <w:tcW w:type="dxa" w:w="979"/>
+          </w:tcPr>
+          <w:p>
+            <w:pPr>
+              <w:spacing w:after="0"/>
+            </w:pPr>
+            <w:r>
+              <w:rPr>
+                <w:sz w:val="16"/>
+              </w:rPr>
+            </w:r>
+            <w:r>
+              <w:rPr>
+                <w:sz w:val="16"/>
+              </w:rPr>
+              <w:t>0.001146</w:t>
+            </w:r>
+          </w:p>
+        </w:tc>
+        <w:tc>
+          <w:tcPr>
+            <w:tcW w:type="dxa" w:w="979"/>
+          </w:tcPr>
+          <w:p>
+            <w:pPr>
+              <w:spacing w:after="0"/>
+            </w:pPr>
+            <w:r>
+              <w:rPr>
+                <w:sz w:val="16"/>
+              </w:rPr>
+            </w:r>
+            <w:r>
+              <w:rPr>
+                <w:sz w:val="16"/>
+              </w:rPr>
+              <w:t>-0.40</w:t>
+            </w:r>
+          </w:p>
+        </w:tc>
+        <w:tc>
+          <w:tcPr>
+            <w:tcW w:type="dxa" w:w="979"/>
+          </w:tcPr>
+          <w:p>
+            <w:pPr>
+              <w:spacing w:after="0"/>
+            </w:pPr>
+            <w:r>
+              <w:rPr>
+                <w:sz w:val="16"/>
+              </w:rPr>
+            </w:r>
+            <w:r>
+              <w:rPr>
+                <w:sz w:val="16"/>
+              </w:rPr>
+              <w:t>5 / 5</w:t>
             </w:r>
           </w:p>
         </w:tc>
@@ -6676,106 +7068,211 @@
       <w:tr>
         <w:tc>
           <w:tcPr>
-            <w:tcW w:type="dxa" w:w="1958"/>
-          </w:tcPr>
-          <w:p>
-            <w:pPr>
-              <w:spacing w:after="0"/>
-            </w:pPr>
-            <w:r>
-              <w:rPr>
-                <w:sz w:val="16"/>
-              </w:rPr>
-            </w:r>
-            <w:r>
-              <w:rPr>
-                <w:sz w:val="16"/>
-              </w:rPr>
-              <w:t>2024</w:t>
-            </w:r>
-          </w:p>
-        </w:tc>
-        <w:tc>
-          <w:tcPr>
-            <w:tcW w:type="dxa" w:w="1958"/>
-          </w:tcPr>
-          <w:p>
-            <w:pPr>
-              <w:spacing w:after="0"/>
-            </w:pPr>
-            <w:r>
-              <w:rPr>
-                <w:sz w:val="16"/>
-              </w:rPr>
-            </w:r>
-            <w:r>
-              <w:rPr>
-                <w:sz w:val="16"/>
-              </w:rPr>
-              <w:t>+0.003142</w:t>
-            </w:r>
-          </w:p>
-        </w:tc>
-        <w:tc>
-          <w:tcPr>
-            <w:tcW w:type="dxa" w:w="1958"/>
-          </w:tcPr>
-          <w:p>
-            <w:pPr>
-              <w:spacing w:after="0"/>
-            </w:pPr>
-            <w:r>
-              <w:rPr>
-                <w:sz w:val="16"/>
-              </w:rPr>
-            </w:r>
-            <w:r>
-              <w:rPr>
-                <w:sz w:val="16"/>
-              </w:rPr>
-              <w:t>[-0.000366, +0.006950]</w:t>
-            </w:r>
-          </w:p>
-        </w:tc>
-        <w:tc>
-          <w:tcPr>
-            <w:tcW w:type="dxa" w:w="1958"/>
-          </w:tcPr>
-          <w:p>
-            <w:pPr>
-              <w:spacing w:after="0"/>
-            </w:pPr>
-            <w:r>
-              <w:rPr>
-                <w:sz w:val="16"/>
-              </w:rPr>
-            </w:r>
-            <w:r>
-              <w:rPr>
-                <w:sz w:val="16"/>
-              </w:rPr>
-              <w:t>Yes</w:t>
-            </w:r>
-          </w:p>
-        </w:tc>
-        <w:tc>
-          <w:tcPr>
-            <w:tcW w:type="dxa" w:w="1958"/>
-          </w:tcPr>
-          <w:p>
-            <w:pPr>
-              <w:spacing w:after="0"/>
-            </w:pPr>
-            <w:r>
-              <w:rPr>
-                <w:sz w:val="16"/>
-              </w:rPr>
-            </w:r>
-            <w:r>
-              <w:rPr>
-                <w:sz w:val="16"/>
-              </w:rPr>
-              <w:t>0.092</w:t>
+            <w:tcW w:type="dxa" w:w="979"/>
+          </w:tcPr>
+          <w:p>
+            <w:pPr>
+              <w:spacing w:after="0"/>
+            </w:pPr>
+            <w:r>
+              <w:rPr>
+                <w:sz w:val="16"/>
+              </w:rPr>
+            </w:r>
+            <w:r>
+              <w:rPr>
+                <w:sz w:val="16"/>
+              </w:rPr>
+              <w:t>RCCF - equal RF (all features)</w:t>
+            </w:r>
+          </w:p>
+        </w:tc>
+        <w:tc>
+          <w:tcPr>
+            <w:tcW w:type="dxa" w:w="979"/>
+          </w:tcPr>
+          <w:p>
+            <w:pPr>
+              <w:spacing w:after="0"/>
+            </w:pPr>
+            <w:r>
+              <w:rPr>
+                <w:sz w:val="16"/>
+              </w:rPr>
+            </w:r>
+            <w:r>
+              <w:rPr>
+                <w:sz w:val="16"/>
+              </w:rPr>
+              <w:t>+0.001613</w:t>
+            </w:r>
+          </w:p>
+        </w:tc>
+        <w:tc>
+          <w:tcPr>
+            <w:tcW w:type="dxa" w:w="979"/>
+          </w:tcPr>
+          <w:p>
+            <w:pPr>
+              <w:spacing w:after="0"/>
+            </w:pPr>
+            <w:r>
+              <w:rPr>
+                <w:sz w:val="16"/>
+              </w:rPr>
+            </w:r>
+            <w:r>
+              <w:rPr>
+                <w:sz w:val="16"/>
+              </w:rPr>
+              <w:t>0.001376</w:t>
+            </w:r>
+          </w:p>
+        </w:tc>
+        <w:tc>
+          <w:tcPr>
+            <w:tcW w:type="dxa" w:w="979"/>
+          </w:tcPr>
+          <w:p>
+            <w:pPr>
+              <w:spacing w:after="0"/>
+            </w:pPr>
+            <w:r>
+              <w:rPr>
+                <w:sz w:val="16"/>
+              </w:rPr>
+            </w:r>
+            <w:r>
+              <w:rPr>
+                <w:sz w:val="16"/>
+              </w:rPr>
+              <w:t>[+0.000628, +0.002597]</w:t>
+            </w:r>
+          </w:p>
+        </w:tc>
+        <w:tc>
+          <w:tcPr>
+            <w:tcW w:type="dxa" w:w="979"/>
+          </w:tcPr>
+          <w:p>
+            <w:pPr>
+              <w:spacing w:after="0"/>
+            </w:pPr>
+            <w:r>
+              <w:rPr>
+                <w:sz w:val="16"/>
+              </w:rPr>
+            </w:r>
+            <w:r>
+              <w:rPr>
+                <w:sz w:val="16"/>
+              </w:rPr>
+              <w:t>[+0.000815, +0.002410]</w:t>
+            </w:r>
+          </w:p>
+        </w:tc>
+        <w:tc>
+          <w:tcPr>
+            <w:tcW w:type="dxa" w:w="979"/>
+          </w:tcPr>
+          <w:p>
+            <w:pPr>
+              <w:spacing w:after="0"/>
+            </w:pPr>
+            <w:r>
+              <w:rPr>
+                <w:sz w:val="16"/>
+              </w:rPr>
+            </w:r>
+            <w:r>
+              <w:rPr>
+                <w:sz w:val="16"/>
+              </w:rPr>
+              <w:t>equivalent</w:t>
+            </w:r>
+          </w:p>
+        </w:tc>
+        <w:tc>
+          <w:tcPr>
+            <w:tcW w:type="dxa" w:w="979"/>
+          </w:tcPr>
+          <w:p>
+            <w:pPr>
+              <w:spacing w:after="0"/>
+            </w:pPr>
+            <w:r>
+              <w:rPr>
+                <w:sz w:val="16"/>
+              </w:rPr>
+            </w:r>
+            <w:r>
+              <w:rPr>
+                <w:sz w:val="16"/>
+              </w:rPr>
+              <w:t>equivalent</w:t>
+            </w:r>
+          </w:p>
+        </w:tc>
+        <w:tc>
+          <w:tcPr>
+            <w:tcW w:type="dxa" w:w="979"/>
+          </w:tcPr>
+          <w:p>
+            <w:pPr>
+              <w:spacing w:after="0"/>
+            </w:pPr>
+            <w:r>
+              <w:rPr>
+                <w:sz w:val="16"/>
+              </w:rPr>
+            </w:r>
+            <w:r>
+              <w:rPr>
+                <w:sz w:val="16"/>
+              </w:rPr>
+              <w:t>0.001369</w:t>
+            </w:r>
+          </w:p>
+        </w:tc>
+        <w:tc>
+          <w:tcPr>
+            <w:tcW w:type="dxa" w:w="979"/>
+          </w:tcPr>
+          <w:p>
+            <w:pPr>
+              <w:spacing w:after="0"/>
+            </w:pPr>
+            <w:r>
+              <w:rPr>
+                <w:sz w:val="16"/>
+              </w:rPr>
+            </w:r>
+            <w:r>
+              <w:rPr>
+                <w:sz w:val="16"/>
+              </w:rPr>
+              <w:t>+1.17</w:t>
+            </w:r>
+          </w:p>
+        </w:tc>
+        <w:tc>
+          <w:tcPr>
+            <w:tcW w:type="dxa" w:w="979"/>
+          </w:tcPr>
+          <w:p>
+            <w:pPr>
+              <w:spacing w:after="0"/>
+            </w:pPr>
+            <w:r>
+              <w:rPr>
+                <w:sz w:val="16"/>
+              </w:rPr>
+            </w:r>
+            <w:r>
+              <w:rPr>
+                <w:sz w:val="16"/>
+              </w:rPr>
+              <w:t>9 / 1</w:t>
             </w:r>
           </w:p>
         </w:tc>
@@ -6783,321 +7280,211 @@
       <w:tr>
         <w:tc>
           <w:tcPr>
-            <w:tcW w:type="dxa" w:w="1958"/>
-          </w:tcPr>
-          <w:p>
-            <w:pPr>
-              <w:spacing w:after="0"/>
-            </w:pPr>
-            <w:r>
-              <w:rPr>
-                <w:sz w:val="16"/>
-              </w:rPr>
-            </w:r>
-            <w:r>
-              <w:rPr>
-                <w:sz w:val="16"/>
-              </w:rPr>
-              <w:t>3407</w:t>
-            </w:r>
-          </w:p>
-        </w:tc>
-        <w:tc>
-          <w:tcPr>
-            <w:tcW w:type="dxa" w:w="1958"/>
-          </w:tcPr>
-          <w:p>
-            <w:pPr>
-              <w:spacing w:after="0"/>
-            </w:pPr>
-            <w:r>
-              <w:rPr>
-                <w:sz w:val="16"/>
-              </w:rPr>
-            </w:r>
-            <w:r>
-              <w:rPr>
-                <w:sz w:val="16"/>
-              </w:rPr>
-              <w:t>+0.001602</w:t>
-            </w:r>
-          </w:p>
-        </w:tc>
-        <w:tc>
-          <w:tcPr>
-            <w:tcW w:type="dxa" w:w="1958"/>
-          </w:tcPr>
-          <w:p>
-            <w:pPr>
-              <w:spacing w:after="0"/>
-            </w:pPr>
-            <w:r>
-              <w:rPr>
-                <w:sz w:val="16"/>
-              </w:rPr>
-            </w:r>
-            <w:r>
-              <w:rPr>
-                <w:sz w:val="16"/>
-              </w:rPr>
-              <w:t>[-0.000142, +0.003605]</w:t>
-            </w:r>
-          </w:p>
-        </w:tc>
-        <w:tc>
-          <w:tcPr>
-            <w:tcW w:type="dxa" w:w="1958"/>
-          </w:tcPr>
-          <w:p>
-            <w:pPr>
-              <w:spacing w:after="0"/>
-            </w:pPr>
-            <w:r>
-              <w:rPr>
-                <w:sz w:val="16"/>
-              </w:rPr>
-            </w:r>
-            <w:r>
-              <w:rPr>
-                <w:sz w:val="16"/>
-              </w:rPr>
-              <w:t>Yes</w:t>
-            </w:r>
-          </w:p>
-        </w:tc>
-        <w:tc>
-          <w:tcPr>
-            <w:tcW w:type="dxa" w:w="1958"/>
-          </w:tcPr>
-          <w:p>
-            <w:pPr>
-              <w:spacing w:after="0"/>
-            </w:pPr>
-            <w:r>
-              <w:rPr>
-                <w:sz w:val="16"/>
-              </w:rPr>
-            </w:r>
-            <w:r>
-              <w:rPr>
-                <w:sz w:val="16"/>
-              </w:rPr>
-              <w:t>0.344</w:t>
-            </w:r>
-          </w:p>
-        </w:tc>
-      </w:tr>
-      <w:tr>
-        <w:tc>
-          <w:tcPr>
-            <w:tcW w:type="dxa" w:w="1958"/>
-          </w:tcPr>
-          <w:p>
-            <w:pPr>
-              <w:spacing w:after="0"/>
-            </w:pPr>
-            <w:r>
-              <w:rPr>
-                <w:sz w:val="16"/>
-              </w:rPr>
-            </w:r>
-            <w:r>
-              <w:rPr>
-                <w:sz w:val="16"/>
-              </w:rPr>
-              <w:t>Pooled (23,958 rows)</w:t>
-            </w:r>
-          </w:p>
-        </w:tc>
-        <w:tc>
-          <w:tcPr>
-            <w:tcW w:type="dxa" w:w="1958"/>
-          </w:tcPr>
-          <w:p>
-            <w:pPr>
-              <w:spacing w:after="0"/>
-            </w:pPr>
-            <w:r>
-              <w:rPr>
-                <w:sz w:val="16"/>
-              </w:rPr>
-            </w:r>
-            <w:r>
-              <w:rPr>
-                <w:sz w:val="16"/>
-              </w:rPr>
-              <w:t>+0.001085</w:t>
-            </w:r>
-          </w:p>
-        </w:tc>
-        <w:tc>
-          <w:tcPr>
-            <w:tcW w:type="dxa" w:w="1958"/>
-          </w:tcPr>
-          <w:p>
-            <w:pPr>
-              <w:spacing w:after="0"/>
-            </w:pPr>
-            <w:r>
-              <w:rPr>
-                <w:sz w:val="16"/>
-              </w:rPr>
-            </w:r>
-            <w:r>
-              <w:rPr>
-                <w:sz w:val="16"/>
-              </w:rPr>
-              <w:t>[-0.002898, +0.005501]</w:t>
-            </w:r>
-          </w:p>
-        </w:tc>
-        <w:tc>
-          <w:tcPr>
-            <w:tcW w:type="dxa" w:w="1958"/>
-          </w:tcPr>
-          <w:p>
-            <w:pPr>
-              <w:spacing w:after="0"/>
-            </w:pPr>
-            <w:r>
-              <w:rPr>
-                <w:sz w:val="16"/>
-              </w:rPr>
-            </w:r>
-            <w:r>
-              <w:rPr>
-                <w:sz w:val="16"/>
-              </w:rPr>
-              <w:t>Yes at 0.01 / No at 0.005</w:t>
-            </w:r>
-          </w:p>
-        </w:tc>
-        <w:tc>
-          <w:tcPr>
-            <w:tcW w:type="dxa" w:w="1958"/>
-          </w:tcPr>
-          <w:p>
-            <w:pPr>
-              <w:spacing w:after="0"/>
-            </w:pPr>
-            <w:r>
-              <w:rPr>
-                <w:sz w:val="16"/>
-              </w:rPr>
-            </w:r>
-            <w:r>
-              <w:rPr>
-                <w:sz w:val="16"/>
-              </w:rPr>
-              <w:t>0.215</w:t>
-            </w:r>
-          </w:p>
-        </w:tc>
-      </w:tr>
-      <w:tr>
-        <w:tc>
-          <w:tcPr>
-            <w:tcW w:type="dxa" w:w="1958"/>
-          </w:tcPr>
-          <w:p>
-            <w:pPr>
-              <w:spacing w:after="0"/>
-            </w:pPr>
-            <w:r>
-              <w:rPr>
-                <w:sz w:val="16"/>
-              </w:rPr>
-            </w:r>
-            <w:r>
-              <w:rPr>
-                <w:sz w:val="16"/>
-              </w:rPr>
-              <w:t>Control: versus equal RF (all features)</w:t>
-            </w:r>
-          </w:p>
-        </w:tc>
-        <w:tc>
-          <w:tcPr>
-            <w:tcW w:type="dxa" w:w="1958"/>
-          </w:tcPr>
-          <w:p>
-            <w:pPr>
-              <w:spacing w:after="0"/>
-            </w:pPr>
-            <w:r>
-              <w:rPr>
-                <w:sz w:val="16"/>
-              </w:rPr>
-            </w:r>
-            <w:r>
-              <w:rPr>
-                <w:sz w:val="16"/>
-              </w:rPr>
-              <w:t>+0.001995</w:t>
-            </w:r>
-          </w:p>
-        </w:tc>
-        <w:tc>
-          <w:tcPr>
-            <w:tcW w:type="dxa" w:w="1958"/>
-          </w:tcPr>
-          <w:p>
-            <w:pPr>
-              <w:spacing w:after="0"/>
-            </w:pPr>
-            <w:r>
-              <w:rPr>
-                <w:sz w:val="16"/>
-              </w:rPr>
-            </w:r>
-            <w:r>
-              <w:rPr>
-                <w:sz w:val="16"/>
-              </w:rPr>
-              <w:t>-</w:t>
-            </w:r>
-          </w:p>
-        </w:tc>
-        <w:tc>
-          <w:tcPr>
-            <w:tcW w:type="dxa" w:w="1958"/>
-          </w:tcPr>
-          <w:p>
-            <w:pPr>
-              <w:spacing w:after="0"/>
-            </w:pPr>
-            <w:r>
-              <w:rPr>
-                <w:sz w:val="16"/>
-              </w:rPr>
-            </w:r>
-            <w:r>
-              <w:rPr>
-                <w:sz w:val="16"/>
-              </w:rPr>
-              <w:t>-</w:t>
-            </w:r>
-          </w:p>
-        </w:tc>
-        <w:tc>
-          <w:tcPr>
-            <w:tcW w:type="dxa" w:w="1958"/>
-          </w:tcPr>
-          <w:p>
-            <w:pPr>
-              <w:spacing w:after="0"/>
-            </w:pPr>
-            <w:r>
-              <w:rPr>
-                <w:sz w:val="16"/>
-              </w:rPr>
-            </w:r>
-            <w:r>
-              <w:rPr>
-                <w:b/>
-                <w:sz w:val="16"/>
-              </w:rPr>
-              <w:t>0.00061 (RCCF better)</w:t>
+            <w:tcW w:type="dxa" w:w="979"/>
+          </w:tcPr>
+          <w:p>
+            <w:pPr>
+              <w:spacing w:after="0"/>
+            </w:pPr>
+            <w:r>
+              <w:rPr>
+                <w:sz w:val="16"/>
+              </w:rPr>
+            </w:r>
+            <w:r>
+              <w:rPr>
+                <w:sz w:val="16"/>
+              </w:rPr>
+              <w:t>RCCF - ExtraTrees (chi-square)</w:t>
+            </w:r>
+          </w:p>
+        </w:tc>
+        <w:tc>
+          <w:tcPr>
+            <w:tcW w:type="dxa" w:w="979"/>
+          </w:tcPr>
+          <w:p>
+            <w:pPr>
+              <w:spacing w:after="0"/>
+            </w:pPr>
+            <w:r>
+              <w:rPr>
+                <w:sz w:val="16"/>
+              </w:rPr>
+            </w:r>
+            <w:r>
+              <w:rPr>
+                <w:sz w:val="16"/>
+              </w:rPr>
+              <w:t>+0.031788</w:t>
+            </w:r>
+          </w:p>
+        </w:tc>
+        <w:tc>
+          <w:tcPr>
+            <w:tcW w:type="dxa" w:w="979"/>
+          </w:tcPr>
+          <w:p>
+            <w:pPr>
+              <w:spacing w:after="0"/>
+            </w:pPr>
+            <w:r>
+              <w:rPr>
+                <w:sz w:val="16"/>
+              </w:rPr>
+            </w:r>
+            <w:r>
+              <w:rPr>
+                <w:sz w:val="16"/>
+              </w:rPr>
+              <w:t>0.001616</w:t>
+            </w:r>
+          </w:p>
+        </w:tc>
+        <w:tc>
+          <w:tcPr>
+            <w:tcW w:type="dxa" w:w="979"/>
+          </w:tcPr>
+          <w:p>
+            <w:pPr>
+              <w:spacing w:after="0"/>
+            </w:pPr>
+            <w:r>
+              <w:rPr>
+                <w:sz w:val="16"/>
+              </w:rPr>
+            </w:r>
+            <w:r>
+              <w:rPr>
+                <w:sz w:val="16"/>
+              </w:rPr>
+              <w:t>[+0.030632, +0.032944]</w:t>
+            </w:r>
+          </w:p>
+        </w:tc>
+        <w:tc>
+          <w:tcPr>
+            <w:tcW w:type="dxa" w:w="979"/>
+          </w:tcPr>
+          <w:p>
+            <w:pPr>
+              <w:spacing w:after="0"/>
+            </w:pPr>
+            <w:r>
+              <w:rPr>
+                <w:sz w:val="16"/>
+              </w:rPr>
+            </w:r>
+            <w:r>
+              <w:rPr>
+                <w:sz w:val="16"/>
+              </w:rPr>
+              <w:t>[+0.030851, +0.032724]</w:t>
+            </w:r>
+          </w:p>
+        </w:tc>
+        <w:tc>
+          <w:tcPr>
+            <w:tcW w:type="dxa" w:w="979"/>
+          </w:tcPr>
+          <w:p>
+            <w:pPr>
+              <w:spacing w:after="0"/>
+            </w:pPr>
+            <w:r>
+              <w:rPr>
+                <w:sz w:val="16"/>
+              </w:rPr>
+            </w:r>
+            <w:r>
+              <w:rPr>
+                <w:sz w:val="16"/>
+              </w:rPr>
+              <w:t>not equivalent</w:t>
+            </w:r>
+          </w:p>
+        </w:tc>
+        <w:tc>
+          <w:tcPr>
+            <w:tcW w:type="dxa" w:w="979"/>
+          </w:tcPr>
+          <w:p>
+            <w:pPr>
+              <w:spacing w:after="0"/>
+            </w:pPr>
+            <w:r>
+              <w:rPr>
+                <w:sz w:val="16"/>
+              </w:rPr>
+            </w:r>
+            <w:r>
+              <w:rPr>
+                <w:sz w:val="16"/>
+              </w:rPr>
+              <w:t>not equivalent</w:t>
+            </w:r>
+          </w:p>
+        </w:tc>
+        <w:tc>
+          <w:tcPr>
+            <w:tcW w:type="dxa" w:w="979"/>
+          </w:tcPr>
+          <w:p>
+            <w:pPr>
+              <w:spacing w:after="0"/>
+            </w:pPr>
+            <w:r>
+              <w:rPr>
+                <w:sz w:val="16"/>
+              </w:rPr>
+            </w:r>
+            <w:r>
+              <w:rPr>
+                <w:sz w:val="16"/>
+              </w:rPr>
+              <w:t>0.001607</w:t>
+            </w:r>
+          </w:p>
+        </w:tc>
+        <w:tc>
+          <w:tcPr>
+            <w:tcW w:type="dxa" w:w="979"/>
+          </w:tcPr>
+          <w:p>
+            <w:pPr>
+              <w:spacing w:after="0"/>
+            </w:pPr>
+            <w:r>
+              <w:rPr>
+                <w:sz w:val="16"/>
+              </w:rPr>
+            </w:r>
+            <w:r>
+              <w:rPr>
+                <w:sz w:val="16"/>
+              </w:rPr>
+              <w:t>+19.68</w:t>
+            </w:r>
+          </w:p>
+        </w:tc>
+        <w:tc>
+          <w:tcPr>
+            <w:tcW w:type="dxa" w:w="979"/>
+          </w:tcPr>
+          <w:p>
+            <w:pPr>
+              <w:spacing w:after="0"/>
+            </w:pPr>
+            <w:r>
+              <w:rPr>
+                <w:sz w:val="16"/>
+              </w:rPr>
+            </w:r>
+            <w:r>
+              <w:rPr>
+                <w:sz w:val="16"/>
+              </w:rPr>
+              <w:t>10 / 0</w:t>
             </w:r>
           </w:p>
         </w:tc>
@@ -7110,13 +7497,50 @@
     </w:p>
     <w:p>
       <w:r>
+        <w:t>The test-row paired bootstrap against the equal-weight chi-square forest gives a pooled 90% interval of [-0.004251, +0.003382] over the same ten seeds, which is also inside both margins.</w:t>
+      </w:r>
+    </w:p>
+    <w:p>
+      <w:r>
+        <w:t xml:space="preserve">Three entries deserve comment. </w:t>
+      </w:r>
+      <w:r>
         <w:rPr>
           <w:b/>
         </w:rPr>
-        <w:t>Third, against the full-feature forest the difference is significant, but no larger than a feature-view choice.</w:t>
-      </w:r>
-      <w:r>
-        <w:t xml:space="preserve"> Compared with an equal-weight full-feature forest, RCCF gains 0.001995 Macro-F1; pooling 23,958 test rows gives an exact McNemar p = 0.00061, with RCCF winning 33 rows and losing 10. The gate therefore does produce a small, directionally consistent advantage, but its magnitude is in the same band as simply swapping the feature view from chi-square to full features (+0.0009 to +0.0022). Combined with a 5.9-fold inference cost, that advantage has no engineering exchange value.</w:t>
+        <w:t>Power.</w:t>
+      </w:r>
+      <w:r>
+        <w:t xml:space="preserve"> With ten seeds and the observed standard deviation, the smallest difference detectable at 80% power is 0.00115 to 0.00161 Macro-F1; anything smaller would be missed, which is precisely why the equivalence margins are stated explicitly rather than inferred from a non-significant test. </w:t>
+      </w:r>
+      <w:r>
+        <w:rPr>
+          <w:b/>
+        </w:rPr>
+        <w:t>Versus the full-feature forest.</w:t>
+      </w:r>
+      <w:r>
+        <w:t xml:space="preserve"> The difference is positive and statistically detectable - the interval excludes zero and nine of ten seeds favour RCCF - yet its magnitude of 0.0016 lies inside the 0.005 equivalence margin: it is real but practically negligible, and Section 5.4 shows it is the same size as a feature-view choice. </w:t>
+      </w:r>
+      <w:r>
+        <w:rPr>
+          <w:b/>
+        </w:rPr>
+        <w:t>Versus extremely randomised trees.</w:t>
+      </w:r>
+      <w:r>
+        <w:t xml:space="preserve"> The difference is large and unambiguous (d_z = 19.7, all ten seeds), and is the only substantial model-to-model gap in this study.</w:t>
+      </w:r>
+    </w:p>
+    <w:p>
+      <w:r>
+        <w:rPr>
+          <w:b/>
+        </w:rPr>
+        <w:t>Third, against the full-feature forest the difference is detectable, but no larger than a feature-view choice.</w:t>
+      </w:r>
+      <w:r>
+        <w:t xml:space="preserve"> Compared with an equal-weight full-feature forest, RCCF gains 0.001613 Macro-F1 over ten seeds, with the seed-level interval excluding zero and nine of ten seeds favouring RCCF. The gate therefore does produce a small, directionally consistent advantage, but its magnitude is in the same band as simply swapping the feature view from chi-square to full features (+0.0021). Combined with a roughly fivefold inference cost, that advantage has no engineering exchange value.</w:t>
       </w:r>
     </w:p>
     <w:p>
@@ -7127,7 +7551,7 @@
         <w:t>Fourth, the cost is certain while the gain is not.</w:t>
       </w:r>
       <w:r>
-        <w:t xml:space="preserve"> On the natural-prior protocol RCCF takes 61.0 s to train against 0.78 s for the equal-weight forest, and 0.173 s to predict against 0.0295 s on a whole test batch, about 5.9 times slower. The two ratios measure different quantities and must not be conflated: 5.9 is the batch prediction-time ratio, whereas the single-row P50 latency ratio reported in Section 5.6 is 4.9 (14.62 ms against 2.96 ms). The gap widens on the balanced control: 9.13 s against 0.45 s. The most favourable summary of what these costs buy is that Macro-F1 moves within +/- 0.01.</w:t>
+        <w:t xml:space="preserve"> On the natural-prior protocol RCCF takes 61.0 s to train against 0.78 s for the equal-weight forest, and 0.244 s to predict against 0.046 s on a whole test batch, about 5.3 times slower. The two ratios measure different quantities and must not be conflated: 5.9 is the batch prediction-time ratio, whereas the single-row P50 latency ratio reported in Section 5.6 is 4.9 (14.62 ms against 2.96 ms). The gap widens on the balanced control: 9.13 s against 0.45 s. The most favourable summary of what these costs buy is that Macro-F1 moves within +/- 0.01.</w:t>
       </w:r>
     </w:p>
     <w:p>
@@ -7138,7 +7562,7 @@
         <w:t>Fifth, a neural baseline shows how badly accuracy can mislead.</w:t>
       </w:r>
       <w:r>
-        <w:t xml:space="preserve"> A multilayer perceptron given the same feature budget and a full training budget (128 hidden units, hyper-parameters selected on the validation partition) reaches 0.97679 accuracy, essentially the same as RCCF's 0.97792, but only 0.797654 Macro-F1, 0.092 below RCCF. Its balanced accuracy is 0.79666 against 0.94920, and its Brier score is 0.036701 against 0.006312. Notably, a paired McNemar test on overall correctness is not significant (pooled p = 0.383 over 23,958 rows; per-seed 1.000 / 0.768 / 0.261), because the two models make a similar </w:t>
+        <w:t xml:space="preserve"> A multilayer perceptron given the same feature budget and a full training budget (128 hidden units, hyper-parameters selected on the validation partition) reaches 0.97679 accuracy, essentially the same as RCCF's 0.97792 over the three seeds common to both runs, but only 0.797654 Macro-F1, 0.092 below RCCF. Its balanced accuracy is 0.79666 against 0.94920, and its Brier score is 0.036701 against 0.006312. Notably, a paired McNemar test on overall correctness is not significant (pooled p = 0.383 over 23,958 rows; per-seed 1.000 / 0.768 / 0.261), because the two models make a similar </w:t>
       </w:r>
       <w:r>
         <w:rPr>
@@ -8420,13 +8844,13 @@
         <w:t>(2) Class prior.</w:t>
       </w:r>
       <w:r>
-        <w:t xml:space="preserve"> The same RCCF mechanism reaches 0.961807 Macro-F1 on the balanced control population and 0.889955 on the natural-prior population, a difference of </w:t>
+        <w:t xml:space="preserve"> The same RCCF mechanism reaches 0.961807 Macro-F1 on the balanced control population and 0.889278 on the natural-prior population, a difference of </w:t>
       </w:r>
       <w:r>
         <w:rPr>
           <w:b/>
         </w:rPr>
-        <w:t>+0.0719</w:t>
+        <w:t>+0.0725</w:t>
       </w:r>
       <w:r>
         <w:t>. This is the largest single protocol effect observed in the study and an order of magnitude larger than any model-to-model difference (at most +0.0078). The mechanism is straightforward: Web Attack accounts for only 1.26% of the natural-prior population and its F1 sits near 0.53, which directly suppresses the macro average.</w:t>
@@ -8471,7 +8895,7 @@
     </w:p>
     <w:p>
       <w:r>
-        <w:t xml:space="preserve">Placing the five magnitudes side by side: aggregation +0.0011, feature view +0.0009, deduplication order +0.0014 (maximum 0.0060), tuning budget +0.0078 and class prior +0.0719. </w:t>
+        <w:t xml:space="preserve">Placing the five magnitudes side by side: aggregation 0.0005, feature view +0.0021, deduplication order +0.0014 (maximum 0.0060), tuning budget +0.0078 and class prior +0.0725. </w:t>
       </w:r>
       <w:r>
         <w:rPr>
@@ -8673,7 +9097,7 @@
         <w:t>Probability calibration.</w:t>
       </w:r>
       <w:r>
-        <w:t xml:space="preserve"> On the natural-prior population RCCF's Log Loss (0.05148) and Brier score (0.006312) are better than the equal-weight forest's (0.05283 and 0.006334), but its ECE is worse (0.006605 against 0.004442). Temperature scaling reduces the ECE of the conditional branch from about 0.0238 to about 0.0119 on the balanced control protocol, while the equal forest's temperature parameter is optimised to 1.0 and its calibration metrics are unchanged. The conclusion is that identical hard labels do not imply identical probability quality, and that the direction of improvement depends on which probabilistic metric is chosen - so no single favourable metric should be reported alone.</w:t>
+        <w:t xml:space="preserve"> On the natural-prior population RCCF's Log Loss (0.05183) is better than the equal-weight forest's (0.05220), but both its Brier score (0.006365 against 0.006255) and its ECE (0.006849 against 0.004493) are worse. Temperature scaling reduces the ECE of the conditional branch from about 0.0238 to about 0.0119 on the balanced control protocol, while the equal forest's temperature parameter is optimised to 1.0 and its calibration metrics are unchanged. The conclusion is that identical hard labels do not imply identical probability quality, and that the direction of improvement depends on which probabilistic metric is chosen - so no single favourable metric should be reported alone.</w:t>
       </w:r>
     </w:p>
     <w:p>
@@ -9817,7 +10241,7 @@
         <w:t>First, relative to the most direct equal-weight control the gain lies inside an equivalence boundary.</w:t>
       </w:r>
       <w:r>
-        <w:t xml:space="preserve"> On the natural-prior population of CIC-IDS2017, the Macro-F1 difference between conditional weighting and an equal-weight chi-square forest is +0.0011 with a pooled 90% interval of [-0.00290, +0.00550], which is equivalent within a pre-specified margin of 0.01 Macro-F1 but not within 0.005; per-seed McNemar tests are non-significant. The four experts disagree on no test row, and the normalised weight entropy is 0.99998. The cost is a 78-fold increase in training time and a 5.9-fold increase in inference time. Against a full-feature equal forest the gate is significantly better (p = 0.00061), but the magnitude matches that of a feature-view change.</w:t>
+        <w:t xml:space="preserve"> Averaged over ten seeds on the natural-prior population of CIC-IDS2017, the Macro-F1 difference between conditional weighting and an equal-weight chi-square forest is -0.000456 with the per-seed sign split five to five; both the seed-level 90% interval [-0.00112, +0.00021] and the test-row paired bootstrap interval [-0.00425, +0.00338] lie inside equivalence margins of 0.005 and 0.01. The four experts disagree on no test row, and the normalised weight entropy is 0.99998. The cost is about an 80-fold increase in training time and a fivefold increase in batch inference time. Against a full-feature equal forest the gate is reliably better over ten seeds, but the magnitude matches that of a feature-view change.</w:t>
       </w:r>
     </w:p>
     <w:p>
@@ -9839,7 +10263,7 @@
         <w:t>Third, protocol effects dominate model effects.</w:t>
       </w:r>
       <w:r>
-        <w:t xml:space="preserve"> Within one experiment set, a change of class prior moves Macro-F1 by +0.0719 and a reversal of deduplication order by up to +0.0060, whereas the aggregation strategy moves it by +0.0011. Under a file-level stress test the same model spans 0.3325 to 0.9997. On public intrusion-detection benchmarks, </w:t>
+        <w:t xml:space="preserve"> Within one experiment set, a change of class prior moves Macro-F1 by +0.0725 and a reversal of deduplication order by up to +0.0060, whereas the aggregation strategy moves it by 0.0005. Under a file-level stress test the same model spans 0.3325 to 0.9997. On public intrusion-detection benchmarks, </w:t>
       </w:r>
       <w:r>
         <w:rPr>
@@ -11187,6 +11611,50 @@
                 <w:sz w:val="16"/>
               </w:rPr>
               <w:t>Neural-baseline results and the paired comparison against RCCF</w:t>
+            </w:r>
+          </w:p>
+        </w:tc>
+      </w:tr>
+      <w:tr>
+        <w:tc>
+          <w:tcPr>
+            <w:tcW w:type="dxa" w:w="4896"/>
+          </w:tcPr>
+          <w:p>
+            <w:pPr>
+              <w:spacing w:after="0"/>
+            </w:pPr>
+            <w:r>
+              <w:rPr>
+                <w:sz w:val="16"/>
+              </w:rPr>
+            </w:r>
+            <w:r>
+              <w:rPr>
+                <w:sz w:val="16"/>
+              </w:rPr>
+              <w:t>S20</w:t>
+            </w:r>
+          </w:p>
+        </w:tc>
+        <w:tc>
+          <w:tcPr>
+            <w:tcW w:type="dxa" w:w="4896"/>
+          </w:tcPr>
+          <w:p>
+            <w:pPr>
+              <w:spacing w:after="0"/>
+            </w:pPr>
+            <w:r>
+              <w:rPr>
+                <w:sz w:val="16"/>
+              </w:rPr>
+            </w:r>
+            <w:r>
+              <w:rPr>
+                <w:sz w:val="16"/>
+              </w:rPr>
+              <w:t>Ten-seed primary run, power analysis and standardised effect sizes</w:t>
             </w:r>
           </w:p>
         </w:tc>

</xml_diff>

<commit_message>
Complete residual gaps: DOI verification, resource profile, cost-sensitive analysis, near-duplicate audit, submission materials
- All 45 references verified against Crossref; no pending DOI placeholders
- Resource profile: model size 4.1x, throughput 4.6x, peak memory
- Cost-sensitive evaluation for C_FN/C_FP ratios 1 to 100
- Near-duplicate audit (0.36% at 4 significant digits) plus sensitivity check
- Dockerfile, GitHub Actions CI, CITATION.cff, model card, data card
- Figure filenames aligned with figure numbers; graphical abstract and JISA cover letter rebuilt
- Line numbering added to the Word manuscripts
</commit_message>
<xml_diff>
--- a/重构版论文_v4_20260915/English_SCI_Manuscript_v4.docx
+++ b/重构版论文_v4_20260915/English_SCI_Manuscript_v4.docx
@@ -21,7 +21,7 @@
     </w:p>
     <w:p>
       <w:r>
-        <w:t>Reported performance differences between machine-learning intrusion-detection models are highly sensitive to duplicate flows, conflicting labels, feature-selection leakage and class priors. We test a widely adopted but rarely validated assumption: that fusing several random-forest experts with sample-specific reliability weights is reliably better than equal voting. Under a single leakage-controlled protocol we construct two explicit populations from CIC-IDS2017 - a 53,237-flow natural-prior population that retains observed class proportions and a 3,365-flow balanced control - and add NSL-KDD and UNSW-NB15 as independent native-label benchmarks, comparing full, chi-square, mutual-information and ANOVA feature views across conditional weighting (RCCF), equal-weight forests, extremely randomised trees, XGBoost and a multilayer perceptron over ten seeds, with a three-seed balanced control. Across ten seeds on the natural-prior protocol the two models differ by -0.00046 Macro-F1 with the per-seed sign split five to five; both the seed-level 90% interval [-0.00112, +0.00021] and the test-row paired bootstrap interval [-0.00425, +0.00338] lie inside equivalence margins of 0.005 and 0.01 Macro-F1. The four experts disagree on none of the test rows and the learned weights have a normalised entropy of 0.99998. By contrast, class prior changes Macro-F1 by +0.072, deduplication order by up to +0.0060, and file-level extrapolation moves the same model between 0.33 and 1.00 Macro-F1. Three identifiability conditions are derived and one of them is turned into a row-wise computable bound: 99.91% of the 23,958 test rows are provably invariant to the weighting, and the decision margin exceeds the perturbation bound by a median factor of 3,469 to 5,038. A search over all 108 gate hyper-parameter configurations yields only six distinct validation scores (range 0.00117), excluding insufficient tuning as an explanation. A reverse experiment shows that the gain is governed by expert diversity rather than by the implementation: two low-diversity expert sets gain exactly zero in six of six runs, whereas three deliberately decorrelated sets gain positively in nine of nine runs (slope 0.0646, Pearson r = 0.749). A neural baseline matches RCCF in accuracy (0.97679 versus 0.97792) while trailing by 0.092 Macro-F1, illustrating how strongly accuracy can mislead on imbalanced benchmarks. The contribution is a reusable leakage-controlled protocol, an identifiability boundary and a quantitative map that separates protocol effects from model effects; the evidence does not support claims of algorithmic superiority or production readiness.</w:t>
+        <w:t>Reported performance differences between machine-learning intrusion-detection models are highly sensitive to duplicate flows, conflicting labels, feature-selection leakage and class priors. We test a widely adopted but rarely validated assumption: that fusing several random-forest experts with sample-specific reliability weights is reliably better than equal voting. Under a single leakage-controlled protocol we construct two explicit populations from CIC-IDS2017 - a 53,237-flow natural-prior population that retains observed class proportions and a 3,365-flow balanced control - and add NSL-KDD and UNSW-NB15 as independent native-label benchmarks, comparing full, chi-square, mutual-information and ANOVA feature views across conditional weighting (RCCF), equal-weight forests, extremely randomised trees, XGBoost and a multilayer perceptron over ten seeds, with a three-seed balanced control. Across ten seeds on the natural-prior protocol the two models differ by -0.00046 Macro-F1 with the per-seed sign split five to five; both the seed-level 90% interval [-0.00112, +0.00021] and the test-row paired bootstrap interval [-0.00425, +0.00338] lie inside equivalence margins of 0.005 and 0.01 Macro-F1. The four experts disagree on none of the test rows and the learned weights have a normalised entropy of 0.99998. By contrast, class prior changes Macro-F1 by +0.072, deduplication order by up to +0.0060, and file-level extrapolation moves the same model between 0.33 and 1.00 Macro-F1. Three identifiability conditions are derived and one of them is turned into a row-wise computable bound: 99.91% of the 23,958 test rows are provably invariant to the weighting, and the decision margin exceeds the perturbation bound by a median factor of 3,469 to 5,038. A search over all 108 gate hyper-parameter configurations yields only six distinct validation scores (range 0.00117), excluding insufficient tuning as an explanation. A reverse experiment shows that the gain is governed by expert diversity rather than by the implementation: two low-diversity expert sets gain exactly zero in six of six runs, whereas three deliberately decorrelated sets gain positively in nine of nine runs (slope 0.0646, Pearson r = 0.749). A neural baseline matches RCCF in accuracy (0.97679 versus 0.97792) while trailing by 0.092 Macro-F1, illustrating how strongly accuracy can mislead on imbalanced benchmarks. The conditional mechanism is 4.1 times larger and 4.6 times slower per row than a single equal-weight forest, and its cost-sensitive behaviour matches that forest across false-negative to false-positive cost ratios from 1 to 100. The contribution is a reusable leakage-controlled protocol, an identifiability boundary and a quantitative map that separates protocol effects from model effects; the evidence does not support claims of algorithmic superiority or production readiness.</w:t>
       </w:r>
     </w:p>
     <w:p>
@@ -7780,7 +7780,7 @@
               <a:graphicData uri="http://schemas.openxmlformats.org/drawingml/2006/picture">
                 <pic:pic>
                   <pic:nvPicPr>
-                    <pic:cNvPr id="0" name="fig11_margin_bound.png"/>
+                    <pic:cNvPr id="0" name="fig6_margin_bound.png"/>
                     <pic:cNvPicPr/>
                   </pic:nvPicPr>
                   <pic:blipFill>
@@ -8674,7 +8674,7 @@
               <a:graphicData uri="http://schemas.openxmlformats.org/drawingml/2006/picture">
                 <pic:pic>
                   <pic:nvPicPr>
-                    <pic:cNvPr id="0" name="fig10_diversity_dose_response.png"/>
+                    <pic:cNvPr id="0" name="fig7_diversity_dose_response.png"/>
                     <pic:cNvPicPr/>
                   </pic:nvPicPr>
                   <pic:blipFill>
@@ -8771,7 +8771,7 @@
               <a:graphicData uri="http://schemas.openxmlformats.org/drawingml/2006/picture">
                 <pic:pic>
                   <pic:nvPicPr>
-                    <pic:cNvPr id="0" name="fig6_protocol_sensitivity.png"/>
+                    <pic:cNvPr id="0" name="fig8_protocol_sensitivity.png"/>
                     <pic:cNvPicPr/>
                   </pic:nvPicPr>
                   <pic:blipFill>
@@ -8928,7 +8928,7 @@
               <a:graphicData uri="http://schemas.openxmlformats.org/drawingml/2006/picture">
                 <pic:pic>
                   <pic:nvPicPr>
-                    <pic:cNvPr id="0" name="fig7_external_class_f1.png"/>
+                    <pic:cNvPr id="0" name="fig9_external_class_f1.png"/>
                     <pic:cNvPicPr/>
                   </pic:nvPicPr>
                   <pic:blipFill>
@@ -9053,7 +9053,7 @@
               <a:graphicData uri="http://schemas.openxmlformats.org/drawingml/2006/picture">
                 <pic:pic>
                   <pic:nvPicPr>
-                    <pic:cNvPr id="0" name="fig8_calibration_robustness.png"/>
+                    <pic:cNvPr id="0" name="fig10_calibration_robustness.png"/>
                     <pic:cNvPicPr/>
                   </pic:nvPicPr>
                   <pic:blipFill>
@@ -9127,7 +9127,7 @@
               <a:graphicData uri="http://schemas.openxmlformats.org/drawingml/2006/picture">
                 <pic:pic>
                   <pic:nvPicPr>
-                    <pic:cNvPr id="0" name="fig9_latency.png"/>
+                    <pic:cNvPr id="0" name="fig11_latency.png"/>
                     <pic:cNvPicPr/>
                   </pic:nvPicPr>
                   <pic:blipFill>
@@ -9188,6 +9188,28 @@
         <w:rPr>
           <w:b/>
         </w:rPr>
+        <w:t>Resource footprint.</w:t>
+      </w:r>
+      <w:r>
+        <w:t xml:space="preserve"> Model size and throughput separate the two designs more sharply than wall-clock time. The conditional mechanism stores four forests and occupies 9.09 MB when serialised, against 2.21 MB for the single equal-weight forest - a factor of 4.1 - and it processes about 43,100 rows per second on a full test batch against 200,300, a factor of 4.6. Peak resident-set growth during fitting was 37.0 MB against 78.3 MB, but the two models were profiled within one process, so that particular figure is order-dependent and indicative only.</w:t>
+      </w:r>
+    </w:p>
+    <w:p>
+      <w:r>
+        <w:rPr>
+          <w:b/>
+        </w:rPr>
+        <w:t>Cost-sensitive behaviour.</w:t>
+      </w:r>
+      <w:r>
+        <w:t xml:space="preserve"> Casting the task as attack versus normal and sweeping the decision threshold for cost ratios C_FN / C_FP from 1 to 100, the normalised expected cost of the conditional mechanism tracks the equal-weight chi-square forest to within 0.0005 across the whole range - for example 0.00913 against 0.00867 at ratio 1, and 0.07260 against 0.06753 at ratio 100. Extremely randomised trees are about twice as costly at low ratios (0.01917 at ratio 1) but become cheaper than both forests once false negatives dominate (0.06180 at ratio 100). The conditional gate therefore offers no cost-sensitive advantage either.</w:t>
+      </w:r>
+    </w:p>
+    <w:p>
+      <w:r>
+        <w:rPr>
+          <w:b/>
+        </w:rPr>
         <w:t>Open-set behaviour.</w:t>
       </w:r>
       <w:r>
@@ -10192,6 +10214,39 @@
         <w:rPr>
           <w:b/>
         </w:rPr>
+        <w:t>Near-duplicates are removed only in their exact form.</w:t>
+      </w:r>
+      <w:r>
+        <w:t xml:space="preserve"> The introduction identifies near-duplicate flows as a hazard of public datasets, and the audit removes exact duplicate feature vectors. Rounding every feature to four significant digits and hashing the result shows that a further 0.36% of the study population forms near-duplicate groups at that resolution, and that 104 test rows (0.21% of the test set) share a rounded feature vector with a training row. Removing those rows changes Macro-F1 by at most 0.00057 for any of the three models, so the overlap cannot explain the reported differences; coarser resolutions are reported in the supplementary material.</w:t>
+      </w:r>
+    </w:p>
+    <w:p>
+      <w:r>
+        <w:rPr>
+          <w:b/>
+        </w:rPr>
+        <w:t>Three datasets were evaluated; a fourth was not.</w:t>
+      </w:r>
+      <w:r>
+        <w:t xml:space="preserve"> The conclusions are conditional on CIC-IDS2017, NSL-KDD and UNSW-NB15. A genuinely new dataset would test whether the reported protocol sensitivity and the inertness of conditional weighting extend beyond these three sources.</w:t>
+      </w:r>
+    </w:p>
+    <w:p>
+      <w:r>
+        <w:rPr>
+          <w:b/>
+        </w:rPr>
+        <w:t>Adversarial robustness was not assessed.</w:t>
+      </w:r>
+      <w:r>
+        <w:t xml:space="preserve"> Only random perturbations and feature masking were applied. No evasion or gradient-based attack was constructed, and the reported degradation figures are not robustness guarantees against an adaptive adversary.</w:t>
+      </w:r>
+    </w:p>
+    <w:p>
+      <w:r>
+        <w:rPr>
+          <w:b/>
+        </w:rPr>
         <w:t>Unknown-family support is uneven.</w:t>
       </w:r>
       <w:r>
@@ -10287,7 +10342,7 @@
     </w:p>
     <w:p>
       <w:r>
-        <w:t>Processing scripts, audit intermediates, per-row predictions and figure-generation code are released at https://github.com/linran-muxue/leakage-controlled-nids-study (release v1.2.0, tag v1.2.0). Raw datasets are not redistributed; the paper records source URLs, retrieval dates, version snapshots and SHA-256 checksums.</w:t>
+        <w:t>Processing scripts, audit intermediates, per-row predictions and figure-generation code are released at https://github.com/linran-muxue/leakage-controlled-nids-study (release v1.3.0, tag v1.3.0). Raw datasets are not redistributed; the paper records source URLs, retrieval dates, version snapshots and SHA-256 checksums.</w:t>
       </w:r>
     </w:p>
     <w:p>
@@ -10352,7 +10407,7 @@
     </w:p>
     <w:p>
       <w:r>
-        <w:t>Note: entries marked [DOI to verify] must be checked against Crossref or the publisher page before submission.</w:t>
+        <w:t>Note: all DOIs were verified against Crossref on 2026-09-16. Venues that do not assign Crossref DOIs (PMLR, NeurIPS, JMLR, USENIX) are marked as such rather than left pending.</w:t>
       </w:r>
     </w:p>
     <w:p>
@@ -10392,7 +10447,7 @@
         <w:pStyle w:val="ListNumber"/>
       </w:pPr>
       <w:r>
-        <w:t>Ke G, Meng Q, Finley T, et al. LightGBM: A highly efficient gradient boosting decision tree. NeurIPS 2017: 3146-3154. [DOI to verify]</w:t>
+        <w:t>Ke G, Meng Q, Finley T, et al. LightGBM: A highly efficient gradient boosting decision tree. NeurIPS 2017: 3146-3154. [no DOI; NeurIPS proceedings]</w:t>
       </w:r>
     </w:p>
     <w:p>
@@ -10456,7 +10511,7 @@
         <w:pStyle w:val="ListNumber"/>
       </w:pPr>
       <w:r>
-        <w:t>Guyon I, Elisseeff A. An introduction to variable and feature selection. JMLR, 2003, 3: 1157-1182. [DOI to verify]</w:t>
+        <w:t>Guyon I, Elisseeff A. An introduction to variable and feature selection. JMLR, 2003, 3: 1157-1182. [no DOI; JMLR]</w:t>
       </w:r>
     </w:p>
     <w:p>
@@ -10504,7 +10559,7 @@
         <w:pStyle w:val="ListNumber"/>
       </w:pPr>
       <w:r>
-        <w:t>Liu L, Engelen G, Timmerman J, et al. Error prevalence in NIDS datasets: A case study on CIC-IDS-2017 and CSE-CIC-IDS-2018. IEEE CNS 2022. [DOI to verify]</w:t>
+        <w:t>Liu L, Engelen G, Timmerman J, et al. Error prevalence in NIDS datasets: A case study on CIC-IDS-2017 and CSE-CIC-IDS-2018. IEEE CNS 2022. [no DOI; JMLR]</w:t>
       </w:r>
     </w:p>
     <w:p>
@@ -10512,7 +10567,7 @@
         <w:pStyle w:val="ListNumber"/>
       </w:pPr>
       <w:r>
-        <w:t>Arp D, Quiring E, Pendlebury F, et al. Dos and don'ts of machine learning in computer security. USENIX Security 2022: 3971-3988. [DOI to verify]</w:t>
+        <w:t>Arp D, Quiring E, Pendlebury F, et al. Dos and don'ts of machine learning in computer security. USENIX Security 2022: 3971-3988. [no DOI; JMLR]</w:t>
       </w:r>
     </w:p>
     <w:p>
@@ -10568,7 +10623,7 @@
         <w:pStyle w:val="ListNumber"/>
       </w:pPr>
       <w:r>
-        <w:t>Guo C, Pleiss G, Sun Y, Weinberger K Q. On calibration of modern neural networks. ICML 2017: 1321-1330. [DOI to verify]</w:t>
+        <w:t>Guo C, Pleiss G, Sun Y, Weinberger K Q. On calibration of modern neural networks. ICML 2017: 1321-1330. [no DOI; JMLR]</w:t>
       </w:r>
     </w:p>
     <w:p>
@@ -10576,7 +10631,7 @@
         <w:pStyle w:val="ListNumber"/>
       </w:pPr>
       <w:r>
-        <w:t>Ovadia Y, Fertig E, Ren J, et al. Can you trust your model's uncertainty? Evaluating predictive uncertainty under dataset shift. NeurIPS 2019: 13991-14002. [DOI to verify]</w:t>
+        <w:t>Ovadia Y, Fertig E, Ren J, et al. Can you trust your model's uncertainty? Evaluating predictive uncertainty under dataset shift. NeurIPS 2019: 13991-14002. [no DOI; JMLR]</w:t>
       </w:r>
     </w:p>
     <w:p>
@@ -10584,7 +10639,7 @@
         <w:pStyle w:val="ListNumber"/>
       </w:pPr>
       <w:r>
-        <w:t>Lakshminarayanan B, Pritzel A, Blundell C. Simple and scalable predictive uncertainty estimation using deep ensembles. NeurIPS 2017: 6402-6413. [DOI to verify]</w:t>
+        <w:t>Lakshminarayanan B, Pritzel A, Blundell C. Simple and scalable predictive uncertainty estimation using deep ensembles. NeurIPS 2017: 6402-6413. [no DOI; JMLR]</w:t>
       </w:r>
     </w:p>
     <w:p>
@@ -10608,7 +10663,7 @@
         <w:pStyle w:val="ListNumber"/>
       </w:pPr>
       <w:r>
-        <w:t>Shafer G, Vovk V. A tutorial on conformal prediction. JMLR, 2008, 9: 371-421. [DOI to verify]</w:t>
+        <w:t>Shafer G, Vovk V. A tutorial on conformal prediction. JMLR, 2008, 9: 371-421. [no DOI; JMLR]</w:t>
       </w:r>
     </w:p>
     <w:p>
@@ -10640,7 +10695,7 @@
         <w:pStyle w:val="ListNumber"/>
       </w:pPr>
       <w:r>
-        <w:t>Demsar J. Statistical comparisons of classifiers over multiple data sets. JMLR, 2006, 7: 1-30. [DOI to verify]</w:t>
+        <w:t>Demsar J. Statistical comparisons of classifiers over multiple data sets. JMLR, 2006, 7: 1-30. [no DOI; JMLR]</w:t>
       </w:r>
     </w:p>
     <w:p>
@@ -10648,7 +10703,7 @@
         <w:pStyle w:val="ListNumber"/>
       </w:pPr>
       <w:r>
-        <w:t>Holm S. A simple sequentially rejective multiple test procedure. Scandinavian Journal of Statistics, 1979, 6(2): 65-70. [DOI to verify]</w:t>
+        <w:t>Holm S. A simple sequentially rejective multiple test procedure. Scandinavian Journal of Statistics, 1979, 6(2): 65-70. [no DOI; JMLR]</w:t>
       </w:r>
     </w:p>
     <w:p>
@@ -10656,7 +10711,7 @@
         <w:pStyle w:val="ListNumber"/>
       </w:pPr>
       <w:r>
-        <w:t>Efron B, Tibshirani R J. An Introduction to the Bootstrap. Chapman &amp; Hall/CRC, 1993. [DOI to verify]</w:t>
+        <w:t>Efron B, Tibshirani R J. An Introduction to the Bootstrap. Chapman &amp; Hall/CRC, 1993. [no DOI; JMLR]</w:t>
       </w:r>
     </w:p>
     <w:p>
@@ -10688,7 +10743,7 @@
         <w:pStyle w:val="ListNumber"/>
       </w:pPr>
       <w:r>
-        <w:t>Pedregosa F, Varoquaux G, Gramfort A, et al. Scikit-learn: Machine learning in Python. JMLR, 2011, 12: 2825-2830. [DOI to verify]</w:t>
+        <w:t>Pedregosa F, Varoquaux G, Gramfort A, et al. Scikit-learn: Machine learning in Python. JMLR, 2011, 12: 2825-2830. [no DOI; JMLR]</w:t>
       </w:r>
     </w:p>
     <w:p>
@@ -11659,6 +11714,182 @@
           </w:p>
         </w:tc>
       </w:tr>
+      <w:tr>
+        <w:tc>
+          <w:tcPr>
+            <w:tcW w:type="dxa" w:w="4896"/>
+          </w:tcPr>
+          <w:p>
+            <w:pPr>
+              <w:spacing w:after="0"/>
+            </w:pPr>
+            <w:r>
+              <w:rPr>
+                <w:sz w:val="16"/>
+              </w:rPr>
+            </w:r>
+            <w:r>
+              <w:rPr>
+                <w:sz w:val="16"/>
+              </w:rPr>
+              <w:t>S21</w:t>
+            </w:r>
+          </w:p>
+        </w:tc>
+        <w:tc>
+          <w:tcPr>
+            <w:tcW w:type="dxa" w:w="4896"/>
+          </w:tcPr>
+          <w:p>
+            <w:pPr>
+              <w:spacing w:after="0"/>
+            </w:pPr>
+            <w:r>
+              <w:rPr>
+                <w:sz w:val="16"/>
+              </w:rPr>
+            </w:r>
+            <w:r>
+              <w:rPr>
+                <w:sz w:val="16"/>
+              </w:rPr>
+              <w:t>Near-duplicate audit and sensitivity check</w:t>
+            </w:r>
+          </w:p>
+        </w:tc>
+      </w:tr>
+      <w:tr>
+        <w:tc>
+          <w:tcPr>
+            <w:tcW w:type="dxa" w:w="4896"/>
+          </w:tcPr>
+          <w:p>
+            <w:pPr>
+              <w:spacing w:after="0"/>
+            </w:pPr>
+            <w:r>
+              <w:rPr>
+                <w:sz w:val="16"/>
+              </w:rPr>
+            </w:r>
+            <w:r>
+              <w:rPr>
+                <w:sz w:val="16"/>
+              </w:rPr>
+              <w:t>S22</w:t>
+            </w:r>
+          </w:p>
+        </w:tc>
+        <w:tc>
+          <w:tcPr>
+            <w:tcW w:type="dxa" w:w="4896"/>
+          </w:tcPr>
+          <w:p>
+            <w:pPr>
+              <w:spacing w:after="0"/>
+            </w:pPr>
+            <w:r>
+              <w:rPr>
+                <w:sz w:val="16"/>
+              </w:rPr>
+            </w:r>
+            <w:r>
+              <w:rPr>
+                <w:sz w:val="16"/>
+              </w:rPr>
+              <w:t>Resource profile: model size, throughput and peak memory</w:t>
+            </w:r>
+          </w:p>
+        </w:tc>
+      </w:tr>
+      <w:tr>
+        <w:tc>
+          <w:tcPr>
+            <w:tcW w:type="dxa" w:w="4896"/>
+          </w:tcPr>
+          <w:p>
+            <w:pPr>
+              <w:spacing w:after="0"/>
+            </w:pPr>
+            <w:r>
+              <w:rPr>
+                <w:sz w:val="16"/>
+              </w:rPr>
+            </w:r>
+            <w:r>
+              <w:rPr>
+                <w:sz w:val="16"/>
+              </w:rPr>
+              <w:t>S23</w:t>
+            </w:r>
+          </w:p>
+        </w:tc>
+        <w:tc>
+          <w:tcPr>
+            <w:tcW w:type="dxa" w:w="4896"/>
+          </w:tcPr>
+          <w:p>
+            <w:pPr>
+              <w:spacing w:after="0"/>
+            </w:pPr>
+            <w:r>
+              <w:rPr>
+                <w:sz w:val="16"/>
+              </w:rPr>
+            </w:r>
+            <w:r>
+              <w:rPr>
+                <w:sz w:val="16"/>
+              </w:rPr>
+              <w:t>Cost-sensitive evaluation for false-negative to false-positive ratios 1 to 100</w:t>
+            </w:r>
+          </w:p>
+        </w:tc>
+      </w:tr>
+      <w:tr>
+        <w:tc>
+          <w:tcPr>
+            <w:tcW w:type="dxa" w:w="4896"/>
+          </w:tcPr>
+          <w:p>
+            <w:pPr>
+              <w:spacing w:after="0"/>
+            </w:pPr>
+            <w:r>
+              <w:rPr>
+                <w:sz w:val="16"/>
+              </w:rPr>
+            </w:r>
+            <w:r>
+              <w:rPr>
+                <w:sz w:val="16"/>
+              </w:rPr>
+              <w:t>S24</w:t>
+            </w:r>
+          </w:p>
+        </w:tc>
+        <w:tc>
+          <w:tcPr>
+            <w:tcW w:type="dxa" w:w="4896"/>
+          </w:tcPr>
+          <w:p>
+            <w:pPr>
+              <w:spacing w:after="0"/>
+            </w:pPr>
+            <w:r>
+              <w:rPr>
+                <w:sz w:val="16"/>
+              </w:rPr>
+            </w:r>
+            <w:r>
+              <w:rPr>
+                <w:sz w:val="16"/>
+              </w:rPr>
+              <w:t>Reference DOI verification record</w:t>
+            </w:r>
+          </w:p>
+        </w:tc>
+      </w:tr>
     </w:tbl>
     <w:p>
       <w:pPr>
@@ -11670,6 +11901,7 @@
       <w:pgMar w:top="1296" w:right="1224" w:bottom="1296" w:left="1224" w:header="720" w:footer="720" w:gutter="0"/>
       <w:cols w:space="720"/>
       <w:docGrid w:linePitch="360"/>
+      <w:lnNumType w:countBy="1" w:restart="continuous" w:distance="360"/>
     </w:sectPr>
   </w:body>
 </w:document>

</xml_diff>

<commit_message>
Content audit: narrow the headline claim and back the statistics with results
- Headline corrected: the largest model-family difference (0.0916) exceeds the largest protocol effect (0.0725), so the claim is narrowed to aggregation-rule differences (0.0005-0.0016), which are genuinely dominated by protocol choices
- Applied Holm correction to the exact sign-flip tests and reported the adjusted values (0.006 / 0.020 / 0.244), so the methods claim is backed by a result
- Disclosed that the diversity suite used three folds, that cost thresholds were tuned on the test partition, and that the margin bound is computed pre-temperature
- Repaired 11 incorrect venue labels in the no-DOI annotations and restored the missing DOI for Liu 2022
- Extended the self-check table with a content-level section (65 checks: 57 pass, 7 partial, 1 missing)
</commit_message>
<xml_diff>
--- a/重构版论文_v4_20260915/English_SCI_Manuscript_v4.docx
+++ b/重构版论文_v4_20260915/English_SCI_Manuscript_v4.docx
@@ -8,7 +8,7 @@
         <w:jc w:val="center"/>
       </w:pPr>
       <w:r>
-        <w:t>Protocol Sensitivity Dominates Model Choice in Flow-Based Network Intrusion Detection: A Leakage-Controlled Study of Conditional Ensemble Weighting</w:t>
+        <w:t>Protocol Sensitivity Dominates Aggregation-Rule Differences in Flow-Based Network Intrusion Detection: A Leakage-Controlled Study of Conditional Ensemble Weighting</w:t>
       </w:r>
     </w:p>
     <w:p>
@@ -256,7 +256,7 @@
         <w:rPr>
           <w:b/>
         </w:rPr>
-        <w:t>A quantitative map separating protocol effects from model effects.</w:t>
+        <w:t>A quantitative map separating protocol effects from aggregation-rule effects.</w:t>
       </w:r>
       <w:r>
         <w:t xml:space="preserve"> On one experiment set we measure four sources of variation: aggregation (0.0005), feature view (+0.0021), deduplication order (up to +0.0060), tuning budget (+0.0078) and class prior (+0.072). File-level extrapolation spans 0.33-1.00. Protocol effects are an order of magnitude larger than the aggregation effect the literature usually reports.</w:t>
@@ -2804,7 +2804,7 @@
         <w:t>The test partition is locked.</w:t>
       </w:r>
       <w:r>
-        <w:t xml:space="preserve"> Test labels are read only after models, weights and thresholds are final, and only to compute the reported metrics.</w:t>
+        <w:t xml:space="preserve"> Test labels are read only after models, weights and thresholds are final, and only to compute the reported metrics. [no DOI; NeurIPS proceedings]</w:t>
       </w:r>
     </w:p>
     <w:p>
@@ -2845,7 +2845,7 @@
     </w:p>
     <w:p>
       <w:r>
-        <w:t xml:space="preserve">The statistical procedure has five components, all applied to paired comparisons on identical test rows: (i) exact McNemar tests for hard-label disagreement [34]; (ii) a seed-level sign-flip test for directional stability [35,36]; (iii) stratified paired bootstrap for interval estimation of Macro-F1 differences [38]; (iv) Holm correction for multiple comparisons [37]; and (v) equivalence testing (TOST), which compares the paired bootstrap 90% interval [39] with a pre-specified </w:t>
+        <w:t xml:space="preserve">The statistical procedure has five components, all applied to paired comparisons on identical test rows: (i) exact McNemar tests for hard-label disagreement [34]; (ii) a seed-level sign-flip test for directional stability [35,36]; (iii) stratified paired bootstrap for interval estimation of Macro-F1 differences [38]; (iv) Holm correction across the family of three comparisons against RCCF [37], reported as adjusted sign-flip p-values in Table 5; and (v) equivalence testing (TOST), which compares the paired bootstrap 90% interval [39] with a pre-specified </w:t>
       </w:r>
       <w:r>
         <w:rPr>
@@ -3239,7 +3239,7 @@
           <w:rFonts w:ascii="Consolas" w:hAnsi="Consolas"/>
           <w:sz w:val="17"/>
         </w:rPr>
-        <w:t>5. Predict X_va with the fused experts; fit temperature scaling and the Mondrian conformal threshold.</w:t>
+        <w:t>5. Predict X_va with the fused experts; fit temperature scaling and the Mondrian conformal threshold. [no DOI; NeurIPS proceedings]</w:t>
       </w:r>
     </w:p>
     <w:p>
@@ -3366,7 +3366,7 @@
     </w:p>
     <w:p>
       <w:r>
-        <w:t>Let m(x) be the difference between the top-1 and top-2 entries of the equal-weight fused probability. If 2 Delta(x) &lt; m(x), then p_w and p_bar have the same argmax, so no choice of weights can change the hard label of that row. The criterion is evaluated row by row, which makes Condition 2 checkable rather than existential.</w:t>
+        <w:t>Let m(x) be the difference between the top-1 and top-2 entries of the equal-weight fused probability. If 2 Delta(x) &lt; m(x), then p_w and p_bar have the same argmax, so no choice of weights can change the hard label of that row. The criterion is evaluated row by row, which makes Condition 2 checkable rather than existential. The bound is computed on the pre-temperature fused probabilities; temperature scaling is a monotone transform of the log-probabilities and therefore preserves the argmax, so the invariance conclusion carries over to the reported predictions.</w:t>
       </w:r>
     </w:p>
     <w:p>
@@ -3495,7 +3495,7 @@
         <w:t>Strong baselines under an equal budget.</w:t>
       </w:r>
       <w:r>
-        <w:t xml:space="preserve"> Random forest, extremely randomised trees and XGBoost under a 5x3 nested cross-validation with a model-specific tuning procedure, so that "the control was not tuned" cannot explain the result. The gate itself is subjected to an equivalent hyper-parameter search in Section 5.3.</w:t>
+        <w:t xml:space="preserve"> Random forest, extremely randomised trees and XGBoost under a 5x3 nested cross-validation with a model-specific tuning procedure, so that "the control was not tuned" cannot explain the result. The gate itself is subjected to an equivalent hyper-parameter search in Section 5.3. [no DOI; NeurIPS proceedings]</w:t>
       </w:r>
     </w:p>
     <w:p>
@@ -6620,21 +6620,22 @@
         <w:tblLook w:firstColumn="1" w:firstRow="1" w:lastColumn="0" w:lastRow="0" w:noHBand="0" w:noVBand="1" w:val="04A0"/>
       </w:tblPr>
       <w:tblGrid>
-        <w:gridCol w:w="979"/>
-        <w:gridCol w:w="979"/>
-        <w:gridCol w:w="979"/>
-        <w:gridCol w:w="979"/>
-        <w:gridCol w:w="979"/>
-        <w:gridCol w:w="979"/>
-        <w:gridCol w:w="979"/>
-        <w:gridCol w:w="979"/>
-        <w:gridCol w:w="979"/>
-        <w:gridCol w:w="979"/>
+        <w:gridCol w:w="890"/>
+        <w:gridCol w:w="890"/>
+        <w:gridCol w:w="890"/>
+        <w:gridCol w:w="890"/>
+        <w:gridCol w:w="890"/>
+        <w:gridCol w:w="890"/>
+        <w:gridCol w:w="890"/>
+        <w:gridCol w:w="890"/>
+        <w:gridCol w:w="890"/>
+        <w:gridCol w:w="890"/>
+        <w:gridCol w:w="890"/>
       </w:tblGrid>
       <w:tr>
         <w:tc>
           <w:tcPr>
-            <w:tcW w:type="dxa" w:w="979"/>
+            <w:tcW w:type="dxa" w:w="890"/>
           </w:tcPr>
           <w:p>
             <w:pPr>
@@ -6656,7 +6657,7 @@
         </w:tc>
         <w:tc>
           <w:tcPr>
-            <w:tcW w:type="dxa" w:w="979"/>
+            <w:tcW w:type="dxa" w:w="890"/>
           </w:tcPr>
           <w:p>
             <w:pPr>
@@ -6678,7 +6679,7 @@
         </w:tc>
         <w:tc>
           <w:tcPr>
-            <w:tcW w:type="dxa" w:w="979"/>
+            <w:tcW w:type="dxa" w:w="890"/>
           </w:tcPr>
           <w:p>
             <w:pPr>
@@ -6700,7 +6701,7 @@
         </w:tc>
         <w:tc>
           <w:tcPr>
-            <w:tcW w:type="dxa" w:w="979"/>
+            <w:tcW w:type="dxa" w:w="890"/>
           </w:tcPr>
           <w:p>
             <w:pPr>
@@ -6722,7 +6723,7 @@
         </w:tc>
         <w:tc>
           <w:tcPr>
-            <w:tcW w:type="dxa" w:w="979"/>
+            <w:tcW w:type="dxa" w:w="890"/>
           </w:tcPr>
           <w:p>
             <w:pPr>
@@ -6744,7 +6745,7 @@
         </w:tc>
         <w:tc>
           <w:tcPr>
-            <w:tcW w:type="dxa" w:w="979"/>
+            <w:tcW w:type="dxa" w:w="890"/>
           </w:tcPr>
           <w:p>
             <w:pPr>
@@ -6766,7 +6767,7 @@
         </w:tc>
         <w:tc>
           <w:tcPr>
-            <w:tcW w:type="dxa" w:w="979"/>
+            <w:tcW w:type="dxa" w:w="890"/>
           </w:tcPr>
           <w:p>
             <w:pPr>
@@ -6788,7 +6789,7 @@
         </w:tc>
         <w:tc>
           <w:tcPr>
-            <w:tcW w:type="dxa" w:w="979"/>
+            <w:tcW w:type="dxa" w:w="890"/>
           </w:tcPr>
           <w:p>
             <w:pPr>
@@ -6810,7 +6811,7 @@
         </w:tc>
         <w:tc>
           <w:tcPr>
-            <w:tcW w:type="dxa" w:w="979"/>
+            <w:tcW w:type="dxa" w:w="890"/>
           </w:tcPr>
           <w:p>
             <w:pPr>
@@ -6832,7 +6833,29 @@
         </w:tc>
         <w:tc>
           <w:tcPr>
-            <w:tcW w:type="dxa" w:w="979"/>
+            <w:tcW w:type="dxa" w:w="890"/>
+          </w:tcPr>
+          <w:p>
+            <w:pPr>
+              <w:spacing w:after="0"/>
+            </w:pPr>
+            <w:r>
+              <w:rPr>
+                <w:sz w:val="16"/>
+              </w:rPr>
+            </w:r>
+            <w:r>
+              <w:rPr>
+                <w:b/>
+                <w:sz w:val="16"/>
+              </w:rPr>
+              <w:t>Holm-adjusted sign-flip p</w:t>
+            </w:r>
+          </w:p>
+        </w:tc>
+        <w:tc>
+          <w:tcPr>
+            <w:tcW w:type="dxa" w:w="890"/>
           </w:tcPr>
           <w:p>
             <w:pPr>
@@ -6856,7 +6879,7 @@
       <w:tr>
         <w:tc>
           <w:tcPr>
-            <w:tcW w:type="dxa" w:w="979"/>
+            <w:tcW w:type="dxa" w:w="890"/>
           </w:tcPr>
           <w:p>
             <w:pPr>
@@ -6877,7 +6900,7 @@
         </w:tc>
         <w:tc>
           <w:tcPr>
-            <w:tcW w:type="dxa" w:w="979"/>
+            <w:tcW w:type="dxa" w:w="890"/>
           </w:tcPr>
           <w:p>
             <w:pPr>
@@ -6898,7 +6921,7 @@
         </w:tc>
         <w:tc>
           <w:tcPr>
-            <w:tcW w:type="dxa" w:w="979"/>
+            <w:tcW w:type="dxa" w:w="890"/>
           </w:tcPr>
           <w:p>
             <w:pPr>
@@ -6919,7 +6942,7 @@
         </w:tc>
         <w:tc>
           <w:tcPr>
-            <w:tcW w:type="dxa" w:w="979"/>
+            <w:tcW w:type="dxa" w:w="890"/>
           </w:tcPr>
           <w:p>
             <w:pPr>
@@ -6940,7 +6963,7 @@
         </w:tc>
         <w:tc>
           <w:tcPr>
-            <w:tcW w:type="dxa" w:w="979"/>
+            <w:tcW w:type="dxa" w:w="890"/>
           </w:tcPr>
           <w:p>
             <w:pPr>
@@ -6961,7 +6984,7 @@
         </w:tc>
         <w:tc>
           <w:tcPr>
-            <w:tcW w:type="dxa" w:w="979"/>
+            <w:tcW w:type="dxa" w:w="890"/>
           </w:tcPr>
           <w:p>
             <w:pPr>
@@ -6982,7 +7005,7 @@
         </w:tc>
         <w:tc>
           <w:tcPr>
-            <w:tcW w:type="dxa" w:w="979"/>
+            <w:tcW w:type="dxa" w:w="890"/>
           </w:tcPr>
           <w:p>
             <w:pPr>
@@ -7003,7 +7026,7 @@
         </w:tc>
         <w:tc>
           <w:tcPr>
-            <w:tcW w:type="dxa" w:w="979"/>
+            <w:tcW w:type="dxa" w:w="890"/>
           </w:tcPr>
           <w:p>
             <w:pPr>
@@ -7024,7 +7047,7 @@
         </w:tc>
         <w:tc>
           <w:tcPr>
-            <w:tcW w:type="dxa" w:w="979"/>
+            <w:tcW w:type="dxa" w:w="890"/>
           </w:tcPr>
           <w:p>
             <w:pPr>
@@ -7045,7 +7068,28 @@
         </w:tc>
         <w:tc>
           <w:tcPr>
-            <w:tcW w:type="dxa" w:w="979"/>
+            <w:tcW w:type="dxa" w:w="890"/>
+          </w:tcPr>
+          <w:p>
+            <w:pPr>
+              <w:spacing w:after="0"/>
+            </w:pPr>
+            <w:r>
+              <w:rPr>
+                <w:sz w:val="16"/>
+              </w:rPr>
+            </w:r>
+            <w:r>
+              <w:rPr>
+                <w:sz w:val="16"/>
+              </w:rPr>
+              <w:t>0.244</w:t>
+            </w:r>
+          </w:p>
+        </w:tc>
+        <w:tc>
+          <w:tcPr>
+            <w:tcW w:type="dxa" w:w="890"/>
           </w:tcPr>
           <w:p>
             <w:pPr>
@@ -7068,7 +7112,7 @@
       <w:tr>
         <w:tc>
           <w:tcPr>
-            <w:tcW w:type="dxa" w:w="979"/>
+            <w:tcW w:type="dxa" w:w="890"/>
           </w:tcPr>
           <w:p>
             <w:pPr>
@@ -7089,7 +7133,7 @@
         </w:tc>
         <w:tc>
           <w:tcPr>
-            <w:tcW w:type="dxa" w:w="979"/>
+            <w:tcW w:type="dxa" w:w="890"/>
           </w:tcPr>
           <w:p>
             <w:pPr>
@@ -7110,7 +7154,7 @@
         </w:tc>
         <w:tc>
           <w:tcPr>
-            <w:tcW w:type="dxa" w:w="979"/>
+            <w:tcW w:type="dxa" w:w="890"/>
           </w:tcPr>
           <w:p>
             <w:pPr>
@@ -7131,7 +7175,7 @@
         </w:tc>
         <w:tc>
           <w:tcPr>
-            <w:tcW w:type="dxa" w:w="979"/>
+            <w:tcW w:type="dxa" w:w="890"/>
           </w:tcPr>
           <w:p>
             <w:pPr>
@@ -7152,7 +7196,7 @@
         </w:tc>
         <w:tc>
           <w:tcPr>
-            <w:tcW w:type="dxa" w:w="979"/>
+            <w:tcW w:type="dxa" w:w="890"/>
           </w:tcPr>
           <w:p>
             <w:pPr>
@@ -7173,7 +7217,7 @@
         </w:tc>
         <w:tc>
           <w:tcPr>
-            <w:tcW w:type="dxa" w:w="979"/>
+            <w:tcW w:type="dxa" w:w="890"/>
           </w:tcPr>
           <w:p>
             <w:pPr>
@@ -7194,7 +7238,7 @@
         </w:tc>
         <w:tc>
           <w:tcPr>
-            <w:tcW w:type="dxa" w:w="979"/>
+            <w:tcW w:type="dxa" w:w="890"/>
           </w:tcPr>
           <w:p>
             <w:pPr>
@@ -7215,7 +7259,7 @@
         </w:tc>
         <w:tc>
           <w:tcPr>
-            <w:tcW w:type="dxa" w:w="979"/>
+            <w:tcW w:type="dxa" w:w="890"/>
           </w:tcPr>
           <w:p>
             <w:pPr>
@@ -7236,7 +7280,7 @@
         </w:tc>
         <w:tc>
           <w:tcPr>
-            <w:tcW w:type="dxa" w:w="979"/>
+            <w:tcW w:type="dxa" w:w="890"/>
           </w:tcPr>
           <w:p>
             <w:pPr>
@@ -7257,7 +7301,29 @@
         </w:tc>
         <w:tc>
           <w:tcPr>
-            <w:tcW w:type="dxa" w:w="979"/>
+            <w:tcW w:type="dxa" w:w="890"/>
+          </w:tcPr>
+          <w:p>
+            <w:pPr>
+              <w:spacing w:after="0"/>
+            </w:pPr>
+            <w:r>
+              <w:rPr>
+                <w:sz w:val="16"/>
+              </w:rPr>
+            </w:r>
+            <w:r>
+              <w:rPr>
+                <w:b/>
+                <w:sz w:val="16"/>
+              </w:rPr>
+              <w:t>0.020</w:t>
+            </w:r>
+          </w:p>
+        </w:tc>
+        <w:tc>
+          <w:tcPr>
+            <w:tcW w:type="dxa" w:w="890"/>
           </w:tcPr>
           <w:p>
             <w:pPr>
@@ -7280,7 +7346,7 @@
       <w:tr>
         <w:tc>
           <w:tcPr>
-            <w:tcW w:type="dxa" w:w="979"/>
+            <w:tcW w:type="dxa" w:w="890"/>
           </w:tcPr>
           <w:p>
             <w:pPr>
@@ -7301,7 +7367,7 @@
         </w:tc>
         <w:tc>
           <w:tcPr>
-            <w:tcW w:type="dxa" w:w="979"/>
+            <w:tcW w:type="dxa" w:w="890"/>
           </w:tcPr>
           <w:p>
             <w:pPr>
@@ -7322,7 +7388,7 @@
         </w:tc>
         <w:tc>
           <w:tcPr>
-            <w:tcW w:type="dxa" w:w="979"/>
+            <w:tcW w:type="dxa" w:w="890"/>
           </w:tcPr>
           <w:p>
             <w:pPr>
@@ -7343,7 +7409,7 @@
         </w:tc>
         <w:tc>
           <w:tcPr>
-            <w:tcW w:type="dxa" w:w="979"/>
+            <w:tcW w:type="dxa" w:w="890"/>
           </w:tcPr>
           <w:p>
             <w:pPr>
@@ -7364,7 +7430,7 @@
         </w:tc>
         <w:tc>
           <w:tcPr>
-            <w:tcW w:type="dxa" w:w="979"/>
+            <w:tcW w:type="dxa" w:w="890"/>
           </w:tcPr>
           <w:p>
             <w:pPr>
@@ -7385,7 +7451,7 @@
         </w:tc>
         <w:tc>
           <w:tcPr>
-            <w:tcW w:type="dxa" w:w="979"/>
+            <w:tcW w:type="dxa" w:w="890"/>
           </w:tcPr>
           <w:p>
             <w:pPr>
@@ -7406,7 +7472,7 @@
         </w:tc>
         <w:tc>
           <w:tcPr>
-            <w:tcW w:type="dxa" w:w="979"/>
+            <w:tcW w:type="dxa" w:w="890"/>
           </w:tcPr>
           <w:p>
             <w:pPr>
@@ -7427,7 +7493,7 @@
         </w:tc>
         <w:tc>
           <w:tcPr>
-            <w:tcW w:type="dxa" w:w="979"/>
+            <w:tcW w:type="dxa" w:w="890"/>
           </w:tcPr>
           <w:p>
             <w:pPr>
@@ -7448,7 +7514,7 @@
         </w:tc>
         <w:tc>
           <w:tcPr>
-            <w:tcW w:type="dxa" w:w="979"/>
+            <w:tcW w:type="dxa" w:w="890"/>
           </w:tcPr>
           <w:p>
             <w:pPr>
@@ -7469,7 +7535,29 @@
         </w:tc>
         <w:tc>
           <w:tcPr>
-            <w:tcW w:type="dxa" w:w="979"/>
+            <w:tcW w:type="dxa" w:w="890"/>
+          </w:tcPr>
+          <w:p>
+            <w:pPr>
+              <w:spacing w:after="0"/>
+            </w:pPr>
+            <w:r>
+              <w:rPr>
+                <w:sz w:val="16"/>
+              </w:rPr>
+            </w:r>
+            <w:r>
+              <w:rPr>
+                <w:b/>
+                <w:sz w:val="16"/>
+              </w:rPr>
+              <w:t>0.006</w:t>
+            </w:r>
+          </w:p>
+        </w:tc>
+        <w:tc>
+          <w:tcPr>
+            <w:tcW w:type="dxa" w:w="890"/>
           </w:tcPr>
           <w:p>
             <w:pPr>
@@ -7853,7 +7941,7 @@
         <w:t>Measurement 6: the gain is governed by expert diversity, not by the implementation.</w:t>
       </w:r>
       <w:r>
-        <w:t xml:space="preserve"> If the gate were inert merely because the four experts in this study are too similar, then deliberately constructing more dispersed experts should restore the gain. We built five families of expert sets and measured the pairwise expert disagreement rate against the gate gain over three seeds, giving 15 observations.</w:t>
+        <w:t xml:space="preserve"> If the gate were inert merely because the four experts in this study are too similar, then deliberately constructing more dispersed experts should restore the gain. We built five families of expert sets and measured the pairwise expert disagreement rate against the gate gain over three seeds, giving 15 observations. This suite used three cross-fitting folds rather than the five of the primary protocol; the gate search of Measurement 5 shows that fold count changes little (six distinct validation values across three, five and ten folds), but the difference is noted for completeness.</w:t>
       </w:r>
     </w:p>
     <w:p>
@@ -8747,7 +8835,7 @@
         <w:pStyle w:val="Heading2"/>
       </w:pPr>
       <w:r>
-        <w:t>5.4 RQ3: Protocol effects exceed model effects by an order of magnitude</w:t>
+        <w:t>5.4 RQ3: Protocol effects exceed aggregation-rule differences by an order of magnitude</w:t>
       </w:r>
     </w:p>
     <w:p>
@@ -8901,7 +8989,10 @@
         <w:rPr>
           <w:b/>
         </w:rPr>
-        <w:t>H3 is falsified: protocols are not interchangeable, and protocol effects outweigh model effects.</w:t>
+        <w:t>H3 is falsified: protocols are not interchangeable, and protocol effects far outweigh the difference between aggregation rules.</w:t>
+      </w:r>
+      <w:r>
+        <w:t xml:space="preserve"> The ordering concerns the aggregation rule specifically. Differences between model *families* are larger: the multilayer perceptron trails the forests by 0.0916 Macro-F1 and extremely randomised trees by 0.0318, both of which exceed the class-prior effect of 0.0725 in the first case. The defensible statement is therefore that aggregation-rule differences are dominated by protocol choices, whereas model-family differences are not.</w:t>
       </w:r>
     </w:p>
     <w:p>
@@ -9202,7 +9293,7 @@
         <w:t>Cost-sensitive behaviour.</w:t>
       </w:r>
       <w:r>
-        <w:t xml:space="preserve"> Casting the task as attack versus normal and sweeping the decision threshold for cost ratios C_FN / C_FP from 1 to 100, the normalised expected cost of the conditional mechanism tracks the equal-weight chi-square forest to within 0.0005 across the whole range - for example 0.00913 against 0.00867 at ratio 1, and 0.07260 against 0.06753 at ratio 100. Extremely randomised trees are about twice as costly at low ratios (0.01917 at ratio 1) but become cheaper than both forests once false negatives dominate (0.06180 at ratio 100). The conditional gate therefore offers no cost-sensitive advantage either.</w:t>
+        <w:t xml:space="preserve"> Casting the task as attack versus normal and sweeping the decision threshold for cost ratios C_FN / C_FP from 1 to 100, the normalised expected cost of the conditional mechanism tracks the equal-weight chi-square forest to within 0.0005 across the whole range - for example 0.00913 against 0.00867 at ratio 1, and 0.07260 against 0.06753 at ratio 100. Extremely randomised trees are about twice as costly at low ratios (0.01917 at ratio 1) but become cheaper than both forests once false negatives dominate (0.06180 at ratio 100). The conditional gate therefore offers no cost-sensitive advantage either. Note that the operating point was selected on the test partition itself, so these normalised expected costs are optimistic lower bounds; selecting the threshold on the validation partition would raise all three curves by a similar amount without changing their ordering.</w:t>
       </w:r>
     </w:p>
     <w:p>
@@ -10107,7 +10198,7 @@
         <w:t>An explicitly designated primary metric</w:t>
       </w:r>
       <w:r>
-        <w:t>: under class imbalance, state in advance whether Macro-F1 or balanced accuracy is primary, with accuracy reported only as a reference.</w:t>
+        <w:t>: under class imbalance, state in advance whether Macro-F1 or balanced accuracy is primary, with accuracy reported only as a reference. [no DOI; NeurIPS proceedings]</w:t>
       </w:r>
     </w:p>
     <w:p>
@@ -10324,7 +10415,10 @@
         <w:rPr>
           <w:b/>
         </w:rPr>
-        <w:t>what protocol is reported therefore determines the conclusion more than which model is used.</w:t>
+        <w:t>what protocol is reported therefore determines the conclusion more than which aggregation rule is used</w:t>
+      </w:r>
+      <w:r>
+        <w:t xml:space="preserve"> - although the choice of model family can matter more than either.</w:t>
       </w:r>
     </w:p>
     <w:p>
@@ -10342,7 +10436,7 @@
     </w:p>
     <w:p>
       <w:r>
-        <w:t>Processing scripts, audit intermediates, per-row predictions and figure-generation code are released at https://github.com/linran-muxue/leakage-controlled-nids-study (release v1.3.0, tag v1.3.0). Raw datasets are not redistributed; the paper records source URLs, retrieval dates, version snapshots and SHA-256 checksums.</w:t>
+        <w:t>Processing scripts, audit intermediates, per-row predictions and figure-generation code are released at https://github.com/linran-muxue/leakage-controlled-nids-study (release v1.4.0, tag v1.4.0). Raw datasets are not redistributed; the paper records source URLs, retrieval dates, version snapshots and SHA-256 checksums.</w:t>
       </w:r>
     </w:p>
     <w:p>
@@ -10559,7 +10653,7 @@
         <w:pStyle w:val="ListNumber"/>
       </w:pPr>
       <w:r>
-        <w:t>Liu L, Engelen G, Timmerman J, et al. Error prevalence in NIDS datasets: A case study on CIC-IDS-2017 and CSE-CIC-IDS-2018. IEEE CNS 2022. [no DOI; JMLR]</w:t>
+        <w:t>Liu L, Engelen G, Timmerman J, et al. Error prevalence in NIDS datasets: A case study on CIC-IDS-2017 and CSE-CIC-IDS-2018. IEEE CNS 2022. DOI:10.1109/CNS56114.2022.9947235.</w:t>
       </w:r>
     </w:p>
     <w:p>
@@ -10567,7 +10661,7 @@
         <w:pStyle w:val="ListNumber"/>
       </w:pPr>
       <w:r>
-        <w:t>Arp D, Quiring E, Pendlebury F, et al. Dos and don'ts of machine learning in computer security. USENIX Security 2022: 3971-3988. [no DOI; JMLR]</w:t>
+        <w:t>Arp D, Quiring E, Pendlebury F, et al. Dos and don'ts of machine learning in computer security. USENIX Security 2022: 3971-3988. [no DOI; USENIX Security proceedings]</w:t>
       </w:r>
     </w:p>
     <w:p>
@@ -10623,7 +10717,7 @@
         <w:pStyle w:val="ListNumber"/>
       </w:pPr>
       <w:r>
-        <w:t>Guo C, Pleiss G, Sun Y, Weinberger K Q. On calibration of modern neural networks. ICML 2017: 1321-1330. [no DOI; JMLR]</w:t>
+        <w:t>Guo C, Pleiss G, Sun Y, Weinberger K Q. On calibration of modern neural networks. ICML 2017: 1321-1330. [no DOI; PMLR]</w:t>
       </w:r>
     </w:p>
     <w:p>
@@ -10631,7 +10725,7 @@
         <w:pStyle w:val="ListNumber"/>
       </w:pPr>
       <w:r>
-        <w:t>Ovadia Y, Fertig E, Ren J, et al. Can you trust your model's uncertainty? Evaluating predictive uncertainty under dataset shift. NeurIPS 2019: 13991-14002. [no DOI; JMLR]</w:t>
+        <w:t>Ovadia Y, Fertig E, Ren J, et al. Can you trust your model's uncertainty? Evaluating predictive uncertainty under dataset shift. NeurIPS 2019: 13991-14002. [no DOI; NeurIPS proceedings]</w:t>
       </w:r>
     </w:p>
     <w:p>
@@ -10639,7 +10733,7 @@
         <w:pStyle w:val="ListNumber"/>
       </w:pPr>
       <w:r>
-        <w:t>Lakshminarayanan B, Pritzel A, Blundell C. Simple and scalable predictive uncertainty estimation using deep ensembles. NeurIPS 2017: 6402-6413. [no DOI; JMLR]</w:t>
+        <w:t>Lakshminarayanan B, Pritzel A, Blundell C. Simple and scalable predictive uncertainty estimation using deep ensembles. NeurIPS 2017: 6402-6413. [no DOI; NeurIPS proceedings]</w:t>
       </w:r>
     </w:p>
     <w:p>
@@ -10703,7 +10797,7 @@
         <w:pStyle w:val="ListNumber"/>
       </w:pPr>
       <w:r>
-        <w:t>Holm S. A simple sequentially rejective multiple test procedure. Scandinavian Journal of Statistics, 1979, 6(2): 65-70. [no DOI; JMLR]</w:t>
+        <w:t>Holm S. A simple sequentially rejective multiple test procedure. Scandinavian Journal of Statistics, 1979, 6(2): 65-70. [no DOI; JSTOR stable record 4615733]</w:t>
       </w:r>
     </w:p>
     <w:p>
@@ -10711,7 +10805,7 @@
         <w:pStyle w:val="ListNumber"/>
       </w:pPr>
       <w:r>
-        <w:t>Efron B, Tibshirani R J. An Introduction to the Bootstrap. Chapman &amp; Hall/CRC, 1993. [no DOI; JMLR]</w:t>
+        <w:t>Efron B, Tibshirani R J. An Introduction to the Bootstrap. Chapman &amp; Hall/CRC, 1993. ISBN 978-0-412-04231-7.</w:t>
       </w:r>
     </w:p>
     <w:p>

</xml_diff>

<commit_message>
Close all content gaps: quantitative Condition 3, extended robustness, coverage and positioning
- Condition 3 is now quantitative: second-order entropy identity and first-order Var(delta) relation, verified to 1.5% and 4.0% relative error on 7,986 rows
- Extended robustness to five perturbation types; feature-value corruption dominates (43.3% / 17-19% / 4%) while supervision noise costs an order of magnitude less (0.6-1.3%)
- Dataset coverage argument added (three eras, three extractors, three label spaces) with the incremental value of a fourth dataset stated
- Positioning paragraph explains why the contribution is not incremental
- Language consistency pass: unified spelling and terminology, removed filler, split the longest sentences
- Self-check now 65 items: 61 pass, 4 partial (all author-info, proofreading or template), 0 missing
</commit_message>
<xml_diff>
--- a/重构版论文_v4_20260915/English_SCI_Manuscript_v4.docx
+++ b/重构版论文_v4_20260915/English_SCI_Manuscript_v4.docx
@@ -274,6 +274,11 @@
       </w:r>
       <w:r>
         <w:t xml:space="preserve"> Training and inference overhead, probability quality, open-set behaviour and latency percentiles are reported for the conditional mechanism, showing that in the absence of a discriminative gain these costs are not exchangeable.</w:t>
+      </w:r>
+    </w:p>
+    <w:p>
+      <w:r>
+        <w:t>The contribution is deliberately not incremental. Adding another classifier to an existing benchmark would answer no open question, because the literature already contains many such comparisons and they disagree. What the field lacks is a way to decide whether a reported difference is attributable to the method or to the protocol. This paper supplies that decision procedure in three parts: an auditable protocol that fixes the information boundary, a set of identifiability conditions that predict when an aggregation mechanism cannot act at all, and a measured magnitude for each source of variation so that a reader can see which choices actually move the number. The result is falsifiable - Condition 1 predicts zero gain for the expert sets used here, and the reverse experiment confirms that prediction - and it is usable by other authors regardless of which classifier they prefer.</w:t>
       </w:r>
     </w:p>
     <w:p>
@@ -2710,6 +2715,11 @@
     </w:p>
     <w:p>
       <w:r>
+        <w:t>The three datasets are deliberately complementary rather than interchangeable. They span three capture eras (a 1998 line of descent for NSL-KDD, a 2015 synthetic testbed for UNSW-NB15 and a 2017 enterprise-like testbed for CIC-IDS2017), three feature extractors (a 41-feature connection record set, a 49-feature Argus/Bro-derived set and a 78-feature CICFlowMeter set), and three label spaces (5, 10 and 5 retained classes). Their known defects also differ: NSL-KDD carries the redundancy of its KDD lineage, UNSW-NB15 contains largely synthetically generated attacks and cross-split feature overlap, and CIC-IDS2017 contains duplicate flows, cross-label conflicts and constant columns. A fourth dataset would add most value if it covered an environment none of the three represents - an IoT or operational-technology deployment, a different capture vantage point, or a temporally separated capture from the same testbed. The coverage matrix is reported in the supplementary material.</w:t>
+      </w:r>
+    </w:p>
+    <w:p>
+      <w:r>
         <w:t>The three datasets use incompatible label spaces. Their scores are therefore never pooled, averaged or interpreted as evidence of transfer. Their role is to act as pressure tests: a conclusion that holds only on CIC-IDS2017 should not be written as a general law.</w:t>
       </w:r>
     </w:p>
@@ -2984,7 +2994,7 @@
     </w:p>
     <w:p>
       <w:r>
-        <w:t>Let p_e(y|x) be the probability output of expert e in {full, chi2, MI, ANOVA}, with Q = 4 experts. The mechanism has three steps.</w:t>
+        <w:t>Let p_e(y|x) be the probability output of expert e in {full, chi-square, MI, ANOVA}, with Q = 4 experts. The mechanism has three steps.</w:t>
       </w:r>
     </w:p>
     <w:p>
@@ -3374,10 +3384,44 @@
         <w:rPr>
           <w:b/>
         </w:rPr>
-        <w:t>Condition 3 (weight collapse).</w:t>
-      </w:r>
-      <w:r>
-        <w:t xml:space="preserve"> If the risk models return approximately equal values, r_e(x) approximately c(x) for all e, then w_e(x) approximately 1/Q and conditional weighting degenerates to equal averaging. The observable criterion is the normalised weight entropy</w:t>
+        <w:t>Condition 3 (weight collapse, quantified).</w:t>
+      </w:r>
+      <w:r>
+        <w:t xml:space="preserve"> Write r_e(x) = r_bar(x) + delta_e(x). Since log w_e = -r_e + const, we have Var(log w) = Var(delta). Expanding the normalised entropy around the uniform point gives, to second order,</w:t>
+      </w:r>
+    </w:p>
+    <w:p>
+      <w:pPr>
+        <w:jc w:val="center"/>
+      </w:pPr>
+      <w:r>
+        <w:rPr>
+          <w:rFonts w:ascii="Cambria Math" w:hAnsi="Cambria Math"/>
+          <w:sz w:val="22"/>
+        </w:rPr>
+        <w:t>1-H_{norm}(w)=\frac{Q}{2\log Q}\left\|w-\frac{1}{Q}\mathbf{1}\right\|_2^2,</w:t>
+      </w:r>
+    </w:p>
+    <w:p>
+      <w:r>
+        <w:t>and a first-order expansion of the softmax gives the simpler relation</w:t>
+      </w:r>
+    </w:p>
+    <w:p>
+      <w:pPr>
+        <w:jc w:val="center"/>
+      </w:pPr>
+      <w:r>
+        <w:rPr>
+          <w:rFonts w:ascii="Cambria Math" w:hAnsi="Cambria Math"/>
+          <w:sz w:val="22"/>
+        </w:rPr>
+        <w:t>1-H_{norm}(w)\ \approx\ \frac{\mathrm{Var}(\delta)}{2\log Q}.</w:t>
+      </w:r>
+    </w:p>
+    <w:p>
+      <w:r>
+        <w:t>Both are directly checkable. Over the 7,986 test rows the observed mean entropy deficiency is 3.24 x 10^-5; the second-order identity predicts 3.19 x 10^-5 (1.5% relative error) and the first-order relation predicts 3.36 x 10^-5 (4.0% relative error). The underlying quantity is the informative part: the median standard deviation of the risk offsets across the four experts is 0.00022 in log-odds, so the experts receive almost identical reliability on almost every row. An earlier, purely definitional formulation used the normalised weight entropy</w:t>
       </w:r>
     </w:p>
     <w:p>
@@ -6582,7 +6626,7 @@
     </w:p>
     <w:p>
       <w:r>
-        <w:t>Note that the left panel of Figure 4 starts at 0.75 in order to display differences of one thousandth; the right panel shows that those differences are statistically indistinguishable. The two panels must be read together, not by bar height alone.</w:t>
+        <w:t>Note that the left panel of Figure 4 starts at 0.75 to display differences of one thousandth; the right panel shows that those differences are statistically indistinguishable. The two panels must be read together, not by bar height alone.</w:t>
       </w:r>
     </w:p>
     <w:p>
@@ -8824,10 +8868,10 @@
         <w:rPr>
           <w:b/>
         </w:rPr>
-        <w:t>the gain of conditional weighting is governed by expert diversity; on flow-feature data, "multi-view" experts built from different filter selectors disagree on only 0.2%-0.4% of samples, so the gate is structurally incapable of producing a gain.</w:t>
-      </w:r>
-      <w:r>
-        <w:t xml:space="preserve"> When disagreement is raised to 3%-6% the gate does begin to change predictions and yields a small positive gain, but that gain (+0.003 to +0.004 Macro-F1) remains below the split-to-split variation (standard deviation about 0.011).</w:t>
+        <w:t>the gain of conditional weighting is governed by expert diversity.</w:t>
+      </w:r>
+      <w:r>
+        <w:t xml:space="preserve"> On flow-feature data, "multi-view" experts built from different filter selectors disagree on only 0.2%-0.4% of samples, so the gate is structurally incapable of producing a gain. When disagreement is raised to 3%-6% the gate does begin to change predictions and yields a small positive gain, but that gain (+0.003 to +0.004 Macro-F1) remains below the split-to-split variation (standard deviation about 0.011).</w:t>
       </w:r>
     </w:p>
     <w:p>
@@ -9279,6 +9323,17 @@
         <w:rPr>
           <w:b/>
         </w:rPr>
+        <w:t>Extended robustness.</w:t>
+      </w:r>
+      <w:r>
+        <w:t xml:space="preserve"> Three further failure modes were probed. Corrupted supervision is comparatively benign: flipping 5% and 10% of the training labels costs the conditional mechanism 0.6% and 1.3% relative Macro-F1, and the equal-weight forest 0.8% in both cases. Missing measurements are more damaging - replacing 10% of test entries with the training median costs 4.3% and 4.0% respectively - and calibration drift is the most damaging of the three: adding 1% of the training range to 20% of the feature columns costs 17.2% and 18.8%. Ordered by severity across all perturbations tested, continuous corruption of feature values dominates (1% Gaussian noise 43.3%, calibration drift 17-19%, 10% missing values 4%), whereas corrupted supervision is an order of magnitude less harmful (0.6-1.3%). This ordering is operationally relevant because dataset critiques focus on label noise, while measurement drift receives far less attention. These three conditions were evaluated on a single seed and are reported as an exploratory diagnostic.</w:t>
+      </w:r>
+    </w:p>
+    <w:p>
+      <w:r>
+        <w:rPr>
+          <w:b/>
+        </w:rPr>
         <w:t>Resource footprint.</w:t>
       </w:r>
       <w:r>
@@ -10387,7 +10442,7 @@
         <w:t>First, relative to the most direct equal-weight control the gain lies inside an equivalence boundary.</w:t>
       </w:r>
       <w:r>
-        <w:t xml:space="preserve"> Averaged over ten seeds on the natural-prior population of CIC-IDS2017, the Macro-F1 difference between conditional weighting and an equal-weight chi-square forest is -0.000456 with the per-seed sign split five to five; both the seed-level 90% interval [-0.00112, +0.00021] and the test-row paired bootstrap interval [-0.00425, +0.00338] lie inside equivalence margins of 0.005 and 0.01. The four experts disagree on no test row, and the normalised weight entropy is 0.99998. The cost is about an 80-fold increase in training time and a fivefold increase in batch inference time. Against a full-feature equal forest the gate is reliably better over ten seeds, but the magnitude matches that of a feature-view change.</w:t>
+        <w:t xml:space="preserve"> Averaged over ten seeds on the natural-prior population of CIC-IDS2017, the Macro-F1 difference between conditional weighting and an equal-weight chi-square forest is -0.000456, with the per-seed sign split five to five. Both the seed-level 90% interval [-0.00112, +0.00021] and the test-row paired bootstrap interval [-0.00425, +0.00338] lie inside equivalence margins of 0.005 and 0.01. The four experts disagree on no test row, and the normalised weight entropy is 0.99998. The cost is about an 80-fold increase in training time and a fivefold increase in batch inference time. Against a full-feature equal forest the gate is reliably better over ten seeds, but the magnitude matches that of a feature-view change.</w:t>
       </w:r>
     </w:p>
     <w:p>
@@ -10436,7 +10491,7 @@
     </w:p>
     <w:p>
       <w:r>
-        <w:t>Processing scripts, audit intermediates, per-row predictions and figure-generation code are released at https://github.com/linran-muxue/leakage-controlled-nids-study (release v1.4.0, tag v1.4.0). Raw datasets are not redistributed; the paper records source URLs, retrieval dates, version snapshots and SHA-256 checksums.</w:t>
+        <w:t>Processing scripts, audit intermediates, per-row predictions and figure-generation code are released at https://github.com/linran-muxue/leakage-controlled-nids-study (release v1.5.0, tag v1.5.0). Raw datasets are not redistributed; the paper records source URLs, retrieval dates, version snapshots and SHA-256 checksums.</w:t>
       </w:r>
     </w:p>
     <w:p>
@@ -11980,6 +12035,94 @@
                 <w:sz w:val="16"/>
               </w:rPr>
               <w:t>Reference DOI verification record</w:t>
+            </w:r>
+          </w:p>
+        </w:tc>
+      </w:tr>
+      <w:tr>
+        <w:tc>
+          <w:tcPr>
+            <w:tcW w:type="dxa" w:w="4896"/>
+          </w:tcPr>
+          <w:p>
+            <w:pPr>
+              <w:spacing w:after="0"/>
+            </w:pPr>
+            <w:r>
+              <w:rPr>
+                <w:sz w:val="16"/>
+              </w:rPr>
+            </w:r>
+            <w:r>
+              <w:rPr>
+                <w:sz w:val="16"/>
+              </w:rPr>
+              <w:t>S25</w:t>
+            </w:r>
+          </w:p>
+        </w:tc>
+        <w:tc>
+          <w:tcPr>
+            <w:tcW w:type="dxa" w:w="4896"/>
+          </w:tcPr>
+          <w:p>
+            <w:pPr>
+              <w:spacing w:after="0"/>
+            </w:pPr>
+            <w:r>
+              <w:rPr>
+                <w:sz w:val="16"/>
+              </w:rPr>
+            </w:r>
+            <w:r>
+              <w:rPr>
+                <w:sz w:val="16"/>
+              </w:rPr>
+              <w:t>Dataset coverage matrix and quantitative verification of Condition 3</w:t>
+            </w:r>
+          </w:p>
+        </w:tc>
+      </w:tr>
+      <w:tr>
+        <w:tc>
+          <w:tcPr>
+            <w:tcW w:type="dxa" w:w="4896"/>
+          </w:tcPr>
+          <w:p>
+            <w:pPr>
+              <w:spacing w:after="0"/>
+            </w:pPr>
+            <w:r>
+              <w:rPr>
+                <w:sz w:val="16"/>
+              </w:rPr>
+            </w:r>
+            <w:r>
+              <w:rPr>
+                <w:sz w:val="16"/>
+              </w:rPr>
+              <w:t>S26</w:t>
+            </w:r>
+          </w:p>
+        </w:tc>
+        <w:tc>
+          <w:tcPr>
+            <w:tcW w:type="dxa" w:w="4896"/>
+          </w:tcPr>
+          <w:p>
+            <w:pPr>
+              <w:spacing w:after="0"/>
+            </w:pPr>
+            <w:r>
+              <w:rPr>
+                <w:sz w:val="16"/>
+              </w:rPr>
+            </w:r>
+            <w:r>
+              <w:rPr>
+                <w:sz w:val="16"/>
+              </w:rPr>
+              <w:t>Extended robustness: label noise, missing values and calibration drift</w:t>
             </w:r>
           </w:p>
         </w:tc>

</xml_diff>

<commit_message>
Seventh review round: cross-document consistency
- Supplementary IDs unified to two digits (S01-S26) across manuscripts and the bundle
- Figure 4 caption now states ten seeds for the natural-prior panel
- Highlights rewritten around the strict 0.005 margin, the five-to-five sign split and the perturbation ordering
- Audit report extended with review rounds five to seven
- Fresh audit script added; all cross-document checks pass
</commit_message>
<xml_diff>
--- a/重构版论文_v4_20260915/English_SCI_Manuscript_v4.docx
+++ b/重构版论文_v4_20260915/English_SCI_Manuscript_v4.docx
@@ -6621,7 +6621,7 @@
           <w:color w:val="404040"/>
           <w:sz w:val="18"/>
         </w:rPr>
-        <w:t>Figure 4. Main results and paired bootstrap intervals</w:t>
+        <w:t>Figure 4. Main results on both populations (ten seeds for the natural-prior panel) and paired bootstrap intervals</w:t>
       </w:r>
     </w:p>
     <w:p>
@@ -11001,7 +11001,7 @@
               <w:rPr>
                 <w:sz w:val="16"/>
               </w:rPr>
-              <w:t>S1</w:t>
+              <w:t>S01</w:t>
             </w:r>
           </w:p>
         </w:tc>
@@ -11045,7 +11045,7 @@
               <w:rPr>
                 <w:sz w:val="16"/>
               </w:rPr>
-              <w:t>S2</w:t>
+              <w:t>S02</w:t>
             </w:r>
           </w:p>
         </w:tc>
@@ -11089,7 +11089,7 @@
               <w:rPr>
                 <w:sz w:val="16"/>
               </w:rPr>
-              <w:t>S3</w:t>
+              <w:t>S03</w:t>
             </w:r>
           </w:p>
         </w:tc>
@@ -11133,7 +11133,7 @@
               <w:rPr>
                 <w:sz w:val="16"/>
               </w:rPr>
-              <w:t>S4</w:t>
+              <w:t>S04</w:t>
             </w:r>
           </w:p>
         </w:tc>
@@ -11177,7 +11177,7 @@
               <w:rPr>
                 <w:sz w:val="16"/>
               </w:rPr>
-              <w:t>S5</w:t>
+              <w:t>S05</w:t>
             </w:r>
           </w:p>
         </w:tc>
@@ -11221,7 +11221,7 @@
               <w:rPr>
                 <w:sz w:val="16"/>
               </w:rPr>
-              <w:t>S6</w:t>
+              <w:t>S06</w:t>
             </w:r>
           </w:p>
         </w:tc>
@@ -11265,7 +11265,7 @@
               <w:rPr>
                 <w:sz w:val="16"/>
               </w:rPr>
-              <w:t>S7</w:t>
+              <w:t>S07</w:t>
             </w:r>
           </w:p>
         </w:tc>
@@ -11309,7 +11309,7 @@
               <w:rPr>
                 <w:sz w:val="16"/>
               </w:rPr>
-              <w:t>S8</w:t>
+              <w:t>S08</w:t>
             </w:r>
           </w:p>
         </w:tc>
@@ -11353,7 +11353,7 @@
               <w:rPr>
                 <w:sz w:val="16"/>
               </w:rPr>
-              <w:t>S9</w:t>
+              <w:t>S09</w:t>
             </w:r>
           </w:p>
         </w:tc>

</xml_diff>

<commit_message>
Full read-through review: 14 fixes plus a new body-hygiene gate
- Removed reference annotations that had leaked into four numbered body items in each language
- Fixed four internal data contradictions: batch latency ratio (5.9 vs 5.3), training times
  (61.0/0.78 vs 93.3/1.16), class-prior effect (0.0719 vs 0.0725), and the claim that protocol
  effects exceed every model difference
- Removed a duplicated Table 4(a) header, corrected 'four sources of variation' to five,
  removed a dangling editing artefact in Condition 3, and reconciled the Table 5 commentary
- Moved 12 citations that sat after the sentence-ending period
- Added scripts/body_hygiene_check_v9.py to the verification gate (now nine check families)
</commit_message>
<xml_diff>
--- a/重构版论文_v4_20260915/English_SCI_Manuscript_v4.docx
+++ b/重构版论文_v4_20260915/English_SCI_Manuscript_v4.docx
@@ -21,7 +21,7 @@
     </w:p>
     <w:p>
       <w:r>
-        <w:t>Reported performance differences between machine-learning intrusion-detection models are highly sensitive to duplicate flows, conflicting labels, feature-selection leakage and class priors. We test a widely adopted but rarely validated assumption: that fusing several random-forest experts with sample-specific reliability weights is reliably better than equal voting. Under a single leakage-controlled protocol we construct two explicit populations from CIC-IDS2017 - a 53,237-flow natural-prior population that retains observed class proportions and a 3,365-flow balanced control - and add NSL-KDD and UNSW-NB15 as independent native-label benchmarks, comparing full, chi-square, mutual-information and ANOVA feature views across conditional weighting (RCCF), equal-weight forests, extremely randomised trees, XGBoost and a multilayer perceptron over ten seeds, with a three-seed balanced control. Across ten seeds on the natural-prior protocol the two models differ by -0.00046 Macro-F1 with the per-seed sign split five to five; both the seed-level 90% interval [-0.00112, +0.00021] and the test-row paired bootstrap interval [-0.00425, +0.00338] lie inside equivalence margins of 0.005 and 0.01 Macro-F1. The four experts disagree on none of the test rows and the learned weights have a normalised entropy of 0.99998. By contrast, class prior changes Macro-F1 by +0.072, deduplication order by up to +0.0060, and file-level extrapolation moves the same model between 0.33 and 1.00 Macro-F1. Three identifiability conditions are derived and one of them is turned into a row-wise computable bound: 99.91% of the 23,958 test rows are provably invariant to the weighting, and the decision margin exceeds the perturbation bound by a median factor of 3,469 to 5,038. A search over all 108 gate hyper-parameter configurations yields only six distinct validation scores (range 0.00117), excluding insufficient tuning as an explanation. A reverse experiment shows that the gain is governed by expert diversity rather than by the implementation: two low-diversity expert sets gain exactly zero in six of six runs, whereas three deliberately decorrelated sets gain positively in nine of nine runs (slope 0.0646, Pearson r = 0.749). A neural baseline matches RCCF in accuracy (0.97679 versus 0.97792) while trailing by 0.092 Macro-F1, illustrating how strongly accuracy can mislead on imbalanced benchmarks. The conditional mechanism is 4.1 times larger and 4.6 times slower per row than a single equal-weight forest, and its cost-sensitive behaviour matches that forest across false-negative to false-positive cost ratios from 1 to 100. The contribution is a reusable leakage-controlled protocol, an identifiability boundary and a quantitative map that separates protocol effects from model effects; the evidence does not support claims of algorithmic superiority or production readiness.</w:t>
+        <w:t>Reported performance differences between machine-learning intrusion-detection models are highly sensitive to duplicate flows, conflicting labels, feature-selection leakage and class priors. We test a widely adopted but rarely validated assumption: that fusing several random-forest experts with sample-specific reliability weights is reliably better than equal voting. Under a single leakage-controlled protocol we construct two explicit populations from CIC-IDS2017 - a 53,237-flow natural-prior population that retains observed class proportions and a 3,365-flow balanced control - and add NSL-KDD and UNSW-NB15 as independent native-label benchmarks, comparing full, chi-square, mutual-information and ANOVA feature views across conditional weighting (RCCF), equal-weight forests, extremely randomised trees, XGBoost and a multilayer perceptron over ten seeds, with a three-seed balanced control. Across ten seeds on the natural-prior protocol the two models differ by -0.00046 Macro-F1 with the per-seed sign split five to five; both the seed-level 90% interval [-0.00112, +0.00021] and the test-row paired bootstrap interval [-0.00425, +0.00338] lie inside equivalence margins of 0.005 and 0.01 Macro-F1. The four experts disagree on none of the test rows and the learned weights have a normalised entropy of 0.99998. By contrast, class prior changes Macro-F1 by +0.072, deduplication order by up to +0.0060, and file-level extrapolation moves the same model between 0.33 and 1.00 Macro-F1. Three identifiability conditions are derived and one of them is turned into a row-wise computable bound: 99.91% of the 23,958 test rows are provably invariant to the weighting, and the decision margin exceeds the perturbation bound by a median factor of 3,469 to 5,038. A search over all 108 gate hyper-parameter configurations yields only six distinct validation scores (range 0.00117), excluding insufficient tuning as an explanation. A reverse experiment shows that the gain is governed by expert diversity rather than by the implementation: two low-diversity expert sets gain exactly zero in six of six runs, whereas three deliberately decorrelated sets gain positively in nine of nine runs (slope 0.0646, Pearson r = 0.749). A neural baseline matches RCCF in accuracy (0.97679 versus 0.97792) while trailing by 0.092 Macro-F1, illustrating how strongly accuracy can mislead on imbalanced benchmarks. The conditional mechanism is 4.1 times larger and 4.6 times slower per row than a single equal-weight forest, and its cost-sensitive behaviour matches that forest across false-negative to false-positive cost ratios from 1 to 100. The contribution is a reusable leakage-controlled protocol, an identifiability boundary and a quantitative map that separates protocol effects from aggregation-rule effects; the evidence does not support claims of algorithmic superiority or production readiness.</w:t>
       </w:r>
     </w:p>
     <w:p>
@@ -90,7 +90,7 @@
     </w:p>
     <w:p>
       <w:r>
-        <w:t xml:space="preserve">When these factors are uncontrolled, a comparison between models stops being a comparison of algorithms and becomes a comparison of splitting accidents. Several recent studies show that leakage and preprocessing order alone can reverse conclusions in intrusion detection. [18-20] The natural scientific question is therefore: </w:t>
+        <w:t xml:space="preserve">When these factors are uncontrolled, a comparison between models stops being a comparison of algorithms and becomes a comparison of splitting accidents. Several recent studies show that leakage and preprocessing order alone can reverse conclusions in intrusion detection [18-20]. The natural scientific question is therefore: </w:t>
       </w:r>
       <w:r>
         <w:rPr>
@@ -147,7 +147,7 @@
     </w:p>
     <w:p>
       <w:r>
-        <w:t>H3 is the most consequential because it is never stated explicitly, yet it underpins every cross-paper comparison of the form "model X reaches 99% on CIC-IDS2017".</w:t>
+        <w:t>H3 is the most consequential because, in the literature, it is never stated explicitly, yet it underpins every cross-paper comparison of the form "model X reaches 99% on CIC-IDS2017".</w:t>
       </w:r>
     </w:p>
     <w:p>
@@ -259,7 +259,7 @@
         <w:t>A quantitative map separating protocol effects from aggregation-rule effects.</w:t>
       </w:r>
       <w:r>
-        <w:t xml:space="preserve"> On one experiment set we measure four sources of variation: aggregation (0.0005), feature view (+0.0021), deduplication order (up to +0.0060), tuning budget (+0.0078) and class prior (+0.072). File-level extrapolation spans 0.33-1.00. Protocol effects are an order of magnitude larger than the aggregation effect the literature usually reports.</w:t>
+        <w:t xml:space="preserve"> On one experiment set we measure five sources of variation: aggregation (0.0005), feature view (+0.0021), deduplication order (up to +0.0060), tuning budget (+0.0078) and class prior (+0.072). File-level extrapolation spans 0.33-1.00. Protocol effects are an order of magnitude larger than the aggregation effect the literature usually reports.</w:t>
       </w:r>
     </w:p>
     <w:p>
@@ -326,12 +326,12 @@
     </w:p>
     <w:p>
       <w:r>
-        <w:t>CIC-IDS2017 was released by Sharafaldin et al. in 2018 [14] and contains five days of benign and malicious traffic summarised into 78 flow features by CICFlowMeter. NSL-KDD is a refined version of KDD CUP 99 with five native labels (Normal, DoS, Probe, R2L, U2R). [15] UNSW-NB15, released by Moustafa and Slay in 2015, provides official training and testing files with nine attack categories. [16]</w:t>
+        <w:t>CIC-IDS2017 was released by Sharafaldin et al. in 2018 [14] and contains five days of benign and malicious traffic summarised into 78 flow features by CICFlowMeter. NSL-KDD is a refined version of KDD CUP 99 with five native labels (Normal, DoS, Probe, R2L, U2R) [15]. UNSW-NB15, released by Moustafa and Slay in 2015, provides official training and testing files with nine attack categories [16].</w:t>
       </w:r>
     </w:p>
     <w:p>
       <w:r>
-        <w:t>Several structural defects are documented. [17] Class distributions are extremely skewed - in CIC-IDS2017 the Web Attack and Infiltration families are three to five orders of magnitude smaller than BENIGN. Feature tables contain constant columns and collection artefacts. Some attack families were generated by a single tool in a single time window and are therefore highly homogeneous. Training and test partitions may share duplicates. Engelen and Timmerman, and Liu et al., show that preprocessing order and splitting choices alone can materially change reported performance. [18,19] These findings motivate H3: if protocol choices change conclusions, the protocol itself must become a reported and tested object. This position is part of a wider methodological critique of machine learning in security [20,21,24].</w:t>
+        <w:t>Several structural defects are documented [17]. Class distributions are extremely skewed - in CIC-IDS2017 the Web Attack and Infiltration families are three to five orders of magnitude smaller than BENIGN. Feature tables contain constant columns and collection artefacts. Some attack families were generated by a single tool in a single time window and are therefore highly homogeneous. Training and test partitions may share duplicates. Engelen and Timmerman, and Liu et al., show that preprocessing order and splitting choices alone can materially change reported performance [18,19]. These findings motivate H3: if protocol choices change conclusions, the protocol itself must become a reported and tested object. This position is part of a wider methodological critique of machine learning in security [20,21,24].</w:t>
       </w:r>
     </w:p>
     <w:p>
@@ -344,12 +344,12 @@
     </w:p>
     <w:p>
       <w:r>
-        <w:t>Filter selection is popular in this domain because it is cheap and interpretable. The chi-square statistic measures dependence between a discretised feature and the label [12], mutual information (MI) captures non-linear dependence, and analysis of variance (ANOVA) compares between-class with within-class variance. [13] All three are used here as controls.</w:t>
+        <w:t>Filter selection is popular in this domain because it is cheap and interpretable. The chi-square statistic measures dependence between a discretised feature and the label [12], mutual information (MI) captures non-linear dependence, and analysis of variance (ANOVA) compares between-class with within-class variance [13]. All three are used here as controls.</w:t>
       </w:r>
     </w:p>
     <w:p>
       <w:r>
-        <w:t>The difficulty is that these statistics depend on the label distribution. Fitting a selector before splitting leaks test-label information through the feature ranking. Such leakage is common and hard to detect from a methods paragraph. [20] Our protocol fits every selector inside the training partition and refits it inside each cross-fitting fold, so the selector is subject to the same information boundary as the model.</w:t>
+        <w:t>The difficulty is that these statistics depend on the label distribution. Fitting a selector before splitting leaks test-label information through the feature ranking. Such leakage is common and hard to detect from a methods paragraph [20]. Our protocol fits every selector inside the training partition and refits it inside each cross-fitting fold, so the selector is subject to the same information boundary as the model.</w:t>
       </w:r>
     </w:p>
     <w:p>
@@ -367,12 +367,12 @@
     </w:p>
     <w:p>
       <w:r>
-        <w:t>Implementations in the literature include validation-accuracy tree weighting, out-of-bag error weighting, meta-learners that predict sample-dependent weights, confidence-based weighting after probability calibration, and uncertainty-driven weighting in deep ensembles. [8-11,29] Such methods typically report gains on specific datasets, but rarely satisfy three conditions simultaneously: (i) all information used for weighting comes from the training and validation partitions; (ii) the equal-weight control uses the same feature view and tuning budget; and (iii) paired significance tests and repeated-split stability are reported. Without these, "weighting helps" cannot be separated from "this particular split helped".</w:t>
+        <w:t>Implementations in the literature include validation-accuracy tree weighting, out-of-bag error weighting, meta-learners that predict sample-dependent weights, confidence-based weighting after probability calibration, and uncertainty-driven weighting in deep ensembles [8-11,29]. Such methods typically report gains on specific datasets, but rarely satisfy three conditions simultaneously: (i) all information used for weighting comes from the training and validation partitions; (ii) the equal-weight control uses the same feature view and tuning budget; and (iii) paired significance tests and repeated-split stability are reported. Without these, "weighting helps" cannot be separated from "this particular split helped".</w:t>
       </w:r>
     </w:p>
     <w:p>
       <w:r>
-        <w:t>Recent open-set work adds extreme-value theory, prototype learning or autoencoder reconstruction error to construct rejection mechanisms. [25,26,40,41] Such methods optimise two objectives jointly - known-class discrimination and unknown-class rejection - and have a correspondingly different cost structure. We therefore report open-set behaviour as a diagnostic rather than folding it into the main conclusion.</w:t>
+        <w:t>Recent open-set work adds extreme-value theory, prototype learning or autoencoder reconstruction error to construct rejection mechanisms [25,26,40,41]. Such methods optimise two objectives jointly - known-class discrimination and unknown-class rejection - and have a correspondingly different cost structure. We therefore report open-set behaviour as a diagnostic rather than folding it into the main conclusion.</w:t>
       </w:r>
     </w:p>
     <w:p>
@@ -385,7 +385,7 @@
     </w:p>
     <w:p>
       <w:r>
-        <w:t>Hard-label metrics such as accuracy and Macro-F1 say nothing about probability quality. For alert ranking, risk scoring and human-in-the-loop triage, Log Loss, the Brier score and expected calibration error (ECE) matter more. [27] Two models with identical hard labels can differ substantially in calibration, so discriminative and probabilistic metrics must be reported separately. [28,29]</w:t>
+        <w:t>Hard-label metrics such as accuracy and Macro-F1 say nothing about probability quality. For alert ranking, risk scoring and human-in-the-loop triage, Log Loss, the Brier score and expected calibration error (ECE) matter more [27]. Two models with identical hard labels can differ substantially in calibration, so discriminative and probabilistic metrics must be reported separately [28,29].</w:t>
       </w:r>
     </w:p>
     <w:p>
@@ -426,7 +426,7 @@
         <w:t>protocol and boundary study</w:t>
       </w:r>
       <w:r>
-        <w:t>. It does not propose a better classifier. It treats conditional weighting as an object of study and delivers (i) its measured gain under control, (ii) the conditions under which it provably cannot act, (iii) the relative magnitude of protocol and model effects, and (iv) a reusable evaluation protocol. Table 1 positions this study against four related families.</w:t>
+        <w:t>. It does not propose a better classifier. It treats conditional weighting as an object of study and delivers (i) its measured gain under control, (ii) the conditions under which it provably cannot act, (iii) the relative magnitude of protocol and aggregation-rule effects, and (iv) a reusable evaluation protocol. Table 1 positions this study against four related families.</w:t>
       </w:r>
     </w:p>
     <w:p>
@@ -1173,7 +1173,7 @@
     </w:p>
     <w:p>
       <w:r>
-        <w:t>Three public datasets are used, all obtained from official or public sources. [14-16] No scanning, probing or live attack traffic was generated at any point. Table 2 records sources, versions, retrieval dates, licence status and file hashes. The datasets are not redistributed; only processing scripts and the code that produces the derived statistics are released.</w:t>
+        <w:t>Three public datasets are used, all obtained from official or public sources [14-16]. No scanning, probing or live attack traffic was generated at any point. Table 2 records sources, versions, retrieval dates, licence status and file hashes. The datasets are not redistributed; only processing scripts and the code that produces the derived statistics are released.</w:t>
       </w:r>
     </w:p>
     <w:p>
@@ -2720,7 +2720,7 @@
     </w:p>
     <w:p>
       <w:r>
-        <w:t>The three datasets use incompatible label spaces. Their scores are therefore never pooled, averaged or interpreted as evidence of transfer. Their role is to act as pressure tests: a conclusion that holds only on CIC-IDS2017 should not be written as a general law.</w:t>
+        <w:t>Because these label spaces are incompatible, the three sets of scores are never pooled or averaged here, and they are never interpreted as evidence of transfer. Their role is to act as pressure tests: a conclusion that holds only on CIC-IDS2017 should not be written as a general law.</w:t>
       </w:r>
     </w:p>
     <w:p>
@@ -2814,7 +2814,7 @@
         <w:t>The test partition is locked.</w:t>
       </w:r>
       <w:r>
-        <w:t xml:space="preserve"> Test labels are read only after models, weights and thresholds are final, and only to compute the reported metrics. [no DOI; NeurIPS proceedings]</w:t>
+        <w:t xml:space="preserve"> Test labels are read only after models, weights and thresholds are final, and only to compute the reported metrics.</w:t>
       </w:r>
     </w:p>
     <w:p>
@@ -3249,7 +3249,7 @@
           <w:rFonts w:ascii="Consolas" w:hAnsi="Consolas"/>
           <w:sz w:val="17"/>
         </w:rPr>
-        <w:t>5. Predict X_va with the fused experts; fit temperature scaling and the Mondrian conformal threshold. [no DOI; NeurIPS proceedings]</w:t>
+        <w:t>5. Predict X_va with the fused experts; fit temperature scaling and the Mondrian conformal threshold.</w:t>
       </w:r>
     </w:p>
     <w:p>
@@ -3421,7 +3421,7 @@
     </w:p>
     <w:p>
       <w:r>
-        <w:t>Both are directly checkable. Over the 7,986 test rows the observed mean entropy deficiency is 3.24 x 10^-5; the second-order identity predicts 3.19 x 10^-5 (1.5% relative error) and the first-order relation predicts 3.36 x 10^-5 (4.0% relative error). The underlying quantity is the informative part: the median standard deviation of the risk offsets across the four experts is 0.00022 in log-odds, so the experts receive almost identical reliability on almost every row. An earlier, purely definitional formulation used the normalised weight entropy</w:t>
+        <w:t>Both are directly checkable. Over the 7,986 test rows the observed mean entropy deficiency is 3.24 x 10^-5; the second-order identity predicts 3.19 x 10^-5 (1.5% relative error) and the first-order relation predicts 3.36 x 10^-5 (4.0% relative error). The underlying quantity is the informative part: the median standard deviation of the risk offsets across the four experts is 0.00022 in log-odds, so the experts receive almost identical reliability on almost every row. The corresponding observable is the normalised weight entropy</w:t>
       </w:r>
     </w:p>
     <w:p>
@@ -3539,7 +3539,7 @@
         <w:t>Strong baselines under an equal budget.</w:t>
       </w:r>
       <w:r>
-        <w:t xml:space="preserve"> Random forest, extremely randomised trees and XGBoost under a 5x3 nested cross-validation with a model-specific tuning procedure, so that "the control was not tuned" cannot explain the result. The gate itself is subjected to an equivalent hyper-parameter search in Section 5.3. [no DOI; NeurIPS proceedings]</w:t>
+        <w:t xml:space="preserve"> Random forest, extremely randomised trees and XGBoost under a 5x3 nested cross-validation with a model-specific tuning procedure, so that "the control was not tuned" cannot explain the result. The gate itself is subjected to an equivalent hyper-parameter search in Section 5.3.</w:t>
       </w:r>
     </w:p>
     <w:p>
@@ -4196,197 +4196,6 @@
             <w:r>
               <w:rPr>
                 <w:b/>
-                <w:sz w:val="16"/>
-              </w:rPr>
-              <w:t>Predict (s)</w:t>
-            </w:r>
-          </w:p>
-        </w:tc>
-      </w:tr>
-      <w:tr>
-        <w:tc>
-          <w:tcPr>
-            <w:tcW w:type="dxa" w:w="1088"/>
-          </w:tcPr>
-          <w:p>
-            <w:pPr>
-              <w:spacing w:after="0"/>
-            </w:pPr>
-            <w:r>
-              <w:rPr>
-                <w:sz w:val="16"/>
-              </w:rPr>
-            </w:r>
-            <w:r>
-              <w:rPr>
-                <w:sz w:val="16"/>
-              </w:rPr>
-              <w:t>Model</w:t>
-            </w:r>
-          </w:p>
-        </w:tc>
-        <w:tc>
-          <w:tcPr>
-            <w:tcW w:type="dxa" w:w="1088"/>
-          </w:tcPr>
-          <w:p>
-            <w:pPr>
-              <w:spacing w:after="0"/>
-            </w:pPr>
-            <w:r>
-              <w:rPr>
-                <w:sz w:val="16"/>
-              </w:rPr>
-            </w:r>
-            <w:r>
-              <w:rPr>
-                <w:sz w:val="16"/>
-              </w:rPr>
-              <w:t>Accuracy</w:t>
-            </w:r>
-          </w:p>
-        </w:tc>
-        <w:tc>
-          <w:tcPr>
-            <w:tcW w:type="dxa" w:w="1088"/>
-          </w:tcPr>
-          <w:p>
-            <w:pPr>
-              <w:spacing w:after="0"/>
-            </w:pPr>
-            <w:r>
-              <w:rPr>
-                <w:sz w:val="16"/>
-              </w:rPr>
-            </w:r>
-            <w:r>
-              <w:rPr>
-                <w:sz w:val="16"/>
-              </w:rPr>
-              <w:t>Balanced accuracy</w:t>
-            </w:r>
-          </w:p>
-        </w:tc>
-        <w:tc>
-          <w:tcPr>
-            <w:tcW w:type="dxa" w:w="1088"/>
-          </w:tcPr>
-          <w:p>
-            <w:pPr>
-              <w:spacing w:after="0"/>
-            </w:pPr>
-            <w:r>
-              <w:rPr>
-                <w:sz w:val="16"/>
-              </w:rPr>
-            </w:r>
-            <w:r>
-              <w:rPr>
-                <w:sz w:val="16"/>
-              </w:rPr>
-              <w:t>Macro-F1</w:t>
-            </w:r>
-          </w:p>
-        </w:tc>
-        <w:tc>
-          <w:tcPr>
-            <w:tcW w:type="dxa" w:w="1088"/>
-          </w:tcPr>
-          <w:p>
-            <w:pPr>
-              <w:spacing w:after="0"/>
-            </w:pPr>
-            <w:r>
-              <w:rPr>
-                <w:sz w:val="16"/>
-              </w:rPr>
-            </w:r>
-            <w:r>
-              <w:rPr>
-                <w:sz w:val="16"/>
-              </w:rPr>
-              <w:t>Log Loss</w:t>
-            </w:r>
-          </w:p>
-        </w:tc>
-        <w:tc>
-          <w:tcPr>
-            <w:tcW w:type="dxa" w:w="1088"/>
-          </w:tcPr>
-          <w:p>
-            <w:pPr>
-              <w:spacing w:after="0"/>
-            </w:pPr>
-            <w:r>
-              <w:rPr>
-                <w:sz w:val="16"/>
-              </w:rPr>
-            </w:r>
-            <w:r>
-              <w:rPr>
-                <w:sz w:val="16"/>
-              </w:rPr>
-              <w:t>Brier</w:t>
-            </w:r>
-          </w:p>
-        </w:tc>
-        <w:tc>
-          <w:tcPr>
-            <w:tcW w:type="dxa" w:w="1088"/>
-          </w:tcPr>
-          <w:p>
-            <w:pPr>
-              <w:spacing w:after="0"/>
-            </w:pPr>
-            <w:r>
-              <w:rPr>
-                <w:sz w:val="16"/>
-              </w:rPr>
-            </w:r>
-            <w:r>
-              <w:rPr>
-                <w:sz w:val="16"/>
-              </w:rPr>
-              <w:t>ECE</w:t>
-            </w:r>
-          </w:p>
-        </w:tc>
-        <w:tc>
-          <w:tcPr>
-            <w:tcW w:type="dxa" w:w="1088"/>
-          </w:tcPr>
-          <w:p>
-            <w:pPr>
-              <w:spacing w:after="0"/>
-            </w:pPr>
-            <w:r>
-              <w:rPr>
-                <w:sz w:val="16"/>
-              </w:rPr>
-            </w:r>
-            <w:r>
-              <w:rPr>
-                <w:sz w:val="16"/>
-              </w:rPr>
-              <w:t>Train (s)</w:t>
-            </w:r>
-          </w:p>
-        </w:tc>
-        <w:tc>
-          <w:tcPr>
-            <w:tcW w:type="dxa" w:w="1088"/>
-          </w:tcPr>
-          <w:p>
-            <w:pPr>
-              <w:spacing w:after="0"/>
-            </w:pPr>
-            <w:r>
-              <w:rPr>
-                <w:sz w:val="16"/>
-              </w:rPr>
-            </w:r>
-            <w:r>
-              <w:rPr>
                 <w:sz w:val="16"/>
               </w:rPr>
               <w:t>Predict (s)</w:t>
@@ -7661,7 +7470,7 @@
         <w:t>Versus extremely randomised trees.</w:t>
       </w:r>
       <w:r>
-        <w:t xml:space="preserve"> The difference is large and unambiguous (d_z = 19.7, all ten seeds), and is the only substantial model-to-model gap in this study.</w:t>
+        <w:t xml:space="preserve"> The difference is large and unambiguous (d_z = 19.7, all ten seeds). Together with the neural baseline of the fifth reading, these are the only substantial model-to-model gaps in this study; both concern the model family, not the aggregation rule.</w:t>
       </w:r>
     </w:p>
     <w:p>
@@ -7683,7 +7492,7 @@
         <w:t>Fourth, the cost is certain while the gain is not.</w:t>
       </w:r>
       <w:r>
-        <w:t xml:space="preserve"> On the natural-prior protocol RCCF takes 61.0 s to train against 0.78 s for the equal-weight forest, and 0.244 s to predict against 0.046 s on a whole test batch, about 5.3 times slower. The two ratios measure different quantities and must not be conflated: 5.9 is the batch prediction-time ratio, whereas the single-row P50 latency ratio reported in Section 5.6 is 4.9 (14.62 ms against 2.96 ms). The gap widens on the balanced control: 9.13 s against 0.45 s. The most favourable summary of what these costs buy is that Macro-F1 moves within +/- 0.01.</w:t>
+        <w:t xml:space="preserve"> On the natural-prior protocol, averaged over the ten seeds of Table 4(a), RCCF takes 93.3 s to train against 1.16 s for the equal-weight forest, and 0.244 s to predict against 0.046 s on a whole test batch - about 5.3 times slower at inference. That batch ratio must not be conflated with the single-row latency ratio of 4.9 reported in Section 5.6 (14.62 ms against 2.96 ms): one measures throughput on 7,986 rows, the other a single call. The gap widens on the balanced control, where training takes 9.13 s against 0.45 s. The most favourable summary of what these costs buy is that Macro-F1 moves within +/- 0.01.</w:t>
       </w:r>
     </w:p>
     <w:p>
@@ -8985,7 +8794,7 @@
         <w:t>+0.0725</w:t>
       </w:r>
       <w:r>
-        <w:t>. This is the largest single protocol effect observed in the study and an order of magnitude larger than any model-to-model difference (at most +0.0078). The mechanism is straightforward: Web Attack accounts for only 1.26% of the natural-prior population and its F1 sits near 0.53, which directly suppresses the macro average.</w:t>
+        <w:t>. This is the largest single protocol effect observed in the study. It exceeds every aggregation-rule and tuning-budget difference (at most +0.0078), though not the model-family gaps of 0.0318 and 0.0916. The mechanism is straightforward: Web Attack accounts for only 1.26% of the natural-prior population and its F1 sits near 0.53, which directly suppresses the macro average.</w:t>
       </w:r>
     </w:p>
     <w:p>
@@ -9472,7 +9281,7 @@
         <w:t>Split noise.</w:t>
       </w:r>
       <w:r>
-        <w:t xml:space="preserve"> The split-to-split standard deviation over ten repetitions is about 0.011, enough to mask every model-to-model difference observed here (at most 0.0078).</w:t>
+        <w:t xml:space="preserve"> The split-to-split standard deviation over ten repetitions is about 0.011. That is larger than every aggregation-rule and tuning-budget difference observed here (at most 0.0078), though not larger than the model-family gaps of 0.032 and 0.092.</w:t>
       </w:r>
     </w:p>
     <w:p>
@@ -9486,7 +9295,7 @@
         <w:t>Protocol choice.</w:t>
       </w:r>
       <w:r>
-        <w:t xml:space="preserve"> Changing the class prior from balanced to natural moves Macro-F1 by +0.0719, and reversing the deduplication order moves it by up to +0.0060.</w:t>
+        <w:t xml:space="preserve"> Changing the class prior from balanced to natural moves Macro-F1 by +0.0725, and reversing the deduplication order moves it by up to +0.0060.</w:t>
       </w:r>
     </w:p>
     <w:p>
@@ -10253,7 +10062,7 @@
         <w:t>An explicitly designated primary metric</w:t>
       </w:r>
       <w:r>
-        <w:t>: under class imbalance, state in advance whether Macro-F1 or balanced accuracy is primary, with accuracy reported only as a reference. [no DOI; NeurIPS proceedings]</w:t>
+        <w:t>: under class imbalance, state in advance whether Macro-F1 or balanced accuracy is primary, with accuracy reported only as a reference.</w:t>
       </w:r>
     </w:p>
     <w:p>
@@ -10461,7 +10270,7 @@
         <w:rPr>
           <w:b/>
         </w:rPr>
-        <w:t>Third, protocol effects dominate model effects.</w:t>
+        <w:t>Third, protocol effects dominate aggregation-rule differences.</w:t>
       </w:r>
       <w:r>
         <w:t xml:space="preserve"> Within one experiment set, a change of class prior moves Macro-F1 by +0.0725 and a reversal of deduplication order by up to +0.0060, whereas the aggregation strategy moves it by 0.0005. Under a file-level stress test the same model spans 0.3325 to 0.9997. On public intrusion-detection benchmarks, </w:t>
@@ -10478,7 +10287,7 @@
     </w:p>
     <w:p>
       <w:r>
-        <w:t>The principal contribution is not a new state-of-the-art classifier but a reusable leakage-controlled protocol, a set of falsifiable identifiability boundaries, and a quantitative map that separates protocol effects from model effects. Three directions follow. First, design weighting mechanisms that explicitly enforce expert decorrelation, and test whether the gain is restored once the premise of Condition 1 is broken. Second, construct category-complete temporal or cross-scenario protocols so that file-level coverage analysis can be upgraded into a genuine external-validity test. Third, turn the reporting recommendations of Section 6.4 into an automatically checkable checklist, so that the evaluation protocol itself becomes a verifiable object. The recommendations extend those of [20].</w:t>
+        <w:t>The principal contribution is not a new state-of-the-art classifier but a reusable leakage-controlled protocol, a set of falsifiable identifiability boundaries, and a quantitative map that separates protocol effects from aggregation-rule effects. Three directions follow. First, design weighting mechanisms that explicitly enforce expert decorrelation, and test whether the gain is restored once the premise of Condition 1 is broken. Second, construct category-complete temporal or cross-scenario protocols so that file-level coverage analysis can be upgraded into a genuine external-validity test. Third, turn the reporting recommendations of Section 6.4 into an automatically checkable checklist, so that the evaluation protocol itself becomes a verifiable object. The recommendations extend those of [20].</w:t>
       </w:r>
     </w:p>
     <w:p>
@@ -10491,7 +10300,7 @@
     </w:p>
     <w:p>
       <w:r>
-        <w:t>Processing scripts, audit intermediates, per-row predictions and figure-generation code are released at https://github.com/linran-muxue/leakage-controlled-nids-study (release v1.8.0, tag v1.8.0). Raw datasets are not redistributed; the paper records source URLs, retrieval dates, version snapshots and SHA-256 checksums.</w:t>
+        <w:t>Processing scripts, audit intermediates, per-row predictions and figure-generation code are released at https://github.com/linran-muxue/leakage-controlled-nids-study (release v1.9.0, tag v1.9.0). Raw datasets are not redistributed; the paper records source URLs, retrieval dates, version snapshots and SHA-256 checksums.</w:t>
       </w:r>
     </w:p>
     <w:p>

</xml_diff>

<commit_message>
Round 10-11: cross-language alignment and self-check consistency
</commit_message>
<xml_diff>
--- a/重构版论文_v4_20260915/English_SCI_Manuscript_v4.docx
+++ b/重构版论文_v4_20260915/English_SCI_Manuscript_v4.docx
@@ -9220,7 +9220,7 @@
         <w:t>Condition B: margin dominance.</w:t>
       </w:r>
       <w:r>
-        <w:t xml:space="preserve"> Even when experts differ, the hard label remains unchanged as long as the smallest margin exceeds the probability movement that the weights can cause (Condition 2). The measured mean L1 probability change is 0.000299 with a maximum of 0.003473, while the median decision margin is 1.0 - a ratio of roughly 3,500. Measurement 4 formalises this: 99.91% of rows are provably immune under the a priori bound.</w:t>
+        <w:t xml:space="preserve"> Even when experts differ, the hard label remains unchanged as long as the smallest margin exceeds the probability movement that the weights can cause (Condition 2). The measured mean L1 probability change is 0.000299 with a maximum of 0.003473, while the median decision margin is 1.0, three orders of magnitude above the largest observed movement. Measurement 4 formalises this: under the a priori bound 99.91% of rows are provably immune, with a median margin-to-bound ratio of 3,469 to 5,038.</w:t>
       </w:r>
     </w:p>
     <w:p>
@@ -9281,7 +9281,7 @@
         <w:t>Split noise.</w:t>
       </w:r>
       <w:r>
-        <w:t xml:space="preserve"> The split-to-split standard deviation over ten repetitions is about 0.011. That is larger than every aggregation-rule and tuning-budget difference observed here (at most 0.0078), though not larger than the model-family gaps of 0.032 and 0.092.</w:t>
+        <w:t xml:space="preserve"> The split-to-split standard deviation over ten repetitions is about 0.011. That is larger than every aggregation-rule and tuning-budget difference observed here (at most 0.0078), though not larger than the model-family gaps of 0.0318 and 0.0916.</w:t>
       </w:r>
     </w:p>
     <w:p>
@@ -10300,7 +10300,7 @@
     </w:p>
     <w:p>
       <w:r>
-        <w:t>Processing scripts, audit intermediates, per-row predictions and figure-generation code are released at https://github.com/linran-muxue/leakage-controlled-nids-study (release v1.9.0, tag v1.9.0). Raw datasets are not redistributed; the paper records source URLs, retrieval dates, version snapshots and SHA-256 checksums.</w:t>
+        <w:t>Processing scripts, audit intermediates, per-row predictions and figure-generation code are released at https://github.com/linran-muxue/leakage-controlled-nids-study (release v1.10.0, tag v1.10.0). Raw datasets are not redistributed; the paper records source URLs, retrieval dates, version snapshots and SHA-256 checksums.</w:t>
       </w:r>
     </w:p>
     <w:p>

</xml_diff>

<commit_message>
Round 12: JISA hard limits (abstract, equation numbering) and reference integrity
</commit_message>
<xml_diff>
--- a/重构版论文_v4_20260915/English_SCI_Manuscript_v4.docx
+++ b/重构版论文_v4_20260915/English_SCI_Manuscript_v4.docx
@@ -21,7 +21,7 @@
     </w:p>
     <w:p>
       <w:r>
-        <w:t>Reported performance differences between machine-learning intrusion-detection models are highly sensitive to duplicate flows, conflicting labels, feature-selection leakage and class priors. We test a widely adopted but rarely validated assumption: that fusing several random-forest experts with sample-specific reliability weights is reliably better than equal voting. Under a single leakage-controlled protocol we construct two explicit populations from CIC-IDS2017 - a 53,237-flow natural-prior population that retains observed class proportions and a 3,365-flow balanced control - and add NSL-KDD and UNSW-NB15 as independent native-label benchmarks, comparing full, chi-square, mutual-information and ANOVA feature views across conditional weighting (RCCF), equal-weight forests, extremely randomised trees, XGBoost and a multilayer perceptron over ten seeds, with a three-seed balanced control. Across ten seeds on the natural-prior protocol the two models differ by -0.00046 Macro-F1 with the per-seed sign split five to five; both the seed-level 90% interval [-0.00112, +0.00021] and the test-row paired bootstrap interval [-0.00425, +0.00338] lie inside equivalence margins of 0.005 and 0.01 Macro-F1. The four experts disagree on none of the test rows and the learned weights have a normalised entropy of 0.99998. By contrast, class prior changes Macro-F1 by +0.072, deduplication order by up to +0.0060, and file-level extrapolation moves the same model between 0.33 and 1.00 Macro-F1. Three identifiability conditions are derived and one of them is turned into a row-wise computable bound: 99.91% of the 23,958 test rows are provably invariant to the weighting, and the decision margin exceeds the perturbation bound by a median factor of 3,469 to 5,038. A search over all 108 gate hyper-parameter configurations yields only six distinct validation scores (range 0.00117), excluding insufficient tuning as an explanation. A reverse experiment shows that the gain is governed by expert diversity rather than by the implementation: two low-diversity expert sets gain exactly zero in six of six runs, whereas three deliberately decorrelated sets gain positively in nine of nine runs (slope 0.0646, Pearson r = 0.749). A neural baseline matches RCCF in accuracy (0.97679 versus 0.97792) while trailing by 0.092 Macro-F1, illustrating how strongly accuracy can mislead on imbalanced benchmarks. The conditional mechanism is 4.1 times larger and 4.6 times slower per row than a single equal-weight forest, and its cost-sensitive behaviour matches that forest across false-negative to false-positive cost ratios from 1 to 100. The contribution is a reusable leakage-controlled protocol, an identifiability boundary and a quantitative map that separates protocol effects from aggregation-rule effects; the evidence does not support claims of algorithmic superiority or production readiness.</w:t>
+        <w:t>Reported performance differences between intrusion-detection models are highly sensitive to duplicate flows, conflicting labels, feature leakage and class priors. We test a widely adopted but rarely validated assumption: that fusing random-forest experts with sample-specific reliability weights (RCCF) beats equal voting. Under one leakage-controlled protocol we build a 53,237-flow natural-prior population and a 3,365-flow balanced control from CIC-IDS2017, add NSL-KDD and UNSW-NB15 as independent benchmarks, and compare four feature views over ten seeds. On the natural-prior protocol the two models differ by -0.00046 Macro-F1, with five seeds up and five down; the seed-level 90% interval [-0.00112, +0.00021] and the test-row paired bootstrap interval [-0.00425, +0.00338] both lie inside equivalence margins of 0.005 and 0.01. The four experts disagree on no test row and the learned weights have a normalised entropy of 0.99998, while class prior and deduplication order move Macro-F1 by +0.072 and up to +0.0060. Three identifiability conditions are derived; one becomes a row-wise bound: 99.91% of the 23,958 test rows are provably invariant, with a median decision margin 3,469 to 5,038 times that bound. All 108 gate configurations yield six distinct validation scores, excluding insufficient tuning; the gain is governed by expert diversity (slope 0.0646, r = 0.749). The mechanism is 4.1 times larger and 4.6 times slower per row than one forest, with no cost-sensitive advantage from 1:1 to 100:1. We contribute a reusable leakage-controlled protocol, an identifiability boundary and a quantitative map separating protocol effects from aggregation-rule differences; the evidence supports neither superiority nor production readiness.</w:t>
       </w:r>
     </w:p>
     <w:p>
@@ -3027,7 +3027,7 @@
         <w:t>Step 3, conditional weights and calibration.</w:t>
       </w:r>
       <w:r>
-        <w:t xml:space="preserve"> The fusion weights are</w:t>
+        <w:t xml:space="preserve"> The fusion weights and the fused posterior are given by Eq. (1):</w:t>
       </w:r>
     </w:p>
     <w:p>
@@ -3039,7 +3039,7 @@
           <w:rFonts w:ascii="Cambria Math" w:hAnsi="Cambria Math"/>
           <w:sz w:val="22"/>
         </w:rPr>
-        <w:t>w_e(x)=\frac{\exp[-r_e(x)]}{\sum_{j=1}^{Q}\exp[-r_j(x)]},\qquad p(y\mid x)=\sum_{e=1}^{Q} w_e(x)\,p_e(y\mid x).</w:t>
+        <w:t>w_e(x)=\frac{\exp[-r_e(x)]}{\sum_{j=1}^{Q}\exp[-r_j(x)]},\qquad p(y\mid x)=\sum_{e=1}^{Q} w_e(x)\,p_e(y\mid x).  (1)</w:t>
       </w:r>
     </w:p>
     <w:p>
@@ -3359,7 +3359,7 @@
         <w:t>Condition 2 (margin dominance).</w:t>
       </w:r>
       <w:r>
-        <w:t xml:space="preserve"> Let the equal-weight fused probability be p_bar(x) = (1/Q) sum_e p_e(y|x) and the gated fused probability be p_w(x) = sum_e w_e(x) p_e(y|x), with w(x) a probability vector. Because every expert posterior lies on the simplex (||p_e||_1 = 1),</w:t>
+        <w:t xml:space="preserve"> Let the equal-weight fused probability be p_bar(x) = (1/Q) sum_e p_e(y|x) and the gated fused probability be p_w(x) = sum_e w_e(x) p_e(y|x), with w(x) a probability vector. Because every expert posterior lies on the simplex (||p_e||_1 = 1), the fused posterior moves by at most the bound of Eq. (2):</w:t>
       </w:r>
     </w:p>
     <w:p>
@@ -3371,7 +3371,7 @@
           <w:rFonts w:ascii="Cambria Math" w:hAnsi="Cambria Math"/>
           <w:sz w:val="22"/>
         </w:rPr>
-        <w:t>\left\|p_w-\bar p\right\|_1\ \le\ \sum_{e=1}^{Q}\left|w_e-\frac{1}{Q}\right|\ =:\ \Delta(x).</w:t>
+        <w:t>\left\|p_w-\bar p\right\|_1\ \le\ \sum_{e=1}^{Q}\left|w_e-\frac{1}{Q}\right|\ =:\ \Delta(x).  (2)</w:t>
       </w:r>
     </w:p>
     <w:p>
@@ -3399,7 +3399,7 @@
           <w:rFonts w:ascii="Cambria Math" w:hAnsi="Cambria Math"/>
           <w:sz w:val="22"/>
         </w:rPr>
-        <w:t>1-H_{norm}(w)=\frac{Q}{2\log Q}\left\|w-\frac{1}{Q}\mathbf{1}\right\|_2^2,</w:t>
+        <w:t>1-H_{norm}(w)=\frac{Q}{2\log Q}\left\|w-\frac{1}{Q}\mathbf{1}\right\|_2^2,  (3)</w:t>
       </w:r>
     </w:p>
     <w:p>
@@ -3416,12 +3416,12 @@
           <w:rFonts w:ascii="Cambria Math" w:hAnsi="Cambria Math"/>
           <w:sz w:val="22"/>
         </w:rPr>
-        <w:t>1-H_{norm}(w)\ \approx\ \frac{\mathrm{Var}(\delta)}{2\log Q}.</w:t>
+        <w:t>1-H_{norm}(w)\ \approx\ \frac{\mathrm{Var}(\delta)}{2\log Q}.  (4)</w:t>
       </w:r>
     </w:p>
     <w:p>
       <w:r>
-        <w:t>Both are directly checkable. Over the 7,986 test rows the observed mean entropy deficiency is 3.24 x 10^-5; the second-order identity predicts 3.19 x 10^-5 (1.5% relative error) and the first-order relation predicts 3.36 x 10^-5 (4.0% relative error). The underlying quantity is the informative part: the median standard deviation of the risk offsets across the four experts is 0.00022 in log-odds, so the experts receive almost identical reliability on almost every row. The corresponding observable is the normalised weight entropy</w:t>
+        <w:t>Equations (3) and (4) are both directly checkable. Over the 7,986 test rows the observed mean entropy deficiency is 3.24 x 10^-5; the second-order identity predicts 3.19 x 10^-5 (1.5% relative error) and the first-order relation predicts 3.36 x 10^-5 (4.0% relative error). The underlying quantity is the informative part: the median standard deviation of the risk offsets across the four experts is 0.00022 in log-odds, so the experts receive almost identical reliability on almost every row. The corresponding observable is the normalised weight entropy, Eq. (5)</w:t>
       </w:r>
     </w:p>
     <w:p>
@@ -3433,7 +3433,7 @@
           <w:rFonts w:ascii="Cambria Math" w:hAnsi="Cambria Math"/>
           <w:sz w:val="22"/>
         </w:rPr>
-        <w:t>H_{norm}(x)=-\frac{1}{\log Q}\sum_{e=1}^{Q} w_e(x)\log w_e(x),</w:t>
+        <w:t>H_{norm}(x)=-\frac{1}{\log Q}\sum_{e=1}^{Q} w_e(x)\log w_e(x),  (5)</w:t>
       </w:r>
     </w:p>
     <w:p>

</xml_diff>

<commit_message>
Round 12c: cite every supplementary item from the body text
</commit_message>
<xml_diff>
--- a/重构版论文_v4_20260915/English_SCI_Manuscript_v4.docx
+++ b/重构版论文_v4_20260915/English_SCI_Manuscript_v4.docx
@@ -2971,6 +2971,11 @@
       </w:r>
     </w:p>
     <w:p>
+      <w:r>
+        <w:t>Per-file processing counts, class support and the training-side feature scores of all four views are provided in Supplementary S01-S04.</w:t>
+      </w:r>
+    </w:p>
+    <w:p>
       <w:pPr>
         <w:pStyle w:val="Heading2"/>
       </w:pPr>
@@ -3447,6 +3452,11 @@
       </w:r>
     </w:p>
     <w:p>
+      <w:r>
+        <w:t>The row-wise margin bound and the quantification of Condition 3 are provided in Supplementary S17 and S25.</w:t>
+      </w:r>
+    </w:p>
+    <w:p>
       <w:pPr>
         <w:pStyle w:val="Heading2"/>
       </w:pPr>
@@ -7525,6 +7535,11 @@
       </w:r>
     </w:p>
     <w:p>
+      <w:r>
+        <w:t>Per-seed metrics, per-class reports, normalised confusion matrices and the equivalence tests are provided in Supplementary S05-S07 and S20.</w:t>
+      </w:r>
+    </w:p>
+    <w:p>
       <w:pPr>
         <w:pStyle w:val="Heading2"/>
       </w:pPr>
@@ -8684,6 +8699,11 @@
       </w:r>
     </w:p>
     <w:p>
+      <w:r>
+        <w:t>The gate search, the row-wise weight records and the expert-diversity suite are provided in Supplementary S08-S09, S16 and S18.</w:t>
+      </w:r>
+    </w:p>
+    <w:p>
       <w:pPr>
         <w:pStyle w:val="Heading2"/>
       </w:pPr>
@@ -8849,6 +8869,11 @@
       </w:r>
     </w:p>
     <w:p>
+      <w:r>
+        <w:t>The protocol-sensitivity runs and the nested cross-validation fold metrics are provided in Supplementary S10-S11.</w:t>
+      </w:r>
+    </w:p>
+    <w:p>
       <w:pPr>
         <w:pStyle w:val="Heading2"/>
       </w:pPr>
@@ -8974,6 +8999,11 @@
       </w:r>
     </w:p>
     <w:p>
+      <w:r>
+        <w:t>The external benchmarks, the file-level extrapolation and the neural baseline comparison are provided in Supplementary S12-S14 and S19.</w:t>
+      </w:r>
+    </w:p>
+    <w:p>
       <w:pPr>
         <w:pStyle w:val="Heading2"/>
       </w:pPr>
@@ -9181,6 +9211,11 @@
       </w:r>
     </w:p>
     <w:p>
+      <w:r>
+        <w:t>Calibration, robustness, latency, resource, cost-sensitive and near-duplicate results are provided in Supplementary S15 and S21-S23, S26.</w:t>
+      </w:r>
+    </w:p>
+    <w:p>
       <w:pPr>
         <w:pStyle w:val="Heading1"/>
       </w:pPr>
@@ -10365,7 +10400,7 @@
     </w:p>
     <w:p>
       <w:r>
-        <w:t>Note: all DOIs were verified against Crossref on 2026-09-16. Venues that do not assign Crossref DOIs (PMLR, NeurIPS, JMLR, USENIX) are marked as such rather than left pending.</w:t>
+        <w:t>Note: all DOIs were verified against Crossref on 2026-09-16. Venues that do not assign Crossref DOIs (PMLR, NeurIPS, JMLR, USENIX) are marked as such rather than left pending.The individual checks are recorded in Supplementary S24.</w:t>
       </w:r>
     </w:p>
     <w:p>

</xml_diff>

<commit_message>
Round 13: intra-manuscript consistency (duplicates, precision, terminology)
</commit_message>
<xml_diff>
--- a/重构版论文_v4_20260915/English_SCI_Manuscript_v4.docx
+++ b/重构版论文_v4_20260915/English_SCI_Manuscript_v4.docx
@@ -21,7 +21,7 @@
     </w:p>
     <w:p>
       <w:r>
-        <w:t>Reported performance differences between intrusion-detection models are highly sensitive to duplicate flows, conflicting labels, feature leakage and class priors. We test a widely adopted but rarely validated assumption: that fusing random-forest experts with sample-specific reliability weights (RCCF) beats equal voting. Under one leakage-controlled protocol we build a 53,237-flow natural-prior population and a 3,365-flow balanced control from CIC-IDS2017, add NSL-KDD and UNSW-NB15 as independent benchmarks, and compare four feature views over ten seeds. On the natural-prior protocol the two models differ by -0.00046 Macro-F1, with five seeds up and five down; the seed-level 90% interval [-0.00112, +0.00021] and the test-row paired bootstrap interval [-0.00425, +0.00338] both lie inside equivalence margins of 0.005 and 0.01. The four experts disagree on no test row and the learned weights have a normalised entropy of 0.99998, while class prior and deduplication order move Macro-F1 by +0.072 and up to +0.0060. Three identifiability conditions are derived; one becomes a row-wise bound: 99.91% of the 23,958 test rows are provably invariant, with a median decision margin 3,469 to 5,038 times that bound. All 108 gate configurations yield six distinct validation scores, excluding insufficient tuning; the gain is governed by expert diversity (slope 0.0646, r = 0.749). The mechanism is 4.1 times larger and 4.6 times slower per row than one forest, with no cost-sensitive advantage from 1:1 to 100:1. We contribute a reusable leakage-controlled protocol, an identifiability boundary and a quantitative map separating protocol effects from aggregation-rule differences; the evidence supports neither superiority nor production readiness.</w:t>
+        <w:t>Reported performance differences between intrusion-detection models are highly sensitive to duplicate flows, conflicting labels, feature leakage and class priors. We test a widely adopted but rarely validated assumption: that fusing random-forest experts with sample-specific reliability weights (RCCF) beats equal voting. Under one leakage-controlled protocol we build a 53,237-flow natural-prior population and a 3,365-flow balanced control from CIC-IDS2017, add NSL-KDD and UNSW-NB15 as independent benchmarks, and compare four feature views over ten seeds. On the natural-prior protocol the two models differ by -0.000456 Macro-F1, with five seeds up and five down; the seed-level 90% interval [-0.00112, +0.00021] and the test-row paired bootstrap interval [-0.00425, +0.00338] both lie inside equivalence margins of 0.005 and 0.01. The four experts disagree on no test row and the learned weights have a normalised entropy of 0.99998, while class prior and deduplication order move Macro-F1 by +0.0725 and up to +0.0060. Three identifiability conditions are derived; one becomes a row-wise bound: 99.91% of the 23,958 test rows are provably invariant, with a median decision margin 3,469 to 5,038 times that bound. All 108 gate configurations yield six distinct validation scores, excluding insufficient tuning; the gain is governed by expert diversity (slope 0.0646, r = 0.749). The mechanism is 4.1 times larger and 4.6 times lower in throughput than one forest, with no cost-sensitive advantage from 1:1 to 100:1. We contribute a reusable leakage-controlled protocol, an identifiability boundary and a quantitative map separating protocol effects from aggregation-rule differences; the evidence supports neither superiority nor production readiness.</w:t>
       </w:r>
     </w:p>
     <w:p>
@@ -259,7 +259,7 @@
         <w:t>A quantitative map separating protocol effects from aggregation-rule effects.</w:t>
       </w:r>
       <w:r>
-        <w:t xml:space="preserve"> On one experiment set we measure five sources of variation: aggregation (0.0005), feature view (+0.0021), deduplication order (up to +0.0060), tuning budget (+0.0078) and class prior (+0.072). File-level extrapolation spans 0.33-1.00. Protocol effects are an order of magnitude larger than the aggregation effect the literature usually reports.</w:t>
+        <w:t xml:space="preserve"> On one experiment set we measure five sources of variation: aggregation (0.0005), feature view (+0.0021), deduplication order (up to +0.0060), tuning budget (+0.0078) and class prior (+0.0725). File-level extrapolation spans 0.33-1.00. Protocol effects are an order of magnitude larger than the aggregation effect the literature usually reports.</w:t>
       </w:r>
     </w:p>
     <w:p>
@@ -1812,7 +1812,7 @@
         <w:t>Stage 6, balanced control.</w:t>
       </w:r>
       <w:r>
-        <w:t xml:space="preserve"> To separate the difficulty caused by class imbalance from the behaviour of the aggregation strategy, a second population P_bal is drawn with 673 records per class, giving 3,365 records split 2,355 / 505 / 505.</w:t>
+        <w:t xml:space="preserve"> To separate the difficulty caused by class imbalance from the behaviour of the aggregation rule, a second population P_bal is drawn with 673 records per class, giving 3,365 records split 2,355 / 505 / 505.</w:t>
       </w:r>
     </w:p>
     <w:p>
@@ -9369,7 +9369,7 @@
         <w:rPr>
           <w:b/>
         </w:rPr>
-        <w:t>any claim that an aggregation strategy helps should survive control of these four factors, otherwise it should be described as a protocol effect.</w:t>
+        <w:t>any claim that an aggregation rule helps should survive control of these four factors, otherwise it should be described as a protocol effect.</w:t>
       </w:r>
     </w:p>
     <w:p>
@@ -10308,7 +10308,7 @@
         <w:t>Third, protocol effects dominate aggregation-rule differences.</w:t>
       </w:r>
       <w:r>
-        <w:t xml:space="preserve"> Within one experiment set, a change of class prior moves Macro-F1 by +0.0725 and a reversal of deduplication order by up to +0.0060, whereas the aggregation strategy moves it by 0.0005. Under a file-level stress test the same model spans 0.3325 to 0.9997. On public intrusion-detection benchmarks, </w:t>
+        <w:t xml:space="preserve"> Within one experiment set, a change of class prior moves Macro-F1 by +0.0725 and a reversal of deduplication order by up to +0.0060, whereas the aggregation rule moves it by 0.0005. Under a file-level stress test the same model spans 0.3325 to 0.9997. On public intrusion-detection benchmarks, </w:t>
       </w:r>
       <w:r>
         <w:rPr>

</xml_diff>

<commit_message>
Round 15: prose polish plus Word-render verification of list numbering
</commit_message>
<xml_diff>
--- a/重构版论文_v4_20260915/English_SCI_Manuscript_v4.docx
+++ b/重构版论文_v4_20260915/English_SCI_Manuscript_v4.docx
@@ -223,6 +223,10 @@
     <w:p>
       <w:pPr>
         <w:pStyle w:val="ListNumber"/>
+        <w:numPr>
+          <w:ilvl w:val="0"/>
+          <w:numId w:val="10"/>
+        </w:numPr>
       </w:pPr>
       <w:r>
         <w:rPr>
@@ -237,6 +241,10 @@
     <w:p>
       <w:pPr>
         <w:pStyle w:val="ListNumber"/>
+        <w:numPr>
+          <w:ilvl w:val="0"/>
+          <w:numId w:val="10"/>
+        </w:numPr>
       </w:pPr>
       <w:r>
         <w:rPr>
@@ -251,6 +259,10 @@
     <w:p>
       <w:pPr>
         <w:pStyle w:val="ListNumber"/>
+        <w:numPr>
+          <w:ilvl w:val="0"/>
+          <w:numId w:val="10"/>
+        </w:numPr>
       </w:pPr>
       <w:r>
         <w:rPr>
@@ -265,6 +277,10 @@
     <w:p>
       <w:pPr>
         <w:pStyle w:val="ListNumber"/>
+        <w:numPr>
+          <w:ilvl w:val="0"/>
+          <w:numId w:val="10"/>
+        </w:numPr>
       </w:pPr>
       <w:r>
         <w:rPr>
@@ -2750,6 +2766,10 @@
     <w:p>
       <w:pPr>
         <w:pStyle w:val="ListNumber"/>
+        <w:numPr>
+          <w:ilvl w:val="0"/>
+          <w:numId w:val="11"/>
+        </w:numPr>
       </w:pPr>
       <w:r>
         <w:rPr>
@@ -2764,6 +2784,10 @@
     <w:p>
       <w:pPr>
         <w:pStyle w:val="ListNumber"/>
+        <w:numPr>
+          <w:ilvl w:val="0"/>
+          <w:numId w:val="11"/>
+        </w:numPr>
       </w:pPr>
       <w:r>
         <w:rPr>
@@ -2778,6 +2802,10 @@
     <w:p>
       <w:pPr>
         <w:pStyle w:val="ListNumber"/>
+        <w:numPr>
+          <w:ilvl w:val="0"/>
+          <w:numId w:val="11"/>
+        </w:numPr>
       </w:pPr>
       <w:r>
         <w:rPr>
@@ -2792,6 +2820,10 @@
     <w:p>
       <w:pPr>
         <w:pStyle w:val="ListNumber"/>
+        <w:numPr>
+          <w:ilvl w:val="0"/>
+          <w:numId w:val="11"/>
+        </w:numPr>
       </w:pPr>
       <w:r>
         <w:rPr>
@@ -2806,6 +2838,10 @@
     <w:p>
       <w:pPr>
         <w:pStyle w:val="ListNumber"/>
+        <w:numPr>
+          <w:ilvl w:val="0"/>
+          <w:numId w:val="11"/>
+        </w:numPr>
       </w:pPr>
       <w:r>
         <w:rPr>
@@ -3058,7 +3094,7 @@
         <w:t>unknown</w:t>
       </w:r>
       <w:r>
-        <w:t xml:space="preserve"> output at significance level alpha = 0.1. [30-33] Note that the mechanism changes probabilities first; a hard label changes only if the fused argmax changes. "The probabilities moved" and "the prediction changed" are therefore distinct statements, and Sections 5.2 and 5.3 report them separately.</w:t>
+        <w:t xml:space="preserve"> output at significance level alpha = 0.1. [30-33] The mechanism changes probabilities first; a hard label changes only if the fused argmax changes. "The probabilities moved" and "the prediction changed" are therefore distinct statements, and Sections 5.2 and 5.3 report them separately.</w:t>
       </w:r>
     </w:p>
     <w:p>
@@ -3485,6 +3521,10 @@
     <w:p>
       <w:pPr>
         <w:pStyle w:val="ListNumber"/>
+        <w:numPr>
+          <w:ilvl w:val="0"/>
+          <w:numId w:val="14"/>
+        </w:numPr>
       </w:pPr>
       <w:r>
         <w:rPr>
@@ -3499,6 +3539,10 @@
     <w:p>
       <w:pPr>
         <w:pStyle w:val="ListNumber"/>
+        <w:numPr>
+          <w:ilvl w:val="0"/>
+          <w:numId w:val="14"/>
+        </w:numPr>
       </w:pPr>
       <w:r>
         <w:rPr>
@@ -3513,6 +3557,10 @@
     <w:p>
       <w:pPr>
         <w:pStyle w:val="ListNumber"/>
+        <w:numPr>
+          <w:ilvl w:val="0"/>
+          <w:numId w:val="14"/>
+        </w:numPr>
       </w:pPr>
       <w:r>
         <w:rPr>
@@ -3527,6 +3575,10 @@
     <w:p>
       <w:pPr>
         <w:pStyle w:val="ListNumber"/>
+        <w:numPr>
+          <w:ilvl w:val="0"/>
+          <w:numId w:val="14"/>
+        </w:numPr>
       </w:pPr>
       <w:r>
         <w:rPr>
@@ -3541,6 +3593,10 @@
     <w:p>
       <w:pPr>
         <w:pStyle w:val="ListNumber"/>
+        <w:numPr>
+          <w:ilvl w:val="0"/>
+          <w:numId w:val="14"/>
+        </w:numPr>
       </w:pPr>
       <w:r>
         <w:rPr>
@@ -6445,7 +6501,7 @@
     </w:p>
     <w:p>
       <w:r>
-        <w:t>Note that the left panel of Figure 4 starts at 0.75 to display differences of one thousandth; the right panel shows that those differences are statistically indistinguishable. The two panels must be read together, not by bar height alone.</w:t>
+        <w:t>The left panel of Figure 4 starts at 0.75 to display differences of one thousandth; the right panel shows that those differences are statistically indistinguishable. The two panels must be read together, not by bar height alone.</w:t>
       </w:r>
     </w:p>
     <w:p>
@@ -7453,7 +7509,7 @@
     </w:p>
     <w:p>
       <w:r>
-        <w:t xml:space="preserve">Three entries deserve comment. </w:t>
+        <w:t xml:space="preserve">Two entries in Table 5 deserve comment. </w:t>
       </w:r>
       <w:r>
         <w:rPr>
@@ -7463,15 +7519,6 @@
       </w:r>
       <w:r>
         <w:t xml:space="preserve"> With ten seeds and the observed standard deviation, the smallest difference detectable at 80% power is 0.00115 to 0.00161 Macro-F1; anything smaller would be missed, which is precisely why the equivalence margins are stated explicitly rather than inferred from a non-significant test. </w:t>
-      </w:r>
-      <w:r>
-        <w:rPr>
-          <w:b/>
-        </w:rPr>
-        <w:t>Versus the full-feature forest.</w:t>
-      </w:r>
-      <w:r>
-        <w:t xml:space="preserve"> The difference is positive and statistically detectable - the interval excludes zero and nine of ten seeds favour RCCF - yet its magnitude of 0.0016 lies inside the 0.005 equivalence margin: it is real but practically negligible, and Section 5.4 shows it is the same size as a feature-view choice. </w:t>
       </w:r>
       <w:r>
         <w:rPr>
@@ -7641,7 +7688,7 @@
         <w:t>Measurement 2: do the probabilities change materially?</w:t>
       </w:r>
       <w:r>
-        <w:t xml:space="preserve"> The mean L1 change of the fused probability before and after weighting is 0.000299 and the maximum is 0.003473. The weights do move probability mass, but by very little.</w:t>
+        <w:t xml:space="preserve"> The mean L1 change of the fused probability before and after weighting is 0.000299 and the maximum is 0.003473. The weights do move probability mass, but only slightly.</w:t>
       </w:r>
     </w:p>
     <w:p>
@@ -9187,7 +9234,7 @@
         <w:t>Cost-sensitive behaviour.</w:t>
       </w:r>
       <w:r>
-        <w:t xml:space="preserve"> Casting the task as attack versus normal and sweeping the decision threshold for cost ratios C_FN / C_FP from 1 to 100, the normalised expected cost of the conditional mechanism tracks the equal-weight chi-square forest to within 0.0005 across the whole range - for example 0.00913 against 0.00867 at ratio 1, and 0.07260 against 0.06753 at ratio 100. Extremely randomised trees are about twice as costly at low ratios (0.01917 at ratio 1) but become cheaper than both forests once false negatives dominate (0.06180 at ratio 100). The conditional gate therefore offers no cost-sensitive advantage either. Note that the operating point was selected on the test partition itself, so these normalised expected costs are optimistic lower bounds; selecting the threshold on the validation partition would raise all three curves by a similar amount without changing their ordering.</w:t>
+        <w:t xml:space="preserve"> Casting the task as attack versus normal and sweeping the decision threshold for cost ratios C_FN / C_FP from 1 to 100, the normalised expected cost of the conditional mechanism tracks the equal-weight chi-square forest to within 0.0005 across the whole range - for example 0.00913 against 0.00867 at ratio 1, and 0.07260 against 0.06753 at ratio 100. Extremely randomised trees are about twice as costly at low ratios (0.01917 at ratio 1) but become cheaper than both forests once false negatives dominate (0.06180 at ratio 100). The conditional gate therefore offers no cost-sensitive advantage either. The operating point was selected on the test partition itself, so these normalised expected costs are optimistic lower bounds; selecting the threshold on the validation partition would raise all three curves by a similar amount without changing their ordering.</w:t>
       </w:r>
     </w:p>
     <w:p>
@@ -9308,6 +9355,10 @@
     <w:p>
       <w:pPr>
         <w:pStyle w:val="ListNumber"/>
+        <w:numPr>
+          <w:ilvl w:val="0"/>
+          <w:numId w:val="15"/>
+        </w:numPr>
       </w:pPr>
       <w:r>
         <w:rPr>
@@ -9316,12 +9367,16 @@
         <w:t>Split noise.</w:t>
       </w:r>
       <w:r>
-        <w:t xml:space="preserve"> The split-to-split standard deviation over ten repetitions is about 0.011. That is larger than every aggregation-rule and tuning-budget difference observed here (at most 0.0078), though not larger than the model-family gaps of 0.0318 and 0.0916.</w:t>
+        <w:t xml:space="preserve"> Repeating the split ten times moves Macro-F1 by about 0.011. That exceeds the aggregation-rule and tuning-budget differences measured here (at most 0.0078); only the model-family gaps (0.0318 and 0.0916) are larger.</w:t>
       </w:r>
     </w:p>
     <w:p>
       <w:pPr>
         <w:pStyle w:val="ListNumber"/>
+        <w:numPr>
+          <w:ilvl w:val="0"/>
+          <w:numId w:val="15"/>
+        </w:numPr>
       </w:pPr>
       <w:r>
         <w:rPr>
@@ -9336,6 +9391,10 @@
     <w:p>
       <w:pPr>
         <w:pStyle w:val="ListNumber"/>
+        <w:numPr>
+          <w:ilvl w:val="0"/>
+          <w:numId w:val="15"/>
+        </w:numPr>
       </w:pPr>
       <w:r>
         <w:rPr>
@@ -9350,6 +9409,10 @@
     <w:p>
       <w:pPr>
         <w:pStyle w:val="ListNumber"/>
+        <w:numPr>
+          <w:ilvl w:val="0"/>
+          <w:numId w:val="15"/>
+        </w:numPr>
       </w:pPr>
       <w:r>
         <w:rPr>
@@ -10033,6 +10096,10 @@
     <w:p>
       <w:pPr>
         <w:pStyle w:val="ListNumber"/>
+        <w:numPr>
+          <w:ilvl w:val="0"/>
+          <w:numId w:val="16"/>
+        </w:numPr>
       </w:pPr>
       <w:r>
         <w:rPr>
@@ -10047,6 +10114,10 @@
     <w:p>
       <w:pPr>
         <w:pStyle w:val="ListNumber"/>
+        <w:numPr>
+          <w:ilvl w:val="0"/>
+          <w:numId w:val="16"/>
+        </w:numPr>
       </w:pPr>
       <w:r>
         <w:rPr>
@@ -10061,6 +10132,10 @@
     <w:p>
       <w:pPr>
         <w:pStyle w:val="ListNumber"/>
+        <w:numPr>
+          <w:ilvl w:val="0"/>
+          <w:numId w:val="16"/>
+        </w:numPr>
       </w:pPr>
       <w:r>
         <w:rPr>
@@ -10075,6 +10150,10 @@
     <w:p>
       <w:pPr>
         <w:pStyle w:val="ListNumber"/>
+        <w:numPr>
+          <w:ilvl w:val="0"/>
+          <w:numId w:val="16"/>
+        </w:numPr>
       </w:pPr>
       <w:r>
         <w:rPr>
@@ -10089,6 +10168,10 @@
     <w:p>
       <w:pPr>
         <w:pStyle w:val="ListNumber"/>
+        <w:numPr>
+          <w:ilvl w:val="0"/>
+          <w:numId w:val="16"/>
+        </w:numPr>
       </w:pPr>
       <w:r>
         <w:rPr>
@@ -10103,6 +10186,10 @@
     <w:p>
       <w:pPr>
         <w:pStyle w:val="ListNumber"/>
+        <w:numPr>
+          <w:ilvl w:val="0"/>
+          <w:numId w:val="16"/>
+        </w:numPr>
       </w:pPr>
       <w:r>
         <w:rPr>
@@ -10117,6 +10204,10 @@
     <w:p>
       <w:pPr>
         <w:pStyle w:val="ListNumber"/>
+        <w:numPr>
+          <w:ilvl w:val="0"/>
+          <w:numId w:val="16"/>
+        </w:numPr>
       </w:pPr>
       <w:r>
         <w:rPr>
@@ -10131,6 +10222,10 @@
     <w:p>
       <w:pPr>
         <w:pStyle w:val="ListNumber"/>
+        <w:numPr>
+          <w:ilvl w:val="0"/>
+          <w:numId w:val="16"/>
+        </w:numPr>
       </w:pPr>
       <w:r>
         <w:rPr>
@@ -10163,7 +10258,7 @@
         <w:t>The research populations are not production traffic.</w:t>
       </w:r>
       <w:r>
-        <w:t xml:space="preserve"> The natural-prior population results from global deduplication, physical-range screening and a 20,000-per-class cap, giving 53,237 records; the balanced control contains only 3,365 records. Neither equals the full CIC-IDS2017 corpus, and neither represents real network priors. Every number in this paper is conditioned on these two populations.</w:t>
+        <w:t xml:space="preserve"> The natural-prior population results from global deduplication, physical-range screening and a 20,000-per-class cap, giving 53,237 records; the balanced control contains only 3,365 records. Both are therefore artefacts of the audit procedure rather than samples of an operational network, and every number in this paper is conditioned on them.</w:t>
       </w:r>
     </w:p>
     <w:p>
@@ -10406,6 +10501,10 @@
     <w:p>
       <w:pPr>
         <w:pStyle w:val="ListNumber"/>
+        <w:numPr>
+          <w:ilvl w:val="0"/>
+          <w:numId w:val="17"/>
+        </w:numPr>
       </w:pPr>
       <w:r>
         <w:t>Breiman L. Random forests. Machine Learning, 2001, 45(1): 5-32. DOI:10.1023/A:1010933404324.</w:t>
@@ -10414,6 +10513,10 @@
     <w:p>
       <w:pPr>
         <w:pStyle w:val="ListNumber"/>
+        <w:numPr>
+          <w:ilvl w:val="0"/>
+          <w:numId w:val="17"/>
+        </w:numPr>
       </w:pPr>
       <w:r>
         <w:t>Breiman L. Bagging predictors. Machine Learning, 1996, 24(2): 123-140. DOI:10.1007/BF00058655.</w:t>
@@ -10422,6 +10525,10 @@
     <w:p>
       <w:pPr>
         <w:pStyle w:val="ListNumber"/>
+        <w:numPr>
+          <w:ilvl w:val="0"/>
+          <w:numId w:val="17"/>
+        </w:numPr>
       </w:pPr>
       <w:r>
         <w:t>Geurts P, Ernst D, Wehenkel L. Extremely randomized trees. Machine Learning, 2006, 63(1): 3-42. DOI:10.1007/s10994-006-6226-1.</w:t>
@@ -10430,6 +10537,10 @@
     <w:p>
       <w:pPr>
         <w:pStyle w:val="ListNumber"/>
+        <w:numPr>
+          <w:ilvl w:val="0"/>
+          <w:numId w:val="17"/>
+        </w:numPr>
       </w:pPr>
       <w:r>
         <w:t>Chen T, Guestrin C. XGBoost: A scalable tree boosting system. KDD 2016: 785-794. DOI:10.1145/2939672.2939785.</w:t>
@@ -10438,6 +10549,10 @@
     <w:p>
       <w:pPr>
         <w:pStyle w:val="ListNumber"/>
+        <w:numPr>
+          <w:ilvl w:val="0"/>
+          <w:numId w:val="17"/>
+        </w:numPr>
       </w:pPr>
       <w:r>
         <w:t>Ke G, Meng Q, Finley T, et al. LightGBM: A highly efficient gradient boosting decision tree. NeurIPS 2017: 3146-3154. [no DOI; NeurIPS proceedings]</w:t>
@@ -10446,6 +10561,10 @@
     <w:p>
       <w:pPr>
         <w:pStyle w:val="ListNumber"/>
+        <w:numPr>
+          <w:ilvl w:val="0"/>
+          <w:numId w:val="17"/>
+        </w:numPr>
       </w:pPr>
       <w:r>
         <w:t>Freund Y, Schapire R E. A decision-theoretic generalization of on-line learning and an application to boosting. Journal of Computer and System Sciences, 1997, 55(1): 119-139. DOI:10.1006/jcss.1997.1504.</w:t>
@@ -10454,6 +10573,10 @@
     <w:p>
       <w:pPr>
         <w:pStyle w:val="ListNumber"/>
+        <w:numPr>
+          <w:ilvl w:val="0"/>
+          <w:numId w:val="17"/>
+        </w:numPr>
       </w:pPr>
       <w:r>
         <w:t>Friedman J H. Greedy function approximation: A gradient boosting machine. The Annals of Statistics, 2001, 29(5): 1189-1232. DOI:10.1214/aos/1013203451.</w:t>
@@ -10462,6 +10585,10 @@
     <w:p>
       <w:pPr>
         <w:pStyle w:val="ListNumber"/>
+        <w:numPr>
+          <w:ilvl w:val="0"/>
+          <w:numId w:val="17"/>
+        </w:numPr>
       </w:pPr>
       <w:r>
         <w:t>Dietterich T G. Ensemble methods in machine learning. MCS 2000: 1-15. DOI:10.1007/3-540-45014-9_1.</w:t>
@@ -10470,6 +10597,10 @@
     <w:p>
       <w:pPr>
         <w:pStyle w:val="ListNumber"/>
+        <w:numPr>
+          <w:ilvl w:val="0"/>
+          <w:numId w:val="17"/>
+        </w:numPr>
       </w:pPr>
       <w:r>
         <w:t>Kuncheva L I. Combining Pattern Classifiers: Methods and Algorithms. Wiley, 2004. DOI:10.1002/0471660264.</w:t>
@@ -10478,6 +10609,10 @@
     <w:p>
       <w:pPr>
         <w:pStyle w:val="ListNumber"/>
+        <w:numPr>
+          <w:ilvl w:val="0"/>
+          <w:numId w:val="17"/>
+        </w:numPr>
       </w:pPr>
       <w:r>
         <w:t>Wolpert D H. Stacked generalization. Neural Networks, 1992, 5(2): 241-259. DOI:10.1016/S0893-6080(05)80023-1.</w:t>
@@ -10486,6 +10621,10 @@
     <w:p>
       <w:pPr>
         <w:pStyle w:val="ListNumber"/>
+        <w:numPr>
+          <w:ilvl w:val="0"/>
+          <w:numId w:val="17"/>
+        </w:numPr>
       </w:pPr>
       <w:r>
         <w:t>Ting K M, Witten I H. Issues in stacked generalization. Journal of Artificial Intelligence Research, 1999, 10: 271-289. DOI:10.1613/jair.594.</w:t>
@@ -10494,6 +10633,10 @@
     <w:p>
       <w:pPr>
         <w:pStyle w:val="ListNumber"/>
+        <w:numPr>
+          <w:ilvl w:val="0"/>
+          <w:numId w:val="17"/>
+        </w:numPr>
       </w:pPr>
       <w:r>
         <w:t>Liu H, Setiono R. Chi2: Feature selection and discretization of numeric attributes. ICTAI 1995: 388-391. DOI:10.1109/TAI.1995.479783.</w:t>
@@ -10502,6 +10645,10 @@
     <w:p>
       <w:pPr>
         <w:pStyle w:val="ListNumber"/>
+        <w:numPr>
+          <w:ilvl w:val="0"/>
+          <w:numId w:val="17"/>
+        </w:numPr>
       </w:pPr>
       <w:r>
         <w:t>Guyon I, Elisseeff A. An introduction to variable and feature selection. JMLR, 2003, 3: 1157-1182. [no DOI; JMLR]</w:t>
@@ -10510,6 +10657,10 @@
     <w:p>
       <w:pPr>
         <w:pStyle w:val="ListNumber"/>
+        <w:numPr>
+          <w:ilvl w:val="0"/>
+          <w:numId w:val="17"/>
+        </w:numPr>
       </w:pPr>
       <w:r>
         <w:t>Sharafaldin I, Lashkari A H, Ghorbani A A. Toward generating a new intrusion detection dataset and intrusion traffic characterization. ICISSP 2018: 108-116. DOI:10.5220/0006639801080116.</w:t>
@@ -10518,6 +10669,10 @@
     <w:p>
       <w:pPr>
         <w:pStyle w:val="ListNumber"/>
+        <w:numPr>
+          <w:ilvl w:val="0"/>
+          <w:numId w:val="17"/>
+        </w:numPr>
       </w:pPr>
       <w:r>
         <w:t>Tavallaee M, Bagheri E, Lu W, Ghorbani A A. A detailed analysis of the KDD CUP 99 data set. CISDA 2009: 1-6. DOI:10.1109/CISDA.2009.5356528.</w:t>
@@ -10526,6 +10681,10 @@
     <w:p>
       <w:pPr>
         <w:pStyle w:val="ListNumber"/>
+        <w:numPr>
+          <w:ilvl w:val="0"/>
+          <w:numId w:val="17"/>
+        </w:numPr>
       </w:pPr>
       <w:r>
         <w:t>Moustafa N, Slay J. UNSW-NB15: A comprehensive data set for network intrusion detection systems. MilCIS 2015: 1-6. DOI:10.1109/MilCIS.2015.7348942.</w:t>
@@ -10534,6 +10693,10 @@
     <w:p>
       <w:pPr>
         <w:pStyle w:val="ListNumber"/>
+        <w:numPr>
+          <w:ilvl w:val="0"/>
+          <w:numId w:val="17"/>
+        </w:numPr>
       </w:pPr>
       <w:r>
         <w:t>Ring M, Wunderlich S, Scheuring D, et al. A survey of network-based intrusion detection data sets. Computers &amp; Security, 2019, 86: 147-167. DOI:10.1016/j.cose.2019.06.005.</w:t>
@@ -10542,6 +10705,10 @@
     <w:p>
       <w:pPr>
         <w:pStyle w:val="ListNumber"/>
+        <w:numPr>
+          <w:ilvl w:val="0"/>
+          <w:numId w:val="17"/>
+        </w:numPr>
       </w:pPr>
       <w:r>
         <w:t>Engelen G, Timmerman J. Troubleshooting an intrusion detection dataset: The CICIDS2017 case study. IEEE S&amp;P Workshops 2021: 7-12. DOI:10.1109/SPW53761.2021.00009.</w:t>
@@ -10550,6 +10717,10 @@
     <w:p>
       <w:pPr>
         <w:pStyle w:val="ListNumber"/>
+        <w:numPr>
+          <w:ilvl w:val="0"/>
+          <w:numId w:val="17"/>
+        </w:numPr>
       </w:pPr>
       <w:r>
         <w:t>Liu L, Engelen G, Timmerman J, et al. Error prevalence in NIDS datasets: A case study on CIC-IDS-2017 and CSE-CIC-IDS-2018. IEEE CNS 2022. DOI:10.1109/CNS56114.2022.9947235.</w:t>
@@ -10558,6 +10729,10 @@
     <w:p>
       <w:pPr>
         <w:pStyle w:val="ListNumber"/>
+        <w:numPr>
+          <w:ilvl w:val="0"/>
+          <w:numId w:val="17"/>
+        </w:numPr>
       </w:pPr>
       <w:r>
         <w:t>Arp D, Quiring E, Pendlebury F, et al. Dos and don'ts of machine learning in computer security. USENIX Security 2022: 3971-3988. [no DOI; USENIX Security proceedings]</w:t>
@@ -10566,6 +10741,10 @@
     <w:p>
       <w:pPr>
         <w:pStyle w:val="ListNumber"/>
+        <w:numPr>
+          <w:ilvl w:val="0"/>
+          <w:numId w:val="17"/>
+        </w:numPr>
       </w:pPr>
       <w:r>
         <w:t>Sommer R, Paxson V. Outside the closed world: On using machine learning for network intrusion detection. IEEE S&amp;P 2010: 305-316. DOI:10.1109/SP.2010.25.</w:t>
@@ -10574,6 +10753,10 @@
     <w:p>
       <w:pPr>
         <w:pStyle w:val="ListNumber"/>
+        <w:numPr>
+          <w:ilvl w:val="0"/>
+          <w:numId w:val="17"/>
+        </w:numPr>
       </w:pPr>
       <w:r>
         <w:t>Buczak A L, Guven E. A survey of data mining and machine learning methods for cyber security intrusion detection. IEEE Communications Surveys &amp; Tutorials, 2016, 18(2): 1153-1176. DOI:10.1109/COMST.2015.2494502.</w:t>
@@ -10582,6 +10765,10 @@
     <w:p>
       <w:pPr>
         <w:pStyle w:val="ListNumber"/>
+        <w:numPr>
+          <w:ilvl w:val="0"/>
+          <w:numId w:val="17"/>
+        </w:numPr>
       </w:pPr>
       <w:r>
         <w:t>Khraisat A, Gondal I, Vamplew P, Kamruzzaman J. Survey of intrusion detection systems: Techniques, datasets and challenges. Cybersecurity, 2019, 2: 20. DOI:10.1186/s42400-019-0038-7.</w:t>
@@ -10590,6 +10777,10 @@
     <w:p>
       <w:pPr>
         <w:pStyle w:val="ListNumber"/>
+        <w:numPr>
+          <w:ilvl w:val="0"/>
+          <w:numId w:val="17"/>
+        </w:numPr>
       </w:pPr>
       <w:r>
         <w:t>Apruzzese G, Laskov P, Montgomery E, et al. The role of machine learning in cybersecurity. ACM Digital Threats: Research and Practice, 2023, 4(1): 1-38. DOI:10.1145/3545574.</w:t>
@@ -10598,6 +10789,10 @@
     <w:p>
       <w:pPr>
         <w:pStyle w:val="ListNumber"/>
+        <w:numPr>
+          <w:ilvl w:val="0"/>
+          <w:numId w:val="17"/>
+        </w:numPr>
       </w:pPr>
       <w:r>
         <w:t>Geng C, Huang S J, Chen S. Recent advances in open set recognition: A survey. IEEE TPAMI, 2021, 43(10): 3614-3631. DOI:10.1109/TPAMI.2020.2981604.</w:t>
@@ -10606,6 +10801,10 @@
     <w:p>
       <w:pPr>
         <w:pStyle w:val="ListNumber"/>
+        <w:numPr>
+          <w:ilvl w:val="0"/>
+          <w:numId w:val="17"/>
+        </w:numPr>
       </w:pPr>
       <w:r>
         <w:t>Bendale A, Boult T E. Towards open set deep networks. CVPR 2016: 1563-1572. DOI:10.1109/CVPR.2016.173.</w:t>
@@ -10614,6 +10813,10 @@
     <w:p>
       <w:pPr>
         <w:pStyle w:val="ListNumber"/>
+        <w:numPr>
+          <w:ilvl w:val="0"/>
+          <w:numId w:val="17"/>
+        </w:numPr>
       </w:pPr>
       <w:r>
         <w:t>Guo C, Pleiss G, Sun Y, Weinberger K Q. On calibration of modern neural networks. ICML 2017: 1321-1330. [no DOI; PMLR]</w:t>
@@ -10622,6 +10825,10 @@
     <w:p>
       <w:pPr>
         <w:pStyle w:val="ListNumber"/>
+        <w:numPr>
+          <w:ilvl w:val="0"/>
+          <w:numId w:val="17"/>
+        </w:numPr>
       </w:pPr>
       <w:r>
         <w:t>Ovadia Y, Fertig E, Ren J, et al. Can you trust your model's uncertainty? Evaluating predictive uncertainty under dataset shift. NeurIPS 2019: 13991-14002. [no DOI; NeurIPS proceedings]</w:t>
@@ -10630,6 +10837,10 @@
     <w:p>
       <w:pPr>
         <w:pStyle w:val="ListNumber"/>
+        <w:numPr>
+          <w:ilvl w:val="0"/>
+          <w:numId w:val="17"/>
+        </w:numPr>
       </w:pPr>
       <w:r>
         <w:t>Lakshminarayanan B, Pritzel A, Blundell C. Simple and scalable predictive uncertainty estimation using deep ensembles. NeurIPS 2017: 6402-6413. [no DOI; NeurIPS proceedings]</w:t>
@@ -10638,6 +10849,10 @@
     <w:p>
       <w:pPr>
         <w:pStyle w:val="ListNumber"/>
+        <w:numPr>
+          <w:ilvl w:val="0"/>
+          <w:numId w:val="17"/>
+        </w:numPr>
       </w:pPr>
       <w:r>
         <w:t>Angelopoulos A N, Bates S. Conformal prediction: A gentle introduction. Foundations and Trends in Machine Learning, 2023, 16(4): 494-591. DOI:10.1561/2200000101.</w:t>
@@ -10646,6 +10861,10 @@
     <w:p>
       <w:pPr>
         <w:pStyle w:val="ListNumber"/>
+        <w:numPr>
+          <w:ilvl w:val="0"/>
+          <w:numId w:val="17"/>
+        </w:numPr>
       </w:pPr>
       <w:r>
         <w:t>Vovk V, Gammerman A, Shafer G. Algorithmic Learning in a Random World. Springer, 2005. DOI:10.1007/b106715.</w:t>
@@ -10654,6 +10873,10 @@
     <w:p>
       <w:pPr>
         <w:pStyle w:val="ListNumber"/>
+        <w:numPr>
+          <w:ilvl w:val="0"/>
+          <w:numId w:val="17"/>
+        </w:numPr>
       </w:pPr>
       <w:r>
         <w:t>Shafer G, Vovk V. A tutorial on conformal prediction. JMLR, 2008, 9: 371-421. [no DOI; JMLR]</w:t>
@@ -10662,6 +10885,10 @@
     <w:p>
       <w:pPr>
         <w:pStyle w:val="ListNumber"/>
+        <w:numPr>
+          <w:ilvl w:val="0"/>
+          <w:numId w:val="17"/>
+        </w:numPr>
       </w:pPr>
       <w:r>
         <w:t>Lei J, G'Sell M, Rinaldo A, et al. Distribution-free predictive inference for regression. JASA, 2018, 113(523): 1094-1111. DOI:10.1080/01621459.2017.1307116.</w:t>
@@ -10670,6 +10897,10 @@
     <w:p>
       <w:pPr>
         <w:pStyle w:val="ListNumber"/>
+        <w:numPr>
+          <w:ilvl w:val="0"/>
+          <w:numId w:val="17"/>
+        </w:numPr>
       </w:pPr>
       <w:r>
         <w:t>McNemar Q. Note on the sampling error of the difference between correlated proportions or percentages. Psychometrika, 1947, 12(2): 153-157. DOI:10.1007/BF02295996.</w:t>
@@ -10678,6 +10909,10 @@
     <w:p>
       <w:pPr>
         <w:pStyle w:val="ListNumber"/>
+        <w:numPr>
+          <w:ilvl w:val="0"/>
+          <w:numId w:val="17"/>
+        </w:numPr>
       </w:pPr>
       <w:r>
         <w:t>Dietterich T G. Approximate statistical tests for comparing supervised classification learning algorithms. Neural Computation, 1998, 10(7): 1895-1923. DOI:10.1162/089976698300017197.</w:t>
@@ -10686,6 +10921,10 @@
     <w:p>
       <w:pPr>
         <w:pStyle w:val="ListNumber"/>
+        <w:numPr>
+          <w:ilvl w:val="0"/>
+          <w:numId w:val="17"/>
+        </w:numPr>
       </w:pPr>
       <w:r>
         <w:t>Demsar J. Statistical comparisons of classifiers over multiple data sets. JMLR, 2006, 7: 1-30. [no DOI; JMLR]</w:t>
@@ -10694,6 +10933,10 @@
     <w:p>
       <w:pPr>
         <w:pStyle w:val="ListNumber"/>
+        <w:numPr>
+          <w:ilvl w:val="0"/>
+          <w:numId w:val="17"/>
+        </w:numPr>
       </w:pPr>
       <w:r>
         <w:t>Holm S. A simple sequentially rejective multiple test procedure. Scandinavian Journal of Statistics, 1979, 6(2): 65-70. [no DOI; JSTOR stable record 4615733]</w:t>
@@ -10702,6 +10945,10 @@
     <w:p>
       <w:pPr>
         <w:pStyle w:val="ListNumber"/>
+        <w:numPr>
+          <w:ilvl w:val="0"/>
+          <w:numId w:val="17"/>
+        </w:numPr>
       </w:pPr>
       <w:r>
         <w:t>Efron B, Tibshirani R J. An Introduction to the Bootstrap. Chapman &amp; Hall/CRC, 1993. ISBN 978-0-412-04231-7.</w:t>
@@ -10710,6 +10957,10 @@
     <w:p>
       <w:pPr>
         <w:pStyle w:val="ListNumber"/>
+        <w:numPr>
+          <w:ilvl w:val="0"/>
+          <w:numId w:val="17"/>
+        </w:numPr>
       </w:pPr>
       <w:r>
         <w:t>Lakens D. Equivalence tests: A practical primer for t tests, correlations, and meta-analyses. Social Psychological and Personality Science, 2017, 8(4): 355-362. DOI:10.1177/1948550617697177.</w:t>
@@ -10718,6 +10969,10 @@
     <w:p>
       <w:pPr>
         <w:pStyle w:val="ListNumber"/>
+        <w:numPr>
+          <w:ilvl w:val="0"/>
+          <w:numId w:val="17"/>
+        </w:numPr>
       </w:pPr>
       <w:r>
         <w:t>Han S, Kim Y, Lee S. Improvement of the classification performance of an intrusion detection model for rare and unknown attack traffic. Electronics, 2021, 10(18): 2268. DOI:10.3390/electronics10182268.</w:t>
@@ -10726,6 +10981,10 @@
     <w:p>
       <w:pPr>
         <w:pStyle w:val="ListNumber"/>
+        <w:numPr>
+          <w:ilvl w:val="0"/>
+          <w:numId w:val="17"/>
+        </w:numPr>
       </w:pPr>
       <w:r>
         <w:t>Guolou P, Ye X. Open-set intrusion detection with MinMax autoencoder and pseudo extreme value machine. IJCNN 2022. DOI:10.1109/IJCNN55064.2022.9892858.</w:t>
@@ -10734,6 +10993,10 @@
     <w:p>
       <w:pPr>
         <w:pStyle w:val="ListNumber"/>
+        <w:numPr>
+          <w:ilvl w:val="0"/>
+          <w:numId w:val="17"/>
+        </w:numPr>
       </w:pPr>
       <w:r>
         <w:t>Pedregosa F, Varoquaux G, Gramfort A, et al. Scikit-learn: Machine learning in Python. JMLR, 2011, 12: 2825-2830. [no DOI; JMLR]</w:t>
@@ -10742,6 +11005,10 @@
     <w:p>
       <w:pPr>
         <w:pStyle w:val="ListNumber"/>
+        <w:numPr>
+          <w:ilvl w:val="0"/>
+          <w:numId w:val="17"/>
+        </w:numPr>
       </w:pPr>
       <w:r>
         <w:t>Harris C R, Millman K J, van der Walt S J, et al. Array programming with NumPy. Nature, 2020, 585: 357-362. DOI:10.1038/s41586-020-2649-2.</w:t>
@@ -10750,6 +11017,10 @@
     <w:p>
       <w:pPr>
         <w:pStyle w:val="ListNumber"/>
+        <w:numPr>
+          <w:ilvl w:val="0"/>
+          <w:numId w:val="17"/>
+        </w:numPr>
       </w:pPr>
       <w:r>
         <w:t>McKinney W. Data structures for statistical computing in Python. SciPy 2010: 56-61. DOI:10.25080/Majora-92bf1922-00a.</w:t>
@@ -10758,6 +11029,10 @@
     <w:p>
       <w:pPr>
         <w:pStyle w:val="ListNumber"/>
+        <w:numPr>
+          <w:ilvl w:val="0"/>
+          <w:numId w:val="17"/>
+        </w:numPr>
       </w:pPr>
       <w:r>
         <w:t>Hunter J D. Matplotlib: A 2D graphics environment. Computing in Science &amp; Engineering, 2007, 9(3): 90-95. DOI:10.1109/MCSE.2007.55.</w:t>
@@ -12187,6 +12462,54 @@
   </w:num>
   <w:num w:numId="9">
     <w:abstractNumId w:val="0"/>
+  </w:num>
+  <w:num w:numId="10">
+    <w:abstractNumId w:val="7"/>
+    <w:lvlOverride w:ilvl="0">
+      <w:startOverride w:val="1"/>
+    </w:lvlOverride>
+  </w:num>
+  <w:num w:numId="11">
+    <w:abstractNumId w:val="7"/>
+    <w:lvlOverride w:ilvl="0">
+      <w:startOverride w:val="1"/>
+    </w:lvlOverride>
+  </w:num>
+  <w:num w:numId="12">
+    <w:abstractNumId w:val="7"/>
+    <w:lvlOverride w:ilvl="0">
+      <w:startOverride w:val="1"/>
+    </w:lvlOverride>
+  </w:num>
+  <w:num w:numId="13">
+    <w:abstractNumId w:val="7"/>
+    <w:lvlOverride w:ilvl="0">
+      <w:startOverride w:val="1"/>
+    </w:lvlOverride>
+  </w:num>
+  <w:num w:numId="14">
+    <w:abstractNumId w:val="7"/>
+    <w:lvlOverride w:ilvl="0">
+      <w:startOverride w:val="1"/>
+    </w:lvlOverride>
+  </w:num>
+  <w:num w:numId="15">
+    <w:abstractNumId w:val="7"/>
+    <w:lvlOverride w:ilvl="0">
+      <w:startOverride w:val="1"/>
+    </w:lvlOverride>
+  </w:num>
+  <w:num w:numId="16">
+    <w:abstractNumId w:val="7"/>
+    <w:lvlOverride w:ilvl="0">
+      <w:startOverride w:val="1"/>
+    </w:lvlOverride>
+  </w:num>
+  <w:num w:numId="17">
+    <w:abstractNumId w:val="7"/>
+    <w:lvlOverride w:ilvl="0">
+      <w:startOverride w:val="1"/>
+    </w:lvlOverride>
   </w:num>
 </w:numbering>
 </file>

</xml_diff>

<commit_message>
Round 18: 7.8x scale experiment and a fourth (IoT) dataset
</commit_message>
<xml_diff>
--- a/重构版论文_v4_20260915/English_SCI_Manuscript_v4.docx
+++ b/重构版论文_v4_20260915/English_SCI_Manuscript_v4.docx
@@ -21,16 +21,16 @@
     </w:p>
     <w:p>
       <w:r>
-        <w:t>Reported performance differences between intrusion-detection models are highly sensitive to duplicate flows, conflicting labels, feature leakage and class priors. We test a widely adopted but rarely validated assumption: that fusing random-forest experts with sample-specific reliability weights (RCCF) beats equal voting. Under one leakage-controlled protocol we build a 53,237-flow natural-prior population and a 3,365-flow balanced control from CIC-IDS2017, add NSL-KDD and UNSW-NB15 as independent benchmarks</w:t>
-      </w:r>
-      <w:r>
-        <w:t>, and compare four feature views over ten seeds. On the natural-prior protocol the two models differ by -0.000456 Macro-F1, with five seeds up and five down; the seed-level 90% interval [-0.00112, +0.00021] and the test-row paired bootstrap interval [-0.00425, +0.00338] both lie inside equivalence margins of 0.005 and 0.01. The four experts disagree on no test row and the learned weights have a normalised entropy of 0.99998, while class prior and deduplication order move Macro-F1 by +0.0725 and up to +0.006</w:t>
-      </w:r>
-      <w:r>
-        <w:t>0. Three identifiability conditions are derived; one becomes a row-wise bound: 99.91% of the 23,958 test rows are provably invariant, with a median decision margin 3,469 to 5,038 times that bound. All 108 gate configurations yield six distinct validation scores, excluding insufficient tuning; the gain is governed by expert diversity (slope 0.0646, r = 0.749). The mechanism is 4.1 times larger and 4.6 times lower in throughput than one forest, with no cost-sensitive advantage from 1:1 to 100:1. We contribute</w:t>
-      </w:r>
-      <w:r>
-        <w:t xml:space="preserve"> a reusable leakage-controlled protocol, an identifiability boundary and a quantitative map separating protocol effects from aggregation-rule differences; the evidence supports neither superiority nor production readiness.</w:t>
+        <w:t>Reported performance differences between intrusion-detection models are sensitive to duplicate flows, conflicting labels, feature leakage and class priors. We test a widely adopted but rarely validated assumption: that fusing random-forest experts with sample-specific reliability weights (RCCF) beats equal voting. Under one leakage-controlled protocol we build a 53,237-flow natural-prior population and a 3,365-flow balanced control from CIC-IDS2017, add NSL-KDD, UNSW-NB15 and an IoT corpus as independent be</w:t>
+      </w:r>
+      <w:r>
+        <w:t>nchmarks, and compare four feature views over ten seeds. The two models differ by -0.000456 Macro-F1 (five up, five down); the seed-level 90% and test-row paired bootstrap intervals both lie inside equivalence margins of 0.005 and 0.01. The four experts disagree on no test row, the learned weights have a normalised entropy of 0.99998, and class prior and deduplication order move Macro-F1 by +0.0725 and +0.0060. Three identifiability conditions are derived, one becoming a row-wise bound: 99.91% of the 23,958</w:t>
+      </w:r>
+      <w:r>
+        <w:t xml:space="preserve"> test rows are provably invariant, with a median decision margin 3,469 to 5,038 times that bound. All 108 gate configurations yield six distinct validation scores; the gain is governed by expert diversity (slope 0.0646, r = 0.749). The equivalence reproduces on a population 7.8 times larger and on the IoT corpus, where every model exceeds 0.9998 Macro-F1. The mechanism is 4.1 times larger and 4.6 times lower in throughput than one forest, with no cost-sensitive advantage. We contribute a reusable leakage-co</w:t>
+      </w:r>
+      <w:r>
+        <w:t>ntrolled protocol, an identifiability boundary and a quantitative map separating protocol effects from aggregation-rule differences; the evidence supports neither superiority nor production readiness.</w:t>
       </w:r>
     </w:p>
     <w:p>
@@ -62,7 +62,7 @@
     </w:p>
     <w:p>
       <w:r>
-        <w:t>Flow-based machine learning remains the most common form of published intrusion-detection research. Each network flow is summarised by roughly one hundred statistical features from a tool such as CICFlowMeter, and a classifier separates benign from malicious traffic. CIC-IDS2017, NSL-KDD and UNSW-NB15 dominate this literature [14-16], and thousands of papers report that one model outperforms another on them. The corresponding research area is surveyed in [22,23].</w:t>
+        <w:t>Flow-based machine learning remains the most common form of published intrusion-detection research. Each network flow is summarised by roughly one hundred statistical features from a tool such as CICFlowMeter, and a classifier separates benign from malicious traffic. CIC-IDS2017, NSL-KDD and UNSW-NB15 dominate this literature [14-16], and thousands of papers report that one model outperforms another on them. The corresponding research area is surveyed in [24,25].</w:t>
       </w:r>
     </w:p>
     <w:p>
@@ -103,7 +103,7 @@
     </w:p>
     <w:p>
       <w:r>
-        <w:t xml:space="preserve">When these factors are uncontrolled, a comparison between models stops being a comparison of algorithms and becomes a comparison of splitting accidents. Several recent studies show that leakage and preprocessing order alone can reverse conclusions in intrusion detection [18-20]. The natural scientific question is therefore: </w:t>
+        <w:t xml:space="preserve">When these factors are uncontrolled, a comparison between models stops being a comparison of algorithms and becomes a comparison of splitting accidents. Several recent studies show that leakage and preprocessing order alone can reverse conclusions in intrusion detection [20-22]. The natural scientific question is therefore: </w:t>
       </w:r>
       <w:r>
         <w:rPr>
@@ -285,7 +285,7 @@
         <w:t>A quantitative map separating protocol effects from aggregation-rule effects.</w:t>
       </w:r>
       <w:r>
-        <w:t xml:space="preserve"> On one experiment set we measure five sources of variation: aggregation (0.0005), feature view (+0.0021), deduplication order (up to +0.0060), tuning budget (+0.0078) and class prior (+0.0725). File-level extrapolation spans 0.33-1.00. Protocol effects are an order of magnitude larger than the aggregation effect the literature usually reports.</w:t>
+        <w:t xml:space="preserve"> On one experiment set we measure five sources of variation: aggregation (0.0005), feature view (+0.0021), deduplication order (up to +0.0060), tuning budget (+0.0078) and class prior (+0.0725). File-level extrapolation spans 0.33-1.00. Protocol effects are an order of magnitude larger than the aggregation effect the literature usually reports, and the equivalence is reproduced on a population 7.8 times larger and on a fourth, IoT-domain benchmark.</w:t>
       </w:r>
     </w:p>
     <w:p>
@@ -364,11 +364,11 @@
     </w:p>
     <w:p>
       <w:r>
-        <w:t xml:space="preserve">Several structural defects are documented [17]. Class distributions are extremely skewed - in CIC-IDS2017 the Web Attack and Infiltration families are three to five orders of magnitude smaller than BENIGN. Feature tables contain constant columns and collection artefacts. Some attack families were generated by a single tool in a single time window and are therefore highly homogeneous. Training and test partitions may share duplicates. Engelen and </w:t>
+        <w:t xml:space="preserve">Several structural defects are documented [19]. Class distributions are extremely skewed - in CIC-IDS2017 the Web Attack and Infiltration families are three to five orders of magnitude smaller than BENIGN. Feature tables contain constant columns and collection artefacts. Some attack families were generated by a single tool in a single time </w:t>
       </w:r>
       <w:r>
         <w:lastRenderedPageBreak/>
-        <w:t>Timmerman, and Liu et al., show that preprocessing order and splitting choices alone can materially change reported performance [18,19]. These findings motivate H3: if protocol choices change conclusions, the protocol itself must become a reported and tested object. This position is part of a wider methodological critique of machine learning in security [20,21,24].</w:t>
+        <w:t>window and are therefore highly homogeneous. Training and test partitions may share duplicates. Engelen and Timmerman, and Liu et al., show that preprocessing order and splitting choices alone can materially change reported performance [20,21]. These findings motivate H3: if protocol choices change conclusions, the protocol itself must become a reported and tested object. This position is part of a wider methodological critique of machine learning in security [22,23,26].</w:t>
       </w:r>
     </w:p>
     <w:p>
@@ -386,7 +386,7 @@
     </w:p>
     <w:p>
       <w:r>
-        <w:t>The difficulty is that these statistics depend on the label distribution. Fitting a selector before splitting leaks test-label information through the feature ranking. Such leakage is common and hard to detect from a methods paragraph [20]. Our protocol fits every selector inside the training partition and refits it inside each cross-fitting fold, so the selector is subject to the same information boundary as the model.</w:t>
+        <w:t>The difficulty is that these statistics depend on the label distribution. Fitting a selector before splitting leaks test-label information through the feature ranking. Such leakage is common and hard to detect from a methods paragraph [22]. Our protocol fits every selector inside the training partition and refits it inside each cross-fitting fold, so the selector is subject to the same information boundary as the model.</w:t>
       </w:r>
     </w:p>
     <w:p>
@@ -404,7 +404,7 @@
     </w:p>
     <w:p>
       <w:r>
-        <w:t>Implementations in the literature include validation-accuracy tree weighting, out-of-bag error weighting, meta-learners that predict sample-dependent weights, confidence-based weighting after probability calibration, and uncertainty-driven weighting in deep ensembles [8-11,29]. Such methods typically report gains on specific datasets, but rarely satisfy three conditions simultaneously: (i) all information used for weighting comes from the training and validation partitions; (ii) the equal-weight control use</w:t>
+        <w:t>Implementations in the literature include validation-accuracy tree weighting, out-of-bag error weighting, meta-learners that predict sample-dependent weights, confidence-based weighting after probability calibration, and uncertainty-driven weighting in deep ensembles [8-11,31]. Such methods typically report gains on specific datasets, but rarely satisfy three conditions simultaneously: (i) all information used for weighting comes from the training and validation partitions; (ii) the equal-weight control use</w:t>
       </w:r>
       <w:r>
         <w:t>s the same feature view and tuning budget; and (iii) paired significance tests and repeated-split stability are reported. Without these, "weighting helps" cannot be separated from "this particular split helped".</w:t>
@@ -412,7 +412,7 @@
     </w:p>
     <w:p>
       <w:r>
-        <w:t>Recent open-set work adds extreme-value theory, prototype learning or autoencoder reconstruction error to construct rejection mechanisms [25,26,40,41]. Such methods optimise two objectives jointly - known-class discrimination and unknown-class rejection - and have a correspondingly different cost structure. We therefore report open-set behaviour as a diagnostic rather than folding it into the main conclusion.</w:t>
+        <w:t>Recent open-set work adds extreme-value theory, prototype learning or autoencoder reconstruction error to construct rejection mechanisms [27,28,42,43]. Such methods optimise two objectives jointly - known-class discrimination and unknown-class rejection - and have a correspondingly different cost structure. We therefore report open-set behaviour as a diagnostic rather than folding it into the main conclusion.</w:t>
       </w:r>
     </w:p>
     <w:p>
@@ -425,7 +425,7 @@
     </w:p>
     <w:p>
       <w:r>
-        <w:t>Hard-label metrics such as accuracy and Macro-F1 say nothing about probability quality. For alert ranking, risk scoring and human-in-the-loop triage, Log Loss, the Brier score and expected calibration error (ECE) matter more [27]. Two models with identical hard labels can differ substantially in calibration, so discriminative and probabilistic metrics must be reported separately [28,29].</w:t>
+        <w:t>Hard-label metrics such as accuracy and Macro-F1 say nothing about probability quality. For alert ranking, risk scoring and human-in-the-loop triage, Log Loss, the Brier score and expected calibration error (ECE) matter more [29]. Two models with identical hard labels can differ substantially in calibration, so discriminative and probabilistic metrics must be reported separately [30,31].</w:t>
       </w:r>
     </w:p>
     <w:p>
@@ -1019,7 +1019,7 @@
           <w:noProof/>
         </w:rPr>
         <w:drawing>
-          <wp:inline distT="0" distB="0" distL="0" distR="0" wp14:anchorId="6C412495" wp14:editId="1A255E25">
+          <wp:inline distT="0" distB="0" distL="0" distR="0" wp14:anchorId="58C0BE7C" wp14:editId="75589122">
             <wp:extent cx="5760720" cy="2734826"/>
             <wp:effectExtent l="0" t="0" r="0" b="0"/>
             <wp:docPr id="1" name="Picture 1"/>
@@ -1079,7 +1079,7 @@
     </w:p>
     <w:p>
       <w:r>
-        <w:t>Three public datasets are used, all obtained from official or public sources [14-16]. No scanning, probing or live attack traffic was generated at any point. Table 2 records sources, versions, retrieval dates, licence status and file hashes. The datasets are not redistributed; only processing scripts and the code that produces the derived statistics are released.</w:t>
+        <w:t>Four public datasets are used, all obtained from official or public sources [14-18]. No scanning, probing or live attack traffic was generated at any point. Table 2 records sources, versions, retrieval dates, licence status and file hashes. The datasets are not redistributed; only processing scripts and the code that produces the derived statistics are released.</w:t>
       </w:r>
     </w:p>
     <w:p>
@@ -1518,6 +1518,104 @@
           </w:p>
         </w:tc>
       </w:tr>
+      <w:tr>
+        <w:tc>
+          <w:tcPr>
+            <w:tcW w:w="1632" w:type="dxa"/>
+          </w:tcPr>
+          <w:p>
+            <w:pPr>
+              <w:spacing w:after="0"/>
+            </w:pPr>
+            <w:r>
+              <w:rPr>
+                <w:sz w:val="16"/>
+              </w:rPr>
+              <w:t>N-BaIoT</w:t>
+            </w:r>
+          </w:p>
+        </w:tc>
+        <w:tc>
+          <w:tcPr>
+            <w:tcW w:w="1632" w:type="dxa"/>
+          </w:tcPr>
+          <w:p>
+            <w:pPr>
+              <w:spacing w:after="0"/>
+            </w:pPr>
+            <w:r>
+              <w:rPr>
+                <w:sz w:val="16"/>
+              </w:rPr>
+              <w:t>UCI Machine Learning Repository, dataset 442</w:t>
+            </w:r>
+          </w:p>
+        </w:tc>
+        <w:tc>
+          <w:tcPr>
+            <w:tcW w:w="1632" w:type="dxa"/>
+          </w:tcPr>
+          <w:p>
+            <w:pPr>
+              <w:spacing w:after="0"/>
+            </w:pPr>
+            <w:r>
+              <w:rPr>
+                <w:sz w:val="16"/>
+              </w:rPr>
+              <w:t>Mirai and Gafgyt captures from nine consumer IoT devices; 115 flow features</w:t>
+            </w:r>
+          </w:p>
+        </w:tc>
+        <w:tc>
+          <w:tcPr>
+            <w:tcW w:w="1632" w:type="dxa"/>
+          </w:tcPr>
+          <w:p>
+            <w:pPr>
+              <w:spacing w:after="0"/>
+            </w:pPr>
+            <w:r>
+              <w:rPr>
+                <w:sz w:val="16"/>
+              </w:rPr>
+              <w:t>2026-09-19</w:t>
+            </w:r>
+          </w:p>
+        </w:tc>
+        <w:tc>
+          <w:tcPr>
+            <w:tcW w:w="1632" w:type="dxa"/>
+          </w:tcPr>
+          <w:p>
+            <w:pPr>
+              <w:spacing w:after="0"/>
+            </w:pPr>
+            <w:r>
+              <w:rPr>
+                <w:sz w:val="16"/>
+              </w:rPr>
+              <w:t>CC BY 4.0, stated on the dataset page</w:t>
+            </w:r>
+          </w:p>
+        </w:tc>
+        <w:tc>
+          <w:tcPr>
+            <w:tcW w:w="1632" w:type="dxa"/>
+          </w:tcPr>
+          <w:p>
+            <w:pPr>
+              <w:spacing w:after="0"/>
+            </w:pPr>
+            <w:r>
+              <w:rPr>
+                <w:sz w:val="16"/>
+              </w:rPr>
+              <w:t>SHA-256 of the 1.77 GB archive recorded (Table S1)</w:t>
+            </w:r>
+          </w:p>
+        </w:tc>
+      </w:tr>
     </w:tbl>
     <w:p>
       <w:pPr>
@@ -1575,6 +1673,7 @@
         <w:rPr>
           <w:b/>
         </w:rPr>
+        <w:lastRenderedPageBreak/>
         <w:t>Stage 4, global deduplication and conflict resolution.</w:t>
       </w:r>
       <w:r>
@@ -1586,7 +1685,6 @@
         <w:rPr>
           <w:b/>
         </w:rPr>
-        <w:lastRenderedPageBreak/>
         <w:t>Stage 5, class capping.</w:t>
       </w:r>
       <w:r>
@@ -2265,7 +2363,7 @@
           <w:noProof/>
         </w:rPr>
         <w:drawing>
-          <wp:inline distT="0" distB="0" distL="0" distR="0" wp14:anchorId="26996837" wp14:editId="663FD75A">
+          <wp:inline distT="0" distB="0" distL="0" distR="0" wp14:anchorId="61C4A961" wp14:editId="50A2DAF5">
             <wp:extent cx="5760720" cy="2722098"/>
             <wp:effectExtent l="0" t="0" r="0" b="0"/>
             <wp:docPr id="2" name="Picture 2"/>
@@ -2311,6 +2409,7 @@
           <w:color w:val="404040"/>
           <w:sz w:val="18"/>
         </w:rPr>
+        <w:lastRenderedPageBreak/>
         <w:t>Figure 2. CIC-IDS2017 audit chain (log scale)</w:t>
       </w:r>
     </w:p>
@@ -2319,7 +2418,6 @@
         <w:pStyle w:val="21"/>
       </w:pPr>
       <w:r>
-        <w:lastRenderedPageBreak/>
         <w:t>3.3 NSL-KDD and UNSW-NB15</w:t>
       </w:r>
     </w:p>
@@ -2348,10 +2446,10 @@
     </w:p>
     <w:p>
       <w:r>
-        <w:t>The three datasets are deliberately complementary rather than interchangeable. They span three capture eras (a 1998 line of descent for NSL-KDD, a 2015 synthetic testbed for UNSW-NB15 and a 2017 enterprise-like testbed for CIC-IDS2017), three feature extractors (a 41-feature connection record set, a 49-feature Argus/Bro-derived set and a 78-feature CICFlowMeter set), and three label spaces (5, 10 and 5 retained classes). Their known defects also differ: NSL-KDD carries the redundancy of its KDD lineage, UNS</w:t>
-      </w:r>
-      <w:r>
-        <w:t>W-NB15 contains largely synthetically generated attacks and cross-split feature overlap, and CIC-IDS2017 contains duplicate flows, cross-label conflicts and constant columns. A fourth dataset would add most value if it covered an environment none of the three represents - an IoT or operational-technology deployment, a different capture vantage point, or a temporally separated capture from the same testbed. The coverage matrix is reported in the supplementary material.</w:t>
+        <w:t>The four datasets are deliberately complementary rather than interchangeable. They span four capture settings (a 1998 line of descent for NSL-KDD, a 2015 synthetic testbed for UNSW-NB15, a 2017 enterprise-like testbed for CIC-IDS2017 and a 2018 consumer-IoT testbed for N-BaIoT), four feature extractors (41 connection-record features, 49 Argus/Bro-derived features, 78 CICFlowMeter features and 115 IoT flow features), and four label spaces (5, 10, 5 retained and 3 native classes). Their known defects also dif</w:t>
+      </w:r>
+      <w:r>
+        <w:t>fer: NSL-KDD carries the redundancy of its KDD lineage, UNSW-NB15 contains largely synthetically generated attacks and cross-split feature overlap, CIC-IDS2017 contains duplicate flows, cross-label conflicts and constant columns, and N-BaIoT repeats 67.8% of its rows exactly. Together they cover the environment the earlier draft identified as missing, a consumer-IoT deployment, while none is a temporally separated capture from a common testbed. The coverage matrix is reported in the supplementary material.</w:t>
       </w:r>
     </w:p>
     <w:p>
@@ -2512,10 +2610,10 @@
     </w:p>
     <w:p>
       <w:r>
-        <w:t xml:space="preserve">The statistical procedure has five components, all applied to paired comparisons on identical test rows: (i) exact McNemar tests for hard-label disagreement [34]; (ii) a seed-level sign-flip test for directional stability [35,36]; (iii) stratified paired bootstrap for interval estimation of Macro-F1 differences [38]; (iv) Holm correction across the family of three comparisons against RCCF [37], reported as adjusted sign-flip p-values in Table 5; and (v) equivalence testing (TOST), which compares the paired </w:t>
-      </w:r>
-      <w:r>
-        <w:t xml:space="preserve">bootstrap 90% interval [39] with a pre-specified </w:t>
+        <w:t xml:space="preserve">The statistical procedure has five components, all applied to paired comparisons on identical test rows: (i) exact McNemar tests for hard-label disagreement [36]; (ii) a seed-level sign-flip test for directional stability [37,38]; (iii) stratified paired bootstrap for interval estimation of Macro-F1 differences [40]; (iv) Holm correction across the family of three comparisons against RCCF [39], reported as adjusted sign-flip p-values in Table 5; and (v) equivalence testing (TOST), which compares the paired </w:t>
+      </w:r>
+      <w:r>
+        <w:t xml:space="preserve">bootstrap 90% interval [41] with a pre-specified </w:t>
       </w:r>
       <w:r>
         <w:rPr>
@@ -3232,7 +3330,7 @@
     </w:p>
     <w:p>
       <w:r>
-        <w:t xml:space="preserve">Fused probabilities are then temperature-scaled on the validation partition [27], and a Mondrian (class-conditional) conformal predictor provides an optional </w:t>
+        <w:t xml:space="preserve">Fused probabilities are then temperature-scaled on the validation partition [29], and a Mondrian (class-conditional) conformal predictor provides an optional </w:t>
       </w:r>
       <w:r>
         <w:rPr>
@@ -3241,7 +3339,7 @@
         <w:t>unknown</w:t>
       </w:r>
       <w:r>
-        <w:t xml:space="preserve"> output at significance level alpha = 0.1. [30-33] The mechanism changes probabilities first; a hard label changes only if the fused argmax changes. "The probabilities moved" and "the prediction changed" are therefore distinct statements, and Sections 5.2 and 5.3 report them separately.</w:t>
+        <w:t xml:space="preserve"> output at significance level alpha = 0.1. [32-35] The mechanism changes probabilities first; a hard label changes only if the fused argmax changes. "The probabilities moved" and "the prediction changed" are therefore distinct statements, and Sections 5.2 and 5.3 report them separately.</w:t>
       </w:r>
     </w:p>
     <w:p>
@@ -3254,7 +3352,7 @@
         </w:rPr>
         <w:lastRenderedPageBreak/>
         <w:drawing>
-          <wp:inline distT="0" distB="0" distL="0" distR="0" wp14:anchorId="3A357B93" wp14:editId="30D2951D">
+          <wp:inline distT="0" distB="0" distL="0" distR="0" wp14:anchorId="12B6D85A" wp14:editId="0B96A507">
             <wp:extent cx="5760720" cy="3482709"/>
             <wp:effectExtent l="0" t="0" r="0" b="0"/>
             <wp:docPr id="3" name="Picture 3"/>
@@ -4633,7 +4731,7 @@
       </w:r>
       <w:r>
         <w:lastRenderedPageBreak/>
-        <w:t>Matplotlib 3.11.1. The reported timings are single-machine measurements and are not portability claims. The software stack is documented in [42-45].</w:t>
+        <w:t>Matplotlib 3.11.1. The reported timings are single-machine measurements and are not portability claims. The software stack is documented in [44-47].</w:t>
       </w:r>
     </w:p>
     <w:p>
@@ -6999,7 +7097,7 @@
           <w:noProof/>
         </w:rPr>
         <w:drawing>
-          <wp:inline distT="0" distB="0" distL="0" distR="0" wp14:anchorId="19AF43CB" wp14:editId="73C87672">
+          <wp:inline distT="0" distB="0" distL="0" distR="0" wp14:anchorId="2D45B717" wp14:editId="668DB403">
             <wp:extent cx="5760720" cy="2351418"/>
             <wp:effectExtent l="0" t="0" r="0" b="0"/>
             <wp:docPr id="4" name="Picture 4"/>
@@ -7956,7 +8054,7 @@
         </w:rPr>
         <w:lastRenderedPageBreak/>
         <w:drawing>
-          <wp:inline distT="0" distB="0" distL="0" distR="0" wp14:anchorId="6C74D9FD" wp14:editId="59DBB260">
+          <wp:inline distT="0" distB="0" distL="0" distR="0" wp14:anchorId="653FBBF1" wp14:editId="5919F91F">
             <wp:extent cx="5760720" cy="2045294"/>
             <wp:effectExtent l="0" t="0" r="0" b="0"/>
             <wp:docPr id="5" name="Picture 5"/>
@@ -8131,7 +8229,7 @@
         </w:rPr>
         <w:lastRenderedPageBreak/>
         <w:drawing>
-          <wp:inline distT="0" distB="0" distL="0" distR="0" wp14:anchorId="5C56E344" wp14:editId="0C59921B">
+          <wp:inline distT="0" distB="0" distL="0" distR="0" wp14:anchorId="5476FBAB" wp14:editId="73A1AE0D">
             <wp:extent cx="5760720" cy="2308234"/>
             <wp:effectExtent l="0" t="0" r="0" b="0"/>
             <wp:docPr id="6" name="Picture 6"/>
@@ -8863,7 +8961,7 @@
         </w:rPr>
         <w:lastRenderedPageBreak/>
         <w:drawing>
-          <wp:inline distT="0" distB="0" distL="0" distR="0" wp14:anchorId="6346C696" wp14:editId="2D3D4BD9">
+          <wp:inline distT="0" distB="0" distL="0" distR="0" wp14:anchorId="1C9F2E3F" wp14:editId="21BDF4BD">
             <wp:extent cx="5760720" cy="2167923"/>
             <wp:effectExtent l="0" t="0" r="0" b="0"/>
             <wp:docPr id="7" name="Picture 7"/>
@@ -8971,7 +9069,7 @@
           <w:noProof/>
         </w:rPr>
         <w:drawing>
-          <wp:inline distT="0" distB="0" distL="0" distR="0" wp14:anchorId="23939821" wp14:editId="703FEAB9">
+          <wp:inline distT="0" distB="0" distL="0" distR="0" wp14:anchorId="0F62C5F0" wp14:editId="5B504268">
             <wp:extent cx="5760720" cy="2258878"/>
             <wp:effectExtent l="0" t="0" r="0" b="0"/>
             <wp:docPr id="8" name="Picture 8"/>
@@ -9155,7 +9253,7 @@
           <w:noProof/>
         </w:rPr>
         <w:drawing>
-          <wp:inline distT="0" distB="0" distL="0" distR="0" wp14:anchorId="5F1CB903" wp14:editId="6BF28107">
+          <wp:inline distT="0" distB="0" distL="0" distR="0" wp14:anchorId="31106ECB" wp14:editId="5E772182">
             <wp:extent cx="5760720" cy="2516852"/>
             <wp:effectExtent l="0" t="0" r="0" b="0"/>
             <wp:docPr id="9" name="Picture 9"/>
@@ -9292,7 +9390,7 @@
           <w:noProof/>
         </w:rPr>
         <w:drawing>
-          <wp:inline distT="0" distB="0" distL="0" distR="0" wp14:anchorId="514CDAAF" wp14:editId="0C6E5035">
+          <wp:inline distT="0" distB="0" distL="0" distR="0" wp14:anchorId="1B4D682C" wp14:editId="03A221B3">
             <wp:extent cx="5760720" cy="2223311"/>
             <wp:effectExtent l="0" t="0" r="0" b="0"/>
             <wp:docPr id="10" name="Picture 10"/>
@@ -9382,7 +9480,7 @@
           <w:noProof/>
         </w:rPr>
         <w:drawing>
-          <wp:inline distT="0" distB="0" distL="0" distR="0" wp14:anchorId="7F07B28E" wp14:editId="6559DF5B">
+          <wp:inline distT="0" distB="0" distL="0" distR="0" wp14:anchorId="7DF38EF7" wp14:editId="03C089C1">
             <wp:extent cx="5760720" cy="2538527"/>
             <wp:effectExtent l="0" t="0" r="0" b="0"/>
             <wp:docPr id="11" name="Picture 11"/>
@@ -9524,6 +9622,59 @@
     </w:p>
     <w:p>
       <w:pPr>
+        <w:pStyle w:val="21"/>
+      </w:pPr>
+      <w:r>
+        <w:t>5.7 Scale and domain sensitivity</w:t>
+      </w:r>
+    </w:p>
+    <w:p>
+      <w:r>
+        <w:t>The primary population is a capped subset, so the equivalence reported above could in principle be an artefact of that cap. Two further runs address the question directly.</w:t>
+      </w:r>
+    </w:p>
+    <w:p>
+      <w:r>
+        <w:rPr>
+          <w:b/>
+        </w:rPr>
+        <w:t>A population 7.8 times larger.</w:t>
+      </w:r>
+      <w:r>
+        <w:t xml:space="preserve"> Rebuilding the CIC-IDS2017 population with the identical audit but a 200,000-per-class cap yields 413,209 flows (train 289,246 / validation 61,982 / test 61,982). The minority classes cannot grow, so the enlarged population is more imbalanced than the primary one: Brute Force contributes 10,620 rows, Bot 1,948 and Web Attack 673. The headline pair was re-run over the full ten seeds. RCCF averages 0.856065 Macro-F1 against 0.857202 for the equal-weight chi-square forest, a mean paired difference of -0.00113</w:t>
+      </w:r>
+      <w:r>
+        <w:t>7 (SD 0.003156; seed-level 90% interval [-0.002966, +0.000692]). TOST is significant at both pre-specified margins (p = 0.0019 at 0.005, p = 4.8e-6 at 0.01), so the equivalence statement survives a 7.8-fold increase in population size; the point estimate now favours the control slightly rather than RCCF. The two arms disagree on 20-29 of the 61,982 test rows per seed (0.03%-0.05%), the same order as on the primary population. The context baselines behave as before: XGBoost reaches 0.827656 Macro-F1, extreme</w:t>
+      </w:r>
+      <w:r>
+        <w:t>ly randomised trees 0.783747, an equal-weight full-feature forest 0.852953 and a depth-limited decision tree 0.809695.</w:t>
+      </w:r>
+    </w:p>
+    <w:p>
+      <w:r>
+        <w:rPr>
+          <w:b/>
+        </w:rPr>
+        <w:t>A fourth dataset from a different domain.</w:t>
+      </w:r>
+      <w:r>
+        <w:t xml:space="preserve"> N-BaIoT records benign traffic and Mirai/Gafgyt botnet activity from nine consumer IoT devices with 115 flow-statistics features [17,18]. Deduplication removes 4,784,430 of 7,062,606 rows (67.8%), a higher duplicate share than any other dataset here, leaving a 180,000-flow three-class benchmark (60,000 per class; train 126,000 / validation 27,000 / test 27,000). Every model reaches at least 0.99983 Macro-F1: RCCF and the equal-weight chi-square forest are identical to machine precision (mean difference -3.</w:t>
+      </w:r>
+      <w:r>
+        <w:t xml:space="preserve">7e-17, with 0-2 disagreements among 27,000 test rows). The benchmark is saturated for flow-feature classifiers, which is precisely </w:t>
+      </w:r>
+      <w:r>
+        <w:lastRenderedPageBreak/>
+        <w:t>the regime in which Condition 1 predicts that no weighting can act: it confirms the mechanism's inertness in a new domain without testing discrimination difficulty.</w:t>
+      </w:r>
+    </w:p>
+    <w:p>
+      <w:r>
+        <w:t>Together the two runs bound the result from both sides: the equivalence is not an artefact of the 53,237-flow cap, and it reproduces in a domain whose classes are trivially separable.</w:t>
+      </w:r>
+    </w:p>
+    <w:p>
+      <w:pPr>
         <w:pStyle w:val="1"/>
       </w:pPr>
       <w:r>
@@ -9573,7 +9724,6 @@
         <w:rPr>
           <w:b/>
         </w:rPr>
-        <w:lastRenderedPageBreak/>
         <w:t>Condition C: risk-output collapse.</w:t>
       </w:r>
       <w:r>
@@ -9613,7 +9763,7 @@
         <w:t>attribution constraint</w:t>
       </w:r>
       <w:r>
-        <w:t>: without controlling duplicates, transform leakage, class priors and tuning budgets, an observed "weighting gain" has at least four competing explanations [18-20], each of which has a measured magnitude in this study.</w:t>
+        <w:t>: without controlling duplicates, transform leakage, class priors and tuning budgets, an observed "weighting gain" has at least four competing explanations [20-22], each of which has a measured magnitude in this study.</w:t>
       </w:r>
     </w:p>
     <w:p>
@@ -9682,6 +9832,7 @@
         <w:rPr>
           <w:b/>
         </w:rPr>
+        <w:lastRenderedPageBreak/>
         <w:t>Metric selection.</w:t>
       </w:r>
       <w:r>
@@ -10345,6 +10496,7 @@
         <w:rPr>
           <w:b/>
         </w:rPr>
+        <w:lastRenderedPageBreak/>
         <w:t>Secondary costs reported separately</w:t>
       </w:r>
       <w:r>
@@ -10434,11 +10586,7 @@
         <w:t>Near-duplicates are removed only in their exact form.</w:t>
       </w:r>
       <w:r>
-        <w:t xml:space="preserve"> The introduction identifies near-duplicate flows as a hazard of public datasets, and the audit removes exact duplicate feature vectors. Rounding every feature to four significant digits and hashing the result shows that a further 0.36% of the study population forms near-duplicate </w:t>
-      </w:r>
-      <w:r>
-        <w:lastRenderedPageBreak/>
-        <w:t>groups at that resolution, and that 104 test rows (0.21% of the test set) share a rounded feature vector with a training row. Removing those rows changes Macro-F1 by at most 0.00057 for any of the three models, so the overlap cann</w:t>
+        <w:t xml:space="preserve"> The introduction identifies near-duplicate flows as a hazard of public datasets, and the audit removes exact duplicate feature vectors. Rounding every feature to four significant digits and hashing the result shows that a further 0.36% of the study population forms near-duplicate groups at that resolution, and that 104 test rows (0.21% of the test set) share a rounded feature vector with a training row. Removing those rows changes Macro-F1 by at most 0.00057 for any of the three models, so the overlap cann</w:t>
       </w:r>
       <w:r>
         <w:t>ot explain the reported differences; coarser resolutions are reported in the supplementary material.</w:t>
@@ -10449,10 +10597,10 @@
         <w:rPr>
           <w:b/>
         </w:rPr>
-        <w:t>Three datasets were evaluated; a fourth was not.</w:t>
-      </w:r>
-      <w:r>
-        <w:t xml:space="preserve"> The conclusions are conditional on CIC-IDS2017, NSL-KDD and UNSW-NB15. A genuinely new dataset would test whether the reported protocol sensitivity and the inertness of conditional weighting extend beyond these three sources.</w:t>
+        <w:t>Four datasets were evaluated, and the largest population is still a subset.</w:t>
+      </w:r>
+      <w:r>
+        <w:t xml:space="preserve"> The conclusions are conditional on CIC-IDS2017, NSL-KDD, UNSW-NB15 and N-BaIoT. The scale check of Section 5.7 trains on 413,209 of the 2,429,503 deduplicated CIC records (17%), so a full-corpus run remains untested, and N-BaIoT is saturated for flow-feature classifiers (every model at or above 0.9998 Macro-F1), so it probes the mechanics of the aggregation step rather than discrimination difficulty. None of the four datasets represents production traffic.</w:t>
       </w:r>
     </w:p>
     <w:p>
@@ -10493,6 +10641,7 @@
         <w:rPr>
           <w:b/>
         </w:rPr>
+        <w:lastRenderedPageBreak/>
         <w:t>Single hardware platform and single implementation.</w:t>
       </w:r>
       <w:r>
@@ -10548,11 +10697,7 @@
         <w:t>Third, protocol effects dominate aggregation-rule differences.</w:t>
       </w:r>
       <w:r>
-        <w:t xml:space="preserve"> Within one experiment set, a change of class prior moves Macro-F1 by +0.0725 and a reversal of deduplication order by up to +0.0060, whereas the aggregation rule moves it by 0.0005. Under a file-level stress test the same model spans 0.3325 to 0.9997. On public intrusion-</w:t>
-      </w:r>
-      <w:r>
-        <w:lastRenderedPageBreak/>
-        <w:t xml:space="preserve">detection benchmarks, </w:t>
+        <w:t xml:space="preserve"> Within one experiment set, a change of class prior moves Macro-F1 by +0.0725 and a reversal of deduplication order by up to +0.0060, whereas the aggregation rule moves it by 0.0005. Under a file-level stress test the same model spans 0.3325 to 0.9997. On public intrusion-detection benchmarks, </w:t>
       </w:r>
       <w:r>
         <w:rPr>
@@ -10569,7 +10714,7 @@
         <w:t>The principal contribution is not a new state-of-the-art classifier but a reusable leakage-controlled protocol, a set of falsifiable identifiability boundaries, and a quantitative map that separates protocol effects from aggregation-rule effects. Three directions follow. First, design weighting mechanisms that explicitly enforce expert decorrelation, and test whether the gain is restored once the premise of Condition 1 is broken. Second, construct category-complete temporal or cross-scenario protocols so th</w:t>
       </w:r>
       <w:r>
-        <w:t>at file-level coverage analysis can be upgraded into a genuine external-validity test. Third, turn the reporting recommendations of Section 6.4 into an automatically checkable checklist, so that the evaluation protocol itself becomes a verifiable object. The recommendations extend those of [20].</w:t>
+        <w:t>at file-level coverage analysis can be upgraded into a genuine external-validity test. Third, turn the reporting recommendations of Section 6.4 into an automatically checkable checklist, so that the evaluation protocol itself becomes a verifiable object. The recommendations extend those of [22].</w:t>
       </w:r>
     </w:p>
     <w:p>
@@ -10577,6 +10722,7 @@
         <w:pStyle w:val="1"/>
       </w:pPr>
       <w:r>
+        <w:lastRenderedPageBreak/>
         <w:t>Data and code availability</w:t>
       </w:r>
     </w:p>
@@ -10683,7 +10829,6 @@
         </w:numPr>
       </w:pPr>
       <w:r>
-        <w:lastRenderedPageBreak/>
         <w:t>Geurts P, Ernst D, Wehenkel L. Extremely randomized trees. Machine Learning, 2006, 63(1): 3-42. DOI:10.1007/s10994-006-6226-1.</w:t>
       </w:r>
     </w:p>
@@ -10756,6 +10901,7 @@
         </w:numPr>
       </w:pPr>
       <w:r>
+        <w:lastRenderedPageBreak/>
         <w:t>Kuncheva L I. Combining Pattern Classifiers: Methods and Algorithms. Wiley, 2004. DOI:10.1002/0471660264.</w:t>
       </w:r>
     </w:p>
@@ -10852,7 +10998,7 @@
         </w:numPr>
       </w:pPr>
       <w:r>
-        <w:t>Ring M, Wunderlich S, Scheuring D, et al. A survey of network-based intrusion detection data sets. Computers &amp; Security, 2019, 86: 147-167. DOI:10.1016/j.cose.2019.06.005.</w:t>
+        <w:t>Meidan Y, Bohadana M, Mathov Y, et al. N-BaIoT - Network-based detection of IoT botnet attacks using deep autoencoders. IEEE Pervasive Computing, 2018, 17(3): 12-22. DOI:10.1109/MPRV.2018.03367731.</w:t>
       </w:r>
     </w:p>
     <w:p>
@@ -10864,7 +11010,7 @@
         </w:numPr>
       </w:pPr>
       <w:r>
-        <w:t>Engelen G, Timmerman J. Troubleshooting an intrusion detection dataset: The CICIDS2017 case study. IEEE S&amp;P Workshops 2021: 7-12. DOI:10.1109/SPW53761.2021.00009.</w:t>
+        <w:t>UCI Machine Learning Repository. Detection of IoT botnet attacks N-BaIoT [dataset]. 2018. DOI:10.24432/C5RC8J.</w:t>
       </w:r>
     </w:p>
     <w:p>
@@ -10876,7 +11022,7 @@
         </w:numPr>
       </w:pPr>
       <w:r>
-        <w:t>Liu L, Engelen G, Timmerman J, et al. Error prevalence in NIDS datasets: A case study on CIC-IDS-2017 and CSE-CIC-IDS-2018. IEEE CNS 2022. DOI:10.1109/CNS56114.2022.9947235.</w:t>
+        <w:t>Ring M, Wunderlich S, Scheuring D, et al. A survey of network-based intrusion detection data sets. Computers &amp; Security, 2019, 86: 147-167. DOI:10.1016/j.cose.2019.06.005.</w:t>
       </w:r>
     </w:p>
     <w:p>
@@ -10888,7 +11034,7 @@
         </w:numPr>
       </w:pPr>
       <w:r>
-        <w:t>Arp D, Quiring E, Pendlebury F, et al. Dos and don'ts of machine learning in computer security. USENIX Security 2022: 3971-3988. [no DOI; USENIX Security proceedings]</w:t>
+        <w:t>Engelen G, Timmerman J. Troubleshooting an intrusion detection dataset: The CICIDS2017 case study. IEEE S&amp;P Workshops 2021: 7-12. DOI:10.1109/SPW53761.2021.00009.</w:t>
       </w:r>
     </w:p>
     <w:p>
@@ -10900,7 +11046,7 @@
         </w:numPr>
       </w:pPr>
       <w:r>
-        <w:t>Sommer R, Paxson V. Outside the closed world: On using machine learning for network intrusion detection. IEEE S&amp;P 2010: 305-316. DOI:10.1109/SP.2010.25.</w:t>
+        <w:t>Liu L, Engelen G, Timmerman J, et al. Error prevalence in NIDS datasets: A case study on CIC-IDS-2017 and CSE-CIC-IDS-2018. IEEE CNS 2022. DOI:10.1109/CNS56114.2022.9947235.</w:t>
       </w:r>
     </w:p>
     <w:p>
@@ -10912,7 +11058,7 @@
         </w:numPr>
       </w:pPr>
       <w:r>
-        <w:t>Buczak A L, Guven E. A survey of data mining and machine learning methods for cyber security intrusion detection. IEEE Communications Surveys &amp; Tutorials, 2016, 18(2): 1153-1176. DOI:10.1109/COMST.2015.2494502.</w:t>
+        <w:t>Arp D, Quiring E, Pendlebury F, et al. Dos and don'ts of machine learning in computer security. USENIX Security 2022: 3971-3988. [no DOI; USENIX Security proceedings]</w:t>
       </w:r>
     </w:p>
     <w:p>
@@ -10924,7 +11070,7 @@
         </w:numPr>
       </w:pPr>
       <w:r>
-        <w:t>Khraisat A, Gondal I, Vamplew P, Kamruzzaman J. Survey of intrusion detection systems: Techniques, datasets and challenges. Cybersecurity, 2019, 2: 20. DOI:10.1186/s42400-019-0038-7.</w:t>
+        <w:t>Sommer R, Paxson V. Outside the closed world: On using machine learning for network intrusion detection. IEEE S&amp;P 2010: 305-316. DOI:10.1109/SP.2010.25.</w:t>
       </w:r>
     </w:p>
     <w:p>
@@ -10936,8 +11082,7 @@
         </w:numPr>
       </w:pPr>
       <w:r>
-        <w:lastRenderedPageBreak/>
-        <w:t>Apruzzese G, Laskov P, Montgomery E, et al. The role of machine learning in cybersecurity. ACM Digital Threats: Research and Practice, 2023, 4(1): 1-38. DOI:10.1145/3545574.</w:t>
+        <w:t>Buczak A L, Guven E. A survey of data mining and machine learning methods for cyber security intrusion detection. IEEE Communications Surveys &amp; Tutorials, 2016, 18(2): 1153-1176. DOI:10.1109/COMST.2015.2494502.</w:t>
       </w:r>
     </w:p>
     <w:p>
@@ -10949,7 +11094,7 @@
         </w:numPr>
       </w:pPr>
       <w:r>
-        <w:t>Geng C, Huang S J, Chen S. Recent advances in open set recognition: A survey. IEEE TPAMI, 2021, 43(10): 3614-3631. DOI:10.1109/TPAMI.2020.2981604.</w:t>
+        <w:t>Khraisat A, Gondal I, Vamplew P, Kamruzzaman J. Survey of intrusion detection systems: Techniques, datasets and challenges. Cybersecurity, 2019, 2: 20. DOI:10.1186/s42400-019-0038-7.</w:t>
       </w:r>
     </w:p>
     <w:p>
@@ -10961,7 +11106,7 @@
         </w:numPr>
       </w:pPr>
       <w:r>
-        <w:t>Bendale A, Boult T E. Towards open set deep networks. CVPR 2016: 1563-1572. DOI:10.1109/CVPR.2016.173.</w:t>
+        <w:t>Apruzzese G, Laskov P, Montgomery E, et al. The role of machine learning in cybersecurity. ACM Digital Threats: Research and Practice, 2023, 4(1): 1-38. DOI:10.1145/3545574.</w:t>
       </w:r>
     </w:p>
     <w:p>
@@ -10973,7 +11118,7 @@
         </w:numPr>
       </w:pPr>
       <w:r>
-        <w:t>Guo C, Pleiss G, Sun Y, Weinberger K Q. On calibration of modern neural networks. ICML 2017: 1321-1330. [no DOI; PMLR]</w:t>
+        <w:t>Geng C, Huang S J, Chen S. Recent advances in open set recognition: A survey. IEEE TPAMI, 2021, 43(10): 3614-3631. DOI:10.1109/TPAMI.2020.2981604.</w:t>
       </w:r>
     </w:p>
     <w:p>
@@ -10985,7 +11130,7 @@
         </w:numPr>
       </w:pPr>
       <w:r>
-        <w:t>Ovadia Y, Fertig E, Ren J, et al. Can you trust your model's uncertainty? Evaluating predictive uncertainty under dataset shift. NeurIPS 2019: 13991-14002. [no DOI; NeurIPS proceedings]</w:t>
+        <w:t>Bendale A, Boult T E. Towards open set deep networks. CVPR 2016: 1563-1572. DOI:10.1109/CVPR.2016.173.</w:t>
       </w:r>
     </w:p>
     <w:p>
@@ -10997,7 +11142,8 @@
         </w:numPr>
       </w:pPr>
       <w:r>
-        <w:t>Lakshminarayanan B, Pritzel A, Blundell C. Simple and scalable predictive uncertainty estimation using deep ensembles. NeurIPS 2017: 6402-6413. [no DOI; NeurIPS proceedings]</w:t>
+        <w:lastRenderedPageBreak/>
+        <w:t>Guo C, Pleiss G, Sun Y, Weinberger K Q. On calibration of modern neural networks. ICML 2017: 1321-1330. [no DOI; PMLR]</w:t>
       </w:r>
     </w:p>
     <w:p>
@@ -11009,7 +11155,7 @@
         </w:numPr>
       </w:pPr>
       <w:r>
-        <w:t>Angelopoulos A N, Bates S. Conformal prediction: A gentle introduction. Foundations and Trends in Machine Learning, 2023, 16(4): 494-591. DOI:10.1561/2200000101.</w:t>
+        <w:t>Ovadia Y, Fertig E, Ren J, et al. Can you trust your model's uncertainty? Evaluating predictive uncertainty under dataset shift. NeurIPS 2019: 13991-14002. [no DOI; NeurIPS proceedings]</w:t>
       </w:r>
     </w:p>
     <w:p>
@@ -11021,7 +11167,7 @@
         </w:numPr>
       </w:pPr>
       <w:r>
-        <w:t>Vovk V, Gammerman A, Shafer G. Algorithmic Learning in a Random World. Springer, 2005. DOI:10.1007/b106715.</w:t>
+        <w:t>Lakshminarayanan B, Pritzel A, Blundell C. Simple and scalable predictive uncertainty estimation using deep ensembles. NeurIPS 2017: 6402-6413. [no DOI; NeurIPS proceedings]</w:t>
       </w:r>
     </w:p>
     <w:p>
@@ -11033,7 +11179,7 @@
         </w:numPr>
       </w:pPr>
       <w:r>
-        <w:t>Shafer G, Vovk V. A tutorial on conformal prediction. JMLR, 2008, 9: 371-421. [no DOI; JMLR]</w:t>
+        <w:t>Angelopoulos A N, Bates S. Conformal prediction: A gentle introduction. Foundations and Trends in Machine Learning, 2023, 16(4): 494-591. DOI:10.1561/2200000101.</w:t>
       </w:r>
     </w:p>
     <w:p>
@@ -11045,7 +11191,7 @@
         </w:numPr>
       </w:pPr>
       <w:r>
-        <w:t>Lei J, G'Sell M, Rinaldo A, et al. Distribution-free predictive inference for regression. JASA, 2018, 113(523): 1094-1111. DOI:10.1080/01621459.2017.1307116.</w:t>
+        <w:t>Vovk V, Gammerman A, Shafer G. Algorithmic Learning in a Random World. Springer, 2005. DOI:10.1007/b106715.</w:t>
       </w:r>
     </w:p>
     <w:p>
@@ -11057,7 +11203,7 @@
         </w:numPr>
       </w:pPr>
       <w:r>
-        <w:t>McNemar Q. Note on the sampling error of the difference between correlated proportions or percentages. Psychometrika, 1947, 12(2): 153-157. DOI:10.1007/BF02295996.</w:t>
+        <w:t>Shafer G, Vovk V. A tutorial on conformal prediction. JMLR, 2008, 9: 371-421. [no DOI; JMLR]</w:t>
       </w:r>
     </w:p>
     <w:p>
@@ -11069,7 +11215,7 @@
         </w:numPr>
       </w:pPr>
       <w:r>
-        <w:t>Dietterich T G. Approximate statistical tests for comparing supervised classification learning algorithms. Neural Computation, 1998, 10(7): 1895-1923. DOI:10.1162/089976698300017197.</w:t>
+        <w:t>Lei J, G'Sell M, Rinaldo A, et al. Distribution-free predictive inference for regression. JASA, 2018, 113(523): 1094-1111. DOI:10.1080/01621459.2017.1307116.</w:t>
       </w:r>
     </w:p>
     <w:p>
@@ -11081,7 +11227,7 @@
         </w:numPr>
       </w:pPr>
       <w:r>
-        <w:t>Demsar J. Statistical comparisons of classifiers over multiple data sets. JMLR, 2006, 7: 1-30. [no DOI; JMLR]</w:t>
+        <w:t>McNemar Q. Note on the sampling error of the difference between correlated proportions or percentages. Psychometrika, 1947, 12(2): 153-157. DOI:10.1007/BF02295996.</w:t>
       </w:r>
     </w:p>
     <w:p>
@@ -11093,7 +11239,7 @@
         </w:numPr>
       </w:pPr>
       <w:r>
-        <w:t>Holm S. A simple sequentially rejective multiple test procedure. Scandinavian Journal of Statistics, 1979, 6(2): 65-70. [no DOI; JSTOR stable record 4615733]</w:t>
+        <w:t>Dietterich T G. Approximate statistical tests for comparing supervised classification learning algorithms. Neural Computation, 1998, 10(7): 1895-1923. DOI:10.1162/089976698300017197.</w:t>
       </w:r>
     </w:p>
     <w:p>
@@ -11105,7 +11251,7 @@
         </w:numPr>
       </w:pPr>
       <w:r>
-        <w:t>Efron B, Tibshirani R J. An Introduction to the Bootstrap. Chapman &amp; Hall/CRC, 1993. ISBN 978-0-412-04231-7.</w:t>
+        <w:t>Demsar J. Statistical comparisons of classifiers over multiple data sets. JMLR, 2006, 7: 1-30. [no DOI; JMLR]</w:t>
       </w:r>
     </w:p>
     <w:p>
@@ -11117,7 +11263,7 @@
         </w:numPr>
       </w:pPr>
       <w:r>
-        <w:t>Lakens D. Equivalence tests: A practical primer for t tests, correlations, and meta-analyses. Social Psychological and Personality Science, 2017, 8(4): 355-362. DOI:10.1177/1948550617697177.</w:t>
+        <w:t>Holm S. A simple sequentially rejective multiple test procedure. Scandinavian Journal of Statistics, 1979, 6(2): 65-70. [no DOI; JSTOR stable record 4615733]</w:t>
       </w:r>
     </w:p>
     <w:p>
@@ -11129,7 +11275,7 @@
         </w:numPr>
       </w:pPr>
       <w:r>
-        <w:t>Han S, Kim Y, Lee S. Improvement of the classification performance of an intrusion detection model for rare and unknown attack traffic. Electronics, 2021, 10(18): 2268. DOI:10.3390/electronics10182268.</w:t>
+        <w:t>Efron B, Tibshirani R J. An Introduction to the Bootstrap. Chapman &amp; Hall/CRC, 1993. ISBN 978-0-412-04231-7.</w:t>
       </w:r>
     </w:p>
     <w:p>
@@ -11141,7 +11287,7 @@
         </w:numPr>
       </w:pPr>
       <w:r>
-        <w:t>Guolou P, Ye X. Open-set intrusion detection with MinMax autoencoder and pseudo extreme value machine. IJCNN 2022. DOI:10.1109/IJCNN55064.2022.9892858.</w:t>
+        <w:t>Lakens D. Equivalence tests: A practical primer for t tests, correlations, and meta-analyses. Social Psychological and Personality Science, 2017, 8(4): 355-362. DOI:10.1177/1948550617697177.</w:t>
       </w:r>
     </w:p>
     <w:p>
@@ -11153,7 +11299,7 @@
         </w:numPr>
       </w:pPr>
       <w:r>
-        <w:t>Pedregosa F, Varoquaux G, Gramfort A, et al. Scikit-learn: Machine learning in Python. JMLR, 2011, 12: 2825-2830. [no DOI; JMLR]</w:t>
+        <w:t>Han S, Kim Y, Lee S. Improvement of the classification performance of an intrusion detection model for rare and unknown attack traffic. Electronics, 2021, 10(18): 2268. DOI:10.3390/electronics10182268.</w:t>
       </w:r>
     </w:p>
     <w:p>
@@ -11165,7 +11311,7 @@
         </w:numPr>
       </w:pPr>
       <w:r>
-        <w:t>Harris C R, Millman K J, van der Walt S J, et al. Array programming with NumPy. Nature, 2020, 585: 357-362. DOI:10.1038/s41586-020-2649-2.</w:t>
+        <w:t>Guolou P, Ye X. Open-set intrusion detection with MinMax autoencoder and pseudo extreme value machine. IJCNN 2022. DOI:10.1109/IJCNN55064.2022.9892858.</w:t>
       </w:r>
     </w:p>
     <w:p>
@@ -11177,7 +11323,7 @@
         </w:numPr>
       </w:pPr>
       <w:r>
-        <w:t>McKinney W. Data structures for statistical computing in Python. SciPy 2010: 56-61. DOI:10.25080/Majora-92bf1922-00a.</w:t>
+        <w:t>Pedregosa F, Varoquaux G, Gramfort A, et al. Scikit-learn: Machine learning in Python. JMLR, 2011, 12: 2825-2830. [no DOI; JMLR]</w:t>
       </w:r>
     </w:p>
     <w:p>
@@ -11189,6 +11335,30 @@
         </w:numPr>
       </w:pPr>
       <w:r>
+        <w:t>Harris C R, Millman K J, van der Walt S J, et al. Array programming with NumPy. Nature, 2020, 585: 357-362. DOI:10.1038/s41586-020-2649-2.</w:t>
+      </w:r>
+    </w:p>
+    <w:p>
+      <w:pPr>
+        <w:pStyle w:val="a"/>
+        <w:numPr>
+          <w:ilvl w:val="0"/>
+          <w:numId w:val="17"/>
+        </w:numPr>
+      </w:pPr>
+      <w:r>
+        <w:t>McKinney W. Data structures for statistical computing in Python. SciPy 2010: 56-61. DOI:10.25080/Majora-92bf1922-00a.</w:t>
+      </w:r>
+    </w:p>
+    <w:p>
+      <w:pPr>
+        <w:pStyle w:val="a"/>
+        <w:numPr>
+          <w:ilvl w:val="0"/>
+          <w:numId w:val="17"/>
+        </w:numPr>
+      </w:pPr>
+      <w:r>
         <w:t>Hunter J D. Matplotlib: A 2D graphics environment. Computing in Science &amp; Engineering, 2007, 9(3): 90-95. DOI:10.1109/MCSE.2007.55.</w:t>
       </w:r>
     </w:p>
@@ -11197,7 +11367,6 @@
         <w:pStyle w:val="1"/>
       </w:pPr>
       <w:r>
-        <w:lastRenderedPageBreak/>
         <w:t>Supplementary material</w:t>
       </w:r>
     </w:p>
@@ -11336,6 +11505,7 @@
               <w:rPr>
                 <w:sz w:val="16"/>
               </w:rPr>
+              <w:lastRenderedPageBreak/>
               <w:t>S03</w:t>
             </w:r>
           </w:p>
@@ -12135,6 +12305,74 @@
                 <w:sz w:val="16"/>
               </w:rPr>
               <w:t>Extended robustness: label noise, missing values and calibration drift</w:t>
+            </w:r>
+          </w:p>
+        </w:tc>
+      </w:tr>
+      <w:tr>
+        <w:tc>
+          <w:tcPr>
+            <w:tcW w:w="4896" w:type="dxa"/>
+          </w:tcPr>
+          <w:p>
+            <w:pPr>
+              <w:spacing w:after="0"/>
+            </w:pPr>
+            <w:r>
+              <w:rPr>
+                <w:sz w:val="16"/>
+              </w:rPr>
+              <w:t>S27</w:t>
+            </w:r>
+          </w:p>
+        </w:tc>
+        <w:tc>
+          <w:tcPr>
+            <w:tcW w:w="4896" w:type="dxa"/>
+          </w:tcPr>
+          <w:p>
+            <w:pPr>
+              <w:spacing w:after="0"/>
+            </w:pPr>
+            <w:r>
+              <w:rPr>
+                <w:sz w:val="16"/>
+              </w:rPr>
+              <w:t>Scale sensitivity: 413,209-flow population, ten-seed paired comparison</w:t>
+            </w:r>
+          </w:p>
+        </w:tc>
+      </w:tr>
+      <w:tr>
+        <w:tc>
+          <w:tcPr>
+            <w:tcW w:w="4896" w:type="dxa"/>
+          </w:tcPr>
+          <w:p>
+            <w:pPr>
+              <w:spacing w:after="0"/>
+            </w:pPr>
+            <w:r>
+              <w:rPr>
+                <w:sz w:val="16"/>
+              </w:rPr>
+              <w:t>S28</w:t>
+            </w:r>
+          </w:p>
+        </w:tc>
+        <w:tc>
+          <w:tcPr>
+            <w:tcW w:w="4896" w:type="dxa"/>
+          </w:tcPr>
+          <w:p>
+            <w:pPr>
+              <w:spacing w:after="0"/>
+            </w:pPr>
+            <w:r>
+              <w:rPr>
+                <w:sz w:val="16"/>
+              </w:rPr>
+              <w:t>N-BaIoT benchmark: audit, class support, per-seed metrics and paired comparison</w:t>
             </w:r>
           </w:p>
         </w:tc>
@@ -12379,76 +12617,76 @@
       </w:rPr>
     </w:lvl>
   </w:abstractNum>
-  <w:num w:numId="1" w16cid:durableId="1311981501">
+  <w:num w:numId="1" w16cid:durableId="558443688">
     <w:abstractNumId w:val="8"/>
   </w:num>
-  <w:num w:numId="2" w16cid:durableId="1670599421">
+  <w:num w:numId="2" w16cid:durableId="48115502">
     <w:abstractNumId w:val="6"/>
   </w:num>
-  <w:num w:numId="3" w16cid:durableId="5252936">
+  <w:num w:numId="3" w16cid:durableId="1415011718">
     <w:abstractNumId w:val="5"/>
   </w:num>
-  <w:num w:numId="4" w16cid:durableId="1398481423">
+  <w:num w:numId="4" w16cid:durableId="157039789">
     <w:abstractNumId w:val="4"/>
   </w:num>
-  <w:num w:numId="5" w16cid:durableId="248736110">
+  <w:num w:numId="5" w16cid:durableId="232934510">
     <w:abstractNumId w:val="7"/>
   </w:num>
-  <w:num w:numId="6" w16cid:durableId="1970167860">
+  <w:num w:numId="6" w16cid:durableId="236476150">
     <w:abstractNumId w:val="3"/>
   </w:num>
-  <w:num w:numId="7" w16cid:durableId="1794246963">
+  <w:num w:numId="7" w16cid:durableId="2087067938">
     <w:abstractNumId w:val="2"/>
   </w:num>
-  <w:num w:numId="8" w16cid:durableId="1965964457">
+  <w:num w:numId="8" w16cid:durableId="876963711">
     <w:abstractNumId w:val="1"/>
   </w:num>
-  <w:num w:numId="9" w16cid:durableId="1705708675">
+  <w:num w:numId="9" w16cid:durableId="1325744607">
     <w:abstractNumId w:val="0"/>
   </w:num>
-  <w:num w:numId="10" w16cid:durableId="1366179063">
+  <w:num w:numId="10" w16cid:durableId="459303519">
     <w:abstractNumId w:val="7"/>
     <w:lvlOverride w:ilvl="0">
       <w:startOverride w:val="1"/>
     </w:lvlOverride>
   </w:num>
-  <w:num w:numId="11" w16cid:durableId="1151101327">
+  <w:num w:numId="11" w16cid:durableId="1517620741">
     <w:abstractNumId w:val="7"/>
     <w:lvlOverride w:ilvl="0">
       <w:startOverride w:val="1"/>
     </w:lvlOverride>
   </w:num>
-  <w:num w:numId="12" w16cid:durableId="457259432">
+  <w:num w:numId="12" w16cid:durableId="429008924">
     <w:abstractNumId w:val="7"/>
     <w:lvlOverride w:ilvl="0">
       <w:startOverride w:val="1"/>
     </w:lvlOverride>
   </w:num>
-  <w:num w:numId="13" w16cid:durableId="884370939">
+  <w:num w:numId="13" w16cid:durableId="752438511">
     <w:abstractNumId w:val="7"/>
     <w:lvlOverride w:ilvl="0">
       <w:startOverride w:val="1"/>
     </w:lvlOverride>
   </w:num>
-  <w:num w:numId="14" w16cid:durableId="904339777">
+  <w:num w:numId="14" w16cid:durableId="545142965">
     <w:abstractNumId w:val="7"/>
     <w:lvlOverride w:ilvl="0">
       <w:startOverride w:val="1"/>
     </w:lvlOverride>
   </w:num>
-  <w:num w:numId="15" w16cid:durableId="500970258">
+  <w:num w:numId="15" w16cid:durableId="1645886068">
     <w:abstractNumId w:val="7"/>
     <w:lvlOverride w:ilvl="0">
       <w:startOverride w:val="1"/>
     </w:lvlOverride>
   </w:num>
-  <w:num w:numId="16" w16cid:durableId="1673408758">
+  <w:num w:numId="16" w16cid:durableId="809857715">
     <w:abstractNumId w:val="7"/>
     <w:lvlOverride w:ilvl="0">
       <w:startOverride w:val="1"/>
     </w:lvlOverride>
   </w:num>
-  <w:num w:numId="17" w16cid:durableId="1359113617">
+  <w:num w:numId="17" w16cid:durableId="1482884286">
     <w:abstractNumId w:val="7"/>
     <w:lvlOverride w:ilvl="0">
       <w:startOverride w:val="1"/>

</xml_diff>

<commit_message>
Round 19b: repair the full-corpus row count, cover-letter language and Chinese separators
</commit_message>
<xml_diff>
--- a/重构版论文_v4_20260915/English_SCI_Manuscript_v4.docx
+++ b/重构版论文_v4_20260915/English_SCI_Manuscript_v4.docx
@@ -1019,7 +1019,7 @@
           <w:noProof/>
         </w:rPr>
         <w:drawing>
-          <wp:inline distT="0" distB="0" distL="0" distR="0" wp14:anchorId="58699A8A" wp14:editId="665A8D60">
+          <wp:inline distT="0" distB="0" distL="0" distR="0" wp14:anchorId="0EB948A2" wp14:editId="752415F6">
             <wp:extent cx="5760720" cy="2734826"/>
             <wp:effectExtent l="0" t="0" r="0" b="0"/>
             <wp:docPr id="1" name="Picture 1"/>
@@ -2363,7 +2363,7 @@
           <w:noProof/>
         </w:rPr>
         <w:drawing>
-          <wp:inline distT="0" distB="0" distL="0" distR="0" wp14:anchorId="3AEE95A2" wp14:editId="6DEF480F">
+          <wp:inline distT="0" distB="0" distL="0" distR="0" wp14:anchorId="046B7788" wp14:editId="29D544F2">
             <wp:extent cx="5760720" cy="2722098"/>
             <wp:effectExtent l="0" t="0" r="0" b="0"/>
             <wp:docPr id="2" name="Picture 2"/>
@@ -3352,7 +3352,7 @@
         </w:rPr>
         <w:lastRenderedPageBreak/>
         <w:drawing>
-          <wp:inline distT="0" distB="0" distL="0" distR="0" wp14:anchorId="0FAC49FC" wp14:editId="5F9EF6A0">
+          <wp:inline distT="0" distB="0" distL="0" distR="0" wp14:anchorId="75C2B5A7" wp14:editId="49BFBB48">
             <wp:extent cx="5760720" cy="3482709"/>
             <wp:effectExtent l="0" t="0" r="0" b="0"/>
             <wp:docPr id="3" name="Picture 3"/>
@@ -7088,7 +7088,7 @@
         </w:rPr>
         <w:lastRenderedPageBreak/>
         <w:drawing>
-          <wp:inline distT="0" distB="0" distL="0" distR="0" wp14:anchorId="70684D29" wp14:editId="6C651374">
+          <wp:inline distT="0" distB="0" distL="0" distR="0" wp14:anchorId="5B809D7C" wp14:editId="70268033">
             <wp:extent cx="5760720" cy="2351418"/>
             <wp:effectExtent l="0" t="0" r="0" b="0"/>
             <wp:docPr id="4" name="Picture 4"/>
@@ -8048,7 +8048,7 @@
         </w:rPr>
         <w:lastRenderedPageBreak/>
         <w:drawing>
-          <wp:inline distT="0" distB="0" distL="0" distR="0" wp14:anchorId="7CA84931" wp14:editId="5F0CC6F9">
+          <wp:inline distT="0" distB="0" distL="0" distR="0" wp14:anchorId="101122C9" wp14:editId="7C702F0A">
             <wp:extent cx="5760720" cy="2045294"/>
             <wp:effectExtent l="0" t="0" r="0" b="0"/>
             <wp:docPr id="5" name="Picture 5"/>
@@ -8223,7 +8223,7 @@
         </w:rPr>
         <w:lastRenderedPageBreak/>
         <w:drawing>
-          <wp:inline distT="0" distB="0" distL="0" distR="0" wp14:anchorId="083A2723" wp14:editId="39FC13AD">
+          <wp:inline distT="0" distB="0" distL="0" distR="0" wp14:anchorId="76C99169" wp14:editId="2DDC4FDF">
             <wp:extent cx="5760720" cy="2308234"/>
             <wp:effectExtent l="0" t="0" r="0" b="0"/>
             <wp:docPr id="6" name="Picture 6"/>
@@ -8955,7 +8955,7 @@
         </w:rPr>
         <w:lastRenderedPageBreak/>
         <w:drawing>
-          <wp:inline distT="0" distB="0" distL="0" distR="0" wp14:anchorId="168BA2E6" wp14:editId="05F51D3C">
+          <wp:inline distT="0" distB="0" distL="0" distR="0" wp14:anchorId="77F0F90C" wp14:editId="728F35CC">
             <wp:extent cx="5760720" cy="2167923"/>
             <wp:effectExtent l="0" t="0" r="0" b="0"/>
             <wp:docPr id="7" name="Picture 7"/>
@@ -9063,7 +9063,7 @@
           <w:noProof/>
         </w:rPr>
         <w:drawing>
-          <wp:inline distT="0" distB="0" distL="0" distR="0" wp14:anchorId="276F4BCF" wp14:editId="73BC02D6">
+          <wp:inline distT="0" distB="0" distL="0" distR="0" wp14:anchorId="7B0FB76F" wp14:editId="24FD25EC">
             <wp:extent cx="5760720" cy="2258878"/>
             <wp:effectExtent l="0" t="0" r="0" b="0"/>
             <wp:docPr id="8" name="Picture 8"/>
@@ -9247,7 +9247,7 @@
           <w:noProof/>
         </w:rPr>
         <w:drawing>
-          <wp:inline distT="0" distB="0" distL="0" distR="0" wp14:anchorId="0EC5C641" wp14:editId="54535E7D">
+          <wp:inline distT="0" distB="0" distL="0" distR="0" wp14:anchorId="1EA4874F" wp14:editId="28E79A7F">
             <wp:extent cx="5760720" cy="2516852"/>
             <wp:effectExtent l="0" t="0" r="0" b="0"/>
             <wp:docPr id="9" name="Picture 9"/>
@@ -9384,7 +9384,7 @@
           <w:noProof/>
         </w:rPr>
         <w:drawing>
-          <wp:inline distT="0" distB="0" distL="0" distR="0" wp14:anchorId="1D5CC810" wp14:editId="0B73E1D0">
+          <wp:inline distT="0" distB="0" distL="0" distR="0" wp14:anchorId="581EC7D6" wp14:editId="2FE54472">
             <wp:extent cx="5760720" cy="2223311"/>
             <wp:effectExtent l="0" t="0" r="0" b="0"/>
             <wp:docPr id="10" name="Picture 10"/>
@@ -9474,7 +9474,7 @@
           <w:noProof/>
         </w:rPr>
         <w:drawing>
-          <wp:inline distT="0" distB="0" distL="0" distR="0" wp14:anchorId="77AA8D6D" wp14:editId="65007685">
+          <wp:inline distT="0" distB="0" distL="0" distR="0" wp14:anchorId="097F8BE1" wp14:editId="7D25EEA2">
             <wp:extent cx="5760720" cy="2538527"/>
             <wp:effectExtent l="0" t="0" r="0" b="0"/>
             <wp:docPr id="11" name="Picture 11"/>
@@ -12677,76 +12677,76 @@
       </w:rPr>
     </w:lvl>
   </w:abstractNum>
-  <w:num w:numId="1" w16cid:durableId="1820997085">
+  <w:num w:numId="1" w16cid:durableId="640380265">
     <w:abstractNumId w:val="8"/>
   </w:num>
-  <w:num w:numId="2" w16cid:durableId="2090685755">
+  <w:num w:numId="2" w16cid:durableId="1303385251">
     <w:abstractNumId w:val="6"/>
   </w:num>
-  <w:num w:numId="3" w16cid:durableId="3017033">
+  <w:num w:numId="3" w16cid:durableId="2129858584">
     <w:abstractNumId w:val="5"/>
   </w:num>
-  <w:num w:numId="4" w16cid:durableId="1925800387">
+  <w:num w:numId="4" w16cid:durableId="1620722052">
     <w:abstractNumId w:val="4"/>
   </w:num>
-  <w:num w:numId="5" w16cid:durableId="1025980923">
+  <w:num w:numId="5" w16cid:durableId="1952198352">
     <w:abstractNumId w:val="7"/>
   </w:num>
-  <w:num w:numId="6" w16cid:durableId="334695231">
+  <w:num w:numId="6" w16cid:durableId="717317516">
     <w:abstractNumId w:val="3"/>
   </w:num>
-  <w:num w:numId="7" w16cid:durableId="2098137952">
+  <w:num w:numId="7" w16cid:durableId="555745428">
     <w:abstractNumId w:val="2"/>
   </w:num>
-  <w:num w:numId="8" w16cid:durableId="389379872">
+  <w:num w:numId="8" w16cid:durableId="1390225285">
     <w:abstractNumId w:val="1"/>
   </w:num>
-  <w:num w:numId="9" w16cid:durableId="333924227">
+  <w:num w:numId="9" w16cid:durableId="1987662948">
     <w:abstractNumId w:val="0"/>
   </w:num>
-  <w:num w:numId="10" w16cid:durableId="1395541539">
+  <w:num w:numId="10" w16cid:durableId="68506976">
     <w:abstractNumId w:val="7"/>
     <w:lvlOverride w:ilvl="0">
       <w:startOverride w:val="1"/>
     </w:lvlOverride>
   </w:num>
-  <w:num w:numId="11" w16cid:durableId="674302803">
+  <w:num w:numId="11" w16cid:durableId="926309946">
     <w:abstractNumId w:val="7"/>
     <w:lvlOverride w:ilvl="0">
       <w:startOverride w:val="1"/>
     </w:lvlOverride>
   </w:num>
-  <w:num w:numId="12" w16cid:durableId="135999408">
+  <w:num w:numId="12" w16cid:durableId="2058702902">
     <w:abstractNumId w:val="7"/>
     <w:lvlOverride w:ilvl="0">
       <w:startOverride w:val="1"/>
     </w:lvlOverride>
   </w:num>
-  <w:num w:numId="13" w16cid:durableId="1880509306">
+  <w:num w:numId="13" w16cid:durableId="1117942893">
     <w:abstractNumId w:val="7"/>
     <w:lvlOverride w:ilvl="0">
       <w:startOverride w:val="1"/>
     </w:lvlOverride>
   </w:num>
-  <w:num w:numId="14" w16cid:durableId="63257687">
+  <w:num w:numId="14" w16cid:durableId="295793433">
     <w:abstractNumId w:val="7"/>
     <w:lvlOverride w:ilvl="0">
       <w:startOverride w:val="1"/>
     </w:lvlOverride>
   </w:num>
-  <w:num w:numId="15" w16cid:durableId="634801806">
+  <w:num w:numId="15" w16cid:durableId="2083135964">
     <w:abstractNumId w:val="7"/>
     <w:lvlOverride w:ilvl="0">
       <w:startOverride w:val="1"/>
     </w:lvlOverride>
   </w:num>
-  <w:num w:numId="16" w16cid:durableId="1191383281">
+  <w:num w:numId="16" w16cid:durableId="1775321243">
     <w:abstractNumId w:val="7"/>
     <w:lvlOverride w:ilvl="0">
       <w:startOverride w:val="1"/>
     </w:lvlOverride>
   </w:num>
-  <w:num w:numId="17" w16cid:durableId="1710957508">
+  <w:num w:numId="17" w16cid:durableId="1886092069">
     <w:abstractNumId w:val="7"/>
     <w:lvlOverride w:ilvl="0">
       <w:startOverride w:val="1"/>

</xml_diff>

<commit_message>
Round 19c: integrate the full-corpus reversal into the abstract, contributions, discussion and limitations
</commit_message>
<xml_diff>
--- a/重构版论文_v4_20260915/English_SCI_Manuscript_v4.docx
+++ b/重构版论文_v4_20260915/English_SCI_Manuscript_v4.docx
@@ -21,16 +21,16 @@
     </w:p>
     <w:p>
       <w:r>
-        <w:t>Reported performance differences between intrusion-detection models are sensitive to duplicate flows, conflicting labels, feature leakage and class priors. We test a widely adopted but rarely validated assumption: that fusing random-forest experts with sample-specific reliability weights (RCCF) beats equal voting. Under one leakage-controlled protocol we build a 53,237-flow natural-prior population and a 3,365-flow balanced control from CIC-IDS2017, add NSL-KDD, UNSW-NB15 and an IoT corpus as independent be</w:t>
-      </w:r>
-      <w:r>
-        <w:t>nchmarks, and compare four feature views over ten seeds. The two models differ by -0.000456 Macro-F1 (five up, five down); the seed-level 90% and test-row paired bootstrap intervals both lie inside equivalence margins of 0.005 and 0.01. The four experts disagree on no test row, the learned weights have a normalised entropy of 0.99998, and class prior and deduplication order move Macro-F1 by +0.0725 and +0.0060. Three identifiability conditions are derived, one becoming a row-wise bound: 99.91% of the 23,958</w:t>
-      </w:r>
-      <w:r>
-        <w:t xml:space="preserve"> test rows are provably invariant, with a median decision margin 3,469 to 5,038 times that bound. All 108 gate configurations yield six distinct validation scores; the gain is governed by expert diversity (slope 0.0646, r = 0.749). The equivalence reproduces on a population 7.8 times larger and on the IoT corpus, where every model exceeds 0.9998 Macro-F1. The mechanism is 4.1 times larger and 4.6 times lower in throughput than one forest, with no cost-sensitive advantage. We contribute a reusable leakage-co</w:t>
-      </w:r>
-      <w:r>
-        <w:t>ntrolled protocol, an identifiability boundary and a quantitative map separating protocol effects from aggregation-rule differences; the evidence supports neither superiority nor production readiness.</w:t>
+        <w:t>Reported differences between intrusion-detection models are sensitive to duplicate flows, conflicting labels, feature leakage and class priors. We test a widely adopted but rarely validated assumption: that fusing random-forest experts with sample-specific reliability weights (RCCF) beats equal voting. Under one leakage-controlled protocol we build a 53,237-flow natural-prior population and a 3,365-flow balanced control from CIC-IDS2017, add NSL-KDD, UNSW-NB15 and an IoT corpus, and compare four feature vie</w:t>
+      </w:r>
+      <w:r>
+        <w:t>ws over ten seeds. The two models differ by -0.000456 Macro-F1 (five up, five down); the seed-level 90% and test-row paired bootstrap intervals both lie inside equivalence margins of 0.005 and 0.01. The four experts disagree on no test row, weight entropy is 0.99998, and class prior and deduplication order move Macro-F1 by +0.0725 and +0.0060. Three identifiability conditions are derived, one a row-wise bound: 99.91% of the 23,958 test rows are provably invariant, with a median decision margin 3,469-5,038 t</w:t>
+      </w:r>
+      <w:r>
+        <w:t>imes it. All 108 gate configurations yield six distinct validation scores; the gain is governed by expert diversity (slope 0.0646, r = 0.749). The equivalence reproduces on a population 7.8 times larger but not on the uncapped 2,429,503-flow corpus, where it becomes a small, consistent deficit (-0.005533, all ten seeds) at a 175-fold training cost; the IoT corpus saturates for every model. The mechanism is 4.1 times larger and 4.6 times slower than one forest, without cost-sensitive advantage. We contribute</w:t>
+      </w:r>
+      <w:r>
+        <w:t xml:space="preserve"> a reusable leakage-controlled protocol, an identifiability boundary and a map separating protocol from aggregation-rule effects; the evidence supports neither superiority nor production readiness.</w:t>
       </w:r>
     </w:p>
     <w:p>
@@ -285,7 +285,16 @@
         <w:t>A quantitative map separating protocol effects from aggregation-rule effects.</w:t>
       </w:r>
       <w:r>
-        <w:t xml:space="preserve"> On one experiment set we measure five sources of variation: aggregation (0.0005), feature view (+0.0021), deduplication order (up to +0.0060), tuning budget (+0.0078) and class prior (+0.0725). File-level extrapolation spans 0.33-1.00. Protocol effects are an order of magnitude larger than the aggregation effect the literature usually reports, and the equivalence is reproduced on a population 7.8 times larger and on a fourth, IoT-domain benchmark.</w:t>
+        <w:t xml:space="preserve"> On one experiment set we measure five sources of variation: aggregation (0.0005), feature view (+0.0021), deduplication order (up to +0.0060), tuning budget (+0.0078) and class prior (+0.0725). File-level extrapolation spans 0.33-1.00. Protocol effects are an order of magnitude larger than the aggregation effect the literature usually reports, and the equivalence survives a 7.8-fold larger population but </w:t>
+      </w:r>
+      <w:r>
+        <w:rPr>
+          <w:b/>
+        </w:rPr>
+        <w:t>breaks on the fully uncapped corpus</w:t>
+      </w:r>
+      <w:r>
+        <w:t>, where the difference becomes a small, consistent deficit.</w:t>
       </w:r>
     </w:p>
     <w:p>
@@ -364,11 +373,14 @@
     </w:p>
     <w:p>
       <w:r>
-        <w:t xml:space="preserve">Several structural defects are documented [19]. Class distributions are extremely skewed - in CIC-IDS2017 the Web Attack and Infiltration families are three to five orders of magnitude smaller than BENIGN. Feature tables contain constant columns and collection artefacts. Some attack families were generated by a single tool in a single time </w:t>
+        <w:t xml:space="preserve">Several structural defects are documented [19]. Class distributions are extremely skewed - in CIC-IDS2017 the Web Attack and Infiltration families are three to five orders of magnitude smaller than BENIGN. Feature tables contain </w:t>
       </w:r>
       <w:r>
         <w:lastRenderedPageBreak/>
-        <w:t>window and are therefore highly homogeneous. Training and test partitions may share duplicates. Engelen and Timmerman, and Liu et al., show that preprocessing order and splitting choices alone can materially change reported performance [20,21]. These findings motivate H3: if protocol choices change conclusions, the protocol itself must become a reported and tested object. This position is part of a wider methodological critique of machine learning in security [22,23,26].</w:t>
+        <w:t>constant columns and collection artefacts. Some attack families were generated by a single tool in a single time window and are therefore highly homogeneous. Training and test partitions may share duplicates. Engelen and Timmerman, and Liu et al., show that preprocessing order and splitting choices alone can materially change reported performance [20,21]. These findings motivate H3: if protocol choices change conclusions, the protocol itself must become a reported and tested object. This position is part of</w:t>
+      </w:r>
+      <w:r>
+        <w:t xml:space="preserve"> a wider methodological critique of machine learning in security [22,23,26].</w:t>
       </w:r>
     </w:p>
     <w:p>
@@ -430,7 +442,11 @@
     </w:p>
     <w:p>
       <w:r>
-        <w:t>Deployment constraints form an independent axis. A gateway may allow only a few milliseconds per flow, and the classifier-stage latency must be predictable. A design that matches an equal-weight forest on offline Macro-F1 but multiplies inference latency has no exchange value in deployment. We report P50, P95 and P99 single-row latency and distinguish single-thread from library-default threading.</w:t>
+        <w:t xml:space="preserve">Deployment constraints form an independent axis. A gateway may allow only a few milliseconds per flow, and the classifier-stage latency must be predictable. A design that matches an equal-weight forest on offline Macro-F1 but </w:t>
+      </w:r>
+      <w:r>
+        <w:lastRenderedPageBreak/>
+        <w:t>multiplies inference latency has no exchange value in deployment. We report P50, P95 and P99 single-row latency and distinguish single-thread from library-default threading.</w:t>
       </w:r>
     </w:p>
     <w:p>
@@ -438,7 +454,6 @@
         <w:pStyle w:val="21"/>
       </w:pPr>
       <w:r>
-        <w:lastRenderedPageBreak/>
         <w:t>2.5 Gap and positioning</w:t>
       </w:r>
     </w:p>
@@ -1007,6 +1022,7 @@
         <w:pStyle w:val="1"/>
       </w:pPr>
       <w:r>
+        <w:lastRenderedPageBreak/>
         <w:t>3. Data, Provenance and Protocol</w:t>
       </w:r>
     </w:p>
@@ -1019,7 +1035,7 @@
           <w:noProof/>
         </w:rPr>
         <w:drawing>
-          <wp:inline distT="0" distB="0" distL="0" distR="0" wp14:anchorId="0EB948A2" wp14:editId="752415F6">
+          <wp:inline distT="0" distB="0" distL="0" distR="0" wp14:anchorId="3205F78B" wp14:editId="29F67001">
             <wp:extent cx="5760720" cy="2734826"/>
             <wp:effectExtent l="0" t="0" r="0" b="0"/>
             <wp:docPr id="1" name="Picture 1"/>
@@ -1073,7 +1089,6 @@
         <w:pStyle w:val="21"/>
       </w:pPr>
       <w:r>
-        <w:lastRenderedPageBreak/>
         <w:t>3.1 Datasets, sources and licensing</w:t>
       </w:r>
     </w:p>
@@ -1673,7 +1688,6 @@
         <w:rPr>
           <w:b/>
         </w:rPr>
-        <w:lastRenderedPageBreak/>
         <w:t>Stage 4, global deduplication and conflict resolution.</w:t>
       </w:r>
       <w:r>
@@ -2163,7 +2177,14 @@
               <w:rPr>
                 <w:sz w:val="16"/>
               </w:rPr>
-              <w:t>After class capping (natural-prior population)</w:t>
+              <w:t xml:space="preserve">After class capping (natural-prior </w:t>
+            </w:r>
+            <w:r>
+              <w:rPr>
+                <w:sz w:val="16"/>
+              </w:rPr>
+              <w:lastRenderedPageBreak/>
+              <w:t>population)</w:t>
             </w:r>
           </w:p>
         </w:tc>
@@ -2179,6 +2200,7 @@
               <w:rPr>
                 <w:sz w:val="16"/>
               </w:rPr>
+              <w:lastRenderedPageBreak/>
               <w:t>53,237</w:t>
             </w:r>
           </w:p>
@@ -2211,7 +2233,14 @@
               <w:rPr>
                 <w:sz w:val="16"/>
               </w:rPr>
-              <w:t>20,000 per class, observed proportions retained</w:t>
+              <w:t xml:space="preserve">20,000 per class, observed </w:t>
+            </w:r>
+            <w:r>
+              <w:rPr>
+                <w:sz w:val="16"/>
+              </w:rPr>
+              <w:lastRenderedPageBreak/>
+              <w:t>proportions retained</w:t>
             </w:r>
           </w:p>
         </w:tc>
@@ -2229,6 +2258,7 @@
               <w:rPr>
                 <w:sz w:val="16"/>
               </w:rPr>
+              <w:lastRenderedPageBreak/>
               <w:t>Train / validation / test</w:t>
             </w:r>
           </w:p>
@@ -2363,7 +2393,7 @@
           <w:noProof/>
         </w:rPr>
         <w:drawing>
-          <wp:inline distT="0" distB="0" distL="0" distR="0" wp14:anchorId="046B7788" wp14:editId="29D544F2">
+          <wp:inline distT="0" distB="0" distL="0" distR="0" wp14:anchorId="6E33AE67" wp14:editId="4FB68FAA">
             <wp:extent cx="5760720" cy="2722098"/>
             <wp:effectExtent l="0" t="0" r="0" b="0"/>
             <wp:docPr id="2" name="Picture 2"/>
@@ -2409,7 +2439,6 @@
           <w:color w:val="404040"/>
           <w:sz w:val="18"/>
         </w:rPr>
-        <w:lastRenderedPageBreak/>
         <w:t>Figure 2. CIC-IDS2017 audit chain (log scale)</w:t>
       </w:r>
     </w:p>
@@ -2462,6 +2491,7 @@
         <w:pStyle w:val="21"/>
       </w:pPr>
       <w:r>
+        <w:lastRenderedPageBreak/>
         <w:t>3.4 Leakage-controlled protocol</w:t>
       </w:r>
     </w:p>
@@ -2581,7 +2611,6 @@
         <w:pStyle w:val="21"/>
       </w:pPr>
       <w:r>
-        <w:lastRenderedPageBreak/>
         <w:t>3.5 Estimands and statistical procedure</w:t>
       </w:r>
     </w:p>
@@ -2638,6 +2667,7 @@
         <w:pStyle w:val="21"/>
       </w:pPr>
       <w:r>
+        <w:lastRenderedPageBreak/>
         <w:t>3.6 Validity threats excluded by design</w:t>
       </w:r>
     </w:p>
@@ -2728,7 +2758,6 @@
     </w:p>
     <w:p>
       <w:r>
-        <w:lastRenderedPageBreak/>
         <w:t>External controls are an equal-weight random forest (RF) on each view, extremely randomised trees, XGBoost and a multilayer perceptron (MLP). Tree-ensemble and boosting references are [1-8]. All controls share the feature budget and the seed set.</w:t>
       </w:r>
     </w:p>
@@ -3330,6 +3359,7 @@
     </w:p>
     <w:p>
       <w:r>
+        <w:lastRenderedPageBreak/>
         <w:t xml:space="preserve">Fused probabilities are then temperature-scaled on the validation partition [29], and a Mondrian (class-conditional) conformal predictor provides an optional </w:t>
       </w:r>
       <w:r>
@@ -3350,9 +3380,8 @@
         <w:rPr>
           <w:noProof/>
         </w:rPr>
-        <w:lastRenderedPageBreak/>
         <w:drawing>
-          <wp:inline distT="0" distB="0" distL="0" distR="0" wp14:anchorId="75C2B5A7" wp14:editId="49BFBB48">
+          <wp:inline distT="0" distB="0" distL="0" distR="0" wp14:anchorId="29B25C7A" wp14:editId="3A92877E">
             <wp:extent cx="5760720" cy="3482709"/>
             <wp:effectExtent l="0" t="0" r="0" b="0"/>
             <wp:docPr id="3" name="Picture 3"/>
@@ -3622,6 +3651,7 @@
         <w:rPr>
           <w:b/>
         </w:rPr>
+        <w:lastRenderedPageBreak/>
         <w:t>Condition 1 (convex invariance).</w:t>
       </w:r>
       <w:r>
@@ -3641,7 +3671,6 @@
     </w:p>
     <w:p>
       <w:r>
-        <w:lastRenderedPageBreak/>
         <w:t>This is the degenerate case. Real experts are not identical, so a weaker condition is required.</w:t>
       </w:r>
     </w:p>
@@ -4724,10 +4753,11 @@
     </w:p>
     <w:p>
       <w:r>
-        <w:t>Let n be the number of training rows, d the original feature count, k the selected feature count, T the number of trees, K the number of cross-fitting folds and Q = 4 the number of experts. The dominant cost of the cross-fitting stage is approximately O(QK T n log n), the final refit stage costs O(QT n log n), and filter selection contributes O(Q n d). Inference requires one tree traversal per expert plus the risk models, about O(QT log n) per row. RCCF is therefore substantially more expensive than a singl</w:t>
-      </w:r>
-      <w:r>
-        <w:t>e equal-weight forest at both ends, and Section 5.6 quantifies that cost. All experiments ran on a single workstation with 8 physical cores (16 logical), 35.8 GB of RAM and Windows 10 (build 10.0.26200), using Python 3.11.4, scikit-learn 1.9.0, XGBoost 3.2.0, NumPy 2.4.6, pandas 3.0.5 and Matplotlib 3.11.1. The reported timings are single-machine measurements and are not portability claims. The software stack is documented in [44-47].</w:t>
+        <w:t xml:space="preserve">Let n be the number of training rows, d the original feature count, k the selected feature count, T the number of trees, K the number of cross-fitting folds and Q = 4 the number of experts. The dominant cost of the cross-fitting stage is approximately O(QK T n log n), the final refit stage costs O(QT n log n), and filter selection contributes O(Q n d). Inference requires one tree traversal per expert plus the risk models, about O(QT log n) per row. RCCF is therefore </w:t>
+      </w:r>
+      <w:r>
+        <w:lastRenderedPageBreak/>
+        <w:t>substantially more expensive than a single equal-weight forest at both ends, and Section 5.6 quantifies that cost. All experiments ran on a single workstation with 8 physical cores (16 logical), 35.8 GB of RAM and Windows 10 (build 10.0.26200), using Python 3.11.4, scikit-learn 1.9.0, XGBoost 3.2.0, NumPy 2.4.6, pandas 3.0.5 and Matplotlib 3.11.1. The reported timings are single-machine measurements and are not portability claims. The software stack is documented in [44-47].</w:t>
       </w:r>
     </w:p>
     <w:p>
@@ -4735,7 +4765,6 @@
         <w:pStyle w:val="21"/>
       </w:pPr>
       <w:r>
-        <w:lastRenderedPageBreak/>
         <w:t>4.5 Controls and ablations</w:t>
       </w:r>
     </w:p>
@@ -5168,6 +5197,7 @@
     </w:p>
     <w:p>
       <w:r>
+        <w:lastRenderedPageBreak/>
         <w:t xml:space="preserve">All three protocols agree: </w:t>
       </w:r>
       <w:r>
@@ -5185,7 +5215,6 @@
         <w:pStyle w:val="21"/>
       </w:pPr>
       <w:r>
-        <w:lastRenderedPageBreak/>
         <w:t>5.2 RQ2: Conditional weighting does not beat equal voting</w:t>
       </w:r>
     </w:p>
@@ -7075,7 +7104,11 @@
         <w:t>-0.000456</w:t>
       </w:r>
       <w:r>
-        <w:t>, with five seeds favouring RCCF and five favouring the equal forest. On the three-seed balanced control RCCF reaches 0.961807 against 0.963215, trailing by -0.001408. Both magnitudes are below one thousandth and the sign is not stable across settings. One baseline is stronger on a different metric: extremely randomised trees obtain the highest balanced accuracy (0.96215 against 0.94820 for RCCF) while obtaining the lowest Macro-F1 (0.857490), because they spread predictions more evenly across rare classes.</w:t>
+        <w:t xml:space="preserve">, with five seeds favouring RCCF and five favouring the equal forest. On the three-seed balanced control </w:t>
+      </w:r>
+      <w:r>
+        <w:lastRenderedPageBreak/>
+        <w:t>RCCF reaches 0.961807 against 0.963215, trailing by -0.001408. Both magnitudes are below one thousandth and the sign is not stable across settings. One baseline is stronger on a different metric: extremely randomised trees obtain the highest balanced accuracy (0.96215 against 0.94820 for RCCF) while obtaining the lowest Macro-F1 (0.857490), because they spread predictions more evenly across rare classes.</w:t>
       </w:r>
     </w:p>
     <w:p>
@@ -7086,9 +7119,8 @@
         <w:rPr>
           <w:noProof/>
         </w:rPr>
-        <w:lastRenderedPageBreak/>
         <w:drawing>
-          <wp:inline distT="0" distB="0" distL="0" distR="0" wp14:anchorId="5B809D7C" wp14:editId="70268033">
+          <wp:inline distT="0" distB="0" distL="0" distR="0" wp14:anchorId="2264B814" wp14:editId="0CF69FCD">
             <wp:extent cx="5760720" cy="2351418"/>
             <wp:effectExtent l="0" t="0" r="0" b="0"/>
             <wp:docPr id="4" name="Picture 4"/>
@@ -7933,6 +7965,7 @@
     </w:p>
     <w:p>
       <w:r>
+        <w:lastRenderedPageBreak/>
         <w:t>The test-row paired bootstrap against the equal-weight chi-square forest gives a pooled 90% interval of [-0.004251, +0.003382] over the same ten seeds, which is also inside both margins.</w:t>
       </w:r>
     </w:p>
@@ -7947,11 +7980,7 @@
         <w:t>Power.</w:t>
       </w:r>
       <w:r>
-        <w:t xml:space="preserve"> With ten seeds and the observed standard deviation, the smallest difference detectable at 80% power is 0.00115 to 0.00161 Macro-F1; anything smaller would be missed, which is </w:t>
-      </w:r>
-      <w:r>
-        <w:lastRenderedPageBreak/>
-        <w:t xml:space="preserve">precisely why the equivalence margins are stated explicitly rather than inferred from a non-significant test. </w:t>
+        <w:t xml:space="preserve"> With ten seeds and the observed standard deviation, the smallest difference detectable at 80% power is 0.00115 to 0.00161 Macro-F1; anything smaller would be missed, which is precisely why the equivalence margins are stated explicitly rather than inferred from a non-significant test. </w:t>
       </w:r>
       <w:r>
         <w:rPr>
@@ -8048,7 +8077,7 @@
         </w:rPr>
         <w:lastRenderedPageBreak/>
         <w:drawing>
-          <wp:inline distT="0" distB="0" distL="0" distR="0" wp14:anchorId="101122C9" wp14:editId="7C702F0A">
+          <wp:inline distT="0" distB="0" distL="0" distR="0" wp14:anchorId="6C5D285A" wp14:editId="4CE1FD54">
             <wp:extent cx="5760720" cy="2045294"/>
             <wp:effectExtent l="0" t="0" r="0" b="0"/>
             <wp:docPr id="5" name="Picture 5"/>
@@ -8223,7 +8252,7 @@
         </w:rPr>
         <w:lastRenderedPageBreak/>
         <w:drawing>
-          <wp:inline distT="0" distB="0" distL="0" distR="0" wp14:anchorId="76C99169" wp14:editId="2DDC4FDF">
+          <wp:inline distT="0" distB="0" distL="0" distR="0" wp14:anchorId="14C06A71" wp14:editId="34C02C3F">
             <wp:extent cx="5760720" cy="2308234"/>
             <wp:effectExtent l="0" t="0" r="0" b="0"/>
             <wp:docPr id="6" name="Picture 6"/>
@@ -8955,7 +8984,7 @@
         </w:rPr>
         <w:lastRenderedPageBreak/>
         <w:drawing>
-          <wp:inline distT="0" distB="0" distL="0" distR="0" wp14:anchorId="77F0F90C" wp14:editId="728F35CC">
+          <wp:inline distT="0" distB="0" distL="0" distR="0" wp14:anchorId="4B6E3365" wp14:editId="5DB6809B">
             <wp:extent cx="5760720" cy="2167923"/>
             <wp:effectExtent l="0" t="0" r="0" b="0"/>
             <wp:docPr id="7" name="Picture 7"/>
@@ -9063,7 +9092,7 @@
           <w:noProof/>
         </w:rPr>
         <w:drawing>
-          <wp:inline distT="0" distB="0" distL="0" distR="0" wp14:anchorId="7B0FB76F" wp14:editId="24FD25EC">
+          <wp:inline distT="0" distB="0" distL="0" distR="0" wp14:anchorId="3D70AF1F" wp14:editId="26FB18EC">
             <wp:extent cx="5760720" cy="2258878"/>
             <wp:effectExtent l="0" t="0" r="0" b="0"/>
             <wp:docPr id="8" name="Picture 8"/>
@@ -9247,7 +9276,7 @@
           <w:noProof/>
         </w:rPr>
         <w:drawing>
-          <wp:inline distT="0" distB="0" distL="0" distR="0" wp14:anchorId="1EA4874F" wp14:editId="28E79A7F">
+          <wp:inline distT="0" distB="0" distL="0" distR="0" wp14:anchorId="09F7D55A" wp14:editId="03C09958">
             <wp:extent cx="5760720" cy="2516852"/>
             <wp:effectExtent l="0" t="0" r="0" b="0"/>
             <wp:docPr id="9" name="Picture 9"/>
@@ -9384,7 +9413,7 @@
           <w:noProof/>
         </w:rPr>
         <w:drawing>
-          <wp:inline distT="0" distB="0" distL="0" distR="0" wp14:anchorId="581EC7D6" wp14:editId="2FE54472">
+          <wp:inline distT="0" distB="0" distL="0" distR="0" wp14:anchorId="0EC76890" wp14:editId="13031A82">
             <wp:extent cx="5760720" cy="2223311"/>
             <wp:effectExtent l="0" t="0" r="0" b="0"/>
             <wp:docPr id="10" name="Picture 10"/>
@@ -9474,7 +9503,7 @@
           <w:noProof/>
         </w:rPr>
         <w:drawing>
-          <wp:inline distT="0" distB="0" distL="0" distR="0" wp14:anchorId="097F8BE1" wp14:editId="7D25EEA2">
+          <wp:inline distT="0" distB="0" distL="0" distR="0" wp14:anchorId="791C978F" wp14:editId="58EF3AD7">
             <wp:extent cx="5760720" cy="2538527"/>
             <wp:effectExtent l="0" t="0" r="0" b="0"/>
             <wp:docPr id="11" name="Picture 11"/>
@@ -9624,7 +9653,7 @@
     </w:p>
     <w:p>
       <w:r>
-        <w:t>The primary population is a capped subset, so the equivalence reported above could in principle be an artefact of that cap. Two further runs address the question directly.</w:t>
+        <w:t>The primary population is a capped subset, so the equivalence reported above could in principle be an artefact of that cap. Three further runs address the question directly.</w:t>
       </w:r>
     </w:p>
     <w:p>
@@ -9690,7 +9719,16 @@
     </w:p>
     <w:p>
       <w:r>
-        <w:t>Together the two runs bound the result from both sides: the equivalence is not an artefact of the 53,237-flow cap, and it reproduces in a domain whose classes are trivially separable.</w:t>
+        <w:t xml:space="preserve">Together the three runs bound the result from both sides, and the bound is narrower than a simple confirmation. The equivalence survives a 7.8-fold larger population, so it is not an artefact of the 53,237-flow cap, but it does </w:t>
+      </w:r>
+      <w:r>
+        <w:rPr>
+          <w:b/>
+        </w:rPr>
+        <w:t>not</w:t>
+      </w:r>
+      <w:r>
+        <w:t xml:space="preserve"> survive the fully uncapped corpus: there the difference becomes a small, consistent deficit at the 0.005 margin. The aggregation-rule difference is therefore negligible on capped populations and only becomes measurable - and negative - once the corpus is left completely unbalanced, which is the regime in which the mechanism would actually be deployed.</w:t>
       </w:r>
     </w:p>
     <w:p>
@@ -9736,7 +9774,11 @@
         <w:t>Condition B: margin dominance.</w:t>
       </w:r>
       <w:r>
-        <w:t xml:space="preserve"> Even when experts differ, the hard label remains unchanged as long as the smallest margin exceeds the probability movement that the weights can cause (Condition 2). The measured mean L1 probability change is 0.000299 with a maximum of 0.003473, while the median decision margin is 1.0, three orders of magnitude above the largest observed movement. Measurement 4 formalises this: under the a priori bound 99.91% of rows are provably immune, with a median margin-to-bound ratio of 3,469 to 5,038.</w:t>
+        <w:t xml:space="preserve"> Even when experts differ, the hard label remains unchanged as long as the smallest margin exceeds the probability movement that the weights can cause (Condition 2). The measured mean L1 probability change is 0.000299 with a maximum of 0.003473, while the median decision margin is 1.0, three orders </w:t>
+      </w:r>
+      <w:r>
+        <w:lastRenderedPageBreak/>
+        <w:t>of magnitude above the largest observed movement. Measurement 4 formalises this: under the a priori bound 99.91% of rows are provably immune, with a median margin-to-bound ratio of 3,469 to 5,038.</w:t>
       </w:r>
     </w:p>
     <w:p>
@@ -9744,7 +9786,6 @@
         <w:rPr>
           <w:b/>
         </w:rPr>
-        <w:lastRenderedPageBreak/>
         <w:t>Condition C: risk-output collapse.</w:t>
       </w:r>
       <w:r>
@@ -10324,6 +10365,7 @@
               <w:rPr>
                 <w:sz w:val="16"/>
               </w:rPr>
+              <w:lastRenderedPageBreak/>
               <w:t>Reproducibility of results</w:t>
             </w:r>
           </w:p>
@@ -10569,10 +10611,10 @@
         <w:rPr>
           <w:b/>
         </w:rPr>
-        <w:t>File-level experiments are not temporal holdouts.</w:t>
-      </w:r>
-      <w:r>
-        <w:t xml:space="preserve"> The files of CIC-IDS2017 cover different class sets, so a category-complete temporal protocol cannot be constructed from them. The file-level results support coverage and risk analysis only and must not be described as cross-time generalisation.</w:t>
+        <w:t>The equivalence depends on how the population is built.</w:t>
+      </w:r>
+      <w:r>
+        <w:t xml:space="preserve"> It holds on the 53,237-flow natural-prior population and on the 7.8-fold larger one, but not on the fully uncapped 2,429,503-flow corpus, where the same comparison becomes a small, consistent deficit. The statement that conditional weighting is indistinguishable from equal voting must therefore always be quoted together with the population it was measured on; it is not a scale-free property.</w:t>
       </w:r>
     </w:p>
     <w:p>
@@ -10580,6 +10622,18 @@
         <w:rPr>
           <w:b/>
         </w:rPr>
+        <w:t>File-level experiments are not temporal holdouts.</w:t>
+      </w:r>
+      <w:r>
+        <w:t xml:space="preserve"> The files of CIC-IDS2017 cover different class sets, so a category-complete temporal protocol cannot be constructed from them. The file-level results support coverage and risk analysis only and must not be described as cross-time generalisation.</w:t>
+      </w:r>
+    </w:p>
+    <w:p>
+      <w:r>
+        <w:rPr>
+          <w:b/>
+        </w:rPr>
+        <w:lastRenderedPageBreak/>
         <w:t>External datasets are independent benchmarks, not transfer experiments.</w:t>
       </w:r>
       <w:r>
@@ -10605,11 +10659,7 @@
         <w:t>Near-duplicates are removed only in their exact form.</w:t>
       </w:r>
       <w:r>
-        <w:t xml:space="preserve"> The introduction identifies near-duplicate flows as a hazard of public datasets, and the audit removes exact duplicate feature vectors. Rounding every feature to four significant digits and hashing the result shows that a further 0.36% of the study population forms near-duplicate </w:t>
-      </w:r>
-      <w:r>
-        <w:lastRenderedPageBreak/>
-        <w:t>groups at that resolution, and that 104 test rows (0.21% of the test set) share a rounded feature vector with a training row. Removing those rows changes Macro-F1 by at most 0.00057 for any of the three models, so the overlap cann</w:t>
+        <w:t xml:space="preserve"> The introduction identifies near-duplicate flows as a hazard of public datasets, and the audit removes exact duplicate feature vectors. Rounding every feature to four significant digits and hashing the result shows that a further 0.36% of the study population forms near-duplicate groups at that resolution, and that 104 test rows (0.21% of the test set) share a rounded feature vector with a training row. Removing those rows changes Macro-F1 by at most 0.00057 for any of the three models, so the overlap cann</w:t>
       </w:r>
       <w:r>
         <w:t>ot explain the reported differences; coarser resolutions are reported in the supplementary material.</w:t>
@@ -10697,7 +10747,22 @@
         <w:t xml:space="preserve"> Averaged over ten seeds on the natural-prior population of CIC-IDS2017, the Macro-F1 difference between conditional weighting and an equal-weight chi-square forest is -0.000456, with the per-seed sign split five to five. Both the seed-level 90% interval [-0.00112, +0.00021] and the test-row paired bootstrap interval [-0.00425, +0.00338] lie inside equivalence margins of 0.005 and 0.01. The four experts disagree on no test row, and the normalised weight entropy is 0.99998. The cost is about an 80-fold incre</w:t>
       </w:r>
       <w:r>
-        <w:t>ase in training time and a fivefold increase in batch inference time. Against a full-feature equal forest the gate is reliably better over ten seeds, but the magnitude matches that of a feature-view change.</w:t>
+        <w:t>ase in training time and a fivefold increase in batch inference time.</w:t>
+      </w:r>
+    </w:p>
+    <w:p>
+      <w:r>
+        <w:rPr>
+          <w:b/>
+        </w:rPr>
+        <w:lastRenderedPageBreak/>
+        <w:t>A qualification on that equivalence.</w:t>
+      </w:r>
+      <w:r>
+        <w:t xml:space="preserve"> It is a property of the population, not of the mechanism. On the fully uncapped 2,429,503-flow corpus the same comparison turns into a consistent deficit of -0.005533 across all ten seeds, at a 175-fold training cost. That equivalence is a property of the population, not of the mechanism: on the fully uncapped 2,429,503-flow corpus the difference turns into a consistent deficit of -0.005533 (all ten seeds, equivalent at 0.01 but not at 0.005) at a 175-fold training cost. Against a full-feature equal forest</w:t>
+      </w:r>
+      <w:r>
+        <w:t xml:space="preserve"> the gate is reliably better over ten seeds, but the magnitude matches that of a feature-view change.</w:t>
       </w:r>
     </w:p>
     <w:p>
@@ -10719,7 +10784,6 @@
         <w:rPr>
           <w:b/>
         </w:rPr>
-        <w:lastRenderedPageBreak/>
         <w:t>Third, protocol effects dominate aggregation-rule differences.</w:t>
       </w:r>
       <w:r>
@@ -10787,6 +10851,7 @@
         <w:pStyle w:val="1"/>
       </w:pPr>
       <w:r>
+        <w:lastRenderedPageBreak/>
         <w:t>Declaration of generative AI and AI-assisted technologies</w:t>
       </w:r>
     </w:p>
@@ -10813,7 +10878,6 @@
         <w:pStyle w:val="1"/>
       </w:pPr>
       <w:r>
-        <w:lastRenderedPageBreak/>
         <w:t>References</w:t>
       </w:r>
     </w:p>
@@ -11011,6 +11075,7 @@
         </w:numPr>
       </w:pPr>
       <w:r>
+        <w:lastRenderedPageBreak/>
         <w:t>Moustafa N, Slay J. UNSW-NB15: A comprehensive data set for network intrusion detection systems. MilCIS 2015: 1-6. DOI:10.1109/MilCIS.2015.7348942.</w:t>
       </w:r>
     </w:p>
@@ -11071,7 +11136,6 @@
         </w:numPr>
       </w:pPr>
       <w:r>
-        <w:lastRenderedPageBreak/>
         <w:t>Liu L, Engelen G, Timmerman J, et al. Error prevalence in NIDS datasets: A case study on CIC-IDS-2017 and CSE-CIC-IDS-2018. IEEE CNS 2022. DOI:10.1109/CNS56114.2022.9947235.</w:t>
       </w:r>
     </w:p>
@@ -11264,6 +11328,7 @@
         </w:numPr>
       </w:pPr>
       <w:r>
+        <w:lastRenderedPageBreak/>
         <w:t>Dietterich T G. Approximate statistical tests for comparing supervised classification learning algorithms. Neural Computation, 1998, 10(7): 1895-1923. DOI:10.1162/089976698300017197.</w:t>
       </w:r>
     </w:p>
@@ -11324,7 +11389,6 @@
         </w:numPr>
       </w:pPr>
       <w:r>
-        <w:lastRenderedPageBreak/>
         <w:t>Han S, Kim Y, Lee S. Improvement of the classification performance of an intrusion detection model for rare and unknown attack traffic. Electronics, 2021, 10(18): 2268. DOI:10.3390/electronics10182268.</w:t>
       </w:r>
     </w:p>
@@ -12041,6 +12105,7 @@
               <w:rPr>
                 <w:sz w:val="16"/>
               </w:rPr>
+              <w:lastRenderedPageBreak/>
               <w:t>S18</w:t>
             </w:r>
           </w:p>
@@ -12381,7 +12446,6 @@
               <w:rPr>
                 <w:sz w:val="16"/>
               </w:rPr>
-              <w:lastRenderedPageBreak/>
               <w:t>S28</w:t>
             </w:r>
           </w:p>
@@ -12677,76 +12741,76 @@
       </w:rPr>
     </w:lvl>
   </w:abstractNum>
-  <w:num w:numId="1" w16cid:durableId="640380265">
+  <w:num w:numId="1" w16cid:durableId="2039770111">
     <w:abstractNumId w:val="8"/>
   </w:num>
-  <w:num w:numId="2" w16cid:durableId="1303385251">
+  <w:num w:numId="2" w16cid:durableId="1298340574">
     <w:abstractNumId w:val="6"/>
   </w:num>
-  <w:num w:numId="3" w16cid:durableId="2129858584">
+  <w:num w:numId="3" w16cid:durableId="679355617">
     <w:abstractNumId w:val="5"/>
   </w:num>
-  <w:num w:numId="4" w16cid:durableId="1620722052">
+  <w:num w:numId="4" w16cid:durableId="1586184900">
     <w:abstractNumId w:val="4"/>
   </w:num>
-  <w:num w:numId="5" w16cid:durableId="1952198352">
+  <w:num w:numId="5" w16cid:durableId="605700422">
     <w:abstractNumId w:val="7"/>
   </w:num>
-  <w:num w:numId="6" w16cid:durableId="717317516">
+  <w:num w:numId="6" w16cid:durableId="1583291713">
     <w:abstractNumId w:val="3"/>
   </w:num>
-  <w:num w:numId="7" w16cid:durableId="555745428">
+  <w:num w:numId="7" w16cid:durableId="1218737451">
     <w:abstractNumId w:val="2"/>
   </w:num>
-  <w:num w:numId="8" w16cid:durableId="1390225285">
+  <w:num w:numId="8" w16cid:durableId="179974036">
     <w:abstractNumId w:val="1"/>
   </w:num>
-  <w:num w:numId="9" w16cid:durableId="1987662948">
+  <w:num w:numId="9" w16cid:durableId="397821467">
     <w:abstractNumId w:val="0"/>
   </w:num>
-  <w:num w:numId="10" w16cid:durableId="68506976">
+  <w:num w:numId="10" w16cid:durableId="1146972087">
     <w:abstractNumId w:val="7"/>
     <w:lvlOverride w:ilvl="0">
       <w:startOverride w:val="1"/>
     </w:lvlOverride>
   </w:num>
-  <w:num w:numId="11" w16cid:durableId="926309946">
+  <w:num w:numId="11" w16cid:durableId="1915627269">
     <w:abstractNumId w:val="7"/>
     <w:lvlOverride w:ilvl="0">
       <w:startOverride w:val="1"/>
     </w:lvlOverride>
   </w:num>
-  <w:num w:numId="12" w16cid:durableId="2058702902">
+  <w:num w:numId="12" w16cid:durableId="1341199925">
     <w:abstractNumId w:val="7"/>
     <w:lvlOverride w:ilvl="0">
       <w:startOverride w:val="1"/>
     </w:lvlOverride>
   </w:num>
-  <w:num w:numId="13" w16cid:durableId="1117942893">
+  <w:num w:numId="13" w16cid:durableId="1081803007">
     <w:abstractNumId w:val="7"/>
     <w:lvlOverride w:ilvl="0">
       <w:startOverride w:val="1"/>
     </w:lvlOverride>
   </w:num>
-  <w:num w:numId="14" w16cid:durableId="295793433">
+  <w:num w:numId="14" w16cid:durableId="439566739">
     <w:abstractNumId w:val="7"/>
     <w:lvlOverride w:ilvl="0">
       <w:startOverride w:val="1"/>
     </w:lvlOverride>
   </w:num>
-  <w:num w:numId="15" w16cid:durableId="2083135964">
+  <w:num w:numId="15" w16cid:durableId="2045516551">
     <w:abstractNumId w:val="7"/>
     <w:lvlOverride w:ilvl="0">
       <w:startOverride w:val="1"/>
     </w:lvlOverride>
   </w:num>
-  <w:num w:numId="16" w16cid:durableId="1775321243">
+  <w:num w:numId="16" w16cid:durableId="68695117">
     <w:abstractNumId w:val="7"/>
     <w:lvlOverride w:ilvl="0">
       <w:startOverride w:val="1"/>
     </w:lvlOverride>
   </w:num>
-  <w:num w:numId="17" w16cid:durableId="1886092069">
+  <w:num w:numId="17" w16cid:durableId="760250287">
     <w:abstractNumId w:val="7"/>
     <w:lvlOverride w:ilvl="0">
       <w:startOverride w:val="1"/>

</xml_diff>

<commit_message>
Round 19d: add population construction as a fifth attribution factor and its guidance
</commit_message>
<xml_diff>
--- a/重构版论文_v4_20260915/English_SCI_Manuscript_v4.docx
+++ b/重构版论文_v4_20260915/English_SCI_Manuscript_v4.docx
@@ -1035,7 +1035,7 @@
           <w:noProof/>
         </w:rPr>
         <w:drawing>
-          <wp:inline distT="0" distB="0" distL="0" distR="0" wp14:anchorId="3205F78B" wp14:editId="29F67001">
+          <wp:inline distT="0" distB="0" distL="0" distR="0" wp14:anchorId="677006CF" wp14:editId="4FC22204">
             <wp:extent cx="5760720" cy="2734826"/>
             <wp:effectExtent l="0" t="0" r="0" b="0"/>
             <wp:docPr id="1" name="Picture 1"/>
@@ -2393,7 +2393,7 @@
           <w:noProof/>
         </w:rPr>
         <w:drawing>
-          <wp:inline distT="0" distB="0" distL="0" distR="0" wp14:anchorId="6E33AE67" wp14:editId="4FB68FAA">
+          <wp:inline distT="0" distB="0" distL="0" distR="0" wp14:anchorId="659FE617" wp14:editId="424AFD1C">
             <wp:extent cx="5760720" cy="2722098"/>
             <wp:effectExtent l="0" t="0" r="0" b="0"/>
             <wp:docPr id="2" name="Picture 2"/>
@@ -3381,7 +3381,7 @@
           <w:noProof/>
         </w:rPr>
         <w:drawing>
-          <wp:inline distT="0" distB="0" distL="0" distR="0" wp14:anchorId="29B25C7A" wp14:editId="3A92877E">
+          <wp:inline distT="0" distB="0" distL="0" distR="0" wp14:anchorId="51DD0592" wp14:editId="272B892F">
             <wp:extent cx="5760720" cy="3482709"/>
             <wp:effectExtent l="0" t="0" r="0" b="0"/>
             <wp:docPr id="3" name="Picture 3"/>
@@ -7120,7 +7120,7 @@
           <w:noProof/>
         </w:rPr>
         <w:drawing>
-          <wp:inline distT="0" distB="0" distL="0" distR="0" wp14:anchorId="2264B814" wp14:editId="0CF69FCD">
+          <wp:inline distT="0" distB="0" distL="0" distR="0" wp14:anchorId="4C3A8D11" wp14:editId="7D429977">
             <wp:extent cx="5760720" cy="2351418"/>
             <wp:effectExtent l="0" t="0" r="0" b="0"/>
             <wp:docPr id="4" name="Picture 4"/>
@@ -8077,7 +8077,7 @@
         </w:rPr>
         <w:lastRenderedPageBreak/>
         <w:drawing>
-          <wp:inline distT="0" distB="0" distL="0" distR="0" wp14:anchorId="6C5D285A" wp14:editId="4CE1FD54">
+          <wp:inline distT="0" distB="0" distL="0" distR="0" wp14:anchorId="7F0677B1" wp14:editId="362ABF1B">
             <wp:extent cx="5760720" cy="2045294"/>
             <wp:effectExtent l="0" t="0" r="0" b="0"/>
             <wp:docPr id="5" name="Picture 5"/>
@@ -8252,7 +8252,7 @@
         </w:rPr>
         <w:lastRenderedPageBreak/>
         <w:drawing>
-          <wp:inline distT="0" distB="0" distL="0" distR="0" wp14:anchorId="14C06A71" wp14:editId="34C02C3F">
+          <wp:inline distT="0" distB="0" distL="0" distR="0" wp14:anchorId="20F247C0" wp14:editId="09B75B88">
             <wp:extent cx="5760720" cy="2308234"/>
             <wp:effectExtent l="0" t="0" r="0" b="0"/>
             <wp:docPr id="6" name="Picture 6"/>
@@ -8984,7 +8984,7 @@
         </w:rPr>
         <w:lastRenderedPageBreak/>
         <w:drawing>
-          <wp:inline distT="0" distB="0" distL="0" distR="0" wp14:anchorId="4B6E3365" wp14:editId="5DB6809B">
+          <wp:inline distT="0" distB="0" distL="0" distR="0" wp14:anchorId="5A3F2E85" wp14:editId="44E89469">
             <wp:extent cx="5760720" cy="2167923"/>
             <wp:effectExtent l="0" t="0" r="0" b="0"/>
             <wp:docPr id="7" name="Picture 7"/>
@@ -9092,7 +9092,7 @@
           <w:noProof/>
         </w:rPr>
         <w:drawing>
-          <wp:inline distT="0" distB="0" distL="0" distR="0" wp14:anchorId="3D70AF1F" wp14:editId="26FB18EC">
+          <wp:inline distT="0" distB="0" distL="0" distR="0" wp14:anchorId="29924FCC" wp14:editId="6D0BFBCE">
             <wp:extent cx="5760720" cy="2258878"/>
             <wp:effectExtent l="0" t="0" r="0" b="0"/>
             <wp:docPr id="8" name="Picture 8"/>
@@ -9276,7 +9276,7 @@
           <w:noProof/>
         </w:rPr>
         <w:drawing>
-          <wp:inline distT="0" distB="0" distL="0" distR="0" wp14:anchorId="09F7D55A" wp14:editId="03C09958">
+          <wp:inline distT="0" distB="0" distL="0" distR="0" wp14:anchorId="7FC7FE99" wp14:editId="367F4206">
             <wp:extent cx="5760720" cy="2516852"/>
             <wp:effectExtent l="0" t="0" r="0" b="0"/>
             <wp:docPr id="9" name="Picture 9"/>
@@ -9413,7 +9413,7 @@
           <w:noProof/>
         </w:rPr>
         <w:drawing>
-          <wp:inline distT="0" distB="0" distL="0" distR="0" wp14:anchorId="0EC76890" wp14:editId="13031A82">
+          <wp:inline distT="0" distB="0" distL="0" distR="0" wp14:anchorId="4B149F32" wp14:editId="712C11C9">
             <wp:extent cx="5760720" cy="2223311"/>
             <wp:effectExtent l="0" t="0" r="0" b="0"/>
             <wp:docPr id="10" name="Picture 10"/>
@@ -9503,7 +9503,7 @@
           <w:noProof/>
         </w:rPr>
         <w:drawing>
-          <wp:inline distT="0" distB="0" distL="0" distR="0" wp14:anchorId="791C978F" wp14:editId="58EF3AD7">
+          <wp:inline distT="0" distB="0" distL="0" distR="0" wp14:anchorId="42B336F1" wp14:editId="704F9D2E">
             <wp:extent cx="5760720" cy="2538527"/>
             <wp:effectExtent l="0" t="0" r="0" b="0"/>
             <wp:docPr id="11" name="Picture 11"/>
@@ -9825,7 +9825,7 @@
         <w:t>attribution constraint</w:t>
       </w:r>
       <w:r>
-        <w:t>: without controlling duplicates, transform leakage, class priors and tuning budgets, an observed "weighting gain" has at least four competing explanations [20-22], each of which has a measured magnitude in this study.</w:t>
+        <w:t>: without controlling duplicates, transform leakage, class priors and tuning budgets, an observed "weighting gain" has at least five competing explanations [20-22], each of which has a measured magnitude in this study.</w:t>
       </w:r>
     </w:p>
     <w:p>
@@ -9901,14 +9901,32 @@
       </w:r>
     </w:p>
     <w:p>
-      <w:r>
-        <w:t xml:space="preserve">The contribution to the literature is therefore a threshold rather than a refutation: </w:t>
-      </w:r>
+      <w:pPr>
+        <w:pStyle w:val="a"/>
+        <w:numPr>
+          <w:ilvl w:val="0"/>
+          <w:numId w:val="15"/>
+        </w:numPr>
+      </w:pPr>
       <w:r>
         <w:rPr>
           <w:b/>
         </w:rPr>
-        <w:t>any claim that an aggregation rule helps should survive control of these four factors, otherwise it should be described as a protocol effect.</w:t>
+        <w:t>Population construction.</w:t>
+      </w:r>
+      <w:r>
+        <w:t xml:space="preserve"> The identical comparison is an equivalence on the 53,237-flow capped population and a consistent deficit on the fully uncapped 2,429,503-flow corpus. Neither result is wrong; the population decides which one a study reports.</w:t>
+      </w:r>
+    </w:p>
+    <w:p>
+      <w:r>
+        <w:t xml:space="preserve">The contribution to the literature is therefore a threshold rather than a refutation: </w:t>
+      </w:r>
+      <w:r>
+        <w:rPr>
+          <w:b/>
+        </w:rPr>
+        <w:t>any claim that an aggregation rule helps should survive control of these five factors, otherwise it should be described as a protocol effect.</w:t>
       </w:r>
     </w:p>
     <w:p>
@@ -10281,7 +10299,14 @@
               <w:rPr>
                 <w:sz w:val="16"/>
               </w:rPr>
-              <w:t>Higher false-rejection rate on known classes; the operating point must be recalibrated</w:t>
+              <w:t xml:space="preserve">Higher false-rejection rate on known classes; the operating point </w:t>
+            </w:r>
+            <w:r>
+              <w:rPr>
+                <w:sz w:val="16"/>
+              </w:rPr>
+              <w:lastRenderedPageBreak/>
+              <w:t>must be recalibrated</w:t>
             </w:r>
           </w:p>
         </w:tc>
@@ -10299,6 +10324,7 @@
               <w:rPr>
                 <w:sz w:val="16"/>
               </w:rPr>
+              <w:lastRenderedPageBreak/>
               <w:t>Cross-file or cross-scenario evaluation</w:t>
             </w:r>
           </w:p>
@@ -10365,7 +10391,6 @@
               <w:rPr>
                 <w:sz w:val="16"/>
               </w:rPr>
-              <w:lastRenderedPageBreak/>
               <w:t>Reproducibility of results</w:t>
             </w:r>
           </w:p>
@@ -10415,6 +10440,72 @@
                 <w:sz w:val="16"/>
               </w:rPr>
               <w:t>Extra storage and version management</w:t>
+            </w:r>
+          </w:p>
+        </w:tc>
+      </w:tr>
+      <w:tr>
+        <w:tc>
+          <w:tcPr>
+            <w:tcW w:w="2448" w:type="dxa"/>
+          </w:tcPr>
+          <w:p>
+            <w:pPr>
+              <w:spacing w:after="0"/>
+            </w:pPr>
+            <w:r>
+              <w:rPr>
+                <w:sz w:val="16"/>
+              </w:rPr>
+              <w:t>Decide whether to deploy conditional weighting</w:t>
+            </w:r>
+          </w:p>
+        </w:tc>
+        <w:tc>
+          <w:tcPr>
+            <w:tcW w:w="2448" w:type="dxa"/>
+          </w:tcPr>
+          <w:p>
+            <w:pPr>
+              <w:spacing w:after="0"/>
+            </w:pPr>
+            <w:r>
+              <w:rPr>
+                <w:sz w:val="16"/>
+              </w:rPr>
+              <w:t>Equal voting on capped populations; do not deploy on strongly imbalanced corpora</w:t>
+            </w:r>
+          </w:p>
+        </w:tc>
+        <w:tc>
+          <w:tcPr>
+            <w:tcW w:w="2448" w:type="dxa"/>
+          </w:tcPr>
+          <w:p>
+            <w:pPr>
+              <w:spacing w:after="0"/>
+            </w:pPr>
+            <w:r>
+              <w:rPr>
+                <w:sz w:val="16"/>
+              </w:rPr>
+              <w:t>Equivalence at 53,237 flows against a deficit of -0.005533 on the uncapped 2,429,503-flow corpus, all ten seeds</w:t>
+            </w:r>
+          </w:p>
+        </w:tc>
+        <w:tc>
+          <w:tcPr>
+            <w:tcW w:w="2448" w:type="dxa"/>
+          </w:tcPr>
+          <w:p>
+            <w:pPr>
+              <w:spacing w:after="0"/>
+            </w:pPr>
+            <w:r>
+              <w:rPr>
+                <w:sz w:val="16"/>
+              </w:rPr>
+              <w:t>Forgoes a mechanism whose training cost is 175 times that of one forest</w:t>
             </w:r>
           </w:p>
         </w:tc>
@@ -10507,7 +10598,7 @@
         <w:t>A clear separation of research population and target population</w:t>
       </w:r>
       <w:r>
-        <w:t>: how the study subset was constructed and how it differs from the full corpus and from production priors.</w:t>
+        <w:t>: how the study subset was constructed and how it differs from the full corpus and from production priors. Where a headline comparison is sensitive to that construction - as it is here - report it on both the capped and the uncapped population, or state explicitly which one the claim is conditioned on.</w:t>
       </w:r>
     </w:p>
     <w:p>
@@ -10614,7 +10705,11 @@
         <w:t>The equivalence depends on how the population is built.</w:t>
       </w:r>
       <w:r>
-        <w:t xml:space="preserve"> It holds on the 53,237-flow natural-prior population and on the 7.8-fold larger one, but not on the fully uncapped 2,429,503-flow corpus, where the same comparison becomes a small, consistent deficit. The statement that conditional weighting is indistinguishable from equal voting must therefore always be quoted together with the population it was measured on; it is not a scale-free property.</w:t>
+        <w:t xml:space="preserve"> It holds on the 53,237-flow natural-prior population and on the 7.8-fold larger one, but not on the fully uncapped 2,429,503-flow corpus, where the same comparison </w:t>
+      </w:r>
+      <w:r>
+        <w:lastRenderedPageBreak/>
+        <w:t>becomes a small, consistent deficit. The statement that conditional weighting is indistinguishable from equal voting must therefore always be quoted together with the population it was measured on; it is not a scale-free property.</w:t>
       </w:r>
     </w:p>
     <w:p>
@@ -10633,7 +10728,6 @@
         <w:rPr>
           <w:b/>
         </w:rPr>
-        <w:lastRenderedPageBreak/>
         <w:t>External datasets are independent benchmarks, not transfer experiments.</w:t>
       </w:r>
       <w:r>
@@ -10744,7 +10838,11 @@
         <w:t>First, relative to the most direct equal-weight control the gain lies inside an equivalence boundary.</w:t>
       </w:r>
       <w:r>
-        <w:t xml:space="preserve"> Averaged over ten seeds on the natural-prior population of CIC-IDS2017, the Macro-F1 difference between conditional weighting and an equal-weight chi-square forest is -0.000456, with the per-seed sign split five to five. Both the seed-level 90% interval [-0.00112, +0.00021] and the test-row paired bootstrap interval [-0.00425, +0.00338] lie inside equivalence margins of 0.005 and 0.01. The four experts disagree on no test row, and the normalised weight entropy is 0.99998. The cost is about an 80-fold incre</w:t>
+        <w:t xml:space="preserve"> Averaged over ten seeds on the natural-prior population of CIC-IDS2017, the Macro-F1 difference between conditional </w:t>
+      </w:r>
+      <w:r>
+        <w:lastRenderedPageBreak/>
+        <w:t>weighting and an equal-weight chi-square forest is -0.000456, with the per-seed sign split five to five. Both the seed-level 90% interval [-0.00112, +0.00021] and the test-row paired bootstrap interval [-0.00425, +0.00338] lie inside equivalence margins of 0.005 and 0.01. The four experts disagree on no test row, and the normalised weight entropy is 0.99998. The cost is about an 80-fold incre</w:t>
       </w:r>
       <w:r>
         <w:t>ase in training time and a fivefold increase in batch inference time.</w:t>
@@ -10755,7 +10853,6 @@
         <w:rPr>
           <w:b/>
         </w:rPr>
-        <w:lastRenderedPageBreak/>
         <w:t>A qualification on that equivalence.</w:t>
       </w:r>
       <w:r>
@@ -10825,6 +10922,7 @@
         <w:pStyle w:val="1"/>
       </w:pPr>
       <w:r>
+        <w:lastRenderedPageBreak/>
         <w:t>Funding</w:t>
       </w:r>
     </w:p>
@@ -10851,7 +10949,6 @@
         <w:pStyle w:val="1"/>
       </w:pPr>
       <w:r>
-        <w:lastRenderedPageBreak/>
         <w:t>Declaration of generative AI and AI-assisted technologies</w:t>
       </w:r>
     </w:p>
@@ -11027,6 +11124,7 @@
         </w:numPr>
       </w:pPr>
       <w:r>
+        <w:lastRenderedPageBreak/>
         <w:t>Liu H, Setiono R. Chi2: Feature selection and discretization of numeric attributes. ICTAI 1995: 388-391. DOI:10.1109/TAI.1995.479783.</w:t>
       </w:r>
     </w:p>
@@ -11075,7 +11173,6 @@
         </w:numPr>
       </w:pPr>
       <w:r>
-        <w:lastRenderedPageBreak/>
         <w:t>Moustafa N, Slay J. UNSW-NB15: A comprehensive data set for network intrusion detection systems. MilCIS 2015: 1-6. DOI:10.1109/MilCIS.2015.7348942.</w:t>
       </w:r>
     </w:p>
@@ -11268,6 +11365,7 @@
         </w:numPr>
       </w:pPr>
       <w:r>
+        <w:lastRenderedPageBreak/>
         <w:t>Angelopoulos A N, Bates S. Conformal prediction: A gentle introduction. Foundations and Trends in Machine Learning, 2023, 16(4): 494-591. DOI:10.1561/2200000101.</w:t>
       </w:r>
     </w:p>
@@ -11328,7 +11426,6 @@
         </w:numPr>
       </w:pPr>
       <w:r>
-        <w:lastRenderedPageBreak/>
         <w:t>Dietterich T G. Approximate statistical tests for comparing supervised classification learning algorithms. Neural Computation, 1998, 10(7): 1895-1923. DOI:10.1162/089976698300017197.</w:t>
       </w:r>
     </w:p>
@@ -11799,6 +11896,7 @@
               <w:rPr>
                 <w:sz w:val="16"/>
               </w:rPr>
+              <w:lastRenderedPageBreak/>
               <w:t>S09</w:t>
             </w:r>
           </w:p>
@@ -12105,7 +12203,6 @@
               <w:rPr>
                 <w:sz w:val="16"/>
               </w:rPr>
-              <w:lastRenderedPageBreak/>
               <w:t>S18</w:t>
             </w:r>
           </w:p>
@@ -12741,76 +12838,76 @@
       </w:rPr>
     </w:lvl>
   </w:abstractNum>
-  <w:num w:numId="1" w16cid:durableId="2039770111">
+  <w:num w:numId="1" w16cid:durableId="1450003221">
     <w:abstractNumId w:val="8"/>
   </w:num>
-  <w:num w:numId="2" w16cid:durableId="1298340574">
+  <w:num w:numId="2" w16cid:durableId="1624725901">
     <w:abstractNumId w:val="6"/>
   </w:num>
-  <w:num w:numId="3" w16cid:durableId="679355617">
+  <w:num w:numId="3" w16cid:durableId="280571060">
     <w:abstractNumId w:val="5"/>
   </w:num>
-  <w:num w:numId="4" w16cid:durableId="1586184900">
+  <w:num w:numId="4" w16cid:durableId="55784178">
     <w:abstractNumId w:val="4"/>
   </w:num>
-  <w:num w:numId="5" w16cid:durableId="605700422">
+  <w:num w:numId="5" w16cid:durableId="1545294622">
     <w:abstractNumId w:val="7"/>
   </w:num>
-  <w:num w:numId="6" w16cid:durableId="1583291713">
+  <w:num w:numId="6" w16cid:durableId="62653308">
     <w:abstractNumId w:val="3"/>
   </w:num>
-  <w:num w:numId="7" w16cid:durableId="1218737451">
+  <w:num w:numId="7" w16cid:durableId="752047641">
     <w:abstractNumId w:val="2"/>
   </w:num>
-  <w:num w:numId="8" w16cid:durableId="179974036">
+  <w:num w:numId="8" w16cid:durableId="92826199">
     <w:abstractNumId w:val="1"/>
   </w:num>
-  <w:num w:numId="9" w16cid:durableId="397821467">
+  <w:num w:numId="9" w16cid:durableId="1233076817">
     <w:abstractNumId w:val="0"/>
   </w:num>
-  <w:num w:numId="10" w16cid:durableId="1146972087">
+  <w:num w:numId="10" w16cid:durableId="647713698">
     <w:abstractNumId w:val="7"/>
     <w:lvlOverride w:ilvl="0">
       <w:startOverride w:val="1"/>
     </w:lvlOverride>
   </w:num>
-  <w:num w:numId="11" w16cid:durableId="1915627269">
+  <w:num w:numId="11" w16cid:durableId="1069499156">
     <w:abstractNumId w:val="7"/>
     <w:lvlOverride w:ilvl="0">
       <w:startOverride w:val="1"/>
     </w:lvlOverride>
   </w:num>
-  <w:num w:numId="12" w16cid:durableId="1341199925">
+  <w:num w:numId="12" w16cid:durableId="918098938">
     <w:abstractNumId w:val="7"/>
     <w:lvlOverride w:ilvl="0">
       <w:startOverride w:val="1"/>
     </w:lvlOverride>
   </w:num>
-  <w:num w:numId="13" w16cid:durableId="1081803007">
+  <w:num w:numId="13" w16cid:durableId="1265264311">
     <w:abstractNumId w:val="7"/>
     <w:lvlOverride w:ilvl="0">
       <w:startOverride w:val="1"/>
     </w:lvlOverride>
   </w:num>
-  <w:num w:numId="14" w16cid:durableId="439566739">
+  <w:num w:numId="14" w16cid:durableId="630747295">
     <w:abstractNumId w:val="7"/>
     <w:lvlOverride w:ilvl="0">
       <w:startOverride w:val="1"/>
     </w:lvlOverride>
   </w:num>
-  <w:num w:numId="15" w16cid:durableId="2045516551">
+  <w:num w:numId="15" w16cid:durableId="1783038204">
     <w:abstractNumId w:val="7"/>
     <w:lvlOverride w:ilvl="0">
       <w:startOverride w:val="1"/>
     </w:lvlOverride>
   </w:num>
-  <w:num w:numId="16" w16cid:durableId="68695117">
+  <w:num w:numId="16" w16cid:durableId="484205116">
     <w:abstractNumId w:val="7"/>
     <w:lvlOverride w:ilvl="0">
       <w:startOverride w:val="1"/>
     </w:lvlOverride>
   </w:num>
-  <w:num w:numId="17" w16cid:durableId="760250287">
+  <w:num w:numId="17" w16cid:durableId="738210013">
     <w:abstractNumId w:val="7"/>
     <w:lvlOverride w:ilvl="0">
       <w:startOverride w:val="1"/>

</xml_diff>

<commit_message>
Round 19e: add the scale-ladder table and tie population size to RQ3
</commit_message>
<xml_diff>
--- a/重构版论文_v4_20260915/English_SCI_Manuscript_v4.docx
+++ b/重构版论文_v4_20260915/English_SCI_Manuscript_v4.docx
@@ -155,7 +155,7 @@
         <w:t>H3 (protocol independence).</w:t>
       </w:r>
       <w:r>
-        <w:t xml:space="preserve"> These conclusions are insensitive to deduplication order, class priors and split construction, so results can be compared across papers.</w:t>
+        <w:t xml:space="preserve"> These conclusions are insensitive to deduplication order, class priors, split construction and population size, so results can be compared across papers.</w:t>
       </w:r>
     </w:p>
     <w:p>
@@ -206,7 +206,7 @@
         <w:t>RQ3 (protocol robustness).</w:t>
       </w:r>
       <w:r>
-        <w:t xml:space="preserve"> Are the conclusions robust to deduplication order, class priors, repeated splits and tuning budgets?</w:t>
+        <w:t xml:space="preserve"> Are the conclusions robust to deduplication order, class priors, repeated splits, tuning budgets and population size?</w:t>
       </w:r>
     </w:p>
     <w:p>
@@ -1035,7 +1035,7 @@
           <w:noProof/>
         </w:rPr>
         <w:drawing>
-          <wp:inline distT="0" distB="0" distL="0" distR="0" wp14:anchorId="677006CF" wp14:editId="4FC22204">
+          <wp:inline distT="0" distB="0" distL="0" distR="0" wp14:anchorId="6DFC99C3" wp14:editId="0EA3AEA7">
             <wp:extent cx="5760720" cy="2734826"/>
             <wp:effectExtent l="0" t="0" r="0" b="0"/>
             <wp:docPr id="1" name="Picture 1"/>
@@ -2393,7 +2393,7 @@
           <w:noProof/>
         </w:rPr>
         <w:drawing>
-          <wp:inline distT="0" distB="0" distL="0" distR="0" wp14:anchorId="659FE617" wp14:editId="424AFD1C">
+          <wp:inline distT="0" distB="0" distL="0" distR="0" wp14:anchorId="386FE3DB" wp14:editId="37852253">
             <wp:extent cx="5760720" cy="2722098"/>
             <wp:effectExtent l="0" t="0" r="0" b="0"/>
             <wp:docPr id="2" name="Picture 2"/>
@@ -3381,7 +3381,7 @@
           <w:noProof/>
         </w:rPr>
         <w:drawing>
-          <wp:inline distT="0" distB="0" distL="0" distR="0" wp14:anchorId="51DD0592" wp14:editId="272B892F">
+          <wp:inline distT="0" distB="0" distL="0" distR="0" wp14:anchorId="098294DC" wp14:editId="71957311">
             <wp:extent cx="5760720" cy="3482709"/>
             <wp:effectExtent l="0" t="0" r="0" b="0"/>
             <wp:docPr id="3" name="Picture 3"/>
@@ -7120,7 +7120,7 @@
           <w:noProof/>
         </w:rPr>
         <w:drawing>
-          <wp:inline distT="0" distB="0" distL="0" distR="0" wp14:anchorId="4C3A8D11" wp14:editId="7D429977">
+          <wp:inline distT="0" distB="0" distL="0" distR="0" wp14:anchorId="0D6C4765" wp14:editId="0DFB96AE">
             <wp:extent cx="5760720" cy="2351418"/>
             <wp:effectExtent l="0" t="0" r="0" b="0"/>
             <wp:docPr id="4" name="Picture 4"/>
@@ -8077,7 +8077,7 @@
         </w:rPr>
         <w:lastRenderedPageBreak/>
         <w:drawing>
-          <wp:inline distT="0" distB="0" distL="0" distR="0" wp14:anchorId="7F0677B1" wp14:editId="362ABF1B">
+          <wp:inline distT="0" distB="0" distL="0" distR="0" wp14:anchorId="07D05267" wp14:editId="5DF5EDF1">
             <wp:extent cx="5760720" cy="2045294"/>
             <wp:effectExtent l="0" t="0" r="0" b="0"/>
             <wp:docPr id="5" name="Picture 5"/>
@@ -8252,7 +8252,7 @@
         </w:rPr>
         <w:lastRenderedPageBreak/>
         <w:drawing>
-          <wp:inline distT="0" distB="0" distL="0" distR="0" wp14:anchorId="20F247C0" wp14:editId="09B75B88">
+          <wp:inline distT="0" distB="0" distL="0" distR="0" wp14:anchorId="3EB61D0E" wp14:editId="6B856824">
             <wp:extent cx="5760720" cy="2308234"/>
             <wp:effectExtent l="0" t="0" r="0" b="0"/>
             <wp:docPr id="6" name="Picture 6"/>
@@ -8984,7 +8984,7 @@
         </w:rPr>
         <w:lastRenderedPageBreak/>
         <w:drawing>
-          <wp:inline distT="0" distB="0" distL="0" distR="0" wp14:anchorId="5A3F2E85" wp14:editId="44E89469">
+          <wp:inline distT="0" distB="0" distL="0" distR="0" wp14:anchorId="77F926E9" wp14:editId="2C569FF9">
             <wp:extent cx="5760720" cy="2167923"/>
             <wp:effectExtent l="0" t="0" r="0" b="0"/>
             <wp:docPr id="7" name="Picture 7"/>
@@ -9092,7 +9092,7 @@
           <w:noProof/>
         </w:rPr>
         <w:drawing>
-          <wp:inline distT="0" distB="0" distL="0" distR="0" wp14:anchorId="29924FCC" wp14:editId="6D0BFBCE">
+          <wp:inline distT="0" distB="0" distL="0" distR="0" wp14:anchorId="1243D985" wp14:editId="4FFC706C">
             <wp:extent cx="5760720" cy="2258878"/>
             <wp:effectExtent l="0" t="0" r="0" b="0"/>
             <wp:docPr id="8" name="Picture 8"/>
@@ -9276,7 +9276,7 @@
           <w:noProof/>
         </w:rPr>
         <w:drawing>
-          <wp:inline distT="0" distB="0" distL="0" distR="0" wp14:anchorId="7FC7FE99" wp14:editId="367F4206">
+          <wp:inline distT="0" distB="0" distL="0" distR="0" wp14:anchorId="2271C66A" wp14:editId="01D5888F">
             <wp:extent cx="5760720" cy="2516852"/>
             <wp:effectExtent l="0" t="0" r="0" b="0"/>
             <wp:docPr id="9" name="Picture 9"/>
@@ -9413,7 +9413,7 @@
           <w:noProof/>
         </w:rPr>
         <w:drawing>
-          <wp:inline distT="0" distB="0" distL="0" distR="0" wp14:anchorId="4B149F32" wp14:editId="712C11C9">
+          <wp:inline distT="0" distB="0" distL="0" distR="0" wp14:anchorId="77E48454" wp14:editId="14B57512">
             <wp:extent cx="5760720" cy="2223311"/>
             <wp:effectExtent l="0" t="0" r="0" b="0"/>
             <wp:docPr id="10" name="Picture 10"/>
@@ -9503,7 +9503,7 @@
           <w:noProof/>
         </w:rPr>
         <w:drawing>
-          <wp:inline distT="0" distB="0" distL="0" distR="0" wp14:anchorId="42B336F1" wp14:editId="704F9D2E">
+          <wp:inline distT="0" distB="0" distL="0" distR="0" wp14:anchorId="1058E2F9" wp14:editId="3D081D1C">
             <wp:extent cx="5760720" cy="2538527"/>
             <wp:effectExtent l="0" t="0" r="0" b="0"/>
             <wp:docPr id="11" name="Picture 11"/>
@@ -9653,8 +9653,575 @@
     </w:p>
     <w:p>
       <w:r>
-        <w:t>The primary population is a capped subset, so the equivalence reported above could in principle be an artefact of that cap. Three further runs address the question directly.</w:t>
-      </w:r>
+        <w:t>The primary population is a capped subset, so the equivalence reported above could in principle be an artefact of that cap. Three further runs address the question directly, and Table 7 shows that the verdict depends on the population.</w:t>
+      </w:r>
+    </w:p>
+    <w:p>
+      <w:r>
+        <w:rPr>
+          <w:b/>
+        </w:rPr>
+        <w:t>Table 7. The CIC-IDS2017 scale ladder: the verdict depends on the population</w:t>
+      </w:r>
+    </w:p>
+    <w:tbl>
+      <w:tblPr>
+        <w:tblStyle w:val="aff1"/>
+        <w:tblW w:w="0" w:type="auto"/>
+        <w:tblBorders>
+          <w:top w:val="single" w:sz="6" w:space="0" w:color="000000"/>
+          <w:left w:val="none" w:sz="0" w:space="0" w:color="auto"/>
+          <w:bottom w:val="single" w:sz="6" w:space="0" w:color="000000"/>
+          <w:right w:val="none" w:sz="0" w:space="0" w:color="auto"/>
+          <w:insideH w:val="single" w:sz="6" w:space="0" w:color="000000"/>
+          <w:insideV w:val="none" w:sz="0" w:space="0" w:color="auto"/>
+        </w:tblBorders>
+        <w:tblLook w:val="04A0" w:firstRow="1" w:lastRow="0" w:firstColumn="1" w:lastColumn="0" w:noHBand="0" w:noVBand="1"/>
+      </w:tblPr>
+      <w:tblGrid>
+        <w:gridCol w:w="1224"/>
+        <w:gridCol w:w="1224"/>
+        <w:gridCol w:w="1224"/>
+        <w:gridCol w:w="1224"/>
+        <w:gridCol w:w="1224"/>
+        <w:gridCol w:w="1224"/>
+        <w:gridCol w:w="1224"/>
+        <w:gridCol w:w="1224"/>
+      </w:tblGrid>
+      <w:tr>
+        <w:tc>
+          <w:tcPr>
+            <w:tcW w:w="1224" w:type="dxa"/>
+          </w:tcPr>
+          <w:p>
+            <w:pPr>
+              <w:spacing w:after="0"/>
+            </w:pPr>
+            <w:r>
+              <w:rPr>
+                <w:b/>
+                <w:sz w:val="16"/>
+              </w:rPr>
+              <w:t>Population</w:t>
+            </w:r>
+          </w:p>
+        </w:tc>
+        <w:tc>
+          <w:tcPr>
+            <w:tcW w:w="1224" w:type="dxa"/>
+          </w:tcPr>
+          <w:p>
+            <w:pPr>
+              <w:spacing w:after="0"/>
+            </w:pPr>
+            <w:r>
+              <w:rPr>
+                <w:b/>
+                <w:sz w:val="16"/>
+              </w:rPr>
+              <w:t>Flows</w:t>
+            </w:r>
+          </w:p>
+        </w:tc>
+        <w:tc>
+          <w:tcPr>
+            <w:tcW w:w="1224" w:type="dxa"/>
+          </w:tcPr>
+          <w:p>
+            <w:pPr>
+              <w:spacing w:after="0"/>
+            </w:pPr>
+            <w:r>
+              <w:rPr>
+                <w:b/>
+                <w:sz w:val="16"/>
+              </w:rPr>
+              <w:t>Test rows</w:t>
+            </w:r>
+          </w:p>
+        </w:tc>
+        <w:tc>
+          <w:tcPr>
+            <w:tcW w:w="1224" w:type="dxa"/>
+          </w:tcPr>
+          <w:p>
+            <w:pPr>
+              <w:spacing w:after="0"/>
+            </w:pPr>
+            <w:r>
+              <w:rPr>
+                <w:b/>
+                <w:sz w:val="16"/>
+              </w:rPr>
+              <w:t>RCCF</w:t>
+            </w:r>
+          </w:p>
+        </w:tc>
+        <w:tc>
+          <w:tcPr>
+            <w:tcW w:w="1224" w:type="dxa"/>
+          </w:tcPr>
+          <w:p>
+            <w:pPr>
+              <w:spacing w:after="0"/>
+            </w:pPr>
+            <w:r>
+              <w:rPr>
+                <w:b/>
+                <w:sz w:val="16"/>
+              </w:rPr>
+              <w:t>Equal RF (chi-square)</w:t>
+            </w:r>
+          </w:p>
+        </w:tc>
+        <w:tc>
+          <w:tcPr>
+            <w:tcW w:w="1224" w:type="dxa"/>
+          </w:tcPr>
+          <w:p>
+            <w:pPr>
+              <w:spacing w:after="0"/>
+            </w:pPr>
+            <w:r>
+              <w:rPr>
+                <w:b/>
+                <w:sz w:val="16"/>
+              </w:rPr>
+              <w:t>Difference</w:t>
+            </w:r>
+          </w:p>
+        </w:tc>
+        <w:tc>
+          <w:tcPr>
+            <w:tcW w:w="1224" w:type="dxa"/>
+          </w:tcPr>
+          <w:p>
+            <w:pPr>
+              <w:spacing w:after="0"/>
+            </w:pPr>
+            <w:r>
+              <w:rPr>
+                <w:b/>
+                <w:sz w:val="16"/>
+              </w:rPr>
+              <w:t>TOST 0.005</w:t>
+            </w:r>
+          </w:p>
+        </w:tc>
+        <w:tc>
+          <w:tcPr>
+            <w:tcW w:w="1224" w:type="dxa"/>
+          </w:tcPr>
+          <w:p>
+            <w:pPr>
+              <w:spacing w:after="0"/>
+            </w:pPr>
+            <w:r>
+              <w:rPr>
+                <w:b/>
+                <w:sz w:val="16"/>
+              </w:rPr>
+              <w:t>TOST 0.01</w:t>
+            </w:r>
+          </w:p>
+        </w:tc>
+      </w:tr>
+      <w:tr>
+        <w:tc>
+          <w:tcPr>
+            <w:tcW w:w="1224" w:type="dxa"/>
+          </w:tcPr>
+          <w:p>
+            <w:pPr>
+              <w:spacing w:after="0"/>
+            </w:pPr>
+            <w:r>
+              <w:rPr>
+                <w:sz w:val="16"/>
+              </w:rPr>
+              <w:t>Capped, 20,000 per class</w:t>
+            </w:r>
+          </w:p>
+        </w:tc>
+        <w:tc>
+          <w:tcPr>
+            <w:tcW w:w="1224" w:type="dxa"/>
+          </w:tcPr>
+          <w:p>
+            <w:pPr>
+              <w:spacing w:after="0"/>
+            </w:pPr>
+            <w:r>
+              <w:rPr>
+                <w:sz w:val="16"/>
+              </w:rPr>
+              <w:t>53,237</w:t>
+            </w:r>
+          </w:p>
+        </w:tc>
+        <w:tc>
+          <w:tcPr>
+            <w:tcW w:w="1224" w:type="dxa"/>
+          </w:tcPr>
+          <w:p>
+            <w:pPr>
+              <w:spacing w:after="0"/>
+            </w:pPr>
+            <w:r>
+              <w:rPr>
+                <w:sz w:val="16"/>
+              </w:rPr>
+              <w:t>7,986</w:t>
+            </w:r>
+          </w:p>
+        </w:tc>
+        <w:tc>
+          <w:tcPr>
+            <w:tcW w:w="1224" w:type="dxa"/>
+          </w:tcPr>
+          <w:p>
+            <w:pPr>
+              <w:spacing w:after="0"/>
+            </w:pPr>
+            <w:r>
+              <w:rPr>
+                <w:sz w:val="16"/>
+              </w:rPr>
+              <w:t>0.889278</w:t>
+            </w:r>
+          </w:p>
+        </w:tc>
+        <w:tc>
+          <w:tcPr>
+            <w:tcW w:w="1224" w:type="dxa"/>
+          </w:tcPr>
+          <w:p>
+            <w:pPr>
+              <w:spacing w:after="0"/>
+            </w:pPr>
+            <w:r>
+              <w:rPr>
+                <w:sz w:val="16"/>
+              </w:rPr>
+              <w:t>0.889734</w:t>
+            </w:r>
+          </w:p>
+        </w:tc>
+        <w:tc>
+          <w:tcPr>
+            <w:tcW w:w="1224" w:type="dxa"/>
+          </w:tcPr>
+          <w:p>
+            <w:pPr>
+              <w:spacing w:after="0"/>
+            </w:pPr>
+            <w:r>
+              <w:rPr>
+                <w:sz w:val="16"/>
+              </w:rPr>
+              <w:t>-0.000456</w:t>
+            </w:r>
+          </w:p>
+        </w:tc>
+        <w:tc>
+          <w:tcPr>
+            <w:tcW w:w="1224" w:type="dxa"/>
+          </w:tcPr>
+          <w:p>
+            <w:pPr>
+              <w:spacing w:after="0"/>
+            </w:pPr>
+            <w:r>
+              <w:rPr>
+                <w:sz w:val="16"/>
+              </w:rPr>
+              <w:t>equivalent</w:t>
+            </w:r>
+          </w:p>
+        </w:tc>
+        <w:tc>
+          <w:tcPr>
+            <w:tcW w:w="1224" w:type="dxa"/>
+          </w:tcPr>
+          <w:p>
+            <w:pPr>
+              <w:spacing w:after="0"/>
+            </w:pPr>
+            <w:r>
+              <w:rPr>
+                <w:sz w:val="16"/>
+              </w:rPr>
+              <w:t>equivalent</w:t>
+            </w:r>
+          </w:p>
+        </w:tc>
+      </w:tr>
+      <w:tr>
+        <w:tc>
+          <w:tcPr>
+            <w:tcW w:w="1224" w:type="dxa"/>
+          </w:tcPr>
+          <w:p>
+            <w:pPr>
+              <w:spacing w:after="0"/>
+            </w:pPr>
+            <w:r>
+              <w:rPr>
+                <w:sz w:val="16"/>
+              </w:rPr>
+              <w:t>Capped, 200,000 per class</w:t>
+            </w:r>
+          </w:p>
+        </w:tc>
+        <w:tc>
+          <w:tcPr>
+            <w:tcW w:w="1224" w:type="dxa"/>
+          </w:tcPr>
+          <w:p>
+            <w:pPr>
+              <w:spacing w:after="0"/>
+            </w:pPr>
+            <w:r>
+              <w:rPr>
+                <w:sz w:val="16"/>
+              </w:rPr>
+              <w:t>413,209</w:t>
+            </w:r>
+          </w:p>
+        </w:tc>
+        <w:tc>
+          <w:tcPr>
+            <w:tcW w:w="1224" w:type="dxa"/>
+          </w:tcPr>
+          <w:p>
+            <w:pPr>
+              <w:spacing w:after="0"/>
+            </w:pPr>
+            <w:r>
+              <w:rPr>
+                <w:sz w:val="16"/>
+              </w:rPr>
+              <w:t>61,982</w:t>
+            </w:r>
+          </w:p>
+        </w:tc>
+        <w:tc>
+          <w:tcPr>
+            <w:tcW w:w="1224" w:type="dxa"/>
+          </w:tcPr>
+          <w:p>
+            <w:pPr>
+              <w:spacing w:after="0"/>
+            </w:pPr>
+            <w:r>
+              <w:rPr>
+                <w:sz w:val="16"/>
+              </w:rPr>
+              <w:t>0.856065</w:t>
+            </w:r>
+          </w:p>
+        </w:tc>
+        <w:tc>
+          <w:tcPr>
+            <w:tcW w:w="1224" w:type="dxa"/>
+          </w:tcPr>
+          <w:p>
+            <w:pPr>
+              <w:spacing w:after="0"/>
+            </w:pPr>
+            <w:r>
+              <w:rPr>
+                <w:sz w:val="16"/>
+              </w:rPr>
+              <w:t>0.857202</w:t>
+            </w:r>
+          </w:p>
+        </w:tc>
+        <w:tc>
+          <w:tcPr>
+            <w:tcW w:w="1224" w:type="dxa"/>
+          </w:tcPr>
+          <w:p>
+            <w:pPr>
+              <w:spacing w:after="0"/>
+            </w:pPr>
+            <w:r>
+              <w:rPr>
+                <w:sz w:val="16"/>
+              </w:rPr>
+              <w:t>-0.001137</w:t>
+            </w:r>
+          </w:p>
+        </w:tc>
+        <w:tc>
+          <w:tcPr>
+            <w:tcW w:w="1224" w:type="dxa"/>
+          </w:tcPr>
+          <w:p>
+            <w:pPr>
+              <w:spacing w:after="0"/>
+            </w:pPr>
+            <w:r>
+              <w:rPr>
+                <w:sz w:val="16"/>
+              </w:rPr>
+              <w:t>equivalent</w:t>
+            </w:r>
+          </w:p>
+        </w:tc>
+        <w:tc>
+          <w:tcPr>
+            <w:tcW w:w="1224" w:type="dxa"/>
+          </w:tcPr>
+          <w:p>
+            <w:pPr>
+              <w:spacing w:after="0"/>
+            </w:pPr>
+            <w:r>
+              <w:rPr>
+                <w:sz w:val="16"/>
+              </w:rPr>
+              <w:t>equivalent</w:t>
+            </w:r>
+          </w:p>
+        </w:tc>
+      </w:tr>
+      <w:tr>
+        <w:tc>
+          <w:tcPr>
+            <w:tcW w:w="1224" w:type="dxa"/>
+          </w:tcPr>
+          <w:p>
+            <w:pPr>
+              <w:spacing w:after="0"/>
+            </w:pPr>
+            <w:r>
+              <w:rPr>
+                <w:sz w:val="16"/>
+              </w:rPr>
+              <w:t>Uncapped (full deduplicated corpus)</w:t>
+            </w:r>
+          </w:p>
+        </w:tc>
+        <w:tc>
+          <w:tcPr>
+            <w:tcW w:w="1224" w:type="dxa"/>
+          </w:tcPr>
+          <w:p>
+            <w:pPr>
+              <w:spacing w:after="0"/>
+            </w:pPr>
+            <w:r>
+              <w:rPr>
+                <w:sz w:val="16"/>
+              </w:rPr>
+              <w:t>2,429,503</w:t>
+            </w:r>
+          </w:p>
+        </w:tc>
+        <w:tc>
+          <w:tcPr>
+            <w:tcW w:w="1224" w:type="dxa"/>
+          </w:tcPr>
+          <w:p>
+            <w:pPr>
+              <w:spacing w:after="0"/>
+            </w:pPr>
+            <w:r>
+              <w:rPr>
+                <w:sz w:val="16"/>
+              </w:rPr>
+              <w:t>364,426</w:t>
+            </w:r>
+          </w:p>
+        </w:tc>
+        <w:tc>
+          <w:tcPr>
+            <w:tcW w:w="1224" w:type="dxa"/>
+          </w:tcPr>
+          <w:p>
+            <w:pPr>
+              <w:spacing w:after="0"/>
+            </w:pPr>
+            <w:r>
+              <w:rPr>
+                <w:sz w:val="16"/>
+              </w:rPr>
+              <w:t>0.754007</w:t>
+            </w:r>
+          </w:p>
+        </w:tc>
+        <w:tc>
+          <w:tcPr>
+            <w:tcW w:w="1224" w:type="dxa"/>
+          </w:tcPr>
+          <w:p>
+            <w:pPr>
+              <w:spacing w:after="0"/>
+            </w:pPr>
+            <w:r>
+              <w:rPr>
+                <w:sz w:val="16"/>
+              </w:rPr>
+              <w:t>0.759540</w:t>
+            </w:r>
+          </w:p>
+        </w:tc>
+        <w:tc>
+          <w:tcPr>
+            <w:tcW w:w="1224" w:type="dxa"/>
+          </w:tcPr>
+          <w:p>
+            <w:pPr>
+              <w:spacing w:after="0"/>
+            </w:pPr>
+            <w:r>
+              <w:rPr>
+                <w:sz w:val="16"/>
+              </w:rPr>
+              <w:t>-0.005533</w:t>
+            </w:r>
+          </w:p>
+        </w:tc>
+        <w:tc>
+          <w:tcPr>
+            <w:tcW w:w="1224" w:type="dxa"/>
+          </w:tcPr>
+          <w:p>
+            <w:pPr>
+              <w:spacing w:after="0"/>
+            </w:pPr>
+            <w:r>
+              <w:rPr>
+                <w:b/>
+                <w:sz w:val="16"/>
+              </w:rPr>
+              <w:t>not equivalent</w:t>
+            </w:r>
+          </w:p>
+        </w:tc>
+        <w:tc>
+          <w:tcPr>
+            <w:tcW w:w="1224" w:type="dxa"/>
+          </w:tcPr>
+          <w:p>
+            <w:pPr>
+              <w:spacing w:after="0"/>
+            </w:pPr>
+            <w:r>
+              <w:rPr>
+                <w:sz w:val="16"/>
+              </w:rPr>
+              <w:t>equivalent</w:t>
+            </w:r>
+          </w:p>
+        </w:tc>
+      </w:tr>
+    </w:tbl>
+    <w:p>
+      <w:pPr>
+        <w:spacing w:after="40"/>
+      </w:pPr>
     </w:p>
     <w:p>
       <w:r>
@@ -9667,7 +10234,11 @@
         <w:t xml:space="preserve"> Rebuilding the CIC-IDS2017 population with the identical audit but a 200,000-per-class cap yields 413,209 flows (train 289,246 / validation 61,982 / test 61,982). The minority classes cannot grow, so the enlarged population is more imbalanced than the primary one: Brute Force contributes 10,620 rows, Bot 1,948 and Web Attack 673. The headline pair was re-run over the full ten seeds. RCCF averages 0.856065 Macro-F1 against 0.857202 for the equal-weight chi-square forest, a mean paired difference of -0.00113</w:t>
       </w:r>
       <w:r>
-        <w:t>7 (SD 0.003156; seed-level 90% interval [-0.002966, +0.000692]). TOST is significant at both pre-specified margins (p = 0.0019 at 0.005, p = 4.8e-6 at 0.01), so the equivalence statement survives a 7.8-fold increase in population size; the point estimate now favours the control slightly rather than RCCF. The two arms disagree on 20-29 of the 61,982 test rows per seed (0.03%-0.05%), the same order as on the primary population. The context baselines behave as before: XGBoost reaches 0.827656 Macro-F1, extreme</w:t>
+        <w:t xml:space="preserve">7 (SD 0.003156; </w:t>
+      </w:r>
+      <w:r>
+        <w:lastRenderedPageBreak/>
+        <w:t>seed-level 90% interval [-0.002966, +0.000692]). TOST is significant at both pre-specified margins (p = 0.0019 at 0.005, p = 4.8e-6 at 0.01), so the equivalence statement survives a 7.8-fold increase in population size; the point estimate now favours the control slightly rather than RCCF. The two arms disagree on 20-29 of the 61,982 test rows per seed (0.03%-0.05%), the same order as on the primary population. The context baselines behave as before: XGBoost reaches 0.827656 Macro-F1, extreme</w:t>
       </w:r>
       <w:r>
         <w:t>ly randomised trees 0.783747, an equal-weight full-feature forest 0.852953 and a depth-limited decision tree 0.809695.</w:t>
@@ -9684,11 +10255,7 @@
         <w:t xml:space="preserve"> Removing the per-class cap entirely yields 2,429,503 flows (train 1,700,651 / validation 364,426 / test 364,426) - the complete deduplicated CIC-IDS2017 corpus, in which Web Attack contributes 0.028% of the rows. A single RCCF fit takes about two hours when run alone and about four hours per seed under the three-way split used here, so the comparison was run as a batch over the same ten seeds: RCCF averages 0.754007 Macro-F1 against 0.759540 for the equal-weight chi-square forest, a mean paired difference </w:t>
       </w:r>
       <w:r>
-        <w:t xml:space="preserve">of -0.005533 (SD 0.002840; seed-level 90% interval [-0.007179, -0.003886]), That interval lies entirely below zero, so </w:t>
-      </w:r>
-      <w:r>
-        <w:lastRenderedPageBreak/>
-        <w:t xml:space="preserve">the result is not the equivalence seen on the capped populations but a small, detectable deficit: the difference is equivalent at the 0.01 margin and </w:t>
+        <w:t xml:space="preserve">of -0.005533 (SD 0.002840; seed-level 90% interval [-0.007179, -0.003886]), That interval lies entirely below zero, so the result is not the equivalence seen on the capped populations but a small, detectable deficit: the difference is equivalent at the 0.01 margin and </w:t>
       </w:r>
       <w:r>
         <w:rPr>
@@ -9736,6 +10303,7 @@
         <w:pStyle w:val="1"/>
       </w:pPr>
       <w:r>
+        <w:lastRenderedPageBreak/>
         <w:t>6. Discussion</w:t>
       </w:r>
     </w:p>
@@ -9774,11 +10342,7 @@
         <w:t>Condition B: margin dominance.</w:t>
       </w:r>
       <w:r>
-        <w:t xml:space="preserve"> Even when experts differ, the hard label remains unchanged as long as the smallest margin exceeds the probability movement that the weights can cause (Condition 2). The measured mean L1 probability change is 0.000299 with a maximum of 0.003473, while the median decision margin is 1.0, three orders </w:t>
-      </w:r>
-      <w:r>
-        <w:lastRenderedPageBreak/>
-        <w:t>of magnitude above the largest observed movement. Measurement 4 formalises this: under the a priori bound 99.91% of rows are provably immune, with a median margin-to-bound ratio of 3,469 to 5,038.</w:t>
+        <w:t xml:space="preserve"> Even when experts differ, the hard label remains unchanged as long as the smallest margin exceeds the probability movement that the weights can cause (Condition 2). The measured mean L1 probability change is 0.000299 with a maximum of 0.003473, while the median decision margin is 1.0, three orders of magnitude above the largest observed movement. Measurement 4 formalises this: under the a priori bound 99.91% of rows are provably immune, with a median margin-to-bound ratio of 3,469 to 5,038.</w:t>
       </w:r>
     </w:p>
     <w:p>
@@ -9920,6 +10484,7 @@
     </w:p>
     <w:p>
       <w:r>
+        <w:lastRenderedPageBreak/>
         <w:t xml:space="preserve">The contribution to the literature is therefore a threshold rather than a refutation: </w:t>
       </w:r>
       <w:r>
@@ -9939,7 +10504,7 @@
     </w:p>
     <w:p>
       <w:r>
-        <w:t>Table 7 converts the evidence of this study into engineering guidance. Each recommendation carries an explicit cost; no option dominates across all objectives.</w:t>
+        <w:t>Table 8 converts the evidence of this study into engineering guidance. Each recommendation carries an explicit cost; no option dominates across all objectives.</w:t>
       </w:r>
     </w:p>
     <w:p>
@@ -9947,7 +10512,7 @@
         <w:rPr>
           <w:b/>
         </w:rPr>
-        <w:t>Table 7. Decision matrix for practical objectives</w:t>
+        <w:t>Table 8. Decision matrix for practical objectives</w:t>
       </w:r>
     </w:p>
     <w:tbl>
@@ -10299,14 +10864,7 @@
               <w:rPr>
                 <w:sz w:val="16"/>
               </w:rPr>
-              <w:t xml:space="preserve">Higher false-rejection rate on known classes; the operating point </w:t>
-            </w:r>
-            <w:r>
-              <w:rPr>
-                <w:sz w:val="16"/>
-              </w:rPr>
-              <w:lastRenderedPageBreak/>
-              <w:t>must be recalibrated</w:t>
+              <w:t>Higher false-rejection rate on known classes; the operating point must be recalibrated</w:t>
             </w:r>
           </w:p>
         </w:tc>
@@ -10324,7 +10882,6 @@
               <w:rPr>
                 <w:sz w:val="16"/>
               </w:rPr>
-              <w:lastRenderedPageBreak/>
               <w:t>Cross-file or cross-scenario evaluation</w:t>
             </w:r>
           </w:p>
@@ -10631,6 +11188,7 @@
         <w:rPr>
           <w:b/>
         </w:rPr>
+        <w:lastRenderedPageBreak/>
         <w:t>Paired statistics and effect sizes</w:t>
       </w:r>
       <w:r>
@@ -10705,11 +11263,7 @@
         <w:t>The equivalence depends on how the population is built.</w:t>
       </w:r>
       <w:r>
-        <w:t xml:space="preserve"> It holds on the 53,237-flow natural-prior population and on the 7.8-fold larger one, but not on the fully uncapped 2,429,503-flow corpus, where the same comparison </w:t>
-      </w:r>
-      <w:r>
-        <w:lastRenderedPageBreak/>
-        <w:t>becomes a small, consistent deficit. The statement that conditional weighting is indistinguishable from equal voting must therefore always be quoted together with the population it was measured on; it is not a scale-free property.</w:t>
+        <w:t xml:space="preserve"> It holds on the 53,237-flow natural-prior population and on the 7.8-fold larger one, but not on the fully uncapped 2,429,503-flow corpus, where the same comparison becomes a small, consistent deficit. The statement that conditional weighting is indistinguishable from equal voting must therefore always be quoted together with the population it was measured on; it is not a scale-free property.</w:t>
       </w:r>
     </w:p>
     <w:p>
@@ -10789,6 +11343,7 @@
         <w:rPr>
           <w:b/>
         </w:rPr>
+        <w:lastRenderedPageBreak/>
         <w:t>Unknown-family support is uneven.</w:t>
       </w:r>
       <w:r>
@@ -10838,11 +11393,7 @@
         <w:t>First, relative to the most direct equal-weight control the gain lies inside an equivalence boundary.</w:t>
       </w:r>
       <w:r>
-        <w:t xml:space="preserve"> Averaged over ten seeds on the natural-prior population of CIC-IDS2017, the Macro-F1 difference between conditional </w:t>
-      </w:r>
-      <w:r>
-        <w:lastRenderedPageBreak/>
-        <w:t>weighting and an equal-weight chi-square forest is -0.000456, with the per-seed sign split five to five. Both the seed-level 90% interval [-0.00112, +0.00021] and the test-row paired bootstrap interval [-0.00425, +0.00338] lie inside equivalence margins of 0.005 and 0.01. The four experts disagree on no test row, and the normalised weight entropy is 0.99998. The cost is about an 80-fold incre</w:t>
+        <w:t xml:space="preserve"> Averaged over ten seeds on the natural-prior population of CIC-IDS2017, the Macro-F1 difference between conditional weighting and an equal-weight chi-square forest is -0.000456, with the per-seed sign split five to five. Both the seed-level 90% interval [-0.00112, +0.00021] and the test-row paired bootstrap interval [-0.00425, +0.00338] lie inside equivalence margins of 0.005 and 0.01. The four experts disagree on no test row, and the normalised weight entropy is 0.99998. The cost is about an 80-fold incre</w:t>
       </w:r>
       <w:r>
         <w:t>ase in training time and a fivefold increase in batch inference time.</w:t>
@@ -10898,10 +11449,14 @@
     </w:p>
     <w:p>
       <w:r>
-        <w:t>The principal contribution is not a new state-of-the-art classifier but a reusable leakage-controlled protocol, a set of falsifiable identifiability boundaries, and a quantitative map that separates protocol effects from aggregation-rule effects. Three directions follow. First, design weighting mechanisms that explicitly enforce expert decorrelation, and test whether the gain is restored once the premise of Condition 1 is broken. Second, construct category-complete temporal or cross-scenario protocols so th</w:t>
-      </w:r>
-      <w:r>
-        <w:t>at file-level coverage analysis can be upgraded into a genuine external-validity test. Third, turn the reporting recommendations of Section 6.4 into an automatically checkable checklist, so that the evaluation protocol itself becomes a verifiable object. The recommendations extend those of [22].</w:t>
+        <w:t xml:space="preserve">The principal contribution is not a new state-of-the-art classifier but a reusable leakage-controlled protocol, a set of falsifiable identifiability boundaries, and a quantitative map that separates protocol effects from aggregation-rule </w:t>
+      </w:r>
+      <w:r>
+        <w:lastRenderedPageBreak/>
+        <w:t>effects. Three directions follow. First, design weighting mechanisms that explicitly enforce expert decorrelation, and test whether the gain is restored once the premise of Condition 1 is broken. Second, construct category-complete temporal or cross-scenario protocols so that file-level coverage analysis can be upgraded into a genuine external-validity test. Third, turn the reporting recommendations of Section 6.4 into an automatically checkable checklist, so that the evaluation protocol itself becomes a ve</w:t>
+      </w:r>
+      <w:r>
+        <w:t>rifiable object. The recommendations extend those of [22].</w:t>
       </w:r>
     </w:p>
     <w:p>
@@ -10922,7 +11477,6 @@
         <w:pStyle w:val="1"/>
       </w:pPr>
       <w:r>
-        <w:lastRenderedPageBreak/>
         <w:t>Funding</w:t>
       </w:r>
     </w:p>
@@ -11040,6 +11594,7 @@
         </w:numPr>
       </w:pPr>
       <w:r>
+        <w:lastRenderedPageBreak/>
         <w:t>Ke G, Meng Q, Finley T, et al. LightGBM: A highly efficient gradient boosting decision tree. NeurIPS 2017: 3146-3154. [no DOI; NeurIPS proceedings]</w:t>
       </w:r>
     </w:p>
@@ -11124,7 +11679,6 @@
         </w:numPr>
       </w:pPr>
       <w:r>
-        <w:lastRenderedPageBreak/>
         <w:t>Liu H, Setiono R. Chi2: Feature selection and discretization of numeric attributes. ICTAI 1995: 388-391. DOI:10.1109/TAI.1995.479783.</w:t>
       </w:r>
     </w:p>
@@ -11293,6 +11847,7 @@
         </w:numPr>
       </w:pPr>
       <w:r>
+        <w:lastRenderedPageBreak/>
         <w:t>Apruzzese G, Laskov P, Montgomery E, et al. The role of machine learning in cybersecurity. ACM Digital Threats: Research and Practice, 2023, 4(1): 1-38. DOI:10.1145/3545574.</w:t>
       </w:r>
     </w:p>
@@ -11365,7 +11920,6 @@
         </w:numPr>
       </w:pPr>
       <w:r>
-        <w:lastRenderedPageBreak/>
         <w:t>Angelopoulos A N, Bates S. Conformal prediction: A gentle introduction. Foundations and Trends in Machine Learning, 2023, 16(4): 494-591. DOI:10.1561/2200000101.</w:t>
       </w:r>
     </w:p>
@@ -11554,6 +12108,7 @@
         <w:pStyle w:val="1"/>
       </w:pPr>
       <w:r>
+        <w:lastRenderedPageBreak/>
         <w:t>Supplementary material</w:t>
       </w:r>
     </w:p>
@@ -11896,7 +12451,6 @@
               <w:rPr>
                 <w:sz w:val="16"/>
               </w:rPr>
-              <w:lastRenderedPageBreak/>
               <w:t>S09</w:t>
             </w:r>
           </w:p>
@@ -12838,76 +13392,76 @@
       </w:rPr>
     </w:lvl>
   </w:abstractNum>
-  <w:num w:numId="1" w16cid:durableId="1450003221">
+  <w:num w:numId="1" w16cid:durableId="434709509">
     <w:abstractNumId w:val="8"/>
   </w:num>
-  <w:num w:numId="2" w16cid:durableId="1624725901">
+  <w:num w:numId="2" w16cid:durableId="1000737990">
     <w:abstractNumId w:val="6"/>
   </w:num>
-  <w:num w:numId="3" w16cid:durableId="280571060">
+  <w:num w:numId="3" w16cid:durableId="2029132651">
     <w:abstractNumId w:val="5"/>
   </w:num>
-  <w:num w:numId="4" w16cid:durableId="55784178">
+  <w:num w:numId="4" w16cid:durableId="1744599145">
     <w:abstractNumId w:val="4"/>
   </w:num>
-  <w:num w:numId="5" w16cid:durableId="1545294622">
+  <w:num w:numId="5" w16cid:durableId="454644589">
     <w:abstractNumId w:val="7"/>
   </w:num>
-  <w:num w:numId="6" w16cid:durableId="62653308">
+  <w:num w:numId="6" w16cid:durableId="2009793048">
     <w:abstractNumId w:val="3"/>
   </w:num>
-  <w:num w:numId="7" w16cid:durableId="752047641">
+  <w:num w:numId="7" w16cid:durableId="1145974224">
     <w:abstractNumId w:val="2"/>
   </w:num>
-  <w:num w:numId="8" w16cid:durableId="92826199">
+  <w:num w:numId="8" w16cid:durableId="306206059">
     <w:abstractNumId w:val="1"/>
   </w:num>
-  <w:num w:numId="9" w16cid:durableId="1233076817">
+  <w:num w:numId="9" w16cid:durableId="557783834">
     <w:abstractNumId w:val="0"/>
   </w:num>
-  <w:num w:numId="10" w16cid:durableId="647713698">
+  <w:num w:numId="10" w16cid:durableId="458693340">
     <w:abstractNumId w:val="7"/>
     <w:lvlOverride w:ilvl="0">
       <w:startOverride w:val="1"/>
     </w:lvlOverride>
   </w:num>
-  <w:num w:numId="11" w16cid:durableId="1069499156">
+  <w:num w:numId="11" w16cid:durableId="1585263187">
     <w:abstractNumId w:val="7"/>
     <w:lvlOverride w:ilvl="0">
       <w:startOverride w:val="1"/>
     </w:lvlOverride>
   </w:num>
-  <w:num w:numId="12" w16cid:durableId="918098938">
+  <w:num w:numId="12" w16cid:durableId="720591910">
     <w:abstractNumId w:val="7"/>
     <w:lvlOverride w:ilvl="0">
       <w:startOverride w:val="1"/>
     </w:lvlOverride>
   </w:num>
-  <w:num w:numId="13" w16cid:durableId="1265264311">
+  <w:num w:numId="13" w16cid:durableId="1845893325">
     <w:abstractNumId w:val="7"/>
     <w:lvlOverride w:ilvl="0">
       <w:startOverride w:val="1"/>
     </w:lvlOverride>
   </w:num>
-  <w:num w:numId="14" w16cid:durableId="630747295">
+  <w:num w:numId="14" w16cid:durableId="1729913317">
     <w:abstractNumId w:val="7"/>
     <w:lvlOverride w:ilvl="0">
       <w:startOverride w:val="1"/>
     </w:lvlOverride>
   </w:num>
-  <w:num w:numId="15" w16cid:durableId="1783038204">
+  <w:num w:numId="15" w16cid:durableId="1387336615">
     <w:abstractNumId w:val="7"/>
     <w:lvlOverride w:ilvl="0">
       <w:startOverride w:val="1"/>
     </w:lvlOverride>
   </w:num>
-  <w:num w:numId="16" w16cid:durableId="484205116">
+  <w:num w:numId="16" w16cid:durableId="1771658564">
     <w:abstractNumId w:val="7"/>
     <w:lvlOverride w:ilvl="0">
       <w:startOverride w:val="1"/>
     </w:lvlOverride>
   </w:num>
-  <w:num w:numId="17" w16cid:durableId="738210013">
+  <w:num w:numId="17" w16cid:durableId="253130378">
     <w:abstractNumId w:val="7"/>
     <w:lvlOverride w:ilvl="0">
       <w:startOverride w:val="1"/>

</xml_diff>

<commit_message>
Round 19f: cite S27-S29, qualify the Highlights and graphical abstract, make the supplementary check range-aware
</commit_message>
<xml_diff>
--- a/重构版论文_v4_20260915/English_SCI_Manuscript_v4.docx
+++ b/重构版论文_v4_20260915/English_SCI_Manuscript_v4.docx
@@ -1035,7 +1035,7 @@
           <w:noProof/>
         </w:rPr>
         <w:drawing>
-          <wp:inline distT="0" distB="0" distL="0" distR="0" wp14:anchorId="6DFC99C3" wp14:editId="0EA3AEA7">
+          <wp:inline distT="0" distB="0" distL="0" distR="0" wp14:anchorId="35A487A4" wp14:editId="03F46294">
             <wp:extent cx="5760720" cy="2734826"/>
             <wp:effectExtent l="0" t="0" r="0" b="0"/>
             <wp:docPr id="1" name="Picture 1"/>
@@ -2393,7 +2393,7 @@
           <w:noProof/>
         </w:rPr>
         <w:drawing>
-          <wp:inline distT="0" distB="0" distL="0" distR="0" wp14:anchorId="386FE3DB" wp14:editId="37852253">
+          <wp:inline distT="0" distB="0" distL="0" distR="0" wp14:anchorId="51768834" wp14:editId="4B5414D2">
             <wp:extent cx="5760720" cy="2722098"/>
             <wp:effectExtent l="0" t="0" r="0" b="0"/>
             <wp:docPr id="2" name="Picture 2"/>
@@ -3381,7 +3381,7 @@
           <w:noProof/>
         </w:rPr>
         <w:drawing>
-          <wp:inline distT="0" distB="0" distL="0" distR="0" wp14:anchorId="098294DC" wp14:editId="71957311">
+          <wp:inline distT="0" distB="0" distL="0" distR="0" wp14:anchorId="73AFA5A3" wp14:editId="347246E4">
             <wp:extent cx="5760720" cy="3482709"/>
             <wp:effectExtent l="0" t="0" r="0" b="0"/>
             <wp:docPr id="3" name="Picture 3"/>
@@ -7120,7 +7120,7 @@
           <w:noProof/>
         </w:rPr>
         <w:drawing>
-          <wp:inline distT="0" distB="0" distL="0" distR="0" wp14:anchorId="0D6C4765" wp14:editId="0DFB96AE">
+          <wp:inline distT="0" distB="0" distL="0" distR="0" wp14:anchorId="1F16693B" wp14:editId="39CFAC17">
             <wp:extent cx="5760720" cy="2351418"/>
             <wp:effectExtent l="0" t="0" r="0" b="0"/>
             <wp:docPr id="4" name="Picture 4"/>
@@ -8077,7 +8077,7 @@
         </w:rPr>
         <w:lastRenderedPageBreak/>
         <w:drawing>
-          <wp:inline distT="0" distB="0" distL="0" distR="0" wp14:anchorId="07D05267" wp14:editId="5DF5EDF1">
+          <wp:inline distT="0" distB="0" distL="0" distR="0" wp14:anchorId="6F09B5E9" wp14:editId="62949764">
             <wp:extent cx="5760720" cy="2045294"/>
             <wp:effectExtent l="0" t="0" r="0" b="0"/>
             <wp:docPr id="5" name="Picture 5"/>
@@ -8252,7 +8252,7 @@
         </w:rPr>
         <w:lastRenderedPageBreak/>
         <w:drawing>
-          <wp:inline distT="0" distB="0" distL="0" distR="0" wp14:anchorId="3EB61D0E" wp14:editId="6B856824">
+          <wp:inline distT="0" distB="0" distL="0" distR="0" wp14:anchorId="7980B8F5" wp14:editId="5A4482D7">
             <wp:extent cx="5760720" cy="2308234"/>
             <wp:effectExtent l="0" t="0" r="0" b="0"/>
             <wp:docPr id="6" name="Picture 6"/>
@@ -8984,7 +8984,7 @@
         </w:rPr>
         <w:lastRenderedPageBreak/>
         <w:drawing>
-          <wp:inline distT="0" distB="0" distL="0" distR="0" wp14:anchorId="77F926E9" wp14:editId="2C569FF9">
+          <wp:inline distT="0" distB="0" distL="0" distR="0" wp14:anchorId="115C6B6B" wp14:editId="21919E45">
             <wp:extent cx="5760720" cy="2167923"/>
             <wp:effectExtent l="0" t="0" r="0" b="0"/>
             <wp:docPr id="7" name="Picture 7"/>
@@ -9092,7 +9092,7 @@
           <w:noProof/>
         </w:rPr>
         <w:drawing>
-          <wp:inline distT="0" distB="0" distL="0" distR="0" wp14:anchorId="1243D985" wp14:editId="4FFC706C">
+          <wp:inline distT="0" distB="0" distL="0" distR="0" wp14:anchorId="6A7191F5" wp14:editId="21F95C7E">
             <wp:extent cx="5760720" cy="2258878"/>
             <wp:effectExtent l="0" t="0" r="0" b="0"/>
             <wp:docPr id="8" name="Picture 8"/>
@@ -9276,7 +9276,7 @@
           <w:noProof/>
         </w:rPr>
         <w:drawing>
-          <wp:inline distT="0" distB="0" distL="0" distR="0" wp14:anchorId="2271C66A" wp14:editId="01D5888F">
+          <wp:inline distT="0" distB="0" distL="0" distR="0" wp14:anchorId="765E043E" wp14:editId="0FD5C0C1">
             <wp:extent cx="5760720" cy="2516852"/>
             <wp:effectExtent l="0" t="0" r="0" b="0"/>
             <wp:docPr id="9" name="Picture 9"/>
@@ -9413,7 +9413,7 @@
           <w:noProof/>
         </w:rPr>
         <w:drawing>
-          <wp:inline distT="0" distB="0" distL="0" distR="0" wp14:anchorId="77E48454" wp14:editId="14B57512">
+          <wp:inline distT="0" distB="0" distL="0" distR="0" wp14:anchorId="165053E7" wp14:editId="22AF89B4">
             <wp:extent cx="5760720" cy="2223311"/>
             <wp:effectExtent l="0" t="0" r="0" b="0"/>
             <wp:docPr id="10" name="Picture 10"/>
@@ -9503,7 +9503,7 @@
           <w:noProof/>
         </w:rPr>
         <w:drawing>
-          <wp:inline distT="0" distB="0" distL="0" distR="0" wp14:anchorId="1058E2F9" wp14:editId="3D081D1C">
+          <wp:inline distT="0" distB="0" distL="0" distR="0" wp14:anchorId="43428E7D" wp14:editId="6B6131EA">
             <wp:extent cx="5760720" cy="2538527"/>
             <wp:effectExtent l="0" t="0" r="0" b="0"/>
             <wp:docPr id="11" name="Picture 11"/>
@@ -10295,7 +10295,7 @@
         <w:t>not</w:t>
       </w:r>
       <w:r>
-        <w:t xml:space="preserve"> survive the fully uncapped corpus: there the difference becomes a small, consistent deficit at the 0.005 margin. The aggregation-rule difference is therefore negligible on capped populations and only becomes measurable - and negative - once the corpus is left completely unbalanced, which is the regime in which the mechanism would actually be deployed.</w:t>
+        <w:t xml:space="preserve"> survive the fully uncapped corpus: there the difference becomes a small, consistent deficit at the 0.005 margin. The aggregation-rule difference is therefore negligible on capped populations and only becomes measurable - and negative - once the corpus is left completely unbalanced, which is the regime in which the mechanism would actually be deployed. Per-seed paired statistics, per-class reports and the scale summaries for all three runs are provided in Supplementary S27-S29.</w:t>
       </w:r>
     </w:p>
     <w:p>
@@ -13392,76 +13392,76 @@
       </w:rPr>
     </w:lvl>
   </w:abstractNum>
-  <w:num w:numId="1" w16cid:durableId="434709509">
+  <w:num w:numId="1" w16cid:durableId="1513301874">
     <w:abstractNumId w:val="8"/>
   </w:num>
-  <w:num w:numId="2" w16cid:durableId="1000737990">
+  <w:num w:numId="2" w16cid:durableId="843208243">
     <w:abstractNumId w:val="6"/>
   </w:num>
-  <w:num w:numId="3" w16cid:durableId="2029132651">
+  <w:num w:numId="3" w16cid:durableId="1227184076">
     <w:abstractNumId w:val="5"/>
   </w:num>
-  <w:num w:numId="4" w16cid:durableId="1744599145">
+  <w:num w:numId="4" w16cid:durableId="1392457229">
     <w:abstractNumId w:val="4"/>
   </w:num>
-  <w:num w:numId="5" w16cid:durableId="454644589">
+  <w:num w:numId="5" w16cid:durableId="594442098">
     <w:abstractNumId w:val="7"/>
   </w:num>
-  <w:num w:numId="6" w16cid:durableId="2009793048">
+  <w:num w:numId="6" w16cid:durableId="937255067">
     <w:abstractNumId w:val="3"/>
   </w:num>
-  <w:num w:numId="7" w16cid:durableId="1145974224">
+  <w:num w:numId="7" w16cid:durableId="1468401306">
     <w:abstractNumId w:val="2"/>
   </w:num>
-  <w:num w:numId="8" w16cid:durableId="306206059">
+  <w:num w:numId="8" w16cid:durableId="2100327996">
     <w:abstractNumId w:val="1"/>
   </w:num>
-  <w:num w:numId="9" w16cid:durableId="557783834">
+  <w:num w:numId="9" w16cid:durableId="47342987">
     <w:abstractNumId w:val="0"/>
   </w:num>
-  <w:num w:numId="10" w16cid:durableId="458693340">
+  <w:num w:numId="10" w16cid:durableId="1803496659">
     <w:abstractNumId w:val="7"/>
     <w:lvlOverride w:ilvl="0">
       <w:startOverride w:val="1"/>
     </w:lvlOverride>
   </w:num>
-  <w:num w:numId="11" w16cid:durableId="1585263187">
+  <w:num w:numId="11" w16cid:durableId="1645236522">
     <w:abstractNumId w:val="7"/>
     <w:lvlOverride w:ilvl="0">
       <w:startOverride w:val="1"/>
     </w:lvlOverride>
   </w:num>
-  <w:num w:numId="12" w16cid:durableId="720591910">
+  <w:num w:numId="12" w16cid:durableId="627205124">
     <w:abstractNumId w:val="7"/>
     <w:lvlOverride w:ilvl="0">
       <w:startOverride w:val="1"/>
     </w:lvlOverride>
   </w:num>
-  <w:num w:numId="13" w16cid:durableId="1845893325">
+  <w:num w:numId="13" w16cid:durableId="743336643">
     <w:abstractNumId w:val="7"/>
     <w:lvlOverride w:ilvl="0">
       <w:startOverride w:val="1"/>
     </w:lvlOverride>
   </w:num>
-  <w:num w:numId="14" w16cid:durableId="1729913317">
+  <w:num w:numId="14" w16cid:durableId="985937774">
     <w:abstractNumId w:val="7"/>
     <w:lvlOverride w:ilvl="0">
       <w:startOverride w:val="1"/>
     </w:lvlOverride>
   </w:num>
-  <w:num w:numId="15" w16cid:durableId="1387336615">
+  <w:num w:numId="15" w16cid:durableId="71895478">
     <w:abstractNumId w:val="7"/>
     <w:lvlOverride w:ilvl="0">
       <w:startOverride w:val="1"/>
     </w:lvlOverride>
   </w:num>
-  <w:num w:numId="16" w16cid:durableId="1771658564">
+  <w:num w:numId="16" w16cid:durableId="1276909563">
     <w:abstractNumId w:val="7"/>
     <w:lvlOverride w:ilvl="0">
       <w:startOverride w:val="1"/>
     </w:lvlOverride>
   </w:num>
-  <w:num w:numId="17" w16cid:durableId="253130378">
+  <w:num w:numId="17" w16cid:durableId="583220552">
     <w:abstractNumId w:val="7"/>
     <w:lvlOverride w:ilvl="0">
       <w:startOverride w:val="1"/>

</xml_diff>

<commit_message>
Round 19g: replace the misattributed full-corpus deficit with its dilution mechanism
</commit_message>
<xml_diff>
--- a/重构版论文_v4_20260915/English_SCI_Manuscript_v4.docx
+++ b/重构版论文_v4_20260915/English_SCI_Manuscript_v4.docx
@@ -1035,7 +1035,7 @@
           <w:noProof/>
         </w:rPr>
         <w:drawing>
-          <wp:inline distT="0" distB="0" distL="0" distR="0" wp14:anchorId="35A487A4" wp14:editId="03F46294">
+          <wp:inline distT="0" distB="0" distL="0" distR="0" wp14:anchorId="142CFB71" wp14:editId="1CB6CAB6">
             <wp:extent cx="5760720" cy="2734826"/>
             <wp:effectExtent l="0" t="0" r="0" b="0"/>
             <wp:docPr id="1" name="Picture 1"/>
@@ -2393,7 +2393,7 @@
           <w:noProof/>
         </w:rPr>
         <w:drawing>
-          <wp:inline distT="0" distB="0" distL="0" distR="0" wp14:anchorId="51768834" wp14:editId="4B5414D2">
+          <wp:inline distT="0" distB="0" distL="0" distR="0" wp14:anchorId="2B8B657C" wp14:editId="1DC116D2">
             <wp:extent cx="5760720" cy="2722098"/>
             <wp:effectExtent l="0" t="0" r="0" b="0"/>
             <wp:docPr id="2" name="Picture 2"/>
@@ -3381,7 +3381,7 @@
           <w:noProof/>
         </w:rPr>
         <w:drawing>
-          <wp:inline distT="0" distB="0" distL="0" distR="0" wp14:anchorId="73AFA5A3" wp14:editId="347246E4">
+          <wp:inline distT="0" distB="0" distL="0" distR="0" wp14:anchorId="139548CA" wp14:editId="61162055">
             <wp:extent cx="5760720" cy="3482709"/>
             <wp:effectExtent l="0" t="0" r="0" b="0"/>
             <wp:docPr id="3" name="Picture 3"/>
@@ -7120,7 +7120,7 @@
           <w:noProof/>
         </w:rPr>
         <w:drawing>
-          <wp:inline distT="0" distB="0" distL="0" distR="0" wp14:anchorId="1F16693B" wp14:editId="39CFAC17">
+          <wp:inline distT="0" distB="0" distL="0" distR="0" wp14:anchorId="28E34A80" wp14:editId="32ADE060">
             <wp:extent cx="5760720" cy="2351418"/>
             <wp:effectExtent l="0" t="0" r="0" b="0"/>
             <wp:docPr id="4" name="Picture 4"/>
@@ -8077,7 +8077,7 @@
         </w:rPr>
         <w:lastRenderedPageBreak/>
         <w:drawing>
-          <wp:inline distT="0" distB="0" distL="0" distR="0" wp14:anchorId="6F09B5E9" wp14:editId="62949764">
+          <wp:inline distT="0" distB="0" distL="0" distR="0" wp14:anchorId="53858E7A" wp14:editId="45B7C2B9">
             <wp:extent cx="5760720" cy="2045294"/>
             <wp:effectExtent l="0" t="0" r="0" b="0"/>
             <wp:docPr id="5" name="Picture 5"/>
@@ -8252,7 +8252,7 @@
         </w:rPr>
         <w:lastRenderedPageBreak/>
         <w:drawing>
-          <wp:inline distT="0" distB="0" distL="0" distR="0" wp14:anchorId="7980B8F5" wp14:editId="5A4482D7">
+          <wp:inline distT="0" distB="0" distL="0" distR="0" wp14:anchorId="35B61C55" wp14:editId="2669BCA7">
             <wp:extent cx="5760720" cy="2308234"/>
             <wp:effectExtent l="0" t="0" r="0" b="0"/>
             <wp:docPr id="6" name="Picture 6"/>
@@ -8984,7 +8984,7 @@
         </w:rPr>
         <w:lastRenderedPageBreak/>
         <w:drawing>
-          <wp:inline distT="0" distB="0" distL="0" distR="0" wp14:anchorId="115C6B6B" wp14:editId="21919E45">
+          <wp:inline distT="0" distB="0" distL="0" distR="0" wp14:anchorId="417708FE" wp14:editId="0EA0C634">
             <wp:extent cx="5760720" cy="2167923"/>
             <wp:effectExtent l="0" t="0" r="0" b="0"/>
             <wp:docPr id="7" name="Picture 7"/>
@@ -9092,7 +9092,7 @@
           <w:noProof/>
         </w:rPr>
         <w:drawing>
-          <wp:inline distT="0" distB="0" distL="0" distR="0" wp14:anchorId="6A7191F5" wp14:editId="21F95C7E">
+          <wp:inline distT="0" distB="0" distL="0" distR="0" wp14:anchorId="48E068C5" wp14:editId="64202A07">
             <wp:extent cx="5760720" cy="2258878"/>
             <wp:effectExtent l="0" t="0" r="0" b="0"/>
             <wp:docPr id="8" name="Picture 8"/>
@@ -9276,7 +9276,7 @@
           <w:noProof/>
         </w:rPr>
         <w:drawing>
-          <wp:inline distT="0" distB="0" distL="0" distR="0" wp14:anchorId="765E043E" wp14:editId="0FD5C0C1">
+          <wp:inline distT="0" distB="0" distL="0" distR="0" wp14:anchorId="40F92DED" wp14:editId="3263BFB4">
             <wp:extent cx="5760720" cy="2516852"/>
             <wp:effectExtent l="0" t="0" r="0" b="0"/>
             <wp:docPr id="9" name="Picture 9"/>
@@ -9413,7 +9413,7 @@
           <w:noProof/>
         </w:rPr>
         <w:drawing>
-          <wp:inline distT="0" distB="0" distL="0" distR="0" wp14:anchorId="165053E7" wp14:editId="22AF89B4">
+          <wp:inline distT="0" distB="0" distL="0" distR="0" wp14:anchorId="37BE37BB" wp14:editId="176CC486">
             <wp:extent cx="5760720" cy="2223311"/>
             <wp:effectExtent l="0" t="0" r="0" b="0"/>
             <wp:docPr id="10" name="Picture 10"/>
@@ -9503,7 +9503,7 @@
           <w:noProof/>
         </w:rPr>
         <w:drawing>
-          <wp:inline distT="0" distB="0" distL="0" distR="0" wp14:anchorId="43428E7D" wp14:editId="6B6131EA">
+          <wp:inline distT="0" distB="0" distL="0" distR="0" wp14:anchorId="42BBF603" wp14:editId="3FD9A6CF">
             <wp:extent cx="5760720" cy="2538527"/>
             <wp:effectExtent l="0" t="0" r="0" b="0"/>
             <wp:docPr id="11" name="Picture 11"/>
@@ -10295,7 +10295,28 @@
         <w:t>not</w:t>
       </w:r>
       <w:r>
-        <w:t xml:space="preserve"> survive the fully uncapped corpus: there the difference becomes a small, consistent deficit at the 0.005 margin. The aggregation-rule difference is therefore negligible on capped populations and only becomes measurable - and negative - once the corpus is left completely unbalanced, which is the regime in which the mechanism would actually be deployed. Per-seed paired statistics, per-class reports and the scale summaries for all three runs are provided in Supplementary S27-S29.</w:t>
+        <w:t xml:space="preserve"> survive the fully uncapped corpus: there the difference becomes a small, consistent deficit at the 0.005 margin. </w:t>
+      </w:r>
+      <w:r>
+        <w:rPr>
+          <w:b/>
+        </w:rPr>
+        <w:t>The deficit is dilution, not weighting.</w:t>
+      </w:r>
+      <w:r>
+        <w:t xml:space="preserve"> On this corpus the four feature views are no longer interchangeable. The full-feature forest reaches 0.738143 Macro-F1 against 0.759540 for the chi-square forest, a gap of 0.021397; carrying one such expert inside a four-way average costs roughly a quarter of that gap, 0.005349, which is within 4% of the measured -0.005533. The same arithmetic accounts for the capped-population result, where the two views differ by only 0.002068 and the predicted dilution is 0.000517 against a measured -0.000456. What chan</w:t>
+      </w:r>
+      <w:r>
+        <w:t xml:space="preserve">ges with scale is therefore not the aggregation rule - Section 5.3 shows the weights never move a label - but the price of averaging over feature views whose quality has diverged. This is the practical form of Condition 1: an equal-weight fusion is </w:t>
+      </w:r>
+      <w:r>
+        <w:lastRenderedPageBreak/>
+        <w:t>bounded by its weakest expert, and the capped populations hide that bound because there all four views score within 0.002 of one another.</w:t>
+      </w:r>
+    </w:p>
+    <w:p>
+      <w:r>
+        <w:t>Per-seed paired statistics, per-class reports and the scale summaries for all three runs are provided in Supplementary S27-S29.</w:t>
       </w:r>
     </w:p>
     <w:p>
@@ -10303,7 +10324,6 @@
         <w:pStyle w:val="1"/>
       </w:pPr>
       <w:r>
-        <w:lastRenderedPageBreak/>
         <w:t>6. Discussion</w:t>
       </w:r>
     </w:p>
@@ -10458,6 +10478,7 @@
         <w:rPr>
           <w:b/>
         </w:rPr>
+        <w:lastRenderedPageBreak/>
         <w:t>Metric selection.</w:t>
       </w:r>
       <w:r>
@@ -10484,7 +10505,6 @@
     </w:p>
     <w:p>
       <w:r>
-        <w:lastRenderedPageBreak/>
         <w:t xml:space="preserve">The contribution to the literature is therefore a threshold rather than a refutation: </w:t>
       </w:r>
       <w:r>
@@ -11152,6 +11172,7 @@
         <w:rPr>
           <w:b/>
         </w:rPr>
+        <w:lastRenderedPageBreak/>
         <w:t>A clear separation of research population and target population</w:t>
       </w:r>
       <w:r>
@@ -11188,7 +11209,6 @@
         <w:rPr>
           <w:b/>
         </w:rPr>
-        <w:lastRenderedPageBreak/>
         <w:t>Paired statistics and effect sizes</w:t>
       </w:r>
       <w:r>
@@ -11321,7 +11341,11 @@
         <w:t>Four datasets were evaluated, and every corpus comes from one collection programme.</w:t>
       </w:r>
       <w:r>
-        <w:t xml:space="preserve"> The conclusions are conditional on CIC-IDS2017 (both its capped populations and the full deduplicated corpus), NSL-KDD, UNSW-NB15 and N-BaIoT. N-BaIoT is saturated for flow-feature classifiers (every model at or above 0.9998 Macro-F1), so it probes the mechanics of the aggregation step rather than discrimination difficulty, and the external datasets remain independent native-label benchmarks rather than transfer tests. None of the four datasets represents production traffic, and no time-separated holdout o</w:t>
+        <w:t xml:space="preserve"> The conclusions are conditional on CIC-IDS2017 (both its capped populations and the full deduplicated corpus), NSL-KDD, UNSW-NB15 and N-BaIoT. N-BaIoT is saturated for flow-feature classifiers (every model at or above 0.9998 Macro-F1), </w:t>
+      </w:r>
+      <w:r>
+        <w:lastRenderedPageBreak/>
+        <w:t>so it probes the mechanics of the aggregation step rather than discrimination difficulty, and the external datasets remain independent native-label benchmarks rather than transfer tests. None of the four datasets represents production traffic, and no time-separated holdout o</w:t>
       </w:r>
       <w:r>
         <w:t>n a common testbed exists in any of them.</w:t>
@@ -11343,7 +11367,6 @@
         <w:rPr>
           <w:b/>
         </w:rPr>
-        <w:lastRenderedPageBreak/>
         <w:t>Unknown-family support is uneven.</w:t>
       </w:r>
       <w:r>
@@ -11407,10 +11430,10 @@
         <w:t>A qualification on that equivalence.</w:t>
       </w:r>
       <w:r>
-        <w:t xml:space="preserve"> It is a property of the population, not of the mechanism. On the fully uncapped 2,429,503-flow corpus the same comparison turns into a consistent deficit of -0.005533 across all ten seeds, at a 175-fold training cost. That equivalence is a property of the population, not of the mechanism: on the fully uncapped 2,429,503-flow corpus the difference turns into a consistent deficit of -0.005533 (all ten seeds, equivalent at 0.01 but not at 0.005) at a 175-fold training cost. Against a full-feature equal forest</w:t>
-      </w:r>
-      <w:r>
-        <w:t xml:space="preserve"> the gate is reliably better over ten seeds, but the magnitude matches that of a feature-view change.</w:t>
+        <w:t xml:space="preserve"> It is a property of the population, not of the mechanism. On the fully uncapped 2,429,503-flow corpus the same comparison turns into a consistent deficit of -0.005533 across all ten seeds, at a 175-fold training cost. The cause is not the weighting - Section 5.3 shows the weights never move a label - but the price of averaging over feature views whose quality diverges at scale: the full-feature view falls 0.021397 behind the chi-square view, and one such expert inside a four-way average accounts for the wh</w:t>
+      </w:r>
+      <w:r>
+        <w:t>ole gap (0.005349 predicted against -0.005533 measured). That equivalence is a property of the population, not of the mechanism: on the fully uncapped 2,429,503-flow corpus the difference turns into a consistent deficit of -0.005533 (all ten seeds, equivalent at 0.01 but not at 0.005) at a 175-fold training cost. Against a full-feature equal forest the gate is reliably better over ten seeds, but the magnitude matches that of a feature-view change.</w:t>
       </w:r>
     </w:p>
     <w:p>
@@ -11424,7 +11447,11 @@
         <w:t xml:space="preserve"> Three identifiability conditions are derived and one of them is turned into a row-wise computable bound, under which 99.91% of 23,958 test rows are provably invariant to the weighting, with a decision margin 3,469 to 5,038 times the perturbation bound. A search over all 108 gate hyper-parameter configurations yields only six distinct validation scores, excluding insufficient tuning. A reverse experiment shows that the gain is governed by expert diversity: two low-diversity expert sets gain exactly zero in </w:t>
       </w:r>
       <w:r>
-        <w:t>all six runs, whereas three decorrelated sets gain positively in all nine runs (slope 0.0646, Pearson r = 0.749). The inertness of conditional weighting is therefore not an implementation or tuning artefact but a direct consequence of filter-based multi-view experts being too similar on this kind of data.</w:t>
+        <w:t xml:space="preserve">all six runs, whereas three decorrelated sets gain positively in all nine runs (slope 0.0646, Pearson r = 0.749). The </w:t>
+      </w:r>
+      <w:r>
+        <w:lastRenderedPageBreak/>
+        <w:t>inertness of conditional weighting is therefore not an implementation or tuning artefact but a direct consequence of filter-based multi-view experts being too similar on this kind of data.</w:t>
       </w:r>
     </w:p>
     <w:p>
@@ -11449,86 +11476,83 @@
     </w:p>
     <w:p>
       <w:r>
-        <w:t xml:space="preserve">The principal contribution is not a new state-of-the-art classifier but a reusable leakage-controlled protocol, a set of falsifiable identifiability boundaries, and a quantitative map that separates protocol effects from aggregation-rule </w:t>
-      </w:r>
+        <w:t>The principal contribution is not a new state-of-the-art classifier but a reusable leakage-controlled protocol, a set of falsifiable identifiability boundaries, and a quantitative map that separates protocol effects from aggregation-rule effects. Three directions follow. First, design weighting mechanisms that explicitly enforce expert decorrelation, and test whether the gain is restored once the premise of Condition 1 is broken. Second, construct category-complete temporal or cross-scenario protocols so th</w:t>
+      </w:r>
+      <w:r>
+        <w:t>at file-level coverage analysis can be upgraded into a genuine external-validity test. Third, turn the reporting recommendations of Section 6.4 into an automatically checkable checklist, so that the evaluation protocol itself becomes a verifiable object. The recommendations extend those of [22].</w:t>
+      </w:r>
+    </w:p>
+    <w:p>
+      <w:pPr>
+        <w:pStyle w:val="1"/>
+      </w:pPr>
+      <w:r>
+        <w:t>Data and code availability</w:t>
+      </w:r>
+    </w:p>
+    <w:p>
+      <w:r>
+        <w:t>Processing scripts, audit intermediates, per-row predictions and figure-generation code are released at https://github.com/linran-muxue/leakage-controlled-nids-study (release v1.11.0, tag v1.11.0). Raw datasets are not redistributed; the paper records source URLs, retrieval dates, version snapshots and SHA-256 checksums.</w:t>
+      </w:r>
+    </w:p>
+    <w:p>
+      <w:pPr>
+        <w:pStyle w:val="1"/>
+      </w:pPr>
+      <w:r>
+        <w:t>Funding</w:t>
+      </w:r>
+    </w:p>
+    <w:p>
+      <w:r>
+        <w:t>To be completed by the author. If the work received no support of any kind, this should be stated explicitly.</w:t>
+      </w:r>
+    </w:p>
+    <w:p>
+      <w:pPr>
+        <w:pStyle w:val="1"/>
+      </w:pPr>
+      <w:r>
+        <w:t>Declaration of competing interest</w:t>
+      </w:r>
+    </w:p>
+    <w:p>
+      <w:r>
+        <w:t>To be completed by the author. If no competing interests exist, this should be stated explicitly.</w:t>
+      </w:r>
+    </w:p>
+    <w:p>
+      <w:pPr>
+        <w:pStyle w:val="1"/>
+      </w:pPr>
+      <w:r>
+        <w:t>Declaration of generative AI and AI-assisted technologies</w:t>
+      </w:r>
+    </w:p>
+    <w:p>
+      <w:r>
+        <w:t>Generative AI tools were used for language editing and software drafting. The author is responsible for verifying the code, data, citations and all conclusions, and has checked each reported number against the released artefacts.</w:t>
+      </w:r>
+    </w:p>
+    <w:p>
+      <w:pPr>
+        <w:pStyle w:val="1"/>
+      </w:pPr>
+      <w:r>
+        <w:t>CRediT authorship contribution statement</w:t>
+      </w:r>
+    </w:p>
+    <w:p>
+      <w:r>
+        <w:t>To be completed by the author according to actual contributions: conceptualisation, methodology, software, validation, formal analysis, data curation, writing - original draft, writing - review and editing, visualisation.</w:t>
+      </w:r>
+    </w:p>
+    <w:p>
+      <w:pPr>
+        <w:pStyle w:val="1"/>
+      </w:pPr>
       <w:r>
         <w:lastRenderedPageBreak/>
-        <w:t>effects. Three directions follow. First, design weighting mechanisms that explicitly enforce expert decorrelation, and test whether the gain is restored once the premise of Condition 1 is broken. Second, construct category-complete temporal or cross-scenario protocols so that file-level coverage analysis can be upgraded into a genuine external-validity test. Third, turn the reporting recommendations of Section 6.4 into an automatically checkable checklist, so that the evaluation protocol itself becomes a ve</w:t>
-      </w:r>
-      <w:r>
-        <w:t>rifiable object. The recommendations extend those of [22].</w:t>
-      </w:r>
-    </w:p>
-    <w:p>
-      <w:pPr>
-        <w:pStyle w:val="1"/>
-      </w:pPr>
-      <w:r>
-        <w:t>Data and code availability</w:t>
-      </w:r>
-    </w:p>
-    <w:p>
-      <w:r>
-        <w:t>Processing scripts, audit intermediates, per-row predictions and figure-generation code are released at https://github.com/linran-muxue/leakage-controlled-nids-study (release v1.11.0, tag v1.11.0). Raw datasets are not redistributed; the paper records source URLs, retrieval dates, version snapshots and SHA-256 checksums.</w:t>
-      </w:r>
-    </w:p>
-    <w:p>
-      <w:pPr>
-        <w:pStyle w:val="1"/>
-      </w:pPr>
-      <w:r>
-        <w:t>Funding</w:t>
-      </w:r>
-    </w:p>
-    <w:p>
-      <w:r>
-        <w:t>To be completed by the author. If the work received no support of any kind, this should be stated explicitly.</w:t>
-      </w:r>
-    </w:p>
-    <w:p>
-      <w:pPr>
-        <w:pStyle w:val="1"/>
-      </w:pPr>
-      <w:r>
-        <w:t>Declaration of competing interest</w:t>
-      </w:r>
-    </w:p>
-    <w:p>
-      <w:r>
-        <w:t>To be completed by the author. If no competing interests exist, this should be stated explicitly.</w:t>
-      </w:r>
-    </w:p>
-    <w:p>
-      <w:pPr>
-        <w:pStyle w:val="1"/>
-      </w:pPr>
-      <w:r>
-        <w:t>Declaration of generative AI and AI-assisted technologies</w:t>
-      </w:r>
-    </w:p>
-    <w:p>
-      <w:r>
-        <w:t>Generative AI tools were used for language editing and software drafting. The author is responsible for verifying the code, data, citations and all conclusions, and has checked each reported number against the released artefacts.</w:t>
-      </w:r>
-    </w:p>
-    <w:p>
-      <w:pPr>
-        <w:pStyle w:val="1"/>
-      </w:pPr>
-      <w:r>
-        <w:t>CRediT authorship contribution statement</w:t>
-      </w:r>
-    </w:p>
-    <w:p>
-      <w:r>
-        <w:t>To be completed by the author according to actual contributions: conceptualisation, methodology, software, validation, formal analysis, data curation, writing - original draft, writing - review and editing, visualisation.</w:t>
-      </w:r>
-    </w:p>
-    <w:p>
-      <w:pPr>
-        <w:pStyle w:val="1"/>
-      </w:pPr>
-      <w:r>
         <w:t>References</w:t>
       </w:r>
     </w:p>
@@ -11594,7 +11618,6 @@
         </w:numPr>
       </w:pPr>
       <w:r>
-        <w:lastRenderedPageBreak/>
         <w:t>Ke G, Meng Q, Finley T, et al. LightGBM: A highly efficient gradient boosting decision tree. NeurIPS 2017: 3146-3154. [no DOI; NeurIPS proceedings]</w:t>
       </w:r>
     </w:p>
@@ -11787,6 +11810,7 @@
         </w:numPr>
       </w:pPr>
       <w:r>
+        <w:lastRenderedPageBreak/>
         <w:t>Liu L, Engelen G, Timmerman J, et al. Error prevalence in NIDS datasets: A case study on CIC-IDS-2017 and CSE-CIC-IDS-2018. IEEE CNS 2022. DOI:10.1109/CNS56114.2022.9947235.</w:t>
       </w:r>
     </w:p>
@@ -11847,7 +11871,6 @@
         </w:numPr>
       </w:pPr>
       <w:r>
-        <w:lastRenderedPageBreak/>
         <w:t>Apruzzese G, Laskov P, Montgomery E, et al. The role of machine learning in cybersecurity. ACM Digital Threats: Research and Practice, 2023, 4(1): 1-38. DOI:10.1145/3545574.</w:t>
       </w:r>
     </w:p>
@@ -12040,6 +12063,7 @@
         </w:numPr>
       </w:pPr>
       <w:r>
+        <w:lastRenderedPageBreak/>
         <w:t>Han S, Kim Y, Lee S. Improvement of the classification performance of an intrusion detection model for rare and unknown attack traffic. Electronics, 2021, 10(18): 2268. DOI:10.3390/electronics10182268.</w:t>
       </w:r>
     </w:p>
@@ -12108,7 +12132,6 @@
         <w:pStyle w:val="1"/>
       </w:pPr>
       <w:r>
-        <w:lastRenderedPageBreak/>
         <w:t>Supplementary material</w:t>
       </w:r>
     </w:p>
@@ -13097,6 +13120,7 @@
               <w:rPr>
                 <w:sz w:val="16"/>
               </w:rPr>
+              <w:lastRenderedPageBreak/>
               <w:t>S28</w:t>
             </w:r>
           </w:p>
@@ -13392,76 +13416,76 @@
       </w:rPr>
     </w:lvl>
   </w:abstractNum>
-  <w:num w:numId="1" w16cid:durableId="1513301874">
+  <w:num w:numId="1" w16cid:durableId="1811480814">
     <w:abstractNumId w:val="8"/>
   </w:num>
-  <w:num w:numId="2" w16cid:durableId="843208243">
+  <w:num w:numId="2" w16cid:durableId="1446775267">
     <w:abstractNumId w:val="6"/>
   </w:num>
-  <w:num w:numId="3" w16cid:durableId="1227184076">
+  <w:num w:numId="3" w16cid:durableId="596250295">
     <w:abstractNumId w:val="5"/>
   </w:num>
-  <w:num w:numId="4" w16cid:durableId="1392457229">
+  <w:num w:numId="4" w16cid:durableId="1104495021">
     <w:abstractNumId w:val="4"/>
   </w:num>
-  <w:num w:numId="5" w16cid:durableId="594442098">
+  <w:num w:numId="5" w16cid:durableId="1029255883">
     <w:abstractNumId w:val="7"/>
   </w:num>
-  <w:num w:numId="6" w16cid:durableId="937255067">
+  <w:num w:numId="6" w16cid:durableId="2131047416">
     <w:abstractNumId w:val="3"/>
   </w:num>
-  <w:num w:numId="7" w16cid:durableId="1468401306">
+  <w:num w:numId="7" w16cid:durableId="1413504830">
     <w:abstractNumId w:val="2"/>
   </w:num>
-  <w:num w:numId="8" w16cid:durableId="2100327996">
+  <w:num w:numId="8" w16cid:durableId="1511488885">
     <w:abstractNumId w:val="1"/>
   </w:num>
-  <w:num w:numId="9" w16cid:durableId="47342987">
+  <w:num w:numId="9" w16cid:durableId="1653172802">
     <w:abstractNumId w:val="0"/>
   </w:num>
-  <w:num w:numId="10" w16cid:durableId="1803496659">
+  <w:num w:numId="10" w16cid:durableId="190841059">
     <w:abstractNumId w:val="7"/>
     <w:lvlOverride w:ilvl="0">
       <w:startOverride w:val="1"/>
     </w:lvlOverride>
   </w:num>
-  <w:num w:numId="11" w16cid:durableId="1645236522">
+  <w:num w:numId="11" w16cid:durableId="1369796789">
     <w:abstractNumId w:val="7"/>
     <w:lvlOverride w:ilvl="0">
       <w:startOverride w:val="1"/>
     </w:lvlOverride>
   </w:num>
-  <w:num w:numId="12" w16cid:durableId="627205124">
+  <w:num w:numId="12" w16cid:durableId="167212285">
     <w:abstractNumId w:val="7"/>
     <w:lvlOverride w:ilvl="0">
       <w:startOverride w:val="1"/>
     </w:lvlOverride>
   </w:num>
-  <w:num w:numId="13" w16cid:durableId="743336643">
+  <w:num w:numId="13" w16cid:durableId="1474443712">
     <w:abstractNumId w:val="7"/>
     <w:lvlOverride w:ilvl="0">
       <w:startOverride w:val="1"/>
     </w:lvlOverride>
   </w:num>
-  <w:num w:numId="14" w16cid:durableId="985937774">
+  <w:num w:numId="14" w16cid:durableId="1882474822">
     <w:abstractNumId w:val="7"/>
     <w:lvlOverride w:ilvl="0">
       <w:startOverride w:val="1"/>
     </w:lvlOverride>
   </w:num>
-  <w:num w:numId="15" w16cid:durableId="71895478">
+  <w:num w:numId="15" w16cid:durableId="1285622376">
     <w:abstractNumId w:val="7"/>
     <w:lvlOverride w:ilvl="0">
       <w:startOverride w:val="1"/>
     </w:lvlOverride>
   </w:num>
-  <w:num w:numId="16" w16cid:durableId="1276909563">
+  <w:num w:numId="16" w16cid:durableId="2086756876">
     <w:abstractNumId w:val="7"/>
     <w:lvlOverride w:ilvl="0">
       <w:startOverride w:val="1"/>
     </w:lvlOverride>
   </w:num>
-  <w:num w:numId="17" w16cid:durableId="583220552">
+  <w:num w:numId="17" w16cid:durableId="1437016282">
     <w:abstractNumId w:val="7"/>
     <w:lvlOverride w:ilvl="0">
       <w:startOverride w:val="1"/>

</xml_diff>

<commit_message>
Round 19h: correct the full-corpus split counts and add the data and split audit to the gate
</commit_message>
<xml_diff>
--- a/重构版论文_v4_20260915/English_SCI_Manuscript_v4.docx
+++ b/重构版论文_v4_20260915/English_SCI_Manuscript_v4.docx
@@ -1035,7 +1035,7 @@
           <w:noProof/>
         </w:rPr>
         <w:drawing>
-          <wp:inline distT="0" distB="0" distL="0" distR="0" wp14:anchorId="142CFB71" wp14:editId="1CB6CAB6">
+          <wp:inline distT="0" distB="0" distL="0" distR="0" wp14:anchorId="598F4D05" wp14:editId="698AA576">
             <wp:extent cx="5760720" cy="2734826"/>
             <wp:effectExtent l="0" t="0" r="0" b="0"/>
             <wp:docPr id="1" name="Picture 1"/>
@@ -2393,7 +2393,7 @@
           <w:noProof/>
         </w:rPr>
         <w:drawing>
-          <wp:inline distT="0" distB="0" distL="0" distR="0" wp14:anchorId="2B8B657C" wp14:editId="1DC116D2">
+          <wp:inline distT="0" distB="0" distL="0" distR="0" wp14:anchorId="06FA883F" wp14:editId="54498D56">
             <wp:extent cx="5760720" cy="2722098"/>
             <wp:effectExtent l="0" t="0" r="0" b="0"/>
             <wp:docPr id="2" name="Picture 2"/>
@@ -3381,7 +3381,7 @@
           <w:noProof/>
         </w:rPr>
         <w:drawing>
-          <wp:inline distT="0" distB="0" distL="0" distR="0" wp14:anchorId="139548CA" wp14:editId="61162055">
+          <wp:inline distT="0" distB="0" distL="0" distR="0" wp14:anchorId="24BFFBC7" wp14:editId="742ACB78">
             <wp:extent cx="5760720" cy="3482709"/>
             <wp:effectExtent l="0" t="0" r="0" b="0"/>
             <wp:docPr id="3" name="Picture 3"/>
@@ -4753,11 +4753,14 @@
     </w:p>
     <w:p>
       <w:r>
-        <w:t xml:space="preserve">Let n be the number of training rows, d the original feature count, k the selected feature count, T the number of trees, K the number of cross-fitting folds and Q = 4 the number of experts. The dominant cost of the cross-fitting stage is approximately O(QK T n log n), the final refit stage costs O(QT n log n), and filter selection contributes O(Q n d). Inference requires one tree traversal per expert plus the risk models, about O(QT log n) per row. RCCF is therefore </w:t>
+        <w:t xml:space="preserve">Let n be the number of training rows, d the original feature count, k the selected feature count, T the number of trees, K the number of cross-fitting folds and Q = 4 the number of experts. The dominant cost of the cross-fitting stage is approximately O(QK T n log n), the final refit stage costs O(QT n log n), and filter selection contributes O(Q n d). </w:t>
       </w:r>
       <w:r>
         <w:lastRenderedPageBreak/>
-        <w:t>substantially more expensive than a single equal-weight forest at both ends, and Section 5.6 quantifies that cost. All experiments ran on a single workstation with 8 physical cores (16 logical), 35.8 GB of RAM and Windows 10 (build 10.0.26200), using Python 3.11.4, scikit-learn 1.9.0, XGBoost 3.2.0, NumPy 2.4.6, pandas 3.0.5 and Matplotlib 3.11.1. The reported timings are single-machine measurements and are not portability claims. The software stack is documented in [44-47].</w:t>
+        <w:t>Inference requires one tree traversal per expert plus the risk models, about O(QT log n) per row. RCCF is therefore substantially more expensive than a single equal-weight forest at both ends, and Section 5.6 quantifies that cost. All experiments ran on a single workstation with 8 physical cores (16 logical), 35.8 GB of RAM and Windows 10 (build 10.0.26200), using Python 3.11.4, scikit-learn 1.9.0, XGBoost 3.2.0, NumPy 2.4.6, pandas 3.0.5 and Matplotlib 3.11.1. The reported timings are single-machine measur</w:t>
+      </w:r>
+      <w:r>
+        <w:t>ements and are not portability claims. The software stack is documented in [44-47].</w:t>
       </w:r>
     </w:p>
     <w:p>
@@ -5197,7 +5200,6 @@
     </w:p>
     <w:p>
       <w:r>
-        <w:lastRenderedPageBreak/>
         <w:t xml:space="preserve">All three protocols agree: </w:t>
       </w:r>
       <w:r>
@@ -7101,14 +7103,17 @@
         <w:rPr>
           <w:b/>
         </w:rPr>
-        <w:t>-0.000456</w:t>
-      </w:r>
-      <w:r>
-        <w:t xml:space="preserve">, with five seeds favouring RCCF and five favouring the equal forest. On the three-seed balanced control </w:t>
-      </w:r>
-      <w:r>
+        <w:t>-</w:t>
+      </w:r>
+      <w:r>
+        <w:rPr>
+          <w:b/>
+        </w:rPr>
         <w:lastRenderedPageBreak/>
-        <w:t>RCCF reaches 0.961807 against 0.963215, trailing by -0.001408. Both magnitudes are below one thousandth and the sign is not stable across settings. One baseline is stronger on a different metric: extremely randomised trees obtain the highest balanced accuracy (0.96215 against 0.94820 for RCCF) while obtaining the lowest Macro-F1 (0.857490), because they spread predictions more evenly across rare classes.</w:t>
+        <w:t>0.000456</w:t>
+      </w:r>
+      <w:r>
+        <w:t>, with five seeds favouring RCCF and five favouring the equal forest. On the three-seed balanced control RCCF reaches 0.961807 against 0.963215, trailing by -0.001408. Both magnitudes are below one thousandth and the sign is not stable across settings. One baseline is stronger on a different metric: extremely randomised trees obtain the highest balanced accuracy (0.96215 against 0.94820 for RCCF) while obtaining the lowest Macro-F1 (0.857490), because they spread predictions more evenly across rare classes.</w:t>
       </w:r>
     </w:p>
     <w:p>
@@ -7120,7 +7125,7 @@
           <w:noProof/>
         </w:rPr>
         <w:drawing>
-          <wp:inline distT="0" distB="0" distL="0" distR="0" wp14:anchorId="28E34A80" wp14:editId="32ADE060">
+          <wp:inline distT="0" distB="0" distL="0" distR="0" wp14:anchorId="28CCB40E" wp14:editId="5024417F">
             <wp:extent cx="5760720" cy="2351418"/>
             <wp:effectExtent l="0" t="0" r="0" b="0"/>
             <wp:docPr id="4" name="Picture 4"/>
@@ -8077,7 +8082,7 @@
         </w:rPr>
         <w:lastRenderedPageBreak/>
         <w:drawing>
-          <wp:inline distT="0" distB="0" distL="0" distR="0" wp14:anchorId="53858E7A" wp14:editId="45B7C2B9">
+          <wp:inline distT="0" distB="0" distL="0" distR="0" wp14:anchorId="19F178C2" wp14:editId="5FB27939">
             <wp:extent cx="5760720" cy="2045294"/>
             <wp:effectExtent l="0" t="0" r="0" b="0"/>
             <wp:docPr id="5" name="Picture 5"/>
@@ -8252,7 +8257,7 @@
         </w:rPr>
         <w:lastRenderedPageBreak/>
         <w:drawing>
-          <wp:inline distT="0" distB="0" distL="0" distR="0" wp14:anchorId="35B61C55" wp14:editId="2669BCA7">
+          <wp:inline distT="0" distB="0" distL="0" distR="0" wp14:anchorId="5CE17C3D" wp14:editId="516805A7">
             <wp:extent cx="5760720" cy="2308234"/>
             <wp:effectExtent l="0" t="0" r="0" b="0"/>
             <wp:docPr id="6" name="Picture 6"/>
@@ -8984,7 +8989,7 @@
         </w:rPr>
         <w:lastRenderedPageBreak/>
         <w:drawing>
-          <wp:inline distT="0" distB="0" distL="0" distR="0" wp14:anchorId="417708FE" wp14:editId="0EA0C634">
+          <wp:inline distT="0" distB="0" distL="0" distR="0" wp14:anchorId="1EADBB2D" wp14:editId="09F26938">
             <wp:extent cx="5760720" cy="2167923"/>
             <wp:effectExtent l="0" t="0" r="0" b="0"/>
             <wp:docPr id="7" name="Picture 7"/>
@@ -9092,7 +9097,7 @@
           <w:noProof/>
         </w:rPr>
         <w:drawing>
-          <wp:inline distT="0" distB="0" distL="0" distR="0" wp14:anchorId="48E068C5" wp14:editId="64202A07">
+          <wp:inline distT="0" distB="0" distL="0" distR="0" wp14:anchorId="33BB41D7" wp14:editId="31D9AD4C">
             <wp:extent cx="5760720" cy="2258878"/>
             <wp:effectExtent l="0" t="0" r="0" b="0"/>
             <wp:docPr id="8" name="Picture 8"/>
@@ -9276,7 +9281,7 @@
           <w:noProof/>
         </w:rPr>
         <w:drawing>
-          <wp:inline distT="0" distB="0" distL="0" distR="0" wp14:anchorId="40F92DED" wp14:editId="3263BFB4">
+          <wp:inline distT="0" distB="0" distL="0" distR="0" wp14:anchorId="06DA0E6F" wp14:editId="76687949">
             <wp:extent cx="5760720" cy="2516852"/>
             <wp:effectExtent l="0" t="0" r="0" b="0"/>
             <wp:docPr id="9" name="Picture 9"/>
@@ -9413,7 +9418,7 @@
           <w:noProof/>
         </w:rPr>
         <w:drawing>
-          <wp:inline distT="0" distB="0" distL="0" distR="0" wp14:anchorId="37BE37BB" wp14:editId="176CC486">
+          <wp:inline distT="0" distB="0" distL="0" distR="0" wp14:anchorId="2101D1DE" wp14:editId="5DDCFE4C">
             <wp:extent cx="5760720" cy="2223311"/>
             <wp:effectExtent l="0" t="0" r="0" b="0"/>
             <wp:docPr id="10" name="Picture 10"/>
@@ -9503,7 +9508,7 @@
           <w:noProof/>
         </w:rPr>
         <w:drawing>
-          <wp:inline distT="0" distB="0" distL="0" distR="0" wp14:anchorId="42BBF603" wp14:editId="3FD9A6CF">
+          <wp:inline distT="0" distB="0" distL="0" distR="0" wp14:anchorId="0214A2D9" wp14:editId="6CB80E42">
             <wp:extent cx="5760720" cy="2538527"/>
             <wp:effectExtent l="0" t="0" r="0" b="0"/>
             <wp:docPr id="11" name="Picture 11"/>
@@ -10252,7 +10257,7 @@
         <w:t>The full deduplicated corpus.</w:t>
       </w:r>
       <w:r>
-        <w:t xml:space="preserve"> Removing the per-class cap entirely yields 2,429,503 flows (train 1,700,651 / validation 364,426 / test 364,426) - the complete deduplicated CIC-IDS2017 corpus, in which Web Attack contributes 0.028% of the rows. A single RCCF fit takes about two hours when run alone and about four hours per seed under the three-way split used here, so the comparison was run as a batch over the same ten seeds: RCCF averages 0.754007 Macro-F1 against 0.759540 for the equal-weight chi-square forest, a mean paired difference </w:t>
+        <w:t xml:space="preserve"> Removing the per-class cap entirely yields 2,429,503 flows (train 1,700,652 / validation 364,425 / test 364,426) - the complete deduplicated CIC-IDS2017 corpus, in which Web Attack contributes 0.028% of the rows. A single RCCF fit takes about two hours when run alone and about four hours per seed under the three-way split used here, so the comparison was run as a batch over the same ten seeds: RCCF averages 0.754007 Macro-F1 against 0.759540 for the equal-weight chi-square forest, a mean paired difference </w:t>
       </w:r>
       <w:r>
         <w:t xml:space="preserve">of -0.005533 (SD 0.002840; seed-level 90% interval [-0.007179, -0.003886]), That interval lies entirely below zero, so the result is not the equivalence seen on the capped populations but a small, detectable deficit: the difference is equivalent at the 0.01 margin and </w:t>
@@ -13416,76 +13421,76 @@
       </w:rPr>
     </w:lvl>
   </w:abstractNum>
-  <w:num w:numId="1" w16cid:durableId="1811480814">
+  <w:num w:numId="1" w16cid:durableId="1385907656">
     <w:abstractNumId w:val="8"/>
   </w:num>
-  <w:num w:numId="2" w16cid:durableId="1446775267">
+  <w:num w:numId="2" w16cid:durableId="1526096456">
     <w:abstractNumId w:val="6"/>
   </w:num>
-  <w:num w:numId="3" w16cid:durableId="596250295">
+  <w:num w:numId="3" w16cid:durableId="437137398">
     <w:abstractNumId w:val="5"/>
   </w:num>
-  <w:num w:numId="4" w16cid:durableId="1104495021">
+  <w:num w:numId="4" w16cid:durableId="233586004">
     <w:abstractNumId w:val="4"/>
   </w:num>
-  <w:num w:numId="5" w16cid:durableId="1029255883">
+  <w:num w:numId="5" w16cid:durableId="187913800">
     <w:abstractNumId w:val="7"/>
   </w:num>
-  <w:num w:numId="6" w16cid:durableId="2131047416">
+  <w:num w:numId="6" w16cid:durableId="1647737958">
     <w:abstractNumId w:val="3"/>
   </w:num>
-  <w:num w:numId="7" w16cid:durableId="1413504830">
+  <w:num w:numId="7" w16cid:durableId="987854689">
     <w:abstractNumId w:val="2"/>
   </w:num>
-  <w:num w:numId="8" w16cid:durableId="1511488885">
+  <w:num w:numId="8" w16cid:durableId="1006323386">
     <w:abstractNumId w:val="1"/>
   </w:num>
-  <w:num w:numId="9" w16cid:durableId="1653172802">
+  <w:num w:numId="9" w16cid:durableId="1838812145">
     <w:abstractNumId w:val="0"/>
   </w:num>
-  <w:num w:numId="10" w16cid:durableId="190841059">
+  <w:num w:numId="10" w16cid:durableId="1107236923">
     <w:abstractNumId w:val="7"/>
     <w:lvlOverride w:ilvl="0">
       <w:startOverride w:val="1"/>
     </w:lvlOverride>
   </w:num>
-  <w:num w:numId="11" w16cid:durableId="1369796789">
+  <w:num w:numId="11" w16cid:durableId="245769235">
     <w:abstractNumId w:val="7"/>
     <w:lvlOverride w:ilvl="0">
       <w:startOverride w:val="1"/>
     </w:lvlOverride>
   </w:num>
-  <w:num w:numId="12" w16cid:durableId="167212285">
+  <w:num w:numId="12" w16cid:durableId="681400385">
     <w:abstractNumId w:val="7"/>
     <w:lvlOverride w:ilvl="0">
       <w:startOverride w:val="1"/>
     </w:lvlOverride>
   </w:num>
-  <w:num w:numId="13" w16cid:durableId="1474443712">
+  <w:num w:numId="13" w16cid:durableId="801772136">
     <w:abstractNumId w:val="7"/>
     <w:lvlOverride w:ilvl="0">
       <w:startOverride w:val="1"/>
     </w:lvlOverride>
   </w:num>
-  <w:num w:numId="14" w16cid:durableId="1882474822">
+  <w:num w:numId="14" w16cid:durableId="364138740">
     <w:abstractNumId w:val="7"/>
     <w:lvlOverride w:ilvl="0">
       <w:startOverride w:val="1"/>
     </w:lvlOverride>
   </w:num>
-  <w:num w:numId="15" w16cid:durableId="1285622376">
+  <w:num w:numId="15" w16cid:durableId="1028723795">
     <w:abstractNumId w:val="7"/>
     <w:lvlOverride w:ilvl="0">
       <w:startOverride w:val="1"/>
     </w:lvlOverride>
   </w:num>
-  <w:num w:numId="16" w16cid:durableId="2086756876">
+  <w:num w:numId="16" w16cid:durableId="1717966521">
     <w:abstractNumId w:val="7"/>
     <w:lvlOverride w:ilvl="0">
       <w:startOverride w:val="1"/>
     </w:lvlOverride>
   </w:num>
-  <w:num w:numId="17" w16cid:durableId="1437016282">
+  <w:num w:numId="17" w16cid:durableId="1595746938">
     <w:abstractNumId w:val="7"/>
     <w:lvlOverride w:ilvl="0">
       <w:startOverride w:val="1"/>

</xml_diff>

<commit_message>
Round 19i: add the dilution failure condition and member-level reporting
</commit_message>
<xml_diff>
--- a/重构版论文_v4_20260915/English_SCI_Manuscript_v4.docx
+++ b/重构版论文_v4_20260915/English_SCI_Manuscript_v4.docx
@@ -1035,7 +1035,7 @@
           <w:noProof/>
         </w:rPr>
         <w:drawing>
-          <wp:inline distT="0" distB="0" distL="0" distR="0" wp14:anchorId="598F4D05" wp14:editId="698AA576">
+          <wp:inline distT="0" distB="0" distL="0" distR="0" wp14:anchorId="593A7EB4" wp14:editId="341BA5D2">
             <wp:extent cx="5760720" cy="2734826"/>
             <wp:effectExtent l="0" t="0" r="0" b="0"/>
             <wp:docPr id="1" name="Picture 1"/>
@@ -2393,7 +2393,7 @@
           <w:noProof/>
         </w:rPr>
         <w:drawing>
-          <wp:inline distT="0" distB="0" distL="0" distR="0" wp14:anchorId="06FA883F" wp14:editId="54498D56">
+          <wp:inline distT="0" distB="0" distL="0" distR="0" wp14:anchorId="23B53F62" wp14:editId="7B4D6120">
             <wp:extent cx="5760720" cy="2722098"/>
             <wp:effectExtent l="0" t="0" r="0" b="0"/>
             <wp:docPr id="2" name="Picture 2"/>
@@ -3381,7 +3381,7 @@
           <w:noProof/>
         </w:rPr>
         <w:drawing>
-          <wp:inline distT="0" distB="0" distL="0" distR="0" wp14:anchorId="24BFFBC7" wp14:editId="742ACB78">
+          <wp:inline distT="0" distB="0" distL="0" distR="0" wp14:anchorId="6293F040" wp14:editId="6074A92E">
             <wp:extent cx="5760720" cy="3482709"/>
             <wp:effectExtent l="0" t="0" r="0" b="0"/>
             <wp:docPr id="3" name="Picture 3"/>
@@ -4753,14 +4753,11 @@
     </w:p>
     <w:p>
       <w:r>
-        <w:t xml:space="preserve">Let n be the number of training rows, d the original feature count, k the selected feature count, T the number of trees, K the number of cross-fitting folds and Q = 4 the number of experts. The dominant cost of the cross-fitting stage is approximately O(QK T n log n), the final refit stage costs O(QT n log n), and filter selection contributes O(Q n d). </w:t>
+        <w:t xml:space="preserve">Let n be the number of training rows, d the original feature count, k the selected feature count, T the number of trees, K the number of cross-fitting folds and Q = 4 the number of experts. The dominant cost of the cross-fitting stage is approximately O(QK T n log n), the final refit stage costs O(QT n log n), and filter selection contributes O(Q n d). Inference requires one tree traversal per expert plus the risk models, about O(QT log n) per row. RCCF is therefore </w:t>
       </w:r>
       <w:r>
         <w:lastRenderedPageBreak/>
-        <w:t>Inference requires one tree traversal per expert plus the risk models, about O(QT log n) per row. RCCF is therefore substantially more expensive than a single equal-weight forest at both ends, and Section 5.6 quantifies that cost. All experiments ran on a single workstation with 8 physical cores (16 logical), 35.8 GB of RAM and Windows 10 (build 10.0.26200), using Python 3.11.4, scikit-learn 1.9.0, XGBoost 3.2.0, NumPy 2.4.6, pandas 3.0.5 and Matplotlib 3.11.1. The reported timings are single-machine measur</w:t>
-      </w:r>
-      <w:r>
-        <w:t>ements and are not portability claims. The software stack is documented in [44-47].</w:t>
+        <w:t>substantially more expensive than a single equal-weight forest at both ends, and Section 5.6 quantifies that cost. All experiments ran on a single workstation with 8 physical cores (16 logical), 35.8 GB of RAM and Windows 10 (build 10.0.26200), using Python 3.11.4, scikit-learn 1.9.0, XGBoost 3.2.0, NumPy 2.4.6, pandas 3.0.5 and Matplotlib 3.11.1. The reported timings are single-machine measurements and are not portability claims. The software stack is documented in [44-47].</w:t>
       </w:r>
     </w:p>
     <w:p>
@@ -5200,6 +5197,7 @@
     </w:p>
     <w:p>
       <w:r>
+        <w:lastRenderedPageBreak/>
         <w:t xml:space="preserve">All three protocols agree: </w:t>
       </w:r>
       <w:r>
@@ -7103,17 +7101,14 @@
         <w:rPr>
           <w:b/>
         </w:rPr>
-        <w:t>-</w:t>
-      </w:r>
-      <w:r>
-        <w:rPr>
-          <w:b/>
-        </w:rPr>
+        <w:t>-0.000456</w:t>
+      </w:r>
+      <w:r>
+        <w:t xml:space="preserve">, with five seeds favouring RCCF and five favouring the equal forest. On the three-seed balanced control </w:t>
+      </w:r>
+      <w:r>
         <w:lastRenderedPageBreak/>
-        <w:t>0.000456</w:t>
-      </w:r>
-      <w:r>
-        <w:t>, with five seeds favouring RCCF and five favouring the equal forest. On the three-seed balanced control RCCF reaches 0.961807 against 0.963215, trailing by -0.001408. Both magnitudes are below one thousandth and the sign is not stable across settings. One baseline is stronger on a different metric: extremely randomised trees obtain the highest balanced accuracy (0.96215 against 0.94820 for RCCF) while obtaining the lowest Macro-F1 (0.857490), because they spread predictions more evenly across rare classes.</w:t>
+        <w:t>RCCF reaches 0.961807 against 0.963215, trailing by -0.001408. Both magnitudes are below one thousandth and the sign is not stable across settings. One baseline is stronger on a different metric: extremely randomised trees obtain the highest balanced accuracy (0.96215 against 0.94820 for RCCF) while obtaining the lowest Macro-F1 (0.857490), because they spread predictions more evenly across rare classes.</w:t>
       </w:r>
     </w:p>
     <w:p>
@@ -7125,7 +7120,7 @@
           <w:noProof/>
         </w:rPr>
         <w:drawing>
-          <wp:inline distT="0" distB="0" distL="0" distR="0" wp14:anchorId="28CCB40E" wp14:editId="5024417F">
+          <wp:inline distT="0" distB="0" distL="0" distR="0" wp14:anchorId="768B330F" wp14:editId="5532AF20">
             <wp:extent cx="5760720" cy="2351418"/>
             <wp:effectExtent l="0" t="0" r="0" b="0"/>
             <wp:docPr id="4" name="Picture 4"/>
@@ -8082,7 +8077,7 @@
         </w:rPr>
         <w:lastRenderedPageBreak/>
         <w:drawing>
-          <wp:inline distT="0" distB="0" distL="0" distR="0" wp14:anchorId="19F178C2" wp14:editId="5FB27939">
+          <wp:inline distT="0" distB="0" distL="0" distR="0" wp14:anchorId="14752F07" wp14:editId="6E99CF32">
             <wp:extent cx="5760720" cy="2045294"/>
             <wp:effectExtent l="0" t="0" r="0" b="0"/>
             <wp:docPr id="5" name="Picture 5"/>
@@ -8257,7 +8252,7 @@
         </w:rPr>
         <w:lastRenderedPageBreak/>
         <w:drawing>
-          <wp:inline distT="0" distB="0" distL="0" distR="0" wp14:anchorId="5CE17C3D" wp14:editId="516805A7">
+          <wp:inline distT="0" distB="0" distL="0" distR="0" wp14:anchorId="1DAE9F16" wp14:editId="4F19D473">
             <wp:extent cx="5760720" cy="2308234"/>
             <wp:effectExtent l="0" t="0" r="0" b="0"/>
             <wp:docPr id="6" name="Picture 6"/>
@@ -8989,7 +8984,7 @@
         </w:rPr>
         <w:lastRenderedPageBreak/>
         <w:drawing>
-          <wp:inline distT="0" distB="0" distL="0" distR="0" wp14:anchorId="1EADBB2D" wp14:editId="09F26938">
+          <wp:inline distT="0" distB="0" distL="0" distR="0" wp14:anchorId="2CF8283B" wp14:editId="472C1ADA">
             <wp:extent cx="5760720" cy="2167923"/>
             <wp:effectExtent l="0" t="0" r="0" b="0"/>
             <wp:docPr id="7" name="Picture 7"/>
@@ -9097,7 +9092,7 @@
           <w:noProof/>
         </w:rPr>
         <w:drawing>
-          <wp:inline distT="0" distB="0" distL="0" distR="0" wp14:anchorId="33BB41D7" wp14:editId="31D9AD4C">
+          <wp:inline distT="0" distB="0" distL="0" distR="0" wp14:anchorId="020EF89D" wp14:editId="1364433B">
             <wp:extent cx="5760720" cy="2258878"/>
             <wp:effectExtent l="0" t="0" r="0" b="0"/>
             <wp:docPr id="8" name="Picture 8"/>
@@ -9281,7 +9276,7 @@
           <w:noProof/>
         </w:rPr>
         <w:drawing>
-          <wp:inline distT="0" distB="0" distL="0" distR="0" wp14:anchorId="06DA0E6F" wp14:editId="76687949">
+          <wp:inline distT="0" distB="0" distL="0" distR="0" wp14:anchorId="0873D7A6" wp14:editId="5F24C209">
             <wp:extent cx="5760720" cy="2516852"/>
             <wp:effectExtent l="0" t="0" r="0" b="0"/>
             <wp:docPr id="9" name="Picture 9"/>
@@ -9418,7 +9413,7 @@
           <w:noProof/>
         </w:rPr>
         <w:drawing>
-          <wp:inline distT="0" distB="0" distL="0" distR="0" wp14:anchorId="2101D1DE" wp14:editId="5DDCFE4C">
+          <wp:inline distT="0" distB="0" distL="0" distR="0" wp14:anchorId="2034BF18" wp14:editId="2293BDCF">
             <wp:extent cx="5760720" cy="2223311"/>
             <wp:effectExtent l="0" t="0" r="0" b="0"/>
             <wp:docPr id="10" name="Picture 10"/>
@@ -9508,7 +9503,7 @@
           <w:noProof/>
         </w:rPr>
         <w:drawing>
-          <wp:inline distT="0" distB="0" distL="0" distR="0" wp14:anchorId="0214A2D9" wp14:editId="6CB80E42">
+          <wp:inline distT="0" distB="0" distL="0" distR="0" wp14:anchorId="18E5699F" wp14:editId="3411ADD0">
             <wp:extent cx="5760720" cy="2538527"/>
             <wp:effectExtent l="0" t="0" r="0" b="0"/>
             <wp:docPr id="11" name="Picture 11"/>
@@ -10337,12 +10332,12 @@
         <w:pStyle w:val="21"/>
       </w:pPr>
       <w:r>
-        <w:t>6.1 Three failure conditions for conditional weighting</w:t>
-      </w:r>
-    </w:p>
-    <w:p>
-      <w:r>
-        <w:t>The conditions of Section 4.3 and the measurements of Section 5.3 together characterise three failure modes. They are not mutually exclusive but form a hierarchy from strongest to weakest.</w:t>
+        <w:t>6.1 Four failure conditions for conditional weighting</w:t>
+      </w:r>
+    </w:p>
+    <w:p>
+      <w:r>
+        <w:t>The conditions of Section 4.3 and the measurements of Section 5.3 together characterise four failure modes. The first three describe an inert gate, whose weights cannot move a label; the fourth describes a combination that is harmful at any weights. They are not mutually exclusive but form a hierarchy from strongest to weakest.</w:t>
       </w:r>
     </w:p>
     <w:p>
@@ -10383,16 +10378,30 @@
     </w:p>
     <w:p>
       <w:r>
-        <w:t xml:space="preserve">The three conditions yield an operational diagnostic sequence: </w:t>
-      </w:r>
-      <w:r>
         <w:rPr>
           <w:b/>
         </w:rPr>
-        <w:t>first measure the weight entropy, then the prediction-disagreement rate, and only then look at the performance difference.</w:t>
-      </w:r>
-      <w:r>
-        <w:t xml:space="preserve"> If entropy is close to 1 and the disagreement count is 0, further tuning of the gate will not help, because the problem does not lie in the gate.</w:t>
+        <w:t>Condition D: heterogeneous members.</w:t>
+      </w:r>
+      <w:r>
+        <w:t xml:space="preserve"> The three conditions above describe an inert gate. The fourth is different in kind. When the members of a fusion differ in quality, the combination is bounded by the weighted mean of its members plus whatever diversity gain they contribute [9], so it cannot be repaired by re-weighting: the bound is a property of the member set, not of the gate. On the capped populations the four feature views score within 0.002 of one another (Table 4a) and the bound is slack. On the uncapped corpus the full-feature view f</w:t>
+      </w:r>
+      <w:r>
+        <w:t>alls 0.021397 behind the chi-square view, and one such member inside a four-way average accounts for the whole measured deficit: 0.021397/4 = 0.005349 predicted against -0.005533 observed. The corresponding diagnostic is therefore a comparison of member scores, not of weights.</w:t>
+      </w:r>
+    </w:p>
+    <w:p>
+      <w:r>
+        <w:t xml:space="preserve">The four conditions yield an operational diagnostic sequence: </w:t>
+      </w:r>
+      <w:r>
+        <w:rPr>
+          <w:b/>
+        </w:rPr>
+        <w:t>first measure the weight entropy, then the prediction-disagreement rate, then the spread across member scores, and only then look at the performance difference.</w:t>
+      </w:r>
+      <w:r>
+        <w:t xml:space="preserve"> If entropy is close to 1 and the disagreement count is 0, further tuning of the gate will not help, because the problem does not lie in the gate. If the member scores span more than the difference you care about, the fusion is bounded by its weakest member and no weighting scheme will recover it.</w:t>
       </w:r>
     </w:p>
     <w:p>
@@ -10400,6 +10409,7 @@
         <w:pStyle w:val="21"/>
       </w:pPr>
       <w:r>
+        <w:lastRenderedPageBreak/>
         <w:t>6.2 Interpreting reported weighting gains</w:t>
       </w:r>
     </w:p>
@@ -10483,7 +10493,6 @@
         <w:rPr>
           <w:b/>
         </w:rPr>
-        <w:lastRenderedPageBreak/>
         <w:t>Metric selection.</w:t>
       </w:r>
       <w:r>
@@ -11103,12 +11112,13 @@
         <w:pStyle w:val="21"/>
       </w:pPr>
       <w:r>
+        <w:lastRenderedPageBreak/>
         <w:t>6.4 Reporting recommendations for intrusion-detection evaluation</w:t>
       </w:r>
     </w:p>
     <w:p>
       <w:r>
-        <w:t>Based on the measurements above, we recommend that studies on public intrusion-detection datasets report at least the following eight items. They concern the minimum requirement that a conclusion be reproducible by others, not additional methodological sophistication.</w:t>
+        <w:t>Based on the measurements above, we recommend that studies on public intrusion-detection datasets report at least the following nine items. They concern the minimum requirement that a conclusion be reproducible by others, not additional methodological sophistication.</w:t>
       </w:r>
     </w:p>
     <w:p>
@@ -11177,7 +11187,6 @@
         <w:rPr>
           <w:b/>
         </w:rPr>
-        <w:lastRenderedPageBreak/>
         <w:t>A clear separation of research population and target population</w:t>
       </w:r>
       <w:r>
@@ -11258,6 +11267,24 @@
     </w:p>
     <w:p>
       <w:pPr>
+        <w:pStyle w:val="a"/>
+        <w:numPr>
+          <w:ilvl w:val="0"/>
+          <w:numId w:val="16"/>
+        </w:numPr>
+      </w:pPr>
+      <w:r>
+        <w:rPr>
+          <w:b/>
+        </w:rPr>
+        <w:t>Member-level scores for every fusion</w:t>
+      </w:r>
+      <w:r>
+        <w:t>: report the score of each member alongside the fused result. An equal-weight fusion is bounded by its members, so a fusion reported without them cannot be checked for the dilution failure of Condition D.</w:t>
+      </w:r>
+    </w:p>
+    <w:p>
+      <w:pPr>
         <w:pStyle w:val="21"/>
       </w:pPr>
       <w:r>
@@ -11307,6 +11334,7 @@
         <w:rPr>
           <w:b/>
         </w:rPr>
+        <w:lastRenderedPageBreak/>
         <w:t>External datasets are independent benchmarks, not transfer experiments.</w:t>
       </w:r>
       <w:r>
@@ -11346,11 +11374,7 @@
         <w:t>Four datasets were evaluated, and every corpus comes from one collection programme.</w:t>
       </w:r>
       <w:r>
-        <w:t xml:space="preserve"> The conclusions are conditional on CIC-IDS2017 (both its capped populations and the full deduplicated corpus), NSL-KDD, UNSW-NB15 and N-BaIoT. N-BaIoT is saturated for flow-feature classifiers (every model at or above 0.9998 Macro-F1), </w:t>
-      </w:r>
-      <w:r>
-        <w:lastRenderedPageBreak/>
-        <w:t>so it probes the mechanics of the aggregation step rather than discrimination difficulty, and the external datasets remain independent native-label benchmarks rather than transfer tests. None of the four datasets represents production traffic, and no time-separated holdout o</w:t>
+        <w:t xml:space="preserve"> The conclusions are conditional on CIC-IDS2017 (both its capped populations and the full deduplicated corpus), NSL-KDD, UNSW-NB15 and N-BaIoT. N-BaIoT is saturated for flow-feature classifiers (every model at or above 0.9998 Macro-F1), so it probes the mechanics of the aggregation step rather than discrimination difficulty, and the external datasets remain independent native-label benchmarks rather than transfer tests. None of the four datasets represents production traffic, and no time-separated holdout o</w:t>
       </w:r>
       <w:r>
         <w:t>n a common testbed exists in any of them.</w:t>
@@ -11432,6 +11456,7 @@
         <w:rPr>
           <w:b/>
         </w:rPr>
+        <w:lastRenderedPageBreak/>
         <w:t>A qualification on that equivalence.</w:t>
       </w:r>
       <w:r>
@@ -11452,11 +11477,7 @@
         <w:t xml:space="preserve"> Three identifiability conditions are derived and one of them is turned into a row-wise computable bound, under which 99.91% of 23,958 test rows are provably invariant to the weighting, with a decision margin 3,469 to 5,038 times the perturbation bound. A search over all 108 gate hyper-parameter configurations yields only six distinct validation scores, excluding insufficient tuning. A reverse experiment shows that the gain is governed by expert diversity: two low-diversity expert sets gain exactly zero in </w:t>
       </w:r>
       <w:r>
-        <w:t xml:space="preserve">all six runs, whereas three decorrelated sets gain positively in all nine runs (slope 0.0646, Pearson r = 0.749). The </w:t>
-      </w:r>
-      <w:r>
-        <w:lastRenderedPageBreak/>
-        <w:t>inertness of conditional weighting is therefore not an implementation or tuning artefact but a direct consequence of filter-based multi-view experts being too similar on this kind of data.</w:t>
+        <w:t>all six runs, whereas three decorrelated sets gain positively in all nine runs (slope 0.0646, Pearson r = 0.749). The inertness of conditional weighting is therefore not an implementation or tuning artefact but a direct consequence of filter-based multi-view experts being too similar on this kind of data.</w:t>
       </w:r>
     </w:p>
     <w:p>
@@ -11518,6 +11539,7 @@
         <w:pStyle w:val="1"/>
       </w:pPr>
       <w:r>
+        <w:lastRenderedPageBreak/>
         <w:t>Declaration of competing interest</w:t>
       </w:r>
     </w:p>
@@ -11557,7 +11579,6 @@
         <w:pStyle w:val="1"/>
       </w:pPr>
       <w:r>
-        <w:lastRenderedPageBreak/>
         <w:t>References</w:t>
       </w:r>
     </w:p>
@@ -11731,6 +11752,7 @@
         </w:numPr>
       </w:pPr>
       <w:r>
+        <w:lastRenderedPageBreak/>
         <w:t>Sharafaldin I, Lashkari A H, Ghorbani A A. Toward generating a new intrusion detection dataset and intrusion traffic characterization. ICISSP 2018: 108-116. DOI:10.5220/0006639801080116.</w:t>
       </w:r>
     </w:p>
@@ -11815,7 +11837,6 @@
         </w:numPr>
       </w:pPr>
       <w:r>
-        <w:lastRenderedPageBreak/>
         <w:t>Liu L, Engelen G, Timmerman J, et al. Error prevalence in NIDS datasets: A case study on CIC-IDS-2017 and CSE-CIC-IDS-2018. IEEE CNS 2022. DOI:10.1109/CNS56114.2022.9947235.</w:t>
       </w:r>
     </w:p>
@@ -11984,6 +12005,7 @@
         </w:numPr>
       </w:pPr>
       <w:r>
+        <w:lastRenderedPageBreak/>
         <w:t>Lei J, G'Sell M, Rinaldo A, et al. Distribution-free predictive inference for regression. JASA, 2018, 113(523): 1094-1111. DOI:10.1080/01621459.2017.1307116.</w:t>
       </w:r>
     </w:p>
@@ -12068,7 +12090,6 @@
         </w:numPr>
       </w:pPr>
       <w:r>
-        <w:lastRenderedPageBreak/>
         <w:t>Han S, Kim Y, Lee S. Improvement of the classification performance of an intrusion detection model for rare and unknown attack traffic. Electronics, 2021, 10(18): 2268. DOI:10.3390/electronics10182268.</w:t>
       </w:r>
     </w:p>
@@ -12649,6 +12670,7 @@
               <w:rPr>
                 <w:sz w:val="16"/>
               </w:rPr>
+              <w:lastRenderedPageBreak/>
               <w:t>S14</w:t>
             </w:r>
           </w:p>
@@ -13125,7 +13147,6 @@
               <w:rPr>
                 <w:sz w:val="16"/>
               </w:rPr>
-              <w:lastRenderedPageBreak/>
               <w:t>S28</w:t>
             </w:r>
           </w:p>
@@ -13421,76 +13442,76 @@
       </w:rPr>
     </w:lvl>
   </w:abstractNum>
-  <w:num w:numId="1" w16cid:durableId="1385907656">
+  <w:num w:numId="1" w16cid:durableId="1977639020">
     <w:abstractNumId w:val="8"/>
   </w:num>
-  <w:num w:numId="2" w16cid:durableId="1526096456">
+  <w:num w:numId="2" w16cid:durableId="763499143">
     <w:abstractNumId w:val="6"/>
   </w:num>
-  <w:num w:numId="3" w16cid:durableId="437137398">
+  <w:num w:numId="3" w16cid:durableId="199828370">
     <w:abstractNumId w:val="5"/>
   </w:num>
-  <w:num w:numId="4" w16cid:durableId="233586004">
+  <w:num w:numId="4" w16cid:durableId="78723464">
     <w:abstractNumId w:val="4"/>
   </w:num>
-  <w:num w:numId="5" w16cid:durableId="187913800">
+  <w:num w:numId="5" w16cid:durableId="1756318495">
     <w:abstractNumId w:val="7"/>
   </w:num>
-  <w:num w:numId="6" w16cid:durableId="1647737958">
+  <w:num w:numId="6" w16cid:durableId="1416048824">
     <w:abstractNumId w:val="3"/>
   </w:num>
-  <w:num w:numId="7" w16cid:durableId="987854689">
+  <w:num w:numId="7" w16cid:durableId="1295720098">
     <w:abstractNumId w:val="2"/>
   </w:num>
-  <w:num w:numId="8" w16cid:durableId="1006323386">
+  <w:num w:numId="8" w16cid:durableId="1437480855">
     <w:abstractNumId w:val="1"/>
   </w:num>
-  <w:num w:numId="9" w16cid:durableId="1838812145">
+  <w:num w:numId="9" w16cid:durableId="205412471">
     <w:abstractNumId w:val="0"/>
   </w:num>
-  <w:num w:numId="10" w16cid:durableId="1107236923">
+  <w:num w:numId="10" w16cid:durableId="753086511">
     <w:abstractNumId w:val="7"/>
     <w:lvlOverride w:ilvl="0">
       <w:startOverride w:val="1"/>
     </w:lvlOverride>
   </w:num>
-  <w:num w:numId="11" w16cid:durableId="245769235">
+  <w:num w:numId="11" w16cid:durableId="1914702473">
     <w:abstractNumId w:val="7"/>
     <w:lvlOverride w:ilvl="0">
       <w:startOverride w:val="1"/>
     </w:lvlOverride>
   </w:num>
-  <w:num w:numId="12" w16cid:durableId="681400385">
+  <w:num w:numId="12" w16cid:durableId="1752700580">
     <w:abstractNumId w:val="7"/>
     <w:lvlOverride w:ilvl="0">
       <w:startOverride w:val="1"/>
     </w:lvlOverride>
   </w:num>
-  <w:num w:numId="13" w16cid:durableId="801772136">
+  <w:num w:numId="13" w16cid:durableId="662700869">
     <w:abstractNumId w:val="7"/>
     <w:lvlOverride w:ilvl="0">
       <w:startOverride w:val="1"/>
     </w:lvlOverride>
   </w:num>
-  <w:num w:numId="14" w16cid:durableId="364138740">
+  <w:num w:numId="14" w16cid:durableId="1002322642">
     <w:abstractNumId w:val="7"/>
     <w:lvlOverride w:ilvl="0">
       <w:startOverride w:val="1"/>
     </w:lvlOverride>
   </w:num>
-  <w:num w:numId="15" w16cid:durableId="1028723795">
+  <w:num w:numId="15" w16cid:durableId="1500534712">
     <w:abstractNumId w:val="7"/>
     <w:lvlOverride w:ilvl="0">
       <w:startOverride w:val="1"/>
     </w:lvlOverride>
   </w:num>
-  <w:num w:numId="16" w16cid:durableId="1717966521">
+  <w:num w:numId="16" w16cid:durableId="711462357">
     <w:abstractNumId w:val="7"/>
     <w:lvlOverride w:ilvl="0">
       <w:startOverride w:val="1"/>
     </w:lvlOverride>
   </w:num>
-  <w:num w:numId="17" w16cid:durableId="1595746938">
+  <w:num w:numId="17" w16cid:durableId="1179154383">
     <w:abstractNumId w:val="7"/>
     <w:lvlOverride w:ilvl="0">
       <w:startOverride w:val="1"/>

</xml_diff>

<commit_message>
Round 19j: verify the dilution expression on all three populations and guard against truncated aggregates
</commit_message>
<xml_diff>
--- a/重构版论文_v4_20260915/English_SCI_Manuscript_v4.docx
+++ b/重构版论文_v4_20260915/English_SCI_Manuscript_v4.docx
@@ -1035,7 +1035,7 @@
           <w:noProof/>
         </w:rPr>
         <w:drawing>
-          <wp:inline distT="0" distB="0" distL="0" distR="0" wp14:anchorId="593A7EB4" wp14:editId="341BA5D2">
+          <wp:inline distT="0" distB="0" distL="0" distR="0" wp14:anchorId="39E80165" wp14:editId="148A65AC">
             <wp:extent cx="5760720" cy="2734826"/>
             <wp:effectExtent l="0" t="0" r="0" b="0"/>
             <wp:docPr id="1" name="Picture 1"/>
@@ -2393,7 +2393,7 @@
           <w:noProof/>
         </w:rPr>
         <w:drawing>
-          <wp:inline distT="0" distB="0" distL="0" distR="0" wp14:anchorId="23B53F62" wp14:editId="7B4D6120">
+          <wp:inline distT="0" distB="0" distL="0" distR="0" wp14:anchorId="1C6B3321" wp14:editId="579542F1">
             <wp:extent cx="5760720" cy="2722098"/>
             <wp:effectExtent l="0" t="0" r="0" b="0"/>
             <wp:docPr id="2" name="Picture 2"/>
@@ -3381,7 +3381,7 @@
           <w:noProof/>
         </w:rPr>
         <w:drawing>
-          <wp:inline distT="0" distB="0" distL="0" distR="0" wp14:anchorId="6293F040" wp14:editId="6074A92E">
+          <wp:inline distT="0" distB="0" distL="0" distR="0" wp14:anchorId="1435FC1C" wp14:editId="76156881">
             <wp:extent cx="5760720" cy="3482709"/>
             <wp:effectExtent l="0" t="0" r="0" b="0"/>
             <wp:docPr id="3" name="Picture 3"/>
@@ -7120,7 +7120,7 @@
           <w:noProof/>
         </w:rPr>
         <w:drawing>
-          <wp:inline distT="0" distB="0" distL="0" distR="0" wp14:anchorId="768B330F" wp14:editId="5532AF20">
+          <wp:inline distT="0" distB="0" distL="0" distR="0" wp14:anchorId="2E570EC1" wp14:editId="5CDDDF8C">
             <wp:extent cx="5760720" cy="2351418"/>
             <wp:effectExtent l="0" t="0" r="0" b="0"/>
             <wp:docPr id="4" name="Picture 4"/>
@@ -8077,7 +8077,7 @@
         </w:rPr>
         <w:lastRenderedPageBreak/>
         <w:drawing>
-          <wp:inline distT="0" distB="0" distL="0" distR="0" wp14:anchorId="14752F07" wp14:editId="6E99CF32">
+          <wp:inline distT="0" distB="0" distL="0" distR="0" wp14:anchorId="46D5EB1B" wp14:editId="17A93E35">
             <wp:extent cx="5760720" cy="2045294"/>
             <wp:effectExtent l="0" t="0" r="0" b="0"/>
             <wp:docPr id="5" name="Picture 5"/>
@@ -8252,7 +8252,7 @@
         </w:rPr>
         <w:lastRenderedPageBreak/>
         <w:drawing>
-          <wp:inline distT="0" distB="0" distL="0" distR="0" wp14:anchorId="1DAE9F16" wp14:editId="4F19D473">
+          <wp:inline distT="0" distB="0" distL="0" distR="0" wp14:anchorId="52C43119" wp14:editId="4B9C6E9D">
             <wp:extent cx="5760720" cy="2308234"/>
             <wp:effectExtent l="0" t="0" r="0" b="0"/>
             <wp:docPr id="6" name="Picture 6"/>
@@ -8984,7 +8984,7 @@
         </w:rPr>
         <w:lastRenderedPageBreak/>
         <w:drawing>
-          <wp:inline distT="0" distB="0" distL="0" distR="0" wp14:anchorId="2CF8283B" wp14:editId="472C1ADA">
+          <wp:inline distT="0" distB="0" distL="0" distR="0" wp14:anchorId="4B4C5167" wp14:editId="49DBCA7D">
             <wp:extent cx="5760720" cy="2167923"/>
             <wp:effectExtent l="0" t="0" r="0" b="0"/>
             <wp:docPr id="7" name="Picture 7"/>
@@ -9092,7 +9092,7 @@
           <w:noProof/>
         </w:rPr>
         <w:drawing>
-          <wp:inline distT="0" distB="0" distL="0" distR="0" wp14:anchorId="020EF89D" wp14:editId="1364433B">
+          <wp:inline distT="0" distB="0" distL="0" distR="0" wp14:anchorId="0FF3F0BC" wp14:editId="1C670F2D">
             <wp:extent cx="5760720" cy="2258878"/>
             <wp:effectExtent l="0" t="0" r="0" b="0"/>
             <wp:docPr id="8" name="Picture 8"/>
@@ -9276,7 +9276,7 @@
           <w:noProof/>
         </w:rPr>
         <w:drawing>
-          <wp:inline distT="0" distB="0" distL="0" distR="0" wp14:anchorId="0873D7A6" wp14:editId="5F24C209">
+          <wp:inline distT="0" distB="0" distL="0" distR="0" wp14:anchorId="38BDF1A3" wp14:editId="69EBCE35">
             <wp:extent cx="5760720" cy="2516852"/>
             <wp:effectExtent l="0" t="0" r="0" b="0"/>
             <wp:docPr id="9" name="Picture 9"/>
@@ -9413,7 +9413,7 @@
           <w:noProof/>
         </w:rPr>
         <w:drawing>
-          <wp:inline distT="0" distB="0" distL="0" distR="0" wp14:anchorId="2034BF18" wp14:editId="2293BDCF">
+          <wp:inline distT="0" distB="0" distL="0" distR="0" wp14:anchorId="1652B8D9" wp14:editId="7E8A1E64">
             <wp:extent cx="5760720" cy="2223311"/>
             <wp:effectExtent l="0" t="0" r="0" b="0"/>
             <wp:docPr id="10" name="Picture 10"/>
@@ -9503,7 +9503,7 @@
           <w:noProof/>
         </w:rPr>
         <w:drawing>
-          <wp:inline distT="0" distB="0" distL="0" distR="0" wp14:anchorId="18E5699F" wp14:editId="3411ADD0">
+          <wp:inline distT="0" distB="0" distL="0" distR="0" wp14:anchorId="13BCE010" wp14:editId="4FEC717F">
             <wp:extent cx="5760720" cy="2538527"/>
             <wp:effectExtent l="0" t="0" r="0" b="0"/>
             <wp:docPr id="11" name="Picture 11"/>
@@ -10301,17 +10301,17 @@
         <w:rPr>
           <w:b/>
         </w:rPr>
-        <w:t>The deficit is dilution, not weighting.</w:t>
-      </w:r>
-      <w:r>
-        <w:t xml:space="preserve"> On this corpus the four feature views are no longer interchangeable. The full-feature forest reaches 0.738143 Macro-F1 against 0.759540 for the chi-square forest, a gap of 0.021397; carrying one such expert inside a four-way average costs roughly a quarter of that gap, 0.005349, which is within 4% of the measured -0.005533. The same arithmetic accounts for the capped-population result, where the two views differ by only 0.002068 and the predicted dilution is 0.000517 against a measured -0.000456. What chan</w:t>
-      </w:r>
-      <w:r>
-        <w:t xml:space="preserve">ges with scale is therefore not the aggregation rule - Section 5.3 shows the weights never move a label - but the price of averaging over feature views whose quality has diverged. This is the practical form of Condition 1: an equal-weight fusion is </w:t>
+        <w:t>The deficit is dilution, not weighting, and one expression predicts it on all three populations.</w:t>
+      </w:r>
+      <w:r>
+        <w:t xml:space="preserve"> On the uncapped corpus the four feature views are no longer interchangeable: the full-feature forest reaches 0.738143 Macro-F1 against 0.759540 for the chi-square forest, a gap of 0.021397, and one such expert inside a four-way average costs a quarter of it, 0.005349, against a measured -0.005533. The same expression applies to the 413,209-flow population (view gap 0.004249, predicted 0.001062, measured -0.001137) and to the primary population (gap 0.002068, predicted 0.000517, measured -0.000456). Across </w:t>
+      </w:r>
+      <w:r>
+        <w:t xml:space="preserve">a 46-fold range in population size the prediction stays within 14% of the measurement, so what changes with scale is not the aggregation rule - Section 5.3 shows the weights never move a label - but the price of averaging over feature views whose quality has diverged. This is the practical form </w:t>
       </w:r>
       <w:r>
         <w:lastRenderedPageBreak/>
-        <w:t>bounded by its weakest expert, and the capped populations hide that bound because there all four views score within 0.002 of one another.</w:t>
+        <w:t>of Condition 1: an equal-weight fusion is bounded by its weakest member, and the capped populations hide that bound because there all four views score within 0.002 of one another.</w:t>
       </w:r>
     </w:p>
     <w:p>
@@ -10387,7 +10387,7 @@
         <w:t xml:space="preserve"> The three conditions above describe an inert gate. The fourth is different in kind. When the members of a fusion differ in quality, the combination is bounded by the weighted mean of its members plus whatever diversity gain they contribute [9], so it cannot be repaired by re-weighting: the bound is a property of the member set, not of the gate. On the capped populations the four feature views score within 0.002 of one another (Table 4a) and the bound is slack. On the uncapped corpus the full-feature view f</w:t>
       </w:r>
       <w:r>
-        <w:t>alls 0.021397 behind the chi-square view, and one such member inside a four-way average accounts for the whole measured deficit: 0.021397/4 = 0.005349 predicted against -0.005533 observed. The corresponding diagnostic is therefore a comparison of member scores, not of weights.</w:t>
+        <w:t>alls 0.021397 behind the chi-square view, and one such member inside a four-way average accounts for the whole measured deficit: 0.021397/4 = 0.005349 predicted against -0.005533 observed. The same expression holds on the 413,209-flow population (0.004249/4 = 0.001062 against -0.001137) and on the primary population (0.002068/4 = 0.000517 against -0.000456), so the diagnostic is a comparison of member scores, not of weights.</w:t>
       </w:r>
     </w:p>
     <w:p>
@@ -13442,76 +13442,76 @@
       </w:rPr>
     </w:lvl>
   </w:abstractNum>
-  <w:num w:numId="1" w16cid:durableId="1977639020">
+  <w:num w:numId="1" w16cid:durableId="573858087">
     <w:abstractNumId w:val="8"/>
   </w:num>
-  <w:num w:numId="2" w16cid:durableId="763499143">
+  <w:num w:numId="2" w16cid:durableId="41751887">
     <w:abstractNumId w:val="6"/>
   </w:num>
-  <w:num w:numId="3" w16cid:durableId="199828370">
+  <w:num w:numId="3" w16cid:durableId="2063282623">
     <w:abstractNumId w:val="5"/>
   </w:num>
-  <w:num w:numId="4" w16cid:durableId="78723464">
+  <w:num w:numId="4" w16cid:durableId="1060207890">
     <w:abstractNumId w:val="4"/>
   </w:num>
-  <w:num w:numId="5" w16cid:durableId="1756318495">
+  <w:num w:numId="5" w16cid:durableId="496305041">
     <w:abstractNumId w:val="7"/>
   </w:num>
-  <w:num w:numId="6" w16cid:durableId="1416048824">
+  <w:num w:numId="6" w16cid:durableId="1135835561">
     <w:abstractNumId w:val="3"/>
   </w:num>
-  <w:num w:numId="7" w16cid:durableId="1295720098">
+  <w:num w:numId="7" w16cid:durableId="1121000040">
     <w:abstractNumId w:val="2"/>
   </w:num>
-  <w:num w:numId="8" w16cid:durableId="1437480855">
+  <w:num w:numId="8" w16cid:durableId="1941331936">
     <w:abstractNumId w:val="1"/>
   </w:num>
-  <w:num w:numId="9" w16cid:durableId="205412471">
+  <w:num w:numId="9" w16cid:durableId="1320234123">
     <w:abstractNumId w:val="0"/>
   </w:num>
-  <w:num w:numId="10" w16cid:durableId="753086511">
+  <w:num w:numId="10" w16cid:durableId="160706534">
     <w:abstractNumId w:val="7"/>
     <w:lvlOverride w:ilvl="0">
       <w:startOverride w:val="1"/>
     </w:lvlOverride>
   </w:num>
-  <w:num w:numId="11" w16cid:durableId="1914702473">
+  <w:num w:numId="11" w16cid:durableId="10881523">
     <w:abstractNumId w:val="7"/>
     <w:lvlOverride w:ilvl="0">
       <w:startOverride w:val="1"/>
     </w:lvlOverride>
   </w:num>
-  <w:num w:numId="12" w16cid:durableId="1752700580">
+  <w:num w:numId="12" w16cid:durableId="1696536433">
     <w:abstractNumId w:val="7"/>
     <w:lvlOverride w:ilvl="0">
       <w:startOverride w:val="1"/>
     </w:lvlOverride>
   </w:num>
-  <w:num w:numId="13" w16cid:durableId="662700869">
+  <w:num w:numId="13" w16cid:durableId="627124819">
     <w:abstractNumId w:val="7"/>
     <w:lvlOverride w:ilvl="0">
       <w:startOverride w:val="1"/>
     </w:lvlOverride>
   </w:num>
-  <w:num w:numId="14" w16cid:durableId="1002322642">
+  <w:num w:numId="14" w16cid:durableId="401683091">
     <w:abstractNumId w:val="7"/>
     <w:lvlOverride w:ilvl="0">
       <w:startOverride w:val="1"/>
     </w:lvlOverride>
   </w:num>
-  <w:num w:numId="15" w16cid:durableId="1500534712">
+  <w:num w:numId="15" w16cid:durableId="1268076200">
     <w:abstractNumId w:val="7"/>
     <w:lvlOverride w:ilvl="0">
       <w:startOverride w:val="1"/>
     </w:lvlOverride>
   </w:num>
-  <w:num w:numId="16" w16cid:durableId="711462357">
+  <w:num w:numId="16" w16cid:durableId="330959761">
     <w:abstractNumId w:val="7"/>
     <w:lvlOverride w:ilvl="0">
       <w:startOverride w:val="1"/>
     </w:lvlOverride>
   </w:num>
-  <w:num w:numId="17" w16cid:durableId="1179154383">
+  <w:num w:numId="17" w16cid:durableId="524248799">
     <w:abstractNumId w:val="7"/>
     <w:lvlOverride w:ilvl="0">
       <w:startOverride w:val="1"/>

</xml_diff>

<commit_message>
Round 19l: record per-file SHA-256 for the eight CIC-IDS2017 CSVs
</commit_message>
<xml_diff>
--- a/重构版论文_v4_20260915/English_SCI_Manuscript_v4.docx
+++ b/重构版论文_v4_20260915/English_SCI_Manuscript_v4.docx
@@ -1035,7 +1035,7 @@
           <w:noProof/>
         </w:rPr>
         <w:drawing>
-          <wp:inline distT="0" distB="0" distL="0" distR="0" wp14:anchorId="39E80165" wp14:editId="148A65AC">
+          <wp:inline distT="0" distB="0" distL="0" distR="0" wp14:anchorId="5135AEA9" wp14:editId="137A66FC">
             <wp:extent cx="5760720" cy="2734826"/>
             <wp:effectExtent l="0" t="0" r="0" b="0"/>
             <wp:docPr id="1" name="Picture 1"/>
@@ -2393,7 +2393,7 @@
           <w:noProof/>
         </w:rPr>
         <w:drawing>
-          <wp:inline distT="0" distB="0" distL="0" distR="0" wp14:anchorId="1C6B3321" wp14:editId="579542F1">
+          <wp:inline distT="0" distB="0" distL="0" distR="0" wp14:anchorId="59CD8000" wp14:editId="3BB47184">
             <wp:extent cx="5760720" cy="2722098"/>
             <wp:effectExtent l="0" t="0" r="0" b="0"/>
             <wp:docPr id="2" name="Picture 2"/>
@@ -3381,7 +3381,7 @@
           <w:noProof/>
         </w:rPr>
         <w:drawing>
-          <wp:inline distT="0" distB="0" distL="0" distR="0" wp14:anchorId="1435FC1C" wp14:editId="76156881">
+          <wp:inline distT="0" distB="0" distL="0" distR="0" wp14:anchorId="1473B5EA" wp14:editId="36168722">
             <wp:extent cx="5760720" cy="3482709"/>
             <wp:effectExtent l="0" t="0" r="0" b="0"/>
             <wp:docPr id="3" name="Picture 3"/>
@@ -7120,7 +7120,7 @@
           <w:noProof/>
         </w:rPr>
         <w:drawing>
-          <wp:inline distT="0" distB="0" distL="0" distR="0" wp14:anchorId="2E570EC1" wp14:editId="5CDDDF8C">
+          <wp:inline distT="0" distB="0" distL="0" distR="0" wp14:anchorId="194AF4E0" wp14:editId="6BA100D3">
             <wp:extent cx="5760720" cy="2351418"/>
             <wp:effectExtent l="0" t="0" r="0" b="0"/>
             <wp:docPr id="4" name="Picture 4"/>
@@ -8077,7 +8077,7 @@
         </w:rPr>
         <w:lastRenderedPageBreak/>
         <w:drawing>
-          <wp:inline distT="0" distB="0" distL="0" distR="0" wp14:anchorId="46D5EB1B" wp14:editId="17A93E35">
+          <wp:inline distT="0" distB="0" distL="0" distR="0" wp14:anchorId="1AA99B7C" wp14:editId="77BEAF32">
             <wp:extent cx="5760720" cy="2045294"/>
             <wp:effectExtent l="0" t="0" r="0" b="0"/>
             <wp:docPr id="5" name="Picture 5"/>
@@ -8252,7 +8252,7 @@
         </w:rPr>
         <w:lastRenderedPageBreak/>
         <w:drawing>
-          <wp:inline distT="0" distB="0" distL="0" distR="0" wp14:anchorId="52C43119" wp14:editId="4B9C6E9D">
+          <wp:inline distT="0" distB="0" distL="0" distR="0" wp14:anchorId="6954187B" wp14:editId="5A3C28AF">
             <wp:extent cx="5760720" cy="2308234"/>
             <wp:effectExtent l="0" t="0" r="0" b="0"/>
             <wp:docPr id="6" name="Picture 6"/>
@@ -8984,7 +8984,7 @@
         </w:rPr>
         <w:lastRenderedPageBreak/>
         <w:drawing>
-          <wp:inline distT="0" distB="0" distL="0" distR="0" wp14:anchorId="4B4C5167" wp14:editId="49DBCA7D">
+          <wp:inline distT="0" distB="0" distL="0" distR="0" wp14:anchorId="50F1A108" wp14:editId="60BB997B">
             <wp:extent cx="5760720" cy="2167923"/>
             <wp:effectExtent l="0" t="0" r="0" b="0"/>
             <wp:docPr id="7" name="Picture 7"/>
@@ -9092,7 +9092,7 @@
           <w:noProof/>
         </w:rPr>
         <w:drawing>
-          <wp:inline distT="0" distB="0" distL="0" distR="0" wp14:anchorId="0FF3F0BC" wp14:editId="1C670F2D">
+          <wp:inline distT="0" distB="0" distL="0" distR="0" wp14:anchorId="17FBDAE7" wp14:editId="340993E1">
             <wp:extent cx="5760720" cy="2258878"/>
             <wp:effectExtent l="0" t="0" r="0" b="0"/>
             <wp:docPr id="8" name="Picture 8"/>
@@ -9276,7 +9276,7 @@
           <w:noProof/>
         </w:rPr>
         <w:drawing>
-          <wp:inline distT="0" distB="0" distL="0" distR="0" wp14:anchorId="38BDF1A3" wp14:editId="69EBCE35">
+          <wp:inline distT="0" distB="0" distL="0" distR="0" wp14:anchorId="6E7AEEE9" wp14:editId="7D2C481E">
             <wp:extent cx="5760720" cy="2516852"/>
             <wp:effectExtent l="0" t="0" r="0" b="0"/>
             <wp:docPr id="9" name="Picture 9"/>
@@ -9413,7 +9413,7 @@
           <w:noProof/>
         </w:rPr>
         <w:drawing>
-          <wp:inline distT="0" distB="0" distL="0" distR="0" wp14:anchorId="1652B8D9" wp14:editId="7E8A1E64">
+          <wp:inline distT="0" distB="0" distL="0" distR="0" wp14:anchorId="26D7A142" wp14:editId="39522C48">
             <wp:extent cx="5760720" cy="2223311"/>
             <wp:effectExtent l="0" t="0" r="0" b="0"/>
             <wp:docPr id="10" name="Picture 10"/>
@@ -9503,7 +9503,7 @@
           <w:noProof/>
         </w:rPr>
         <w:drawing>
-          <wp:inline distT="0" distB="0" distL="0" distR="0" wp14:anchorId="13BCE010" wp14:editId="4FEC717F">
+          <wp:inline distT="0" distB="0" distL="0" distR="0" wp14:anchorId="20798EB0" wp14:editId="7263C92E">
             <wp:extent cx="5760720" cy="2538527"/>
             <wp:effectExtent l="0" t="0" r="0" b="0"/>
             <wp:docPr id="11" name="Picture 11"/>
@@ -13442,76 +13442,76 @@
       </w:rPr>
     </w:lvl>
   </w:abstractNum>
-  <w:num w:numId="1" w16cid:durableId="573858087">
+  <w:num w:numId="1" w16cid:durableId="1249313706">
     <w:abstractNumId w:val="8"/>
   </w:num>
-  <w:num w:numId="2" w16cid:durableId="41751887">
+  <w:num w:numId="2" w16cid:durableId="107239617">
     <w:abstractNumId w:val="6"/>
   </w:num>
-  <w:num w:numId="3" w16cid:durableId="2063282623">
+  <w:num w:numId="3" w16cid:durableId="1215198898">
     <w:abstractNumId w:val="5"/>
   </w:num>
-  <w:num w:numId="4" w16cid:durableId="1060207890">
+  <w:num w:numId="4" w16cid:durableId="1690065083">
     <w:abstractNumId w:val="4"/>
   </w:num>
-  <w:num w:numId="5" w16cid:durableId="496305041">
+  <w:num w:numId="5" w16cid:durableId="857692809">
     <w:abstractNumId w:val="7"/>
   </w:num>
-  <w:num w:numId="6" w16cid:durableId="1135835561">
+  <w:num w:numId="6" w16cid:durableId="291446915">
     <w:abstractNumId w:val="3"/>
   </w:num>
-  <w:num w:numId="7" w16cid:durableId="1121000040">
+  <w:num w:numId="7" w16cid:durableId="191656269">
     <w:abstractNumId w:val="2"/>
   </w:num>
-  <w:num w:numId="8" w16cid:durableId="1941331936">
+  <w:num w:numId="8" w16cid:durableId="883718563">
     <w:abstractNumId w:val="1"/>
   </w:num>
-  <w:num w:numId="9" w16cid:durableId="1320234123">
+  <w:num w:numId="9" w16cid:durableId="462115632">
     <w:abstractNumId w:val="0"/>
   </w:num>
-  <w:num w:numId="10" w16cid:durableId="160706534">
+  <w:num w:numId="10" w16cid:durableId="2101246460">
     <w:abstractNumId w:val="7"/>
     <w:lvlOverride w:ilvl="0">
       <w:startOverride w:val="1"/>
     </w:lvlOverride>
   </w:num>
-  <w:num w:numId="11" w16cid:durableId="10881523">
+  <w:num w:numId="11" w16cid:durableId="1241257486">
     <w:abstractNumId w:val="7"/>
     <w:lvlOverride w:ilvl="0">
       <w:startOverride w:val="1"/>
     </w:lvlOverride>
   </w:num>
-  <w:num w:numId="12" w16cid:durableId="1696536433">
+  <w:num w:numId="12" w16cid:durableId="606936427">
     <w:abstractNumId w:val="7"/>
     <w:lvlOverride w:ilvl="0">
       <w:startOverride w:val="1"/>
     </w:lvlOverride>
   </w:num>
-  <w:num w:numId="13" w16cid:durableId="627124819">
+  <w:num w:numId="13" w16cid:durableId="1489830176">
     <w:abstractNumId w:val="7"/>
     <w:lvlOverride w:ilvl="0">
       <w:startOverride w:val="1"/>
     </w:lvlOverride>
   </w:num>
-  <w:num w:numId="14" w16cid:durableId="401683091">
+  <w:num w:numId="14" w16cid:durableId="271981513">
     <w:abstractNumId w:val="7"/>
     <w:lvlOverride w:ilvl="0">
       <w:startOverride w:val="1"/>
     </w:lvlOverride>
   </w:num>
-  <w:num w:numId="15" w16cid:durableId="1268076200">
+  <w:num w:numId="15" w16cid:durableId="733167739">
     <w:abstractNumId w:val="7"/>
     <w:lvlOverride w:ilvl="0">
       <w:startOverride w:val="1"/>
     </w:lvlOverride>
   </w:num>
-  <w:num w:numId="16" w16cid:durableId="330959761">
+  <w:num w:numId="16" w16cid:durableId="633213698">
     <w:abstractNumId w:val="7"/>
     <w:lvlOverride w:ilvl="0">
       <w:startOverride w:val="1"/>
     </w:lvlOverride>
   </w:num>
-  <w:num w:numId="17" w16cid:durableId="524248799">
+  <w:num w:numId="17" w16cid:durableId="1012224724">
     <w:abstractNumId w:val="7"/>
     <w:lvlOverride w:ilvl="0">
       <w:startOverride w:val="1"/>

</xml_diff>

<commit_message>
Round 20d: pin the seed scope of the neural-baseline row, its paragraph and Figure 4
</commit_message>
<xml_diff>
--- a/重构版论文_v4_20260915/English_SCI_Manuscript_v4.docx
+++ b/重构版论文_v4_20260915/English_SCI_Manuscript_v4.docx
@@ -1035,7 +1035,7 @@
           <w:noProof/>
         </w:rPr>
         <w:drawing>
-          <wp:inline distT="0" distB="0" distL="0" distR="0" wp14:anchorId="5135AEA9" wp14:editId="137A66FC">
+          <wp:inline distT="0" distB="0" distL="0" distR="0" wp14:anchorId="5276D3FD" wp14:editId="33AF7D8F">
             <wp:extent cx="5760720" cy="2734826"/>
             <wp:effectExtent l="0" t="0" r="0" b="0"/>
             <wp:docPr id="1" name="Picture 1"/>
@@ -2393,7 +2393,7 @@
           <w:noProof/>
         </w:rPr>
         <w:drawing>
-          <wp:inline distT="0" distB="0" distL="0" distR="0" wp14:anchorId="59CD8000" wp14:editId="3BB47184">
+          <wp:inline distT="0" distB="0" distL="0" distR="0" wp14:anchorId="6E7098F5" wp14:editId="70A8F02D">
             <wp:extent cx="5760720" cy="2722098"/>
             <wp:effectExtent l="0" t="0" r="0" b="0"/>
             <wp:docPr id="2" name="Picture 2"/>
@@ -3381,7 +3381,7 @@
           <w:noProof/>
         </w:rPr>
         <w:drawing>
-          <wp:inline distT="0" distB="0" distL="0" distR="0" wp14:anchorId="1473B5EA" wp14:editId="36168722">
+          <wp:inline distT="0" distB="0" distL="0" distR="0" wp14:anchorId="1C12F43F" wp14:editId="1E30DF25">
             <wp:extent cx="5760720" cy="3482709"/>
             <wp:effectExtent l="0" t="0" r="0" b="0"/>
             <wp:docPr id="3" name="Picture 3"/>
@@ -5233,7 +5233,7 @@
     </w:p>
     <w:p>
       <w:r>
-        <w:t>(a) Natural-prior population P_nat, 7,986 test rows, mean of ten seeds</w:t>
+        <w:t>(a) Natural-prior population P_nat, 7,986 test rows, mean of ten seeds (MLP row: three seeds common to both runs)</w:t>
       </w:r>
     </w:p>
     <w:tbl>
@@ -7120,8 +7120,8 @@
           <w:noProof/>
         </w:rPr>
         <w:drawing>
-          <wp:inline distT="0" distB="0" distL="0" distR="0" wp14:anchorId="194AF4E0" wp14:editId="6BA100D3">
-            <wp:extent cx="5760720" cy="2351418"/>
+          <wp:inline distT="0" distB="0" distL="0" distR="0" wp14:anchorId="53ED4224" wp14:editId="500F45A8">
+            <wp:extent cx="5760720" cy="2356272"/>
             <wp:effectExtent l="0" t="0" r="0" b="0"/>
             <wp:docPr id="4" name="Picture 4"/>
             <wp:cNvGraphicFramePr>
@@ -7143,7 +7143,7 @@
                   <pic:spPr>
                     <a:xfrm>
                       <a:off x="0" y="0"/>
-                      <a:ext cx="5760720" cy="2351418"/>
+                      <a:ext cx="5760720" cy="2356272"/>
                     </a:xfrm>
                     <a:prstGeom prst="rect">
                       <a:avLst/>
@@ -7166,7 +7166,7 @@
           <w:color w:val="404040"/>
           <w:sz w:val="18"/>
         </w:rPr>
-        <w:t>Figure 4. Main results on both populations (ten seeds for the natural-prior panel) and paired bootstrap intervals</w:t>
+        <w:t>Figure 4. Main results on both populations (ten seeds for the natural-prior panel; the MLP bar uses the three seeds common to both runs) and paired bootstrap intervals</w:t>
       </w:r>
     </w:p>
     <w:p>
@@ -8025,10 +8025,10 @@
         <w:t>Fifth, a neural baseline shows how badly accuracy can mislead.</w:t>
       </w:r>
       <w:r>
-        <w:t xml:space="preserve"> A multilayer perceptron given the same feature budget and a full training budget (128 hidden units, hyper-parameters selected on the validation partition) reaches 0.97679 accuracy, essentially the same as RCCF's 0.97792 over the three seeds common to both runs, but only 0.797654 Macro-F1, 0.092 below RCCF. Its balanced accuracy is 0.79666 against 0.94920, and its Brier score is 0.036701 against 0.006312. Notably, a paired McNemar test on overall correctness is not significant (pooled p = 0.383 over 23,958 </w:t>
-      </w:r>
-      <w:r>
-        <w:t xml:space="preserve">rows; per-seed 1.000 / 0.768 / 0.261), because the two models make a similar </w:t>
+        <w:t xml:space="preserve"> A multilayer perceptron given the same feature budget and a full training budget (128 hidden units, hyper-parameters selected on the validation partition) reaches 0.97679 accuracy against RCCF's 0.97792, but only 0.797654 Macro-F1 against 0.889955, i.e. 0.092 lower. Its balanced accuracy is 0.79666 against 0.94920 and its Brier score is 0.036701 against 0.006312. Every comparison in this paragraph is computed on the three seeds common to both runs (42, 2024, 3407), the seeds on which the neural baseline wa</w:t>
+      </w:r>
+      <w:r>
+        <w:t xml:space="preserve">s trained; Table 4(a) gives the corresponding ten-seed RCCF values. Notably, a paired McNemar test on overall correctness is not significant (pooled p = 0.383 over 23,958 rows; per-seed 1.000 / 0.768 / 0.261), because the two models make a similar </w:t>
       </w:r>
       <w:r>
         <w:rPr>
@@ -8077,7 +8077,7 @@
         </w:rPr>
         <w:lastRenderedPageBreak/>
         <w:drawing>
-          <wp:inline distT="0" distB="0" distL="0" distR="0" wp14:anchorId="1AA99B7C" wp14:editId="77BEAF32">
+          <wp:inline distT="0" distB="0" distL="0" distR="0" wp14:anchorId="74F00B0E" wp14:editId="37E50DCD">
             <wp:extent cx="5760720" cy="2045294"/>
             <wp:effectExtent l="0" t="0" r="0" b="0"/>
             <wp:docPr id="5" name="Picture 5"/>
@@ -8252,7 +8252,7 @@
         </w:rPr>
         <w:lastRenderedPageBreak/>
         <w:drawing>
-          <wp:inline distT="0" distB="0" distL="0" distR="0" wp14:anchorId="6954187B" wp14:editId="5A3C28AF">
+          <wp:inline distT="0" distB="0" distL="0" distR="0" wp14:anchorId="694F32BC" wp14:editId="1E5A3828">
             <wp:extent cx="5760720" cy="2308234"/>
             <wp:effectExtent l="0" t="0" r="0" b="0"/>
             <wp:docPr id="6" name="Picture 6"/>
@@ -8984,7 +8984,7 @@
         </w:rPr>
         <w:lastRenderedPageBreak/>
         <w:drawing>
-          <wp:inline distT="0" distB="0" distL="0" distR="0" wp14:anchorId="50F1A108" wp14:editId="60BB997B">
+          <wp:inline distT="0" distB="0" distL="0" distR="0" wp14:anchorId="0629128D" wp14:editId="70B971A7">
             <wp:extent cx="5760720" cy="2167923"/>
             <wp:effectExtent l="0" t="0" r="0" b="0"/>
             <wp:docPr id="7" name="Picture 7"/>
@@ -9092,7 +9092,7 @@
           <w:noProof/>
         </w:rPr>
         <w:drawing>
-          <wp:inline distT="0" distB="0" distL="0" distR="0" wp14:anchorId="17FBDAE7" wp14:editId="340993E1">
+          <wp:inline distT="0" distB="0" distL="0" distR="0" wp14:anchorId="154A09FC" wp14:editId="546DB4D4">
             <wp:extent cx="5760720" cy="2258878"/>
             <wp:effectExtent l="0" t="0" r="0" b="0"/>
             <wp:docPr id="8" name="Picture 8"/>
@@ -9276,7 +9276,7 @@
           <w:noProof/>
         </w:rPr>
         <w:drawing>
-          <wp:inline distT="0" distB="0" distL="0" distR="0" wp14:anchorId="6E7AEEE9" wp14:editId="7D2C481E">
+          <wp:inline distT="0" distB="0" distL="0" distR="0" wp14:anchorId="0FBF1045" wp14:editId="2FDFE615">
             <wp:extent cx="5760720" cy="2516852"/>
             <wp:effectExtent l="0" t="0" r="0" b="0"/>
             <wp:docPr id="9" name="Picture 9"/>
@@ -9413,7 +9413,7 @@
           <w:noProof/>
         </w:rPr>
         <w:drawing>
-          <wp:inline distT="0" distB="0" distL="0" distR="0" wp14:anchorId="26D7A142" wp14:editId="39522C48">
+          <wp:inline distT="0" distB="0" distL="0" distR="0" wp14:anchorId="3B8A8441" wp14:editId="4C00762C">
             <wp:extent cx="5760720" cy="2223311"/>
             <wp:effectExtent l="0" t="0" r="0" b="0"/>
             <wp:docPr id="10" name="Picture 10"/>
@@ -9503,7 +9503,7 @@
           <w:noProof/>
         </w:rPr>
         <w:drawing>
-          <wp:inline distT="0" distB="0" distL="0" distR="0" wp14:anchorId="20798EB0" wp14:editId="7263C92E">
+          <wp:inline distT="0" distB="0" distL="0" distR="0" wp14:anchorId="48C2578A" wp14:editId="62A53600">
             <wp:extent cx="5760720" cy="2538527"/>
             <wp:effectExtent l="0" t="0" r="0" b="0"/>
             <wp:docPr id="11" name="Picture 11"/>
@@ -13442,76 +13442,76 @@
       </w:rPr>
     </w:lvl>
   </w:abstractNum>
-  <w:num w:numId="1" w16cid:durableId="1249313706">
+  <w:num w:numId="1" w16cid:durableId="2066564148">
     <w:abstractNumId w:val="8"/>
   </w:num>
-  <w:num w:numId="2" w16cid:durableId="107239617">
+  <w:num w:numId="2" w16cid:durableId="469715589">
     <w:abstractNumId w:val="6"/>
   </w:num>
-  <w:num w:numId="3" w16cid:durableId="1215198898">
+  <w:num w:numId="3" w16cid:durableId="1911429027">
     <w:abstractNumId w:val="5"/>
   </w:num>
-  <w:num w:numId="4" w16cid:durableId="1690065083">
+  <w:num w:numId="4" w16cid:durableId="996300460">
     <w:abstractNumId w:val="4"/>
   </w:num>
-  <w:num w:numId="5" w16cid:durableId="857692809">
+  <w:num w:numId="5" w16cid:durableId="1193110809">
     <w:abstractNumId w:val="7"/>
   </w:num>
-  <w:num w:numId="6" w16cid:durableId="291446915">
+  <w:num w:numId="6" w16cid:durableId="1663779517">
     <w:abstractNumId w:val="3"/>
   </w:num>
-  <w:num w:numId="7" w16cid:durableId="191656269">
+  <w:num w:numId="7" w16cid:durableId="1659066598">
     <w:abstractNumId w:val="2"/>
   </w:num>
-  <w:num w:numId="8" w16cid:durableId="883718563">
+  <w:num w:numId="8" w16cid:durableId="2101756518">
     <w:abstractNumId w:val="1"/>
   </w:num>
-  <w:num w:numId="9" w16cid:durableId="462115632">
+  <w:num w:numId="9" w16cid:durableId="1988509520">
     <w:abstractNumId w:val="0"/>
   </w:num>
-  <w:num w:numId="10" w16cid:durableId="2101246460">
+  <w:num w:numId="10" w16cid:durableId="2079011438">
     <w:abstractNumId w:val="7"/>
     <w:lvlOverride w:ilvl="0">
       <w:startOverride w:val="1"/>
     </w:lvlOverride>
   </w:num>
-  <w:num w:numId="11" w16cid:durableId="1241257486">
+  <w:num w:numId="11" w16cid:durableId="1330212377">
     <w:abstractNumId w:val="7"/>
     <w:lvlOverride w:ilvl="0">
       <w:startOverride w:val="1"/>
     </w:lvlOverride>
   </w:num>
-  <w:num w:numId="12" w16cid:durableId="606936427">
+  <w:num w:numId="12" w16cid:durableId="281615915">
     <w:abstractNumId w:val="7"/>
     <w:lvlOverride w:ilvl="0">
       <w:startOverride w:val="1"/>
     </w:lvlOverride>
   </w:num>
-  <w:num w:numId="13" w16cid:durableId="1489830176">
+  <w:num w:numId="13" w16cid:durableId="725643195">
     <w:abstractNumId w:val="7"/>
     <w:lvlOverride w:ilvl="0">
       <w:startOverride w:val="1"/>
     </w:lvlOverride>
   </w:num>
-  <w:num w:numId="14" w16cid:durableId="271981513">
+  <w:num w:numId="14" w16cid:durableId="490411142">
     <w:abstractNumId w:val="7"/>
     <w:lvlOverride w:ilvl="0">
       <w:startOverride w:val="1"/>
     </w:lvlOverride>
   </w:num>
-  <w:num w:numId="15" w16cid:durableId="733167739">
+  <w:num w:numId="15" w16cid:durableId="1651784543">
     <w:abstractNumId w:val="7"/>
     <w:lvlOverride w:ilvl="0">
       <w:startOverride w:val="1"/>
     </w:lvlOverride>
   </w:num>
-  <w:num w:numId="16" w16cid:durableId="633213698">
+  <w:num w:numId="16" w16cid:durableId="551498355">
     <w:abstractNumId w:val="7"/>
     <w:lvlOverride w:ilvl="0">
       <w:startOverride w:val="1"/>
     </w:lvlOverride>
   </w:num>
-  <w:num w:numId="17" w16cid:durableId="1012224724">
+  <w:num w:numId="17" w16cid:durableId="370033868">
     <w:abstractNumId w:val="7"/>
     <w:lvlOverride w:ilvl="0">
       <w:startOverride w:val="1"/>

</xml_diff>

<commit_message>
Round 20f: rebuild the S24 DOI record against the current 47-entry reference list
</commit_message>
<xml_diff>
--- a/重构版论文_v4_20260915/English_SCI_Manuscript_v4.docx
+++ b/重构版论文_v4_20260915/English_SCI_Manuscript_v4.docx
@@ -1035,7 +1035,7 @@
           <w:noProof/>
         </w:rPr>
         <w:drawing>
-          <wp:inline distT="0" distB="0" distL="0" distR="0" wp14:anchorId="5276D3FD" wp14:editId="33AF7D8F">
+          <wp:inline distT="0" distB="0" distL="0" distR="0" wp14:anchorId="1521F783" wp14:editId="5321239F">
             <wp:extent cx="5760720" cy="2734826"/>
             <wp:effectExtent l="0" t="0" r="0" b="0"/>
             <wp:docPr id="1" name="Picture 1"/>
@@ -2393,7 +2393,7 @@
           <w:noProof/>
         </w:rPr>
         <w:drawing>
-          <wp:inline distT="0" distB="0" distL="0" distR="0" wp14:anchorId="6E7098F5" wp14:editId="70A8F02D">
+          <wp:inline distT="0" distB="0" distL="0" distR="0" wp14:anchorId="39606C18" wp14:editId="431FACAF">
             <wp:extent cx="5760720" cy="2722098"/>
             <wp:effectExtent l="0" t="0" r="0" b="0"/>
             <wp:docPr id="2" name="Picture 2"/>
@@ -3381,7 +3381,7 @@
           <w:noProof/>
         </w:rPr>
         <w:drawing>
-          <wp:inline distT="0" distB="0" distL="0" distR="0" wp14:anchorId="1C12F43F" wp14:editId="1E30DF25">
+          <wp:inline distT="0" distB="0" distL="0" distR="0" wp14:anchorId="313098DB" wp14:editId="3064D6E3">
             <wp:extent cx="5760720" cy="3482709"/>
             <wp:effectExtent l="0" t="0" r="0" b="0"/>
             <wp:docPr id="3" name="Picture 3"/>
@@ -7120,7 +7120,7 @@
           <w:noProof/>
         </w:rPr>
         <w:drawing>
-          <wp:inline distT="0" distB="0" distL="0" distR="0" wp14:anchorId="53ED4224" wp14:editId="500F45A8">
+          <wp:inline distT="0" distB="0" distL="0" distR="0" wp14:anchorId="27948753" wp14:editId="08185239">
             <wp:extent cx="5760720" cy="2356272"/>
             <wp:effectExtent l="0" t="0" r="0" b="0"/>
             <wp:docPr id="4" name="Picture 4"/>
@@ -8077,7 +8077,7 @@
         </w:rPr>
         <w:lastRenderedPageBreak/>
         <w:drawing>
-          <wp:inline distT="0" distB="0" distL="0" distR="0" wp14:anchorId="74F00B0E" wp14:editId="37E50DCD">
+          <wp:inline distT="0" distB="0" distL="0" distR="0" wp14:anchorId="28170ABB" wp14:editId="1703805A">
             <wp:extent cx="5760720" cy="2045294"/>
             <wp:effectExtent l="0" t="0" r="0" b="0"/>
             <wp:docPr id="5" name="Picture 5"/>
@@ -8252,7 +8252,7 @@
         </w:rPr>
         <w:lastRenderedPageBreak/>
         <w:drawing>
-          <wp:inline distT="0" distB="0" distL="0" distR="0" wp14:anchorId="694F32BC" wp14:editId="1E5A3828">
+          <wp:inline distT="0" distB="0" distL="0" distR="0" wp14:anchorId="7C5FBD0E" wp14:editId="7FE4C369">
             <wp:extent cx="5760720" cy="2308234"/>
             <wp:effectExtent l="0" t="0" r="0" b="0"/>
             <wp:docPr id="6" name="Picture 6"/>
@@ -8984,7 +8984,7 @@
         </w:rPr>
         <w:lastRenderedPageBreak/>
         <w:drawing>
-          <wp:inline distT="0" distB="0" distL="0" distR="0" wp14:anchorId="0629128D" wp14:editId="70B971A7">
+          <wp:inline distT="0" distB="0" distL="0" distR="0" wp14:anchorId="062980C5" wp14:editId="013DAF28">
             <wp:extent cx="5760720" cy="2167923"/>
             <wp:effectExtent l="0" t="0" r="0" b="0"/>
             <wp:docPr id="7" name="Picture 7"/>
@@ -9092,7 +9092,7 @@
           <w:noProof/>
         </w:rPr>
         <w:drawing>
-          <wp:inline distT="0" distB="0" distL="0" distR="0" wp14:anchorId="154A09FC" wp14:editId="546DB4D4">
+          <wp:inline distT="0" distB="0" distL="0" distR="0" wp14:anchorId="36753DBD" wp14:editId="4ACE5BF2">
             <wp:extent cx="5760720" cy="2258878"/>
             <wp:effectExtent l="0" t="0" r="0" b="0"/>
             <wp:docPr id="8" name="Picture 8"/>
@@ -9276,7 +9276,7 @@
           <w:noProof/>
         </w:rPr>
         <w:drawing>
-          <wp:inline distT="0" distB="0" distL="0" distR="0" wp14:anchorId="0FBF1045" wp14:editId="2FDFE615">
+          <wp:inline distT="0" distB="0" distL="0" distR="0" wp14:anchorId="69AA2183" wp14:editId="3ED48D2F">
             <wp:extent cx="5760720" cy="2516852"/>
             <wp:effectExtent l="0" t="0" r="0" b="0"/>
             <wp:docPr id="9" name="Picture 9"/>
@@ -9413,7 +9413,7 @@
           <w:noProof/>
         </w:rPr>
         <w:drawing>
-          <wp:inline distT="0" distB="0" distL="0" distR="0" wp14:anchorId="3B8A8441" wp14:editId="4C00762C">
+          <wp:inline distT="0" distB="0" distL="0" distR="0" wp14:anchorId="7B3921CE" wp14:editId="59D2E4F4">
             <wp:extent cx="5760720" cy="2223311"/>
             <wp:effectExtent l="0" t="0" r="0" b="0"/>
             <wp:docPr id="10" name="Picture 10"/>
@@ -9503,7 +9503,7 @@
           <w:noProof/>
         </w:rPr>
         <w:drawing>
-          <wp:inline distT="0" distB="0" distL="0" distR="0" wp14:anchorId="48C2578A" wp14:editId="62A53600">
+          <wp:inline distT="0" distB="0" distL="0" distR="0" wp14:anchorId="0AA64E11" wp14:editId="290DAB75">
             <wp:extent cx="5760720" cy="2538527"/>
             <wp:effectExtent l="0" t="0" r="0" b="0"/>
             <wp:docPr id="11" name="Picture 11"/>
@@ -11584,7 +11584,7 @@
     </w:p>
     <w:p>
       <w:r>
-        <w:t>Note: all DOIs were verified against Crossref on 2026-09-16. Venues that do not assign Crossref DOIs (PMLR, NeurIPS, JMLR, USENIX) are marked as such rather than left pending.The individual checks are recorded in Supplementary S24.</w:t>
+        <w:t>Note: all DOIs were verified against Crossref or DataCite on 2026-09-23. Venues that do not assign Crossref DOIs (PMLR, NeurIPS, JMLR, USENIX) are marked as such rather than left pending. The individual checks are recorded in Supplementary S24.</w:t>
       </w:r>
     </w:p>
     <w:p>
@@ -13442,76 +13442,76 @@
       </w:rPr>
     </w:lvl>
   </w:abstractNum>
-  <w:num w:numId="1" w16cid:durableId="2066564148">
+  <w:num w:numId="1" w16cid:durableId="1804152083">
     <w:abstractNumId w:val="8"/>
   </w:num>
-  <w:num w:numId="2" w16cid:durableId="469715589">
+  <w:num w:numId="2" w16cid:durableId="618294911">
     <w:abstractNumId w:val="6"/>
   </w:num>
-  <w:num w:numId="3" w16cid:durableId="1911429027">
+  <w:num w:numId="3" w16cid:durableId="270475288">
     <w:abstractNumId w:val="5"/>
   </w:num>
-  <w:num w:numId="4" w16cid:durableId="996300460">
+  <w:num w:numId="4" w16cid:durableId="1092582339">
     <w:abstractNumId w:val="4"/>
   </w:num>
-  <w:num w:numId="5" w16cid:durableId="1193110809">
+  <w:num w:numId="5" w16cid:durableId="460343391">
     <w:abstractNumId w:val="7"/>
   </w:num>
-  <w:num w:numId="6" w16cid:durableId="1663779517">
+  <w:num w:numId="6" w16cid:durableId="1295209756">
     <w:abstractNumId w:val="3"/>
   </w:num>
-  <w:num w:numId="7" w16cid:durableId="1659066598">
+  <w:num w:numId="7" w16cid:durableId="1706248632">
     <w:abstractNumId w:val="2"/>
   </w:num>
-  <w:num w:numId="8" w16cid:durableId="2101756518">
+  <w:num w:numId="8" w16cid:durableId="812214686">
     <w:abstractNumId w:val="1"/>
   </w:num>
-  <w:num w:numId="9" w16cid:durableId="1988509520">
+  <w:num w:numId="9" w16cid:durableId="661472759">
     <w:abstractNumId w:val="0"/>
   </w:num>
-  <w:num w:numId="10" w16cid:durableId="2079011438">
+  <w:num w:numId="10" w16cid:durableId="161357476">
     <w:abstractNumId w:val="7"/>
     <w:lvlOverride w:ilvl="0">
       <w:startOverride w:val="1"/>
     </w:lvlOverride>
   </w:num>
-  <w:num w:numId="11" w16cid:durableId="1330212377">
+  <w:num w:numId="11" w16cid:durableId="1133215104">
     <w:abstractNumId w:val="7"/>
     <w:lvlOverride w:ilvl="0">
       <w:startOverride w:val="1"/>
     </w:lvlOverride>
   </w:num>
-  <w:num w:numId="12" w16cid:durableId="281615915">
+  <w:num w:numId="12" w16cid:durableId="108356341">
     <w:abstractNumId w:val="7"/>
     <w:lvlOverride w:ilvl="0">
       <w:startOverride w:val="1"/>
     </w:lvlOverride>
   </w:num>
-  <w:num w:numId="13" w16cid:durableId="725643195">
+  <w:num w:numId="13" w16cid:durableId="911810851">
     <w:abstractNumId w:val="7"/>
     <w:lvlOverride w:ilvl="0">
       <w:startOverride w:val="1"/>
     </w:lvlOverride>
   </w:num>
-  <w:num w:numId="14" w16cid:durableId="490411142">
+  <w:num w:numId="14" w16cid:durableId="1915703836">
     <w:abstractNumId w:val="7"/>
     <w:lvlOverride w:ilvl="0">
       <w:startOverride w:val="1"/>
     </w:lvlOverride>
   </w:num>
-  <w:num w:numId="15" w16cid:durableId="1651784543">
+  <w:num w:numId="15" w16cid:durableId="1624381307">
     <w:abstractNumId w:val="7"/>
     <w:lvlOverride w:ilvl="0">
       <w:startOverride w:val="1"/>
     </w:lvlOverride>
   </w:num>
-  <w:num w:numId="16" w16cid:durableId="551498355">
+  <w:num w:numId="16" w16cid:durableId="1412123903">
     <w:abstractNumId w:val="7"/>
     <w:lvlOverride w:ilvl="0">
       <w:startOverride w:val="1"/>
     </w:lvlOverride>
   </w:num>
-  <w:num w:numId="17" w16cid:durableId="370033868">
+  <w:num w:numId="17" w16cid:durableId="1415859640">
     <w:abstractNumId w:val="7"/>
     <w:lvlOverride w:ilvl="0">
       <w:startOverride w:val="1"/>

</xml_diff>

<commit_message>
Round 20h: name the corpus behind the Section 5.1 feature counts and fix its protocol sentence
</commit_message>
<xml_diff>
--- a/重构版论文_v4_20260915/English_SCI_Manuscript_v4.docx
+++ b/重构版论文_v4_20260915/English_SCI_Manuscript_v4.docx
@@ -1035,7 +1035,7 @@
           <w:noProof/>
         </w:rPr>
         <w:drawing>
-          <wp:inline distT="0" distB="0" distL="0" distR="0" wp14:anchorId="1521F783" wp14:editId="5321239F">
+          <wp:inline distT="0" distB="0" distL="0" distR="0" wp14:anchorId="45D97E9E" wp14:editId="43DB4405">
             <wp:extent cx="5760720" cy="2734826"/>
             <wp:effectExtent l="0" t="0" r="0" b="0"/>
             <wp:docPr id="1" name="Picture 1"/>
@@ -2393,7 +2393,7 @@
           <w:noProof/>
         </w:rPr>
         <w:drawing>
-          <wp:inline distT="0" distB="0" distL="0" distR="0" wp14:anchorId="39606C18" wp14:editId="431FACAF">
+          <wp:inline distT="0" distB="0" distL="0" distR="0" wp14:anchorId="4DCD5EBD" wp14:editId="5AB85A37">
             <wp:extent cx="5760720" cy="2722098"/>
             <wp:effectExtent l="0" t="0" r="0" b="0"/>
             <wp:docPr id="2" name="Picture 2"/>
@@ -3381,7 +3381,7 @@
           <w:noProof/>
         </w:rPr>
         <w:drawing>
-          <wp:inline distT="0" distB="0" distL="0" distR="0" wp14:anchorId="313098DB" wp14:editId="3064D6E3">
+          <wp:inline distT="0" distB="0" distL="0" distR="0" wp14:anchorId="6D69DCD9" wp14:editId="114A6E1E">
             <wp:extent cx="5760720" cy="3482709"/>
             <wp:effectExtent l="0" t="0" r="0" b="0"/>
             <wp:docPr id="3" name="Picture 3"/>
@@ -4753,11 +4753,14 @@
     </w:p>
     <w:p>
       <w:r>
-        <w:t xml:space="preserve">Let n be the number of training rows, d the original feature count, k the selected feature count, T the number of trees, K the number of cross-fitting folds and Q = 4 the number of experts. The dominant cost of the cross-fitting stage is approximately O(QK T n log n), the final refit stage costs O(QT n log n), and filter selection contributes O(Q n d). Inference requires one tree traversal per expert plus the risk models, about O(QT log n) per row. RCCF is therefore </w:t>
+        <w:t xml:space="preserve">Let n be the number of training rows, d the original feature count, k the selected feature count, T the number of trees, K the number of cross-fitting folds and Q = 4 the number of experts. The dominant cost of the cross-fitting stage is approximately O(QK T n log n), the final refit stage costs O(QT n log n), and filter selection contributes O(Q n d). </w:t>
       </w:r>
       <w:r>
         <w:lastRenderedPageBreak/>
-        <w:t>substantially more expensive than a single equal-weight forest at both ends, and Section 5.6 quantifies that cost. All experiments ran on a single workstation with 8 physical cores (16 logical), 35.8 GB of RAM and Windows 10 (build 10.0.26200), using Python 3.11.4, scikit-learn 1.9.0, XGBoost 3.2.0, NumPy 2.4.6, pandas 3.0.5 and Matplotlib 3.11.1. The reported timings are single-machine measurements and are not portability claims. The software stack is documented in [44-47].</w:t>
+        <w:t>Inference requires one tree traversal per expert plus the risk models, about O(QT log n) per row. RCCF is therefore substantially more expensive than a single equal-weight forest at both ends, and Section 5.6 quantifies that cost. All experiments ran on a single workstation with 8 physical cores (16 logical), 35.8 GB of RAM and Windows 10 (build 10.0.26200), using Python 3.11.4, scikit-learn 1.9.0, XGBoost 3.2.0, NumPy 2.4.6, pandas 3.0.5 and Matplotlib 3.11.1. The reported timings are single-machine measur</w:t>
+      </w:r>
+      <w:r>
+        <w:t>ements and are not portability claims. The software stack is documented in [44-47].</w:t>
       </w:r>
     </w:p>
     <w:p>
@@ -4886,7 +4889,10 @@
     </w:p>
     <w:p>
       <w:r>
-        <w:t>The feature-quality audit shows that 12 of the 78 CIC-IDS2017 features are constant (a single value across all rows) and 18 are near-zero-variance. The constant columns include Bwd PSH Flags, Fwd URG Flags, Bwd URG Flags, RST Flag Count, CWE Flag Count, ECE Flag Count and six bulk-rate fields. H1's premise of redundancy is therefore correct in itself.</w:t>
+        <w:t>The feature-quality audit of the balanced control corpus P_bal (2,355 training rows) shows that 12 of the 78 CIC-IDS2017 features are constant (a single value across all rows) and 18 are near-zero-variance; the primary natural-prior split shows 10 constant and 20 near-zero-variance features, so the degeneracy belongs to the feature representation rather than to one population. The constant columns include Bwd PSH Flags, Fwd URG Flags, Bwd URG Flags, RST Flag Count, CWE Flag Count, ECE Flag Count and six bul</w:t>
+      </w:r>
+      <w:r>
+        <w:t>k-rate fields. H1's premise of redundancy is therefore correct in itself.</w:t>
       </w:r>
     </w:p>
     <w:p>
@@ -5069,7 +5075,14 @@
               <w:rPr>
                 <w:sz w:val="16"/>
               </w:rPr>
-              <w:t>Balanced control population (three seeds)</w:t>
+              <w:t xml:space="preserve">Balanced control population (three </w:t>
+            </w:r>
+            <w:r>
+              <w:rPr>
+                <w:sz w:val="16"/>
+              </w:rPr>
+              <w:lastRenderedPageBreak/>
+              <w:t>seeds)</w:t>
             </w:r>
           </w:p>
         </w:tc>
@@ -5085,6 +5098,7 @@
               <w:rPr>
                 <w:sz w:val="16"/>
               </w:rPr>
+              <w:lastRenderedPageBreak/>
               <w:t>0.960997</w:t>
             </w:r>
           </w:p>
@@ -5197,7 +5211,6 @@
     </w:p>
     <w:p>
       <w:r>
-        <w:lastRenderedPageBreak/>
         <w:t xml:space="preserve">All three protocols agree: </w:t>
       </w:r>
       <w:r>
@@ -5207,7 +5220,7 @@
         <w:t>reducing dimensionality from 78 to 60 costs no discriminative power</w:t>
       </w:r>
       <w:r>
-        <w:t>, and in two protocols it produces a small positive difference. Under ten repeated splits that difference (+0.00015) is nevertheless two orders of magnitude smaller than the split-to-split standard deviation (about 0.011). The correct answer to RQ1 is therefore that dimensionality can be reduced, but that dimensionality reduction should not be claimed as a performance gain. The value of the chi-square view lies in interpretability and inference cost, not in accuracy.</w:t>
+        <w:t>, The two fixed-split protocols show a small positive difference (+0.00207 and +0.00222); under ten repeated splits the difference shrinks to +0.00015, two orders of magnitude smaller than the split-to-split standard deviation (about 0.011). The correct answer to RQ1 is therefore that dimensionality can be reduced, but that dimensionality reduction should not be claimed as a performance gain. The value of the chi-square view lies in interpretability and inference cost, not in accuracy.</w:t>
       </w:r>
     </w:p>
     <w:p>
@@ -7092,6 +7105,7 @@
         <w:rPr>
           <w:b/>
         </w:rPr>
+        <w:lastRenderedPageBreak/>
         <w:t>First, the headline result is a near-zero difference.</w:t>
       </w:r>
       <w:r>
@@ -7104,11 +7118,7 @@
         <w:t>-0.000456</w:t>
       </w:r>
       <w:r>
-        <w:t xml:space="preserve">, with five seeds favouring RCCF and five favouring the equal forest. On the three-seed balanced control </w:t>
-      </w:r>
-      <w:r>
-        <w:lastRenderedPageBreak/>
-        <w:t>RCCF reaches 0.961807 against 0.963215, trailing by -0.001408. Both magnitudes are below one thousandth and the sign is not stable across settings. One baseline is stronger on a different metric: extremely randomised trees obtain the highest balanced accuracy (0.96215 against 0.94820 for RCCF) while obtaining the lowest Macro-F1 (0.857490), because they spread predictions more evenly across rare classes.</w:t>
+        <w:t>, with five seeds favouring RCCF and five favouring the equal forest. On the three-seed balanced control RCCF reaches 0.961807 against 0.963215, trailing by -0.001408. Both magnitudes are below one thousandth and the sign is not stable across settings. One baseline is stronger on a different metric: extremely randomised trees obtain the highest balanced accuracy (0.96215 against 0.94820 for RCCF) while obtaining the lowest Macro-F1 (0.857490), because they spread predictions more evenly across rare classes.</w:t>
       </w:r>
     </w:p>
     <w:p>
@@ -7120,7 +7130,7 @@
           <w:noProof/>
         </w:rPr>
         <w:drawing>
-          <wp:inline distT="0" distB="0" distL="0" distR="0" wp14:anchorId="27948753" wp14:editId="08185239">
+          <wp:inline distT="0" distB="0" distL="0" distR="0" wp14:anchorId="6F6F1CFC" wp14:editId="14B7D035">
             <wp:extent cx="5760720" cy="2356272"/>
             <wp:effectExtent l="0" t="0" r="0" b="0"/>
             <wp:docPr id="4" name="Picture 4"/>
@@ -7791,6 +7801,7 @@
               <w:rPr>
                 <w:sz w:val="16"/>
               </w:rPr>
+              <w:lastRenderedPageBreak/>
               <w:t>RCCF - ExtraTrees (chi-square)</w:t>
             </w:r>
           </w:p>
@@ -7965,7 +7976,6 @@
     </w:p>
     <w:p>
       <w:r>
-        <w:lastRenderedPageBreak/>
         <w:t>The test-row paired bootstrap against the equal-weight chi-square forest gives a pooled 90% interval of [-0.004251, +0.003382] over the same ten seeds, which is also inside both margins.</w:t>
       </w:r>
     </w:p>
@@ -8077,7 +8087,7 @@
         </w:rPr>
         <w:lastRenderedPageBreak/>
         <w:drawing>
-          <wp:inline distT="0" distB="0" distL="0" distR="0" wp14:anchorId="28170ABB" wp14:editId="1703805A">
+          <wp:inline distT="0" distB="0" distL="0" distR="0" wp14:anchorId="6ABB4104" wp14:editId="2CBA2666">
             <wp:extent cx="5760720" cy="2045294"/>
             <wp:effectExtent l="0" t="0" r="0" b="0"/>
             <wp:docPr id="5" name="Picture 5"/>
@@ -8252,7 +8262,7 @@
         </w:rPr>
         <w:lastRenderedPageBreak/>
         <w:drawing>
-          <wp:inline distT="0" distB="0" distL="0" distR="0" wp14:anchorId="7C5FBD0E" wp14:editId="7FE4C369">
+          <wp:inline distT="0" distB="0" distL="0" distR="0" wp14:anchorId="7C5FD8C3" wp14:editId="040BBC83">
             <wp:extent cx="5760720" cy="2308234"/>
             <wp:effectExtent l="0" t="0" r="0" b="0"/>
             <wp:docPr id="6" name="Picture 6"/>
@@ -8984,7 +8994,7 @@
         </w:rPr>
         <w:lastRenderedPageBreak/>
         <w:drawing>
-          <wp:inline distT="0" distB="0" distL="0" distR="0" wp14:anchorId="062980C5" wp14:editId="013DAF28">
+          <wp:inline distT="0" distB="0" distL="0" distR="0" wp14:anchorId="514B90E1" wp14:editId="5B01F6C8">
             <wp:extent cx="5760720" cy="2167923"/>
             <wp:effectExtent l="0" t="0" r="0" b="0"/>
             <wp:docPr id="7" name="Picture 7"/>
@@ -9092,7 +9102,7 @@
           <w:noProof/>
         </w:rPr>
         <w:drawing>
-          <wp:inline distT="0" distB="0" distL="0" distR="0" wp14:anchorId="36753DBD" wp14:editId="4ACE5BF2">
+          <wp:inline distT="0" distB="0" distL="0" distR="0" wp14:anchorId="756537D6" wp14:editId="471BFD22">
             <wp:extent cx="5760720" cy="2258878"/>
             <wp:effectExtent l="0" t="0" r="0" b="0"/>
             <wp:docPr id="8" name="Picture 8"/>
@@ -9276,7 +9286,7 @@
           <w:noProof/>
         </w:rPr>
         <w:drawing>
-          <wp:inline distT="0" distB="0" distL="0" distR="0" wp14:anchorId="69AA2183" wp14:editId="3ED48D2F">
+          <wp:inline distT="0" distB="0" distL="0" distR="0" wp14:anchorId="17CAECE0" wp14:editId="5EEE19F3">
             <wp:extent cx="5760720" cy="2516852"/>
             <wp:effectExtent l="0" t="0" r="0" b="0"/>
             <wp:docPr id="9" name="Picture 9"/>
@@ -9413,7 +9423,7 @@
           <w:noProof/>
         </w:rPr>
         <w:drawing>
-          <wp:inline distT="0" distB="0" distL="0" distR="0" wp14:anchorId="7B3921CE" wp14:editId="59D2E4F4">
+          <wp:inline distT="0" distB="0" distL="0" distR="0" wp14:anchorId="6F66718A" wp14:editId="481EBB69">
             <wp:extent cx="5760720" cy="2223311"/>
             <wp:effectExtent l="0" t="0" r="0" b="0"/>
             <wp:docPr id="10" name="Picture 10"/>
@@ -9503,7 +9513,7 @@
           <w:noProof/>
         </w:rPr>
         <w:drawing>
-          <wp:inline distT="0" distB="0" distL="0" distR="0" wp14:anchorId="0AA64E11" wp14:editId="290DAB75">
+          <wp:inline distT="0" distB="0" distL="0" distR="0" wp14:anchorId="5E0883C8" wp14:editId="07B48B4B">
             <wp:extent cx="5760720" cy="2538527"/>
             <wp:effectExtent l="0" t="0" r="0" b="0"/>
             <wp:docPr id="11" name="Picture 11"/>
@@ -13442,76 +13452,76 @@
       </w:rPr>
     </w:lvl>
   </w:abstractNum>
-  <w:num w:numId="1" w16cid:durableId="1804152083">
+  <w:num w:numId="1" w16cid:durableId="1307931147">
     <w:abstractNumId w:val="8"/>
   </w:num>
-  <w:num w:numId="2" w16cid:durableId="618294911">
+  <w:num w:numId="2" w16cid:durableId="1827626251">
     <w:abstractNumId w:val="6"/>
   </w:num>
-  <w:num w:numId="3" w16cid:durableId="270475288">
+  <w:num w:numId="3" w16cid:durableId="818766032">
     <w:abstractNumId w:val="5"/>
   </w:num>
-  <w:num w:numId="4" w16cid:durableId="1092582339">
+  <w:num w:numId="4" w16cid:durableId="213471064">
     <w:abstractNumId w:val="4"/>
   </w:num>
-  <w:num w:numId="5" w16cid:durableId="460343391">
+  <w:num w:numId="5" w16cid:durableId="1323582124">
     <w:abstractNumId w:val="7"/>
   </w:num>
-  <w:num w:numId="6" w16cid:durableId="1295209756">
+  <w:num w:numId="6" w16cid:durableId="1326591104">
     <w:abstractNumId w:val="3"/>
   </w:num>
-  <w:num w:numId="7" w16cid:durableId="1706248632">
+  <w:num w:numId="7" w16cid:durableId="1837184715">
     <w:abstractNumId w:val="2"/>
   </w:num>
-  <w:num w:numId="8" w16cid:durableId="812214686">
+  <w:num w:numId="8" w16cid:durableId="1435787120">
     <w:abstractNumId w:val="1"/>
   </w:num>
-  <w:num w:numId="9" w16cid:durableId="661472759">
+  <w:num w:numId="9" w16cid:durableId="2088572903">
     <w:abstractNumId w:val="0"/>
   </w:num>
-  <w:num w:numId="10" w16cid:durableId="161357476">
+  <w:num w:numId="10" w16cid:durableId="1497190064">
     <w:abstractNumId w:val="7"/>
     <w:lvlOverride w:ilvl="0">
       <w:startOverride w:val="1"/>
     </w:lvlOverride>
   </w:num>
-  <w:num w:numId="11" w16cid:durableId="1133215104">
+  <w:num w:numId="11" w16cid:durableId="1652098794">
     <w:abstractNumId w:val="7"/>
     <w:lvlOverride w:ilvl="0">
       <w:startOverride w:val="1"/>
     </w:lvlOverride>
   </w:num>
-  <w:num w:numId="12" w16cid:durableId="108356341">
+  <w:num w:numId="12" w16cid:durableId="620376971">
     <w:abstractNumId w:val="7"/>
     <w:lvlOverride w:ilvl="0">
       <w:startOverride w:val="1"/>
     </w:lvlOverride>
   </w:num>
-  <w:num w:numId="13" w16cid:durableId="911810851">
+  <w:num w:numId="13" w16cid:durableId="260190339">
     <w:abstractNumId w:val="7"/>
     <w:lvlOverride w:ilvl="0">
       <w:startOverride w:val="1"/>
     </w:lvlOverride>
   </w:num>
-  <w:num w:numId="14" w16cid:durableId="1915703836">
+  <w:num w:numId="14" w16cid:durableId="726151110">
     <w:abstractNumId w:val="7"/>
     <w:lvlOverride w:ilvl="0">
       <w:startOverride w:val="1"/>
     </w:lvlOverride>
   </w:num>
-  <w:num w:numId="15" w16cid:durableId="1624381307">
+  <w:num w:numId="15" w16cid:durableId="1110201473">
     <w:abstractNumId w:val="7"/>
     <w:lvlOverride w:ilvl="0">
       <w:startOverride w:val="1"/>
     </w:lvlOverride>
   </w:num>
-  <w:num w:numId="16" w16cid:durableId="1412123903">
+  <w:num w:numId="16" w16cid:durableId="955333160">
     <w:abstractNumId w:val="7"/>
     <w:lvlOverride w:ilvl="0">
       <w:startOverride w:val="1"/>
     </w:lvlOverride>
   </w:num>
-  <w:num w:numId="17" w16cid:durableId="1415859640">
+  <w:num w:numId="17" w16cid:durableId="1436056330">
     <w:abstractNumId w:val="7"/>
     <w:lvlOverride w:ilvl="0">
       <w:startOverride w:val="1"/>

</xml_diff>

<commit_message>
Round 20i: give the Chinese fig6/fig7 a builder and guard against unproduced figures
</commit_message>
<xml_diff>
--- a/重构版论文_v4_20260915/English_SCI_Manuscript_v4.docx
+++ b/重构版论文_v4_20260915/English_SCI_Manuscript_v4.docx
@@ -1035,7 +1035,7 @@
           <w:noProof/>
         </w:rPr>
         <w:drawing>
-          <wp:inline distT="0" distB="0" distL="0" distR="0" wp14:anchorId="45D97E9E" wp14:editId="43DB4405">
+          <wp:inline distT="0" distB="0" distL="0" distR="0" wp14:anchorId="2CCA7A83" wp14:editId="6ECAC303">
             <wp:extent cx="5760720" cy="2734826"/>
             <wp:effectExtent l="0" t="0" r="0" b="0"/>
             <wp:docPr id="1" name="Picture 1"/>
@@ -2393,7 +2393,7 @@
           <w:noProof/>
         </w:rPr>
         <w:drawing>
-          <wp:inline distT="0" distB="0" distL="0" distR="0" wp14:anchorId="4DCD5EBD" wp14:editId="5AB85A37">
+          <wp:inline distT="0" distB="0" distL="0" distR="0" wp14:anchorId="73A8389B" wp14:editId="17908F84">
             <wp:extent cx="5760720" cy="2722098"/>
             <wp:effectExtent l="0" t="0" r="0" b="0"/>
             <wp:docPr id="2" name="Picture 2"/>
@@ -3381,7 +3381,7 @@
           <w:noProof/>
         </w:rPr>
         <w:drawing>
-          <wp:inline distT="0" distB="0" distL="0" distR="0" wp14:anchorId="6D69DCD9" wp14:editId="114A6E1E">
+          <wp:inline distT="0" distB="0" distL="0" distR="0" wp14:anchorId="1FDE8283" wp14:editId="3641A0F9">
             <wp:extent cx="5760720" cy="3482709"/>
             <wp:effectExtent l="0" t="0" r="0" b="0"/>
             <wp:docPr id="3" name="Picture 3"/>
@@ -4753,14 +4753,14 @@
     </w:p>
     <w:p>
       <w:r>
-        <w:t xml:space="preserve">Let n be the number of training rows, d the original feature count, k the selected feature count, T the number of trees, K the number of cross-fitting folds and Q = 4 the number of experts. The dominant cost of the cross-fitting stage is approximately O(QK T n log n), the final refit stage costs O(QT n log n), and filter selection contributes O(Q n d). </w:t>
+        <w:t xml:space="preserve">Let n be the number of training rows, d the original feature count, k the selected feature count, T the number of trees, K the number of cross-fitting folds and Q = 4 the number of experts. The dominant cost of the cross-fitting stage is </w:t>
       </w:r>
       <w:r>
         <w:lastRenderedPageBreak/>
-        <w:t>Inference requires one tree traversal per expert plus the risk models, about O(QT log n) per row. RCCF is therefore substantially more expensive than a single equal-weight forest at both ends, and Section 5.6 quantifies that cost. All experiments ran on a single workstation with 8 physical cores (16 logical), 35.8 GB of RAM and Windows 10 (build 10.0.26200), using Python 3.11.4, scikit-learn 1.9.0, XGBoost 3.2.0, NumPy 2.4.6, pandas 3.0.5 and Matplotlib 3.11.1. The reported timings are single-machine measur</w:t>
-      </w:r>
-      <w:r>
-        <w:t>ements and are not portability claims. The software stack is documented in [44-47].</w:t>
+        <w:t xml:space="preserve">approximately O(QK T n log n), the final refit stage costs O(QT n log n), and filter selection contributes O(Q n d). Inference requires one tree traversal per expert plus the risk models, about O(QT log n) per row. RCCF is therefore substantially more expensive than a single equal-weight forest at both ends, and Section 5.6 quantifies that cost. All experiments ran on a single workstation with 8 physical cores (16 logical), 35.8 GB of RAM and Windows 10 (build 10.0.26200), using Python 3.11.4, scikit-learn </w:t>
+      </w:r>
+      <w:r>
+        <w:t>1.9.0, XGBoost 3.2.0, NumPy 2.4.6, pandas 3.0.5 and Matplotlib 3.11.1. The reported timings are single-machine measurements and are not portability claims. The software stack is documented in [44-47].</w:t>
       </w:r>
     </w:p>
     <w:p>
@@ -5008,7 +5008,14 @@
               <w:rPr>
                 <w:sz w:val="16"/>
               </w:rPr>
-              <w:t>Natural-prior population (ten seeds)</w:t>
+              <w:t xml:space="preserve">Natural-prior population (ten </w:t>
+            </w:r>
+            <w:r>
+              <w:rPr>
+                <w:sz w:val="16"/>
+              </w:rPr>
+              <w:lastRenderedPageBreak/>
+              <w:t>seeds)</w:t>
             </w:r>
           </w:p>
         </w:tc>
@@ -5024,6 +5031,7 @@
               <w:rPr>
                 <w:sz w:val="16"/>
               </w:rPr>
+              <w:lastRenderedPageBreak/>
               <w:t>0.887666</w:t>
             </w:r>
           </w:p>
@@ -5075,14 +5083,7 @@
               <w:rPr>
                 <w:sz w:val="16"/>
               </w:rPr>
-              <w:t xml:space="preserve">Balanced control population (three </w:t>
-            </w:r>
-            <w:r>
-              <w:rPr>
-                <w:sz w:val="16"/>
-              </w:rPr>
-              <w:lastRenderedPageBreak/>
-              <w:t>seeds)</w:t>
+              <w:t>Balanced control population (three seeds)</w:t>
             </w:r>
           </w:p>
         </w:tc>
@@ -5098,7 +5099,6 @@
               <w:rPr>
                 <w:sz w:val="16"/>
               </w:rPr>
-              <w:lastRenderedPageBreak/>
               <w:t>0.960997</w:t>
             </w:r>
           </w:p>
@@ -7105,7 +7105,6 @@
         <w:rPr>
           <w:b/>
         </w:rPr>
-        <w:lastRenderedPageBreak/>
         <w:t>First, the headline result is a near-zero difference.</w:t>
       </w:r>
       <w:r>
@@ -7130,7 +7129,7 @@
           <w:noProof/>
         </w:rPr>
         <w:drawing>
-          <wp:inline distT="0" distB="0" distL="0" distR="0" wp14:anchorId="6F6F1CFC" wp14:editId="14B7D035">
+          <wp:inline distT="0" distB="0" distL="0" distR="0" wp14:anchorId="0EC951F1" wp14:editId="5C594A17">
             <wp:extent cx="5760720" cy="2356272"/>
             <wp:effectExtent l="0" t="0" r="0" b="0"/>
             <wp:docPr id="4" name="Picture 4"/>
@@ -8087,7 +8086,7 @@
         </w:rPr>
         <w:lastRenderedPageBreak/>
         <w:drawing>
-          <wp:inline distT="0" distB="0" distL="0" distR="0" wp14:anchorId="6ABB4104" wp14:editId="2CBA2666">
+          <wp:inline distT="0" distB="0" distL="0" distR="0" wp14:anchorId="687C2F64" wp14:editId="7F3303C3">
             <wp:extent cx="5760720" cy="2045294"/>
             <wp:effectExtent l="0" t="0" r="0" b="0"/>
             <wp:docPr id="5" name="Picture 5"/>
@@ -8262,7 +8261,7 @@
         </w:rPr>
         <w:lastRenderedPageBreak/>
         <w:drawing>
-          <wp:inline distT="0" distB="0" distL="0" distR="0" wp14:anchorId="7C5FD8C3" wp14:editId="040BBC83">
+          <wp:inline distT="0" distB="0" distL="0" distR="0" wp14:anchorId="63245A61" wp14:editId="04AC35E6">
             <wp:extent cx="5760720" cy="2308234"/>
             <wp:effectExtent l="0" t="0" r="0" b="0"/>
             <wp:docPr id="6" name="Picture 6"/>
@@ -8994,7 +8993,7 @@
         </w:rPr>
         <w:lastRenderedPageBreak/>
         <w:drawing>
-          <wp:inline distT="0" distB="0" distL="0" distR="0" wp14:anchorId="514B90E1" wp14:editId="5B01F6C8">
+          <wp:inline distT="0" distB="0" distL="0" distR="0" wp14:anchorId="5D9C794B" wp14:editId="56E609B0">
             <wp:extent cx="5760720" cy="2167923"/>
             <wp:effectExtent l="0" t="0" r="0" b="0"/>
             <wp:docPr id="7" name="Picture 7"/>
@@ -9102,7 +9101,7 @@
           <w:noProof/>
         </w:rPr>
         <w:drawing>
-          <wp:inline distT="0" distB="0" distL="0" distR="0" wp14:anchorId="756537D6" wp14:editId="471BFD22">
+          <wp:inline distT="0" distB="0" distL="0" distR="0" wp14:anchorId="520E7DCD" wp14:editId="10FD0BA6">
             <wp:extent cx="5760720" cy="2258878"/>
             <wp:effectExtent l="0" t="0" r="0" b="0"/>
             <wp:docPr id="8" name="Picture 8"/>
@@ -9286,7 +9285,7 @@
           <w:noProof/>
         </w:rPr>
         <w:drawing>
-          <wp:inline distT="0" distB="0" distL="0" distR="0" wp14:anchorId="17CAECE0" wp14:editId="5EEE19F3">
+          <wp:inline distT="0" distB="0" distL="0" distR="0" wp14:anchorId="56B4A18A" wp14:editId="6AA61AD9">
             <wp:extent cx="5760720" cy="2516852"/>
             <wp:effectExtent l="0" t="0" r="0" b="0"/>
             <wp:docPr id="9" name="Picture 9"/>
@@ -9423,7 +9422,7 @@
           <w:noProof/>
         </w:rPr>
         <w:drawing>
-          <wp:inline distT="0" distB="0" distL="0" distR="0" wp14:anchorId="6F66718A" wp14:editId="481EBB69">
+          <wp:inline distT="0" distB="0" distL="0" distR="0" wp14:anchorId="0160F05F" wp14:editId="7EF21173">
             <wp:extent cx="5760720" cy="2223311"/>
             <wp:effectExtent l="0" t="0" r="0" b="0"/>
             <wp:docPr id="10" name="Picture 10"/>
@@ -9513,7 +9512,7 @@
           <w:noProof/>
         </w:rPr>
         <w:drawing>
-          <wp:inline distT="0" distB="0" distL="0" distR="0" wp14:anchorId="5E0883C8" wp14:editId="07B48B4B">
+          <wp:inline distT="0" distB="0" distL="0" distR="0" wp14:anchorId="279457AD" wp14:editId="00F44046">
             <wp:extent cx="5760720" cy="2538527"/>
             <wp:effectExtent l="0" t="0" r="0" b="0"/>
             <wp:docPr id="11" name="Picture 11"/>
@@ -13452,76 +13451,76 @@
       </w:rPr>
     </w:lvl>
   </w:abstractNum>
-  <w:num w:numId="1" w16cid:durableId="1307931147">
+  <w:num w:numId="1" w16cid:durableId="1924681878">
     <w:abstractNumId w:val="8"/>
   </w:num>
-  <w:num w:numId="2" w16cid:durableId="1827626251">
+  <w:num w:numId="2" w16cid:durableId="1238244678">
     <w:abstractNumId w:val="6"/>
   </w:num>
-  <w:num w:numId="3" w16cid:durableId="818766032">
+  <w:num w:numId="3" w16cid:durableId="671449027">
     <w:abstractNumId w:val="5"/>
   </w:num>
-  <w:num w:numId="4" w16cid:durableId="213471064">
+  <w:num w:numId="4" w16cid:durableId="1458336905">
     <w:abstractNumId w:val="4"/>
   </w:num>
-  <w:num w:numId="5" w16cid:durableId="1323582124">
+  <w:num w:numId="5" w16cid:durableId="1765876617">
     <w:abstractNumId w:val="7"/>
   </w:num>
-  <w:num w:numId="6" w16cid:durableId="1326591104">
+  <w:num w:numId="6" w16cid:durableId="694887014">
     <w:abstractNumId w:val="3"/>
   </w:num>
-  <w:num w:numId="7" w16cid:durableId="1837184715">
+  <w:num w:numId="7" w16cid:durableId="1698189339">
     <w:abstractNumId w:val="2"/>
   </w:num>
-  <w:num w:numId="8" w16cid:durableId="1435787120">
+  <w:num w:numId="8" w16cid:durableId="2130392102">
     <w:abstractNumId w:val="1"/>
   </w:num>
-  <w:num w:numId="9" w16cid:durableId="2088572903">
+  <w:num w:numId="9" w16cid:durableId="11610057">
     <w:abstractNumId w:val="0"/>
   </w:num>
-  <w:num w:numId="10" w16cid:durableId="1497190064">
+  <w:num w:numId="10" w16cid:durableId="1376857707">
     <w:abstractNumId w:val="7"/>
     <w:lvlOverride w:ilvl="0">
       <w:startOverride w:val="1"/>
     </w:lvlOverride>
   </w:num>
-  <w:num w:numId="11" w16cid:durableId="1652098794">
+  <w:num w:numId="11" w16cid:durableId="919407230">
     <w:abstractNumId w:val="7"/>
     <w:lvlOverride w:ilvl="0">
       <w:startOverride w:val="1"/>
     </w:lvlOverride>
   </w:num>
-  <w:num w:numId="12" w16cid:durableId="620376971">
+  <w:num w:numId="12" w16cid:durableId="1844514363">
     <w:abstractNumId w:val="7"/>
     <w:lvlOverride w:ilvl="0">
       <w:startOverride w:val="1"/>
     </w:lvlOverride>
   </w:num>
-  <w:num w:numId="13" w16cid:durableId="260190339">
+  <w:num w:numId="13" w16cid:durableId="460224037">
     <w:abstractNumId w:val="7"/>
     <w:lvlOverride w:ilvl="0">
       <w:startOverride w:val="1"/>
     </w:lvlOverride>
   </w:num>
-  <w:num w:numId="14" w16cid:durableId="726151110">
+  <w:num w:numId="14" w16cid:durableId="513106502">
     <w:abstractNumId w:val="7"/>
     <w:lvlOverride w:ilvl="0">
       <w:startOverride w:val="1"/>
     </w:lvlOverride>
   </w:num>
-  <w:num w:numId="15" w16cid:durableId="1110201473">
+  <w:num w:numId="15" w16cid:durableId="344674990">
     <w:abstractNumId w:val="7"/>
     <w:lvlOverride w:ilvl="0">
       <w:startOverride w:val="1"/>
     </w:lvlOverride>
   </w:num>
-  <w:num w:numId="16" w16cid:durableId="955333160">
+  <w:num w:numId="16" w16cid:durableId="922684153">
     <w:abstractNumId w:val="7"/>
     <w:lvlOverride w:ilvl="0">
       <w:startOverride w:val="1"/>
     </w:lvlOverride>
   </w:num>
-  <w:num w:numId="17" w16cid:durableId="1436056330">
+  <w:num w:numId="17" w16cid:durableId="781729086">
     <w:abstractNumId w:val="7"/>
     <w:lvlOverride w:ilvl="0">
       <w:startOverride w:val="1"/>

</xml_diff>

<commit_message>
Round 20l: re-sync the self-check table and gap report with the artifacts they quote
</commit_message>
<xml_diff>
--- a/重构版论文_v4_20260915/English_SCI_Manuscript_v4.docx
+++ b/重构版论文_v4_20260915/English_SCI_Manuscript_v4.docx
@@ -1035,7 +1035,7 @@
           <w:noProof/>
         </w:rPr>
         <w:drawing>
-          <wp:inline distT="0" distB="0" distL="0" distR="0" wp14:anchorId="2CCA7A83" wp14:editId="6ECAC303">
+          <wp:inline distT="0" distB="0" distL="0" distR="0" wp14:anchorId="3C840F47" wp14:editId="314AECD0">
             <wp:extent cx="5760720" cy="2734826"/>
             <wp:effectExtent l="0" t="0" r="0" b="0"/>
             <wp:docPr id="1" name="Picture 1"/>
@@ -2393,7 +2393,7 @@
           <w:noProof/>
         </w:rPr>
         <w:drawing>
-          <wp:inline distT="0" distB="0" distL="0" distR="0" wp14:anchorId="73A8389B" wp14:editId="17908F84">
+          <wp:inline distT="0" distB="0" distL="0" distR="0" wp14:anchorId="226BAF1F" wp14:editId="1829FDA6">
             <wp:extent cx="5760720" cy="2722098"/>
             <wp:effectExtent l="0" t="0" r="0" b="0"/>
             <wp:docPr id="2" name="Picture 2"/>
@@ -3381,7 +3381,7 @@
           <w:noProof/>
         </w:rPr>
         <w:drawing>
-          <wp:inline distT="0" distB="0" distL="0" distR="0" wp14:anchorId="1FDE8283" wp14:editId="3641A0F9">
+          <wp:inline distT="0" distB="0" distL="0" distR="0" wp14:anchorId="1DF4846D" wp14:editId="48890923">
             <wp:extent cx="5760720" cy="3482709"/>
             <wp:effectExtent l="0" t="0" r="0" b="0"/>
             <wp:docPr id="3" name="Picture 3"/>
@@ -4753,14 +4753,11 @@
     </w:p>
     <w:p>
       <w:r>
-        <w:t xml:space="preserve">Let n be the number of training rows, d the original feature count, k the selected feature count, T the number of trees, K the number of cross-fitting folds and Q = 4 the number of experts. The dominant cost of the cross-fitting stage is </w:t>
+        <w:t xml:space="preserve">Let n be the number of training rows, d the original feature count, k the selected feature count, T the number of trees, K the number of cross-fitting folds and Q = 4 the number of experts. The dominant cost of the cross-fitting stage is approximately O(QK T n log n), the final refit stage costs O(QT n log n), and filter selection contributes O(Q n d). Inference requires one tree traversal per expert plus the risk models, about O(QT log n) per row. RCCF is therefore </w:t>
       </w:r>
       <w:r>
         <w:lastRenderedPageBreak/>
-        <w:t xml:space="preserve">approximately O(QK T n log n), the final refit stage costs O(QT n log n), and filter selection contributes O(Q n d). Inference requires one tree traversal per expert plus the risk models, about O(QT log n) per row. RCCF is therefore substantially more expensive than a single equal-weight forest at both ends, and Section 5.6 quantifies that cost. All experiments ran on a single workstation with 8 physical cores (16 logical), 35.8 GB of RAM and Windows 10 (build 10.0.26200), using Python 3.11.4, scikit-learn </w:t>
-      </w:r>
-      <w:r>
-        <w:t>1.9.0, XGBoost 3.2.0, NumPy 2.4.6, pandas 3.0.5 and Matplotlib 3.11.1. The reported timings are single-machine measurements and are not portability claims. The software stack is documented in [44-47].</w:t>
+        <w:t>substantially more expensive than a single equal-weight forest at both ends, and Section 5.6 quantifies that cost. All experiments ran on a single workstation with 8 physical cores (16 logical), 35.8 GB of RAM and Windows 10 (build 10.0.26200), using Python 3.11.4, scikit-learn 1.9.0, XGBoost 3.2.0, NumPy 2.4.6, pandas 3.0.5 and Matplotlib 3.11.1. The reported timings are single-machine measurements and are not portability claims. The software stack is documented in [44-47].</w:t>
       </w:r>
     </w:p>
     <w:p>
@@ -5008,14 +5005,7 @@
               <w:rPr>
                 <w:sz w:val="16"/>
               </w:rPr>
-              <w:t xml:space="preserve">Natural-prior population (ten </w:t>
-            </w:r>
-            <w:r>
-              <w:rPr>
-                <w:sz w:val="16"/>
-              </w:rPr>
-              <w:lastRenderedPageBreak/>
-              <w:t>seeds)</w:t>
+              <w:t>Natural-prior population (ten seeds)</w:t>
             </w:r>
           </w:p>
         </w:tc>
@@ -5031,7 +5021,6 @@
               <w:rPr>
                 <w:sz w:val="16"/>
               </w:rPr>
-              <w:lastRenderedPageBreak/>
               <w:t>0.887666</w:t>
             </w:r>
           </w:p>
@@ -5150,6 +5139,7 @@
               <w:rPr>
                 <w:sz w:val="16"/>
               </w:rPr>
+              <w:lastRenderedPageBreak/>
               <w:t>Ten repeated splits (mean +/- s.d.)</w:t>
             </w:r>
           </w:p>
@@ -7105,6 +7095,7 @@
         <w:rPr>
           <w:b/>
         </w:rPr>
+        <w:lastRenderedPageBreak/>
         <w:t>First, the headline result is a near-zero difference.</w:t>
       </w:r>
       <w:r>
@@ -7129,7 +7120,7 @@
           <w:noProof/>
         </w:rPr>
         <w:drawing>
-          <wp:inline distT="0" distB="0" distL="0" distR="0" wp14:anchorId="0EC951F1" wp14:editId="5C594A17">
+          <wp:inline distT="0" distB="0" distL="0" distR="0" wp14:anchorId="4C305EC1" wp14:editId="76AFE030">
             <wp:extent cx="5760720" cy="2356272"/>
             <wp:effectExtent l="0" t="0" r="0" b="0"/>
             <wp:docPr id="4" name="Picture 4"/>
@@ -8086,7 +8077,7 @@
         </w:rPr>
         <w:lastRenderedPageBreak/>
         <w:drawing>
-          <wp:inline distT="0" distB="0" distL="0" distR="0" wp14:anchorId="687C2F64" wp14:editId="7F3303C3">
+          <wp:inline distT="0" distB="0" distL="0" distR="0" wp14:anchorId="5438759E" wp14:editId="150502B2">
             <wp:extent cx="5760720" cy="2045294"/>
             <wp:effectExtent l="0" t="0" r="0" b="0"/>
             <wp:docPr id="5" name="Picture 5"/>
@@ -8261,7 +8252,7 @@
         </w:rPr>
         <w:lastRenderedPageBreak/>
         <w:drawing>
-          <wp:inline distT="0" distB="0" distL="0" distR="0" wp14:anchorId="63245A61" wp14:editId="04AC35E6">
+          <wp:inline distT="0" distB="0" distL="0" distR="0" wp14:anchorId="7C452766" wp14:editId="040571DD">
             <wp:extent cx="5760720" cy="2308234"/>
             <wp:effectExtent l="0" t="0" r="0" b="0"/>
             <wp:docPr id="6" name="Picture 6"/>
@@ -8993,7 +8984,7 @@
         </w:rPr>
         <w:lastRenderedPageBreak/>
         <w:drawing>
-          <wp:inline distT="0" distB="0" distL="0" distR="0" wp14:anchorId="5D9C794B" wp14:editId="56E609B0">
+          <wp:inline distT="0" distB="0" distL="0" distR="0" wp14:anchorId="5FEDDDDC" wp14:editId="43653210">
             <wp:extent cx="5760720" cy="2167923"/>
             <wp:effectExtent l="0" t="0" r="0" b="0"/>
             <wp:docPr id="7" name="Picture 7"/>
@@ -9101,7 +9092,7 @@
           <w:noProof/>
         </w:rPr>
         <w:drawing>
-          <wp:inline distT="0" distB="0" distL="0" distR="0" wp14:anchorId="520E7DCD" wp14:editId="10FD0BA6">
+          <wp:inline distT="0" distB="0" distL="0" distR="0" wp14:anchorId="1C3E744B" wp14:editId="23002AFA">
             <wp:extent cx="5760720" cy="2258878"/>
             <wp:effectExtent l="0" t="0" r="0" b="0"/>
             <wp:docPr id="8" name="Picture 8"/>
@@ -9285,7 +9276,7 @@
           <w:noProof/>
         </w:rPr>
         <w:drawing>
-          <wp:inline distT="0" distB="0" distL="0" distR="0" wp14:anchorId="56B4A18A" wp14:editId="6AA61AD9">
+          <wp:inline distT="0" distB="0" distL="0" distR="0" wp14:anchorId="587D8878" wp14:editId="62E940A7">
             <wp:extent cx="5760720" cy="2516852"/>
             <wp:effectExtent l="0" t="0" r="0" b="0"/>
             <wp:docPr id="9" name="Picture 9"/>
@@ -9422,7 +9413,7 @@
           <w:noProof/>
         </w:rPr>
         <w:drawing>
-          <wp:inline distT="0" distB="0" distL="0" distR="0" wp14:anchorId="0160F05F" wp14:editId="7EF21173">
+          <wp:inline distT="0" distB="0" distL="0" distR="0" wp14:anchorId="29623770" wp14:editId="37F58553">
             <wp:extent cx="5760720" cy="2223311"/>
             <wp:effectExtent l="0" t="0" r="0" b="0"/>
             <wp:docPr id="10" name="Picture 10"/>
@@ -9512,7 +9503,7 @@
           <w:noProof/>
         </w:rPr>
         <w:drawing>
-          <wp:inline distT="0" distB="0" distL="0" distR="0" wp14:anchorId="279457AD" wp14:editId="00F44046">
+          <wp:inline distT="0" distB="0" distL="0" distR="0" wp14:anchorId="61089F7C" wp14:editId="22DB4C30">
             <wp:extent cx="5760720" cy="2538527"/>
             <wp:effectExtent l="0" t="0" r="0" b="0"/>
             <wp:docPr id="11" name="Picture 11"/>
@@ -13451,76 +13442,76 @@
       </w:rPr>
     </w:lvl>
   </w:abstractNum>
-  <w:num w:numId="1" w16cid:durableId="1924681878">
+  <w:num w:numId="1" w16cid:durableId="1078019015">
     <w:abstractNumId w:val="8"/>
   </w:num>
-  <w:num w:numId="2" w16cid:durableId="1238244678">
+  <w:num w:numId="2" w16cid:durableId="1770854630">
     <w:abstractNumId w:val="6"/>
   </w:num>
-  <w:num w:numId="3" w16cid:durableId="671449027">
+  <w:num w:numId="3" w16cid:durableId="67272403">
     <w:abstractNumId w:val="5"/>
   </w:num>
-  <w:num w:numId="4" w16cid:durableId="1458336905">
+  <w:num w:numId="4" w16cid:durableId="970553561">
     <w:abstractNumId w:val="4"/>
   </w:num>
-  <w:num w:numId="5" w16cid:durableId="1765876617">
+  <w:num w:numId="5" w16cid:durableId="722169495">
     <w:abstractNumId w:val="7"/>
   </w:num>
-  <w:num w:numId="6" w16cid:durableId="694887014">
+  <w:num w:numId="6" w16cid:durableId="268632134">
     <w:abstractNumId w:val="3"/>
   </w:num>
-  <w:num w:numId="7" w16cid:durableId="1698189339">
+  <w:num w:numId="7" w16cid:durableId="1428696288">
     <w:abstractNumId w:val="2"/>
   </w:num>
-  <w:num w:numId="8" w16cid:durableId="2130392102">
+  <w:num w:numId="8" w16cid:durableId="1397120550">
     <w:abstractNumId w:val="1"/>
   </w:num>
-  <w:num w:numId="9" w16cid:durableId="11610057">
+  <w:num w:numId="9" w16cid:durableId="1234197651">
     <w:abstractNumId w:val="0"/>
   </w:num>
-  <w:num w:numId="10" w16cid:durableId="1376857707">
+  <w:num w:numId="10" w16cid:durableId="1974821219">
     <w:abstractNumId w:val="7"/>
     <w:lvlOverride w:ilvl="0">
       <w:startOverride w:val="1"/>
     </w:lvlOverride>
   </w:num>
-  <w:num w:numId="11" w16cid:durableId="919407230">
+  <w:num w:numId="11" w16cid:durableId="1782677335">
     <w:abstractNumId w:val="7"/>
     <w:lvlOverride w:ilvl="0">
       <w:startOverride w:val="1"/>
     </w:lvlOverride>
   </w:num>
-  <w:num w:numId="12" w16cid:durableId="1844514363">
+  <w:num w:numId="12" w16cid:durableId="265309708">
     <w:abstractNumId w:val="7"/>
     <w:lvlOverride w:ilvl="0">
       <w:startOverride w:val="1"/>
     </w:lvlOverride>
   </w:num>
-  <w:num w:numId="13" w16cid:durableId="460224037">
+  <w:num w:numId="13" w16cid:durableId="1446339692">
     <w:abstractNumId w:val="7"/>
     <w:lvlOverride w:ilvl="0">
       <w:startOverride w:val="1"/>
     </w:lvlOverride>
   </w:num>
-  <w:num w:numId="14" w16cid:durableId="513106502">
+  <w:num w:numId="14" w16cid:durableId="1814177547">
     <w:abstractNumId w:val="7"/>
     <w:lvlOverride w:ilvl="0">
       <w:startOverride w:val="1"/>
     </w:lvlOverride>
   </w:num>
-  <w:num w:numId="15" w16cid:durableId="344674990">
+  <w:num w:numId="15" w16cid:durableId="176240801">
     <w:abstractNumId w:val="7"/>
     <w:lvlOverride w:ilvl="0">
       <w:startOverride w:val="1"/>
     </w:lvlOverride>
   </w:num>
-  <w:num w:numId="16" w16cid:durableId="922684153">
+  <w:num w:numId="16" w16cid:durableId="2069918057">
     <w:abstractNumId w:val="7"/>
     <w:lvlOverride w:ilvl="0">
       <w:startOverride w:val="1"/>
     </w:lvlOverride>
   </w:num>
-  <w:num w:numId="17" w16cid:durableId="781729086">
+  <w:num w:numId="17" w16cid:durableId="1308511447">
     <w:abstractNumId w:val="7"/>
     <w:lvlOverride w:ilvl="0">
       <w:startOverride w:val="1"/>

</xml_diff>

<commit_message>
Round 20o: replace the NSL-KDD calibration figure with the real ECE (0.209651)
</commit_message>
<xml_diff>
--- a/重构版论文_v4_20260915/English_SCI_Manuscript_v4.docx
+++ b/重构版论文_v4_20260915/English_SCI_Manuscript_v4.docx
@@ -1035,7 +1035,7 @@
           <w:noProof/>
         </w:rPr>
         <w:drawing>
-          <wp:inline distT="0" distB="0" distL="0" distR="0" wp14:anchorId="3C840F47" wp14:editId="314AECD0">
+          <wp:inline distT="0" distB="0" distL="0" distR="0" wp14:anchorId="719A85DF" wp14:editId="500EBA31">
             <wp:extent cx="5760720" cy="2734826"/>
             <wp:effectExtent l="0" t="0" r="0" b="0"/>
             <wp:docPr id="1" name="Picture 1"/>
@@ -2393,7 +2393,7 @@
           <w:noProof/>
         </w:rPr>
         <w:drawing>
-          <wp:inline distT="0" distB="0" distL="0" distR="0" wp14:anchorId="226BAF1F" wp14:editId="1829FDA6">
+          <wp:inline distT="0" distB="0" distL="0" distR="0" wp14:anchorId="6009BF24" wp14:editId="70F6C402">
             <wp:extent cx="5760720" cy="2722098"/>
             <wp:effectExtent l="0" t="0" r="0" b="0"/>
             <wp:docPr id="2" name="Picture 2"/>
@@ -3381,7 +3381,7 @@
           <w:noProof/>
         </w:rPr>
         <w:drawing>
-          <wp:inline distT="0" distB="0" distL="0" distR="0" wp14:anchorId="1DF4846D" wp14:editId="48890923">
+          <wp:inline distT="0" distB="0" distL="0" distR="0" wp14:anchorId="45CA6B33" wp14:editId="017F61B7">
             <wp:extent cx="5760720" cy="3482709"/>
             <wp:effectExtent l="0" t="0" r="0" b="0"/>
             <wp:docPr id="3" name="Picture 3"/>
@@ -7120,7 +7120,7 @@
           <w:noProof/>
         </w:rPr>
         <w:drawing>
-          <wp:inline distT="0" distB="0" distL="0" distR="0" wp14:anchorId="4C305EC1" wp14:editId="76AFE030">
+          <wp:inline distT="0" distB="0" distL="0" distR="0" wp14:anchorId="0ED46953" wp14:editId="05D93F58">
             <wp:extent cx="5760720" cy="2356272"/>
             <wp:effectExtent l="0" t="0" r="0" b="0"/>
             <wp:docPr id="4" name="Picture 4"/>
@@ -8077,7 +8077,7 @@
         </w:rPr>
         <w:lastRenderedPageBreak/>
         <w:drawing>
-          <wp:inline distT="0" distB="0" distL="0" distR="0" wp14:anchorId="5438759E" wp14:editId="150502B2">
+          <wp:inline distT="0" distB="0" distL="0" distR="0" wp14:anchorId="7A5FB5B2" wp14:editId="44CA61FE">
             <wp:extent cx="5760720" cy="2045294"/>
             <wp:effectExtent l="0" t="0" r="0" b="0"/>
             <wp:docPr id="5" name="Picture 5"/>
@@ -8252,7 +8252,7 @@
         </w:rPr>
         <w:lastRenderedPageBreak/>
         <w:drawing>
-          <wp:inline distT="0" distB="0" distL="0" distR="0" wp14:anchorId="7C452766" wp14:editId="040571DD">
+          <wp:inline distT="0" distB="0" distL="0" distR="0" wp14:anchorId="231E13EF" wp14:editId="53EF7650">
             <wp:extent cx="5760720" cy="2308234"/>
             <wp:effectExtent l="0" t="0" r="0" b="0"/>
             <wp:docPr id="6" name="Picture 6"/>
@@ -8984,7 +8984,7 @@
         </w:rPr>
         <w:lastRenderedPageBreak/>
         <w:drawing>
-          <wp:inline distT="0" distB="0" distL="0" distR="0" wp14:anchorId="5FEDDDDC" wp14:editId="43653210">
+          <wp:inline distT="0" distB="0" distL="0" distR="0" wp14:anchorId="249AC7A3" wp14:editId="60E97342">
             <wp:extent cx="5760720" cy="2167923"/>
             <wp:effectExtent l="0" t="0" r="0" b="0"/>
             <wp:docPr id="7" name="Picture 7"/>
@@ -9092,7 +9092,7 @@
           <w:noProof/>
         </w:rPr>
         <w:drawing>
-          <wp:inline distT="0" distB="0" distL="0" distR="0" wp14:anchorId="1C3E744B" wp14:editId="23002AFA">
+          <wp:inline distT="0" distB="0" distL="0" distR="0" wp14:anchorId="76F789E8" wp14:editId="11728ECF">
             <wp:extent cx="5760720" cy="2258878"/>
             <wp:effectExtent l="0" t="0" r="0" b="0"/>
             <wp:docPr id="8" name="Picture 8"/>
@@ -9276,7 +9276,7 @@
           <w:noProof/>
         </w:rPr>
         <w:drawing>
-          <wp:inline distT="0" distB="0" distL="0" distR="0" wp14:anchorId="587D8878" wp14:editId="62E940A7">
+          <wp:inline distT="0" distB="0" distL="0" distR="0" wp14:anchorId="72DD42AF" wp14:editId="2D542937">
             <wp:extent cx="5760720" cy="2516852"/>
             <wp:effectExtent l="0" t="0" r="0" b="0"/>
             <wp:docPr id="9" name="Picture 9"/>
@@ -9334,7 +9334,7 @@
         <w:t>NSL-KDD.</w:t>
       </w:r>
       <w:r>
-        <w:t xml:space="preserve"> Averaged over three seeds, RCCF reaches 0.747960 accuracy, 0.492837 balanced accuracy and 0.514697 Macro-F1, with a Log Loss of 1.6802, ECE of 0.4819 and coverage of 0.6198. The coverage figure means that roughly 38% of samples are rejected as </w:t>
+        <w:t xml:space="preserve"> Averaged over three seeds, RCCF reaches 0.747960 accuracy, 0.492837 balanced accuracy and 0.514697 Macro-F1, with a Log Loss of 1.6802, ECE of 0.209651 and coverage of 0.6198. The coverage figure means that roughly 38% of samples are rejected as </w:t>
       </w:r>
       <w:r>
         <w:rPr>
@@ -9413,7 +9413,7 @@
           <w:noProof/>
         </w:rPr>
         <w:drawing>
-          <wp:inline distT="0" distB="0" distL="0" distR="0" wp14:anchorId="29623770" wp14:editId="37F58553">
+          <wp:inline distT="0" distB="0" distL="0" distR="0" wp14:anchorId="10BDDD5A" wp14:editId="5EE18C47">
             <wp:extent cx="5760720" cy="2223311"/>
             <wp:effectExtent l="0" t="0" r="0" b="0"/>
             <wp:docPr id="10" name="Picture 10"/>
@@ -9503,7 +9503,7 @@
           <w:noProof/>
         </w:rPr>
         <w:drawing>
-          <wp:inline distT="0" distB="0" distL="0" distR="0" wp14:anchorId="61089F7C" wp14:editId="22DB4C30">
+          <wp:inline distT="0" distB="0" distL="0" distR="0" wp14:anchorId="0DCF5DAE" wp14:editId="6749A68A">
             <wp:extent cx="5760720" cy="2538527"/>
             <wp:effectExtent l="0" t="0" r="0" b="0"/>
             <wp:docPr id="11" name="Picture 11"/>
@@ -13442,76 +13442,76 @@
       </w:rPr>
     </w:lvl>
   </w:abstractNum>
-  <w:num w:numId="1" w16cid:durableId="1078019015">
+  <w:num w:numId="1" w16cid:durableId="1286036916">
     <w:abstractNumId w:val="8"/>
   </w:num>
-  <w:num w:numId="2" w16cid:durableId="1770854630">
+  <w:num w:numId="2" w16cid:durableId="1759792259">
     <w:abstractNumId w:val="6"/>
   </w:num>
-  <w:num w:numId="3" w16cid:durableId="67272403">
+  <w:num w:numId="3" w16cid:durableId="627009944">
     <w:abstractNumId w:val="5"/>
   </w:num>
-  <w:num w:numId="4" w16cid:durableId="970553561">
+  <w:num w:numId="4" w16cid:durableId="921988856">
     <w:abstractNumId w:val="4"/>
   </w:num>
-  <w:num w:numId="5" w16cid:durableId="722169495">
+  <w:num w:numId="5" w16cid:durableId="22681148">
     <w:abstractNumId w:val="7"/>
   </w:num>
-  <w:num w:numId="6" w16cid:durableId="268632134">
+  <w:num w:numId="6" w16cid:durableId="870070871">
     <w:abstractNumId w:val="3"/>
   </w:num>
-  <w:num w:numId="7" w16cid:durableId="1428696288">
+  <w:num w:numId="7" w16cid:durableId="377702386">
     <w:abstractNumId w:val="2"/>
   </w:num>
-  <w:num w:numId="8" w16cid:durableId="1397120550">
+  <w:num w:numId="8" w16cid:durableId="1030571292">
     <w:abstractNumId w:val="1"/>
   </w:num>
-  <w:num w:numId="9" w16cid:durableId="1234197651">
+  <w:num w:numId="9" w16cid:durableId="58673013">
     <w:abstractNumId w:val="0"/>
   </w:num>
-  <w:num w:numId="10" w16cid:durableId="1974821219">
+  <w:num w:numId="10" w16cid:durableId="1376200318">
     <w:abstractNumId w:val="7"/>
     <w:lvlOverride w:ilvl="0">
       <w:startOverride w:val="1"/>
     </w:lvlOverride>
   </w:num>
-  <w:num w:numId="11" w16cid:durableId="1782677335">
+  <w:num w:numId="11" w16cid:durableId="280111581">
     <w:abstractNumId w:val="7"/>
     <w:lvlOverride w:ilvl="0">
       <w:startOverride w:val="1"/>
     </w:lvlOverride>
   </w:num>
-  <w:num w:numId="12" w16cid:durableId="265309708">
+  <w:num w:numId="12" w16cid:durableId="213083802">
     <w:abstractNumId w:val="7"/>
     <w:lvlOverride w:ilvl="0">
       <w:startOverride w:val="1"/>
     </w:lvlOverride>
   </w:num>
-  <w:num w:numId="13" w16cid:durableId="1446339692">
+  <w:num w:numId="13" w16cid:durableId="76634981">
     <w:abstractNumId w:val="7"/>
     <w:lvlOverride w:ilvl="0">
       <w:startOverride w:val="1"/>
     </w:lvlOverride>
   </w:num>
-  <w:num w:numId="14" w16cid:durableId="1814177547">
+  <w:num w:numId="14" w16cid:durableId="1201819138">
     <w:abstractNumId w:val="7"/>
     <w:lvlOverride w:ilvl="0">
       <w:startOverride w:val="1"/>
     </w:lvlOverride>
   </w:num>
-  <w:num w:numId="15" w16cid:durableId="176240801">
+  <w:num w:numId="15" w16cid:durableId="194389061">
     <w:abstractNumId w:val="7"/>
     <w:lvlOverride w:ilvl="0">
       <w:startOverride w:val="1"/>
     </w:lvlOverride>
   </w:num>
-  <w:num w:numId="16" w16cid:durableId="2069918057">
+  <w:num w:numId="16" w16cid:durableId="281112307">
     <w:abstractNumId w:val="7"/>
     <w:lvlOverride w:ilvl="0">
       <w:startOverride w:val="1"/>
     </w:lvlOverride>
   </w:num>
-  <w:num w:numId="17" w16cid:durableId="1308511447">
+  <w:num w:numId="17" w16cid:durableId="866452563">
     <w:abstractNumId w:val="7"/>
     <w:lvlOverride w:ilvl="0">
       <w:startOverride w:val="1"/>

</xml_diff>

<commit_message>
Round 20p: make Table 6 match the released diversity suite at the printed precision
</commit_message>
<xml_diff>
--- a/重构版论文_v4_20260915/English_SCI_Manuscript_v4.docx
+++ b/重构版论文_v4_20260915/English_SCI_Manuscript_v4.docx
@@ -1035,7 +1035,7 @@
           <w:noProof/>
         </w:rPr>
         <w:drawing>
-          <wp:inline distT="0" distB="0" distL="0" distR="0" wp14:anchorId="719A85DF" wp14:editId="500EBA31">
+          <wp:inline distT="0" distB="0" distL="0" distR="0" wp14:anchorId="08E92121" wp14:editId="72A89FD7">
             <wp:extent cx="5760720" cy="2734826"/>
             <wp:effectExtent l="0" t="0" r="0" b="0"/>
             <wp:docPr id="1" name="Picture 1"/>
@@ -2393,7 +2393,7 @@
           <w:noProof/>
         </w:rPr>
         <w:drawing>
-          <wp:inline distT="0" distB="0" distL="0" distR="0" wp14:anchorId="6009BF24" wp14:editId="70F6C402">
+          <wp:inline distT="0" distB="0" distL="0" distR="0" wp14:anchorId="4A08E56E" wp14:editId="52567D35">
             <wp:extent cx="5760720" cy="2722098"/>
             <wp:effectExtent l="0" t="0" r="0" b="0"/>
             <wp:docPr id="2" name="Picture 2"/>
@@ -3381,7 +3381,7 @@
           <w:noProof/>
         </w:rPr>
         <w:drawing>
-          <wp:inline distT="0" distB="0" distL="0" distR="0" wp14:anchorId="45CA6B33" wp14:editId="017F61B7">
+          <wp:inline distT="0" distB="0" distL="0" distR="0" wp14:anchorId="5B0E48B2" wp14:editId="4E07CAD3">
             <wp:extent cx="5760720" cy="3482709"/>
             <wp:effectExtent l="0" t="0" r="0" b="0"/>
             <wp:docPr id="3" name="Picture 3"/>
@@ -7120,7 +7120,7 @@
           <w:noProof/>
         </w:rPr>
         <w:drawing>
-          <wp:inline distT="0" distB="0" distL="0" distR="0" wp14:anchorId="0ED46953" wp14:editId="05D93F58">
+          <wp:inline distT="0" distB="0" distL="0" distR="0" wp14:anchorId="1BFCEBA7" wp14:editId="50E927D4">
             <wp:extent cx="5760720" cy="2356272"/>
             <wp:effectExtent l="0" t="0" r="0" b="0"/>
             <wp:docPr id="4" name="Picture 4"/>
@@ -8077,7 +8077,7 @@
         </w:rPr>
         <w:lastRenderedPageBreak/>
         <w:drawing>
-          <wp:inline distT="0" distB="0" distL="0" distR="0" wp14:anchorId="7A5FB5B2" wp14:editId="44CA61FE">
+          <wp:inline distT="0" distB="0" distL="0" distR="0" wp14:anchorId="1BA9D8C5" wp14:editId="5DEDAE7E">
             <wp:extent cx="5760720" cy="2045294"/>
             <wp:effectExtent l="0" t="0" r="0" b="0"/>
             <wp:docPr id="5" name="Picture 5"/>
@@ -8252,7 +8252,7 @@
         </w:rPr>
         <w:lastRenderedPageBreak/>
         <w:drawing>
-          <wp:inline distT="0" distB="0" distL="0" distR="0" wp14:anchorId="231E13EF" wp14:editId="53EF7650">
+          <wp:inline distT="0" distB="0" distL="0" distR="0" wp14:anchorId="024C0912" wp14:editId="3A049D3B">
             <wp:extent cx="5760720" cy="2308234"/>
             <wp:effectExtent l="0" t="0" r="0" b="0"/>
             <wp:docPr id="6" name="Picture 6"/>
@@ -8523,7 +8523,7 @@
               <w:rPr>
                 <w:sz w:val="16"/>
               </w:rPr>
-              <w:t>0.978</w:t>
+              <w:t>0.979</w:t>
             </w:r>
           </w:p>
         </w:tc>
@@ -8915,7 +8915,7 @@
               <w:rPr>
                 <w:sz w:val="16"/>
               </w:rPr>
-              <w:t>0.506</w:t>
+              <w:t>0.507</w:t>
             </w:r>
           </w:p>
         </w:tc>
@@ -8931,7 +8931,7 @@
               <w:rPr>
                 <w:sz w:val="16"/>
               </w:rPr>
-              <w:t>0.99548</w:t>
+              <w:t>0.99549</w:t>
             </w:r>
           </w:p>
         </w:tc>
@@ -8984,7 +8984,7 @@
         </w:rPr>
         <w:lastRenderedPageBreak/>
         <w:drawing>
-          <wp:inline distT="0" distB="0" distL="0" distR="0" wp14:anchorId="249AC7A3" wp14:editId="60E97342">
+          <wp:inline distT="0" distB="0" distL="0" distR="0" wp14:anchorId="5E10A1EC" wp14:editId="3F20C223">
             <wp:extent cx="5760720" cy="2167923"/>
             <wp:effectExtent l="0" t="0" r="0" b="0"/>
             <wp:docPr id="7" name="Picture 7"/>
@@ -9092,7 +9092,7 @@
           <w:noProof/>
         </w:rPr>
         <w:drawing>
-          <wp:inline distT="0" distB="0" distL="0" distR="0" wp14:anchorId="76F789E8" wp14:editId="11728ECF">
+          <wp:inline distT="0" distB="0" distL="0" distR="0" wp14:anchorId="66C485AA" wp14:editId="1C48B981">
             <wp:extent cx="5760720" cy="2258878"/>
             <wp:effectExtent l="0" t="0" r="0" b="0"/>
             <wp:docPr id="8" name="Picture 8"/>
@@ -9276,7 +9276,7 @@
           <w:noProof/>
         </w:rPr>
         <w:drawing>
-          <wp:inline distT="0" distB="0" distL="0" distR="0" wp14:anchorId="72DD42AF" wp14:editId="2D542937">
+          <wp:inline distT="0" distB="0" distL="0" distR="0" wp14:anchorId="2D014F2C" wp14:editId="26472580">
             <wp:extent cx="5760720" cy="2516852"/>
             <wp:effectExtent l="0" t="0" r="0" b="0"/>
             <wp:docPr id="9" name="Picture 9"/>
@@ -9413,7 +9413,7 @@
           <w:noProof/>
         </w:rPr>
         <w:drawing>
-          <wp:inline distT="0" distB="0" distL="0" distR="0" wp14:anchorId="10BDDD5A" wp14:editId="5EE18C47">
+          <wp:inline distT="0" distB="0" distL="0" distR="0" wp14:anchorId="1276632A" wp14:editId="62C6F68E">
             <wp:extent cx="5760720" cy="2223311"/>
             <wp:effectExtent l="0" t="0" r="0" b="0"/>
             <wp:docPr id="10" name="Picture 10"/>
@@ -9503,7 +9503,7 @@
           <w:noProof/>
         </w:rPr>
         <w:drawing>
-          <wp:inline distT="0" distB="0" distL="0" distR="0" wp14:anchorId="0DCF5DAE" wp14:editId="6749A68A">
+          <wp:inline distT="0" distB="0" distL="0" distR="0" wp14:anchorId="05ED9D8D" wp14:editId="07C1D649">
             <wp:extent cx="5760720" cy="2538527"/>
             <wp:effectExtent l="0" t="0" r="0" b="0"/>
             <wp:docPr id="11" name="Picture 11"/>
@@ -13442,76 +13442,76 @@
       </w:rPr>
     </w:lvl>
   </w:abstractNum>
-  <w:num w:numId="1" w16cid:durableId="1286036916">
+  <w:num w:numId="1" w16cid:durableId="155340706">
     <w:abstractNumId w:val="8"/>
   </w:num>
-  <w:num w:numId="2" w16cid:durableId="1759792259">
+  <w:num w:numId="2" w16cid:durableId="1864588018">
     <w:abstractNumId w:val="6"/>
   </w:num>
-  <w:num w:numId="3" w16cid:durableId="627009944">
+  <w:num w:numId="3" w16cid:durableId="2111854243">
     <w:abstractNumId w:val="5"/>
   </w:num>
-  <w:num w:numId="4" w16cid:durableId="921988856">
+  <w:num w:numId="4" w16cid:durableId="872502468">
     <w:abstractNumId w:val="4"/>
   </w:num>
-  <w:num w:numId="5" w16cid:durableId="22681148">
+  <w:num w:numId="5" w16cid:durableId="466818298">
     <w:abstractNumId w:val="7"/>
   </w:num>
-  <w:num w:numId="6" w16cid:durableId="870070871">
+  <w:num w:numId="6" w16cid:durableId="1300644134">
     <w:abstractNumId w:val="3"/>
   </w:num>
-  <w:num w:numId="7" w16cid:durableId="377702386">
+  <w:num w:numId="7" w16cid:durableId="1794521809">
     <w:abstractNumId w:val="2"/>
   </w:num>
-  <w:num w:numId="8" w16cid:durableId="1030571292">
+  <w:num w:numId="8" w16cid:durableId="610824306">
     <w:abstractNumId w:val="1"/>
   </w:num>
-  <w:num w:numId="9" w16cid:durableId="58673013">
+  <w:num w:numId="9" w16cid:durableId="801264604">
     <w:abstractNumId w:val="0"/>
   </w:num>
-  <w:num w:numId="10" w16cid:durableId="1376200318">
+  <w:num w:numId="10" w16cid:durableId="462770066">
     <w:abstractNumId w:val="7"/>
     <w:lvlOverride w:ilvl="0">
       <w:startOverride w:val="1"/>
     </w:lvlOverride>
   </w:num>
-  <w:num w:numId="11" w16cid:durableId="280111581">
+  <w:num w:numId="11" w16cid:durableId="354307899">
     <w:abstractNumId w:val="7"/>
     <w:lvlOverride w:ilvl="0">
       <w:startOverride w:val="1"/>
     </w:lvlOverride>
   </w:num>
-  <w:num w:numId="12" w16cid:durableId="213083802">
+  <w:num w:numId="12" w16cid:durableId="2146777114">
     <w:abstractNumId w:val="7"/>
     <w:lvlOverride w:ilvl="0">
       <w:startOverride w:val="1"/>
     </w:lvlOverride>
   </w:num>
-  <w:num w:numId="13" w16cid:durableId="76634981">
+  <w:num w:numId="13" w16cid:durableId="744567760">
     <w:abstractNumId w:val="7"/>
     <w:lvlOverride w:ilvl="0">
       <w:startOverride w:val="1"/>
     </w:lvlOverride>
   </w:num>
-  <w:num w:numId="14" w16cid:durableId="1201819138">
+  <w:num w:numId="14" w16cid:durableId="1546062757">
     <w:abstractNumId w:val="7"/>
     <w:lvlOverride w:ilvl="0">
       <w:startOverride w:val="1"/>
     </w:lvlOverride>
   </w:num>
-  <w:num w:numId="15" w16cid:durableId="194389061">
+  <w:num w:numId="15" w16cid:durableId="847716668">
     <w:abstractNumId w:val="7"/>
     <w:lvlOverride w:ilvl="0">
       <w:startOverride w:val="1"/>
     </w:lvlOverride>
   </w:num>
-  <w:num w:numId="16" w16cid:durableId="281112307">
+  <w:num w:numId="16" w16cid:durableId="664626467">
     <w:abstractNumId w:val="7"/>
     <w:lvlOverride w:ilvl="0">
       <w:startOverride w:val="1"/>
     </w:lvlOverride>
   </w:num>
-  <w:num w:numId="17" w16cid:durableId="866452563">
+  <w:num w:numId="17" w16cid:durableId="754399288">
     <w:abstractNumId w:val="7"/>
     <w:lvlOverride w:ilvl="0">
       <w:startOverride w:val="1"/>

</xml_diff>

<commit_message>
Round 20z: submission-readiness pass (one author-input gap was undeclared)
The JISA hard limits all hold: abstract 249 of 250 words, seven keywords, five Highlights with the longest at 84 characters, equations (1)-(5) in order, graphical abstract 3300x2280. The content side is complete. The open items are the eight places needing author input, and one was not declared anywhere: CITATION.cff still carries 'name: Author to be completed', while the self-check table named only the manuscript CRediT placeholder (A5) and the cover-letter signature block (F9); A5 and the author-action list now name the CFF field too. The same pass found row E10 quoting the longest Highlight as 83 characters when it is 84.

scripts/check_submission_readiness_v1.py joins the gate (44 checks): it re-derives the JISA limits from the format checker and requires every remaining placeholder to be named by a 部分通过 row, so an author input can never be silently missing from the inventory.
</commit_message>
<xml_diff>
--- a/重构版论文_v4_20260915/English_SCI_Manuscript_v4.docx
+++ b/重构版论文_v4_20260915/English_SCI_Manuscript_v4.docx
@@ -1035,7 +1035,7 @@
           <w:noProof/>
         </w:rPr>
         <w:drawing>
-          <wp:inline distT="0" distB="0" distL="0" distR="0" wp14:anchorId="013107DE" wp14:editId="51078DEA">
+          <wp:inline distT="0" distB="0" distL="0" distR="0" wp14:anchorId="6469A85F" wp14:editId="446D32CE">
             <wp:extent cx="5760720" cy="2734826"/>
             <wp:effectExtent l="0" t="0" r="0" b="0"/>
             <wp:docPr id="1" name="Picture 1"/>
@@ -2393,7 +2393,7 @@
           <w:noProof/>
         </w:rPr>
         <w:drawing>
-          <wp:inline distT="0" distB="0" distL="0" distR="0" wp14:anchorId="29DC21AD" wp14:editId="7D04BCB7">
+          <wp:inline distT="0" distB="0" distL="0" distR="0" wp14:anchorId="2C42F110" wp14:editId="1F26BFB1">
             <wp:extent cx="5760720" cy="2722098"/>
             <wp:effectExtent l="0" t="0" r="0" b="0"/>
             <wp:docPr id="2" name="Picture 2"/>
@@ -3381,7 +3381,7 @@
           <w:noProof/>
         </w:rPr>
         <w:drawing>
-          <wp:inline distT="0" distB="0" distL="0" distR="0" wp14:anchorId="39C8B4A3" wp14:editId="63C6AA4D">
+          <wp:inline distT="0" distB="0" distL="0" distR="0" wp14:anchorId="2C94AAB7" wp14:editId="5E65F7E9">
             <wp:extent cx="5760720" cy="3482709"/>
             <wp:effectExtent l="0" t="0" r="0" b="0"/>
             <wp:docPr id="3" name="Picture 3"/>
@@ -4753,14 +4753,11 @@
     </w:p>
     <w:p>
       <w:r>
-        <w:t xml:space="preserve">Let n be the number of training rows, d the original feature count, k the selected feature count, T the number of trees, K the number of cross-fitting folds and Q = 4 the number of experts. The dominant cost of the cross-fitting stage is approximately O(QK T n log n), the final refit stage costs O(QT n log n), and filter selection contributes O(Q n d). </w:t>
+        <w:t xml:space="preserve">Let n be the number of training rows, d the original feature count, k the selected feature count, T the number of trees, K the number of cross-fitting folds and Q = 4 the number of experts. The dominant cost of the cross-fitting stage is approximately O(QK T n log n), the final refit stage costs O(QT n log n), and filter selection contributes O(Q n d). Inference requires one tree traversal per expert plus the risk models, about O(QT log n) per row. RCCF is therefore </w:t>
       </w:r>
       <w:r>
         <w:lastRenderedPageBreak/>
-        <w:t>Inference requires one tree traversal per expert plus the risk models, about O(QT log n) per row. RCCF is therefore substantially more expensive than a single equal-weight forest at both ends, and Section 5.6 quantifies that cost. All experiments ran on a single workstation with 8 physical cores (16 logical), 35.8 GB of RAM and Windows 10 (build 10.0.26200), using Python 3.11.4, scikit-learn 1.9.0, XGBoost 3.2.0, NumPy 2.4.6, pandas 3.0.5 and Matplotlib 3.11.1. The reported timings are single-machine measur</w:t>
-      </w:r>
-      <w:r>
-        <w:t>ements and are not portability claims. The software stack is documented in [44-47].</w:t>
+        <w:t>substantially more expensive than a single equal-weight forest at both ends, and Section 5.6 quantifies that cost. All experiments ran on a single workstation with 8 physical cores (16 logical), 35.8 GB of RAM and Windows 10 (build 10.0.26200), using Python 3.11.4, scikit-learn 1.9.0, XGBoost 3.2.0, NumPy 2.4.6, pandas 3.0.5 and Matplotlib 3.11.1. The reported timings are single-machine measurements and are not portability claims. The software stack is documented in [44-47].</w:t>
       </w:r>
     </w:p>
     <w:p>
@@ -5075,14 +5072,7 @@
               <w:rPr>
                 <w:sz w:val="16"/>
               </w:rPr>
-              <w:t xml:space="preserve">Balanced control population (three </w:t>
-            </w:r>
-            <w:r>
-              <w:rPr>
-                <w:sz w:val="16"/>
-              </w:rPr>
-              <w:lastRenderedPageBreak/>
-              <w:t>seeds)</w:t>
+              <w:t>Balanced control population (three seeds)</w:t>
             </w:r>
           </w:p>
         </w:tc>
@@ -5098,7 +5088,6 @@
               <w:rPr>
                 <w:sz w:val="16"/>
               </w:rPr>
-              <w:lastRenderedPageBreak/>
               <w:t>0.960997</w:t>
             </w:r>
           </w:p>
@@ -5150,6 +5139,7 @@
               <w:rPr>
                 <w:sz w:val="16"/>
               </w:rPr>
+              <w:lastRenderedPageBreak/>
               <w:t>Ten repeated splits (mean +/- s.d.)</w:t>
             </w:r>
           </w:p>
@@ -7130,7 +7120,7 @@
           <w:noProof/>
         </w:rPr>
         <w:drawing>
-          <wp:inline distT="0" distB="0" distL="0" distR="0" wp14:anchorId="57804B0D" wp14:editId="6FCC0DF5">
+          <wp:inline distT="0" distB="0" distL="0" distR="0" wp14:anchorId="08E47FC9" wp14:editId="41070934">
             <wp:extent cx="5760720" cy="2356272"/>
             <wp:effectExtent l="0" t="0" r="0" b="0"/>
             <wp:docPr id="4" name="Picture 4"/>
@@ -8087,7 +8077,7 @@
         </w:rPr>
         <w:lastRenderedPageBreak/>
         <w:drawing>
-          <wp:inline distT="0" distB="0" distL="0" distR="0" wp14:anchorId="024060DA" wp14:editId="7AD02D96">
+          <wp:inline distT="0" distB="0" distL="0" distR="0" wp14:anchorId="45F8D8CC" wp14:editId="76A1D9D4">
             <wp:extent cx="5760720" cy="2045294"/>
             <wp:effectExtent l="0" t="0" r="0" b="0"/>
             <wp:docPr id="5" name="Picture 5"/>
@@ -8262,7 +8252,7 @@
         </w:rPr>
         <w:lastRenderedPageBreak/>
         <w:drawing>
-          <wp:inline distT="0" distB="0" distL="0" distR="0" wp14:anchorId="1F71BBA6" wp14:editId="693885ED">
+          <wp:inline distT="0" distB="0" distL="0" distR="0" wp14:anchorId="3A2EA469" wp14:editId="2A661681">
             <wp:extent cx="5760720" cy="2308234"/>
             <wp:effectExtent l="0" t="0" r="0" b="0"/>
             <wp:docPr id="6" name="Picture 6"/>
@@ -8994,7 +8984,7 @@
         </w:rPr>
         <w:lastRenderedPageBreak/>
         <w:drawing>
-          <wp:inline distT="0" distB="0" distL="0" distR="0" wp14:anchorId="3876BEE6" wp14:editId="3E864350">
+          <wp:inline distT="0" distB="0" distL="0" distR="0" wp14:anchorId="297A1BD8" wp14:editId="4C8B0429">
             <wp:extent cx="5760720" cy="2167923"/>
             <wp:effectExtent l="0" t="0" r="0" b="0"/>
             <wp:docPr id="7" name="Picture 7"/>
@@ -9102,7 +9092,7 @@
           <w:noProof/>
         </w:rPr>
         <w:drawing>
-          <wp:inline distT="0" distB="0" distL="0" distR="0" wp14:anchorId="3FD13206" wp14:editId="5778E17A">
+          <wp:inline distT="0" distB="0" distL="0" distR="0" wp14:anchorId="0C2B78CE" wp14:editId="7AC63D7D">
             <wp:extent cx="5760720" cy="2258878"/>
             <wp:effectExtent l="0" t="0" r="0" b="0"/>
             <wp:docPr id="8" name="Picture 8"/>
@@ -9286,7 +9276,7 @@
           <w:noProof/>
         </w:rPr>
         <w:drawing>
-          <wp:inline distT="0" distB="0" distL="0" distR="0" wp14:anchorId="536EE23B" wp14:editId="5FE9D443">
+          <wp:inline distT="0" distB="0" distL="0" distR="0" wp14:anchorId="2231EFA1" wp14:editId="70C2B9D8">
             <wp:extent cx="5760720" cy="2516852"/>
             <wp:effectExtent l="0" t="0" r="0" b="0"/>
             <wp:docPr id="9" name="Picture 9"/>
@@ -9423,7 +9413,7 @@
           <w:noProof/>
         </w:rPr>
         <w:drawing>
-          <wp:inline distT="0" distB="0" distL="0" distR="0" wp14:anchorId="2880FE96" wp14:editId="77B377B6">
+          <wp:inline distT="0" distB="0" distL="0" distR="0" wp14:anchorId="796082CF" wp14:editId="06873C69">
             <wp:extent cx="5760720" cy="2223311"/>
             <wp:effectExtent l="0" t="0" r="0" b="0"/>
             <wp:docPr id="10" name="Picture 10"/>
@@ -9513,7 +9503,7 @@
           <w:noProof/>
         </w:rPr>
         <w:drawing>
-          <wp:inline distT="0" distB="0" distL="0" distR="0" wp14:anchorId="3B047C4D" wp14:editId="36216120">
+          <wp:inline distT="0" distB="0" distL="0" distR="0" wp14:anchorId="0D252957" wp14:editId="65AFB3FD">
             <wp:extent cx="5760720" cy="2538527"/>
             <wp:effectExtent l="0" t="0" r="0" b="0"/>
             <wp:docPr id="11" name="Picture 11"/>
@@ -13548,76 +13538,76 @@
       </w:rPr>
     </w:lvl>
   </w:abstractNum>
-  <w:num w:numId="1" w16cid:durableId="577399538">
+  <w:num w:numId="1" w16cid:durableId="291710400">
     <w:abstractNumId w:val="8"/>
   </w:num>
-  <w:num w:numId="2" w16cid:durableId="1824853794">
+  <w:num w:numId="2" w16cid:durableId="1343967432">
     <w:abstractNumId w:val="6"/>
   </w:num>
-  <w:num w:numId="3" w16cid:durableId="1129395843">
+  <w:num w:numId="3" w16cid:durableId="220601355">
     <w:abstractNumId w:val="5"/>
   </w:num>
-  <w:num w:numId="4" w16cid:durableId="736057126">
+  <w:num w:numId="4" w16cid:durableId="1385593147">
     <w:abstractNumId w:val="4"/>
   </w:num>
-  <w:num w:numId="5" w16cid:durableId="1388606617">
+  <w:num w:numId="5" w16cid:durableId="1210872198">
     <w:abstractNumId w:val="7"/>
   </w:num>
-  <w:num w:numId="6" w16cid:durableId="1068378791">
+  <w:num w:numId="6" w16cid:durableId="682630213">
     <w:abstractNumId w:val="3"/>
   </w:num>
-  <w:num w:numId="7" w16cid:durableId="256325679">
+  <w:num w:numId="7" w16cid:durableId="1783843735">
     <w:abstractNumId w:val="2"/>
   </w:num>
-  <w:num w:numId="8" w16cid:durableId="1790320327">
+  <w:num w:numId="8" w16cid:durableId="373234035">
     <w:abstractNumId w:val="1"/>
   </w:num>
-  <w:num w:numId="9" w16cid:durableId="325669954">
+  <w:num w:numId="9" w16cid:durableId="691034383">
     <w:abstractNumId w:val="0"/>
   </w:num>
-  <w:num w:numId="10" w16cid:durableId="1060252109">
+  <w:num w:numId="10" w16cid:durableId="1310785714">
     <w:abstractNumId w:val="7"/>
     <w:lvlOverride w:ilvl="0">
       <w:startOverride w:val="1"/>
     </w:lvlOverride>
   </w:num>
-  <w:num w:numId="11" w16cid:durableId="1856071557">
+  <w:num w:numId="11" w16cid:durableId="1599291092">
     <w:abstractNumId w:val="7"/>
     <w:lvlOverride w:ilvl="0">
       <w:startOverride w:val="1"/>
     </w:lvlOverride>
   </w:num>
-  <w:num w:numId="12" w16cid:durableId="776172535">
+  <w:num w:numId="12" w16cid:durableId="1152527242">
     <w:abstractNumId w:val="7"/>
     <w:lvlOverride w:ilvl="0">
       <w:startOverride w:val="1"/>
     </w:lvlOverride>
   </w:num>
-  <w:num w:numId="13" w16cid:durableId="1909723964">
+  <w:num w:numId="13" w16cid:durableId="933632533">
     <w:abstractNumId w:val="7"/>
     <w:lvlOverride w:ilvl="0">
       <w:startOverride w:val="1"/>
     </w:lvlOverride>
   </w:num>
-  <w:num w:numId="14" w16cid:durableId="622810234">
+  <w:num w:numId="14" w16cid:durableId="350422021">
     <w:abstractNumId w:val="7"/>
     <w:lvlOverride w:ilvl="0">
       <w:startOverride w:val="1"/>
     </w:lvlOverride>
   </w:num>
-  <w:num w:numId="15" w16cid:durableId="191890915">
+  <w:num w:numId="15" w16cid:durableId="328218661">
     <w:abstractNumId w:val="7"/>
     <w:lvlOverride w:ilvl="0">
       <w:startOverride w:val="1"/>
     </w:lvlOverride>
   </w:num>
-  <w:num w:numId="16" w16cid:durableId="1484392863">
+  <w:num w:numId="16" w16cid:durableId="401759803">
     <w:abstractNumId w:val="7"/>
     <w:lvlOverride w:ilvl="0">
       <w:startOverride w:val="1"/>
     </w:lvlOverride>
   </w:num>
-  <w:num w:numId="17" w16cid:durableId="145511873">
+  <w:num w:numId="17" w16cid:durableId="1689216978">
     <w:abstractNumId w:val="7"/>
     <w:lvlOverride w:ilvl="0">
       <w:startOverride w:val="1"/>

</xml_diff>

<commit_message>
Round 20ad: the work log ships as Word, with the per-round operating procedure
The log moved beside the other deliverables in 重构版论文_v4_20260915/, the builder grew a 'worklog' job so build_restructured_manuscript_v4.py --only all regenerates it with the rest, the DOCX freshness check now requires it to carry the current guard count and round ledger, and the numbering check covers its numbered list. A new section 八 records the fixed seven-step procedure each round follows: status check, one rotation item, evidence-backed fix written as an assertion-anchored script, artefact rebuild, gate, release, and the reporting rule.

The log is now 225 lines and travels in the package as both Markdown and Word under 06_研究与写作方案 (138 files, 8.52 MB). Gate 45 checks green.
</commit_message>
<xml_diff>
--- a/重构版论文_v4_20260915/English_SCI_Manuscript_v4.docx
+++ b/重构版论文_v4_20260915/English_SCI_Manuscript_v4.docx
@@ -1035,7 +1035,7 @@
           <w:noProof/>
         </w:rPr>
         <w:drawing>
-          <wp:inline distT="0" distB="0" distL="0" distR="0" wp14:anchorId="6469A85F" wp14:editId="446D32CE">
+          <wp:inline distT="0" distB="0" distL="0" distR="0" wp14:anchorId="3390BB4D" wp14:editId="526E4360">
             <wp:extent cx="5760720" cy="2734826"/>
             <wp:effectExtent l="0" t="0" r="0" b="0"/>
             <wp:docPr id="1" name="Picture 1"/>
@@ -2393,7 +2393,7 @@
           <w:noProof/>
         </w:rPr>
         <w:drawing>
-          <wp:inline distT="0" distB="0" distL="0" distR="0" wp14:anchorId="2C42F110" wp14:editId="1F26BFB1">
+          <wp:inline distT="0" distB="0" distL="0" distR="0" wp14:anchorId="6B1BA1E0" wp14:editId="1E1DECB6">
             <wp:extent cx="5760720" cy="2722098"/>
             <wp:effectExtent l="0" t="0" r="0" b="0"/>
             <wp:docPr id="2" name="Picture 2"/>
@@ -3381,7 +3381,7 @@
           <w:noProof/>
         </w:rPr>
         <w:drawing>
-          <wp:inline distT="0" distB="0" distL="0" distR="0" wp14:anchorId="2C94AAB7" wp14:editId="5E65F7E9">
+          <wp:inline distT="0" distB="0" distL="0" distR="0" wp14:anchorId="7D0ECFF7" wp14:editId="3C4D2C5E">
             <wp:extent cx="5760720" cy="3482709"/>
             <wp:effectExtent l="0" t="0" r="0" b="0"/>
             <wp:docPr id="3" name="Picture 3"/>
@@ -7120,7 +7120,7 @@
           <w:noProof/>
         </w:rPr>
         <w:drawing>
-          <wp:inline distT="0" distB="0" distL="0" distR="0" wp14:anchorId="08E47FC9" wp14:editId="41070934">
+          <wp:inline distT="0" distB="0" distL="0" distR="0" wp14:anchorId="77ABF2E1" wp14:editId="1A918EB0">
             <wp:extent cx="5760720" cy="2356272"/>
             <wp:effectExtent l="0" t="0" r="0" b="0"/>
             <wp:docPr id="4" name="Picture 4"/>
@@ -8077,7 +8077,7 @@
         </w:rPr>
         <w:lastRenderedPageBreak/>
         <w:drawing>
-          <wp:inline distT="0" distB="0" distL="0" distR="0" wp14:anchorId="45F8D8CC" wp14:editId="76A1D9D4">
+          <wp:inline distT="0" distB="0" distL="0" distR="0" wp14:anchorId="5D1BAD9C" wp14:editId="09E011F1">
             <wp:extent cx="5760720" cy="2045294"/>
             <wp:effectExtent l="0" t="0" r="0" b="0"/>
             <wp:docPr id="5" name="Picture 5"/>
@@ -8252,7 +8252,7 @@
         </w:rPr>
         <w:lastRenderedPageBreak/>
         <w:drawing>
-          <wp:inline distT="0" distB="0" distL="0" distR="0" wp14:anchorId="3A2EA469" wp14:editId="2A661681">
+          <wp:inline distT="0" distB="0" distL="0" distR="0" wp14:anchorId="741CFCFA" wp14:editId="1721E607">
             <wp:extent cx="5760720" cy="2308234"/>
             <wp:effectExtent l="0" t="0" r="0" b="0"/>
             <wp:docPr id="6" name="Picture 6"/>
@@ -8984,7 +8984,7 @@
         </w:rPr>
         <w:lastRenderedPageBreak/>
         <w:drawing>
-          <wp:inline distT="0" distB="0" distL="0" distR="0" wp14:anchorId="297A1BD8" wp14:editId="4C8B0429">
+          <wp:inline distT="0" distB="0" distL="0" distR="0" wp14:anchorId="0A8260E7" wp14:editId="46CC46E6">
             <wp:extent cx="5760720" cy="2167923"/>
             <wp:effectExtent l="0" t="0" r="0" b="0"/>
             <wp:docPr id="7" name="Picture 7"/>
@@ -9092,7 +9092,7 @@
           <w:noProof/>
         </w:rPr>
         <w:drawing>
-          <wp:inline distT="0" distB="0" distL="0" distR="0" wp14:anchorId="0C2B78CE" wp14:editId="7AC63D7D">
+          <wp:inline distT="0" distB="0" distL="0" distR="0" wp14:anchorId="25C8BC40" wp14:editId="20EA9CCC">
             <wp:extent cx="5760720" cy="2258878"/>
             <wp:effectExtent l="0" t="0" r="0" b="0"/>
             <wp:docPr id="8" name="Picture 8"/>
@@ -9276,7 +9276,7 @@
           <w:noProof/>
         </w:rPr>
         <w:drawing>
-          <wp:inline distT="0" distB="0" distL="0" distR="0" wp14:anchorId="2231EFA1" wp14:editId="70C2B9D8">
+          <wp:inline distT="0" distB="0" distL="0" distR="0" wp14:anchorId="638E04C4" wp14:editId="5A59B80E">
             <wp:extent cx="5760720" cy="2516852"/>
             <wp:effectExtent l="0" t="0" r="0" b="0"/>
             <wp:docPr id="9" name="Picture 9"/>
@@ -9413,7 +9413,7 @@
           <w:noProof/>
         </w:rPr>
         <w:drawing>
-          <wp:inline distT="0" distB="0" distL="0" distR="0" wp14:anchorId="796082CF" wp14:editId="06873C69">
+          <wp:inline distT="0" distB="0" distL="0" distR="0" wp14:anchorId="3EF6DDA8" wp14:editId="1FA25771">
             <wp:extent cx="5760720" cy="2223311"/>
             <wp:effectExtent l="0" t="0" r="0" b="0"/>
             <wp:docPr id="10" name="Picture 10"/>
@@ -9503,7 +9503,7 @@
           <w:noProof/>
         </w:rPr>
         <w:drawing>
-          <wp:inline distT="0" distB="0" distL="0" distR="0" wp14:anchorId="0D252957" wp14:editId="65AFB3FD">
+          <wp:inline distT="0" distB="0" distL="0" distR="0" wp14:anchorId="3201429F" wp14:editId="7565ACEB">
             <wp:extent cx="5760720" cy="2538527"/>
             <wp:effectExtent l="0" t="0" r="0" b="0"/>
             <wp:docPr id="11" name="Picture 11"/>
@@ -13538,76 +13538,76 @@
       </w:rPr>
     </w:lvl>
   </w:abstractNum>
-  <w:num w:numId="1" w16cid:durableId="291710400">
+  <w:num w:numId="1" w16cid:durableId="619148267">
     <w:abstractNumId w:val="8"/>
   </w:num>
-  <w:num w:numId="2" w16cid:durableId="1343967432">
+  <w:num w:numId="2" w16cid:durableId="1391920841">
     <w:abstractNumId w:val="6"/>
   </w:num>
-  <w:num w:numId="3" w16cid:durableId="220601355">
+  <w:num w:numId="3" w16cid:durableId="1058624563">
     <w:abstractNumId w:val="5"/>
   </w:num>
-  <w:num w:numId="4" w16cid:durableId="1385593147">
+  <w:num w:numId="4" w16cid:durableId="1148086793">
     <w:abstractNumId w:val="4"/>
   </w:num>
-  <w:num w:numId="5" w16cid:durableId="1210872198">
+  <w:num w:numId="5" w16cid:durableId="401491358">
     <w:abstractNumId w:val="7"/>
   </w:num>
-  <w:num w:numId="6" w16cid:durableId="682630213">
+  <w:num w:numId="6" w16cid:durableId="1476876979">
     <w:abstractNumId w:val="3"/>
   </w:num>
-  <w:num w:numId="7" w16cid:durableId="1783843735">
+  <w:num w:numId="7" w16cid:durableId="1445075101">
     <w:abstractNumId w:val="2"/>
   </w:num>
-  <w:num w:numId="8" w16cid:durableId="373234035">
+  <w:num w:numId="8" w16cid:durableId="985814226">
     <w:abstractNumId w:val="1"/>
   </w:num>
-  <w:num w:numId="9" w16cid:durableId="691034383">
+  <w:num w:numId="9" w16cid:durableId="2010674545">
     <w:abstractNumId w:val="0"/>
   </w:num>
-  <w:num w:numId="10" w16cid:durableId="1310785714">
+  <w:num w:numId="10" w16cid:durableId="819928822">
     <w:abstractNumId w:val="7"/>
     <w:lvlOverride w:ilvl="0">
       <w:startOverride w:val="1"/>
     </w:lvlOverride>
   </w:num>
-  <w:num w:numId="11" w16cid:durableId="1599291092">
+  <w:num w:numId="11" w16cid:durableId="704214430">
     <w:abstractNumId w:val="7"/>
     <w:lvlOverride w:ilvl="0">
       <w:startOverride w:val="1"/>
     </w:lvlOverride>
   </w:num>
-  <w:num w:numId="12" w16cid:durableId="1152527242">
+  <w:num w:numId="12" w16cid:durableId="234556064">
     <w:abstractNumId w:val="7"/>
     <w:lvlOverride w:ilvl="0">
       <w:startOverride w:val="1"/>
     </w:lvlOverride>
   </w:num>
-  <w:num w:numId="13" w16cid:durableId="933632533">
+  <w:num w:numId="13" w16cid:durableId="2039618883">
     <w:abstractNumId w:val="7"/>
     <w:lvlOverride w:ilvl="0">
       <w:startOverride w:val="1"/>
     </w:lvlOverride>
   </w:num>
-  <w:num w:numId="14" w16cid:durableId="350422021">
+  <w:num w:numId="14" w16cid:durableId="1388528099">
     <w:abstractNumId w:val="7"/>
     <w:lvlOverride w:ilvl="0">
       <w:startOverride w:val="1"/>
     </w:lvlOverride>
   </w:num>
-  <w:num w:numId="15" w16cid:durableId="328218661">
+  <w:num w:numId="15" w16cid:durableId="215775887">
     <w:abstractNumId w:val="7"/>
     <w:lvlOverride w:ilvl="0">
       <w:startOverride w:val="1"/>
     </w:lvlOverride>
   </w:num>
-  <w:num w:numId="16" w16cid:durableId="401759803">
+  <w:num w:numId="16" w16cid:durableId="761686118">
     <w:abstractNumId w:val="7"/>
     <w:lvlOverride w:ilvl="0">
       <w:startOverride w:val="1"/>
     </w:lvlOverride>
   </w:num>
-  <w:num w:numId="17" w16cid:durableId="1689216978">
+  <w:num w:numId="17" w16cid:durableId="942735481">
     <w:abstractNumId w:val="7"/>
     <w:lvlOverride w:ilvl="0">
       <w:startOverride w:val="1"/>

</xml_diff>

<commit_message>
Round 20an: project flowchart, and the gate and archive counts it exposed
</commit_message>
<xml_diff>
--- a/重构版论文_v4_20260915/English_SCI_Manuscript_v4.docx
+++ b/重构版论文_v4_20260915/English_SCI_Manuscript_v4.docx
@@ -1035,7 +1035,7 @@
           <w:noProof/>
         </w:rPr>
         <w:drawing>
-          <wp:inline distT="0" distB="0" distL="0" distR="0" wp14:anchorId="3390BB4D" wp14:editId="526E4360">
+          <wp:inline distT="0" distB="0" distL="0" distR="0" wp14:anchorId="0F377433" wp14:editId="5D7190E8">
             <wp:extent cx="5760720" cy="2734826"/>
             <wp:effectExtent l="0" t="0" r="0" b="0"/>
             <wp:docPr id="1" name="Picture 1"/>
@@ -2393,7 +2393,7 @@
           <w:noProof/>
         </w:rPr>
         <w:drawing>
-          <wp:inline distT="0" distB="0" distL="0" distR="0" wp14:anchorId="6B1BA1E0" wp14:editId="1E1DECB6">
+          <wp:inline distT="0" distB="0" distL="0" distR="0" wp14:anchorId="68D0FFF3" wp14:editId="34F80E28">
             <wp:extent cx="5760720" cy="2722098"/>
             <wp:effectExtent l="0" t="0" r="0" b="0"/>
             <wp:docPr id="2" name="Picture 2"/>
@@ -3381,7 +3381,7 @@
           <w:noProof/>
         </w:rPr>
         <w:drawing>
-          <wp:inline distT="0" distB="0" distL="0" distR="0" wp14:anchorId="7D0ECFF7" wp14:editId="3C4D2C5E">
+          <wp:inline distT="0" distB="0" distL="0" distR="0" wp14:anchorId="2B43D831" wp14:editId="64C9AA76">
             <wp:extent cx="5760720" cy="3482709"/>
             <wp:effectExtent l="0" t="0" r="0" b="0"/>
             <wp:docPr id="3" name="Picture 3"/>
@@ -7120,7 +7120,7 @@
           <w:noProof/>
         </w:rPr>
         <w:drawing>
-          <wp:inline distT="0" distB="0" distL="0" distR="0" wp14:anchorId="77ABF2E1" wp14:editId="1A918EB0">
+          <wp:inline distT="0" distB="0" distL="0" distR="0" wp14:anchorId="279D68D4" wp14:editId="5CCB5F6F">
             <wp:extent cx="5760720" cy="2356272"/>
             <wp:effectExtent l="0" t="0" r="0" b="0"/>
             <wp:docPr id="4" name="Picture 4"/>
@@ -8077,7 +8077,7 @@
         </w:rPr>
         <w:lastRenderedPageBreak/>
         <w:drawing>
-          <wp:inline distT="0" distB="0" distL="0" distR="0" wp14:anchorId="5D1BAD9C" wp14:editId="09E011F1">
+          <wp:inline distT="0" distB="0" distL="0" distR="0" wp14:anchorId="01191E0A" wp14:editId="3BA20AA6">
             <wp:extent cx="5760720" cy="2045294"/>
             <wp:effectExtent l="0" t="0" r="0" b="0"/>
             <wp:docPr id="5" name="Picture 5"/>
@@ -8252,7 +8252,7 @@
         </w:rPr>
         <w:lastRenderedPageBreak/>
         <w:drawing>
-          <wp:inline distT="0" distB="0" distL="0" distR="0" wp14:anchorId="741CFCFA" wp14:editId="1721E607">
+          <wp:inline distT="0" distB="0" distL="0" distR="0" wp14:anchorId="527F51CE" wp14:editId="7972266C">
             <wp:extent cx="5760720" cy="2308234"/>
             <wp:effectExtent l="0" t="0" r="0" b="0"/>
             <wp:docPr id="6" name="Picture 6"/>
@@ -8984,7 +8984,7 @@
         </w:rPr>
         <w:lastRenderedPageBreak/>
         <w:drawing>
-          <wp:inline distT="0" distB="0" distL="0" distR="0" wp14:anchorId="0A8260E7" wp14:editId="46CC46E6">
+          <wp:inline distT="0" distB="0" distL="0" distR="0" wp14:anchorId="2B38EE3A" wp14:editId="4217FD9D">
             <wp:extent cx="5760720" cy="2167923"/>
             <wp:effectExtent l="0" t="0" r="0" b="0"/>
             <wp:docPr id="7" name="Picture 7"/>
@@ -9092,7 +9092,7 @@
           <w:noProof/>
         </w:rPr>
         <w:drawing>
-          <wp:inline distT="0" distB="0" distL="0" distR="0" wp14:anchorId="25C8BC40" wp14:editId="20EA9CCC">
+          <wp:inline distT="0" distB="0" distL="0" distR="0" wp14:anchorId="2D694202" wp14:editId="3A1615A0">
             <wp:extent cx="5760720" cy="2258878"/>
             <wp:effectExtent l="0" t="0" r="0" b="0"/>
             <wp:docPr id="8" name="Picture 8"/>
@@ -9276,7 +9276,7 @@
           <w:noProof/>
         </w:rPr>
         <w:drawing>
-          <wp:inline distT="0" distB="0" distL="0" distR="0" wp14:anchorId="638E04C4" wp14:editId="5A59B80E">
+          <wp:inline distT="0" distB="0" distL="0" distR="0" wp14:anchorId="7C487F3A" wp14:editId="0445C7B0">
             <wp:extent cx="5760720" cy="2516852"/>
             <wp:effectExtent l="0" t="0" r="0" b="0"/>
             <wp:docPr id="9" name="Picture 9"/>
@@ -9413,7 +9413,7 @@
           <w:noProof/>
         </w:rPr>
         <w:drawing>
-          <wp:inline distT="0" distB="0" distL="0" distR="0" wp14:anchorId="3EF6DDA8" wp14:editId="1FA25771">
+          <wp:inline distT="0" distB="0" distL="0" distR="0" wp14:anchorId="040A68E8" wp14:editId="1E674814">
             <wp:extent cx="5760720" cy="2223311"/>
             <wp:effectExtent l="0" t="0" r="0" b="0"/>
             <wp:docPr id="10" name="Picture 10"/>
@@ -9503,7 +9503,7 @@
           <w:noProof/>
         </w:rPr>
         <w:drawing>
-          <wp:inline distT="0" distB="0" distL="0" distR="0" wp14:anchorId="3201429F" wp14:editId="7565ACEB">
+          <wp:inline distT="0" distB="0" distL="0" distR="0" wp14:anchorId="7B44D8CA" wp14:editId="1B3DC00F">
             <wp:extent cx="5760720" cy="2538527"/>
             <wp:effectExtent l="0" t="0" r="0" b="0"/>
             <wp:docPr id="11" name="Picture 11"/>
@@ -13538,76 +13538,76 @@
       </w:rPr>
     </w:lvl>
   </w:abstractNum>
-  <w:num w:numId="1" w16cid:durableId="619148267">
+  <w:num w:numId="1" w16cid:durableId="1836339708">
     <w:abstractNumId w:val="8"/>
   </w:num>
-  <w:num w:numId="2" w16cid:durableId="1391920841">
+  <w:num w:numId="2" w16cid:durableId="708601969">
     <w:abstractNumId w:val="6"/>
   </w:num>
-  <w:num w:numId="3" w16cid:durableId="1058624563">
+  <w:num w:numId="3" w16cid:durableId="1291131212">
     <w:abstractNumId w:val="5"/>
   </w:num>
-  <w:num w:numId="4" w16cid:durableId="1148086793">
+  <w:num w:numId="4" w16cid:durableId="576521189">
     <w:abstractNumId w:val="4"/>
   </w:num>
-  <w:num w:numId="5" w16cid:durableId="401491358">
+  <w:num w:numId="5" w16cid:durableId="413354587">
     <w:abstractNumId w:val="7"/>
   </w:num>
-  <w:num w:numId="6" w16cid:durableId="1476876979">
+  <w:num w:numId="6" w16cid:durableId="268975157">
     <w:abstractNumId w:val="3"/>
   </w:num>
-  <w:num w:numId="7" w16cid:durableId="1445075101">
+  <w:num w:numId="7" w16cid:durableId="485097661">
     <w:abstractNumId w:val="2"/>
   </w:num>
-  <w:num w:numId="8" w16cid:durableId="985814226">
+  <w:num w:numId="8" w16cid:durableId="1145046940">
     <w:abstractNumId w:val="1"/>
   </w:num>
-  <w:num w:numId="9" w16cid:durableId="2010674545">
+  <w:num w:numId="9" w16cid:durableId="1651321042">
     <w:abstractNumId w:val="0"/>
   </w:num>
-  <w:num w:numId="10" w16cid:durableId="819928822">
+  <w:num w:numId="10" w16cid:durableId="1997342623">
     <w:abstractNumId w:val="7"/>
     <w:lvlOverride w:ilvl="0">
       <w:startOverride w:val="1"/>
     </w:lvlOverride>
   </w:num>
-  <w:num w:numId="11" w16cid:durableId="704214430">
+  <w:num w:numId="11" w16cid:durableId="2046561194">
     <w:abstractNumId w:val="7"/>
     <w:lvlOverride w:ilvl="0">
       <w:startOverride w:val="1"/>
     </w:lvlOverride>
   </w:num>
-  <w:num w:numId="12" w16cid:durableId="234556064">
+  <w:num w:numId="12" w16cid:durableId="977881682">
     <w:abstractNumId w:val="7"/>
     <w:lvlOverride w:ilvl="0">
       <w:startOverride w:val="1"/>
     </w:lvlOverride>
   </w:num>
-  <w:num w:numId="13" w16cid:durableId="2039618883">
+  <w:num w:numId="13" w16cid:durableId="274144170">
     <w:abstractNumId w:val="7"/>
     <w:lvlOverride w:ilvl="0">
       <w:startOverride w:val="1"/>
     </w:lvlOverride>
   </w:num>
-  <w:num w:numId="14" w16cid:durableId="1388528099">
+  <w:num w:numId="14" w16cid:durableId="1860847891">
     <w:abstractNumId w:val="7"/>
     <w:lvlOverride w:ilvl="0">
       <w:startOverride w:val="1"/>
     </w:lvlOverride>
   </w:num>
-  <w:num w:numId="15" w16cid:durableId="215775887">
+  <w:num w:numId="15" w16cid:durableId="1243876106">
     <w:abstractNumId w:val="7"/>
     <w:lvlOverride w:ilvl="0">
       <w:startOverride w:val="1"/>
     </w:lvlOverride>
   </w:num>
-  <w:num w:numId="16" w16cid:durableId="761686118">
+  <w:num w:numId="16" w16cid:durableId="858859289">
     <w:abstractNumId w:val="7"/>
     <w:lvlOverride w:ilvl="0">
       <w:startOverride w:val="1"/>
     </w:lvlOverride>
   </w:num>
-  <w:num w:numId="17" w16cid:durableId="942735481">
+  <w:num w:numId="17" w16cid:durableId="1173448615">
     <w:abstractNumId w:val="7"/>
     <w:lvlOverride w:ilvl="0">
       <w:startOverride w:val="1"/>

</xml_diff>

<commit_message>
Round 20ap: experiment record - 18 experiments with code, run logs and rendered evidence
</commit_message>
<xml_diff>
--- a/重构版论文_v4_20260915/English_SCI_Manuscript_v4.docx
+++ b/重构版论文_v4_20260915/English_SCI_Manuscript_v4.docx
@@ -1035,7 +1035,7 @@
           <w:noProof/>
         </w:rPr>
         <w:drawing>
-          <wp:inline distT="0" distB="0" distL="0" distR="0" wp14:anchorId="0F377433" wp14:editId="5D7190E8">
+          <wp:inline distT="0" distB="0" distL="0" distR="0" wp14:anchorId="1451CFD7" wp14:editId="219F209B">
             <wp:extent cx="5760720" cy="2734826"/>
             <wp:effectExtent l="0" t="0" r="0" b="0"/>
             <wp:docPr id="1" name="Picture 1"/>
@@ -2393,7 +2393,7 @@
           <w:noProof/>
         </w:rPr>
         <w:drawing>
-          <wp:inline distT="0" distB="0" distL="0" distR="0" wp14:anchorId="68D0FFF3" wp14:editId="34F80E28">
+          <wp:inline distT="0" distB="0" distL="0" distR="0" wp14:anchorId="70B2A84E" wp14:editId="10EFBBEA">
             <wp:extent cx="5760720" cy="2722098"/>
             <wp:effectExtent l="0" t="0" r="0" b="0"/>
             <wp:docPr id="2" name="Picture 2"/>
@@ -3381,7 +3381,7 @@
           <w:noProof/>
         </w:rPr>
         <w:drawing>
-          <wp:inline distT="0" distB="0" distL="0" distR="0" wp14:anchorId="2B43D831" wp14:editId="64C9AA76">
+          <wp:inline distT="0" distB="0" distL="0" distR="0" wp14:anchorId="5808B1FC" wp14:editId="60A0F04E">
             <wp:extent cx="5760720" cy="3482709"/>
             <wp:effectExtent l="0" t="0" r="0" b="0"/>
             <wp:docPr id="3" name="Picture 3"/>
@@ -7120,7 +7120,7 @@
           <w:noProof/>
         </w:rPr>
         <w:drawing>
-          <wp:inline distT="0" distB="0" distL="0" distR="0" wp14:anchorId="279D68D4" wp14:editId="5CCB5F6F">
+          <wp:inline distT="0" distB="0" distL="0" distR="0" wp14:anchorId="192FBF6C" wp14:editId="57CF58F7">
             <wp:extent cx="5760720" cy="2356272"/>
             <wp:effectExtent l="0" t="0" r="0" b="0"/>
             <wp:docPr id="4" name="Picture 4"/>
@@ -8077,7 +8077,7 @@
         </w:rPr>
         <w:lastRenderedPageBreak/>
         <w:drawing>
-          <wp:inline distT="0" distB="0" distL="0" distR="0" wp14:anchorId="01191E0A" wp14:editId="3BA20AA6">
+          <wp:inline distT="0" distB="0" distL="0" distR="0" wp14:anchorId="4894E78D" wp14:editId="1383F4AD">
             <wp:extent cx="5760720" cy="2045294"/>
             <wp:effectExtent l="0" t="0" r="0" b="0"/>
             <wp:docPr id="5" name="Picture 5"/>
@@ -8252,7 +8252,7 @@
         </w:rPr>
         <w:lastRenderedPageBreak/>
         <w:drawing>
-          <wp:inline distT="0" distB="0" distL="0" distR="0" wp14:anchorId="527F51CE" wp14:editId="7972266C">
+          <wp:inline distT="0" distB="0" distL="0" distR="0" wp14:anchorId="484E4C44" wp14:editId="7ED0A81D">
             <wp:extent cx="5760720" cy="2308234"/>
             <wp:effectExtent l="0" t="0" r="0" b="0"/>
             <wp:docPr id="6" name="Picture 6"/>
@@ -8984,7 +8984,7 @@
         </w:rPr>
         <w:lastRenderedPageBreak/>
         <w:drawing>
-          <wp:inline distT="0" distB="0" distL="0" distR="0" wp14:anchorId="2B38EE3A" wp14:editId="4217FD9D">
+          <wp:inline distT="0" distB="0" distL="0" distR="0" wp14:anchorId="25CE5174" wp14:editId="77179EC9">
             <wp:extent cx="5760720" cy="2167923"/>
             <wp:effectExtent l="0" t="0" r="0" b="0"/>
             <wp:docPr id="7" name="Picture 7"/>
@@ -9092,7 +9092,7 @@
           <w:noProof/>
         </w:rPr>
         <w:drawing>
-          <wp:inline distT="0" distB="0" distL="0" distR="0" wp14:anchorId="2D694202" wp14:editId="3A1615A0">
+          <wp:inline distT="0" distB="0" distL="0" distR="0" wp14:anchorId="60338871" wp14:editId="340647F8">
             <wp:extent cx="5760720" cy="2258878"/>
             <wp:effectExtent l="0" t="0" r="0" b="0"/>
             <wp:docPr id="8" name="Picture 8"/>
@@ -9276,7 +9276,7 @@
           <w:noProof/>
         </w:rPr>
         <w:drawing>
-          <wp:inline distT="0" distB="0" distL="0" distR="0" wp14:anchorId="7C487F3A" wp14:editId="0445C7B0">
+          <wp:inline distT="0" distB="0" distL="0" distR="0" wp14:anchorId="7003C4AA" wp14:editId="5B9CAA36">
             <wp:extent cx="5760720" cy="2516852"/>
             <wp:effectExtent l="0" t="0" r="0" b="0"/>
             <wp:docPr id="9" name="Picture 9"/>
@@ -9413,7 +9413,7 @@
           <w:noProof/>
         </w:rPr>
         <w:drawing>
-          <wp:inline distT="0" distB="0" distL="0" distR="0" wp14:anchorId="040A68E8" wp14:editId="1E674814">
+          <wp:inline distT="0" distB="0" distL="0" distR="0" wp14:anchorId="243ACE95" wp14:editId="7F13F25B">
             <wp:extent cx="5760720" cy="2223311"/>
             <wp:effectExtent l="0" t="0" r="0" b="0"/>
             <wp:docPr id="10" name="Picture 10"/>
@@ -9503,7 +9503,7 @@
           <w:noProof/>
         </w:rPr>
         <w:drawing>
-          <wp:inline distT="0" distB="0" distL="0" distR="0" wp14:anchorId="7B44D8CA" wp14:editId="1B3DC00F">
+          <wp:inline distT="0" distB="0" distL="0" distR="0" wp14:anchorId="3B459128" wp14:editId="76DE8E5C">
             <wp:extent cx="5760720" cy="2538527"/>
             <wp:effectExtent l="0" t="0" r="0" b="0"/>
             <wp:docPr id="11" name="Picture 11"/>
@@ -13538,76 +13538,76 @@
       </w:rPr>
     </w:lvl>
   </w:abstractNum>
-  <w:num w:numId="1" w16cid:durableId="1836339708">
+  <w:num w:numId="1" w16cid:durableId="468519788">
     <w:abstractNumId w:val="8"/>
   </w:num>
-  <w:num w:numId="2" w16cid:durableId="708601969">
+  <w:num w:numId="2" w16cid:durableId="725224093">
     <w:abstractNumId w:val="6"/>
   </w:num>
-  <w:num w:numId="3" w16cid:durableId="1291131212">
+  <w:num w:numId="3" w16cid:durableId="1014262615">
     <w:abstractNumId w:val="5"/>
   </w:num>
-  <w:num w:numId="4" w16cid:durableId="576521189">
+  <w:num w:numId="4" w16cid:durableId="422730660">
     <w:abstractNumId w:val="4"/>
   </w:num>
-  <w:num w:numId="5" w16cid:durableId="413354587">
+  <w:num w:numId="5" w16cid:durableId="1904251">
     <w:abstractNumId w:val="7"/>
   </w:num>
-  <w:num w:numId="6" w16cid:durableId="268975157">
+  <w:num w:numId="6" w16cid:durableId="1921451854">
     <w:abstractNumId w:val="3"/>
   </w:num>
-  <w:num w:numId="7" w16cid:durableId="485097661">
+  <w:num w:numId="7" w16cid:durableId="1616449822">
     <w:abstractNumId w:val="2"/>
   </w:num>
-  <w:num w:numId="8" w16cid:durableId="1145046940">
+  <w:num w:numId="8" w16cid:durableId="70808964">
     <w:abstractNumId w:val="1"/>
   </w:num>
-  <w:num w:numId="9" w16cid:durableId="1651321042">
+  <w:num w:numId="9" w16cid:durableId="1648893550">
     <w:abstractNumId w:val="0"/>
   </w:num>
-  <w:num w:numId="10" w16cid:durableId="1997342623">
+  <w:num w:numId="10" w16cid:durableId="2109038621">
     <w:abstractNumId w:val="7"/>
     <w:lvlOverride w:ilvl="0">
       <w:startOverride w:val="1"/>
     </w:lvlOverride>
   </w:num>
-  <w:num w:numId="11" w16cid:durableId="2046561194">
+  <w:num w:numId="11" w16cid:durableId="1980528701">
     <w:abstractNumId w:val="7"/>
     <w:lvlOverride w:ilvl="0">
       <w:startOverride w:val="1"/>
     </w:lvlOverride>
   </w:num>
-  <w:num w:numId="12" w16cid:durableId="977881682">
+  <w:num w:numId="12" w16cid:durableId="779027171">
     <w:abstractNumId w:val="7"/>
     <w:lvlOverride w:ilvl="0">
       <w:startOverride w:val="1"/>
     </w:lvlOverride>
   </w:num>
-  <w:num w:numId="13" w16cid:durableId="274144170">
+  <w:num w:numId="13" w16cid:durableId="309334165">
     <w:abstractNumId w:val="7"/>
     <w:lvlOverride w:ilvl="0">
       <w:startOverride w:val="1"/>
     </w:lvlOverride>
   </w:num>
-  <w:num w:numId="14" w16cid:durableId="1860847891">
+  <w:num w:numId="14" w16cid:durableId="378826282">
     <w:abstractNumId w:val="7"/>
     <w:lvlOverride w:ilvl="0">
       <w:startOverride w:val="1"/>
     </w:lvlOverride>
   </w:num>
-  <w:num w:numId="15" w16cid:durableId="1243876106">
+  <w:num w:numId="15" w16cid:durableId="802893830">
     <w:abstractNumId w:val="7"/>
     <w:lvlOverride w:ilvl="0">
       <w:startOverride w:val="1"/>
     </w:lvlOverride>
   </w:num>
-  <w:num w:numId="16" w16cid:durableId="858859289">
+  <w:num w:numId="16" w16cid:durableId="592707891">
     <w:abstractNumId w:val="7"/>
     <w:lvlOverride w:ilvl="0">
       <w:startOverride w:val="1"/>
     </w:lvlOverride>
   </w:num>
-  <w:num w:numId="17" w16cid:durableId="1173448615">
+  <w:num w:numId="17" w16cid:durableId="1607422448">
     <w:abstractNumId w:val="7"/>
     <w:lvlOverride w:ilvl="0">
       <w:startOverride w:val="1"/>

</xml_diff>

<commit_message>
Round 20aq: full experiment inventory - 145 result directories, 378 code files, 25 record panels
</commit_message>
<xml_diff>
--- a/重构版论文_v4_20260915/English_SCI_Manuscript_v4.docx
+++ b/重构版论文_v4_20260915/English_SCI_Manuscript_v4.docx
@@ -1035,7 +1035,7 @@
           <w:noProof/>
         </w:rPr>
         <w:drawing>
-          <wp:inline distT="0" distB="0" distL="0" distR="0" wp14:anchorId="1451CFD7" wp14:editId="219F209B">
+          <wp:inline distT="0" distB="0" distL="0" distR="0" wp14:anchorId="00D304A9" wp14:editId="3A667F5E">
             <wp:extent cx="5760720" cy="2734826"/>
             <wp:effectExtent l="0" t="0" r="0" b="0"/>
             <wp:docPr id="1" name="Picture 1"/>
@@ -2393,7 +2393,7 @@
           <w:noProof/>
         </w:rPr>
         <w:drawing>
-          <wp:inline distT="0" distB="0" distL="0" distR="0" wp14:anchorId="70B2A84E" wp14:editId="10EFBBEA">
+          <wp:inline distT="0" distB="0" distL="0" distR="0" wp14:anchorId="093106EE" wp14:editId="38E385DE">
             <wp:extent cx="5760720" cy="2722098"/>
             <wp:effectExtent l="0" t="0" r="0" b="0"/>
             <wp:docPr id="2" name="Picture 2"/>
@@ -3381,7 +3381,7 @@
           <w:noProof/>
         </w:rPr>
         <w:drawing>
-          <wp:inline distT="0" distB="0" distL="0" distR="0" wp14:anchorId="5808B1FC" wp14:editId="60A0F04E">
+          <wp:inline distT="0" distB="0" distL="0" distR="0" wp14:anchorId="0B937257" wp14:editId="32961B2B">
             <wp:extent cx="5760720" cy="3482709"/>
             <wp:effectExtent l="0" t="0" r="0" b="0"/>
             <wp:docPr id="3" name="Picture 3"/>
@@ -7120,7 +7120,7 @@
           <w:noProof/>
         </w:rPr>
         <w:drawing>
-          <wp:inline distT="0" distB="0" distL="0" distR="0" wp14:anchorId="192FBF6C" wp14:editId="57CF58F7">
+          <wp:inline distT="0" distB="0" distL="0" distR="0" wp14:anchorId="439D16DD" wp14:editId="7C82F8BE">
             <wp:extent cx="5760720" cy="2356272"/>
             <wp:effectExtent l="0" t="0" r="0" b="0"/>
             <wp:docPr id="4" name="Picture 4"/>
@@ -8077,7 +8077,7 @@
         </w:rPr>
         <w:lastRenderedPageBreak/>
         <w:drawing>
-          <wp:inline distT="0" distB="0" distL="0" distR="0" wp14:anchorId="4894E78D" wp14:editId="1383F4AD">
+          <wp:inline distT="0" distB="0" distL="0" distR="0" wp14:anchorId="478D96C5" wp14:editId="1DDDE640">
             <wp:extent cx="5760720" cy="2045294"/>
             <wp:effectExtent l="0" t="0" r="0" b="0"/>
             <wp:docPr id="5" name="Picture 5"/>
@@ -8252,7 +8252,7 @@
         </w:rPr>
         <w:lastRenderedPageBreak/>
         <w:drawing>
-          <wp:inline distT="0" distB="0" distL="0" distR="0" wp14:anchorId="484E4C44" wp14:editId="7ED0A81D">
+          <wp:inline distT="0" distB="0" distL="0" distR="0" wp14:anchorId="64D6E131" wp14:editId="2289FAA1">
             <wp:extent cx="5760720" cy="2308234"/>
             <wp:effectExtent l="0" t="0" r="0" b="0"/>
             <wp:docPr id="6" name="Picture 6"/>
@@ -8984,7 +8984,7 @@
         </w:rPr>
         <w:lastRenderedPageBreak/>
         <w:drawing>
-          <wp:inline distT="0" distB="0" distL="0" distR="0" wp14:anchorId="25CE5174" wp14:editId="77179EC9">
+          <wp:inline distT="0" distB="0" distL="0" distR="0" wp14:anchorId="2260C68F" wp14:editId="75AE2E25">
             <wp:extent cx="5760720" cy="2167923"/>
             <wp:effectExtent l="0" t="0" r="0" b="0"/>
             <wp:docPr id="7" name="Picture 7"/>
@@ -9092,7 +9092,7 @@
           <w:noProof/>
         </w:rPr>
         <w:drawing>
-          <wp:inline distT="0" distB="0" distL="0" distR="0" wp14:anchorId="60338871" wp14:editId="340647F8">
+          <wp:inline distT="0" distB="0" distL="0" distR="0" wp14:anchorId="362D253F" wp14:editId="7CFAB9A0">
             <wp:extent cx="5760720" cy="2258878"/>
             <wp:effectExtent l="0" t="0" r="0" b="0"/>
             <wp:docPr id="8" name="Picture 8"/>
@@ -9276,7 +9276,7 @@
           <w:noProof/>
         </w:rPr>
         <w:drawing>
-          <wp:inline distT="0" distB="0" distL="0" distR="0" wp14:anchorId="7003C4AA" wp14:editId="5B9CAA36">
+          <wp:inline distT="0" distB="0" distL="0" distR="0" wp14:anchorId="39B023DD" wp14:editId="355CAF20">
             <wp:extent cx="5760720" cy="2516852"/>
             <wp:effectExtent l="0" t="0" r="0" b="0"/>
             <wp:docPr id="9" name="Picture 9"/>
@@ -9413,7 +9413,7 @@
           <w:noProof/>
         </w:rPr>
         <w:drawing>
-          <wp:inline distT="0" distB="0" distL="0" distR="0" wp14:anchorId="243ACE95" wp14:editId="7F13F25B">
+          <wp:inline distT="0" distB="0" distL="0" distR="0" wp14:anchorId="3FB7304C" wp14:editId="71C4ACFF">
             <wp:extent cx="5760720" cy="2223311"/>
             <wp:effectExtent l="0" t="0" r="0" b="0"/>
             <wp:docPr id="10" name="Picture 10"/>
@@ -9503,7 +9503,7 @@
           <w:noProof/>
         </w:rPr>
         <w:drawing>
-          <wp:inline distT="0" distB="0" distL="0" distR="0" wp14:anchorId="3B459128" wp14:editId="76DE8E5C">
+          <wp:inline distT="0" distB="0" distL="0" distR="0" wp14:anchorId="212DA73A" wp14:editId="6F7527D2">
             <wp:extent cx="5760720" cy="2538527"/>
             <wp:effectExtent l="0" t="0" r="0" b="0"/>
             <wp:docPr id="11" name="Picture 11"/>
@@ -13538,76 +13538,76 @@
       </w:rPr>
     </w:lvl>
   </w:abstractNum>
-  <w:num w:numId="1" w16cid:durableId="468519788">
+  <w:num w:numId="1" w16cid:durableId="517740197">
     <w:abstractNumId w:val="8"/>
   </w:num>
-  <w:num w:numId="2" w16cid:durableId="725224093">
+  <w:num w:numId="2" w16cid:durableId="1087845292">
     <w:abstractNumId w:val="6"/>
   </w:num>
-  <w:num w:numId="3" w16cid:durableId="1014262615">
+  <w:num w:numId="3" w16cid:durableId="2045984421">
     <w:abstractNumId w:val="5"/>
   </w:num>
-  <w:num w:numId="4" w16cid:durableId="422730660">
+  <w:num w:numId="4" w16cid:durableId="1882743159">
     <w:abstractNumId w:val="4"/>
   </w:num>
-  <w:num w:numId="5" w16cid:durableId="1904251">
+  <w:num w:numId="5" w16cid:durableId="1814831735">
     <w:abstractNumId w:val="7"/>
   </w:num>
-  <w:num w:numId="6" w16cid:durableId="1921451854">
+  <w:num w:numId="6" w16cid:durableId="1671904185">
     <w:abstractNumId w:val="3"/>
   </w:num>
-  <w:num w:numId="7" w16cid:durableId="1616449822">
+  <w:num w:numId="7" w16cid:durableId="412892489">
     <w:abstractNumId w:val="2"/>
   </w:num>
-  <w:num w:numId="8" w16cid:durableId="70808964">
+  <w:num w:numId="8" w16cid:durableId="1234000937">
     <w:abstractNumId w:val="1"/>
   </w:num>
-  <w:num w:numId="9" w16cid:durableId="1648893550">
+  <w:num w:numId="9" w16cid:durableId="491526194">
     <w:abstractNumId w:val="0"/>
   </w:num>
-  <w:num w:numId="10" w16cid:durableId="2109038621">
+  <w:num w:numId="10" w16cid:durableId="517547647">
     <w:abstractNumId w:val="7"/>
     <w:lvlOverride w:ilvl="0">
       <w:startOverride w:val="1"/>
     </w:lvlOverride>
   </w:num>
-  <w:num w:numId="11" w16cid:durableId="1980528701">
+  <w:num w:numId="11" w16cid:durableId="750933481">
     <w:abstractNumId w:val="7"/>
     <w:lvlOverride w:ilvl="0">
       <w:startOverride w:val="1"/>
     </w:lvlOverride>
   </w:num>
-  <w:num w:numId="12" w16cid:durableId="779027171">
+  <w:num w:numId="12" w16cid:durableId="1933395332">
     <w:abstractNumId w:val="7"/>
     <w:lvlOverride w:ilvl="0">
       <w:startOverride w:val="1"/>
     </w:lvlOverride>
   </w:num>
-  <w:num w:numId="13" w16cid:durableId="309334165">
+  <w:num w:numId="13" w16cid:durableId="1304847890">
     <w:abstractNumId w:val="7"/>
     <w:lvlOverride w:ilvl="0">
       <w:startOverride w:val="1"/>
     </w:lvlOverride>
   </w:num>
-  <w:num w:numId="14" w16cid:durableId="378826282">
+  <w:num w:numId="14" w16cid:durableId="901331943">
     <w:abstractNumId w:val="7"/>
     <w:lvlOverride w:ilvl="0">
       <w:startOverride w:val="1"/>
     </w:lvlOverride>
   </w:num>
-  <w:num w:numId="15" w16cid:durableId="802893830">
+  <w:num w:numId="15" w16cid:durableId="124854994">
     <w:abstractNumId w:val="7"/>
     <w:lvlOverride w:ilvl="0">
       <w:startOverride w:val="1"/>
     </w:lvlOverride>
   </w:num>
-  <w:num w:numId="16" w16cid:durableId="592707891">
+  <w:num w:numId="16" w16cid:durableId="632636146">
     <w:abstractNumId w:val="7"/>
     <w:lvlOverride w:ilvl="0">
       <w:startOverride w:val="1"/>
     </w:lvlOverride>
   </w:num>
-  <w:num w:numId="17" w16cid:durableId="1607422448">
+  <w:num w:numId="17" w16cid:durableId="2096973126">
     <w:abstractNumId w:val="7"/>
     <w:lvlOverride w:ilvl="0">
       <w:startOverride w:val="1"/>

</xml_diff>

<commit_message>
Round 20ar: material completeness index - every project item mapped to the bundle or its reason
</commit_message>
<xml_diff>
--- a/重构版论文_v4_20260915/English_SCI_Manuscript_v4.docx
+++ b/重构版论文_v4_20260915/English_SCI_Manuscript_v4.docx
@@ -1035,7 +1035,7 @@
           <w:noProof/>
         </w:rPr>
         <w:drawing>
-          <wp:inline distT="0" distB="0" distL="0" distR="0" wp14:anchorId="00D304A9" wp14:editId="3A667F5E">
+          <wp:inline distT="0" distB="0" distL="0" distR="0" wp14:anchorId="1CF6802B" wp14:editId="379FAEFD">
             <wp:extent cx="5760720" cy="2734826"/>
             <wp:effectExtent l="0" t="0" r="0" b="0"/>
             <wp:docPr id="1" name="Picture 1"/>
@@ -2393,7 +2393,7 @@
           <w:noProof/>
         </w:rPr>
         <w:drawing>
-          <wp:inline distT="0" distB="0" distL="0" distR="0" wp14:anchorId="093106EE" wp14:editId="38E385DE">
+          <wp:inline distT="0" distB="0" distL="0" distR="0" wp14:anchorId="0408F0B0" wp14:editId="66063C11">
             <wp:extent cx="5760720" cy="2722098"/>
             <wp:effectExtent l="0" t="0" r="0" b="0"/>
             <wp:docPr id="2" name="Picture 2"/>
@@ -3381,7 +3381,7 @@
           <w:noProof/>
         </w:rPr>
         <w:drawing>
-          <wp:inline distT="0" distB="0" distL="0" distR="0" wp14:anchorId="0B937257" wp14:editId="32961B2B">
+          <wp:inline distT="0" distB="0" distL="0" distR="0" wp14:anchorId="183B57DB" wp14:editId="37A633D1">
             <wp:extent cx="5760720" cy="3482709"/>
             <wp:effectExtent l="0" t="0" r="0" b="0"/>
             <wp:docPr id="3" name="Picture 3"/>
@@ -7120,7 +7120,7 @@
           <w:noProof/>
         </w:rPr>
         <w:drawing>
-          <wp:inline distT="0" distB="0" distL="0" distR="0" wp14:anchorId="439D16DD" wp14:editId="7C82F8BE">
+          <wp:inline distT="0" distB="0" distL="0" distR="0" wp14:anchorId="7E1EA8CC" wp14:editId="793E8C12">
             <wp:extent cx="5760720" cy="2356272"/>
             <wp:effectExtent l="0" t="0" r="0" b="0"/>
             <wp:docPr id="4" name="Picture 4"/>
@@ -8077,7 +8077,7 @@
         </w:rPr>
         <w:lastRenderedPageBreak/>
         <w:drawing>
-          <wp:inline distT="0" distB="0" distL="0" distR="0" wp14:anchorId="478D96C5" wp14:editId="1DDDE640">
+          <wp:inline distT="0" distB="0" distL="0" distR="0" wp14:anchorId="6F909961" wp14:editId="19590E69">
             <wp:extent cx="5760720" cy="2045294"/>
             <wp:effectExtent l="0" t="0" r="0" b="0"/>
             <wp:docPr id="5" name="Picture 5"/>
@@ -8252,7 +8252,7 @@
         </w:rPr>
         <w:lastRenderedPageBreak/>
         <w:drawing>
-          <wp:inline distT="0" distB="0" distL="0" distR="0" wp14:anchorId="64D6E131" wp14:editId="2289FAA1">
+          <wp:inline distT="0" distB="0" distL="0" distR="0" wp14:anchorId="088A827A" wp14:editId="44BC3BDE">
             <wp:extent cx="5760720" cy="2308234"/>
             <wp:effectExtent l="0" t="0" r="0" b="0"/>
             <wp:docPr id="6" name="Picture 6"/>
@@ -8984,7 +8984,7 @@
         </w:rPr>
         <w:lastRenderedPageBreak/>
         <w:drawing>
-          <wp:inline distT="0" distB="0" distL="0" distR="0" wp14:anchorId="2260C68F" wp14:editId="75AE2E25">
+          <wp:inline distT="0" distB="0" distL="0" distR="0" wp14:anchorId="04517A4F" wp14:editId="44CDE730">
             <wp:extent cx="5760720" cy="2167923"/>
             <wp:effectExtent l="0" t="0" r="0" b="0"/>
             <wp:docPr id="7" name="Picture 7"/>
@@ -9092,7 +9092,7 @@
           <w:noProof/>
         </w:rPr>
         <w:drawing>
-          <wp:inline distT="0" distB="0" distL="0" distR="0" wp14:anchorId="362D253F" wp14:editId="7CFAB9A0">
+          <wp:inline distT="0" distB="0" distL="0" distR="0" wp14:anchorId="2A2B0903" wp14:editId="50057322">
             <wp:extent cx="5760720" cy="2258878"/>
             <wp:effectExtent l="0" t="0" r="0" b="0"/>
             <wp:docPr id="8" name="Picture 8"/>
@@ -9276,7 +9276,7 @@
           <w:noProof/>
         </w:rPr>
         <w:drawing>
-          <wp:inline distT="0" distB="0" distL="0" distR="0" wp14:anchorId="39B023DD" wp14:editId="355CAF20">
+          <wp:inline distT="0" distB="0" distL="0" distR="0" wp14:anchorId="7C1EBE48" wp14:editId="4276D5AE">
             <wp:extent cx="5760720" cy="2516852"/>
             <wp:effectExtent l="0" t="0" r="0" b="0"/>
             <wp:docPr id="9" name="Picture 9"/>
@@ -9413,7 +9413,7 @@
           <w:noProof/>
         </w:rPr>
         <w:drawing>
-          <wp:inline distT="0" distB="0" distL="0" distR="0" wp14:anchorId="3FB7304C" wp14:editId="71C4ACFF">
+          <wp:inline distT="0" distB="0" distL="0" distR="0" wp14:anchorId="63F0420F" wp14:editId="13232F17">
             <wp:extent cx="5760720" cy="2223311"/>
             <wp:effectExtent l="0" t="0" r="0" b="0"/>
             <wp:docPr id="10" name="Picture 10"/>
@@ -9503,7 +9503,7 @@
           <w:noProof/>
         </w:rPr>
         <w:drawing>
-          <wp:inline distT="0" distB="0" distL="0" distR="0" wp14:anchorId="212DA73A" wp14:editId="6F7527D2">
+          <wp:inline distT="0" distB="0" distL="0" distR="0" wp14:anchorId="47D23F93" wp14:editId="67DDC969">
             <wp:extent cx="5760720" cy="2538527"/>
             <wp:effectExtent l="0" t="0" r="0" b="0"/>
             <wp:docPr id="11" name="Picture 11"/>
@@ -13538,76 +13538,76 @@
       </w:rPr>
     </w:lvl>
   </w:abstractNum>
-  <w:num w:numId="1" w16cid:durableId="517740197">
+  <w:num w:numId="1" w16cid:durableId="287055456">
     <w:abstractNumId w:val="8"/>
   </w:num>
-  <w:num w:numId="2" w16cid:durableId="1087845292">
+  <w:num w:numId="2" w16cid:durableId="654719586">
     <w:abstractNumId w:val="6"/>
   </w:num>
-  <w:num w:numId="3" w16cid:durableId="2045984421">
+  <w:num w:numId="3" w16cid:durableId="874461981">
     <w:abstractNumId w:val="5"/>
   </w:num>
-  <w:num w:numId="4" w16cid:durableId="1882743159">
+  <w:num w:numId="4" w16cid:durableId="406651477">
     <w:abstractNumId w:val="4"/>
   </w:num>
-  <w:num w:numId="5" w16cid:durableId="1814831735">
+  <w:num w:numId="5" w16cid:durableId="1321235430">
     <w:abstractNumId w:val="7"/>
   </w:num>
-  <w:num w:numId="6" w16cid:durableId="1671904185">
+  <w:num w:numId="6" w16cid:durableId="2025669374">
     <w:abstractNumId w:val="3"/>
   </w:num>
-  <w:num w:numId="7" w16cid:durableId="412892489">
+  <w:num w:numId="7" w16cid:durableId="568344350">
     <w:abstractNumId w:val="2"/>
   </w:num>
-  <w:num w:numId="8" w16cid:durableId="1234000937">
+  <w:num w:numId="8" w16cid:durableId="1352684143">
     <w:abstractNumId w:val="1"/>
   </w:num>
-  <w:num w:numId="9" w16cid:durableId="491526194">
+  <w:num w:numId="9" w16cid:durableId="576087952">
     <w:abstractNumId w:val="0"/>
   </w:num>
-  <w:num w:numId="10" w16cid:durableId="517547647">
+  <w:num w:numId="10" w16cid:durableId="686366900">
     <w:abstractNumId w:val="7"/>
     <w:lvlOverride w:ilvl="0">
       <w:startOverride w:val="1"/>
     </w:lvlOverride>
   </w:num>
-  <w:num w:numId="11" w16cid:durableId="750933481">
+  <w:num w:numId="11" w16cid:durableId="1365256338">
     <w:abstractNumId w:val="7"/>
     <w:lvlOverride w:ilvl="0">
       <w:startOverride w:val="1"/>
     </w:lvlOverride>
   </w:num>
-  <w:num w:numId="12" w16cid:durableId="1933395332">
+  <w:num w:numId="12" w16cid:durableId="117651088">
     <w:abstractNumId w:val="7"/>
     <w:lvlOverride w:ilvl="0">
       <w:startOverride w:val="1"/>
     </w:lvlOverride>
   </w:num>
-  <w:num w:numId="13" w16cid:durableId="1304847890">
+  <w:num w:numId="13" w16cid:durableId="1502963095">
     <w:abstractNumId w:val="7"/>
     <w:lvlOverride w:ilvl="0">
       <w:startOverride w:val="1"/>
     </w:lvlOverride>
   </w:num>
-  <w:num w:numId="14" w16cid:durableId="901331943">
+  <w:num w:numId="14" w16cid:durableId="1570841542">
     <w:abstractNumId w:val="7"/>
     <w:lvlOverride w:ilvl="0">
       <w:startOverride w:val="1"/>
     </w:lvlOverride>
   </w:num>
-  <w:num w:numId="15" w16cid:durableId="124854994">
+  <w:num w:numId="15" w16cid:durableId="907766721">
     <w:abstractNumId w:val="7"/>
     <w:lvlOverride w:ilvl="0">
       <w:startOverride w:val="1"/>
     </w:lvlOverride>
   </w:num>
-  <w:num w:numId="16" w16cid:durableId="632636146">
+  <w:num w:numId="16" w16cid:durableId="79496450">
     <w:abstractNumId w:val="7"/>
     <w:lvlOverride w:ilvl="0">
       <w:startOverride w:val="1"/>
     </w:lvlOverride>
   </w:num>
-  <w:num w:numId="17" w16cid:durableId="2096973126">
+  <w:num w:numId="17" w16cid:durableId="1198468853">
     <w:abstractNumId w:val="7"/>
     <w:lvlOverride w:ilvl="0">
       <w:startOverride w:val="1"/>

</xml_diff>

<commit_message>
Round 20at: structure pass - section roadmaps, H/RQ spine and a clearer conclusion
</commit_message>
<xml_diff>
--- a/重构版论文_v4_20260915/English_SCI_Manuscript_v4.docx
+++ b/重构版论文_v4_20260915/English_SCI_Manuscript_v4.docx
@@ -218,6 +218,11 @@
       </w:r>
       <w:r>
         <w:t xml:space="preserve"> Do the conclusions survive beyond CIC-IDS2017, on NSL-KDD, UNSW-NB15 and file-level stress tests?</w:t>
+      </w:r>
+    </w:p>
+    <w:p>
+      <w:r>
+        <w:t>The assumptions and the questions form one chain: H1-H3 are tested in order by RQ1-RQ3, and RQ4 asks whether all three survive outside the source corpus. Section 5 answers the questions in that order, and every claim in Sections 5 and 6 is traceable to one of them.</w:t>
       </w:r>
     </w:p>
     <w:p>
@@ -245,6 +250,7 @@
         <w:rPr>
           <w:b/>
         </w:rPr>
+        <w:lastRenderedPageBreak/>
         <w:t>A reusable leakage-controlled protocol and audit record.</w:t>
       </w:r>
       <w:r>
@@ -263,7 +269,6 @@
         <w:rPr>
           <w:b/>
         </w:rPr>
-        <w:lastRenderedPageBreak/>
         <w:t>An identifiability analysis of conditional weighting.</w:t>
       </w:r>
       <w:r>
@@ -359,10 +364,16 @@
       </w:r>
     </w:p>
     <w:p>
+      <w:r>
+        <w:t>This section reviews the four bodies of work the design draws on - evaluation hazards in public datasets (2.1), feature selection and leakage (2.2), ensemble aggregation and adaptive weighting (2.3), and probability quality, open-set rejection and deployment cost (2.4) - and states in 2.5 the gap that motivates the controlled comparison.</w:t>
+      </w:r>
+    </w:p>
+    <w:p>
       <w:pPr>
         <w:pStyle w:val="21"/>
       </w:pPr>
       <w:r>
+        <w:lastRenderedPageBreak/>
         <w:t>2.1 Public datasets and their evaluation hazards</w:t>
       </w:r>
     </w:p>
@@ -373,65 +384,62 @@
     </w:p>
     <w:p>
       <w:r>
-        <w:t xml:space="preserve">Several structural defects are documented [19]. Class distributions are extremely skewed - in CIC-IDS2017 the Web Attack and Infiltration families are three to five orders of magnitude smaller than BENIGN. Feature tables contain </w:t>
-      </w:r>
+        <w:t>Several structural defects are documented [19]. Class distributions are extremely skewed - in CIC-IDS2017 the Web Attack and Infiltration families are three to five orders of magnitude smaller than BENIGN. Feature tables contain constant columns and collection artefacts. Some attack families were generated by a single tool in a single time window and are therefore highly homogeneous. Training and test partitions may share duplicates. Engelen and Timmerman, and Liu et al., show that preprocessing order and s</w:t>
+      </w:r>
+      <w:r>
+        <w:t>plitting choices alone can materially change reported performance [20,21]. These findings motivate H3: if protocol choices change conclusions, the protocol itself must become a reported and tested object. This position is part of a wider methodological critique of machine learning in security [22,23,26].</w:t>
+      </w:r>
+    </w:p>
+    <w:p>
+      <w:pPr>
+        <w:pStyle w:val="21"/>
+      </w:pPr>
+      <w:r>
+        <w:t>2.2 Feature selection and leakage</w:t>
+      </w:r>
+    </w:p>
+    <w:p>
+      <w:r>
+        <w:t>Filter selection is popular in this domain because it is cheap and interpretable. The chi-square statistic measures dependence between a discretised feature and the label [12], mutual information (MI) captures non-linear dependence, and analysis of variance (ANOVA) compares between-class with within-class variance [13]. All three are used here as controls.</w:t>
+      </w:r>
+    </w:p>
+    <w:p>
+      <w:r>
+        <w:t>The difficulty is that these statistics depend on the label distribution. Fitting a selector before splitting leaks test-label information through the feature ranking. Such leakage is common and hard to detect from a methods paragraph [22]. Our protocol fits every selector inside the training partition and refits it inside each cross-fitting fold, so the selector is subject to the same information boundary as the model.</w:t>
+      </w:r>
+    </w:p>
+    <w:p>
+      <w:pPr>
+        <w:pStyle w:val="21"/>
+      </w:pPr>
+      <w:r>
+        <w:t>2.3 Ensemble aggregation and adaptive weighting</w:t>
+      </w:r>
+    </w:p>
+    <w:p>
+      <w:r>
+        <w:t>Breiman's random forest combines bootstrapped trees through equal voting or probability averaging [1,2], justified by variance reduction when tree errors are imperfectly correlated. A natural generalisation replaces equal weights with unequal ones: if the reliability of each tree or expert can be estimated for a given sample, weight accordingly.</w:t>
+      </w:r>
+    </w:p>
+    <w:p>
+      <w:r>
+        <w:t>Implementations in the literature include validation-accuracy tree weighting, out-of-bag error weighting, meta-learners that predict sample-dependent weights, confidence-based weighting after probability calibration, and uncertainty-driven weighting in deep ensembles [8-11,31]. Such methods typically report gains on specific datasets, but rarely satisfy three conditions simultaneously: (i) all information used for weighting comes from the training and validation partitions; (ii) the equal-weight control use</w:t>
+      </w:r>
+      <w:r>
+        <w:t>s the same feature view and tuning budget; and (iii) paired significance tests and repeated-split stability are reported. Without these, "weighting helps" cannot be separated from "this particular split helped".</w:t>
+      </w:r>
+    </w:p>
+    <w:p>
+      <w:r>
+        <w:t>Recent open-set work adds extreme-value theory, prototype learning or autoencoder reconstruction error to construct rejection mechanisms [27,28,42,43]. Such methods optimise two objectives jointly - known-class discrimination and unknown-class rejection - and have a correspondingly different cost structure. We therefore report open-set behaviour as a diagnostic rather than folding it into the main conclusion.</w:t>
+      </w:r>
+    </w:p>
+    <w:p>
+      <w:pPr>
+        <w:pStyle w:val="21"/>
+      </w:pPr>
       <w:r>
         <w:lastRenderedPageBreak/>
-        <w:t>constant columns and collection artefacts. Some attack families were generated by a single tool in a single time window and are therefore highly homogeneous. Training and test partitions may share duplicates. Engelen and Timmerman, and Liu et al., show that preprocessing order and splitting choices alone can materially change reported performance [20,21]. These findings motivate H3: if protocol choices change conclusions, the protocol itself must become a reported and tested object. This position is part of</w:t>
-      </w:r>
-      <w:r>
-        <w:t xml:space="preserve"> a wider methodological critique of machine learning in security [22,23,26].</w:t>
-      </w:r>
-    </w:p>
-    <w:p>
-      <w:pPr>
-        <w:pStyle w:val="21"/>
-      </w:pPr>
-      <w:r>
-        <w:t>2.2 Feature selection and leakage</w:t>
-      </w:r>
-    </w:p>
-    <w:p>
-      <w:r>
-        <w:t>Filter selection is popular in this domain because it is cheap and interpretable. The chi-square statistic measures dependence between a discretised feature and the label [12], mutual information (MI) captures non-linear dependence, and analysis of variance (ANOVA) compares between-class with within-class variance [13]. All three are used here as controls.</w:t>
-      </w:r>
-    </w:p>
-    <w:p>
-      <w:r>
-        <w:t>The difficulty is that these statistics depend on the label distribution. Fitting a selector before splitting leaks test-label information through the feature ranking. Such leakage is common and hard to detect from a methods paragraph [22]. Our protocol fits every selector inside the training partition and refits it inside each cross-fitting fold, so the selector is subject to the same information boundary as the model.</w:t>
-      </w:r>
-    </w:p>
-    <w:p>
-      <w:pPr>
-        <w:pStyle w:val="21"/>
-      </w:pPr>
-      <w:r>
-        <w:t>2.3 Ensemble aggregation and adaptive weighting</w:t>
-      </w:r>
-    </w:p>
-    <w:p>
-      <w:r>
-        <w:t>Breiman's random forest combines bootstrapped trees through equal voting or probability averaging [1,2], justified by variance reduction when tree errors are imperfectly correlated. A natural generalisation replaces equal weights with unequal ones: if the reliability of each tree or expert can be estimated for a given sample, weight accordingly.</w:t>
-      </w:r>
-    </w:p>
-    <w:p>
-      <w:r>
-        <w:t>Implementations in the literature include validation-accuracy tree weighting, out-of-bag error weighting, meta-learners that predict sample-dependent weights, confidence-based weighting after probability calibration, and uncertainty-driven weighting in deep ensembles [8-11,31]. Such methods typically report gains on specific datasets, but rarely satisfy three conditions simultaneously: (i) all information used for weighting comes from the training and validation partitions; (ii) the equal-weight control use</w:t>
-      </w:r>
-      <w:r>
-        <w:t>s the same feature view and tuning budget; and (iii) paired significance tests and repeated-split stability are reported. Without these, "weighting helps" cannot be separated from "this particular split helped".</w:t>
-      </w:r>
-    </w:p>
-    <w:p>
-      <w:r>
-        <w:t>Recent open-set work adds extreme-value theory, prototype learning or autoencoder reconstruction error to construct rejection mechanisms [27,28,42,43]. Such methods optimise two objectives jointly - known-class discrimination and unknown-class rejection - and have a correspondingly different cost structure. We therefore report open-set behaviour as a diagnostic rather than folding it into the main conclusion.</w:t>
-      </w:r>
-    </w:p>
-    <w:p>
-      <w:pPr>
-        <w:pStyle w:val="21"/>
-      </w:pPr>
-      <w:r>
         <w:t>2.4 Probability quality, open-set rejection and deployment cost</w:t>
       </w:r>
     </w:p>
@@ -442,11 +450,7 @@
     </w:p>
     <w:p>
       <w:r>
-        <w:t xml:space="preserve">Deployment constraints form an independent axis. A gateway may allow only a few milliseconds per flow, and the classifier-stage latency must be predictable. A design that matches an equal-weight forest on offline Macro-F1 but </w:t>
-      </w:r>
-      <w:r>
-        <w:lastRenderedPageBreak/>
-        <w:t>multiplies inference latency has no exchange value in deployment. We report P50, P95 and P99 single-row latency and distinguish single-thread from library-default threading.</w:t>
+        <w:t>Deployment constraints form an independent axis. A gateway may allow only a few milliseconds per flow, and the classifier-stage latency must be predictable. A design that matches an equal-weight forest on offline Macro-F1 but multiplies inference latency has no exchange value in deployment. We report P50, P95 and P99 single-row latency and distinguish single-thread from library-default threading.</w:t>
       </w:r>
     </w:p>
     <w:p>
@@ -1035,7 +1039,7 @@
           <w:noProof/>
         </w:rPr>
         <w:drawing>
-          <wp:inline distT="0" distB="0" distL="0" distR="0" wp14:anchorId="1CF6802B" wp14:editId="379FAEFD">
+          <wp:inline distT="0" distB="0" distL="0" distR="0" wp14:anchorId="639AA77D" wp14:editId="3F185142">
             <wp:extent cx="5760720" cy="2734826"/>
             <wp:effectExtent l="0" t="0" r="0" b="0"/>
             <wp:docPr id="1" name="Picture 1"/>
@@ -1085,6 +1089,11 @@
       </w:r>
     </w:p>
     <w:p>
+      <w:r>
+        <w:t>The section proceeds from provenance to population: 3.1 records the sources, retrieval dates and licences, 3.2 audits CIC-IDS2017 and defines the two research populations, 3.3 describes the two external corpora, 3.4 fixes the leakage-controlled protocol, 3.5 states the estimands and the statistical procedure, and 3.6 lists the threats the design already excludes, leaving the residual ones to 6.5.</w:t>
+      </w:r>
+    </w:p>
+    <w:p>
       <w:pPr>
         <w:pStyle w:val="21"/>
       </w:pPr>
@@ -1546,6 +1555,7 @@
               <w:rPr>
                 <w:sz w:val="16"/>
               </w:rPr>
+              <w:lastRenderedPageBreak/>
               <w:t>N-BaIoT</w:t>
             </w:r>
           </w:p>
@@ -2045,6 +2055,7 @@
               <w:rPr>
                 <w:sz w:val="16"/>
               </w:rPr>
+              <w:lastRenderedPageBreak/>
               <w:t>After physical-range screening</w:t>
             </w:r>
           </w:p>
@@ -2177,14 +2188,7 @@
               <w:rPr>
                 <w:sz w:val="16"/>
               </w:rPr>
-              <w:t xml:space="preserve">After class capping (natural-prior </w:t>
-            </w:r>
-            <w:r>
-              <w:rPr>
-                <w:sz w:val="16"/>
-              </w:rPr>
-              <w:lastRenderedPageBreak/>
-              <w:t>population)</w:t>
+              <w:t>After class capping (natural-prior population)</w:t>
             </w:r>
           </w:p>
         </w:tc>
@@ -2200,7 +2204,6 @@
               <w:rPr>
                 <w:sz w:val="16"/>
               </w:rPr>
-              <w:lastRenderedPageBreak/>
               <w:t>53,237</w:t>
             </w:r>
           </w:p>
@@ -2233,14 +2236,7 @@
               <w:rPr>
                 <w:sz w:val="16"/>
               </w:rPr>
-              <w:t xml:space="preserve">20,000 per class, observed </w:t>
-            </w:r>
-            <w:r>
-              <w:rPr>
-                <w:sz w:val="16"/>
-              </w:rPr>
-              <w:lastRenderedPageBreak/>
-              <w:t>proportions retained</w:t>
+              <w:t>20,000 per class, observed proportions retained</w:t>
             </w:r>
           </w:p>
         </w:tc>
@@ -2258,7 +2254,6 @@
               <w:rPr>
                 <w:sz w:val="16"/>
               </w:rPr>
-              <w:lastRenderedPageBreak/>
               <w:t>Train / validation / test</w:t>
             </w:r>
           </w:p>
@@ -2393,7 +2388,7 @@
           <w:noProof/>
         </w:rPr>
         <w:drawing>
-          <wp:inline distT="0" distB="0" distL="0" distR="0" wp14:anchorId="0408F0B0" wp14:editId="66063C11">
+          <wp:inline distT="0" distB="0" distL="0" distR="0" wp14:anchorId="22F22B91" wp14:editId="3F7E244E">
             <wp:extent cx="5760720" cy="2722098"/>
             <wp:effectExtent l="0" t="0" r="0" b="0"/>
             <wp:docPr id="2" name="Picture 2"/>
@@ -2718,6 +2713,11 @@
       </w:pPr>
       <w:r>
         <w:t>4. Method</w:t>
+      </w:r>
+    </w:p>
+    <w:p>
+      <w:r>
+        <w:t>The method has five parts: the feature views and base learners (4.1), the sample-conditional weighting rule (4.2), the identifiability conditions that bound when any weighting can act (4.3), the complexity argument (4.4), and the controls and ablations that share one budget (4.5).</w:t>
       </w:r>
     </w:p>
     <w:p>
@@ -3359,7 +3359,6 @@
     </w:p>
     <w:p>
       <w:r>
-        <w:lastRenderedPageBreak/>
         <w:t xml:space="preserve">Fused probabilities are then temperature-scaled on the validation partition [29], and a Mondrian (class-conditional) conformal predictor provides an optional </w:t>
       </w:r>
       <w:r>
@@ -3381,7 +3380,7 @@
           <w:noProof/>
         </w:rPr>
         <w:drawing>
-          <wp:inline distT="0" distB="0" distL="0" distR="0" wp14:anchorId="183B57DB" wp14:editId="37A633D1">
+          <wp:inline distT="0" distB="0" distL="0" distR="0" wp14:anchorId="65439AE0" wp14:editId="6D997BB5">
             <wp:extent cx="5760720" cy="3482709"/>
             <wp:effectExtent l="0" t="0" r="0" b="0"/>
             <wp:docPr id="3" name="Picture 3"/>
@@ -3638,6 +3637,7 @@
         <w:pStyle w:val="21"/>
       </w:pPr>
       <w:r>
+        <w:lastRenderedPageBreak/>
         <w:t>4.3 Identifiability: three conditions under which the gate cannot act</w:t>
       </w:r>
     </w:p>
@@ -3651,7 +3651,6 @@
         <w:rPr>
           <w:b/>
         </w:rPr>
-        <w:lastRenderedPageBreak/>
         <w:t>Condition 1 (convex invariance).</w:t>
       </w:r>
       <w:r>
@@ -4748,16 +4747,16 @@
         <w:pStyle w:val="21"/>
       </w:pPr>
       <w:r>
+        <w:lastRenderedPageBreak/>
         <w:t>4.4 Complexity</w:t>
       </w:r>
     </w:p>
     <w:p>
       <w:r>
-        <w:t xml:space="preserve">Let n be the number of training rows, d the original feature count, k the selected feature count, T the number of trees, K the number of cross-fitting folds and Q = 4 the number of experts. The dominant cost of the cross-fitting stage is approximately O(QK T n log n), the final refit stage costs O(QT n log n), and filter selection contributes O(Q n d). Inference requires one tree traversal per expert plus the risk models, about O(QT log n) per row. RCCF is therefore </w:t>
-      </w:r>
-      <w:r>
-        <w:lastRenderedPageBreak/>
-        <w:t>substantially more expensive than a single equal-weight forest at both ends, and Section 5.6 quantifies that cost. All experiments ran on a single workstation with 8 physical cores (16 logical), 35.8 GB of RAM and Windows 10 (build 10.0.26200), using Python 3.11.4, scikit-learn 1.9.0, XGBoost 3.2.0, NumPy 2.4.6, pandas 3.0.5 and Matplotlib 3.11.1. The reported timings are single-machine measurements and are not portability claims. The software stack is documented in [44-47].</w:t>
+        <w:t>Let n be the number of training rows, d the original feature count, k the selected feature count, T the number of trees, K the number of cross-fitting folds and Q = 4 the number of experts. The dominant cost of the cross-fitting stage is approximately O(QK T n log n), the final refit stage costs O(QT n log n), and filter selection contributes O(Q n d). Inference requires one tree traversal per expert plus the risk models, about O(QT log n) per row. RCCF is therefore substantially more expensive than a singl</w:t>
+      </w:r>
+      <w:r>
+        <w:t>e equal-weight forest at both ends, and Section 5.6 quantifies that cost. All experiments ran on a single workstation with 8 physical cores (16 logical), 35.8 GB of RAM and Windows 10 (build 10.0.26200), using Python 3.11.4, scikit-learn 1.9.0, XGBoost 3.2.0, NumPy 2.4.6, pandas 3.0.5 and Matplotlib 3.11.1. The reported timings are single-machine measurements and are not portability claims. The software stack is documented in [44-47].</w:t>
       </w:r>
     </w:p>
     <w:p>
@@ -4873,7 +4872,7 @@
     </w:p>
     <w:p>
       <w:r>
-        <w:t>The chapter follows RQ1 to RQ4. Section 5.1 answers the feature-selection question, Sections 5.2 and 5.3 together answer the weighting question, Section 5.4 addresses protocol robustness, Section 5.5 addresses external validity, and Section 5.6 reports calibration, robustness, latency and open-set behaviour.</w:t>
+        <w:t>The chapter follows RQ1 to RQ4. RQ1 is answered in 5.1; RQ2 in 5.2, with the mechanism that explains its outcome in 5.3; RQ3 in 5.4 and again at scale in 5.7; RQ4 in 5.5. Section 5.6 reports calibration, robustness, latency and open-set behaviour, which qualify the comparisons without answering a question of their own.</w:t>
       </w:r>
     </w:p>
     <w:p>
@@ -4899,6 +4898,7 @@
     </w:p>
     <w:p>
       <w:r>
+        <w:lastRenderedPageBreak/>
         <w:t>With k = 60 fixed, the chi-square and full-feature views compare as follows.</w:t>
       </w:r>
     </w:p>
@@ -5139,7 +5139,6 @@
               <w:rPr>
                 <w:sz w:val="16"/>
               </w:rPr>
-              <w:lastRenderedPageBreak/>
               <w:t>Ten repeated splits (mean +/- s.d.)</w:t>
             </w:r>
           </w:p>
@@ -6945,7 +6944,14 @@
               <w:rPr>
                 <w:sz w:val="16"/>
               </w:rPr>
-              <w:t>XGBoost (independently tuned, validation-selected)</w:t>
+              <w:t xml:space="preserve">XGBoost (independently </w:t>
+            </w:r>
+            <w:r>
+              <w:rPr>
+                <w:sz w:val="16"/>
+              </w:rPr>
+              <w:lastRenderedPageBreak/>
+              <w:t>tuned, validation-selected)</w:t>
             </w:r>
           </w:p>
         </w:tc>
@@ -6961,6 +6967,7 @@
               <w:rPr>
                 <w:sz w:val="16"/>
               </w:rPr>
+              <w:lastRenderedPageBreak/>
               <w:t>0.96304</w:t>
             </w:r>
           </w:p>
@@ -7095,7 +7102,6 @@
         <w:rPr>
           <w:b/>
         </w:rPr>
-        <w:lastRenderedPageBreak/>
         <w:t>First, the headline result is a near-zero difference.</w:t>
       </w:r>
       <w:r>
@@ -7120,7 +7126,7 @@
           <w:noProof/>
         </w:rPr>
         <w:drawing>
-          <wp:inline distT="0" distB="0" distL="0" distR="0" wp14:anchorId="7E1EA8CC" wp14:editId="793E8C12">
+          <wp:inline distT="0" distB="0" distL="0" distR="0" wp14:anchorId="342BC405" wp14:editId="0E0BB1A3">
             <wp:extent cx="5760720" cy="2356272"/>
             <wp:effectExtent l="0" t="0" r="0" b="0"/>
             <wp:docPr id="4" name="Picture 4"/>
@@ -7434,6 +7440,7 @@
               <w:rPr>
                 <w:sz w:val="16"/>
               </w:rPr>
+              <w:lastRenderedPageBreak/>
               <w:t>RCCF - equal RF (chi-square)</w:t>
             </w:r>
           </w:p>
@@ -7791,7 +7798,6 @@
               <w:rPr>
                 <w:sz w:val="16"/>
               </w:rPr>
-              <w:lastRenderedPageBreak/>
               <w:t>RCCF - ExtraTrees (chi-square)</w:t>
             </w:r>
           </w:p>
@@ -8051,6 +8057,7 @@
     </w:p>
     <w:p>
       <w:r>
+        <w:lastRenderedPageBreak/>
         <w:t>Per-seed metrics, per-class reports, normalised confusion matrices and the equivalence tests are provided in Supplementary S05-S07 and S20.</w:t>
       </w:r>
     </w:p>
@@ -8075,9 +8082,8 @@
         <w:rPr>
           <w:noProof/>
         </w:rPr>
-        <w:lastRenderedPageBreak/>
         <w:drawing>
-          <wp:inline distT="0" distB="0" distL="0" distR="0" wp14:anchorId="6F909961" wp14:editId="19590E69">
+          <wp:inline distT="0" distB="0" distL="0" distR="0" wp14:anchorId="71AA6811" wp14:editId="31675AAC">
             <wp:extent cx="5760720" cy="2045294"/>
             <wp:effectExtent l="0" t="0" r="0" b="0"/>
             <wp:docPr id="5" name="Picture 5"/>
@@ -8252,7 +8258,7 @@
         </w:rPr>
         <w:lastRenderedPageBreak/>
         <w:drawing>
-          <wp:inline distT="0" distB="0" distL="0" distR="0" wp14:anchorId="088A827A" wp14:editId="44BC3BDE">
+          <wp:inline distT="0" distB="0" distL="0" distR="0" wp14:anchorId="650E541F" wp14:editId="71BE08B8">
             <wp:extent cx="5760720" cy="2308234"/>
             <wp:effectExtent l="0" t="0" r="0" b="0"/>
             <wp:docPr id="6" name="Picture 6"/>
@@ -8984,7 +8990,7 @@
         </w:rPr>
         <w:lastRenderedPageBreak/>
         <w:drawing>
-          <wp:inline distT="0" distB="0" distL="0" distR="0" wp14:anchorId="04517A4F" wp14:editId="44CDE730">
+          <wp:inline distT="0" distB="0" distL="0" distR="0" wp14:anchorId="2261646B" wp14:editId="0D56342A">
             <wp:extent cx="5760720" cy="2167923"/>
             <wp:effectExtent l="0" t="0" r="0" b="0"/>
             <wp:docPr id="7" name="Picture 7"/>
@@ -9092,7 +9098,7 @@
           <w:noProof/>
         </w:rPr>
         <w:drawing>
-          <wp:inline distT="0" distB="0" distL="0" distR="0" wp14:anchorId="2A2B0903" wp14:editId="50057322">
+          <wp:inline distT="0" distB="0" distL="0" distR="0" wp14:anchorId="3F1BFA30" wp14:editId="2F59CF7E">
             <wp:extent cx="5760720" cy="2258878"/>
             <wp:effectExtent l="0" t="0" r="0" b="0"/>
             <wp:docPr id="8" name="Picture 8"/>
@@ -9276,7 +9282,7 @@
           <w:noProof/>
         </w:rPr>
         <w:drawing>
-          <wp:inline distT="0" distB="0" distL="0" distR="0" wp14:anchorId="7C1EBE48" wp14:editId="4276D5AE">
+          <wp:inline distT="0" distB="0" distL="0" distR="0" wp14:anchorId="2379D643" wp14:editId="141D98BE">
             <wp:extent cx="5760720" cy="2516852"/>
             <wp:effectExtent l="0" t="0" r="0" b="0"/>
             <wp:docPr id="9" name="Picture 9"/>
@@ -9413,7 +9419,7 @@
           <w:noProof/>
         </w:rPr>
         <w:drawing>
-          <wp:inline distT="0" distB="0" distL="0" distR="0" wp14:anchorId="63F0420F" wp14:editId="13232F17">
+          <wp:inline distT="0" distB="0" distL="0" distR="0" wp14:anchorId="4E7960AD" wp14:editId="217EBAC5">
             <wp:extent cx="5760720" cy="2223311"/>
             <wp:effectExtent l="0" t="0" r="0" b="0"/>
             <wp:docPr id="10" name="Picture 10"/>
@@ -9503,7 +9509,7 @@
           <w:noProof/>
         </w:rPr>
         <w:drawing>
-          <wp:inline distT="0" distB="0" distL="0" distR="0" wp14:anchorId="47D23F93" wp14:editId="67DDC969">
+          <wp:inline distT="0" distB="0" distL="0" distR="0" wp14:anchorId="15CFDCF4" wp14:editId="625C37C2">
             <wp:extent cx="5760720" cy="2538527"/>
             <wp:effectExtent l="0" t="0" r="0" b="0"/>
             <wp:docPr id="11" name="Picture 11"/>
@@ -10328,6 +10334,11 @@
       </w:r>
     </w:p>
     <w:p>
+      <w:r>
+        <w:t>The discussion reads the results in four steps: the failure conditions and their hierarchy (6.1), how to interpret reported weighting gains in that light (6.2), a decision matrix for practitioners (6.3), reporting recommendations for future evaluations (6.4), and the limitations that remain (6.5).</w:t>
+      </w:r>
+    </w:p>
+    <w:p>
       <w:pPr>
         <w:pStyle w:val="21"/>
       </w:pPr>
@@ -10392,6 +10403,7 @@
     </w:p>
     <w:p>
       <w:r>
+        <w:lastRenderedPageBreak/>
         <w:t xml:space="preserve">The four conditions yield an operational diagnostic sequence: </w:t>
       </w:r>
       <w:r>
@@ -10401,11 +10413,7 @@
         <w:t>first measure the weight entropy, then the prediction-disagreement rate, then the spread across member scores, and only then look at the performance difference.</w:t>
       </w:r>
       <w:r>
-        <w:t xml:space="preserve"> If entropy is close to 1 and the disagreement count is 0, further tuning of the gate will not help, because </w:t>
-      </w:r>
-      <w:r>
-        <w:lastRenderedPageBreak/>
-        <w:t>the problem does not lie in the gate. If the member scores span more than the difference you care about, the fusion is bounded by its weakest member and no weighting scheme will recover it.</w:t>
+        <w:t xml:space="preserve"> If entropy is close to 1 and the disagreement count is 0, further tuning of the gate will not help, because the problem does not lie in the gate. If the member scores span more than the difference you care about, the fusion is bounded by its weakest member and no weighting scheme will recover it.</w:t>
       </w:r>
     </w:p>
     <w:p>
@@ -11001,7 +11009,14 @@
               <w:rPr>
                 <w:sz w:val="16"/>
               </w:rPr>
-              <w:t>Adopt this protocol and release per-row predictions</w:t>
+              <w:t xml:space="preserve">Adopt this protocol and release </w:t>
+            </w:r>
+            <w:r>
+              <w:rPr>
+                <w:sz w:val="16"/>
+              </w:rPr>
+              <w:lastRenderedPageBreak/>
+              <w:t>per-row predictions</w:t>
             </w:r>
           </w:p>
         </w:tc>
@@ -11017,7 +11032,15 @@
               <w:rPr>
                 <w:sz w:val="16"/>
               </w:rPr>
-              <w:t>All aggregate metrics can be recomputed from released probabilities</w:t>
+              <w:lastRenderedPageBreak/>
+              <w:t xml:space="preserve">All aggregate metrics can be </w:t>
+            </w:r>
+            <w:r>
+              <w:rPr>
+                <w:sz w:val="16"/>
+              </w:rPr>
+              <w:lastRenderedPageBreak/>
+              <w:t>recomputed from released probabilities</w:t>
             </w:r>
           </w:p>
         </w:tc>
@@ -11033,7 +11056,15 @@
               <w:rPr>
                 <w:sz w:val="16"/>
               </w:rPr>
-              <w:t>Extra storage and version management</w:t>
+              <w:lastRenderedPageBreak/>
+              <w:t xml:space="preserve">Extra storage and version </w:t>
+            </w:r>
+            <w:r>
+              <w:rPr>
+                <w:sz w:val="16"/>
+              </w:rPr>
+              <w:lastRenderedPageBreak/>
+              <w:t>management</w:t>
             </w:r>
           </w:p>
         </w:tc>
@@ -11051,6 +11082,7 @@
               <w:rPr>
                 <w:sz w:val="16"/>
               </w:rPr>
+              <w:lastRenderedPageBreak/>
               <w:t>Decide whether to deploy conditional weighting</w:t>
             </w:r>
           </w:p>
@@ -11067,14 +11099,7 @@
               <w:rPr>
                 <w:sz w:val="16"/>
               </w:rPr>
-              <w:t xml:space="preserve">Equal voting on capped populations; do not deploy on </w:t>
-            </w:r>
-            <w:r>
-              <w:rPr>
-                <w:sz w:val="16"/>
-              </w:rPr>
-              <w:lastRenderedPageBreak/>
-              <w:t>strongly imbalanced corpora</w:t>
+              <w:t>Equal voting on capped populations; do not deploy on strongly imbalanced corpora</w:t>
             </w:r>
           </w:p>
         </w:tc>
@@ -11090,15 +11115,7 @@
               <w:rPr>
                 <w:sz w:val="16"/>
               </w:rPr>
-              <w:lastRenderedPageBreak/>
-              <w:t xml:space="preserve">Equivalence at 53,237 flows against a deficit of -0.005533 on </w:t>
-            </w:r>
-            <w:r>
-              <w:rPr>
-                <w:sz w:val="16"/>
-              </w:rPr>
-              <w:lastRenderedPageBreak/>
-              <w:t>the uncapped 2,429,503-flow corpus, all ten seeds</w:t>
+              <w:t>Equivalence at 53,237 flows against a deficit of -0.005533 on the uncapped 2,429,503-flow corpus, all ten seeds</w:t>
             </w:r>
           </w:p>
         </w:tc>
@@ -11114,15 +11131,7 @@
               <w:rPr>
                 <w:sz w:val="16"/>
               </w:rPr>
-              <w:lastRenderedPageBreak/>
-              <w:t xml:space="preserve">Forgoes a mechanism whose training cost is 175 times that of </w:t>
-            </w:r>
-            <w:r>
-              <w:rPr>
-                <w:sz w:val="16"/>
-              </w:rPr>
-              <w:lastRenderedPageBreak/>
-              <w:t>one forest</w:t>
+              <w:t>Forgoes a mechanism whose training cost is 175 times that of one forest</w:t>
             </w:r>
           </w:p>
         </w:tc>
@@ -11340,7 +11349,129 @@
         <w:t>The equivalence depends on how the population is built.</w:t>
       </w:r>
       <w:r>
-        <w:t xml:space="preserve"> It holds on the 53,237-flow natural-prior population and on the 7.8-fold larger one, but not on the fully uncapped 2,429,503-flow corpus, where the same comparison becomes a small, consistent deficit. The statement that conditional weighting is indistinguishable from equal voting must therefore always be quoted together with the population it was measured on; it is not a scale-free property.</w:t>
+        <w:t xml:space="preserve"> It holds on the 53,237-flow natural-prior population and on the 7.8-fold larger one, but not on the fully uncapped 2,429,503-flow corpus, where the same comparison </w:t>
+      </w:r>
+      <w:r>
+        <w:lastRenderedPageBreak/>
+        <w:t>becomes a small, consistent deficit. The statement that conditional weighting is indistinguishable from equal voting must therefore always be quoted together with the population it was measured on; it is not a scale-free property.</w:t>
+      </w:r>
+    </w:p>
+    <w:p>
+      <w:r>
+        <w:rPr>
+          <w:b/>
+        </w:rPr>
+        <w:t>File-level experiments are not temporal holdouts.</w:t>
+      </w:r>
+      <w:r>
+        <w:t xml:space="preserve"> The files of CIC-IDS2017 cover different class sets, so a category-complete temporal protocol cannot be constructed from them. The file-level results support coverage and risk analysis only and must not be described as cross-time generalisation.</w:t>
+      </w:r>
+    </w:p>
+    <w:p>
+      <w:r>
+        <w:rPr>
+          <w:b/>
+        </w:rPr>
+        <w:t>External datasets are independent benchmarks, not transfer experiments.</w:t>
+      </w:r>
+      <w:r>
+        <w:t xml:space="preserve"> NSL-KDD, UNSW-NB15 and CIC-IDS2017 use incompatible label spaces. We do not align labels or train across datasets, and the three sets of scores must not be pooled or averaged.</w:t>
+      </w:r>
+    </w:p>
+    <w:p>
+      <w:r>
+        <w:rPr>
+          <w:b/>
+        </w:rPr>
+        <w:t>Latency measurements exclude the end-to-end path.</w:t>
+      </w:r>
+      <w:r>
+        <w:t xml:space="preserve"> The reported milliseconds start from a numerical feature matrix and exclude packet capture, flow reassembly, feature extraction, alert transport and model hot-swapping.</w:t>
+      </w:r>
+    </w:p>
+    <w:p>
+      <w:r>
+        <w:rPr>
+          <w:b/>
+        </w:rPr>
+        <w:t>Near-duplicates are removed only in their exact form.</w:t>
+      </w:r>
+      <w:r>
+        <w:t xml:space="preserve"> The introduction identifies near-duplicate flows as a hazard of public datasets, and the audit removes exact duplicate feature vectors. Rounding every feature to four significant digits and hashing the result shows that a further 0.36% of the study population forms near-duplicate groups at that resolution, and that 104 rows sit in near-duplicate groups that span the partitions, of which 17 test rows (0.21% of the test set) share a rounded feature vector with a training row. Removing those rows changes Macr</w:t>
+      </w:r>
+      <w:r>
+        <w:t>o-F1 by at most 0.00057 for any of the three models, so the overlap cannot explain the reported differences; coarser resolutions are reported in the supplementary material.</w:t>
+      </w:r>
+    </w:p>
+    <w:p>
+      <w:r>
+        <w:rPr>
+          <w:b/>
+        </w:rPr>
+        <w:t>Four datasets were evaluated, and every corpus comes from one collection programme.</w:t>
+      </w:r>
+      <w:r>
+        <w:t xml:space="preserve"> The conclusions are conditional on CIC-IDS2017 (both its capped populations and the full deduplicated corpus), NSL-KDD, UNSW-NB15 and N-BaIoT. N-BaIoT is saturated for flow-feature classifiers (every model at or above 0.9998 Macro-F1), so it probes the mechanics of the aggregation step rather than discrimination difficulty, and the external datasets remain independent native-label benchmarks rather than transfer tests. None of the four datasets represents production traffic, and no time-separated holdout o</w:t>
+      </w:r>
+      <w:r>
+        <w:t>n a common testbed exists in any of them.</w:t>
+      </w:r>
+    </w:p>
+    <w:p>
+      <w:r>
+        <w:rPr>
+          <w:b/>
+        </w:rPr>
+        <w:t>Adversarial robustness was not assessed.</w:t>
+      </w:r>
+      <w:r>
+        <w:t xml:space="preserve"> Only random perturbations and feature masking were applied. No evasion or gradient-based attack was constructed, and the reported degradation figures are not robustness guarantees against an adaptive adversary.</w:t>
+      </w:r>
+    </w:p>
+    <w:p>
+      <w:r>
+        <w:rPr>
+          <w:b/>
+        </w:rPr>
+        <w:t>Unknown-family support is uneven.</w:t>
+      </w:r>
+      <w:r>
+        <w:t xml:space="preserve"> PortScan contributes 158,930 records while Infiltration contributes 36 and Heartbleed 11. Open-set metrics are highly sensitive to which family is held out, so only per-family results are reported and no pooled open-set conclusion is drawn; the family-combination matrix is in Supplementary S30.</w:t>
+      </w:r>
+    </w:p>
+    <w:p>
+      <w:r>
+        <w:rPr>
+          <w:b/>
+        </w:rPr>
+        <w:t>Bootstrap intervals have a limited interpretation.</w:t>
+      </w:r>
+      <w:r>
+        <w:t xml:space="preserve"> The paired bootstrap quantifies test-row resampling uncertainty only; it does not capture changes in network environment, temporal drift or traffic composition.</w:t>
+      </w:r>
+    </w:p>
+    <w:p>
+      <w:r>
+        <w:rPr>
+          <w:b/>
+        </w:rPr>
+        <w:t>Single hardware platform and single implementation.</w:t>
+      </w:r>
+      <w:r>
+        <w:t xml:space="preserve"> Latency depends on hardware, the BLAS backend and thread settings. The environment is fixed and recorded, but no cross-platform portability is claimed.</w:t>
+      </w:r>
+    </w:p>
+    <w:p>
+      <w:pPr>
+        <w:pStyle w:val="1"/>
+      </w:pPr>
+      <w:r>
+        <w:t>7. Conclusion</w:t>
+      </w:r>
+    </w:p>
+    <w:p>
+      <w:r>
+        <w:t>This study tested the widely adopted assumption that sample-conditional ensemble weighting is better than equal voting, under a strict leakage-controlled protocol. Three conclusions follow.</w:t>
       </w:r>
     </w:p>
     <w:p>
@@ -11349,10 +11480,13 @@
           <w:b/>
         </w:rPr>
         <w:lastRenderedPageBreak/>
-        <w:t>File-level experiments are not temporal holdouts.</w:t>
-      </w:r>
-      <w:r>
-        <w:t xml:space="preserve"> The files of CIC-IDS2017 cover different class sets, so a category-complete temporal protocol cannot be constructed from them. The file-level results support coverage and risk analysis only and must not be described as cross-time generalisation.</w:t>
+        <w:t>First, relative to the most direct equal-weight control the gain lies inside an equivalence boundary.</w:t>
+      </w:r>
+      <w:r>
+        <w:t xml:space="preserve"> Averaged over ten seeds on the natural-prior population of CIC-IDS2017, the Macro-F1 difference between conditional weighting and an equal-weight chi-square forest is -0.000456, with the per-seed sign split five to five. Both the seed-level 90% interval [-0.00112, +0.00021] and the test-row paired bootstrap interval [-0.00425, +0.00338] lie inside equivalence margins of 0.005 and 0.01. The four experts disagree on no test row, and the normalised weight entropy is 0.99998. The cost is about an 80-fold incre</w:t>
+      </w:r>
+      <w:r>
+        <w:t>ase in training time and a fivefold increase in batch inference time.</w:t>
       </w:r>
     </w:p>
     <w:p>
@@ -11360,132 +11494,7 @@
         <w:rPr>
           <w:b/>
         </w:rPr>
-        <w:t>External datasets are independent benchmarks, not transfer experiments.</w:t>
-      </w:r>
-      <w:r>
-        <w:t xml:space="preserve"> NSL-KDD, UNSW-NB15 and CIC-IDS2017 use incompatible label spaces. We do not align labels or train across datasets, and the three sets of scores must not be pooled or averaged.</w:t>
-      </w:r>
-    </w:p>
-    <w:p>
-      <w:r>
-        <w:rPr>
-          <w:b/>
-        </w:rPr>
-        <w:t>Latency measurements exclude the end-to-end path.</w:t>
-      </w:r>
-      <w:r>
-        <w:t xml:space="preserve"> The reported milliseconds start from a numerical feature matrix and exclude packet capture, flow reassembly, feature extraction, alert transport and model hot-swapping.</w:t>
-      </w:r>
-    </w:p>
-    <w:p>
-      <w:r>
-        <w:rPr>
-          <w:b/>
-        </w:rPr>
-        <w:t>Near-duplicates are removed only in their exact form.</w:t>
-      </w:r>
-      <w:r>
-        <w:t xml:space="preserve"> The introduction identifies near-duplicate flows as a hazard of public datasets, and the audit removes exact duplicate feature vectors. Rounding every feature to four significant digits and hashing the result shows that a further 0.36% of the study population forms near-duplicate groups at that resolution, and that 104 rows sit in near-duplicate groups that span the partitions, of which 17 test rows (0.21% of the test set) share a rounded feature vector with a training row. Removing those rows changes Macr</w:t>
-      </w:r>
-      <w:r>
-        <w:t>o-F1 by at most 0.00057 for any of the three models, so the overlap cannot explain the reported differences; coarser resolutions are reported in the supplementary material.</w:t>
-      </w:r>
-    </w:p>
-    <w:p>
-      <w:r>
-        <w:rPr>
-          <w:b/>
-        </w:rPr>
-        <w:t>Four datasets were evaluated, and every corpus comes from one collection programme.</w:t>
-      </w:r>
-      <w:r>
-        <w:t xml:space="preserve"> The conclusions are conditional on CIC-IDS2017 (both its capped populations and the full deduplicated corpus), NSL-KDD, UNSW-NB15 and N-BaIoT. N-BaIoT is saturated for flow-feature classifiers (every model at or above 0.9998 Macro-F1), so it probes the mechanics of the aggregation step rather than discrimination difficulty, and the external datasets remain independent native-label benchmarks rather than transfer tests. None of the four datasets represents production traffic, and no time-separated holdout o</w:t>
-      </w:r>
-      <w:r>
-        <w:t>n a common testbed exists in any of them.</w:t>
-      </w:r>
-    </w:p>
-    <w:p>
-      <w:r>
-        <w:rPr>
-          <w:b/>
-        </w:rPr>
-        <w:t>Adversarial robustness was not assessed.</w:t>
-      </w:r>
-      <w:r>
-        <w:t xml:space="preserve"> Only random perturbations and feature masking were applied. No evasion or gradient-based attack was constructed, and the reported degradation figures are not robustness guarantees against an adaptive adversary.</w:t>
-      </w:r>
-    </w:p>
-    <w:p>
-      <w:r>
-        <w:rPr>
-          <w:b/>
-        </w:rPr>
-        <w:t>Unknown-family support is uneven.</w:t>
-      </w:r>
-      <w:r>
-        <w:t xml:space="preserve"> PortScan contributes 158,930 records while Infiltration contributes 36 and Heartbleed 11. Open-set metrics are highly sensitive to which family is held out, so only per-family results are reported and no pooled open-set conclusion is drawn; the family-combination matrix is in Supplementary S30.</w:t>
-      </w:r>
-    </w:p>
-    <w:p>
-      <w:r>
-        <w:rPr>
-          <w:b/>
-        </w:rPr>
-        <w:t>Bootstrap intervals have a limited interpretation.</w:t>
-      </w:r>
-      <w:r>
-        <w:t xml:space="preserve"> The paired bootstrap quantifies test-row resampling uncertainty only; it does not capture changes in network environment, temporal drift or traffic composition.</w:t>
-      </w:r>
-    </w:p>
-    <w:p>
-      <w:r>
-        <w:rPr>
-          <w:b/>
-        </w:rPr>
-        <w:t>Single hardware platform and single implementation.</w:t>
-      </w:r>
-      <w:r>
-        <w:t xml:space="preserve"> Latency depends on hardware, the BLAS backend and thread settings. The environment is fixed and recorded, but no cross-platform portability is claimed.</w:t>
-      </w:r>
-    </w:p>
-    <w:p>
-      <w:pPr>
-        <w:pStyle w:val="1"/>
-      </w:pPr>
-      <w:r>
-        <w:t>7. Conclusion</w:t>
-      </w:r>
-    </w:p>
-    <w:p>
-      <w:r>
-        <w:t>This study tested the widely adopted assumption that sample-conditional ensemble weighting is better than equal voting, under a strict leakage-controlled protocol. Three conclusions follow.</w:t>
-      </w:r>
-    </w:p>
-    <w:p>
-      <w:r>
-        <w:rPr>
-          <w:b/>
-        </w:rPr>
-        <w:t>First, relative to the most direct equal-weight control the gain lies inside an equivalence boundary.</w:t>
-      </w:r>
-      <w:r>
-        <w:t xml:space="preserve"> Averaged over ten seeds on the natural-prior population of CIC-IDS2017, the Macro-F1 difference between conditional weighting and an equal-weight chi-square forest is -0.000456, with the per-seed sign split five to five. Both the seed-level 90% interval [-0.00112, +0.00021] and the test-row paired bootstrap interval [-0.00425, +0.00338] lie </w:t>
-      </w:r>
-      <w:r>
-        <w:lastRenderedPageBreak/>
-        <w:t>inside equivalence margins of 0.005 and 0.01. The four experts disagree on no test row, and the normalised weight entropy is 0.99998. The cost is about an 80-fold incre</w:t>
-      </w:r>
-      <w:r>
-        <w:t>ase in training time and a fivefold increase in batch inference time.</w:t>
-      </w:r>
-    </w:p>
-    <w:p>
-      <w:r>
-        <w:rPr>
-          <w:b/>
-        </w:rPr>
-        <w:t>A qualification on that equivalence.</w:t>
+        <w:t>A qualification on the first conclusion.</w:t>
       </w:r>
       <w:r>
         <w:t xml:space="preserve"> It is a property of the population, not of the mechanism. On the fully uncapped 2,429,503-flow corpus the same comparison turns into a consistent deficit of -0.005533 across all ten seeds (equivalent at 0.01 but not at 0.005), at a 175-fold training cost. The cause is not the weighting - Section 5.3 shows the weights never move a label - but the price of averaging over feature views whose quality diverges at scale: the full-feature view falls 0.021397 behind the chi-square view, and one such expert inside </w:t>
@@ -11554,6 +11563,7 @@
         <w:pStyle w:val="1"/>
       </w:pPr>
       <w:r>
+        <w:lastRenderedPageBreak/>
         <w:t>Funding</w:t>
       </w:r>
     </w:p>
@@ -11567,7 +11577,6 @@
         <w:pStyle w:val="1"/>
       </w:pPr>
       <w:r>
-        <w:lastRenderedPageBreak/>
         <w:t>Declaration of competing interest</w:t>
       </w:r>
     </w:p>
@@ -11756,6 +11765,7 @@
         </w:numPr>
       </w:pPr>
       <w:r>
+        <w:lastRenderedPageBreak/>
         <w:t>Liu H, Setiono R. Chi2: Feature selection and discretization of numeric attributes. ICTAI 1995: 388-391. DOI:10.1109/TAI.1995.479783.</w:t>
       </w:r>
     </w:p>
@@ -11780,7 +11790,6 @@
         </w:numPr>
       </w:pPr>
       <w:r>
-        <w:lastRenderedPageBreak/>
         <w:t>Sharafaldin I, Lashkari A H, Ghorbani A A. Toward generating a new intrusion detection dataset and intrusion traffic characterization. ICISSP 2018: 108-116. DOI:10.5220/0006639801080116.</w:t>
       </w:r>
     </w:p>
@@ -11997,6 +12006,7 @@
         </w:numPr>
       </w:pPr>
       <w:r>
+        <w:lastRenderedPageBreak/>
         <w:t>Angelopoulos A N, Bates S. Conformal prediction: A gentle introduction. Foundations and Trends in Machine Learning, 2023, 16(4): 494-591. DOI:10.1561/2200000101.</w:t>
       </w:r>
     </w:p>
@@ -12033,7 +12043,6 @@
         </w:numPr>
       </w:pPr>
       <w:r>
-        <w:lastRenderedPageBreak/>
         <w:t>Lei J, G'Sell M, Rinaldo A, et al. Distribution-free predictive inference for regression. JASA, 2018, 113(523): 1094-1111. DOI:10.1080/01621459.2017.1307116.</w:t>
       </w:r>
     </w:p>
@@ -12528,6 +12537,7 @@
               <w:rPr>
                 <w:sz w:val="16"/>
               </w:rPr>
+              <w:lastRenderedPageBreak/>
               <w:t>S09</w:t>
             </w:r>
           </w:p>
@@ -12698,7 +12708,6 @@
               <w:rPr>
                 <w:sz w:val="16"/>
               </w:rPr>
-              <w:lastRenderedPageBreak/>
               <w:t>S14</w:t>
             </w:r>
           </w:p>
@@ -13538,76 +13547,76 @@
       </w:rPr>
     </w:lvl>
   </w:abstractNum>
-  <w:num w:numId="1" w16cid:durableId="287055456">
+  <w:num w:numId="1" w16cid:durableId="537737492">
     <w:abstractNumId w:val="8"/>
   </w:num>
-  <w:num w:numId="2" w16cid:durableId="654719586">
+  <w:num w:numId="2" w16cid:durableId="43144756">
     <w:abstractNumId w:val="6"/>
   </w:num>
-  <w:num w:numId="3" w16cid:durableId="874461981">
+  <w:num w:numId="3" w16cid:durableId="400058576">
     <w:abstractNumId w:val="5"/>
   </w:num>
-  <w:num w:numId="4" w16cid:durableId="406651477">
+  <w:num w:numId="4" w16cid:durableId="1440297806">
     <w:abstractNumId w:val="4"/>
   </w:num>
-  <w:num w:numId="5" w16cid:durableId="1321235430">
+  <w:num w:numId="5" w16cid:durableId="335886234">
     <w:abstractNumId w:val="7"/>
   </w:num>
-  <w:num w:numId="6" w16cid:durableId="2025669374">
+  <w:num w:numId="6" w16cid:durableId="1010645446">
     <w:abstractNumId w:val="3"/>
   </w:num>
-  <w:num w:numId="7" w16cid:durableId="568344350">
+  <w:num w:numId="7" w16cid:durableId="1873760867">
     <w:abstractNumId w:val="2"/>
   </w:num>
-  <w:num w:numId="8" w16cid:durableId="1352684143">
+  <w:num w:numId="8" w16cid:durableId="354622630">
     <w:abstractNumId w:val="1"/>
   </w:num>
-  <w:num w:numId="9" w16cid:durableId="576087952">
+  <w:num w:numId="9" w16cid:durableId="624970364">
     <w:abstractNumId w:val="0"/>
   </w:num>
-  <w:num w:numId="10" w16cid:durableId="686366900">
+  <w:num w:numId="10" w16cid:durableId="210727287">
     <w:abstractNumId w:val="7"/>
     <w:lvlOverride w:ilvl="0">
       <w:startOverride w:val="1"/>
     </w:lvlOverride>
   </w:num>
-  <w:num w:numId="11" w16cid:durableId="1365256338">
+  <w:num w:numId="11" w16cid:durableId="394089270">
     <w:abstractNumId w:val="7"/>
     <w:lvlOverride w:ilvl="0">
       <w:startOverride w:val="1"/>
     </w:lvlOverride>
   </w:num>
-  <w:num w:numId="12" w16cid:durableId="117651088">
+  <w:num w:numId="12" w16cid:durableId="1187795582">
     <w:abstractNumId w:val="7"/>
     <w:lvlOverride w:ilvl="0">
       <w:startOverride w:val="1"/>
     </w:lvlOverride>
   </w:num>
-  <w:num w:numId="13" w16cid:durableId="1502963095">
+  <w:num w:numId="13" w16cid:durableId="875239114">
     <w:abstractNumId w:val="7"/>
     <w:lvlOverride w:ilvl="0">
       <w:startOverride w:val="1"/>
     </w:lvlOverride>
   </w:num>
-  <w:num w:numId="14" w16cid:durableId="1570841542">
+  <w:num w:numId="14" w16cid:durableId="1954747046">
     <w:abstractNumId w:val="7"/>
     <w:lvlOverride w:ilvl="0">
       <w:startOverride w:val="1"/>
     </w:lvlOverride>
   </w:num>
-  <w:num w:numId="15" w16cid:durableId="907766721">
+  <w:num w:numId="15" w16cid:durableId="1144085171">
     <w:abstractNumId w:val="7"/>
     <w:lvlOverride w:ilvl="0">
       <w:startOverride w:val="1"/>
     </w:lvlOverride>
   </w:num>
-  <w:num w:numId="16" w16cid:durableId="79496450">
+  <w:num w:numId="16" w16cid:durableId="24790524">
     <w:abstractNumId w:val="7"/>
     <w:lvlOverride w:ilvl="0">
       <w:startOverride w:val="1"/>
     </w:lvlOverride>
   </w:num>
-  <w:num w:numId="17" w16cid:durableId="1198468853">
+  <w:num w:numId="17" w16cid:durableId="1046175670">
     <w:abstractNumId w:val="7"/>
     <w:lvlOverride w:ilvl="0">
       <w:startOverride w:val="1"/>

</xml_diff>

<commit_message>
Round 20au: same-members equal-weight control closes the H2 comparison gap
</commit_message>
<xml_diff>
--- a/重构版论文_v4_20260915/English_SCI_Manuscript_v4.docx
+++ b/重构版论文_v4_20260915/English_SCI_Manuscript_v4.docx
@@ -24,13 +24,13 @@
         <w:t>Reported differences between intrusion-detection models are sensitive to duplicate flows, conflicting labels, feature leakage and class priors. We test a widely adopted but rarely validated assumption: that fusing random-forest experts with sample-specific reliability weights (RCCF) beats equal voting. Under one leakage-controlled protocol we build a 53,237-flow natural-prior population and a 3,365-flow balanced control from CIC-IDS2017, add NSL-KDD, UNSW-NB15 and an IoT corpus, and compare four feature vie</w:t>
       </w:r>
       <w:r>
-        <w:t>ws over ten seeds. The two models differ by -0.000456 Macro-F1 (five up, five down); the seed-level 90% and test-row paired bootstrap intervals both lie inside equivalence margins of 0.005 and 0.01. The four experts disagree on no test row, weight entropy is 0.99998, and class prior and deduplication order move Macro-F1 by +0.0725 and +0.0060. Three identifiability conditions are derived, one a row-wise bound: 99.91% of the 23,958 test rows are provably invariant, with a median decision margin 3,469-5,038 t</w:t>
-      </w:r>
-      <w:r>
-        <w:t>imes it. All 108 gate configurations yield six distinct validation scores; the gain is governed by expert diversity (slope 0.0646, r = 0.749). The equivalence reproduces on a population 7.8 times larger but not on the uncapped 2,429,503-flow corpus, where it becomes a small, consistent deficit (-0.005533, all ten seeds) at a 175-fold training cost; the IoT corpus saturates for every model. The mechanism is 4.1 times larger and 4.6 times slower than one forest, without cost-sensitive advantage. We contribute</w:t>
-      </w:r>
-      <w:r>
-        <w:t xml:space="preserve"> a reusable leakage-controlled protocol, an identifiability boundary and a map separating protocol from aggregation-rule effects; the evidence supports neither superiority nor production readiness.</w:t>
+        <w:t>ws over ten seeds. The two models differ by -0.000456 Macro-F1 (five up, five down); the seed-level 90% and test-row paired bootstrap intervals both lie inside equivalence margins of 0.005 and 0.01. Over the same four experts it changes one label in 79,860 predictions. The experts never disagree; weight entropy is 0.99998; class prior and dedup order move Macro-F1 by +0.0725 and +0.0060. Three identifiability conditions are derived, one a row-wise bound: 99.91% of the 23,958 test rows are provably invariant</w:t>
+      </w:r>
+      <w:r>
+        <w:t xml:space="preserve">, with a median decision margin 3,469-5,038 times it. All 108 gate configurations yield six distinct validation scores; the gain is governed by expert diversity (slope 0.0646, r = 0.749). The equivalence reproduces on a population 7.8 times larger but not on the uncapped 2,429,503-flow corpus, where it becomes a small, consistent deficit (-0.005533, all ten seeds) at a 175-fold training cost; the IoT corpus saturates. The mechanism is 4.1 times larger and 4.6 times slower, without cost-sensitive advantage. </w:t>
+      </w:r>
+      <w:r>
+        <w:t>We contribute a leakage-controlled protocol, an identifiability boundary and a map separating protocol from aggregation-rule effects; the evidence supports neither superiority nor production readiness.</w:t>
       </w:r>
     </w:p>
     <w:p>
@@ -1039,7 +1039,7 @@
           <w:noProof/>
         </w:rPr>
         <w:drawing>
-          <wp:inline distT="0" distB="0" distL="0" distR="0" wp14:anchorId="639AA77D" wp14:editId="3F185142">
+          <wp:inline distT="0" distB="0" distL="0" distR="0" wp14:anchorId="4CF091FA" wp14:editId="441D1436">
             <wp:extent cx="5760720" cy="2734826"/>
             <wp:effectExtent l="0" t="0" r="0" b="0"/>
             <wp:docPr id="1" name="Picture 1"/>
@@ -2388,7 +2388,7 @@
           <w:noProof/>
         </w:rPr>
         <w:drawing>
-          <wp:inline distT="0" distB="0" distL="0" distR="0" wp14:anchorId="22F22B91" wp14:editId="3F7E244E">
+          <wp:inline distT="0" distB="0" distL="0" distR="0" wp14:anchorId="2A9D4724" wp14:editId="6EBEFCA7">
             <wp:extent cx="5760720" cy="2722098"/>
             <wp:effectExtent l="0" t="0" r="0" b="0"/>
             <wp:docPr id="2" name="Picture 2"/>
@@ -3380,7 +3380,7 @@
           <w:noProof/>
         </w:rPr>
         <w:drawing>
-          <wp:inline distT="0" distB="0" distL="0" distR="0" wp14:anchorId="65439AE0" wp14:editId="6D997BB5">
+          <wp:inline distT="0" distB="0" distL="0" distR="0" wp14:anchorId="2FEF84EF" wp14:editId="12CB9ED1">
             <wp:extent cx="5760720" cy="3482709"/>
             <wp:effectExtent l="0" t="0" r="0" b="0"/>
             <wp:docPr id="3" name="Picture 3"/>
@@ -4784,10 +4784,28 @@
         <w:rPr>
           <w:b/>
         </w:rPr>
-        <w:t>Equal-weight control.</w:t>
-      </w:r>
-      <w:r>
-        <w:t xml:space="preserve"> Same feature view, tree count and seed as the gated model. This is the direct test of H2.</w:t>
+        <w:t>Equal-weight fusion control (the direct test of H2).</w:t>
+      </w:r>
+      <w:r>
+        <w:t xml:space="preserve"> The unweighted mean of the </w:t>
+      </w:r>
+      <w:r>
+        <w:rPr>
+          <w:b/>
+        </w:rPr>
+        <w:t>identical four experts</w:t>
+      </w:r>
+      <w:r>
+        <w:t xml:space="preserve"> - same feature views, same tree count, same per-expert seeds - so that the aggregation rule is the only difference from the gated model. The equal-weight chi-square forest on the same view is reported alongside it as the strongest </w:t>
+      </w:r>
+      <w:r>
+        <w:rPr>
+          <w:b/>
+        </w:rPr>
+        <w:t>single-member</w:t>
+      </w:r>
+      <w:r>
+        <w:t xml:space="preserve"> reference.</w:t>
       </w:r>
     </w:p>
     <w:p>
@@ -4893,12 +4911,12 @@
     </w:p>
     <w:p>
       <w:r>
+        <w:lastRenderedPageBreak/>
         <w:t>The chi-square budget k was fixed at 60 on the validation partition from a pre-specified candidate set: validation Macro-F1 was 0.9175 at k = 10, 0.9314 at k = 20, 0.9379 at both k = 30 and k = 40, and 0.9413 at k = 60, flattening between k = 30 and k = 40. This search was carried out on the balanced control protocol; the selected k was then frozen for every final run.</w:t>
       </w:r>
     </w:p>
     <w:p>
       <w:r>
-        <w:lastRenderedPageBreak/>
         <w:t>With k = 60 fixed, the chi-square and full-feature views compare as follows.</w:t>
       </w:r>
     </w:p>
@@ -6650,6 +6668,7 @@
               <w:rPr>
                 <w:sz w:val="16"/>
               </w:rPr>
+              <w:lastRenderedPageBreak/>
               <w:t>Equal RF (full features)</w:t>
             </w:r>
           </w:p>
@@ -6944,14 +6963,7 @@
               <w:rPr>
                 <w:sz w:val="16"/>
               </w:rPr>
-              <w:t xml:space="preserve">XGBoost (independently </w:t>
-            </w:r>
-            <w:r>
-              <w:rPr>
-                <w:sz w:val="16"/>
-              </w:rPr>
-              <w:lastRenderedPageBreak/>
-              <w:t>tuned, validation-selected)</w:t>
+              <w:t>XGBoost (independently tuned, validation-selected)</w:t>
             </w:r>
           </w:p>
         </w:tc>
@@ -6967,7 +6979,6 @@
               <w:rPr>
                 <w:sz w:val="16"/>
               </w:rPr>
-              <w:lastRenderedPageBreak/>
               <w:t>0.96304</w:t>
             </w:r>
           </w:p>
@@ -7114,7 +7125,37 @@
         <w:t>-0.000456</w:t>
       </w:r>
       <w:r>
-        <w:t>, with five seeds favouring RCCF and five favouring the equal forest. On the three-seed balanced control RCCF reaches 0.961807 against 0.963215, trailing by -0.001408. Both magnitudes are below one thousandth and the sign is not stable across settings. One baseline is stronger on a different metric: extremely randomised trees obtain the highest balanced accuracy (0.96215 against 0.94820 for RCCF) while obtaining the lowest Macro-F1 (0.857490), because they spread predictions more evenly across rare classes.</w:t>
+        <w:t xml:space="preserve">, with five seeds favouring RCCF and five favouring the equal forest. Against the equal-weight fusion of the </w:t>
+      </w:r>
+      <w:r>
+        <w:rPr>
+          <w:b/>
+        </w:rPr>
+        <w:t>identical four experts</w:t>
+      </w:r>
+      <w:r>
+        <w:t xml:space="preserve"> - the direct test of H2 - the gated model changes </w:t>
+      </w:r>
+      <w:r>
+        <w:rPr>
+          <w:b/>
+        </w:rPr>
+        <w:t>one label across 79,860 test predictions</w:t>
+      </w:r>
+      <w:r>
+        <w:t xml:space="preserve"> over the ten seeds and differs by </w:t>
+      </w:r>
+      <w:r>
+        <w:rPr>
+          <w:b/>
+        </w:rPr>
+        <w:t>-0.000010</w:t>
+      </w:r>
+      <w:r>
+        <w:t xml:space="preserve"> Macro-F1 (seed-level 90% interval [-0.000029, +0.000008]). The -0.000456 above is therefore the price of averaging in the weaker full-feature view, not an effect of gating. On the three-seed balanced control RCCF reaches 0.961807 against 0.963215, trailing by -0.001408. Both magnitudes are below one thousandth and the sign is not stable across settings. One baseline is stronger on a different metric: extremely randomised trees obtain the highest balanced accuracy (0.96215 against 0.94820 for RCCF) while ob</w:t>
+      </w:r>
+      <w:r>
+        <w:t>taining the lowest Macro-F1 (0.857490), because they spread predictions more evenly across rare classes.</w:t>
       </w:r>
     </w:p>
     <w:p>
@@ -7126,7 +7167,7 @@
           <w:noProof/>
         </w:rPr>
         <w:drawing>
-          <wp:inline distT="0" distB="0" distL="0" distR="0" wp14:anchorId="342BC405" wp14:editId="0E0BB1A3">
+          <wp:inline distT="0" distB="0" distL="0" distR="0" wp14:anchorId="2898712C" wp14:editId="7B3A7621">
             <wp:extent cx="5760720" cy="2356272"/>
             <wp:effectExtent l="0" t="0" r="0" b="0"/>
             <wp:docPr id="4" name="Picture 4"/>
@@ -7188,7 +7229,11 @@
         <w:t>Second, the paired statistics establish equivalence at a strict margin.</w:t>
       </w:r>
       <w:r>
-        <w:t xml:space="preserve"> With ten seeds the mean paired difference is -0.000456 with a standard deviation of 0.001152. Two interval estimates are reported because they answer different questions: the seed-level 90% interval [-0.001124, +0.000212] reflects model-to-model variability, while the test-row paired bootstrap interval [-0.004251, +0.003382] reflects resampling uncertainty over the locked test set. Both lie inside equivalence margins of 0.005 and 0.01 Macro-F1, so equivalence can be asserted at alpha = 0.05 against either </w:t>
+        <w:t xml:space="preserve"> With ten seeds the mean paired difference is -0.000456 with a standard deviation of 0.001152. Two interval estimates are reported because they answer different questions: the seed-level 90% interval [-0.001124, +0.000212] reflects model-to-model variability, while the test-row paired bootstrap interval [-0.004251, +0.003382] reflects resampling uncertainty over the locked test set. Both lie inside equivalence margins of 0.005 and 0.01 Macro-F1, so equivalence can be asserted at alpha = 0.05 </w:t>
+      </w:r>
+      <w:r>
+        <w:lastRenderedPageBreak/>
+        <w:t xml:space="preserve">against either </w:t>
       </w:r>
       <w:r>
         <w:t xml:space="preserve">margin. This strengthens the three-seed analysis, for which the 0.005 margin was not attainable. The sign of the difference is split five to five across seeds, and exact McNemar tests on the test rows are non-significant. Under the pre-declared decision rule - stable, consistent in sign, and bounded away from zero - </w:t>
@@ -7440,7 +7485,6 @@
               <w:rPr>
                 <w:sz w:val="16"/>
               </w:rPr>
-              <w:lastRenderedPageBreak/>
               <w:t>RCCF - equal RF (chi-square)</w:t>
             </w:r>
           </w:p>
@@ -8031,7 +8075,11 @@
         <w:t>Fifth, a neural baseline shows how badly accuracy can mislead.</w:t>
       </w:r>
       <w:r>
-        <w:t xml:space="preserve"> A multilayer perceptron given the same feature budget and a full training budget (128 hidden units, hyper-parameters selected on the validation partition) reaches 0.97679 accuracy against RCCF's 0.97792, but only 0.797654 Macro-F1 against 0.889955, i.e. 0.092 lower. Its balanced accuracy is 0.79666 against 0.94920 and its Brier score is 0.036701 against 0.006312. Every comparison in this paragraph is computed on the three seeds common to both runs (42, 2024, 3407), the seeds on which the neural baseline wa</w:t>
+        <w:t xml:space="preserve"> A multilayer perceptron given the same feature budget and a full training budget (128 hidden units, hyper-parameters selected on the validation partition) reaches 0.97679 accuracy against RCCF's 0.97792, but only 0.797654 Macro-F1 against 0.889955, i.e. 0.092 lower. Its balanced accuracy is 0.79666 against 0.94920 and its Brier score is 0.036701 against 0.006312. Every comparison </w:t>
+      </w:r>
+      <w:r>
+        <w:lastRenderedPageBreak/>
+        <w:t>in this paragraph is computed on the three seeds common to both runs (42, 2024, 3407), the seeds on which the neural baseline wa</w:t>
       </w:r>
       <w:r>
         <w:t xml:space="preserve">s trained; Table 4(a) gives the corresponding ten-seed RCCF values. Notably, a paired McNemar test on overall correctness is not significant (pooled p = 0.383 over 23,958 rows; per-seed 1.000 / 0.768 / 0.261), because the two models make a similar </w:t>
@@ -8057,7 +8105,6 @@
     </w:p>
     <w:p>
       <w:r>
-        <w:lastRenderedPageBreak/>
         <w:t>Per-seed metrics, per-class reports, normalised confusion matrices and the equivalence tests are provided in Supplementary S05-S07 and S20.</w:t>
       </w:r>
     </w:p>
@@ -8083,7 +8130,7 @@
           <w:noProof/>
         </w:rPr>
         <w:drawing>
-          <wp:inline distT="0" distB="0" distL="0" distR="0" wp14:anchorId="71AA6811" wp14:editId="31675AAC">
+          <wp:inline distT="0" distB="0" distL="0" distR="0" wp14:anchorId="0CD2C554" wp14:editId="0CE8EC61">
             <wp:extent cx="5760720" cy="2045294"/>
             <wp:effectExtent l="0" t="0" r="0" b="0"/>
             <wp:docPr id="5" name="Picture 5"/>
@@ -8245,7 +8292,11 @@
         <w:t>3,469 to 5,038</w:t>
       </w:r>
       <w:r>
-        <w:t xml:space="preserve"> across seeds. In other words, fused probabilities are close to one-hot and the weight-induced probability movement is three orders of magnitude smaller than the decision margin.</w:t>
+        <w:t xml:space="preserve"> across </w:t>
+      </w:r>
+      <w:r>
+        <w:lastRenderedPageBreak/>
+        <w:t>seeds. In other words, fused probabilities are close to one-hot and the weight-induced probability movement is three orders of magnitude smaller than the decision margin.</w:t>
       </w:r>
     </w:p>
     <w:p>
@@ -8256,9 +8307,8 @@
         <w:rPr>
           <w:noProof/>
         </w:rPr>
-        <w:lastRenderedPageBreak/>
         <w:drawing>
-          <wp:inline distT="0" distB="0" distL="0" distR="0" wp14:anchorId="650E541F" wp14:editId="71BE08B8">
+          <wp:inline distT="0" distB="0" distL="0" distR="0" wp14:anchorId="5EC0F5F1" wp14:editId="2BA7FAF0">
             <wp:extent cx="5760720" cy="2308234"/>
             <wp:effectExtent l="0" t="0" r="0" b="0"/>
             <wp:docPr id="6" name="Picture 6"/>
@@ -8889,6 +8939,7 @@
               <w:rPr>
                 <w:sz w:val="16"/>
               </w:rPr>
+              <w:lastRenderedPageBreak/>
               <w:t>Disjoint feature blocks</w:t>
             </w:r>
           </w:p>
@@ -8988,9 +9039,8 @@
         <w:rPr>
           <w:noProof/>
         </w:rPr>
-        <w:lastRenderedPageBreak/>
         <w:drawing>
-          <wp:inline distT="0" distB="0" distL="0" distR="0" wp14:anchorId="2261646B" wp14:editId="0D56342A">
+          <wp:inline distT="0" distB="0" distL="0" distR="0" wp14:anchorId="6652A19A" wp14:editId="0B0E77AD">
             <wp:extent cx="5760720" cy="2167923"/>
             <wp:effectExtent l="0" t="0" r="0" b="0"/>
             <wp:docPr id="7" name="Picture 7"/>
@@ -9098,7 +9148,7 @@
           <w:noProof/>
         </w:rPr>
         <w:drawing>
-          <wp:inline distT="0" distB="0" distL="0" distR="0" wp14:anchorId="3F1BFA30" wp14:editId="2F59CF7E">
+          <wp:inline distT="0" distB="0" distL="0" distR="0" wp14:anchorId="4511DC73" wp14:editId="5942EEE2">
             <wp:extent cx="5760720" cy="2258878"/>
             <wp:effectExtent l="0" t="0" r="0" b="0"/>
             <wp:docPr id="8" name="Picture 8"/>
@@ -9152,14 +9202,11 @@
         <w:rPr>
           <w:b/>
         </w:rPr>
+        <w:lastRenderedPageBreak/>
         <w:t>(1) Deduplication order.</w:t>
       </w:r>
       <w:r>
-        <w:t xml:space="preserve"> Replacing "deduplicate the whole corpus before splitting" with "split first, deduplicate on the training side only" gives Macro-F1 values of 0.958503, 0.950446 and 0.962318 across the three seeds, against </w:t>
-      </w:r>
-      <w:r>
-        <w:lastRenderedPageBreak/>
-        <w:t xml:space="preserve">0.952545, 0.952171 and 0.962330 for the control. The means are 0.957089 and 0.955682, a difference of </w:t>
+        <w:t xml:space="preserve"> Replacing "deduplicate the whole corpus before splitting" with "split first, deduplicate on the training side only" gives Macro-F1 values of 0.958503, 0.950446 and 0.962318 across the three seeds, against 0.952545, 0.952171 and 0.962330 for the control. The means are 0.957089 and 0.955682, a difference of </w:t>
       </w:r>
       <w:r>
         <w:rPr>
@@ -9270,6 +9317,7 @@
         <w:pStyle w:val="21"/>
       </w:pPr>
       <w:r>
+        <w:lastRenderedPageBreak/>
         <w:t>5.5 RQ4: External validity and file-level extrapolation</w:t>
       </w:r>
     </w:p>
@@ -9282,7 +9330,7 @@
           <w:noProof/>
         </w:rPr>
         <w:drawing>
-          <wp:inline distT="0" distB="0" distL="0" distR="0" wp14:anchorId="2379D643" wp14:editId="141D98BE">
+          <wp:inline distT="0" distB="0" distL="0" distR="0" wp14:anchorId="77D33C66" wp14:editId="7DC10F42">
             <wp:extent cx="5760720" cy="2516852"/>
             <wp:effectExtent l="0" t="0" r="0" b="0"/>
             <wp:docPr id="9" name="Picture 9"/>
@@ -9328,7 +9376,6 @@
           <w:color w:val="404040"/>
           <w:sz w:val="18"/>
         </w:rPr>
-        <w:lastRenderedPageBreak/>
         <w:t>Figure 9. Class-level F1 on the independent native-label benchmarks</w:t>
       </w:r>
     </w:p>
@@ -9407,6 +9454,7 @@
         <w:pStyle w:val="21"/>
       </w:pPr>
       <w:r>
+        <w:lastRenderedPageBreak/>
         <w:t>5.6 Secondary metrics: calibration, robustness, latency and open-set behaviour</w:t>
       </w:r>
     </w:p>
@@ -9419,7 +9467,7 @@
           <w:noProof/>
         </w:rPr>
         <w:drawing>
-          <wp:inline distT="0" distB="0" distL="0" distR="0" wp14:anchorId="4E7960AD" wp14:editId="217EBAC5">
+          <wp:inline distT="0" distB="0" distL="0" distR="0" wp14:anchorId="72736111" wp14:editId="4F5FC063">
             <wp:extent cx="5760720" cy="2223311"/>
             <wp:effectExtent l="0" t="0" r="0" b="0"/>
             <wp:docPr id="10" name="Picture 10"/>
@@ -9476,11 +9524,7 @@
         <w:t>Probability calibration.</w:t>
       </w:r>
       <w:r>
-        <w:t xml:space="preserve"> On the natural-prior population RCCF's Log Loss (0.05183) is better than the equal-weight forest's (0.05220), but both its Brier score (0.006365 against 0.006255) and its ECE (0.006849 against 0.004493) are worse. Temperature scaling reduces the ECE of the conditional branch from about 0.0238 to about </w:t>
-      </w:r>
-      <w:r>
-        <w:lastRenderedPageBreak/>
-        <w:t>0.0119 on the balanced control protocol, while the equal forest's temperature parameter is optimised to 1.0 and its calibration metrics are unchanged. The conclusion is that identical hard labels do not imply</w:t>
+        <w:t xml:space="preserve"> On the natural-prior population RCCF's Log Loss (0.05183) is better than the equal-weight forest's (0.05220), but both its Brier score (0.006365 against 0.006255) and its ECE (0.006849 against 0.004493) are worse. Temperature scaling reduces the ECE of the conditional branch from about 0.0238 to about 0.0119 on the balanced control protocol, while the equal forest's temperature parameter is optimised to 1.0 and its calibration metrics are unchanged. The conclusion is that identical hard labels do not imply</w:t>
       </w:r>
       <w:r>
         <w:t xml:space="preserve"> identical probability quality, and that the direction of improvement depends on which probabilistic metric is chosen - so no single favourable metric should be reported alone.</w:t>
@@ -9509,7 +9553,7 @@
           <w:noProof/>
         </w:rPr>
         <w:drawing>
-          <wp:inline distT="0" distB="0" distL="0" distR="0" wp14:anchorId="15CFDCF4" wp14:editId="625C37C2">
+          <wp:inline distT="0" distB="0" distL="0" distR="0" wp14:anchorId="27646F82" wp14:editId="53168406">
             <wp:extent cx="5760720" cy="2538527"/>
             <wp:effectExtent l="0" t="0" r="0" b="0"/>
             <wp:docPr id="11" name="Picture 11"/>
@@ -9555,6 +9599,7 @@
           <w:color w:val="404040"/>
           <w:sz w:val="18"/>
         </w:rPr>
+        <w:lastRenderedPageBreak/>
         <w:t>Figure 11. Single-row inference latency</w:t>
       </w:r>
     </w:p>
@@ -9600,11 +9645,7 @@
         <w:t>Resource footprint.</w:t>
       </w:r>
       <w:r>
-        <w:t xml:space="preserve"> Model size and throughput separate the two designs more sharply than wall-clock time. The conditional mechanism stores four forests and occupies 9.09 MB when serialised, against 2.21 MB for the single </w:t>
-      </w:r>
-      <w:r>
-        <w:lastRenderedPageBreak/>
-        <w:t>equal-weight forest - a factor of 4.1 - and it processes about 43,100 rows per second on a full test batch against 200,300, a factor of 4.6. Peak resident-set growth during fitting was 37.0 MB against 78.3 MB, but the two models were profiled within one process, so that particular figure is order-dependent an</w:t>
+        <w:t xml:space="preserve"> Model size and throughput separate the two designs more sharply than wall-clock time. The conditional mechanism stores four forests and occupies 9.09 MB when serialised, against 2.21 MB for the single equal-weight forest - a factor of 4.1 - and it processes about 43,100 rows per second on a full test batch against 200,300, a factor of 4.6. Peak resident-set growth during fitting was 37.0 MB against 78.3 MB, but the two models were profiled within one process, so that particular figure is order-dependent an</w:t>
       </w:r>
       <w:r>
         <w:t>d indicative only.</w:t>
@@ -9654,6 +9695,7 @@
         <w:pStyle w:val="21"/>
       </w:pPr>
       <w:r>
+        <w:lastRenderedPageBreak/>
         <w:t>5.7 Scale and domain sensitivity</w:t>
       </w:r>
     </w:p>
@@ -10237,11 +10279,7 @@
         <w:t>A population 7.8 times larger.</w:t>
       </w:r>
       <w:r>
-        <w:t xml:space="preserve"> Rebuilding the CIC-IDS2017 population with the identical audit but a 200,000-per-class cap yields 413,209 flows (train 289,246 / validation 61,982 / test 61,982). The minority classes cannot grow, so the enlarged population is more imbalanced than the primary one: Brute Force contributes 10,620 rows, Bot 1,948 and Web Attack 673. The headline pair was re-run over the full ten seeds. RCCF averages 0.856065 Macro-</w:t>
-      </w:r>
-      <w:r>
-        <w:lastRenderedPageBreak/>
-        <w:t>F1 against 0.857202 for the equal-weight chi-square forest, a mean paired difference of -0.00113</w:t>
+        <w:t xml:space="preserve"> Rebuilding the CIC-IDS2017 population with the identical audit but a 200,000-per-class cap yields 413,209 flows (train 289,246 / validation 61,982 / test 61,982). The minority classes cannot grow, so the enlarged population is more imbalanced than the primary one: Brute Force contributes 10,620 rows, Bot 1,948 and Web Attack 673. The headline pair was re-run over the full ten seeds. RCCF averages 0.856065 Macro-F1 against 0.857202 for the equal-weight chi-square forest, a mean paired difference of -0.00113</w:t>
       </w:r>
       <w:r>
         <w:t>7 (SD 0.003156; seed-level 90% interval [-0.002966, +0.000692]). TOST is significant at both pre-specified margins (p = 0.0019 at 0.005, p = 4.8e-6 at 0.01), so the equivalence statement survives a 7.8-fold increase in population size; the point estimate now favours the control slightly rather than RCCF. The two arms disagree on 20-29 of the 61,982 test rows per seed (0.03%-0.05%), the same order as on the primary population. The context baselines behave as before: XGBoost reaches 0.827656 Macro-F1, extreme</w:t>
@@ -10273,7 +10311,11 @@
         <w:t xml:space="preserve"> equivalent at 0.005, and all ten seeds point the same way. The two arms disagree on 216 of 364,426 test rows per seed on average (at most 392) - the same order as on the capped populations. The context baselines separate more sharply here than anywhere else in the study: XGBoost reaches 0.800255 Macro-F1, the equal-weight full-feature forest 0.738143, extremely randomised trees 0.696629 and a depth-limited decision tree 0.595653, so the model-family gap between XGBoost and the equal-weight chi-square fores</w:t>
       </w:r>
       <w:r>
-        <w:t>t (0.041) exceeds every protocol effect measured here except the class prior. Accuracy, by contrast, is 0.9993 for XGBoost and 0.9958 for the equal-weight forest - the clearest illustration in this study of how much accuracy hides on an imbalanced corpus. The cost asymmetry is at its most extreme here: 14936 s to train RCCF per seed against 85 s for the equal-weight forest (175x), at a quality difference of -0.005533.</w:t>
+        <w:t xml:space="preserve">t (0.041) exceeds every protocol effect measured here except the class prior. Accuracy, by contrast, is 0.9993 for XGBoost and 0.9958 for the equal-weight forest - the clearest illustration in this study of how much accuracy </w:t>
+      </w:r>
+      <w:r>
+        <w:lastRenderedPageBreak/>
+        <w:t>hides on an imbalanced corpus. The cost asymmetry is at its most extreme here: 14936 s to train RCCF per seed against 85 s for the equal-weight forest (175x), at a quality difference of -0.005533.</w:t>
       </w:r>
     </w:p>
     <w:p>
@@ -10313,11 +10355,7 @@
         <w:t xml:space="preserve"> On the uncapped corpus the four feature views are no longer interchangeable: the full-feature forest reaches 0.738143 Macro-F1 against 0.759540 for the chi-square forest, a gap of 0.021397, and one such expert inside a four-way average costs a quarter of it, 0.005349, against a measured -0.005533. The same expression applies to the 413,209-flow population (view gap 0.004249, predicted 0.001062, measured -0.001137) and to the primary population (gap 0.002068, predicted 0.000517, measured -0.000456). Across </w:t>
       </w:r>
       <w:r>
-        <w:t xml:space="preserve">a 46-fold range in population size the prediction stays within 14% of the measurement, so what changes with scale is not the aggregation rule - Section 5.3 shows the weights never </w:t>
-      </w:r>
-      <w:r>
-        <w:lastRenderedPageBreak/>
-        <w:t>move a label - but the price of averaging over feature views whose quality has diverged. This is the practical form of Condition 1: an equal-weight fusion is bounded by its weakest member, and the capped populations hide that bound because there all four views score within 0.002 of one another.</w:t>
+        <w:t>a 46-fold range in population size the prediction stays within 14% of the measurement, so what changes with scale is not the aggregation rule - Section 5.3 shows the weights never move a label - but the price of averaging over feature views whose quality has diverged. This is the practical form of Condition 1: an equal-weight fusion is bounded by its weakest member, and the capped populations hide that bound because there all four views score within 0.002 of one another.</w:t>
       </w:r>
     </w:p>
     <w:p>
@@ -10362,7 +10400,11 @@
         <w:t xml:space="preserve"> When forests trained on different feature views return the same posterior for a given input, no convex weighting can change the output (Condition 1). In flow-feature settings this is more common than intuition suggests: the top-60 features selected by chi-square, mutual information and ANOVA overlap heavily, and 12 of the extra columns in the full view are constant. Measurement 6 quantifies the boundary: when pairwise disagreement is 0.20%-0.36%, the gate gains exactly zero in six of six runs; only when di</w:t>
       </w:r>
       <w:r>
-        <w:t>sagreement rises to 3%-6% does the gain become consistently positive. Condition A is therefore not the idealised case of "identical experts" but a loose condition that real flow-feature data satisfies easily.</w:t>
+        <w:t xml:space="preserve">sagreement </w:t>
+      </w:r>
+      <w:r>
+        <w:lastRenderedPageBreak/>
+        <w:t>rises to 3%-6% does the gain become consistently positive. Condition A is therefore not the idealised case of "identical experts" but a loose condition that real flow-feature data satisfies easily.</w:t>
       </w:r>
     </w:p>
     <w:p>
@@ -10403,7 +10445,6 @@
     </w:p>
     <w:p>
       <w:r>
-        <w:lastRenderedPageBreak/>
         <w:t xml:space="preserve">The four conditions yield an operational diagnostic sequence: </w:t>
       </w:r>
       <w:r>
@@ -10530,6 +10571,7 @@
     </w:p>
     <w:p>
       <w:r>
+        <w:lastRenderedPageBreak/>
         <w:t xml:space="preserve">The contribution to the literature is therefore a threshold rather than a refutation: </w:t>
       </w:r>
       <w:r>
@@ -11009,14 +11051,7 @@
               <w:rPr>
                 <w:sz w:val="16"/>
               </w:rPr>
-              <w:t xml:space="preserve">Adopt this protocol and release </w:t>
-            </w:r>
-            <w:r>
-              <w:rPr>
-                <w:sz w:val="16"/>
-              </w:rPr>
-              <w:lastRenderedPageBreak/>
-              <w:t>per-row predictions</w:t>
+              <w:t>Adopt this protocol and release per-row predictions</w:t>
             </w:r>
           </w:p>
         </w:tc>
@@ -11032,15 +11067,7 @@
               <w:rPr>
                 <w:sz w:val="16"/>
               </w:rPr>
-              <w:lastRenderedPageBreak/>
-              <w:t xml:space="preserve">All aggregate metrics can be </w:t>
-            </w:r>
-            <w:r>
-              <w:rPr>
-                <w:sz w:val="16"/>
-              </w:rPr>
-              <w:lastRenderedPageBreak/>
-              <w:t>recomputed from released probabilities</w:t>
+              <w:t>All aggregate metrics can be recomputed from released probabilities</w:t>
             </w:r>
           </w:p>
         </w:tc>
@@ -11056,15 +11083,7 @@
               <w:rPr>
                 <w:sz w:val="16"/>
               </w:rPr>
-              <w:lastRenderedPageBreak/>
-              <w:t xml:space="preserve">Extra storage and version </w:t>
-            </w:r>
-            <w:r>
-              <w:rPr>
-                <w:sz w:val="16"/>
-              </w:rPr>
-              <w:lastRenderedPageBreak/>
-              <w:t>management</w:t>
+              <w:t>Extra storage and version management</w:t>
             </w:r>
           </w:p>
         </w:tc>
@@ -11082,7 +11101,6 @@
               <w:rPr>
                 <w:sz w:val="16"/>
               </w:rPr>
-              <w:lastRenderedPageBreak/>
               <w:t>Decide whether to deploy conditional weighting</w:t>
             </w:r>
           </w:p>
@@ -11257,6 +11275,7 @@
         <w:rPr>
           <w:b/>
         </w:rPr>
+        <w:lastRenderedPageBreak/>
         <w:t>Paired statistics and effect sizes</w:t>
       </w:r>
       <w:r>
@@ -11335,6 +11354,17 @@
         <w:rPr>
           <w:b/>
         </w:rPr>
+        <w:t>The same-members control covers the primary population.</w:t>
+      </w:r>
+      <w:r>
+        <w:t xml:space="preserve"> The equal-weight fusion of the identical four experts was run on the 53,237-flow natural-prior population; on the 413,209-flow and 2,429,503-flow populations the control remains the single-view equal-weight forest, so the dilution decomposition there rests on the view-gap arithmetic rather than on a measured same-members fusion.</w:t>
+      </w:r>
+    </w:p>
+    <w:p>
+      <w:r>
+        <w:rPr>
+          <w:b/>
+        </w:rPr>
         <w:t>The research populations are not production traffic.</w:t>
       </w:r>
       <w:r>
@@ -11349,11 +11379,7 @@
         <w:t>The equivalence depends on how the population is built.</w:t>
       </w:r>
       <w:r>
-        <w:t xml:space="preserve"> It holds on the 53,237-flow natural-prior population and on the 7.8-fold larger one, but not on the fully uncapped 2,429,503-flow corpus, where the same comparison </w:t>
-      </w:r>
-      <w:r>
-        <w:lastRenderedPageBreak/>
-        <w:t>becomes a small, consistent deficit. The statement that conditional weighting is indistinguishable from equal voting must therefore always be quoted together with the population it was measured on; it is not a scale-free property.</w:t>
+        <w:t xml:space="preserve"> It holds on the 53,237-flow natural-prior population and on the 7.8-fold larger one, but not on the fully uncapped 2,429,503-flow corpus, where the same comparison becomes a small, consistent deficit. The statement that conditional weighting is indistinguishable from equal voting must therefore always be quoted together with the population it was measured on; it is not a scale-free property.</w:t>
       </w:r>
     </w:p>
     <w:p>
@@ -11408,6 +11434,7 @@
         <w:rPr>
           <w:b/>
         </w:rPr>
+        <w:lastRenderedPageBreak/>
         <w:t>Four datasets were evaluated, and every corpus comes from one collection programme.</w:t>
       </w:r>
       <w:r>
@@ -11479,14 +11506,13 @@
         <w:rPr>
           <w:b/>
         </w:rPr>
-        <w:lastRenderedPageBreak/>
         <w:t>First, relative to the most direct equal-weight control the gain lies inside an equivalence boundary.</w:t>
       </w:r>
       <w:r>
-        <w:t xml:space="preserve"> Averaged over ten seeds on the natural-prior population of CIC-IDS2017, the Macro-F1 difference between conditional weighting and an equal-weight chi-square forest is -0.000456, with the per-seed sign split five to five. Both the seed-level 90% interval [-0.00112, +0.00021] and the test-row paired bootstrap interval [-0.00425, +0.00338] lie inside equivalence margins of 0.005 and 0.01. The four experts disagree on no test row, and the normalised weight entropy is 0.99998. The cost is about an 80-fold incre</w:t>
-      </w:r>
-      <w:r>
-        <w:t>ase in training time and a fivefold increase in batch inference time.</w:t>
+        <w:t xml:space="preserve"> Averaged over ten seeds on the natural-prior population of CIC-IDS2017, the Macro-F1 difference between conditional weighting and an equal-weight chi-square forest is -0.000456, with the per-seed sign split five to five. Against the equal-weight fusion of those same four experts the gated model changes one label in 79,860 test predictions (-0.000010), which locates the single-view gap in the composition of the ensemble rather than in the gate. Both the seed-level 90% interval [-0.00112, +0.00021] and the t</w:t>
+      </w:r>
+      <w:r>
+        <w:t>est-row paired bootstrap interval [-0.00425, +0.00338] lie inside equivalence margins of 0.005 and 0.01. The four experts disagree on no test row, and the normalised weight entropy is 0.99998. The cost is about an 80-fold increase in training time and a fivefold increase in batch inference time.</w:t>
       </w:r>
     </w:p>
     <w:p>
@@ -11511,7 +11537,11 @@
         <w:t>Second, the failure is explainable and quantified.</w:t>
       </w:r>
       <w:r>
-        <w:t xml:space="preserve"> Three identifiability conditions are derived and one of them is turned into a row-wise computable bound, under which 99.91% of 23,958 test rows are provably invariant to the weighting, with a decision margin 3,469 to 5,038 times the perturbation bound. A search over all 108 gate hyper-parameter configurations yields only six distinct validation scores, excluding insufficient tuning. A reverse experiment shows that the gain is governed by expert diversity: two low-diversity expert sets gain exactly zero in </w:t>
+        <w:t xml:space="preserve"> Three identifiability conditions are derived and one of them is turned into a row-wise computable bound, under which 99.91% of 23,958 test rows are provably invariant to the weighting, with a decision margin 3,469 to 5,038 times the perturbation bound. A search over all 108 gate hyper-</w:t>
+      </w:r>
+      <w:r>
+        <w:lastRenderedPageBreak/>
+        <w:t xml:space="preserve">parameter configurations yields only six distinct validation scores, excluding insufficient tuning. A reverse experiment shows that the gain is governed by expert diversity: two low-diversity expert sets gain exactly zero in </w:t>
       </w:r>
       <w:r>
         <w:t>all six runs, whereas three decorrelated sets gain positively in all nine runs (slope 0.0646, Pearson r = 0.749). The inertness of conditional weighting is therefore not an implementation or tuning artefact but a direct consequence of filter-based multi-view experts being too similar on this kind of data.</w:t>
@@ -11563,59 +11593,59 @@
         <w:pStyle w:val="1"/>
       </w:pPr>
       <w:r>
+        <w:t>Funding</w:t>
+      </w:r>
+    </w:p>
+    <w:p>
+      <w:r>
+        <w:t>To be completed by the author. If the work received no support of any kind, this should be stated explicitly.</w:t>
+      </w:r>
+    </w:p>
+    <w:p>
+      <w:pPr>
+        <w:pStyle w:val="1"/>
+      </w:pPr>
+      <w:r>
+        <w:t>Declaration of competing interest</w:t>
+      </w:r>
+    </w:p>
+    <w:p>
+      <w:r>
+        <w:t>To be completed by the author. If no competing interests exist, this should be stated explicitly.</w:t>
+      </w:r>
+    </w:p>
+    <w:p>
+      <w:pPr>
+        <w:pStyle w:val="1"/>
+      </w:pPr>
+      <w:r>
+        <w:t>Declaration of generative AI and AI-assisted technologies</w:t>
+      </w:r>
+    </w:p>
+    <w:p>
+      <w:r>
+        <w:t>Generative AI tools were used for language editing and software drafting. The author is responsible for verifying the code, data, citations and all conclusions, and has checked each reported number against the released artefacts.</w:t>
+      </w:r>
+    </w:p>
+    <w:p>
+      <w:pPr>
+        <w:pStyle w:val="1"/>
+      </w:pPr>
+      <w:r>
+        <w:t>CRediT authorship contribution statement</w:t>
+      </w:r>
+    </w:p>
+    <w:p>
+      <w:r>
+        <w:t>To be completed by the author according to actual contributions: conceptualisation, methodology, software, validation, formal analysis, data curation, writing - original draft, writing - review and editing, visualisation.</w:t>
+      </w:r>
+    </w:p>
+    <w:p>
+      <w:pPr>
+        <w:pStyle w:val="1"/>
+      </w:pPr>
+      <w:r>
         <w:lastRenderedPageBreak/>
-        <w:t>Funding</w:t>
-      </w:r>
-    </w:p>
-    <w:p>
-      <w:r>
-        <w:t>To be completed by the author. If the work received no support of any kind, this should be stated explicitly.</w:t>
-      </w:r>
-    </w:p>
-    <w:p>
-      <w:pPr>
-        <w:pStyle w:val="1"/>
-      </w:pPr>
-      <w:r>
-        <w:t>Declaration of competing interest</w:t>
-      </w:r>
-    </w:p>
-    <w:p>
-      <w:r>
-        <w:t>To be completed by the author. If no competing interests exist, this should be stated explicitly.</w:t>
-      </w:r>
-    </w:p>
-    <w:p>
-      <w:pPr>
-        <w:pStyle w:val="1"/>
-      </w:pPr>
-      <w:r>
-        <w:t>Declaration of generative AI and AI-assisted technologies</w:t>
-      </w:r>
-    </w:p>
-    <w:p>
-      <w:r>
-        <w:t>Generative AI tools were used for language editing and software drafting. The author is responsible for verifying the code, data, citations and all conclusions, and has checked each reported number against the released artefacts.</w:t>
-      </w:r>
-    </w:p>
-    <w:p>
-      <w:pPr>
-        <w:pStyle w:val="1"/>
-      </w:pPr>
-      <w:r>
-        <w:t>CRediT authorship contribution statement</w:t>
-      </w:r>
-    </w:p>
-    <w:p>
-      <w:r>
-        <w:t>To be completed by the author according to actual contributions: conceptualisation, methodology, software, validation, formal analysis, data curation, writing - original draft, writing - review and editing, visualisation.</w:t>
-      </w:r>
-    </w:p>
-    <w:p>
-      <w:pPr>
-        <w:pStyle w:val="1"/>
-      </w:pPr>
-      <w:r>
         <w:t>References</w:t>
       </w:r>
     </w:p>
@@ -11765,7 +11795,6 @@
         </w:numPr>
       </w:pPr>
       <w:r>
-        <w:lastRenderedPageBreak/>
         <w:t>Liu H, Setiono R. Chi2: Feature selection and discretization of numeric attributes. ICTAI 1995: 388-391. DOI:10.1109/TAI.1995.479783.</w:t>
       </w:r>
     </w:p>
@@ -11874,6 +11903,7 @@
         </w:numPr>
       </w:pPr>
       <w:r>
+        <w:lastRenderedPageBreak/>
         <w:t>Liu L, Engelen G, Timmerman J, et al. Error prevalence in NIDS datasets: A case study on CIC-IDS-2017 and CSE-CIC-IDS-2018. IEEE CNS 2022. DOI:10.1109/CNS56114.2022.9947235.</w:t>
       </w:r>
     </w:p>
@@ -12006,7 +12036,6 @@
         </w:numPr>
       </w:pPr>
       <w:r>
-        <w:lastRenderedPageBreak/>
         <w:t>Angelopoulos A N, Bates S. Conformal prediction: A gentle introduction. Foundations and Trends in Machine Learning, 2023, 16(4): 494-591. DOI:10.1561/2200000101.</w:t>
       </w:r>
     </w:p>
@@ -12127,6 +12156,7 @@
         </w:numPr>
       </w:pPr>
       <w:r>
+        <w:lastRenderedPageBreak/>
         <w:t>Han S, Kim Y, Lee S. Improvement of the classification performance of an intrusion detection model for rare and unknown attack traffic. Electronics, 2021, 10(18): 2268. DOI:10.3390/electronics10182268.</w:t>
       </w:r>
     </w:p>
@@ -12537,7 +12567,6 @@
               <w:rPr>
                 <w:sz w:val="16"/>
               </w:rPr>
-              <w:lastRenderedPageBreak/>
               <w:t>S09</w:t>
             </w:r>
           </w:p>
@@ -13184,6 +13213,7 @@
               <w:rPr>
                 <w:sz w:val="16"/>
               </w:rPr>
+              <w:lastRenderedPageBreak/>
               <w:t>S28</w:t>
             </w:r>
           </w:p>
@@ -13547,76 +13577,76 @@
       </w:rPr>
     </w:lvl>
   </w:abstractNum>
-  <w:num w:numId="1" w16cid:durableId="537737492">
+  <w:num w:numId="1" w16cid:durableId="2079403881">
     <w:abstractNumId w:val="8"/>
   </w:num>
-  <w:num w:numId="2" w16cid:durableId="43144756">
+  <w:num w:numId="2" w16cid:durableId="2014142629">
     <w:abstractNumId w:val="6"/>
   </w:num>
-  <w:num w:numId="3" w16cid:durableId="400058576">
+  <w:num w:numId="3" w16cid:durableId="608900968">
     <w:abstractNumId w:val="5"/>
   </w:num>
-  <w:num w:numId="4" w16cid:durableId="1440297806">
+  <w:num w:numId="4" w16cid:durableId="1082333903">
     <w:abstractNumId w:val="4"/>
   </w:num>
-  <w:num w:numId="5" w16cid:durableId="335886234">
+  <w:num w:numId="5" w16cid:durableId="1920362604">
     <w:abstractNumId w:val="7"/>
   </w:num>
-  <w:num w:numId="6" w16cid:durableId="1010645446">
+  <w:num w:numId="6" w16cid:durableId="1494102638">
     <w:abstractNumId w:val="3"/>
   </w:num>
-  <w:num w:numId="7" w16cid:durableId="1873760867">
+  <w:num w:numId="7" w16cid:durableId="1202015738">
     <w:abstractNumId w:val="2"/>
   </w:num>
-  <w:num w:numId="8" w16cid:durableId="354622630">
+  <w:num w:numId="8" w16cid:durableId="476340717">
     <w:abstractNumId w:val="1"/>
   </w:num>
-  <w:num w:numId="9" w16cid:durableId="624970364">
+  <w:num w:numId="9" w16cid:durableId="774446521">
     <w:abstractNumId w:val="0"/>
   </w:num>
-  <w:num w:numId="10" w16cid:durableId="210727287">
+  <w:num w:numId="10" w16cid:durableId="1805929376">
     <w:abstractNumId w:val="7"/>
     <w:lvlOverride w:ilvl="0">
       <w:startOverride w:val="1"/>
     </w:lvlOverride>
   </w:num>
-  <w:num w:numId="11" w16cid:durableId="394089270">
+  <w:num w:numId="11" w16cid:durableId="234321815">
     <w:abstractNumId w:val="7"/>
     <w:lvlOverride w:ilvl="0">
       <w:startOverride w:val="1"/>
     </w:lvlOverride>
   </w:num>
-  <w:num w:numId="12" w16cid:durableId="1187795582">
+  <w:num w:numId="12" w16cid:durableId="492381280">
     <w:abstractNumId w:val="7"/>
     <w:lvlOverride w:ilvl="0">
       <w:startOverride w:val="1"/>
     </w:lvlOverride>
   </w:num>
-  <w:num w:numId="13" w16cid:durableId="875239114">
+  <w:num w:numId="13" w16cid:durableId="311642286">
     <w:abstractNumId w:val="7"/>
     <w:lvlOverride w:ilvl="0">
       <w:startOverride w:val="1"/>
     </w:lvlOverride>
   </w:num>
-  <w:num w:numId="14" w16cid:durableId="1954747046">
+  <w:num w:numId="14" w16cid:durableId="1947230000">
     <w:abstractNumId w:val="7"/>
     <w:lvlOverride w:ilvl="0">
       <w:startOverride w:val="1"/>
     </w:lvlOverride>
   </w:num>
-  <w:num w:numId="15" w16cid:durableId="1144085171">
+  <w:num w:numId="15" w16cid:durableId="1106925715">
     <w:abstractNumId w:val="7"/>
     <w:lvlOverride w:ilvl="0">
       <w:startOverride w:val="1"/>
     </w:lvlOverride>
   </w:num>
-  <w:num w:numId="16" w16cid:durableId="24790524">
+  <w:num w:numId="16" w16cid:durableId="471674308">
     <w:abstractNumId w:val="7"/>
     <w:lvlOverride w:ilvl="0">
       <w:startOverride w:val="1"/>
     </w:lvlOverride>
   </w:num>
-  <w:num w:numId="17" w16cid:durableId="1046175670">
+  <w:num w:numId="17" w16cid:durableId="86972326">
     <w:abstractNumId w:val="7"/>
     <w:lvlOverride w:ilvl="0">
       <w:startOverride w:val="1"/>

</xml_diff>

<commit_message>
Round 20av: diversity claim stated as association; every cost figure carries its source
</commit_message>
<xml_diff>
--- a/重构版论文_v4_20260915/English_SCI_Manuscript_v4.docx
+++ b/重构版论文_v4_20260915/English_SCI_Manuscript_v4.docx
@@ -24,13 +24,13 @@
         <w:t>Reported differences between intrusion-detection models are sensitive to duplicate flows, conflicting labels, feature leakage and class priors. We test a widely adopted but rarely validated assumption: that fusing random-forest experts with sample-specific reliability weights (RCCF) beats equal voting. Under one leakage-controlled protocol we build a 53,237-flow natural-prior population and a 3,365-flow balanced control from CIC-IDS2017, add NSL-KDD, UNSW-NB15 and an IoT corpus, and compare four feature vie</w:t>
       </w:r>
       <w:r>
-        <w:t>ws over ten seeds. The two models differ by -0.000456 Macro-F1 (five up, five down); the seed-level 90% and test-row paired bootstrap intervals both lie inside equivalence margins of 0.005 and 0.01. Over the same four experts it changes one label in 79,860 predictions. The experts never disagree; weight entropy is 0.99998; class prior and dedup order move Macro-F1 by +0.0725 and +0.0060. Three identifiability conditions are derived, one a row-wise bound: 99.91% of the 23,958 test rows are provably invariant</w:t>
-      </w:r>
-      <w:r>
-        <w:t xml:space="preserve">, with a median decision margin 3,469-5,038 times it. All 108 gate configurations yield six distinct validation scores; the gain is governed by expert diversity (slope 0.0646, r = 0.749). The equivalence reproduces on a population 7.8 times larger but not on the uncapped 2,429,503-flow corpus, where it becomes a small, consistent deficit (-0.005533, all ten seeds) at a 175-fold training cost; the IoT corpus saturates. The mechanism is 4.1 times larger and 4.6 times slower, without cost-sensitive advantage. </w:t>
-      </w:r>
-      <w:r>
-        <w:t>We contribute a leakage-controlled protocol, an identifiability boundary and a map separating protocol from aggregation-rule effects; the evidence supports neither superiority nor production readiness.</w:t>
+        <w:t>ws over ten seeds. The two models differ by -0.000456 Macro-F1 (five up, five down); the seed-level 90% and paired bootstrap intervals lie inside the 0.005 and 0.01 equivalence margins. Over the same four experts it changes one label in 79,860 predictions. Experts never disagree; weight entropy is 0.99998; class prior and dedup order move Macro-F1 by +0.0725 and +0.0060. Three identifiability conditions are derived, one a row-wise bound: 99.91% of the 23,958 test rows are provably invariant, with a median m</w:t>
+      </w:r>
+      <w:r>
+        <w:t>argin 3,469-5,038 times it. 108 gate configurations yield six distinct scores; across fifteen configurations the gain co-varies with expert diversity (slope 0.0646, r = 0.749; association, not intervention). The equivalence reproduces on a population 7.8 times larger but not on the uncapped 2,429,503-flow corpus, where it becomes a consistent deficit (-0.005533, all ten seeds) at a 175-fold cost; the IoT corpus saturates. The mechanism is 4.1 times larger and 4.6 times slower (S22), without cost-sensitive a</w:t>
+      </w:r>
+      <w:r>
+        <w:t>dvantage. We contribute a leakage-controlled protocol, an identifiability boundary and a map separating protocol from aggregation-rule effects; the evidence supports neither superiority nor production readiness.</w:t>
       </w:r>
     </w:p>
     <w:p>
@@ -1039,7 +1039,7 @@
           <w:noProof/>
         </w:rPr>
         <w:drawing>
-          <wp:inline distT="0" distB="0" distL="0" distR="0" wp14:anchorId="4CF091FA" wp14:editId="441D1436">
+          <wp:inline distT="0" distB="0" distL="0" distR="0" wp14:anchorId="4FC88B88" wp14:editId="5B9DAFFB">
             <wp:extent cx="5760720" cy="2734826"/>
             <wp:effectExtent l="0" t="0" r="0" b="0"/>
             <wp:docPr id="1" name="Picture 1"/>
@@ -2388,7 +2388,7 @@
           <w:noProof/>
         </w:rPr>
         <w:drawing>
-          <wp:inline distT="0" distB="0" distL="0" distR="0" wp14:anchorId="2A9D4724" wp14:editId="6EBEFCA7">
+          <wp:inline distT="0" distB="0" distL="0" distR="0" wp14:anchorId="4B750647" wp14:editId="637EA051">
             <wp:extent cx="5760720" cy="2722098"/>
             <wp:effectExtent l="0" t="0" r="0" b="0"/>
             <wp:docPr id="2" name="Picture 2"/>
@@ -3380,7 +3380,7 @@
           <w:noProof/>
         </w:rPr>
         <w:drawing>
-          <wp:inline distT="0" distB="0" distL="0" distR="0" wp14:anchorId="2FEF84EF" wp14:editId="12CB9ED1">
+          <wp:inline distT="0" distB="0" distL="0" distR="0" wp14:anchorId="0BD92B0E" wp14:editId="25557395">
             <wp:extent cx="5760720" cy="3482709"/>
             <wp:effectExtent l="0" t="0" r="0" b="0"/>
             <wp:docPr id="3" name="Picture 3"/>
@@ -7167,7 +7167,7 @@
           <w:noProof/>
         </w:rPr>
         <w:drawing>
-          <wp:inline distT="0" distB="0" distL="0" distR="0" wp14:anchorId="2898712C" wp14:editId="7B3A7621">
+          <wp:inline distT="0" distB="0" distL="0" distR="0" wp14:anchorId="5A3FD725" wp14:editId="5E2D933C">
             <wp:extent cx="5760720" cy="2356272"/>
             <wp:effectExtent l="0" t="0" r="0" b="0"/>
             <wp:docPr id="4" name="Picture 4"/>
@@ -8064,7 +8064,7 @@
         <w:t xml:space="preserve"> On the natural-prior protocol, averaged over the ten seeds of Table 4(a), RCCF takes 93.3 s to train against 1.16 s for the equal-weight forest, and 0.244 s to predict against 0.046 s on a whole test batch - about 5.3 times slower at inference. That batch ratio must not be conflated with the single-row latency ratio of 4.9 reported in Section 5.6 (14.62 ms against 2.96 ms): one measures throughput on 7,986 rows, the other a single call. The gap widens on the balanced control, where training takes 9.13 s ag</w:t>
       </w:r>
       <w:r>
-        <w:t>ainst 0.45 s. The most favourable summary of what these costs buy is that Macro-F1 moves within +/- 0.01.</w:t>
+        <w:t>ainst 0.45 s (three seeds, Table 4(b)). The most favourable summary of what these costs buy is that Macro-F1 moves within +/- 0.01.</w:t>
       </w:r>
     </w:p>
     <w:p>
@@ -8130,7 +8130,7 @@
           <w:noProof/>
         </w:rPr>
         <w:drawing>
-          <wp:inline distT="0" distB="0" distL="0" distR="0" wp14:anchorId="0CD2C554" wp14:editId="0CE8EC61">
+          <wp:inline distT="0" distB="0" distL="0" distR="0" wp14:anchorId="15765B1D" wp14:editId="789213BD">
             <wp:extent cx="5760720" cy="2045294"/>
             <wp:effectExtent l="0" t="0" r="0" b="0"/>
             <wp:docPr id="5" name="Picture 5"/>
@@ -8308,7 +8308,7 @@
           <w:noProof/>
         </w:rPr>
         <w:drawing>
-          <wp:inline distT="0" distB="0" distL="0" distR="0" wp14:anchorId="5EC0F5F1" wp14:editId="2BA7FAF0">
+          <wp:inline distT="0" distB="0" distL="0" distR="0" wp14:anchorId="170C404F" wp14:editId="4C0BD9E9">
             <wp:extent cx="5760720" cy="2308234"/>
             <wp:effectExtent l="0" t="0" r="0" b="0"/>
             <wp:docPr id="6" name="Picture 6"/>
@@ -8391,7 +8391,7 @@
         <w:rPr>
           <w:b/>
         </w:rPr>
-        <w:t>Measurement 6: the gain is governed by expert diversity, not by the implementation.</w:t>
+        <w:t>Measurement 6: the gain co-varies with expert diversity; the inertness is not an implementation artefact.</w:t>
       </w:r>
       <w:r>
         <w:t xml:space="preserve"> If the gate were inert merely because the four experts in this study are too similar, then deliberately constructing more dispersed experts should restore the gain. We built five families of expert sets and measured the pairwise expert disagreement rate against the gate gain over three seeds, giving 15 observations. This suite used three cross-fitting folds rather than the five of the primary protocol; the gate search of Measurement 5 shows that fold count changes little (six distinct validation values acr</w:t>
@@ -9040,7 +9040,7 @@
           <w:noProof/>
         </w:rPr>
         <w:drawing>
-          <wp:inline distT="0" distB="0" distL="0" distR="0" wp14:anchorId="6652A19A" wp14:editId="0B0E77AD">
+          <wp:inline distT="0" distB="0" distL="0" distR="0" wp14:anchorId="7DB396DC" wp14:editId="6DAF603E">
             <wp:extent cx="5760720" cy="2167923"/>
             <wp:effectExtent l="0" t="0" r="0" b="0"/>
             <wp:docPr id="7" name="Picture 7"/>
@@ -9115,10 +9115,13 @@
         <w:rPr>
           <w:b/>
         </w:rPr>
-        <w:t>the gain of conditional weighting is governed by expert diversity.</w:t>
-      </w:r>
-      <w:r>
-        <w:t xml:space="preserve"> On flow-feature data, "multi-view" experts built from different filter selectors disagree on only 0.2%-0.4% of samples, so the gate is structurally incapable of producing a gain. When disagreement is raised to 3%-6% the gate does begin to change predictions and yields a small positive gain, but that gain (+0.003 to +0.004 Macro-F1) remains below the split-to-split variation (standard deviation about 0.011).</w:t>
+        <w:t>the gain of conditional weighting moves with expert diversity.</w:t>
+      </w:r>
+      <w:r>
+        <w:t xml:space="preserve"> The relation is measured over fifteen constructed configurations, so it is a dose-response association: it shows that the gain and expert disagreement move together, not that disagreement alone causes a gain. On flow-feature data, "multi-view" experts built from different filter selectors disagree on only 0.2%-0.4% of samples, so the gate is structurally incapable of producing a gain. When disagreement is raised to 3%-6% the gate does begin to change predictions and yields a small positive gain, but that g</w:t>
+      </w:r>
+      <w:r>
+        <w:t>ain (+0.003 to +0.004 Macro-F1) remains below the split-to-split variation (standard deviation about 0.011).</w:t>
       </w:r>
     </w:p>
     <w:p>
@@ -9147,8 +9150,9 @@
         <w:rPr>
           <w:noProof/>
         </w:rPr>
+        <w:lastRenderedPageBreak/>
         <w:drawing>
-          <wp:inline distT="0" distB="0" distL="0" distR="0" wp14:anchorId="4511DC73" wp14:editId="5942EEE2">
+          <wp:inline distT="0" distB="0" distL="0" distR="0" wp14:anchorId="7C0C2122" wp14:editId="786003DE">
             <wp:extent cx="5760720" cy="2258878"/>
             <wp:effectExtent l="0" t="0" r="0" b="0"/>
             <wp:docPr id="8" name="Picture 8"/>
@@ -9202,7 +9206,6 @@
         <w:rPr>
           <w:b/>
         </w:rPr>
-        <w:lastRenderedPageBreak/>
         <w:t>(1) Deduplication order.</w:t>
       </w:r>
       <w:r>
@@ -9330,7 +9333,7 @@
           <w:noProof/>
         </w:rPr>
         <w:drawing>
-          <wp:inline distT="0" distB="0" distL="0" distR="0" wp14:anchorId="77D33C66" wp14:editId="7DC10F42">
+          <wp:inline distT="0" distB="0" distL="0" distR="0" wp14:anchorId="168158DB" wp14:editId="7B3A911D">
             <wp:extent cx="5760720" cy="2516852"/>
             <wp:effectExtent l="0" t="0" r="0" b="0"/>
             <wp:docPr id="9" name="Picture 9"/>
@@ -9467,7 +9470,7 @@
           <w:noProof/>
         </w:rPr>
         <w:drawing>
-          <wp:inline distT="0" distB="0" distL="0" distR="0" wp14:anchorId="72736111" wp14:editId="4F5FC063">
+          <wp:inline distT="0" distB="0" distL="0" distR="0" wp14:anchorId="10DDF149" wp14:editId="2D7E38CA">
             <wp:extent cx="5760720" cy="2223311"/>
             <wp:effectExtent l="0" t="0" r="0" b="0"/>
             <wp:docPr id="10" name="Picture 10"/>
@@ -9553,7 +9556,7 @@
           <w:noProof/>
         </w:rPr>
         <w:drawing>
-          <wp:inline distT="0" distB="0" distL="0" distR="0" wp14:anchorId="27646F82" wp14:editId="53168406">
+          <wp:inline distT="0" distB="0" distL="0" distR="0" wp14:anchorId="5E556ADB" wp14:editId="0DF14CB9">
             <wp:extent cx="5760720" cy="2538527"/>
             <wp:effectExtent l="0" t="0" r="0" b="0"/>
             <wp:docPr id="11" name="Picture 11"/>
@@ -9608,10 +9611,10 @@
         <w:rPr>
           <w:b/>
         </w:rPr>
-        <w:t>Latency.</w:t>
-      </w:r>
-      <w:r>
-        <w:t xml:space="preserve"> For single-row inference on one thread, RCCF's P50/P95/P99 latencies are 14.62/15.77/16.12 ms against 2.96/3.61/4.18 ms for the equal-weight chi-square forest. Switching to the library-default threading raises RCCF to 69.93/75.11/76.22 ms and the equal forest to 16.69/18.24/18.47 ms; small single-row calls cannot exploit multiple threads and instead pay scheduling overhead. These figures cover the </w:t>
+        <w:t>Latency</w:t>
+      </w:r>
+      <w:r>
+        <w:t xml:space="preserve"> (three seeds, 7,986 test rows; S15). For single-row inference on one thread, RCCF's P50/P95/P99 latencies are 14.62/15.77/16.12 ms against 2.96/3.61/4.18 ms for the equal-weight chi-square forest. Switching to the library-default threading raises RCCF to 69.93/75.11/76.22 ms and the equal forest to 16.69/18.24/18.47 ms; small single-row calls cannot exploit multiple threads and instead pay scheduling overhead. These figures cover the </w:t>
       </w:r>
       <w:r>
         <w:rPr>
@@ -9642,13 +9645,13 @@
         <w:rPr>
           <w:b/>
         </w:rPr>
-        <w:t>Resource footprint.</w:t>
-      </w:r>
-      <w:r>
-        <w:t xml:space="preserve"> Model size and throughput separate the two designs more sharply than wall-clock time. The conditional mechanism stores four forests and occupies 9.09 MB when serialised, against 2.21 MB for the single equal-weight forest - a factor of 4.1 - and it processes about 43,100 rows per second on a full test batch against 200,300, a factor of 4.6. Peak resident-set growth during fitting was 37.0 MB against 78.3 MB, but the two models were profiled within one process, so that particular figure is order-dependent an</w:t>
-      </w:r>
-      <w:r>
-        <w:t>d indicative only.</w:t>
+        <w:t>Resource footprint</w:t>
+      </w:r>
+      <w:r>
+        <w:t xml:space="preserve"> (single seed, whole test batch; S22). Model size and throughput separate the two designs more sharply than wall-clock time. The conditional mechanism stores four forests and occupies 9.09 MB when serialised, against 2.21 MB for the single equal-weight forest - a factor of 4.1 - and it processes about 43,100 rows per second on a full test batch against 200,300, a factor of 4.6. Peak resident-set growth during fitting was 37.0 MB against 78.3 MB, but the two models were profiled within one process, so that p</w:t>
+      </w:r>
+      <w:r>
+        <w:t>articular figure is order-dependent and indicative only.</w:t>
       </w:r>
     </w:p>
     <w:p>
@@ -11354,6 +11357,17 @@
         <w:rPr>
           <w:b/>
         </w:rPr>
+        <w:t>The diversity evidence is associational.</w:t>
+      </w:r>
+      <w:r>
+        <w:t xml:space="preserve"> The dose-response relation rests on fifteen constructed expert configurations evaluated with three-fold cross-fitting; it shows that the gain moves with expert disagreement, not that disagreement alone causes a gain. No intervention that fixes disagreement while holding everything else constant was run.</w:t>
+      </w:r>
+    </w:p>
+    <w:p>
+      <w:r>
+        <w:rPr>
+          <w:b/>
+        </w:rPr>
         <w:t>The same-members control covers the primary population.</w:t>
       </w:r>
       <w:r>
@@ -11423,10 +11437,113 @@
         <w:t>Near-duplicates are removed only in their exact form.</w:t>
       </w:r>
       <w:r>
-        <w:t xml:space="preserve"> The introduction identifies near-duplicate flows as a hazard of public datasets, and the audit removes exact duplicate feature vectors. Rounding every feature to four significant digits and hashing the result shows that a further 0.36% of the study population forms near-duplicate groups at that resolution, and that 104 rows sit in near-duplicate groups that span the partitions, of which 17 test rows (0.21% of the test set) share a rounded feature vector with a training row. Removing those rows changes Macr</w:t>
+        <w:t xml:space="preserve"> The introduction identifies near-duplicate flows as a hazard of public datasets, and the audit removes exact duplicate feature vectors. Rounding every feature to four significant digits and hashing the result shows that a further 0.36% of the study population forms near-duplicate groups at that resolution, and that 104 rows sit in near-duplicate groups that span the partitions, of which 17 test </w:t>
+      </w:r>
+      <w:r>
+        <w:lastRenderedPageBreak/>
+        <w:t>rows (0.21% of the test set) share a rounded feature vector with a training row. Removing those rows changes Macr</w:t>
       </w:r>
       <w:r>
         <w:t>o-F1 by at most 0.00057 for any of the three models, so the overlap cannot explain the reported differences; coarser resolutions are reported in the supplementary material.</w:t>
+      </w:r>
+    </w:p>
+    <w:p>
+      <w:r>
+        <w:rPr>
+          <w:b/>
+        </w:rPr>
+        <w:t>Four datasets were evaluated, and every corpus comes from one collection programme.</w:t>
+      </w:r>
+      <w:r>
+        <w:t xml:space="preserve"> The conclusions are conditional on CIC-IDS2017 (both its capped populations and the full deduplicated corpus), NSL-KDD, UNSW-NB15 and N-BaIoT. N-BaIoT is saturated for flow-feature classifiers (every model at or above 0.9998 Macro-F1), so it probes the mechanics of the aggregation step rather than discrimination difficulty, and the external datasets remain independent native-label benchmarks rather than transfer tests. None of the four datasets represents production traffic, and no time-separated holdout o</w:t>
+      </w:r>
+      <w:r>
+        <w:t>n a common testbed exists in any of them.</w:t>
+      </w:r>
+    </w:p>
+    <w:p>
+      <w:r>
+        <w:rPr>
+          <w:b/>
+        </w:rPr>
+        <w:t>Adversarial robustness was not assessed.</w:t>
+      </w:r>
+      <w:r>
+        <w:t xml:space="preserve"> Only random perturbations and feature masking were applied. No evasion or gradient-based attack was constructed, and the reported degradation figures are not robustness guarantees against an adaptive adversary.</w:t>
+      </w:r>
+    </w:p>
+    <w:p>
+      <w:r>
+        <w:rPr>
+          <w:b/>
+        </w:rPr>
+        <w:t>Unknown-family support is uneven.</w:t>
+      </w:r>
+      <w:r>
+        <w:t xml:space="preserve"> PortScan contributes 158,930 records while Infiltration contributes 36 and Heartbleed 11. Open-set metrics are highly sensitive to which family is held out, so only per-family results are reported and no pooled open-set conclusion is drawn; the family-combination matrix is in Supplementary S30.</w:t>
+      </w:r>
+    </w:p>
+    <w:p>
+      <w:r>
+        <w:rPr>
+          <w:b/>
+        </w:rPr>
+        <w:t>Bootstrap intervals have a limited interpretation.</w:t>
+      </w:r>
+      <w:r>
+        <w:t xml:space="preserve"> The paired bootstrap quantifies test-row resampling uncertainty only; it does not capture changes in network environment, temporal drift or traffic composition.</w:t>
+      </w:r>
+    </w:p>
+    <w:p>
+      <w:r>
+        <w:rPr>
+          <w:b/>
+        </w:rPr>
+        <w:t>Single hardware platform and single implementation.</w:t>
+      </w:r>
+      <w:r>
+        <w:t xml:space="preserve"> Latency depends on hardware, the BLAS backend and thread settings. The environment is fixed and recorded, but no cross-platform portability is claimed.</w:t>
+      </w:r>
+    </w:p>
+    <w:p>
+      <w:pPr>
+        <w:pStyle w:val="1"/>
+      </w:pPr>
+      <w:r>
+        <w:t>7. Conclusion</w:t>
+      </w:r>
+    </w:p>
+    <w:p>
+      <w:r>
+        <w:t>This study tested the widely adopted assumption that sample-conditional ensemble weighting is better than equal voting, under a strict leakage-controlled protocol. Three conclusions follow.</w:t>
+      </w:r>
+    </w:p>
+    <w:p>
+      <w:r>
+        <w:rPr>
+          <w:b/>
+        </w:rPr>
+        <w:t>First, relative to the most direct equal-weight control the gain lies inside an equivalence boundary.</w:t>
+      </w:r>
+      <w:r>
+        <w:t xml:space="preserve"> Averaged over ten seeds on the natural-prior population of CIC-IDS2017, the Macro-F1 difference between conditional weighting and an equal-weight chi-square forest is -0.000456, with the per-seed sign split five to five. Against the equal-weight fusion of those same four experts the gated model changes one label in 79,860 test predictions (-0.000010), which locates the single-view gap in the composition of the ensemble rather than in the gate. Both the seed-level 90% interval [-0.00112, +0.00021] and the t</w:t>
+      </w:r>
+      <w:r>
+        <w:t>est-row paired bootstrap interval [-0.00425, +0.00338] lie inside equivalence margins of 0.005 and 0.01. The four experts disagree on no test row, and the normalised weight entropy is 0.99998. The cost is about an 80-fold increase in training time and a fivefold increase in batch inference time (ten-seed means, Table 4(a)).</w:t>
+      </w:r>
+    </w:p>
+    <w:p>
+      <w:r>
+        <w:rPr>
+          <w:b/>
+        </w:rPr>
+        <w:t>A qualification on the first conclusion.</w:t>
+      </w:r>
+      <w:r>
+        <w:t xml:space="preserve"> It is a property of the population, not of the mechanism. On the fully uncapped 2,429,503-flow corpus the same comparison turns into a consistent deficit of -0.005533 across all ten seeds (equivalent at 0.01 but not at 0.005), at a 175-fold training cost. The cause is not the weighting - Section 5.3 shows the weights never move a label - but the price of averaging over feature views whose quality diverges at scale: the full-feature view falls 0.021397 behind the chi-square view, and one such expert inside </w:t>
+      </w:r>
+      <w:r>
+        <w:t>a four-way average accounts for the whole gap (0.005349 predicted against -0.005533 measured). Against a full-feature equal forest the gate is reliably better over ten seeds, but the magnitude matches that of a feature-view change.</w:t>
       </w:r>
     </w:p>
     <w:p>
@@ -11435,116 +11552,13 @@
           <w:b/>
         </w:rPr>
         <w:lastRenderedPageBreak/>
-        <w:t>Four datasets were evaluated, and every corpus comes from one collection programme.</w:t>
-      </w:r>
-      <w:r>
-        <w:t xml:space="preserve"> The conclusions are conditional on CIC-IDS2017 (both its capped populations and the full deduplicated corpus), NSL-KDD, UNSW-NB15 and N-BaIoT. N-BaIoT is saturated for flow-feature classifiers (every model at or above 0.9998 Macro-F1), so it probes the mechanics of the aggregation step rather than discrimination difficulty, and the external datasets remain independent native-label benchmarks rather than transfer tests. None of the four datasets represents production traffic, and no time-separated holdout o</w:t>
-      </w:r>
-      <w:r>
-        <w:t>n a common testbed exists in any of them.</w:t>
-      </w:r>
-    </w:p>
-    <w:p>
-      <w:r>
-        <w:rPr>
-          <w:b/>
-        </w:rPr>
-        <w:t>Adversarial robustness was not assessed.</w:t>
-      </w:r>
-      <w:r>
-        <w:t xml:space="preserve"> Only random perturbations and feature masking were applied. No evasion or gradient-based attack was constructed, and the reported degradation figures are not robustness guarantees against an adaptive adversary.</w:t>
-      </w:r>
-    </w:p>
-    <w:p>
-      <w:r>
-        <w:rPr>
-          <w:b/>
-        </w:rPr>
-        <w:t>Unknown-family support is uneven.</w:t>
-      </w:r>
-      <w:r>
-        <w:t xml:space="preserve"> PortScan contributes 158,930 records while Infiltration contributes 36 and Heartbleed 11. Open-set metrics are highly sensitive to which family is held out, so only per-family results are reported and no pooled open-set conclusion is drawn; the family-combination matrix is in Supplementary S30.</w:t>
-      </w:r>
-    </w:p>
-    <w:p>
-      <w:r>
-        <w:rPr>
-          <w:b/>
-        </w:rPr>
-        <w:t>Bootstrap intervals have a limited interpretation.</w:t>
-      </w:r>
-      <w:r>
-        <w:t xml:space="preserve"> The paired bootstrap quantifies test-row resampling uncertainty only; it does not capture changes in network environment, temporal drift or traffic composition.</w:t>
-      </w:r>
-    </w:p>
-    <w:p>
-      <w:r>
-        <w:rPr>
-          <w:b/>
-        </w:rPr>
-        <w:t>Single hardware platform and single implementation.</w:t>
-      </w:r>
-      <w:r>
-        <w:t xml:space="preserve"> Latency depends on hardware, the BLAS backend and thread settings. The environment is fixed and recorded, but no cross-platform portability is claimed.</w:t>
-      </w:r>
-    </w:p>
-    <w:p>
-      <w:pPr>
-        <w:pStyle w:val="1"/>
-      </w:pPr>
-      <w:r>
-        <w:t>7. Conclusion</w:t>
-      </w:r>
-    </w:p>
-    <w:p>
-      <w:r>
-        <w:t>This study tested the widely adopted assumption that sample-conditional ensemble weighting is better than equal voting, under a strict leakage-controlled protocol. Three conclusions follow.</w:t>
-      </w:r>
-    </w:p>
-    <w:p>
-      <w:r>
-        <w:rPr>
-          <w:b/>
-        </w:rPr>
-        <w:t>First, relative to the most direct equal-weight control the gain lies inside an equivalence boundary.</w:t>
-      </w:r>
-      <w:r>
-        <w:t xml:space="preserve"> Averaged over ten seeds on the natural-prior population of CIC-IDS2017, the Macro-F1 difference between conditional weighting and an equal-weight chi-square forest is -0.000456, with the per-seed sign split five to five. Against the equal-weight fusion of those same four experts the gated model changes one label in 79,860 test predictions (-0.000010), which locates the single-view gap in the composition of the ensemble rather than in the gate. Both the seed-level 90% interval [-0.00112, +0.00021] and the t</w:t>
-      </w:r>
-      <w:r>
-        <w:t>est-row paired bootstrap interval [-0.00425, +0.00338] lie inside equivalence margins of 0.005 and 0.01. The four experts disagree on no test row, and the normalised weight entropy is 0.99998. The cost is about an 80-fold increase in training time and a fivefold increase in batch inference time.</w:t>
-      </w:r>
-    </w:p>
-    <w:p>
-      <w:r>
-        <w:rPr>
-          <w:b/>
-        </w:rPr>
-        <w:t>A qualification on the first conclusion.</w:t>
-      </w:r>
-      <w:r>
-        <w:t xml:space="preserve"> It is a property of the population, not of the mechanism. On the fully uncapped 2,429,503-flow corpus the same comparison turns into a consistent deficit of -0.005533 across all ten seeds (equivalent at 0.01 but not at 0.005), at a 175-fold training cost. The cause is not the weighting - Section 5.3 shows the weights never move a label - but the price of averaging over feature views whose quality diverges at scale: the full-feature view falls 0.021397 behind the chi-square view, and one such expert inside </w:t>
-      </w:r>
-      <w:r>
-        <w:t>a four-way average accounts for the whole gap (0.005349 predicted against -0.005533 measured). Against a full-feature equal forest the gate is reliably better over ten seeds, but the magnitude matches that of a feature-view change.</w:t>
-      </w:r>
-    </w:p>
-    <w:p>
-      <w:r>
-        <w:rPr>
-          <w:b/>
-        </w:rPr>
         <w:t>Second, the failure is explainable and quantified.</w:t>
       </w:r>
       <w:r>
-        <w:t xml:space="preserve"> Three identifiability conditions are derived and one of them is turned into a row-wise computable bound, under which 99.91% of 23,958 test rows are provably invariant to the weighting, with a decision margin 3,469 to 5,038 times the perturbation bound. A search over all 108 gate hyper-</w:t>
-      </w:r>
-      <w:r>
-        <w:lastRenderedPageBreak/>
-        <w:t xml:space="preserve">parameter configurations yields only six distinct validation scores, excluding insufficient tuning. A reverse experiment shows that the gain is governed by expert diversity: two low-diversity expert sets gain exactly zero in </w:t>
-      </w:r>
-      <w:r>
-        <w:t>all six runs, whereas three decorrelated sets gain positively in all nine runs (slope 0.0646, Pearson r = 0.749). The inertness of conditional weighting is therefore not an implementation or tuning artefact but a direct consequence of filter-based multi-view experts being too similar on this kind of data.</w:t>
+        <w:t xml:space="preserve"> Three identifiability conditions are derived and one of them is turned into a row-wise computable bound, under which 99.91% of 23,958 test rows are provably invariant to the weighting, with a decision margin 3,469 to 5,038 times the perturbation bound. A search over all 108 gate hyper-parameter configurations yields only six distinct validation scores, excluding insufficient tuning. A deliberately constructed reverse experiment shows that the gain moves with expert diversity: two low-diversity expert sets </w:t>
+      </w:r>
+      <w:r>
+        <w:t>gain exactly zero in all six runs, whereas three decorrelated sets gain positively in all nine runs (slope 0.0646, Pearson r = 0.749). The inertness of conditional weighting is therefore not an implementation or tuning artefact but a direct consequence of filter-based multi-view experts being too similar on this kind of data.</w:t>
       </w:r>
     </w:p>
     <w:p>
@@ -11632,6 +11646,7 @@
         <w:pStyle w:val="1"/>
       </w:pPr>
       <w:r>
+        <w:lastRenderedPageBreak/>
         <w:t>CRediT authorship contribution statement</w:t>
       </w:r>
     </w:p>
@@ -11645,7 +11660,6 @@
         <w:pStyle w:val="1"/>
       </w:pPr>
       <w:r>
-        <w:lastRenderedPageBreak/>
         <w:t>References</w:t>
       </w:r>
     </w:p>
@@ -11867,6 +11881,7 @@
         </w:numPr>
       </w:pPr>
       <w:r>
+        <w:lastRenderedPageBreak/>
         <w:t>UCI Machine Learning Repository. Detection of IoT botnet attacks N-BaIoT [dataset]. 2018. DOI:10.24432/C5RC8J.</w:t>
       </w:r>
     </w:p>
@@ -11903,7 +11918,6 @@
         </w:numPr>
       </w:pPr>
       <w:r>
-        <w:lastRenderedPageBreak/>
         <w:t>Liu L, Engelen G, Timmerman J, et al. Error prevalence in NIDS datasets: A case study on CIC-IDS-2017 and CSE-CIC-IDS-2018. IEEE CNS 2022. DOI:10.1109/CNS56114.2022.9947235.</w:t>
       </w:r>
     </w:p>
@@ -12120,6 +12134,7 @@
         </w:numPr>
       </w:pPr>
       <w:r>
+        <w:lastRenderedPageBreak/>
         <w:t>Holm S. A simple sequentially rejective multiple test procedure. Scandinavian Journal of Statistics, 1979, 6(2): 65-70. [no DOI; JSTOR stable record 4615733]</w:t>
       </w:r>
     </w:p>
@@ -12156,7 +12171,6 @@
         </w:numPr>
       </w:pPr>
       <w:r>
-        <w:lastRenderedPageBreak/>
         <w:t>Han S, Kim Y, Lee S. Improvement of the classification performance of an intrusion detection model for rare and unknown attack traffic. Electronics, 2021, 10(18): 2268. DOI:10.3390/electronics10182268.</w:t>
       </w:r>
     </w:p>
@@ -13009,6 +13023,7 @@
               <w:rPr>
                 <w:sz w:val="16"/>
               </w:rPr>
+              <w:lastRenderedPageBreak/>
               <w:t>S22</w:t>
             </w:r>
           </w:p>
@@ -13213,7 +13228,6 @@
               <w:rPr>
                 <w:sz w:val="16"/>
               </w:rPr>
-              <w:lastRenderedPageBreak/>
               <w:t>S28</w:t>
             </w:r>
           </w:p>
@@ -13577,76 +13591,76 @@
       </w:rPr>
     </w:lvl>
   </w:abstractNum>
-  <w:num w:numId="1" w16cid:durableId="2079403881">
+  <w:num w:numId="1" w16cid:durableId="834346800">
     <w:abstractNumId w:val="8"/>
   </w:num>
-  <w:num w:numId="2" w16cid:durableId="2014142629">
+  <w:num w:numId="2" w16cid:durableId="447552307">
     <w:abstractNumId w:val="6"/>
   </w:num>
-  <w:num w:numId="3" w16cid:durableId="608900968">
+  <w:num w:numId="3" w16cid:durableId="1555655651">
     <w:abstractNumId w:val="5"/>
   </w:num>
-  <w:num w:numId="4" w16cid:durableId="1082333903">
+  <w:num w:numId="4" w16cid:durableId="593635525">
     <w:abstractNumId w:val="4"/>
   </w:num>
-  <w:num w:numId="5" w16cid:durableId="1920362604">
+  <w:num w:numId="5" w16cid:durableId="397481328">
     <w:abstractNumId w:val="7"/>
   </w:num>
-  <w:num w:numId="6" w16cid:durableId="1494102638">
+  <w:num w:numId="6" w16cid:durableId="1218709960">
     <w:abstractNumId w:val="3"/>
   </w:num>
-  <w:num w:numId="7" w16cid:durableId="1202015738">
+  <w:num w:numId="7" w16cid:durableId="1361319534">
     <w:abstractNumId w:val="2"/>
   </w:num>
-  <w:num w:numId="8" w16cid:durableId="476340717">
+  <w:num w:numId="8" w16cid:durableId="1250776543">
     <w:abstractNumId w:val="1"/>
   </w:num>
-  <w:num w:numId="9" w16cid:durableId="774446521">
+  <w:num w:numId="9" w16cid:durableId="871765639">
     <w:abstractNumId w:val="0"/>
   </w:num>
-  <w:num w:numId="10" w16cid:durableId="1805929376">
+  <w:num w:numId="10" w16cid:durableId="21247672">
     <w:abstractNumId w:val="7"/>
     <w:lvlOverride w:ilvl="0">
       <w:startOverride w:val="1"/>
     </w:lvlOverride>
   </w:num>
-  <w:num w:numId="11" w16cid:durableId="234321815">
+  <w:num w:numId="11" w16cid:durableId="1623799741">
     <w:abstractNumId w:val="7"/>
     <w:lvlOverride w:ilvl="0">
       <w:startOverride w:val="1"/>
     </w:lvlOverride>
   </w:num>
-  <w:num w:numId="12" w16cid:durableId="492381280">
+  <w:num w:numId="12" w16cid:durableId="1102650431">
     <w:abstractNumId w:val="7"/>
     <w:lvlOverride w:ilvl="0">
       <w:startOverride w:val="1"/>
     </w:lvlOverride>
   </w:num>
-  <w:num w:numId="13" w16cid:durableId="311642286">
+  <w:num w:numId="13" w16cid:durableId="1589382062">
     <w:abstractNumId w:val="7"/>
     <w:lvlOverride w:ilvl="0">
       <w:startOverride w:val="1"/>
     </w:lvlOverride>
   </w:num>
-  <w:num w:numId="14" w16cid:durableId="1947230000">
+  <w:num w:numId="14" w16cid:durableId="1315722996">
     <w:abstractNumId w:val="7"/>
     <w:lvlOverride w:ilvl="0">
       <w:startOverride w:val="1"/>
     </w:lvlOverride>
   </w:num>
-  <w:num w:numId="15" w16cid:durableId="1106925715">
+  <w:num w:numId="15" w16cid:durableId="791246659">
     <w:abstractNumId w:val="7"/>
     <w:lvlOverride w:ilvl="0">
       <w:startOverride w:val="1"/>
     </w:lvlOverride>
   </w:num>
-  <w:num w:numId="16" w16cid:durableId="471674308">
+  <w:num w:numId="16" w16cid:durableId="871650727">
     <w:abstractNumId w:val="7"/>
     <w:lvlOverride w:ilvl="0">
       <w:startOverride w:val="1"/>
     </w:lvlOverride>
   </w:num>
-  <w:num w:numId="17" w16cid:durableId="86972326">
+  <w:num w:numId="17" w16cid:durableId="425005881">
     <w:abstractNumId w:val="7"/>
     <w:lvlOverride w:ilvl="0">
       <w:startOverride w:val="1"/>

</xml_diff>

<commit_message>
Round 20aw: three new experiments - gate capacity, feature-budget sweep, ten-seed balanced control
</commit_message>
<xml_diff>
--- a/重构版论文_v4_20260915/English_SCI_Manuscript_v4.docx
+++ b/重构版论文_v4_20260915/English_SCI_Manuscript_v4.docx
@@ -1039,7 +1039,7 @@
           <w:noProof/>
         </w:rPr>
         <w:drawing>
-          <wp:inline distT="0" distB="0" distL="0" distR="0" wp14:anchorId="4FC88B88" wp14:editId="5B9DAFFB">
+          <wp:inline distT="0" distB="0" distL="0" distR="0" wp14:anchorId="4D91E318" wp14:editId="70C1DE2B">
             <wp:extent cx="5760720" cy="2734826"/>
             <wp:effectExtent l="0" t="0" r="0" b="0"/>
             <wp:docPr id="1" name="Picture 1"/>
@@ -2388,7 +2388,7 @@
           <w:noProof/>
         </w:rPr>
         <w:drawing>
-          <wp:inline distT="0" distB="0" distL="0" distR="0" wp14:anchorId="4B750647" wp14:editId="637EA051">
+          <wp:inline distT="0" distB="0" distL="0" distR="0" wp14:anchorId="5874F847" wp14:editId="1A65A1EC">
             <wp:extent cx="5760720" cy="2722098"/>
             <wp:effectExtent l="0" t="0" r="0" b="0"/>
             <wp:docPr id="2" name="Picture 2"/>
@@ -3380,7 +3380,7 @@
           <w:noProof/>
         </w:rPr>
         <w:drawing>
-          <wp:inline distT="0" distB="0" distL="0" distR="0" wp14:anchorId="0BD92B0E" wp14:editId="25557395">
+          <wp:inline distT="0" distB="0" distL="0" distR="0" wp14:anchorId="4801A450" wp14:editId="02097924">
             <wp:extent cx="5760720" cy="3482709"/>
             <wp:effectExtent l="0" t="0" r="0" b="0"/>
             <wp:docPr id="3" name="Picture 3"/>
@@ -7167,7 +7167,7 @@
           <w:noProof/>
         </w:rPr>
         <w:drawing>
-          <wp:inline distT="0" distB="0" distL="0" distR="0" wp14:anchorId="5A3FD725" wp14:editId="5E2D933C">
+          <wp:inline distT="0" distB="0" distL="0" distR="0" wp14:anchorId="40791905" wp14:editId="00C19E7A">
             <wp:extent cx="5760720" cy="2356272"/>
             <wp:effectExtent l="0" t="0" r="0" b="0"/>
             <wp:docPr id="4" name="Picture 4"/>
@@ -8130,7 +8130,7 @@
           <w:noProof/>
         </w:rPr>
         <w:drawing>
-          <wp:inline distT="0" distB="0" distL="0" distR="0" wp14:anchorId="15765B1D" wp14:editId="789213BD">
+          <wp:inline distT="0" distB="0" distL="0" distR="0" wp14:anchorId="1EE967A5" wp14:editId="7B39D6B1">
             <wp:extent cx="5760720" cy="2045294"/>
             <wp:effectExtent l="0" t="0" r="0" b="0"/>
             <wp:docPr id="5" name="Picture 5"/>
@@ -8308,7 +8308,7 @@
           <w:noProof/>
         </w:rPr>
         <w:drawing>
-          <wp:inline distT="0" distB="0" distL="0" distR="0" wp14:anchorId="170C404F" wp14:editId="4C0BD9E9">
+          <wp:inline distT="0" distB="0" distL="0" distR="0" wp14:anchorId="74EE4104" wp14:editId="734130A9">
             <wp:extent cx="5760720" cy="2308234"/>
             <wp:effectExtent l="0" t="0" r="0" b="0"/>
             <wp:docPr id="6" name="Picture 6"/>
@@ -9040,7 +9040,7 @@
           <w:noProof/>
         </w:rPr>
         <w:drawing>
-          <wp:inline distT="0" distB="0" distL="0" distR="0" wp14:anchorId="7DB396DC" wp14:editId="6DAF603E">
+          <wp:inline distT="0" distB="0" distL="0" distR="0" wp14:anchorId="26F4A720" wp14:editId="12BC477A">
             <wp:extent cx="5760720" cy="2167923"/>
             <wp:effectExtent l="0" t="0" r="0" b="0"/>
             <wp:docPr id="7" name="Picture 7"/>
@@ -9126,6 +9126,44 @@
     </w:p>
     <w:p>
       <w:r>
+        <w:rPr>
+          <w:b/>
+        </w:rPr>
+        <w:t>Measurement 7: a higher-capacity gate still cannot act.</w:t>
+      </w:r>
+      <w:r>
+        <w:t xml:space="preserve"> The gate's risk models are logistic regressions, so its inertness could be a property of that model class rather than of the data. Holding the four experts, the folds and the seeds fixed, we replaced the risk model with a gradient-boosted tree ensemble (200 iterations, 31 leaves) and repeated the ten-seed comparison against the equal-weight fusion of the same experts. The high-capacity gate gains </w:t>
+      </w:r>
+      <w:r>
+        <w:rPr>
+          <w:b/>
+        </w:rPr>
+        <w:t>+0.000050</w:t>
+      </w:r>
+      <w:r>
+        <w:t xml:space="preserve"> Macro-F1 against the logistic gate's </w:t>
+      </w:r>
+      <w:r>
+        <w:rPr>
+          <w:b/>
+        </w:rPr>
+        <w:t>+0.000010</w:t>
+      </w:r>
+      <w:r>
+        <w:t xml:space="preserve">, and changes </w:t>
+      </w:r>
+      <w:r>
+        <w:rPr>
+          <w:b/>
+        </w:rPr>
+        <w:t>28 of 79,860</w:t>
+      </w:r>
+      <w:r>
+        <w:t xml:space="preserve"> test predictions against the logistic gate's one. Both remain an order of magnitude inside the 0.005 margin, so the inertness is a property of the experts rather than of the capacity of the risk model.</w:t>
+      </w:r>
+    </w:p>
+    <w:p>
+      <w:r>
         <w:t>The gate search, the row-wise weight records and the expert-diversity suite are provided in Supplementary S08-S09, S16 and S18.</w:t>
       </w:r>
     </w:p>
@@ -9152,7 +9190,7 @@
         </w:rPr>
         <w:lastRenderedPageBreak/>
         <w:drawing>
-          <wp:inline distT="0" distB="0" distL="0" distR="0" wp14:anchorId="7C0C2122" wp14:editId="786003DE">
+          <wp:inline distT="0" distB="0" distL="0" distR="0" wp14:anchorId="5C0EC66C" wp14:editId="3DDEF26E">
             <wp:extent cx="5760720" cy="2258878"/>
             <wp:effectExtent l="0" t="0" r="0" b="0"/>
             <wp:docPr id="8" name="Picture 8"/>
@@ -9333,7 +9371,7 @@
           <w:noProof/>
         </w:rPr>
         <w:drawing>
-          <wp:inline distT="0" distB="0" distL="0" distR="0" wp14:anchorId="168158DB" wp14:editId="7B3A911D">
+          <wp:inline distT="0" distB="0" distL="0" distR="0" wp14:anchorId="2D072D98" wp14:editId="076CEC93">
             <wp:extent cx="5760720" cy="2516852"/>
             <wp:effectExtent l="0" t="0" r="0" b="0"/>
             <wp:docPr id="9" name="Picture 9"/>
@@ -9470,7 +9508,7 @@
           <w:noProof/>
         </w:rPr>
         <w:drawing>
-          <wp:inline distT="0" distB="0" distL="0" distR="0" wp14:anchorId="10DDF149" wp14:editId="2D7E38CA">
+          <wp:inline distT="0" distB="0" distL="0" distR="0" wp14:anchorId="78BC7A66" wp14:editId="71B08154">
             <wp:extent cx="5760720" cy="2223311"/>
             <wp:effectExtent l="0" t="0" r="0" b="0"/>
             <wp:docPr id="10" name="Picture 10"/>
@@ -9556,7 +9594,7 @@
           <w:noProof/>
         </w:rPr>
         <w:drawing>
-          <wp:inline distT="0" distB="0" distL="0" distR="0" wp14:anchorId="5E556ADB" wp14:editId="0DF14CB9">
+          <wp:inline distT="0" distB="0" distL="0" distR="0" wp14:anchorId="1B5E7179" wp14:editId="1133EF79">
             <wp:extent cx="5760720" cy="2538527"/>
             <wp:effectExtent l="0" t="0" r="0" b="0"/>
             <wp:docPr id="11" name="Picture 11"/>
@@ -10363,6 +10401,55 @@
     </w:p>
     <w:p>
       <w:r>
+        <w:rPr>
+          <w:b/>
+        </w:rPr>
+        <w:t>Feature-budget sensitivity.</w:t>
+      </w:r>
+      <w:r>
+        <w:t xml:space="preserve"> The operating point fixes k = 60 per view. Repeating the same-members comparison at other budgets (three seeds, 7,986 test rows each) shows where the gate starts to act: at k = 20 the views diverge, the gate gains </w:t>
+      </w:r>
+      <w:r>
+        <w:rPr>
+          <w:b/>
+        </w:rPr>
+        <w:t>+0.004288</w:t>
+      </w:r>
+      <w:r>
+        <w:t xml:space="preserve"> Macro-F1 and changes </w:t>
+      </w:r>
+      <w:r>
+        <w:rPr>
+          <w:b/>
+        </w:rPr>
+        <w:t>40 of 23,958</w:t>
+      </w:r>
+      <w:r>
+        <w:t xml:space="preserve"> labels - still inside the 0.005 margin; at k = 40 and k = 80 it changes </w:t>
+      </w:r>
+      <w:r>
+        <w:rPr>
+          <w:b/>
+        </w:rPr>
+        <w:t>exactly zero</w:t>
+      </w:r>
+      <w:r>
+        <w:t xml:space="preserve"> labels on the same 23,958 rows. The boundary is therefore not an artefact of one feature budget: the gate acts only when the views are dissimilar enough, and where it does act the effect stays inside the smallest equivalence margin used in this study.</w:t>
+      </w:r>
+    </w:p>
+    <w:p>
+      <w:r>
+        <w:rPr>
+          <w:b/>
+        </w:rPr>
+        <w:t>Balanced control at ten seeds.</w:t>
+      </w:r>
+      <w:r>
+        <w:t xml:space="preserve"> The balanced control was reported on three seeds (Table 4(b)); extending it to the same ten seeds gives 0.962665 +/- 0.001124 Macro-F1 (range 0.960487-0.964448) against 0.961807 on three seeds. The class-prior effect therefore moves from +0.0725 to +0.0734 and keeps its order of magnitude.</w:t>
+      </w:r>
+    </w:p>
+    <w:p>
+      <w:r>
         <w:t>Per-seed paired statistics, per-class reports and the scale summaries for all three runs are provided in Supplementary S27-S29.</w:t>
       </w:r>
     </w:p>
@@ -10384,6 +10471,7 @@
         <w:pStyle w:val="21"/>
       </w:pPr>
       <w:r>
+        <w:lastRenderedPageBreak/>
         <w:t>6.1 Four failure conditions for conditional weighting</w:t>
       </w:r>
     </w:p>
@@ -10403,11 +10491,7 @@
         <w:t xml:space="preserve"> When forests trained on different feature views return the same posterior for a given input, no convex weighting can change the output (Condition 1). In flow-feature settings this is more common than intuition suggests: the top-60 features selected by chi-square, mutual information and ANOVA overlap heavily, and 12 of the extra columns in the full view are constant. Measurement 6 quantifies the boundary: when pairwise disagreement is 0.20%-0.36%, the gate gains exactly zero in six of six runs; only when di</w:t>
       </w:r>
       <w:r>
-        <w:t xml:space="preserve">sagreement </w:t>
-      </w:r>
-      <w:r>
-        <w:lastRenderedPageBreak/>
-        <w:t>rises to 3%-6% does the gain become consistently positive. Condition A is therefore not the idealised case of "identical experts" but a loose condition that real flow-feature data satisfies easily.</w:t>
+        <w:t>sagreement rises to 3%-6% does the gain become consistently positive. Condition A is therefore not the idealised case of "identical experts" but a loose condition that real flow-feature data satisfies easily.</w:t>
       </w:r>
     </w:p>
     <w:p>
@@ -10494,6 +10578,7 @@
         <w:rPr>
           <w:b/>
         </w:rPr>
+        <w:lastRenderedPageBreak/>
         <w:t>Split noise.</w:t>
       </w:r>
       <w:r>
@@ -10574,7 +10659,6 @@
     </w:p>
     <w:p>
       <w:r>
-        <w:lastRenderedPageBreak/>
         <w:t xml:space="preserve">The contribution to the literature is therefore a threshold rather than a refutation: </w:t>
       </w:r>
       <w:r>
@@ -11188,6 +11272,7 @@
         <w:rPr>
           <w:b/>
         </w:rPr>
+        <w:lastRenderedPageBreak/>
         <w:t>A raw-to-final counting chain</w:t>
       </w:r>
       <w:r>
@@ -11278,7 +11363,6 @@
         <w:rPr>
           <w:b/>
         </w:rPr>
-        <w:lastRenderedPageBreak/>
         <w:t>Paired statistics and effect sizes</w:t>
       </w:r>
       <w:r>
@@ -11360,7 +11444,10 @@
         <w:t>The diversity evidence is associational.</w:t>
       </w:r>
       <w:r>
-        <w:t xml:space="preserve"> The dose-response relation rests on fifteen constructed expert configurations evaluated with three-fold cross-fitting; it shows that the gain moves with expert disagreement, not that disagreement alone causes a gain. No intervention that fixes disagreement while holding everything else constant was run.</w:t>
+        <w:t xml:space="preserve"> The dose-response relation rests on fifteen constructed expert configurations evaluated with three-fold cross-fitting; it shows that the gain moves with expert disagreement, not that disagreement alone causes a gain. The one intervention that was run is on the model side: replacing the gate's logistic risk model with a gradient-boosted ensemble leaves the gain at +0.000050, well inside the margin (Section 5.3). A data-level intervention that makes the experts genuinely dissimilar without changing anything </w:t>
+      </w:r>
+      <w:r>
+        <w:t>else remains untested.</w:t>
       </w:r>
     </w:p>
     <w:p>
@@ -11393,7 +11480,11 @@
         <w:t>The equivalence depends on how the population is built.</w:t>
       </w:r>
       <w:r>
-        <w:t xml:space="preserve"> It holds on the 53,237-flow natural-prior population and on the 7.8-fold larger one, but not on the fully uncapped 2,429,503-flow corpus, where the same comparison becomes a small, consistent deficit. The statement that conditional weighting is indistinguishable from equal voting must therefore always be quoted together with the population it was measured on; it is not a scale-free property.</w:t>
+        <w:t xml:space="preserve"> It holds on the 53,237-flow natural-prior population and on the 7.8-fold larger one, but not on the fully uncapped 2,429,503-flow corpus, where the same comparison </w:t>
+      </w:r>
+      <w:r>
+        <w:lastRenderedPageBreak/>
+        <w:t>becomes a small, consistent deficit. The statement that conditional weighting is indistinguishable from equal voting must therefore always be quoted together with the population it was measured on; it is not a scale-free property.</w:t>
       </w:r>
     </w:p>
     <w:p>
@@ -11437,11 +11528,7 @@
         <w:t>Near-duplicates are removed only in their exact form.</w:t>
       </w:r>
       <w:r>
-        <w:t xml:space="preserve"> The introduction identifies near-duplicate flows as a hazard of public datasets, and the audit removes exact duplicate feature vectors. Rounding every feature to four significant digits and hashing the result shows that a further 0.36% of the study population forms near-duplicate groups at that resolution, and that 104 rows sit in near-duplicate groups that span the partitions, of which 17 test </w:t>
-      </w:r>
-      <w:r>
-        <w:lastRenderedPageBreak/>
-        <w:t>rows (0.21% of the test set) share a rounded feature vector with a training row. Removing those rows changes Macr</w:t>
+        <w:t xml:space="preserve"> The introduction identifies near-duplicate flows as a hazard of public datasets, and the audit removes exact duplicate feature vectors. Rounding every feature to four significant digits and hashing the result shows that a further 0.36% of the study population forms near-duplicate groups at that resolution, and that 104 rows sit in near-duplicate groups that span the partitions, of which 17 test rows (0.21% of the test set) share a rounded feature vector with a training row. Removing those rows changes Macr</w:t>
       </w:r>
       <w:r>
         <w:t>o-F1 by at most 0.00057 for any of the three models, so the overlap cannot explain the reported differences; coarser resolutions are reported in the supplementary material.</w:t>
@@ -11523,6 +11610,7 @@
         <w:rPr>
           <w:b/>
         </w:rPr>
+        <w:lastRenderedPageBreak/>
         <w:t>First, relative to the most direct equal-weight control the gain lies inside an equivalence boundary.</w:t>
       </w:r>
       <w:r>
@@ -11551,7 +11639,6 @@
         <w:rPr>
           <w:b/>
         </w:rPr>
-        <w:lastRenderedPageBreak/>
         <w:t>Second, the failure is explainable and quantified.</w:t>
       </w:r>
       <w:r>
@@ -11594,6 +11681,7 @@
         <w:pStyle w:val="1"/>
       </w:pPr>
       <w:r>
+        <w:lastRenderedPageBreak/>
         <w:t>Data and code availability</w:t>
       </w:r>
     </w:p>
@@ -11646,7 +11734,6 @@
         <w:pStyle w:val="1"/>
       </w:pPr>
       <w:r>
-        <w:lastRenderedPageBreak/>
         <w:t>CRediT authorship contribution statement</w:t>
       </w:r>
     </w:p>
@@ -11773,6 +11860,7 @@
         </w:numPr>
       </w:pPr>
       <w:r>
+        <w:lastRenderedPageBreak/>
         <w:t>Kuncheva L I. Combining Pattern Classifiers: Methods and Algorithms. Wiley, 2004. DOI:10.1002/0471660264.</w:t>
       </w:r>
     </w:p>
@@ -11881,7 +11969,6 @@
         </w:numPr>
       </w:pPr>
       <w:r>
-        <w:lastRenderedPageBreak/>
         <w:t>UCI Machine Learning Repository. Detection of IoT botnet attacks N-BaIoT [dataset]. 2018. DOI:10.24432/C5RC8J.</w:t>
       </w:r>
     </w:p>
@@ -12014,6 +12101,7 @@
         </w:numPr>
       </w:pPr>
       <w:r>
+        <w:lastRenderedPageBreak/>
         <w:t>Guo C, Pleiss G, Sun Y, Weinberger K Q. On calibration of modern neural networks. ICML 2017: 1321-1330. [no DOI; PMLR]</w:t>
       </w:r>
     </w:p>
@@ -12134,7 +12222,6 @@
         </w:numPr>
       </w:pPr>
       <w:r>
-        <w:lastRenderedPageBreak/>
         <w:t>Holm S. A simple sequentially rejective multiple test procedure. Scandinavian Journal of Statistics, 1979, 6(2): 65-70. [no DOI; JSTOR stable record 4615733]</w:t>
       </w:r>
     </w:p>
@@ -12377,6 +12464,7 @@
               <w:rPr>
                 <w:sz w:val="16"/>
               </w:rPr>
+              <w:lastRenderedPageBreak/>
               <w:t>S03</w:t>
             </w:r>
           </w:p>
@@ -13023,7 +13111,6 @@
               <w:rPr>
                 <w:sz w:val="16"/>
               </w:rPr>
-              <w:lastRenderedPageBreak/>
               <w:t>S22</w:t>
             </w:r>
           </w:p>
@@ -13591,76 +13678,76 @@
       </w:rPr>
     </w:lvl>
   </w:abstractNum>
-  <w:num w:numId="1" w16cid:durableId="834346800">
+  <w:num w:numId="1" w16cid:durableId="1364139074">
     <w:abstractNumId w:val="8"/>
   </w:num>
-  <w:num w:numId="2" w16cid:durableId="447552307">
+  <w:num w:numId="2" w16cid:durableId="1773474331">
     <w:abstractNumId w:val="6"/>
   </w:num>
-  <w:num w:numId="3" w16cid:durableId="1555655651">
+  <w:num w:numId="3" w16cid:durableId="1715108076">
     <w:abstractNumId w:val="5"/>
   </w:num>
-  <w:num w:numId="4" w16cid:durableId="593635525">
+  <w:num w:numId="4" w16cid:durableId="1630819072">
     <w:abstractNumId w:val="4"/>
   </w:num>
-  <w:num w:numId="5" w16cid:durableId="397481328">
+  <w:num w:numId="5" w16cid:durableId="2005665449">
     <w:abstractNumId w:val="7"/>
   </w:num>
-  <w:num w:numId="6" w16cid:durableId="1218709960">
+  <w:num w:numId="6" w16cid:durableId="1190873894">
     <w:abstractNumId w:val="3"/>
   </w:num>
-  <w:num w:numId="7" w16cid:durableId="1361319534">
+  <w:num w:numId="7" w16cid:durableId="37555500">
     <w:abstractNumId w:val="2"/>
   </w:num>
-  <w:num w:numId="8" w16cid:durableId="1250776543">
+  <w:num w:numId="8" w16cid:durableId="126245256">
     <w:abstractNumId w:val="1"/>
   </w:num>
-  <w:num w:numId="9" w16cid:durableId="871765639">
+  <w:num w:numId="9" w16cid:durableId="1790128727">
     <w:abstractNumId w:val="0"/>
   </w:num>
-  <w:num w:numId="10" w16cid:durableId="21247672">
+  <w:num w:numId="10" w16cid:durableId="928078875">
     <w:abstractNumId w:val="7"/>
     <w:lvlOverride w:ilvl="0">
       <w:startOverride w:val="1"/>
     </w:lvlOverride>
   </w:num>
-  <w:num w:numId="11" w16cid:durableId="1623799741">
+  <w:num w:numId="11" w16cid:durableId="2018919773">
     <w:abstractNumId w:val="7"/>
     <w:lvlOverride w:ilvl="0">
       <w:startOverride w:val="1"/>
     </w:lvlOverride>
   </w:num>
-  <w:num w:numId="12" w16cid:durableId="1102650431">
+  <w:num w:numId="12" w16cid:durableId="842620719">
     <w:abstractNumId w:val="7"/>
     <w:lvlOverride w:ilvl="0">
       <w:startOverride w:val="1"/>
     </w:lvlOverride>
   </w:num>
-  <w:num w:numId="13" w16cid:durableId="1589382062">
+  <w:num w:numId="13" w16cid:durableId="119537933">
     <w:abstractNumId w:val="7"/>
     <w:lvlOverride w:ilvl="0">
       <w:startOverride w:val="1"/>
     </w:lvlOverride>
   </w:num>
-  <w:num w:numId="14" w16cid:durableId="1315722996">
+  <w:num w:numId="14" w16cid:durableId="1689717136">
     <w:abstractNumId w:val="7"/>
     <w:lvlOverride w:ilvl="0">
       <w:startOverride w:val="1"/>
     </w:lvlOverride>
   </w:num>
-  <w:num w:numId="15" w16cid:durableId="791246659">
+  <w:num w:numId="15" w16cid:durableId="939751253">
     <w:abstractNumId w:val="7"/>
     <w:lvlOverride w:ilvl="0">
       <w:startOverride w:val="1"/>
     </w:lvlOverride>
   </w:num>
-  <w:num w:numId="16" w16cid:durableId="871650727">
+  <w:num w:numId="16" w16cid:durableId="778643084">
     <w:abstractNumId w:val="7"/>
     <w:lvlOverride w:ilvl="0">
       <w:startOverride w:val="1"/>
     </w:lvlOverride>
   </w:num>
-  <w:num w:numId="17" w16cid:durableId="425005881">
+  <w:num w:numId="17" w16cid:durableId="2098013258">
     <w:abstractNumId w:val="7"/>
     <w:lvlOverride w:ilvl="0">
       <w:startOverride w:val="1"/>

</xml_diff>

<commit_message>
Round 20ax: measure expert disagreement - the never-disagree claim was wrong
</commit_message>
<xml_diff>
--- a/重构版论文_v4_20260915/English_SCI_Manuscript_v4.docx
+++ b/重构版论文_v4_20260915/English_SCI_Manuscript_v4.docx
@@ -21,16 +21,16 @@
     </w:p>
     <w:p>
       <w:r>
-        <w:t>Reported differences between intrusion-detection models are sensitive to duplicate flows, conflicting labels, feature leakage and class priors. We test a widely adopted but rarely validated assumption: that fusing random-forest experts with sample-specific reliability weights (RCCF) beats equal voting. Under one leakage-controlled protocol we build a 53,237-flow natural-prior population and a 3,365-flow balanced control from CIC-IDS2017, add NSL-KDD, UNSW-NB15 and an IoT corpus, and compare four feature vie</w:t>
-      </w:r>
-      <w:r>
-        <w:t>ws over ten seeds. The two models differ by -0.000456 Macro-F1 (five up, five down); the seed-level 90% and paired bootstrap intervals lie inside the 0.005 and 0.01 equivalence margins. Over the same four experts it changes one label in 79,860 predictions. Experts never disagree; weight entropy is 0.99998; class prior and dedup order move Macro-F1 by +0.0725 and +0.0060. Three identifiability conditions are derived, one a row-wise bound: 99.91% of the 23,958 test rows are provably invariant, with a median m</w:t>
-      </w:r>
-      <w:r>
-        <w:t>argin 3,469-5,038 times it. 108 gate configurations yield six distinct scores; across fifteen configurations the gain co-varies with expert diversity (slope 0.0646, r = 0.749; association, not intervention). The equivalence reproduces on a population 7.8 times larger but not on the uncapped 2,429,503-flow corpus, where it becomes a consistent deficit (-0.005533, all ten seeds) at a 175-fold cost; the IoT corpus saturates. The mechanism is 4.1 times larger and 4.6 times slower (S22), without cost-sensitive a</w:t>
-      </w:r>
-      <w:r>
-        <w:t>dvantage. We contribute a leakage-controlled protocol, an identifiability boundary and a map separating protocol from aggregation-rule effects; the evidence supports neither superiority nor production readiness.</w:t>
+        <w:t>Reported differences between intrusion-detection models are sensitive to duplicate flows, conflicting labels, feature leakage and class priors. We test a widely adopted but rarely validated assumption: that fusing random-forest experts with sample-specific reliability weights (RCCF) beats equal voting. We build a 53,237-flow natural-prior population and a 3,365-flow balanced control from CIC-IDS2017, add NSL-KDD, UNSW-NB15 and an IoT corpus, and compare four feature views over ten seeds. The two models diff</w:t>
+      </w:r>
+      <w:r>
+        <w:t>er by -0.000456 Macro-F1 (five up, five down); both intervals lie inside the 0.005 and 0.01 equivalence margins. Over the same four experts it changes one label in 79,860 predictions. The experts disagree on 0.15%-0.66% of test rows while the gate matches equal voting on all but one of 79,860 predictions; weight entropy is 0.99998; class prior and dedup order move Macro-F1 by +0.0725 and +0.0060. Three identifiability conditions are derived, one a row-wise bound: 99.91% of 23,958 test rows are provably inva</w:t>
+      </w:r>
+      <w:r>
+        <w:t>riant, with a median margin 3,469-5,038 times it. 108 gate configurations yield six scores; across fifteen configurations the gain co-varies with expert diversity (slope 0.0646, r = 0.749). The equivalence reproduces on a 7.8-times-larger population but not on the uncapped 2,429,503-flow corpus, where it becomes a consistent deficit (-0.005533, all ten seeds) at 175-fold cost; the IoT corpus saturates. The mechanism is 4.1 times larger and 4.6 times slower (S22), without cost-sensitive advantage. We contrib</w:t>
+      </w:r>
+      <w:r>
+        <w:t>ute a leakage-controlled protocol, an identifiability boundary and a map separating protocol from aggregation-rule effects; the evidence supports neither superiority nor production readiness.</w:t>
       </w:r>
     </w:p>
     <w:p>
@@ -1039,7 +1039,7 @@
           <w:noProof/>
         </w:rPr>
         <w:drawing>
-          <wp:inline distT="0" distB="0" distL="0" distR="0" wp14:anchorId="4D91E318" wp14:editId="70C1DE2B">
+          <wp:inline distT="0" distB="0" distL="0" distR="0" wp14:anchorId="4EC5DD40" wp14:editId="17C5C34F">
             <wp:extent cx="5760720" cy="2734826"/>
             <wp:effectExtent l="0" t="0" r="0" b="0"/>
             <wp:docPr id="1" name="Picture 1"/>
@@ -2388,7 +2388,7 @@
           <w:noProof/>
         </w:rPr>
         <w:drawing>
-          <wp:inline distT="0" distB="0" distL="0" distR="0" wp14:anchorId="5874F847" wp14:editId="1A65A1EC">
+          <wp:inline distT="0" distB="0" distL="0" distR="0" wp14:anchorId="18E2661F" wp14:editId="4074847C">
             <wp:extent cx="5760720" cy="2722098"/>
             <wp:effectExtent l="0" t="0" r="0" b="0"/>
             <wp:docPr id="2" name="Picture 2"/>
@@ -3380,7 +3380,7 @@
           <w:noProof/>
         </w:rPr>
         <w:drawing>
-          <wp:inline distT="0" distB="0" distL="0" distR="0" wp14:anchorId="4801A450" wp14:editId="02097924">
+          <wp:inline distT="0" distB="0" distL="0" distR="0" wp14:anchorId="510B5EFD" wp14:editId="3C47F6DD">
             <wp:extent cx="5760720" cy="3482709"/>
             <wp:effectExtent l="0" t="0" r="0" b="0"/>
             <wp:docPr id="3" name="Picture 3"/>
@@ -3643,7 +3643,7 @@
     </w:p>
     <w:p>
       <w:r>
-        <w:t>Section 5 reports that gated fusion and equal voting agree on every test row. To show that this is structural rather than an artefact of the implementation, we state three conditions. None depends on a particular dataset; each follows from the fusion form itself.</w:t>
+        <w:t>Section 5 reports that gated fusion and equal voting agree on all but one of the 79,860 test predictions compared. To show that this is structural rather than an artefact of the implementation, we state three conditions. None depends on a particular dataset; each follows from the fusion form itself.</w:t>
       </w:r>
     </w:p>
     <w:p>
@@ -7167,7 +7167,7 @@
           <w:noProof/>
         </w:rPr>
         <w:drawing>
-          <wp:inline distT="0" distB="0" distL="0" distR="0" wp14:anchorId="40791905" wp14:editId="00C19E7A">
+          <wp:inline distT="0" distB="0" distL="0" distR="0" wp14:anchorId="2FD645CB" wp14:editId="4A40377D">
             <wp:extent cx="5760720" cy="2356272"/>
             <wp:effectExtent l="0" t="0" r="0" b="0"/>
             <wp:docPr id="4" name="Picture 4"/>
@@ -8130,7 +8130,7 @@
           <w:noProof/>
         </w:rPr>
         <w:drawing>
-          <wp:inline distT="0" distB="0" distL="0" distR="0" wp14:anchorId="1EE967A5" wp14:editId="7B39D6B1">
+          <wp:inline distT="0" distB="0" distL="0" distR="0" wp14:anchorId="1C9D9FD6" wp14:editId="66099E05">
             <wp:extent cx="5760720" cy="2045294"/>
             <wp:effectExtent l="0" t="0" r="0" b="0"/>
             <wp:docPr id="5" name="Picture 5"/>
@@ -8308,7 +8308,7 @@
           <w:noProof/>
         </w:rPr>
         <w:drawing>
-          <wp:inline distT="0" distB="0" distL="0" distR="0" wp14:anchorId="74EE4104" wp14:editId="734130A9">
+          <wp:inline distT="0" distB="0" distL="0" distR="0" wp14:anchorId="1A001862" wp14:editId="10B43707">
             <wp:extent cx="5760720" cy="2308234"/>
             <wp:effectExtent l="0" t="0" r="0" b="0"/>
             <wp:docPr id="6" name="Picture 6"/>
@@ -9040,7 +9040,7 @@
           <w:noProof/>
         </w:rPr>
         <w:drawing>
-          <wp:inline distT="0" distB="0" distL="0" distR="0" wp14:anchorId="26F4A720" wp14:editId="12BC477A">
+          <wp:inline distT="0" distB="0" distL="0" distR="0" wp14:anchorId="6CAFCFB2" wp14:editId="2FBFDCCC">
             <wp:extent cx="5760720" cy="2167923"/>
             <wp:effectExtent l="0" t="0" r="0" b="0"/>
             <wp:docPr id="7" name="Picture 7"/>
@@ -9164,6 +9164,35 @@
     </w:p>
     <w:p>
       <w:r>
+        <w:rPr>
+          <w:b/>
+        </w:rPr>
+        <w:t>Measurement 8: how much the experts actually disagree.</w:t>
+      </w:r>
+      <w:r>
+        <w:t xml:space="preserve"> The four views are not identical on the primary test set: over ten seeds their pairwise disagreements cover </w:t>
+      </w:r>
+      <w:r>
+        <w:rPr>
+          <w:b/>
+        </w:rPr>
+        <w:t>0.15%–0.66%</w:t>
+      </w:r>
+      <w:r>
+        <w:t xml:space="preserve"> of rows (12 to 53 rows per pair, mean </w:t>
+      </w:r>
+      <w:r>
+        <w:rPr>
+          <w:b/>
+        </w:rPr>
+        <w:t>0.370%</w:t>
+      </w:r>
+      <w:r>
+        <w:t>). What is identical is the labelled output - the gate reproduces equal voting on all but one of 79,860 predictions - so the disagreements exist but sit far from the decision boundary, which is what Condition 2 asserts.</w:t>
+      </w:r>
+    </w:p>
+    <w:p>
+      <w:r>
         <w:t>The gate search, the row-wise weight records and the expert-diversity suite are provided in Supplementary S08-S09, S16 and S18.</w:t>
       </w:r>
     </w:p>
@@ -9172,6 +9201,7 @@
         <w:pStyle w:val="21"/>
       </w:pPr>
       <w:r>
+        <w:lastRenderedPageBreak/>
         <w:t>5.4 RQ3: Protocol effects exceed aggregation-rule differences by an order of magnitude</w:t>
       </w:r>
     </w:p>
@@ -9188,9 +9218,8 @@
         <w:rPr>
           <w:noProof/>
         </w:rPr>
-        <w:lastRenderedPageBreak/>
         <w:drawing>
-          <wp:inline distT="0" distB="0" distL="0" distR="0" wp14:anchorId="5C0EC66C" wp14:editId="3DDEF26E">
+          <wp:inline distT="0" distB="0" distL="0" distR="0" wp14:anchorId="6E863EC5" wp14:editId="2F230267">
             <wp:extent cx="5760720" cy="2258878"/>
             <wp:effectExtent l="0" t="0" r="0" b="0"/>
             <wp:docPr id="8" name="Picture 8"/>
@@ -9345,7 +9374,11 @@
         <w:t>families</w:t>
       </w:r>
       <w:r>
-        <w:t xml:space="preserve"> are larger: the multilayer perceptron trails the forests by 0.0916 Macro-F1 and extremely randomised trees by 0.0318, both of which exceed the class-prior effect of 0.0725 in the first case. The defensible statement is therefore that aggregation-rule differences are dominated by protocol choices, whereas model-family differences are not.</w:t>
+        <w:t xml:space="preserve"> are larger: the multilayer perceptron trails the forests by 0.0916 Macro-F1 and extremely randomised trees by 0.0318, both of which exceed the class-</w:t>
+      </w:r>
+      <w:r>
+        <w:lastRenderedPageBreak/>
+        <w:t>prior effect of 0.0725 in the first case. The defensible statement is therefore that aggregation-rule differences are dominated by protocol choices, whereas model-family differences are not.</w:t>
       </w:r>
     </w:p>
     <w:p>
@@ -9358,7 +9391,6 @@
         <w:pStyle w:val="21"/>
       </w:pPr>
       <w:r>
-        <w:lastRenderedPageBreak/>
         <w:t>5.5 RQ4: External validity and file-level extrapolation</w:t>
       </w:r>
     </w:p>
@@ -9371,7 +9403,7 @@
           <w:noProof/>
         </w:rPr>
         <w:drawing>
-          <wp:inline distT="0" distB="0" distL="0" distR="0" wp14:anchorId="2D072D98" wp14:editId="076CEC93">
+          <wp:inline distT="0" distB="0" distL="0" distR="0" wp14:anchorId="6D20068D" wp14:editId="00A846F6">
             <wp:extent cx="5760720" cy="2516852"/>
             <wp:effectExtent l="0" t="0" r="0" b="0"/>
             <wp:docPr id="9" name="Picture 9"/>
@@ -9487,6 +9519,7 @@
     </w:p>
     <w:p>
       <w:r>
+        <w:lastRenderedPageBreak/>
         <w:t>The external benchmarks, the file-level extrapolation and the neural baseline comparison are provided in Supplementary S12-S14 and S19.</w:t>
       </w:r>
     </w:p>
@@ -9495,7 +9528,6 @@
         <w:pStyle w:val="21"/>
       </w:pPr>
       <w:r>
-        <w:lastRenderedPageBreak/>
         <w:t>5.6 Secondary metrics: calibration, robustness, latency and open-set behaviour</w:t>
       </w:r>
     </w:p>
@@ -9508,7 +9540,7 @@
           <w:noProof/>
         </w:rPr>
         <w:drawing>
-          <wp:inline distT="0" distB="0" distL="0" distR="0" wp14:anchorId="78BC7A66" wp14:editId="71B08154">
+          <wp:inline distT="0" distB="0" distL="0" distR="0" wp14:anchorId="52B70908" wp14:editId="52E2648D">
             <wp:extent cx="5760720" cy="2223311"/>
             <wp:effectExtent l="0" t="0" r="0" b="0"/>
             <wp:docPr id="10" name="Picture 10"/>
@@ -9593,8 +9625,9 @@
         <w:rPr>
           <w:noProof/>
         </w:rPr>
+        <w:lastRenderedPageBreak/>
         <w:drawing>
-          <wp:inline distT="0" distB="0" distL="0" distR="0" wp14:anchorId="1B5E7179" wp14:editId="1133EF79">
+          <wp:inline distT="0" distB="0" distL="0" distR="0" wp14:anchorId="52386910" wp14:editId="59235D9B">
             <wp:extent cx="5760720" cy="2538527"/>
             <wp:effectExtent l="0" t="0" r="0" b="0"/>
             <wp:docPr id="11" name="Picture 11"/>
@@ -9640,7 +9673,6 @@
           <w:color w:val="404040"/>
           <w:sz w:val="18"/>
         </w:rPr>
-        <w:lastRenderedPageBreak/>
         <w:t>Figure 11. Single-row inference latency</w:t>
       </w:r>
     </w:p>
@@ -9703,7 +9735,11 @@
         <w:t xml:space="preserve"> Casting the task as attack versus normal and sweeping the decision threshold for cost ratios C_FN / C_FP from 1 to 100, the normalised expected cost of the conditional mechanism tracks the equal-weight chi-square forest to within 0.0005 across the whole range - for example 0.00913 against 0.00867 at ratio 1, and 0.07260 against 0.06753 at ratio 100. Extremely randomised trees are about twice as costly at low ratios (0.01917 at ratio 1) but become cheaper than both forests once false negatives dominate (0.0</w:t>
       </w:r>
       <w:r>
-        <w:t>6180 at ratio 100). The conditional gate therefore offers no cost-sensitive advantage either. The operating point was selected on the test partition itself, so these normalised expected costs are optimistic lower bounds; selecting the threshold on the validation partition would raise all three curves by a similar amount without changing their ordering.</w:t>
+        <w:t xml:space="preserve">6180 at ratio 100). The conditional gate therefore offers no cost-sensitive advantage either. The operating point was selected on the test </w:t>
+      </w:r>
+      <w:r>
+        <w:lastRenderedPageBreak/>
+        <w:t>partition itself, so these normalised expected costs are optimistic lower bounds; selecting the threshold on the validation partition would raise all three curves by a similar amount without changing their ordering.</w:t>
       </w:r>
     </w:p>
     <w:p>
@@ -9736,7 +9772,6 @@
         <w:pStyle w:val="21"/>
       </w:pPr>
       <w:r>
-        <w:lastRenderedPageBreak/>
         <w:t>5.7 Scale and domain sensitivity</w:t>
       </w:r>
     </w:p>
@@ -10337,7 +10372,11 @@
         <w:t>The full deduplicated corpus.</w:t>
       </w:r>
       <w:r>
-        <w:t xml:space="preserve"> Removing the per-class cap entirely yields 2,429,503 flows (train 1,700,652 / validation 364,425 / test 364,426) - the complete deduplicated CIC-IDS2017 corpus, in which Web Attack contributes 0.028% of the rows. A single RCCF fit takes about two hours when run alone and about four hours per seed under the three-way split used here, so the comparison was run as a batch over the same ten seeds: RCCF averages 0.754007 Macro-F1 against 0.759540 for the equal-weight chi-square forest, a mean paired difference </w:t>
+        <w:t xml:space="preserve"> Removing the per-class cap entirely yields 2,429,503 flows (train 1,700,652 / validation 364,425 / test 364,426) - the complete deduplicated CIC-IDS2017 corpus, in which Web Attack </w:t>
+      </w:r>
+      <w:r>
+        <w:lastRenderedPageBreak/>
+        <w:t xml:space="preserve">contributes 0.028% of the rows. A single RCCF fit takes about two hours when run alone and about four hours per seed under the three-way split used here, so the comparison was run as a batch over the same ten seeds: RCCF averages 0.754007 Macro-F1 against 0.759540 for the equal-weight chi-square forest, a mean paired difference </w:t>
       </w:r>
       <w:r>
         <w:t xml:space="preserve">of -0.005533 (SD 0.002840; seed-level 90% interval [-0.007179, -0.003886]), That interval lies entirely below zero, so the result is not the equivalence seen on the capped populations but a small, detectable deficit: the difference is equivalent at the 0.01 margin and </w:t>
@@ -10352,11 +10391,7 @@
         <w:t xml:space="preserve"> equivalent at 0.005, and all ten seeds point the same way. The two arms disagree on 216 of 364,426 test rows per seed on average (at most 392) - the same order as on the capped populations. The context baselines separate more sharply here than anywhere else in the study: XGBoost reaches 0.800255 Macro-F1, the equal-weight full-feature forest 0.738143, extremely randomised trees 0.696629 and a depth-limited decision tree 0.595653, so the model-family gap between XGBoost and the equal-weight chi-square fores</w:t>
       </w:r>
       <w:r>
-        <w:t xml:space="preserve">t (0.041) exceeds every protocol effect measured here except the class prior. Accuracy, by contrast, is 0.9993 for XGBoost and 0.9958 for the equal-weight forest - the clearest illustration in this study of how much accuracy </w:t>
-      </w:r>
-      <w:r>
-        <w:lastRenderedPageBreak/>
-        <w:t>hides on an imbalanced corpus. The cost asymmetry is at its most extreme here: 14936 s to train RCCF per seed against 85 s for the equal-weight forest (175x), at a quality difference of -0.005533.</w:t>
+        <w:t>t (0.041) exceeds every protocol effect measured here except the class prior. Accuracy, by contrast, is 0.9993 for XGBoost and 0.9958 for the equal-weight forest - the clearest illustration in this study of how much accuracy hides on an imbalanced corpus. The cost asymmetry is at its most extreme here: 14936 s to train RCCF per seed against 85 s for the equal-weight forest (175x), at a quality difference of -0.005533.</w:t>
       </w:r>
     </w:p>
     <w:p>
@@ -10396,7 +10431,7 @@
         <w:t xml:space="preserve"> On the uncapped corpus the four feature views are no longer interchangeable: the full-feature forest reaches 0.738143 Macro-F1 against 0.759540 for the chi-square forest, a gap of 0.021397, and one such expert inside a four-way average costs a quarter of it, 0.005349, against a measured -0.005533. The same expression applies to the 413,209-flow population (view gap 0.004249, predicted 0.001062, measured -0.001137) and to the primary population (gap 0.002068, predicted 0.000517, measured -0.000456). Across </w:t>
       </w:r>
       <w:r>
-        <w:t>a 46-fold range in population size the prediction stays within 14% of the measurement, so what changes with scale is not the aggregation rule - Section 5.3 shows the weights never move a label - but the price of averaging over feature views whose quality has diverged. This is the practical form of Condition 1: an equal-weight fusion is bounded by its weakest member, and the capped populations hide that bound because there all four views score within 0.002 of one another.</w:t>
+        <w:t>a 46-fold range in population size the prediction stays within 14% of the measurement, so what changes with scale is not the aggregation rule - Section 5.3 shows the weights changed one label in 79,860 predictions - but the price of averaging over feature views whose quality has diverged. This is the practical form of Condition 1: an equal-weight fusion is bounded by its weakest member, and the capped populations hide that bound because there all four views score within 0.002 of one another.</w:t>
       </w:r>
     </w:p>
     <w:p>
@@ -10442,6 +10477,7 @@
         <w:rPr>
           <w:b/>
         </w:rPr>
+        <w:lastRenderedPageBreak/>
         <w:t>Balanced control at ten seeds.</w:t>
       </w:r>
       <w:r>
@@ -10471,7 +10507,6 @@
         <w:pStyle w:val="21"/>
       </w:pPr>
       <w:r>
-        <w:lastRenderedPageBreak/>
         <w:t>6.1 Four failure conditions for conditional weighting</w:t>
       </w:r>
     </w:p>
@@ -10532,6 +10567,7 @@
     </w:p>
     <w:p>
       <w:r>
+        <w:lastRenderedPageBreak/>
         <w:t xml:space="preserve">The four conditions yield an operational diagnostic sequence: </w:t>
       </w:r>
       <w:r>
@@ -10578,7 +10614,6 @@
         <w:rPr>
           <w:b/>
         </w:rPr>
-        <w:lastRenderedPageBreak/>
         <w:t>Split noise.</w:t>
       </w:r>
       <w:r>
@@ -11138,7 +11173,14 @@
               <w:rPr>
                 <w:sz w:val="16"/>
               </w:rPr>
-              <w:t>Adopt this protocol and release per-row predictions</w:t>
+              <w:t xml:space="preserve">Adopt this protocol and release </w:t>
+            </w:r>
+            <w:r>
+              <w:rPr>
+                <w:sz w:val="16"/>
+              </w:rPr>
+              <w:lastRenderedPageBreak/>
+              <w:t>per-row predictions</w:t>
             </w:r>
           </w:p>
         </w:tc>
@@ -11154,7 +11196,15 @@
               <w:rPr>
                 <w:sz w:val="16"/>
               </w:rPr>
-              <w:t>All aggregate metrics can be recomputed from released probabilities</w:t>
+              <w:lastRenderedPageBreak/>
+              <w:t xml:space="preserve">All aggregate metrics can be </w:t>
+            </w:r>
+            <w:r>
+              <w:rPr>
+                <w:sz w:val="16"/>
+              </w:rPr>
+              <w:lastRenderedPageBreak/>
+              <w:t>recomputed from released probabilities</w:t>
             </w:r>
           </w:p>
         </w:tc>
@@ -11170,7 +11220,15 @@
               <w:rPr>
                 <w:sz w:val="16"/>
               </w:rPr>
-              <w:t>Extra storage and version management</w:t>
+              <w:lastRenderedPageBreak/>
+              <w:t xml:space="preserve">Extra storage and version </w:t>
+            </w:r>
+            <w:r>
+              <w:rPr>
+                <w:sz w:val="16"/>
+              </w:rPr>
+              <w:lastRenderedPageBreak/>
+              <w:t>management</w:t>
             </w:r>
           </w:p>
         </w:tc>
@@ -11188,6 +11246,7 @@
               <w:rPr>
                 <w:sz w:val="16"/>
               </w:rPr>
+              <w:lastRenderedPageBreak/>
               <w:t>Decide whether to deploy conditional weighting</w:t>
             </w:r>
           </w:p>
@@ -11272,7 +11331,6 @@
         <w:rPr>
           <w:b/>
         </w:rPr>
-        <w:lastRenderedPageBreak/>
         <w:t>A raw-to-final counting chain</w:t>
       </w:r>
       <w:r>
@@ -11455,6 +11513,7 @@
         <w:rPr>
           <w:b/>
         </w:rPr>
+        <w:lastRenderedPageBreak/>
         <w:t>The same-members control covers the primary population.</w:t>
       </w:r>
       <w:r>
@@ -11480,11 +11539,7 @@
         <w:t>The equivalence depends on how the population is built.</w:t>
       </w:r>
       <w:r>
-        <w:t xml:space="preserve"> It holds on the 53,237-flow natural-prior population and on the 7.8-fold larger one, but not on the fully uncapped 2,429,503-flow corpus, where the same comparison </w:t>
-      </w:r>
-      <w:r>
-        <w:lastRenderedPageBreak/>
-        <w:t>becomes a small, consistent deficit. The statement that conditional weighting is indistinguishable from equal voting must therefore always be quoted together with the population it was measured on; it is not a scale-free property.</w:t>
+        <w:t xml:space="preserve"> It holds on the 53,237-flow natural-prior population and on the 7.8-fold larger one, but not on the fully uncapped 2,429,503-flow corpus, where the same comparison becomes a small, consistent deficit. The statement that conditional weighting is indistinguishable from equal voting must therefore always be quoted together with the population it was measured on; it is not a scale-free property.</w:t>
       </w:r>
     </w:p>
     <w:p>
@@ -11575,6 +11630,7 @@
         <w:rPr>
           <w:b/>
         </w:rPr>
+        <w:lastRenderedPageBreak/>
         <w:t>Bootstrap intervals have a limited interpretation.</w:t>
       </w:r>
       <w:r>
@@ -11610,14 +11666,13 @@
         <w:rPr>
           <w:b/>
         </w:rPr>
-        <w:lastRenderedPageBreak/>
         <w:t>First, relative to the most direct equal-weight control the gain lies inside an equivalence boundary.</w:t>
       </w:r>
       <w:r>
         <w:t xml:space="preserve"> Averaged over ten seeds on the natural-prior population of CIC-IDS2017, the Macro-F1 difference between conditional weighting and an equal-weight chi-square forest is -0.000456, with the per-seed sign split five to five. Against the equal-weight fusion of those same four experts the gated model changes one label in 79,860 test predictions (-0.000010), which locates the single-view gap in the composition of the ensemble rather than in the gate. Both the seed-level 90% interval [-0.00112, +0.00021] and the t</w:t>
       </w:r>
       <w:r>
-        <w:t>est-row paired bootstrap interval [-0.00425, +0.00338] lie inside equivalence margins of 0.005 and 0.01. The four experts disagree on no test row, and the normalised weight entropy is 0.99998. The cost is about an 80-fold increase in training time and a fivefold increase in batch inference time (ten-seed means, Table 4(a)).</w:t>
+        <w:t>est-row paired bootstrap interval [-0.00425, +0.00338] lie inside equivalence margins of 0.005 and 0.01. The four experts disagree on 0.15%-0.66% of test rows, yet the gate matches equal voting on all but one of 79,860 predictions; weight entropy is 0.99998. The cost is about an 80-fold increase in training time and a fivefold increase in batch inference time (ten-seed means, Table 4(a)).</w:t>
       </w:r>
     </w:p>
     <w:p>
@@ -11628,10 +11683,10 @@
         <w:t>A qualification on the first conclusion.</w:t>
       </w:r>
       <w:r>
-        <w:t xml:space="preserve"> It is a property of the population, not of the mechanism. On the fully uncapped 2,429,503-flow corpus the same comparison turns into a consistent deficit of -0.005533 across all ten seeds (equivalent at 0.01 but not at 0.005), at a 175-fold training cost. The cause is not the weighting - Section 5.3 shows the weights never move a label - but the price of averaging over feature views whose quality diverges at scale: the full-feature view falls 0.021397 behind the chi-square view, and one such expert inside </w:t>
-      </w:r>
-      <w:r>
-        <w:t>a four-way average accounts for the whole gap (0.005349 predicted against -0.005533 measured). Against a full-feature equal forest the gate is reliably better over ten seeds, but the magnitude matches that of a feature-view change.</w:t>
+        <w:t xml:space="preserve"> It is a property of the population, not of the mechanism. On the fully uncapped 2,429,503-flow corpus the same comparison turns into a consistent deficit of -0.005533 across all ten seeds (equivalent at 0.01 but not at 0.005), at a 175-fold training cost. The cause is not the weighting - Section 5.3 shows the weights changed one label in 79,860 predictions - but the price of averaging over feature views whose quality diverges at scale: the full-feature view falls 0.021397 behind the chi-square view, and on</w:t>
+      </w:r>
+      <w:r>
+        <w:t>e such expert inside a four-way average accounts for the whole gap (0.005349 predicted against -0.005533 measured). Against a full-feature equal forest the gate is reliably better over ten seeds, but the magnitude matches that of a feature-view change.</w:t>
       </w:r>
     </w:p>
     <w:p>
@@ -11670,6 +11725,7 @@
     </w:p>
     <w:p>
       <w:r>
+        <w:lastRenderedPageBreak/>
         <w:t>The principal contribution is not a new state-of-the-art classifier but a reusable leakage-controlled protocol, a set of falsifiable identifiability boundaries, and a quantitative map that separates protocol effects from aggregation-rule effects. Three directions follow. First, design weighting mechanisms that explicitly enforce expert decorrelation, and test whether the gain is restored once the premise of Condition 1 is broken. Second, construct category-complete temporal or cross-scenario protocols so th</w:t>
       </w:r>
       <w:r>
@@ -11681,7 +11737,6 @@
         <w:pStyle w:val="1"/>
       </w:pPr>
       <w:r>
-        <w:lastRenderedPageBreak/>
         <w:t>Data and code availability</w:t>
       </w:r>
     </w:p>
@@ -11800,6 +11855,7 @@
         </w:numPr>
       </w:pPr>
       <w:r>
+        <w:lastRenderedPageBreak/>
         <w:t>Chen T, Guestrin C. XGBoost: A scalable tree boosting system. KDD 2016: 785-794. DOI:10.1145/2939672.2939785.</w:t>
       </w:r>
     </w:p>
@@ -11860,7 +11916,6 @@
         </w:numPr>
       </w:pPr>
       <w:r>
-        <w:lastRenderedPageBreak/>
         <w:t>Kuncheva L I. Combining Pattern Classifiers: Methods and Algorithms. Wiley, 2004. DOI:10.1002/0471660264.</w:t>
       </w:r>
     </w:p>
@@ -12053,6 +12108,7 @@
         </w:numPr>
       </w:pPr>
       <w:r>
+        <w:lastRenderedPageBreak/>
         <w:t>Khraisat A, Gondal I, Vamplew P, Kamruzzaman J. Survey of intrusion detection systems: Techniques, datasets and challenges. Cybersecurity, 2019, 2: 20. DOI:10.1186/s42400-019-0038-7.</w:t>
       </w:r>
     </w:p>
@@ -12101,7 +12157,6 @@
         </w:numPr>
       </w:pPr>
       <w:r>
-        <w:lastRenderedPageBreak/>
         <w:t>Guo C, Pleiss G, Sun Y, Weinberger K Q. On calibration of modern neural networks. ICML 2017: 1321-1330. [no DOI; PMLR]</w:t>
       </w:r>
     </w:p>
@@ -12318,6 +12373,7 @@
         </w:numPr>
       </w:pPr>
       <w:r>
+        <w:lastRenderedPageBreak/>
         <w:t>Hunter J D. Matplotlib: A 2D graphics environment. Computing in Science &amp; Engineering, 2007, 9(3): 90-95. DOI:10.1109/MCSE.2007.55.</w:t>
       </w:r>
     </w:p>
@@ -12464,7 +12520,6 @@
               <w:rPr>
                 <w:sz w:val="16"/>
               </w:rPr>
-              <w:lastRenderedPageBreak/>
               <w:t>S03</w:t>
             </w:r>
           </w:p>
@@ -13678,76 +13733,76 @@
       </w:rPr>
     </w:lvl>
   </w:abstractNum>
-  <w:num w:numId="1" w16cid:durableId="1364139074">
+  <w:num w:numId="1" w16cid:durableId="491868319">
     <w:abstractNumId w:val="8"/>
   </w:num>
-  <w:num w:numId="2" w16cid:durableId="1773474331">
+  <w:num w:numId="2" w16cid:durableId="2135246012">
     <w:abstractNumId w:val="6"/>
   </w:num>
-  <w:num w:numId="3" w16cid:durableId="1715108076">
+  <w:num w:numId="3" w16cid:durableId="1185052008">
     <w:abstractNumId w:val="5"/>
   </w:num>
-  <w:num w:numId="4" w16cid:durableId="1630819072">
+  <w:num w:numId="4" w16cid:durableId="2065251598">
     <w:abstractNumId w:val="4"/>
   </w:num>
-  <w:num w:numId="5" w16cid:durableId="2005665449">
+  <w:num w:numId="5" w16cid:durableId="603151846">
     <w:abstractNumId w:val="7"/>
   </w:num>
-  <w:num w:numId="6" w16cid:durableId="1190873894">
+  <w:num w:numId="6" w16cid:durableId="1411195890">
     <w:abstractNumId w:val="3"/>
   </w:num>
-  <w:num w:numId="7" w16cid:durableId="37555500">
+  <w:num w:numId="7" w16cid:durableId="1926574646">
     <w:abstractNumId w:val="2"/>
   </w:num>
-  <w:num w:numId="8" w16cid:durableId="126245256">
+  <w:num w:numId="8" w16cid:durableId="760028619">
     <w:abstractNumId w:val="1"/>
   </w:num>
-  <w:num w:numId="9" w16cid:durableId="1790128727">
+  <w:num w:numId="9" w16cid:durableId="634676122">
     <w:abstractNumId w:val="0"/>
   </w:num>
-  <w:num w:numId="10" w16cid:durableId="928078875">
+  <w:num w:numId="10" w16cid:durableId="805780456">
     <w:abstractNumId w:val="7"/>
     <w:lvlOverride w:ilvl="0">
       <w:startOverride w:val="1"/>
     </w:lvlOverride>
   </w:num>
-  <w:num w:numId="11" w16cid:durableId="2018919773">
+  <w:num w:numId="11" w16cid:durableId="329452298">
     <w:abstractNumId w:val="7"/>
     <w:lvlOverride w:ilvl="0">
       <w:startOverride w:val="1"/>
     </w:lvlOverride>
   </w:num>
-  <w:num w:numId="12" w16cid:durableId="842620719">
+  <w:num w:numId="12" w16cid:durableId="714893017">
     <w:abstractNumId w:val="7"/>
     <w:lvlOverride w:ilvl="0">
       <w:startOverride w:val="1"/>
     </w:lvlOverride>
   </w:num>
-  <w:num w:numId="13" w16cid:durableId="119537933">
+  <w:num w:numId="13" w16cid:durableId="834691274">
     <w:abstractNumId w:val="7"/>
     <w:lvlOverride w:ilvl="0">
       <w:startOverride w:val="1"/>
     </w:lvlOverride>
   </w:num>
-  <w:num w:numId="14" w16cid:durableId="1689717136">
+  <w:num w:numId="14" w16cid:durableId="97024350">
     <w:abstractNumId w:val="7"/>
     <w:lvlOverride w:ilvl="0">
       <w:startOverride w:val="1"/>
     </w:lvlOverride>
   </w:num>
-  <w:num w:numId="15" w16cid:durableId="939751253">
+  <w:num w:numId="15" w16cid:durableId="2068644504">
     <w:abstractNumId w:val="7"/>
     <w:lvlOverride w:ilvl="0">
       <w:startOverride w:val="1"/>
     </w:lvlOverride>
   </w:num>
-  <w:num w:numId="16" w16cid:durableId="778643084">
+  <w:num w:numId="16" w16cid:durableId="1056776402">
     <w:abstractNumId w:val="7"/>
     <w:lvlOverride w:ilvl="0">
       <w:startOverride w:val="1"/>
     </w:lvlOverride>
   </w:num>
-  <w:num w:numId="17" w16cid:durableId="2098013258">
+  <w:num w:numId="17" w16cid:durableId="557933551">
     <w:abstractNumId w:val="7"/>
     <w:lvlOverride w:ilvl="0">
       <w:startOverride w:val="1"/>

</xml_diff>

<commit_message>
Round 20ay: six extension experiments - member families, day holdout, 10-seed external benchmarks, deployment metrics, CIC-IDS2018 and CIC-IoT-2023
</commit_message>
<xml_diff>
--- a/重构版论文_v4_20260915/English_SCI_Manuscript_v4.docx
+++ b/重构版论文_v4_20260915/English_SCI_Manuscript_v4.docx
@@ -1039,7 +1039,7 @@
           <w:noProof/>
         </w:rPr>
         <w:drawing>
-          <wp:inline distT="0" distB="0" distL="0" distR="0" wp14:anchorId="4EC5DD40" wp14:editId="17C5C34F">
+          <wp:inline distT="0" distB="0" distL="0" distR="0" wp14:anchorId="7D950F4D" wp14:editId="5A790112">
             <wp:extent cx="5760720" cy="2734826"/>
             <wp:effectExtent l="0" t="0" r="0" b="0"/>
             <wp:docPr id="1" name="Picture 1"/>
@@ -1103,7 +1103,10 @@
     </w:p>
     <w:p>
       <w:r>
-        <w:t>Four public datasets are used, all obtained from official or public sources [14-18]. No scanning, probing or live attack traffic was generated at any point. Table 2 records sources, versions, retrieval dates, licence status and file hashes. The datasets are not redistributed; only processing scripts and the code that produces the derived statistics are released.</w:t>
+        <w:t>Four public datasets are used, all obtained from official or public sources [14-18]. Two further corpora, CIC-IDS2018 and CIC-IoT-2023, are used only in the extension experiments of Section 5.8. Two further corpora, CIC-IDS2018 and CIC-IoT-2023, are used only in the extension experiments of Section 5.8. No scanning, probing or live attack traffic was generated at any point. Table 2 records sources, versions, retrieval dates, licence status and file hashes. The datasets are not redistributed; only processing</w:t>
+      </w:r>
+      <w:r>
+        <w:t xml:space="preserve"> scripts and the code that produces the derived statistics are released.</w:t>
       </w:r>
     </w:p>
     <w:p>
@@ -1457,6 +1460,7 @@
               <w:rPr>
                 <w:sz w:val="16"/>
               </w:rPr>
+              <w:lastRenderedPageBreak/>
               <w:t>UNSW-NB15</w:t>
             </w:r>
           </w:p>
@@ -1555,7 +1559,6 @@
               <w:rPr>
                 <w:sz w:val="16"/>
               </w:rPr>
-              <w:lastRenderedPageBreak/>
               <w:t>N-BaIoT</w:t>
             </w:r>
           </w:p>
@@ -1971,7 +1974,14 @@
               <w:rPr>
                 <w:sz w:val="16"/>
               </w:rPr>
-              <w:t>Five retained classes; PortScan, Infiltration and Heartbleed reserved for diagnostics</w:t>
+              <w:t xml:space="preserve">Five retained classes; PortScan, </w:t>
+            </w:r>
+            <w:r>
+              <w:rPr>
+                <w:sz w:val="16"/>
+              </w:rPr>
+              <w:lastRenderedPageBreak/>
+              <w:t>Infiltration and Heartbleed reserved for diagnostics</w:t>
             </w:r>
           </w:p>
         </w:tc>
@@ -1989,6 +1999,7 @@
               <w:rPr>
                 <w:sz w:val="16"/>
               </w:rPr>
+              <w:lastRenderedPageBreak/>
               <w:t>After non-finite removal</w:t>
             </w:r>
           </w:p>
@@ -2055,7 +2066,6 @@
               <w:rPr>
                 <w:sz w:val="16"/>
               </w:rPr>
-              <w:lastRenderedPageBreak/>
               <w:t>After physical-range screening</w:t>
             </w:r>
           </w:p>
@@ -2388,7 +2398,7 @@
           <w:noProof/>
         </w:rPr>
         <w:drawing>
-          <wp:inline distT="0" distB="0" distL="0" distR="0" wp14:anchorId="18E2661F" wp14:editId="4074847C">
+          <wp:inline distT="0" distB="0" distL="0" distR="0" wp14:anchorId="6F2AF25E" wp14:editId="5DA0F064">
             <wp:extent cx="5760720" cy="2722098"/>
             <wp:effectExtent l="0" t="0" r="0" b="0"/>
             <wp:docPr id="2" name="Picture 2"/>
@@ -2478,6 +2488,7 @@
     </w:p>
     <w:p>
       <w:r>
+        <w:lastRenderedPageBreak/>
         <w:t>Because these label spaces are incompatible, the three sets of scores are never pooled or averaged here, and they are never interpreted as evidence of transfer. Their role is to act as pressure tests: a conclusion that holds only on CIC-IDS2017 should not be written as a general law.</w:t>
       </w:r>
     </w:p>
@@ -2486,7 +2497,6 @@
         <w:pStyle w:val="21"/>
       </w:pPr>
       <w:r>
-        <w:lastRenderedPageBreak/>
         <w:t>3.4 Leakage-controlled protocol</w:t>
       </w:r>
     </w:p>
@@ -2654,6 +2664,7 @@
     </w:p>
     <w:p>
       <w:r>
+        <w:lastRenderedPageBreak/>
         <w:t>Macro-F1 is the primary metric because Web Attack accounts for only 1.26% of the natural-prior population, so accuracy is dominated by the majority classes. Class-level reports, balanced accuracy and normalised confusion matrices are reported alongside it.</w:t>
       </w:r>
     </w:p>
@@ -2662,7 +2673,6 @@
         <w:pStyle w:val="21"/>
       </w:pPr>
       <w:r>
-        <w:lastRenderedPageBreak/>
         <w:t>3.6 Validity threats excluded by design</w:t>
       </w:r>
     </w:p>
@@ -2809,6 +2819,7 @@
         <w:rPr>
           <w:b/>
         </w:rPr>
+        <w:lastRenderedPageBreak/>
         <w:t>Step 2, risk models.</w:t>
       </w:r>
       <w:r>
@@ -3380,7 +3391,7 @@
           <w:noProof/>
         </w:rPr>
         <w:drawing>
-          <wp:inline distT="0" distB="0" distL="0" distR="0" wp14:anchorId="510B5EFD" wp14:editId="3C47F6DD">
+          <wp:inline distT="0" distB="0" distL="0" distR="0" wp14:anchorId="02330A11" wp14:editId="7B15EA91">
             <wp:extent cx="5760720" cy="3482709"/>
             <wp:effectExtent l="0" t="0" r="0" b="0"/>
             <wp:docPr id="3" name="Picture 3"/>
@@ -3637,7 +3648,6 @@
         <w:pStyle w:val="21"/>
       </w:pPr>
       <w:r>
-        <w:lastRenderedPageBreak/>
         <w:t>4.3 Identifiability: three conditions under which the gate cannot act</w:t>
       </w:r>
     </w:p>
@@ -7167,7 +7177,7 @@
           <w:noProof/>
         </w:rPr>
         <w:drawing>
-          <wp:inline distT="0" distB="0" distL="0" distR="0" wp14:anchorId="2FD645CB" wp14:editId="4A40377D">
+          <wp:inline distT="0" distB="0" distL="0" distR="0" wp14:anchorId="12D4A5F5" wp14:editId="02EF53FE">
             <wp:extent cx="5760720" cy="2356272"/>
             <wp:effectExtent l="0" t="0" r="0" b="0"/>
             <wp:docPr id="4" name="Picture 4"/>
@@ -8130,7 +8140,7 @@
           <w:noProof/>
         </w:rPr>
         <w:drawing>
-          <wp:inline distT="0" distB="0" distL="0" distR="0" wp14:anchorId="1C9D9FD6" wp14:editId="66099E05">
+          <wp:inline distT="0" distB="0" distL="0" distR="0" wp14:anchorId="3275DC4A" wp14:editId="6E90D262">
             <wp:extent cx="5760720" cy="2045294"/>
             <wp:effectExtent l="0" t="0" r="0" b="0"/>
             <wp:docPr id="5" name="Picture 5"/>
@@ -8308,7 +8318,7 @@
           <w:noProof/>
         </w:rPr>
         <w:drawing>
-          <wp:inline distT="0" distB="0" distL="0" distR="0" wp14:anchorId="1A001862" wp14:editId="10B43707">
+          <wp:inline distT="0" distB="0" distL="0" distR="0" wp14:anchorId="44E3DFBB" wp14:editId="750AD296">
             <wp:extent cx="5760720" cy="2308234"/>
             <wp:effectExtent l="0" t="0" r="0" b="0"/>
             <wp:docPr id="6" name="Picture 6"/>
@@ -9040,7 +9050,7 @@
           <w:noProof/>
         </w:rPr>
         <w:drawing>
-          <wp:inline distT="0" distB="0" distL="0" distR="0" wp14:anchorId="6CAFCFB2" wp14:editId="2FBFDCCC">
+          <wp:inline distT="0" distB="0" distL="0" distR="0" wp14:anchorId="3B3DB389" wp14:editId="491D701A">
             <wp:extent cx="5760720" cy="2167923"/>
             <wp:effectExtent l="0" t="0" r="0" b="0"/>
             <wp:docPr id="7" name="Picture 7"/>
@@ -9219,7 +9229,7 @@
           <w:noProof/>
         </w:rPr>
         <w:drawing>
-          <wp:inline distT="0" distB="0" distL="0" distR="0" wp14:anchorId="6E863EC5" wp14:editId="2F230267">
+          <wp:inline distT="0" distB="0" distL="0" distR="0" wp14:anchorId="09626D6A" wp14:editId="200C386D">
             <wp:extent cx="5760720" cy="2258878"/>
             <wp:effectExtent l="0" t="0" r="0" b="0"/>
             <wp:docPr id="8" name="Picture 8"/>
@@ -9403,7 +9413,7 @@
           <w:noProof/>
         </w:rPr>
         <w:drawing>
-          <wp:inline distT="0" distB="0" distL="0" distR="0" wp14:anchorId="6D20068D" wp14:editId="00A846F6">
+          <wp:inline distT="0" distB="0" distL="0" distR="0" wp14:anchorId="0FDD7AED" wp14:editId="3EC19AF5">
             <wp:extent cx="5760720" cy="2516852"/>
             <wp:effectExtent l="0" t="0" r="0" b="0"/>
             <wp:docPr id="9" name="Picture 9"/>
@@ -9540,7 +9550,7 @@
           <w:noProof/>
         </w:rPr>
         <w:drawing>
-          <wp:inline distT="0" distB="0" distL="0" distR="0" wp14:anchorId="52B70908" wp14:editId="52E2648D">
+          <wp:inline distT="0" distB="0" distL="0" distR="0" wp14:anchorId="24628013" wp14:editId="71D80EEC">
             <wp:extent cx="5760720" cy="2223311"/>
             <wp:effectExtent l="0" t="0" r="0" b="0"/>
             <wp:docPr id="10" name="Picture 10"/>
@@ -9627,7 +9637,7 @@
         </w:rPr>
         <w:lastRenderedPageBreak/>
         <w:drawing>
-          <wp:inline distT="0" distB="0" distL="0" distR="0" wp14:anchorId="52386910" wp14:editId="59235D9B">
+          <wp:inline distT="0" distB="0" distL="0" distR="0" wp14:anchorId="08C17284" wp14:editId="0052F252">
             <wp:extent cx="5760720" cy="2538527"/>
             <wp:effectExtent l="0" t="0" r="0" b="0"/>
             <wp:docPr id="11" name="Picture 11"/>
@@ -10491,28 +10501,30 @@
     </w:p>
     <w:p>
       <w:pPr>
-        <w:pStyle w:val="1"/>
-      </w:pPr>
-      <w:r>
-        <w:t>6. Discussion</w:t>
-      </w:r>
-    </w:p>
-    <w:p>
-      <w:r>
-        <w:t>The discussion reads the results in four steps: the failure conditions and their hierarchy (6.1), how to interpret reported weighting gains in that light (6.2), a decision matrix for practitioners (6.3), reporting recommendations for future evaluations (6.4), and the limitations that remain (6.5).</w:t>
-      </w:r>
-    </w:p>
-    <w:p>
-      <w:pPr>
         <w:pStyle w:val="21"/>
       </w:pPr>
       <w:r>
-        <w:t>6.1 Four failure conditions for conditional weighting</w:t>
-      </w:r>
-    </w:p>
-    <w:p>
-      <w:r>
-        <w:t>The conditions of Section 4.3 and the measurements of Section 5.3 together characterise four failure modes. The first three describe an inert gate, whose weights cannot move a label; the fourth describes a combination that is harmful at any weights. They are not mutually exclusive but form a hierarchy from strongest to weakest.</w:t>
+        <w:t>5.8 Extension experiments</w:t>
+      </w:r>
+    </w:p>
+    <w:p>
+      <w:r>
+        <w:t>Five extensions probe the boundaries of the main result; their per-seed data and a standalone report ship with the release (</w:t>
+      </w:r>
+      <w:r>
+        <w:t>扩展实验报告</w:t>
+      </w:r>
+      <w:r>
+        <w:t xml:space="preserve">, </w:t>
+      </w:r>
+      <w:r>
+        <w:rPr>
+          <w:rFonts w:ascii="Consolas" w:hAnsi="Consolas"/>
+        </w:rPr>
+        <w:t>results_*_v1/</w:t>
+      </w:r>
+      <w:r>
+        <w:t>).</w:t>
       </w:r>
     </w:p>
     <w:p>
@@ -10520,6 +10532,88 @@
         <w:rPr>
           <w:b/>
         </w:rPr>
+        <w:t>Member family and count.</w:t>
+      </w:r>
+      <w:r>
+        <w:t xml:space="preserve"> Replacing the four same-family filter views (pairwise disagreement 0.64%, gain +0.000140) with cross-family members (random forest, extremely randomised trees and XGBoost) raises disagreement to 2.29% and the gain to +0.001421; six members give +0.001661. The gate therefore acts once the members are dissimilar enough, but even the most diverse configuration stays inside the 0.005 margin.</w:t>
+      </w:r>
+    </w:p>
+    <w:p>
+      <w:r>
+        <w:rPr>
+          <w:b/>
+        </w:rPr>
+        <w:t>Temporal holdout.</w:t>
+      </w:r>
+      <w:r>
+        <w:t xml:space="preserve"> Splitting CIC-IDS2017 by capture day (train on four days, test on the fifth, per-class cap 20,000) drops Macro-F1 to 0.133-0.317 across the five held-out days. The cause is compositional: Monday contains only Normal traffic, Tuesday only Normal and Brute Force, and so on, so no day carries the full label set. The day-level split is therefore constructible but not category-complete - the quantified form of the limitation in Section 6.5.</w:t>
+      </w:r>
+    </w:p>
+    <w:p>
+      <w:r>
+        <w:rPr>
+          <w:b/>
+        </w:rPr>
+        <w:t>External benchmarks at ten seeds.</w:t>
+      </w:r>
+      <w:r>
+        <w:t xml:space="preserve"> Under the three deterministic views (the mutual-information expert is omitted because its k-nearest-neighbour estimator does not scale to these training sizes), NSL-KDD reaches 0.518756 +/- 0.003374, UNSW-NB15 0.483371 +/- 0.005582 and N-BaIoT 0.999941 +/- 0.000053 over ten seeds.</w:t>
+      </w:r>
+    </w:p>
+    <w:p>
+      <w:r>
+        <w:rPr>
+          <w:b/>
+        </w:rPr>
+        <w:t>Two further corpora.</w:t>
+      </w:r>
+      <w:r>
+        <w:t xml:space="preserve"> CIC-IDS2018 (16.2 M raw rows, 4.10 M duplicates removed) gives a 56,055/12,012/12,012 five-class benchmark on which the gate and the same-members equal fusion are identical across five seeds (0.964124, zero labels changed). CIC-IoT-2023 (38.4 M rows, eight coarse classes) gives 0.752375 for the gate against 0.752347 for the same-members fusion over three seeds - a +0.000028 difference. Both reproduce the primary finding on corpora the study had not used.</w:t>
+      </w:r>
+    </w:p>
+    <w:p>
+      <w:r>
+        <w:rPr>
+          <w:b/>
+        </w:rPr>
+        <w:t>Deployment view.</w:t>
+      </w:r>
+      <w:r>
+        <w:t xml:space="preserve"> At the model's own operating point the full-corpus false-positive rate on benign flows is 0.00441 for the equal-weight chi-square forest and 0.00018 for XGBoost, and the conditional model reaches AUROC 0.99987 with FPR 0.00033 at 95% detection on the primary population. The aggregation-rule effect is an order of magnitude smaller than the model-family effect on the same axis.</w:t>
+      </w:r>
+    </w:p>
+    <w:p>
+      <w:pPr>
+        <w:pStyle w:val="1"/>
+      </w:pPr>
+      <w:r>
+        <w:t>6. Discussion</w:t>
+      </w:r>
+    </w:p>
+    <w:p>
+      <w:r>
+        <w:t>The discussion reads the results in four steps: the failure conditions and their hierarchy (6.1), how to interpret reported weighting gains in that light (6.2), a decision matrix for practitioners (6.3), reporting recommendations for future evaluations (6.4), and the limitations that remain (6.5).</w:t>
+      </w:r>
+    </w:p>
+    <w:p>
+      <w:pPr>
+        <w:pStyle w:val="21"/>
+      </w:pPr>
+      <w:r>
+        <w:t>6.1 Four failure conditions for conditional weighting</w:t>
+      </w:r>
+    </w:p>
+    <w:p>
+      <w:r>
+        <w:t>The conditions of Section 4.3 and the measurements of Section 5.3 together characterise four failure modes. The first three describe an inert gate, whose weights cannot move a label; the fourth describes a combination that is harmful at any weights. They are not mutually exclusive but form a hierarchy from strongest to weakest.</w:t>
+      </w:r>
+    </w:p>
+    <w:p>
+      <w:r>
+        <w:rPr>
+          <w:b/>
+        </w:rPr>
+        <w:lastRenderedPageBreak/>
         <w:t>Condition A: identical expert output.</w:t>
       </w:r>
       <w:r>
@@ -10567,7 +10661,6 @@
     </w:p>
     <w:p>
       <w:r>
-        <w:lastRenderedPageBreak/>
         <w:t xml:space="preserve">The four conditions yield an operational diagnostic sequence: </w:t>
       </w:r>
       <w:r>
@@ -10668,6 +10761,7 @@
         <w:rPr>
           <w:b/>
         </w:rPr>
+        <w:lastRenderedPageBreak/>
         <w:t>Metric selection.</w:t>
       </w:r>
       <w:r>
@@ -11173,14 +11267,7 @@
               <w:rPr>
                 <w:sz w:val="16"/>
               </w:rPr>
-              <w:t xml:space="preserve">Adopt this protocol and release </w:t>
-            </w:r>
-            <w:r>
-              <w:rPr>
-                <w:sz w:val="16"/>
-              </w:rPr>
-              <w:lastRenderedPageBreak/>
-              <w:t>per-row predictions</w:t>
+              <w:t>Adopt this protocol and release per-row predictions</w:t>
             </w:r>
           </w:p>
         </w:tc>
@@ -11196,15 +11283,7 @@
               <w:rPr>
                 <w:sz w:val="16"/>
               </w:rPr>
-              <w:lastRenderedPageBreak/>
-              <w:t xml:space="preserve">All aggregate metrics can be </w:t>
-            </w:r>
-            <w:r>
-              <w:rPr>
-                <w:sz w:val="16"/>
-              </w:rPr>
-              <w:lastRenderedPageBreak/>
-              <w:t>recomputed from released probabilities</w:t>
+              <w:t>All aggregate metrics can be recomputed from released probabilities</w:t>
             </w:r>
           </w:p>
         </w:tc>
@@ -11220,15 +11299,7 @@
               <w:rPr>
                 <w:sz w:val="16"/>
               </w:rPr>
-              <w:lastRenderedPageBreak/>
-              <w:t xml:space="preserve">Extra storage and version </w:t>
-            </w:r>
-            <w:r>
-              <w:rPr>
-                <w:sz w:val="16"/>
-              </w:rPr>
-              <w:lastRenderedPageBreak/>
-              <w:t>management</w:t>
+              <w:t>Extra storage and version management</w:t>
             </w:r>
           </w:p>
         </w:tc>
@@ -11246,7 +11317,6 @@
               <w:rPr>
                 <w:sz w:val="16"/>
               </w:rPr>
-              <w:lastRenderedPageBreak/>
               <w:t>Decide whether to deploy conditional weighting</w:t>
             </w:r>
           </w:p>
@@ -11385,6 +11455,7 @@
         <w:rPr>
           <w:b/>
         </w:rPr>
+        <w:lastRenderedPageBreak/>
         <w:t>A clear separation of research population and target population</w:t>
       </w:r>
       <w:r>
@@ -11513,7 +11584,6 @@
         <w:rPr>
           <w:b/>
         </w:rPr>
-        <w:lastRenderedPageBreak/>
         <w:t>The same-members control covers the primary population.</w:t>
       </w:r>
       <w:r>
@@ -11558,6 +11628,7 @@
         <w:rPr>
           <w:b/>
         </w:rPr>
+        <w:lastRenderedPageBreak/>
         <w:t>External datasets are independent benchmarks, not transfer experiments.</w:t>
       </w:r>
       <w:r>
@@ -11594,13 +11665,13 @@
         <w:rPr>
           <w:b/>
         </w:rPr>
-        <w:t>Four datasets were evaluated, and every corpus comes from one collection programme.</w:t>
-      </w:r>
-      <w:r>
-        <w:t xml:space="preserve"> The conclusions are conditional on CIC-IDS2017 (both its capped populations and the full deduplicated corpus), NSL-KDD, UNSW-NB15 and N-BaIoT. N-BaIoT is saturated for flow-feature classifiers (every model at or above 0.9998 Macro-F1), so it probes the mechanics of the aggregation step rather than discrimination difficulty, and the external datasets remain independent native-label benchmarks rather than transfer tests. None of the four datasets represents production traffic, and no time-separated holdout o</w:t>
-      </w:r>
-      <w:r>
-        <w:t>n a common testbed exists in any of them.</w:t>
+        <w:t>Six datasets were evaluated, and every corpus comes from one collection programme.</w:t>
+      </w:r>
+      <w:r>
+        <w:t xml:space="preserve"> The conclusions are conditional on CIC-IDS2017 (capped populations and the full deduplicated corpus), NSL-KDD, UNSW-NB15 and N-BaIoT; CIC-IDS2018 and CIC-IoT-2023 were added as extension corpora (Section 5.8) and reproduce the primary comparison. N-BaIoT is saturated for flow-feature classifiers (every model at or above 0.9998 Macro-F1), so it probes the mechanics of the aggregation step rather than discrimination difficulty, and the external datasets remain independent native-label benchmarks rather than </w:t>
+      </w:r>
+      <w:r>
+        <w:t>transfer tests. None of the six represents production traffic. A day-level split of CIC-IDS2017 is constructible, but every capture day carries only a subset of the five classes (Monday Normal only; Tuesday Normal and Brute Force; Wednesday Normal and DoS/DDoS; Thursday adds Web Attack; Friday adds Bot), so it is not category-complete: the measured day-holdout Macro-F1 collapses to 0.13-0.32 across the five days, which is what that limitation now quantifies.</w:t>
       </w:r>
     </w:p>
     <w:p>
@@ -11630,7 +11701,6 @@
         <w:rPr>
           <w:b/>
         </w:rPr>
-        <w:lastRenderedPageBreak/>
         <w:t>Bootstrap intervals have a limited interpretation.</w:t>
       </w:r>
       <w:r>
@@ -11669,7 +11739,11 @@
         <w:t>First, relative to the most direct equal-weight control the gain lies inside an equivalence boundary.</w:t>
       </w:r>
       <w:r>
-        <w:t xml:space="preserve"> Averaged over ten seeds on the natural-prior population of CIC-IDS2017, the Macro-F1 difference between conditional weighting and an equal-weight chi-square forest is -0.000456, with the per-seed sign split five to five. Against the equal-weight fusion of those same four experts the gated model changes one label in 79,860 test predictions (-0.000010), which locates the single-view gap in the composition of the ensemble rather than in the gate. Both the seed-level 90% interval [-0.00112, +0.00021] and the t</w:t>
+        <w:t xml:space="preserve"> Averaged over ten seeds on the natural-prior population of CIC-IDS2017, the Macro-F1 difference between conditional weighting and an equal-weight chi-square forest is -0.000456, with the per-seed sign split five to five. Against the </w:t>
+      </w:r>
+      <w:r>
+        <w:lastRenderedPageBreak/>
+        <w:t>equal-weight fusion of those same four experts the gated model changes one label in 79,860 test predictions (-0.000010), which locates the single-view gap in the composition of the ensemble rather than in the gate. Both the seed-level 90% interval [-0.00112, +0.00021] and the t</w:t>
       </w:r>
       <w:r>
         <w:t>est-row paired bootstrap interval [-0.00425, +0.00338] lie inside equivalence margins of 0.005 and 0.01. The four experts disagree on 0.15%-0.66% of test rows, yet the gate matches equal voting on all but one of 79,860 predictions; weight entropy is 0.99998. The cost is about an 80-fold increase in training time and a fivefold increase in batch inference time (ten-seed means, Table 4(a)).</w:t>
@@ -11725,31 +11799,31 @@
     </w:p>
     <w:p>
       <w:r>
+        <w:t>The principal contribution is not a new state-of-the-art classifier but a reusable leakage-controlled protocol, a set of falsifiable identifiability boundaries, and a quantitative map that separates protocol effects from aggregation-rule effects. Three directions follow. First, design weighting mechanisms that explicitly enforce expert decorrelation, and test whether the gain is restored once the premise of Condition 1 is broken. Second, construct category-complete temporal or cross-scenario protocols so th</w:t>
+      </w:r>
+      <w:r>
+        <w:t>at file-level coverage analysis can be upgraded into a genuine external-validity test. Third, turn the reporting recommendations of Section 6.4 into an automatically checkable checklist, so that the evaluation protocol itself becomes a verifiable object. The recommendations extend those of [22].</w:t>
+      </w:r>
+    </w:p>
+    <w:p>
+      <w:pPr>
+        <w:pStyle w:val="1"/>
+      </w:pPr>
+      <w:r>
+        <w:t>Data and code availability</w:t>
+      </w:r>
+    </w:p>
+    <w:p>
+      <w:r>
+        <w:t>Processing scripts, audit intermediates, per-row predictions and figure-generation code are released at https://github.com/linran-muxue/leakage-controlled-nids-study (release v1.11.0, tag v1.11.0). Raw datasets are not redistributed; the paper records source URLs, retrieval dates, version snapshots and SHA-256 checksums.</w:t>
+      </w:r>
+    </w:p>
+    <w:p>
+      <w:pPr>
+        <w:pStyle w:val="1"/>
+      </w:pPr>
+      <w:r>
         <w:lastRenderedPageBreak/>
-        <w:t>The principal contribution is not a new state-of-the-art classifier but a reusable leakage-controlled protocol, a set of falsifiable identifiability boundaries, and a quantitative map that separates protocol effects from aggregation-rule effects. Three directions follow. First, design weighting mechanisms that explicitly enforce expert decorrelation, and test whether the gain is restored once the premise of Condition 1 is broken. Second, construct category-complete temporal or cross-scenario protocols so th</w:t>
-      </w:r>
-      <w:r>
-        <w:t>at file-level coverage analysis can be upgraded into a genuine external-validity test. Third, turn the reporting recommendations of Section 6.4 into an automatically checkable checklist, so that the evaluation protocol itself becomes a verifiable object. The recommendations extend those of [22].</w:t>
-      </w:r>
-    </w:p>
-    <w:p>
-      <w:pPr>
-        <w:pStyle w:val="1"/>
-      </w:pPr>
-      <w:r>
-        <w:t>Data and code availability</w:t>
-      </w:r>
-    </w:p>
-    <w:p>
-      <w:r>
-        <w:t>Processing scripts, audit intermediates, per-row predictions and figure-generation code are released at https://github.com/linran-muxue/leakage-controlled-nids-study (release v1.11.0, tag v1.11.0). Raw datasets are not redistributed; the paper records source URLs, retrieval dates, version snapshots and SHA-256 checksums.</w:t>
-      </w:r>
-    </w:p>
-    <w:p>
-      <w:pPr>
-        <w:pStyle w:val="1"/>
-      </w:pPr>
-      <w:r>
         <w:t>Funding</w:t>
       </w:r>
     </w:p>
@@ -11855,7 +11929,6 @@
         </w:numPr>
       </w:pPr>
       <w:r>
-        <w:lastRenderedPageBreak/>
         <w:t>Chen T, Guestrin C. XGBoost: A scalable tree boosting system. KDD 2016: 785-794. DOI:10.1145/2939672.2939785.</w:t>
       </w:r>
     </w:p>
@@ -11952,6 +12025,7 @@
         </w:numPr>
       </w:pPr>
       <w:r>
+        <w:lastRenderedPageBreak/>
         <w:t>Liu H, Setiono R. Chi2: Feature selection and discretization of numeric attributes. ICTAI 1995: 388-391. DOI:10.1109/TAI.1995.479783.</w:t>
       </w:r>
     </w:p>
@@ -12108,7 +12182,6 @@
         </w:numPr>
       </w:pPr>
       <w:r>
-        <w:lastRenderedPageBreak/>
         <w:t>Khraisat A, Gondal I, Vamplew P, Kamruzzaman J. Survey of intrusion detection systems: Techniques, datasets and challenges. Cybersecurity, 2019, 2: 20. DOI:10.1186/s42400-019-0038-7.</w:t>
       </w:r>
     </w:p>
@@ -12193,6 +12266,7 @@
         </w:numPr>
       </w:pPr>
       <w:r>
+        <w:lastRenderedPageBreak/>
         <w:t>Angelopoulos A N, Bates S. Conformal prediction: A gentle introduction. Foundations and Trends in Machine Learning, 2023, 16(4): 494-591. DOI:10.1561/2200000101.</w:t>
       </w:r>
     </w:p>
@@ -12373,7 +12447,6 @@
         </w:numPr>
       </w:pPr>
       <w:r>
-        <w:lastRenderedPageBreak/>
         <w:t>Hunter J D. Matplotlib: A 2D graphics environment. Computing in Science &amp; Engineering, 2007, 9(3): 90-95. DOI:10.1109/MCSE.2007.55.</w:t>
       </w:r>
     </w:p>
@@ -12724,6 +12797,7 @@
               <w:rPr>
                 <w:sz w:val="16"/>
               </w:rPr>
+              <w:lastRenderedPageBreak/>
               <w:t>S09</w:t>
             </w:r>
           </w:p>
@@ -13733,76 +13807,76 @@
       </w:rPr>
     </w:lvl>
   </w:abstractNum>
-  <w:num w:numId="1" w16cid:durableId="491868319">
+  <w:num w:numId="1" w16cid:durableId="2120754536">
     <w:abstractNumId w:val="8"/>
   </w:num>
-  <w:num w:numId="2" w16cid:durableId="2135246012">
+  <w:num w:numId="2" w16cid:durableId="1326779711">
     <w:abstractNumId w:val="6"/>
   </w:num>
-  <w:num w:numId="3" w16cid:durableId="1185052008">
+  <w:num w:numId="3" w16cid:durableId="643851019">
     <w:abstractNumId w:val="5"/>
   </w:num>
-  <w:num w:numId="4" w16cid:durableId="2065251598">
+  <w:num w:numId="4" w16cid:durableId="71512673">
     <w:abstractNumId w:val="4"/>
   </w:num>
-  <w:num w:numId="5" w16cid:durableId="603151846">
+  <w:num w:numId="5" w16cid:durableId="878779801">
     <w:abstractNumId w:val="7"/>
   </w:num>
-  <w:num w:numId="6" w16cid:durableId="1411195890">
+  <w:num w:numId="6" w16cid:durableId="995760272">
     <w:abstractNumId w:val="3"/>
   </w:num>
-  <w:num w:numId="7" w16cid:durableId="1926574646">
+  <w:num w:numId="7" w16cid:durableId="764762100">
     <w:abstractNumId w:val="2"/>
   </w:num>
-  <w:num w:numId="8" w16cid:durableId="760028619">
+  <w:num w:numId="8" w16cid:durableId="1314291271">
     <w:abstractNumId w:val="1"/>
   </w:num>
-  <w:num w:numId="9" w16cid:durableId="634676122">
+  <w:num w:numId="9" w16cid:durableId="1363282508">
     <w:abstractNumId w:val="0"/>
   </w:num>
-  <w:num w:numId="10" w16cid:durableId="805780456">
+  <w:num w:numId="10" w16cid:durableId="1944990340">
     <w:abstractNumId w:val="7"/>
     <w:lvlOverride w:ilvl="0">
       <w:startOverride w:val="1"/>
     </w:lvlOverride>
   </w:num>
-  <w:num w:numId="11" w16cid:durableId="329452298">
+  <w:num w:numId="11" w16cid:durableId="314379181">
     <w:abstractNumId w:val="7"/>
     <w:lvlOverride w:ilvl="0">
       <w:startOverride w:val="1"/>
     </w:lvlOverride>
   </w:num>
-  <w:num w:numId="12" w16cid:durableId="714893017">
+  <w:num w:numId="12" w16cid:durableId="1163084693">
     <w:abstractNumId w:val="7"/>
     <w:lvlOverride w:ilvl="0">
       <w:startOverride w:val="1"/>
     </w:lvlOverride>
   </w:num>
-  <w:num w:numId="13" w16cid:durableId="834691274">
+  <w:num w:numId="13" w16cid:durableId="381561609">
     <w:abstractNumId w:val="7"/>
     <w:lvlOverride w:ilvl="0">
       <w:startOverride w:val="1"/>
     </w:lvlOverride>
   </w:num>
-  <w:num w:numId="14" w16cid:durableId="97024350">
+  <w:num w:numId="14" w16cid:durableId="1692292084">
     <w:abstractNumId w:val="7"/>
     <w:lvlOverride w:ilvl="0">
       <w:startOverride w:val="1"/>
     </w:lvlOverride>
   </w:num>
-  <w:num w:numId="15" w16cid:durableId="2068644504">
+  <w:num w:numId="15" w16cid:durableId="1639845155">
     <w:abstractNumId w:val="7"/>
     <w:lvlOverride w:ilvl="0">
       <w:startOverride w:val="1"/>
     </w:lvlOverride>
   </w:num>
-  <w:num w:numId="16" w16cid:durableId="1056776402">
+  <w:num w:numId="16" w16cid:durableId="685789655">
     <w:abstractNumId w:val="7"/>
     <w:lvlOverride w:ilvl="0">
       <w:startOverride w:val="1"/>
     </w:lvlOverride>
   </w:num>
-  <w:num w:numId="17" w16cid:durableId="557933551">
+  <w:num w:numId="17" w16cid:durableId="1770655723">
     <w:abstractNumId w:val="7"/>
     <w:lvlOverride w:ilvl="0">
       <w:startOverride w:val="1"/>

</xml_diff>

<commit_message>
Round 20az: four recent corpora (2020-2023) - LITNET-2020, IoT-23, RT-IoT2022, ACI-IoT-2023
</commit_message>
<xml_diff>
--- a/重构版论文_v4_20260915/English_SCI_Manuscript_v4.docx
+++ b/重构版论文_v4_20260915/English_SCI_Manuscript_v4.docx
@@ -1039,7 +1039,7 @@
           <w:noProof/>
         </w:rPr>
         <w:drawing>
-          <wp:inline distT="0" distB="0" distL="0" distR="0" wp14:anchorId="7D950F4D" wp14:editId="5A790112">
+          <wp:inline distT="0" distB="0" distL="0" distR="0" wp14:anchorId="19F356D0" wp14:editId="27561A0B">
             <wp:extent cx="5760720" cy="2734826"/>
             <wp:effectExtent l="0" t="0" r="0" b="0"/>
             <wp:docPr id="1" name="Picture 1"/>
@@ -1103,10 +1103,7 @@
     </w:p>
     <w:p>
       <w:r>
-        <w:t>Four public datasets are used, all obtained from official or public sources [14-18]. Two further corpora, CIC-IDS2018 and CIC-IoT-2023, are used only in the extension experiments of Section 5.8. Two further corpora, CIC-IDS2018 and CIC-IoT-2023, are used only in the extension experiments of Section 5.8. No scanning, probing or live attack traffic was generated at any point. Table 2 records sources, versions, retrieval dates, licence status and file hashes. The datasets are not redistributed; only processing</w:t>
-      </w:r>
-      <w:r>
-        <w:t xml:space="preserve"> scripts and the code that produces the derived statistics are released.</w:t>
+        <w:t>Four public datasets are used, all obtained from official or public sources [14-18]. Two further corpora, CIC-IDS2018 and CIC-IoT-2023, are used only in the extension experiments of Section 5.8. No scanning, probing or live attack traffic was generated at any point. Table 2 records sources, versions, retrieval dates, licence status and file hashes. The datasets are not redistributed; only processing scripts and the code that produces the derived statistics are released.</w:t>
       </w:r>
     </w:p>
     <w:p>
@@ -1460,8 +1457,30 @@
               <w:rPr>
                 <w:sz w:val="16"/>
               </w:rPr>
+              <w:t>UNSW-NB15</w:t>
+            </w:r>
+          </w:p>
+        </w:tc>
+        <w:tc>
+          <w:tcPr>
+            <w:tcW w:w="1632" w:type="dxa"/>
+          </w:tcPr>
+          <w:p>
+            <w:pPr>
+              <w:spacing w:after="0"/>
+            </w:pPr>
+            <w:r>
+              <w:rPr>
+                <w:sz w:val="16"/>
+              </w:rPr>
+              <w:t xml:space="preserve">UNSW Canberra </w:t>
+            </w:r>
+            <w:r>
+              <w:rPr>
+                <w:sz w:val="16"/>
+              </w:rPr>
               <w:lastRenderedPageBreak/>
-              <w:t>UNSW-NB15</w:t>
+              <w:t>Cyber, official project page</w:t>
             </w:r>
           </w:p>
         </w:tc>
@@ -1477,7 +1496,15 @@
               <w:rPr>
                 <w:sz w:val="16"/>
               </w:rPr>
-              <w:t>UNSW Canberra Cyber, official project page</w:t>
+              <w:lastRenderedPageBreak/>
+              <w:t xml:space="preserve">Official training and </w:t>
+            </w:r>
+            <w:r>
+              <w:rPr>
+                <w:sz w:val="16"/>
+              </w:rPr>
+              <w:lastRenderedPageBreak/>
+              <w:t>testing CSV</w:t>
             </w:r>
           </w:p>
         </w:tc>
@@ -1493,7 +1520,8 @@
               <w:rPr>
                 <w:sz w:val="16"/>
               </w:rPr>
-              <w:t>Official training and testing CSV</w:t>
+              <w:lastRenderedPageBreak/>
+              <w:t>2026-09-04</w:t>
             </w:r>
           </w:p>
         </w:tc>
@@ -1509,7 +1537,14 @@
               <w:rPr>
                 <w:sz w:val="16"/>
               </w:rPr>
-              <w:t>2026-09-04</w:t>
+              <w:t xml:space="preserve">Page requires citation </w:t>
+            </w:r>
+            <w:r>
+              <w:rPr>
+                <w:sz w:val="16"/>
+              </w:rPr>
+              <w:lastRenderedPageBreak/>
+              <w:t>of the original paper; no SPDX identifier</w:t>
             </w:r>
           </w:p>
         </w:tc>
@@ -1525,23 +1560,15 @@
               <w:rPr>
                 <w:sz w:val="16"/>
               </w:rPr>
-              <w:t>Page requires citation of the original paper; no SPDX identifier</w:t>
-            </w:r>
-          </w:p>
-        </w:tc>
-        <w:tc>
-          <w:tcPr>
-            <w:tcW w:w="1632" w:type="dxa"/>
-          </w:tcPr>
-          <w:p>
-            <w:pPr>
-              <w:spacing w:after="0"/>
-            </w:pPr>
-            <w:r>
-              <w:rPr>
-                <w:sz w:val="16"/>
-              </w:rPr>
-              <w:t>SHA-256 recorded for both files</w:t>
+              <w:lastRenderedPageBreak/>
+              <w:t xml:space="preserve">SHA-256 recorded </w:t>
+            </w:r>
+            <w:r>
+              <w:rPr>
+                <w:sz w:val="16"/>
+              </w:rPr>
+              <w:lastRenderedPageBreak/>
+              <w:t>for both files</w:t>
             </w:r>
           </w:p>
         </w:tc>
@@ -1559,6 +1586,7 @@
               <w:rPr>
                 <w:sz w:val="16"/>
               </w:rPr>
+              <w:lastRenderedPageBreak/>
               <w:t>N-BaIoT</w:t>
             </w:r>
           </w:p>
@@ -1974,14 +2002,14 @@
               <w:rPr>
                 <w:sz w:val="16"/>
               </w:rPr>
-              <w:t xml:space="preserve">Five retained classes; PortScan, </w:t>
+              <w:t xml:space="preserve">Five retained classes; PortScan, Infiltration and Heartbleed </w:t>
             </w:r>
             <w:r>
               <w:rPr>
                 <w:sz w:val="16"/>
               </w:rPr>
               <w:lastRenderedPageBreak/>
-              <w:t>Infiltration and Heartbleed reserved for diagnostics</w:t>
+              <w:t>reserved for diagnostics</w:t>
             </w:r>
           </w:p>
         </w:tc>
@@ -2398,7 +2426,7 @@
           <w:noProof/>
         </w:rPr>
         <w:drawing>
-          <wp:inline distT="0" distB="0" distL="0" distR="0" wp14:anchorId="6F2AF25E" wp14:editId="5DA0F064">
+          <wp:inline distT="0" distB="0" distL="0" distR="0" wp14:anchorId="2D31DF7B" wp14:editId="6D573019">
             <wp:extent cx="5760720" cy="2722098"/>
             <wp:effectExtent l="0" t="0" r="0" b="0"/>
             <wp:docPr id="2" name="Picture 2"/>
@@ -3391,7 +3419,7 @@
           <w:noProof/>
         </w:rPr>
         <w:drawing>
-          <wp:inline distT="0" distB="0" distL="0" distR="0" wp14:anchorId="02330A11" wp14:editId="7B15EA91">
+          <wp:inline distT="0" distB="0" distL="0" distR="0" wp14:anchorId="44DD14AF" wp14:editId="706F6319">
             <wp:extent cx="5760720" cy="3482709"/>
             <wp:effectExtent l="0" t="0" r="0" b="0"/>
             <wp:docPr id="3" name="Picture 3"/>
@@ -7177,7 +7205,7 @@
           <w:noProof/>
         </w:rPr>
         <w:drawing>
-          <wp:inline distT="0" distB="0" distL="0" distR="0" wp14:anchorId="12D4A5F5" wp14:editId="02EF53FE">
+          <wp:inline distT="0" distB="0" distL="0" distR="0" wp14:anchorId="7C39BB00" wp14:editId="4DC7F831">
             <wp:extent cx="5760720" cy="2356272"/>
             <wp:effectExtent l="0" t="0" r="0" b="0"/>
             <wp:docPr id="4" name="Picture 4"/>
@@ -8140,7 +8168,7 @@
           <w:noProof/>
         </w:rPr>
         <w:drawing>
-          <wp:inline distT="0" distB="0" distL="0" distR="0" wp14:anchorId="3275DC4A" wp14:editId="6E90D262">
+          <wp:inline distT="0" distB="0" distL="0" distR="0" wp14:anchorId="0B89601F" wp14:editId="30394374">
             <wp:extent cx="5760720" cy="2045294"/>
             <wp:effectExtent l="0" t="0" r="0" b="0"/>
             <wp:docPr id="5" name="Picture 5"/>
@@ -8318,7 +8346,7 @@
           <w:noProof/>
         </w:rPr>
         <w:drawing>
-          <wp:inline distT="0" distB="0" distL="0" distR="0" wp14:anchorId="44E3DFBB" wp14:editId="750AD296">
+          <wp:inline distT="0" distB="0" distL="0" distR="0" wp14:anchorId="1FDD89D7" wp14:editId="10FDC8A3">
             <wp:extent cx="5760720" cy="2308234"/>
             <wp:effectExtent l="0" t="0" r="0" b="0"/>
             <wp:docPr id="6" name="Picture 6"/>
@@ -9050,7 +9078,7 @@
           <w:noProof/>
         </w:rPr>
         <w:drawing>
-          <wp:inline distT="0" distB="0" distL="0" distR="0" wp14:anchorId="3B3DB389" wp14:editId="491D701A">
+          <wp:inline distT="0" distB="0" distL="0" distR="0" wp14:anchorId="7306CC49" wp14:editId="66D7F9C3">
             <wp:extent cx="5760720" cy="2167923"/>
             <wp:effectExtent l="0" t="0" r="0" b="0"/>
             <wp:docPr id="7" name="Picture 7"/>
@@ -9229,7 +9257,7 @@
           <w:noProof/>
         </w:rPr>
         <w:drawing>
-          <wp:inline distT="0" distB="0" distL="0" distR="0" wp14:anchorId="09626D6A" wp14:editId="200C386D">
+          <wp:inline distT="0" distB="0" distL="0" distR="0" wp14:anchorId="0695A7C1" wp14:editId="36513888">
             <wp:extent cx="5760720" cy="2258878"/>
             <wp:effectExtent l="0" t="0" r="0" b="0"/>
             <wp:docPr id="8" name="Picture 8"/>
@@ -9413,7 +9441,7 @@
           <w:noProof/>
         </w:rPr>
         <w:drawing>
-          <wp:inline distT="0" distB="0" distL="0" distR="0" wp14:anchorId="0FDD7AED" wp14:editId="3EC19AF5">
+          <wp:inline distT="0" distB="0" distL="0" distR="0" wp14:anchorId="64F293B1" wp14:editId="4918E8C8">
             <wp:extent cx="5760720" cy="2516852"/>
             <wp:effectExtent l="0" t="0" r="0" b="0"/>
             <wp:docPr id="9" name="Picture 9"/>
@@ -9550,7 +9578,7 @@
           <w:noProof/>
         </w:rPr>
         <w:drawing>
-          <wp:inline distT="0" distB="0" distL="0" distR="0" wp14:anchorId="24628013" wp14:editId="71D80EEC">
+          <wp:inline distT="0" distB="0" distL="0" distR="0" wp14:anchorId="5BA727AE" wp14:editId="36AA350C">
             <wp:extent cx="5760720" cy="2223311"/>
             <wp:effectExtent l="0" t="0" r="0" b="0"/>
             <wp:docPr id="10" name="Picture 10"/>
@@ -9637,7 +9665,7 @@
         </w:rPr>
         <w:lastRenderedPageBreak/>
         <w:drawing>
-          <wp:inline distT="0" distB="0" distL="0" distR="0" wp14:anchorId="08C17284" wp14:editId="0052F252">
+          <wp:inline distT="0" distB="0" distL="0" distR="0" wp14:anchorId="3AC1EA59" wp14:editId="3C481BC5">
             <wp:extent cx="5760720" cy="2538527"/>
             <wp:effectExtent l="0" t="0" r="0" b="0"/>
             <wp:docPr id="11" name="Picture 11"/>
@@ -10583,37 +10611,51 @@
       </w:r>
     </w:p>
     <w:p>
-      <w:pPr>
-        <w:pStyle w:val="1"/>
-      </w:pPr>
-      <w:r>
-        <w:t>6. Discussion</w:t>
-      </w:r>
-    </w:p>
-    <w:p>
-      <w:r>
-        <w:t>The discussion reads the results in four steps: the failure conditions and their hierarchy (6.1), how to interpret reported weighting gains in that light (6.2), a decision matrix for practitioners (6.3), reporting recommendations for future evaluations (6.4), and the limitations that remain (6.5).</w:t>
-      </w:r>
-    </w:p>
-    <w:p>
-      <w:pPr>
-        <w:pStyle w:val="21"/>
-      </w:pPr>
-      <w:r>
-        <w:t>6.1 Four failure conditions for conditional weighting</w:t>
-      </w:r>
-    </w:p>
-    <w:p>
-      <w:r>
-        <w:t>The conditions of Section 4.3 and the measurements of Section 5.3 together characterise four failure modes. The first three describe an inert gate, whose weights cannot move a label; the fourth describes a combination that is harmful at any weights. They are not mutually exclusive but form a hierarchy from strongest to weakest.</w:t>
-      </w:r>
-    </w:p>
-    <w:p>
       <w:r>
         <w:rPr>
           <w:b/>
         </w:rPr>
+        <w:t>Corpus vintage.</w:t>
+      </w:r>
+      <w:r>
+        <w:t xml:space="preserve"> The ten corpora span 1998-2023, and five of them were released in 2020 or later: LITNET-2020, IoT-23 (both 2020), RT-IoT2022 (2022), ACI-IoT-2023 and CIC-IoT-2023. On each of the five the gate is indistinguishable from the equal-weight fusion of the same members: the differences are +0.000000 (LITNET-2020), +0.000000 (IoT-23), +0.000235 (RT-IoT2022), +0.000000 (ACI-IoT-2023) and +0.000028 (CIC-IoT-2023), against Macro-F1 levels of 0.999, 0.985, 0.940, 0.778 and 0.752. The 2020-2023 corpora are therefore no</w:t>
+      </w:r>
+      <w:r>
+        <w:t>t only newer but also more difficult than the 2017 data, and the aggregation-rule conclusion does not depend on the vintage of the source corpus. Corpora released in 2024-2025 are distributed behind request forms; the preparation and evaluation scripts are released so they can be added under the same protocol.</w:t>
+      </w:r>
+    </w:p>
+    <w:p>
+      <w:pPr>
+        <w:pStyle w:val="1"/>
+      </w:pPr>
+      <w:r>
         <w:lastRenderedPageBreak/>
+        <w:t>6. Discussion</w:t>
+      </w:r>
+    </w:p>
+    <w:p>
+      <w:r>
+        <w:t>The discussion reads the results in four steps: the failure conditions and their hierarchy (6.1), how to interpret reported weighting gains in that light (6.2), a decision matrix for practitioners (6.3), reporting recommendations for future evaluations (6.4), and the limitations that remain (6.5).</w:t>
+      </w:r>
+    </w:p>
+    <w:p>
+      <w:pPr>
+        <w:pStyle w:val="21"/>
+      </w:pPr>
+      <w:r>
+        <w:t>6.1 Four failure conditions for conditional weighting</w:t>
+      </w:r>
+    </w:p>
+    <w:p>
+      <w:r>
+        <w:t>The conditions of Section 4.3 and the measurements of Section 5.3 together characterise four failure modes. The first three describe an inert gate, whose weights cannot move a label; the fourth describes a combination that is harmful at any weights. They are not mutually exclusive but form a hierarchy from strongest to weakest.</w:t>
+      </w:r>
+    </w:p>
+    <w:p>
+      <w:r>
+        <w:rPr>
+          <w:b/>
+        </w:rPr>
         <w:t>Condition A: identical expert output.</w:t>
       </w:r>
       <w:r>
@@ -10678,6 +10720,7 @@
         <w:pStyle w:val="21"/>
       </w:pPr>
       <w:r>
+        <w:lastRenderedPageBreak/>
         <w:t>6.2 Interpreting reported weighting gains</w:t>
       </w:r>
     </w:p>
@@ -10761,7 +10804,6 @@
         <w:rPr>
           <w:b/>
         </w:rPr>
-        <w:lastRenderedPageBreak/>
         <w:t>Metric selection.</w:t>
       </w:r>
       <w:r>
@@ -11381,6 +11423,7 @@
         <w:pStyle w:val="21"/>
       </w:pPr>
       <w:r>
+        <w:lastRenderedPageBreak/>
         <w:t>6.4 Reporting recommendations for intrusion-detection evaluation</w:t>
       </w:r>
     </w:p>
@@ -11455,7 +11498,6 @@
         <w:rPr>
           <w:b/>
         </w:rPr>
-        <w:lastRenderedPageBreak/>
         <w:t>A clear separation of research population and target population</w:t>
       </w:r>
       <w:r>
@@ -11598,7 +11640,11 @@
         <w:t>The research populations are not production traffic.</w:t>
       </w:r>
       <w:r>
-        <w:t xml:space="preserve"> The natural-prior population results from global deduplication, physical-range screening and a 20,000-per-class cap, giving 53,237 records; the balanced control contains only 3,365 records. Both are therefore artefacts of the audit procedure rather than samples of an operational network, and every number in this paper is conditioned on them.</w:t>
+        <w:t xml:space="preserve"> The natural-prior population results from global deduplication, physical-range screening and a 20,000-per-class cap, giving 53,237 records; the balanced control </w:t>
+      </w:r>
+      <w:r>
+        <w:lastRenderedPageBreak/>
+        <w:t>contains only 3,365 records. Both are therefore artefacts of the audit procedure rather than samples of an operational network, and every number in this paper is conditioned on them.</w:t>
       </w:r>
     </w:p>
     <w:p>
@@ -11628,7 +11674,6 @@
         <w:rPr>
           <w:b/>
         </w:rPr>
-        <w:lastRenderedPageBreak/>
         <w:t>External datasets are independent benchmarks, not transfer experiments.</w:t>
       </w:r>
       <w:r>
@@ -11665,7 +11710,7 @@
         <w:rPr>
           <w:b/>
         </w:rPr>
-        <w:t>Six datasets were evaluated, and every corpus comes from one collection programme.</w:t>
+        <w:t>Ten corpora were evaluated, and every corpus comes from one collection programme.</w:t>
       </w:r>
       <w:r>
         <w:t xml:space="preserve"> The conclusions are conditional on CIC-IDS2017 (capped populations and the full deduplicated corpus), NSL-KDD, UNSW-NB15 and N-BaIoT; CIC-IDS2018 and CIC-IoT-2023 were added as extension corpora (Section 5.8) and reproduce the primary comparison. N-BaIoT is saturated for flow-feature classifiers (every model at or above 0.9998 Macro-F1), so it probes the mechanics of the aggregation step rather than discrimination difficulty, and the external datasets remain independent native-label benchmarks rather than </w:t>
@@ -11712,6 +11757,7 @@
         <w:rPr>
           <w:b/>
         </w:rPr>
+        <w:lastRenderedPageBreak/>
         <w:t>Single hardware platform and single implementation.</w:t>
       </w:r>
       <w:r>
@@ -11739,11 +11785,7 @@
         <w:t>First, relative to the most direct equal-weight control the gain lies inside an equivalence boundary.</w:t>
       </w:r>
       <w:r>
-        <w:t xml:space="preserve"> Averaged over ten seeds on the natural-prior population of CIC-IDS2017, the Macro-F1 difference between conditional weighting and an equal-weight chi-square forest is -0.000456, with the per-seed sign split five to five. Against the </w:t>
-      </w:r>
-      <w:r>
-        <w:lastRenderedPageBreak/>
-        <w:t>equal-weight fusion of those same four experts the gated model changes one label in 79,860 test predictions (-0.000010), which locates the single-view gap in the composition of the ensemble rather than in the gate. Both the seed-level 90% interval [-0.00112, +0.00021] and the t</w:t>
+        <w:t xml:space="preserve"> Averaged over ten seeds on the natural-prior population of CIC-IDS2017, the Macro-F1 difference between conditional weighting and an equal-weight chi-square forest is -0.000456, with the per-seed sign split five to five. Against the equal-weight fusion of those same four experts the gated model changes one label in 79,860 test predictions (-0.000010), which locates the single-view gap in the composition of the ensemble rather than in the gate. Both the seed-level 90% interval [-0.00112, +0.00021] and the t</w:t>
       </w:r>
       <w:r>
         <w:t>est-row paired bootstrap interval [-0.00425, +0.00338] lie inside equivalence margins of 0.005 and 0.01. The four experts disagree on 0.15%-0.66% of test rows, yet the gate matches equal voting on all but one of 79,860 predictions; weight entropy is 0.99998. The cost is about an 80-fold increase in training time and a fivefold increase in batch inference time (ten-seed means, Table 4(a)).</w:t>
@@ -11799,10 +11841,11 @@
     </w:p>
     <w:p>
       <w:r>
-        <w:t>The principal contribution is not a new state-of-the-art classifier but a reusable leakage-controlled protocol, a set of falsifiable identifiability boundaries, and a quantitative map that separates protocol effects from aggregation-rule effects. Three directions follow. First, design weighting mechanisms that explicitly enforce expert decorrelation, and test whether the gain is restored once the premise of Condition 1 is broken. Second, construct category-complete temporal or cross-scenario protocols so th</w:t>
-      </w:r>
-      <w:r>
-        <w:t>at file-level coverage analysis can be upgraded into a genuine external-validity test. Third, turn the reporting recommendations of Section 6.4 into an automatically checkable checklist, so that the evaluation protocol itself becomes a verifiable object. The recommendations extend those of [22].</w:t>
+        <w:t>The principal contribution is not a new state-of-the-art classifier but a reusable leakage-controlled protocol, a set of falsifiable identifiability boundaries, and a quantitative map that separates protocol effects from aggregation-rule effects. Three directions follow. First, design weighting mechanisms that explicitly enforce expert decorrelation, and test whether the gain is restored once the premise of Condition 1 is broken. Second, construct category-</w:t>
+      </w:r>
+      <w:r>
+        <w:lastRenderedPageBreak/>
+        <w:t>complete temporal or cross-scenario protocols so that file-level coverage analysis can be upgraded into a genuine external-validity test. Third, turn the reporting recommendations of Section 6.4 into an automatically checkable checklist, so that the evaluation protocol itself becomes a verifiable object. The recommendations extend those of [22].</w:t>
       </w:r>
     </w:p>
     <w:p>
@@ -11823,7 +11866,6 @@
         <w:pStyle w:val="1"/>
       </w:pPr>
       <w:r>
-        <w:lastRenderedPageBreak/>
         <w:t>Funding</w:t>
       </w:r>
     </w:p>
@@ -11953,6 +11995,7 @@
         </w:numPr>
       </w:pPr>
       <w:r>
+        <w:lastRenderedPageBreak/>
         <w:t>Freund Y, Schapire R E. A decision-theoretic generalization of on-line learning and an application to boosting. Journal of Computer and System Sciences, 1997, 55(1): 119-139. DOI:10.1006/jcss.1997.1504.</w:t>
       </w:r>
     </w:p>
@@ -12025,7 +12068,6 @@
         </w:numPr>
       </w:pPr>
       <w:r>
-        <w:lastRenderedPageBreak/>
         <w:t>Liu H, Setiono R. Chi2: Feature selection and discretization of numeric attributes. ICTAI 1995: 388-391. DOI:10.1109/TAI.1995.479783.</w:t>
       </w:r>
     </w:p>
@@ -12206,6 +12248,7 @@
         </w:numPr>
       </w:pPr>
       <w:r>
+        <w:lastRenderedPageBreak/>
         <w:t>Geng C, Huang S J, Chen S. Recent advances in open set recognition: A survey. IEEE TPAMI, 2021, 43(10): 3614-3631. DOI:10.1109/TPAMI.2020.2981604.</w:t>
       </w:r>
     </w:p>
@@ -12266,7 +12309,6 @@
         </w:numPr>
       </w:pPr>
       <w:r>
-        <w:lastRenderedPageBreak/>
         <w:t>Angelopoulos A N, Bates S. Conformal prediction: A gentle introduction. Foundations and Trends in Machine Learning, 2023, 16(4): 494-591. DOI:10.1561/2200000101.</w:t>
       </w:r>
     </w:p>
@@ -12455,6 +12497,7 @@
         <w:pStyle w:val="1"/>
       </w:pPr>
       <w:r>
+        <w:lastRenderedPageBreak/>
         <w:t>Supplementary material</w:t>
       </w:r>
     </w:p>
@@ -12797,7 +12840,6 @@
               <w:rPr>
                 <w:sz w:val="16"/>
               </w:rPr>
-              <w:lastRenderedPageBreak/>
               <w:t>S09</w:t>
             </w:r>
           </w:p>
@@ -13807,76 +13849,76 @@
       </w:rPr>
     </w:lvl>
   </w:abstractNum>
-  <w:num w:numId="1" w16cid:durableId="2120754536">
+  <w:num w:numId="1" w16cid:durableId="2071149961">
     <w:abstractNumId w:val="8"/>
   </w:num>
-  <w:num w:numId="2" w16cid:durableId="1326779711">
+  <w:num w:numId="2" w16cid:durableId="1065836794">
     <w:abstractNumId w:val="6"/>
   </w:num>
-  <w:num w:numId="3" w16cid:durableId="643851019">
+  <w:num w:numId="3" w16cid:durableId="863707562">
     <w:abstractNumId w:val="5"/>
   </w:num>
-  <w:num w:numId="4" w16cid:durableId="71512673">
+  <w:num w:numId="4" w16cid:durableId="1257012700">
     <w:abstractNumId w:val="4"/>
   </w:num>
-  <w:num w:numId="5" w16cid:durableId="878779801">
+  <w:num w:numId="5" w16cid:durableId="777869390">
     <w:abstractNumId w:val="7"/>
   </w:num>
-  <w:num w:numId="6" w16cid:durableId="995760272">
+  <w:num w:numId="6" w16cid:durableId="36853969">
     <w:abstractNumId w:val="3"/>
   </w:num>
-  <w:num w:numId="7" w16cid:durableId="764762100">
+  <w:num w:numId="7" w16cid:durableId="1568295080">
     <w:abstractNumId w:val="2"/>
   </w:num>
-  <w:num w:numId="8" w16cid:durableId="1314291271">
+  <w:num w:numId="8" w16cid:durableId="1228569520">
     <w:abstractNumId w:val="1"/>
   </w:num>
-  <w:num w:numId="9" w16cid:durableId="1363282508">
+  <w:num w:numId="9" w16cid:durableId="362286810">
     <w:abstractNumId w:val="0"/>
   </w:num>
-  <w:num w:numId="10" w16cid:durableId="1944990340">
+  <w:num w:numId="10" w16cid:durableId="2065715276">
     <w:abstractNumId w:val="7"/>
     <w:lvlOverride w:ilvl="0">
       <w:startOverride w:val="1"/>
     </w:lvlOverride>
   </w:num>
-  <w:num w:numId="11" w16cid:durableId="314379181">
+  <w:num w:numId="11" w16cid:durableId="2001031755">
     <w:abstractNumId w:val="7"/>
     <w:lvlOverride w:ilvl="0">
       <w:startOverride w:val="1"/>
     </w:lvlOverride>
   </w:num>
-  <w:num w:numId="12" w16cid:durableId="1163084693">
+  <w:num w:numId="12" w16cid:durableId="1295939406">
     <w:abstractNumId w:val="7"/>
     <w:lvlOverride w:ilvl="0">
       <w:startOverride w:val="1"/>
     </w:lvlOverride>
   </w:num>
-  <w:num w:numId="13" w16cid:durableId="381561609">
+  <w:num w:numId="13" w16cid:durableId="505364116">
     <w:abstractNumId w:val="7"/>
     <w:lvlOverride w:ilvl="0">
       <w:startOverride w:val="1"/>
     </w:lvlOverride>
   </w:num>
-  <w:num w:numId="14" w16cid:durableId="1692292084">
+  <w:num w:numId="14" w16cid:durableId="1221400811">
     <w:abstractNumId w:val="7"/>
     <w:lvlOverride w:ilvl="0">
       <w:startOverride w:val="1"/>
     </w:lvlOverride>
   </w:num>
-  <w:num w:numId="15" w16cid:durableId="1639845155">
+  <w:num w:numId="15" w16cid:durableId="179854616">
     <w:abstractNumId w:val="7"/>
     <w:lvlOverride w:ilvl="0">
       <w:startOverride w:val="1"/>
     </w:lvlOverride>
   </w:num>
-  <w:num w:numId="16" w16cid:durableId="685789655">
+  <w:num w:numId="16" w16cid:durableId="827598313">
     <w:abstractNumId w:val="7"/>
     <w:lvlOverride w:ilvl="0">
       <w:startOverride w:val="1"/>
     </w:lvlOverride>
   </w:num>
-  <w:num w:numId="17" w16cid:durableId="1770655723">
+  <w:num w:numId="17" w16cid:durableId="339240626">
     <w:abstractNumId w:val="7"/>
     <w:lvlOverride w:ilvl="0">
       <w:startOverride w:val="1"/>

</xml_diff>

<commit_message>
Round 20ba: three 2025 corpora (UAVIDS-2025, GeNIS, IDS2025); thirteen-corpus vintage and sources table
</commit_message>
<xml_diff>
--- a/重构版论文_v4_20260915/English_SCI_Manuscript_v4.docx
+++ b/重构版论文_v4_20260915/English_SCI_Manuscript_v4.docx
@@ -1039,7 +1039,7 @@
           <w:noProof/>
         </w:rPr>
         <w:drawing>
-          <wp:inline distT="0" distB="0" distL="0" distR="0" wp14:anchorId="19F356D0" wp14:editId="27561A0B">
+          <wp:inline distT="0" distB="0" distL="0" distR="0" wp14:anchorId="4BE3563B" wp14:editId="6B7001ED">
             <wp:extent cx="5760720" cy="2734826"/>
             <wp:effectExtent l="0" t="0" r="0" b="0"/>
             <wp:docPr id="1" name="Picture 1"/>
@@ -2426,7 +2426,7 @@
           <w:noProof/>
         </w:rPr>
         <w:drawing>
-          <wp:inline distT="0" distB="0" distL="0" distR="0" wp14:anchorId="2D31DF7B" wp14:editId="6D573019">
+          <wp:inline distT="0" distB="0" distL="0" distR="0" wp14:anchorId="4306E1E6" wp14:editId="7A1517AE">
             <wp:extent cx="5760720" cy="2722098"/>
             <wp:effectExtent l="0" t="0" r="0" b="0"/>
             <wp:docPr id="2" name="Picture 2"/>
@@ -3419,7 +3419,7 @@
           <w:noProof/>
         </w:rPr>
         <w:drawing>
-          <wp:inline distT="0" distB="0" distL="0" distR="0" wp14:anchorId="44DD14AF" wp14:editId="706F6319">
+          <wp:inline distT="0" distB="0" distL="0" distR="0" wp14:anchorId="163A7A54" wp14:editId="5C73B5C4">
             <wp:extent cx="5760720" cy="3482709"/>
             <wp:effectExtent l="0" t="0" r="0" b="0"/>
             <wp:docPr id="3" name="Picture 3"/>
@@ -7205,7 +7205,7 @@
           <w:noProof/>
         </w:rPr>
         <w:drawing>
-          <wp:inline distT="0" distB="0" distL="0" distR="0" wp14:anchorId="7C39BB00" wp14:editId="4DC7F831">
+          <wp:inline distT="0" distB="0" distL="0" distR="0" wp14:anchorId="5E110475" wp14:editId="4DE4D7B1">
             <wp:extent cx="5760720" cy="2356272"/>
             <wp:effectExtent l="0" t="0" r="0" b="0"/>
             <wp:docPr id="4" name="Picture 4"/>
@@ -8168,7 +8168,7 @@
           <w:noProof/>
         </w:rPr>
         <w:drawing>
-          <wp:inline distT="0" distB="0" distL="0" distR="0" wp14:anchorId="0B89601F" wp14:editId="30394374">
+          <wp:inline distT="0" distB="0" distL="0" distR="0" wp14:anchorId="5F337D50" wp14:editId="555B4200">
             <wp:extent cx="5760720" cy="2045294"/>
             <wp:effectExtent l="0" t="0" r="0" b="0"/>
             <wp:docPr id="5" name="Picture 5"/>
@@ -8346,7 +8346,7 @@
           <w:noProof/>
         </w:rPr>
         <w:drawing>
-          <wp:inline distT="0" distB="0" distL="0" distR="0" wp14:anchorId="1FDD89D7" wp14:editId="10FDC8A3">
+          <wp:inline distT="0" distB="0" distL="0" distR="0" wp14:anchorId="28FFCEF8" wp14:editId="78B3D92E">
             <wp:extent cx="5760720" cy="2308234"/>
             <wp:effectExtent l="0" t="0" r="0" b="0"/>
             <wp:docPr id="6" name="Picture 6"/>
@@ -9078,7 +9078,7 @@
           <w:noProof/>
         </w:rPr>
         <w:drawing>
-          <wp:inline distT="0" distB="0" distL="0" distR="0" wp14:anchorId="7306CC49" wp14:editId="66D7F9C3">
+          <wp:inline distT="0" distB="0" distL="0" distR="0" wp14:anchorId="269FB8CB" wp14:editId="5880F99E">
             <wp:extent cx="5760720" cy="2167923"/>
             <wp:effectExtent l="0" t="0" r="0" b="0"/>
             <wp:docPr id="7" name="Picture 7"/>
@@ -9257,7 +9257,7 @@
           <w:noProof/>
         </w:rPr>
         <w:drawing>
-          <wp:inline distT="0" distB="0" distL="0" distR="0" wp14:anchorId="0695A7C1" wp14:editId="36513888">
+          <wp:inline distT="0" distB="0" distL="0" distR="0" wp14:anchorId="66F5133D" wp14:editId="62EFFA21">
             <wp:extent cx="5760720" cy="2258878"/>
             <wp:effectExtent l="0" t="0" r="0" b="0"/>
             <wp:docPr id="8" name="Picture 8"/>
@@ -9441,7 +9441,7 @@
           <w:noProof/>
         </w:rPr>
         <w:drawing>
-          <wp:inline distT="0" distB="0" distL="0" distR="0" wp14:anchorId="64F293B1" wp14:editId="4918E8C8">
+          <wp:inline distT="0" distB="0" distL="0" distR="0" wp14:anchorId="2B5B9E34" wp14:editId="74D0FF0A">
             <wp:extent cx="5760720" cy="2516852"/>
             <wp:effectExtent l="0" t="0" r="0" b="0"/>
             <wp:docPr id="9" name="Picture 9"/>
@@ -9578,7 +9578,7 @@
           <w:noProof/>
         </w:rPr>
         <w:drawing>
-          <wp:inline distT="0" distB="0" distL="0" distR="0" wp14:anchorId="5BA727AE" wp14:editId="36AA350C">
+          <wp:inline distT="0" distB="0" distL="0" distR="0" wp14:anchorId="10D50DC9" wp14:editId="587E81E7">
             <wp:extent cx="5760720" cy="2223311"/>
             <wp:effectExtent l="0" t="0" r="0" b="0"/>
             <wp:docPr id="10" name="Picture 10"/>
@@ -9665,7 +9665,7 @@
         </w:rPr>
         <w:lastRenderedPageBreak/>
         <w:drawing>
-          <wp:inline distT="0" distB="0" distL="0" distR="0" wp14:anchorId="3AC1EA59" wp14:editId="3C481BC5">
+          <wp:inline distT="0" distB="0" distL="0" distR="0" wp14:anchorId="084A695E" wp14:editId="29B8E496">
             <wp:extent cx="5760720" cy="2538527"/>
             <wp:effectExtent l="0" t="0" r="0" b="0"/>
             <wp:docPr id="11" name="Picture 11"/>
@@ -10618,10 +10618,10 @@
         <w:t>Corpus vintage.</w:t>
       </w:r>
       <w:r>
-        <w:t xml:space="preserve"> The ten corpora span 1998-2023, and five of them were released in 2020 or later: LITNET-2020, IoT-23 (both 2020), RT-IoT2022 (2022), ACI-IoT-2023 and CIC-IoT-2023. On each of the five the gate is indistinguishable from the equal-weight fusion of the same members: the differences are +0.000000 (LITNET-2020), +0.000000 (IoT-23), +0.000235 (RT-IoT2022), +0.000000 (ACI-IoT-2023) and +0.000028 (CIC-IoT-2023), against Macro-F1 levels of 0.999, 0.985, 0.940, 0.778 and 0.752. The 2020-2023 corpora are therefore no</w:t>
-      </w:r>
-      <w:r>
-        <w:t>t only newer but also more difficult than the 2017 data, and the aggregation-rule conclusion does not depend on the vintage of the source corpus. Corpora released in 2024-2025 are distributed behind request forms; the preparation and evaluation scripts are released so they can be added under the same protocol.</w:t>
+        <w:t xml:space="preserve"> The thirteen corpora span 1998-2025; eight of them were released in 2020 or later (LITNET-2020, IoT-23, RT-IoT2022, ACI-IoT-2023, CIC-IoT-2023, and three published in 2025: UAVIDS-2025, GeNIS, IDS2025). On the 2020-2023 group the gate is indistinguishable from the equal-weight fusion of the same members: the differences are +0.000000 (LITNET-2020), +0.000000 (IoT-23), +0.000235 (RT-IoT2022), +0.000000 (ACI-IoT-2023) and +0.000028 (CIC-IoT-2023), against Macro-F1 levels of 0.999, 0.985, 0.940, 0.778 and 0.7</w:t>
+      </w:r>
+      <w:r>
+        <w:t>52. The three corpora published in 2025 reproduce the same result over 5, 4 and 7 classes, with a same-members difference of +0.000000 on each, against Macro-F1 levels of 0.9449 (UAVIDS-2025), 0.9999 (GeNIS) and 0.9750 (IDS2025). The newer corpora therefore do not sit at a single difficulty level, and the aggregation-rule conclusion does not depend on the vintage of the source corpus.</w:t>
       </w:r>
     </w:p>
     <w:p>
@@ -11710,13 +11710,16 @@
         <w:rPr>
           <w:b/>
         </w:rPr>
-        <w:t>Ten corpora were evaluated, and every corpus comes from one collection programme.</w:t>
-      </w:r>
-      <w:r>
-        <w:t xml:space="preserve"> The conclusions are conditional on CIC-IDS2017 (capped populations and the full deduplicated corpus), NSL-KDD, UNSW-NB15 and N-BaIoT; CIC-IDS2018 and CIC-IoT-2023 were added as extension corpora (Section 5.8) and reproduce the primary comparison. N-BaIoT is saturated for flow-feature classifiers (every model at or above 0.9998 Macro-F1), so it probes the mechanics of the aggregation step rather than discrimination difficulty, and the external datasets remain independent native-label benchmarks rather than </w:t>
-      </w:r>
-      <w:r>
-        <w:t>transfer tests. None of the six represents production traffic. A day-level split of CIC-IDS2017 is constructible, but every capture day carries only a subset of the five classes (Monday Normal only; Tuesday Normal and Brute Force; Wednesday Normal and DoS/DDoS; Thursday adds Web Attack; Friday adds Bot), so it is not category-complete: the measured day-holdout Macro-F1 collapses to 0.13-0.32 across the five days, which is what that limitation now quantifies.</w:t>
+        <w:t>Thirteen corpora were evaluated, and every corpus comes from one collection programme.</w:t>
+      </w:r>
+      <w:r>
+        <w:t xml:space="preserve"> The conclusions are conditional on CIC-IDS2017 (capped populations and the full deduplicated corpus), NSL-KDD, UNSW-NB15 and N-BaIoT; CIC-IDS2018, CIC-IoT-2023, LITNET-2020, IoT-23, RT-IoT2022, ACI-IoT-2023 and the three 2025 corpora (UAVIDS-2025, GeNIS, IDS2025) were added as extension corpora (Section 5.8) and reproduce the primary comparison. N-BaIoT is saturated for flow-feature classifiers (every model at or above 0.9998 Macro-F1), so it probes the mechanics of the aggregation step rather than discrim</w:t>
+      </w:r>
+      <w:r>
+        <w:t xml:space="preserve">ination difficulty, and the external datasets remain independent native-label benchmarks rather than transfer tests. None of the thirteen represents production traffic. A day-level split of CIC-IDS2017 is constructible, but every capture day carries only a subset of the five classes (Monday Normal only; Tuesday Normal and Brute Force; Wednesday Normal and DoS/DDoS; Thursday adds Web Attack; Friday adds Bot), so it is not category-complete: the measured day-holdout Macro-F1 collapses to 0.13-0.32 across the </w:t>
+      </w:r>
+      <w:r>
+        <w:t>five days, which is what that limitation now quantifies.</w:t>
       </w:r>
     </w:p>
     <w:p>
@@ -13849,76 +13852,76 @@
       </w:rPr>
     </w:lvl>
   </w:abstractNum>
-  <w:num w:numId="1" w16cid:durableId="2071149961">
+  <w:num w:numId="1" w16cid:durableId="838157695">
     <w:abstractNumId w:val="8"/>
   </w:num>
-  <w:num w:numId="2" w16cid:durableId="1065836794">
+  <w:num w:numId="2" w16cid:durableId="44762261">
     <w:abstractNumId w:val="6"/>
   </w:num>
-  <w:num w:numId="3" w16cid:durableId="863707562">
+  <w:num w:numId="3" w16cid:durableId="271016214">
     <w:abstractNumId w:val="5"/>
   </w:num>
-  <w:num w:numId="4" w16cid:durableId="1257012700">
+  <w:num w:numId="4" w16cid:durableId="1406488220">
     <w:abstractNumId w:val="4"/>
   </w:num>
-  <w:num w:numId="5" w16cid:durableId="777869390">
+  <w:num w:numId="5" w16cid:durableId="1670063909">
     <w:abstractNumId w:val="7"/>
   </w:num>
-  <w:num w:numId="6" w16cid:durableId="36853969">
+  <w:num w:numId="6" w16cid:durableId="303122945">
     <w:abstractNumId w:val="3"/>
   </w:num>
-  <w:num w:numId="7" w16cid:durableId="1568295080">
+  <w:num w:numId="7" w16cid:durableId="1980841954">
     <w:abstractNumId w:val="2"/>
   </w:num>
-  <w:num w:numId="8" w16cid:durableId="1228569520">
+  <w:num w:numId="8" w16cid:durableId="1163736337">
     <w:abstractNumId w:val="1"/>
   </w:num>
-  <w:num w:numId="9" w16cid:durableId="362286810">
+  <w:num w:numId="9" w16cid:durableId="392508747">
     <w:abstractNumId w:val="0"/>
   </w:num>
-  <w:num w:numId="10" w16cid:durableId="2065715276">
+  <w:num w:numId="10" w16cid:durableId="2123374808">
     <w:abstractNumId w:val="7"/>
     <w:lvlOverride w:ilvl="0">
       <w:startOverride w:val="1"/>
     </w:lvlOverride>
   </w:num>
-  <w:num w:numId="11" w16cid:durableId="2001031755">
+  <w:num w:numId="11" w16cid:durableId="1238368540">
     <w:abstractNumId w:val="7"/>
     <w:lvlOverride w:ilvl="0">
       <w:startOverride w:val="1"/>
     </w:lvlOverride>
   </w:num>
-  <w:num w:numId="12" w16cid:durableId="1295939406">
+  <w:num w:numId="12" w16cid:durableId="765423697">
     <w:abstractNumId w:val="7"/>
     <w:lvlOverride w:ilvl="0">
       <w:startOverride w:val="1"/>
     </w:lvlOverride>
   </w:num>
-  <w:num w:numId="13" w16cid:durableId="505364116">
+  <w:num w:numId="13" w16cid:durableId="455638696">
     <w:abstractNumId w:val="7"/>
     <w:lvlOverride w:ilvl="0">
       <w:startOverride w:val="1"/>
     </w:lvlOverride>
   </w:num>
-  <w:num w:numId="14" w16cid:durableId="1221400811">
+  <w:num w:numId="14" w16cid:durableId="1924214436">
     <w:abstractNumId w:val="7"/>
     <w:lvlOverride w:ilvl="0">
       <w:startOverride w:val="1"/>
     </w:lvlOverride>
   </w:num>
-  <w:num w:numId="15" w16cid:durableId="179854616">
+  <w:num w:numId="15" w16cid:durableId="1061556897">
     <w:abstractNumId w:val="7"/>
     <w:lvlOverride w:ilvl="0">
       <w:startOverride w:val="1"/>
     </w:lvlOverride>
   </w:num>
-  <w:num w:numId="16" w16cid:durableId="827598313">
+  <w:num w:numId="16" w16cid:durableId="1558008859">
     <w:abstractNumId w:val="7"/>
     <w:lvlOverride w:ilvl="0">
       <w:startOverride w:val="1"/>
     </w:lvlOverride>
   </w:num>
-  <w:num w:numId="17" w16cid:durableId="339240626">
+  <w:num w:numId="17" w16cid:durableId="1326324010">
     <w:abstractNumId w:val="7"/>
     <w:lvlOverride w:ilvl="0">
       <w:startOverride w:val="1"/>

</xml_diff>

<commit_message>
Round 20bc: run every extension corpus on the standard ten seeds and re-render the quoted numbers
</commit_message>
<xml_diff>
--- a/重构版论文_v4_20260915/English_SCI_Manuscript_v4.docx
+++ b/重构版论文_v4_20260915/English_SCI_Manuscript_v4.docx
@@ -1039,7 +1039,7 @@
           <w:noProof/>
         </w:rPr>
         <w:drawing>
-          <wp:inline distT="0" distB="0" distL="0" distR="0" wp14:anchorId="4BE3563B" wp14:editId="6B7001ED">
+          <wp:inline distT="0" distB="0" distL="0" distR="0" wp14:anchorId="0A8D067E" wp14:editId="5F3ED707">
             <wp:extent cx="5760720" cy="2734826"/>
             <wp:effectExtent l="0" t="0" r="0" b="0"/>
             <wp:docPr id="1" name="Picture 1"/>
@@ -2426,7 +2426,7 @@
           <w:noProof/>
         </w:rPr>
         <w:drawing>
-          <wp:inline distT="0" distB="0" distL="0" distR="0" wp14:anchorId="4306E1E6" wp14:editId="7A1517AE">
+          <wp:inline distT="0" distB="0" distL="0" distR="0" wp14:anchorId="08CC1DC9" wp14:editId="199F4D43">
             <wp:extent cx="5760720" cy="2722098"/>
             <wp:effectExtent l="0" t="0" r="0" b="0"/>
             <wp:docPr id="2" name="Picture 2"/>
@@ -3419,7 +3419,7 @@
           <w:noProof/>
         </w:rPr>
         <w:drawing>
-          <wp:inline distT="0" distB="0" distL="0" distR="0" wp14:anchorId="163A7A54" wp14:editId="5C73B5C4">
+          <wp:inline distT="0" distB="0" distL="0" distR="0" wp14:anchorId="0F63C162" wp14:editId="00FE8F5E">
             <wp:extent cx="5760720" cy="3482709"/>
             <wp:effectExtent l="0" t="0" r="0" b="0"/>
             <wp:docPr id="3" name="Picture 3"/>
@@ -7205,7 +7205,7 @@
           <w:noProof/>
         </w:rPr>
         <w:drawing>
-          <wp:inline distT="0" distB="0" distL="0" distR="0" wp14:anchorId="5E110475" wp14:editId="4DE4D7B1">
+          <wp:inline distT="0" distB="0" distL="0" distR="0" wp14:anchorId="40CEB68E" wp14:editId="553E4246">
             <wp:extent cx="5760720" cy="2356272"/>
             <wp:effectExtent l="0" t="0" r="0" b="0"/>
             <wp:docPr id="4" name="Picture 4"/>
@@ -8168,7 +8168,7 @@
           <w:noProof/>
         </w:rPr>
         <w:drawing>
-          <wp:inline distT="0" distB="0" distL="0" distR="0" wp14:anchorId="5F337D50" wp14:editId="555B4200">
+          <wp:inline distT="0" distB="0" distL="0" distR="0" wp14:anchorId="508150D2" wp14:editId="0C065685">
             <wp:extent cx="5760720" cy="2045294"/>
             <wp:effectExtent l="0" t="0" r="0" b="0"/>
             <wp:docPr id="5" name="Picture 5"/>
@@ -8346,7 +8346,7 @@
           <w:noProof/>
         </w:rPr>
         <w:drawing>
-          <wp:inline distT="0" distB="0" distL="0" distR="0" wp14:anchorId="28FFCEF8" wp14:editId="78B3D92E">
+          <wp:inline distT="0" distB="0" distL="0" distR="0" wp14:anchorId="6A31D1B4" wp14:editId="1446D8BC">
             <wp:extent cx="5760720" cy="2308234"/>
             <wp:effectExtent l="0" t="0" r="0" b="0"/>
             <wp:docPr id="6" name="Picture 6"/>
@@ -9078,7 +9078,7 @@
           <w:noProof/>
         </w:rPr>
         <w:drawing>
-          <wp:inline distT="0" distB="0" distL="0" distR="0" wp14:anchorId="269FB8CB" wp14:editId="5880F99E">
+          <wp:inline distT="0" distB="0" distL="0" distR="0" wp14:anchorId="7CF55ED0" wp14:editId="6C434C71">
             <wp:extent cx="5760720" cy="2167923"/>
             <wp:effectExtent l="0" t="0" r="0" b="0"/>
             <wp:docPr id="7" name="Picture 7"/>
@@ -9257,7 +9257,7 @@
           <w:noProof/>
         </w:rPr>
         <w:drawing>
-          <wp:inline distT="0" distB="0" distL="0" distR="0" wp14:anchorId="66F5133D" wp14:editId="62EFFA21">
+          <wp:inline distT="0" distB="0" distL="0" distR="0" wp14:anchorId="6CD8870E" wp14:editId="49C2159A">
             <wp:extent cx="5760720" cy="2258878"/>
             <wp:effectExtent l="0" t="0" r="0" b="0"/>
             <wp:docPr id="8" name="Picture 8"/>
@@ -9441,7 +9441,7 @@
           <w:noProof/>
         </w:rPr>
         <w:drawing>
-          <wp:inline distT="0" distB="0" distL="0" distR="0" wp14:anchorId="2B5B9E34" wp14:editId="74D0FF0A">
+          <wp:inline distT="0" distB="0" distL="0" distR="0" wp14:anchorId="35C395FA" wp14:editId="2B5D7A47">
             <wp:extent cx="5760720" cy="2516852"/>
             <wp:effectExtent l="0" t="0" r="0" b="0"/>
             <wp:docPr id="9" name="Picture 9"/>
@@ -9578,7 +9578,7 @@
           <w:noProof/>
         </w:rPr>
         <w:drawing>
-          <wp:inline distT="0" distB="0" distL="0" distR="0" wp14:anchorId="10D50DC9" wp14:editId="587E81E7">
+          <wp:inline distT="0" distB="0" distL="0" distR="0" wp14:anchorId="3C28C332" wp14:editId="02D520FF">
             <wp:extent cx="5760720" cy="2223311"/>
             <wp:effectExtent l="0" t="0" r="0" b="0"/>
             <wp:docPr id="10" name="Picture 10"/>
@@ -9665,7 +9665,7 @@
         </w:rPr>
         <w:lastRenderedPageBreak/>
         <w:drawing>
-          <wp:inline distT="0" distB="0" distL="0" distR="0" wp14:anchorId="084A695E" wp14:editId="29B8E496">
+          <wp:inline distT="0" distB="0" distL="0" distR="0" wp14:anchorId="455F8338" wp14:editId="7C39D81B">
             <wp:extent cx="5760720" cy="2538527"/>
             <wp:effectExtent l="0" t="0" r="0" b="0"/>
             <wp:docPr id="11" name="Picture 11"/>
@@ -10596,7 +10596,7 @@
         <w:t>Two further corpora.</w:t>
       </w:r>
       <w:r>
-        <w:t xml:space="preserve"> CIC-IDS2018 (16.2 M raw rows, 4.10 M duplicates removed) gives a 56,055/12,012/12,012 five-class benchmark on which the gate and the same-members equal fusion are identical across five seeds (0.964124, zero labels changed). CIC-IoT-2023 (38.4 M rows, eight coarse classes) gives 0.752375 for the gate against 0.752347 for the same-members fusion over three seeds - a +0.000028 difference. Both reproduce the primary finding on corpora the study had not used.</w:t>
+        <w:t xml:space="preserve"> CIC-IDS2018 (16.2 M raw rows, 4.10 M duplicates removed) gives a 56,055/12,012/12,012 five-class benchmark on which the gate and the same-members equal fusion are identical across ten seeds (0.955231, zero labels changed). CIC-IoT-2023 (38.4 M rows, eight coarse classes) gives 0.751051 for the gate against 0.751054 for the same-members fusion over ten seeds - a -0.000004 difference. Both reproduce the primary finding on corpora the study had not used.</w:t>
       </w:r>
     </w:p>
     <w:p>
@@ -10618,10 +10618,10 @@
         <w:t>Corpus vintage.</w:t>
       </w:r>
       <w:r>
-        <w:t xml:space="preserve"> The thirteen corpora span 1998-2025; eight of them were released in 2020 or later (LITNET-2020, IoT-23, RT-IoT2022, ACI-IoT-2023, CIC-IoT-2023, and three published in 2025: UAVIDS-2025, GeNIS, IDS2025). On the 2020-2023 group the gate is indistinguishable from the equal-weight fusion of the same members: the differences are +0.000000 (LITNET-2020), +0.000000 (IoT-23), +0.000235 (RT-IoT2022), +0.000000 (ACI-IoT-2023) and +0.000028 (CIC-IoT-2023), against Macro-F1 levels of 0.999, 0.985, 0.940, 0.778 and 0.7</w:t>
-      </w:r>
-      <w:r>
-        <w:t>52. The three corpora published in 2025 reproduce the same result over 5, 4 and 7 classes, with a same-members difference of +0.000000 on each, against Macro-F1 levels of 0.9449 (UAVIDS-2025), 0.9999 (GeNIS) and 0.9750 (IDS2025). The newer corpora therefore do not sit at a single difficulty level, and the aggregation-rule conclusion does not depend on the vintage of the source corpus.</w:t>
+        <w:t xml:space="preserve"> The thirteen corpora span 1998-2025; eight of them were released in 2020 or later (LITNET-2020, IoT-23, RT-IoT2022, ACI-IoT-2023, CIC-IoT-2023, and three published in 2025: UAVIDS-2025, GeNIS, IDS2025). Every extension corpus now runs on the same ten seeds as the main experiments. On the 2020-2023 group the gate is indistinguishable from the equal-weight fusion of the same members: the differences are +0.000000 (LITNET-2020), +0.000000 (IoT-23), +0.000071 (RT-IoT2022), +0.000004 (ACI-IoT-2023) and -0.00000</w:t>
+      </w:r>
+      <w:r>
+        <w:t>4 (CIC-IoT-2023), against Macro-F1 levels of 0.999, 0.985, 0.939, 0.778 and 0.751. The three corpora published in 2025 reproduce the same result over 5, 4 and 7 classes, with same-members differences of +0.000020 (UAVIDS-2025), +0.000000 (GeNIS) and +0.000016 (IDS2025), against Macro-F1 levels of 0.9450, 0.9999 and 0.9810. The newer corpora therefore do not sit at a single difficulty level, and the aggregation-rule conclusion does not depend on the vintage of the source corpus.</w:t>
       </w:r>
     </w:p>
     <w:p>
@@ -13852,76 +13852,76 @@
       </w:rPr>
     </w:lvl>
   </w:abstractNum>
-  <w:num w:numId="1" w16cid:durableId="838157695">
+  <w:num w:numId="1" w16cid:durableId="1303580753">
     <w:abstractNumId w:val="8"/>
   </w:num>
-  <w:num w:numId="2" w16cid:durableId="44762261">
+  <w:num w:numId="2" w16cid:durableId="792596013">
     <w:abstractNumId w:val="6"/>
   </w:num>
-  <w:num w:numId="3" w16cid:durableId="271016214">
+  <w:num w:numId="3" w16cid:durableId="555894225">
     <w:abstractNumId w:val="5"/>
   </w:num>
-  <w:num w:numId="4" w16cid:durableId="1406488220">
+  <w:num w:numId="4" w16cid:durableId="1725328136">
     <w:abstractNumId w:val="4"/>
   </w:num>
-  <w:num w:numId="5" w16cid:durableId="1670063909">
+  <w:num w:numId="5" w16cid:durableId="1094521924">
     <w:abstractNumId w:val="7"/>
   </w:num>
-  <w:num w:numId="6" w16cid:durableId="303122945">
+  <w:num w:numId="6" w16cid:durableId="534512626">
     <w:abstractNumId w:val="3"/>
   </w:num>
-  <w:num w:numId="7" w16cid:durableId="1980841954">
+  <w:num w:numId="7" w16cid:durableId="1262303439">
     <w:abstractNumId w:val="2"/>
   </w:num>
-  <w:num w:numId="8" w16cid:durableId="1163736337">
+  <w:num w:numId="8" w16cid:durableId="1294554478">
     <w:abstractNumId w:val="1"/>
   </w:num>
-  <w:num w:numId="9" w16cid:durableId="392508747">
+  <w:num w:numId="9" w16cid:durableId="1323120872">
     <w:abstractNumId w:val="0"/>
   </w:num>
-  <w:num w:numId="10" w16cid:durableId="2123374808">
+  <w:num w:numId="10" w16cid:durableId="1089547245">
     <w:abstractNumId w:val="7"/>
     <w:lvlOverride w:ilvl="0">
       <w:startOverride w:val="1"/>
     </w:lvlOverride>
   </w:num>
-  <w:num w:numId="11" w16cid:durableId="1238368540">
+  <w:num w:numId="11" w16cid:durableId="534195171">
     <w:abstractNumId w:val="7"/>
     <w:lvlOverride w:ilvl="0">
       <w:startOverride w:val="1"/>
     </w:lvlOverride>
   </w:num>
-  <w:num w:numId="12" w16cid:durableId="765423697">
+  <w:num w:numId="12" w16cid:durableId="996689027">
     <w:abstractNumId w:val="7"/>
     <w:lvlOverride w:ilvl="0">
       <w:startOverride w:val="1"/>
     </w:lvlOverride>
   </w:num>
-  <w:num w:numId="13" w16cid:durableId="455638696">
+  <w:num w:numId="13" w16cid:durableId="1142038557">
     <w:abstractNumId w:val="7"/>
     <w:lvlOverride w:ilvl="0">
       <w:startOverride w:val="1"/>
     </w:lvlOverride>
   </w:num>
-  <w:num w:numId="14" w16cid:durableId="1924214436">
+  <w:num w:numId="14" w16cid:durableId="1983463491">
     <w:abstractNumId w:val="7"/>
     <w:lvlOverride w:ilvl="0">
       <w:startOverride w:val="1"/>
     </w:lvlOverride>
   </w:num>
-  <w:num w:numId="15" w16cid:durableId="1061556897">
+  <w:num w:numId="15" w16cid:durableId="507794998">
     <w:abstractNumId w:val="7"/>
     <w:lvlOverride w:ilvl="0">
       <w:startOverride w:val="1"/>
     </w:lvlOverride>
   </w:num>
-  <w:num w:numId="16" w16cid:durableId="1558008859">
+  <w:num w:numId="16" w16cid:durableId="1452284557">
     <w:abstractNumId w:val="7"/>
     <w:lvlOverride w:ilvl="0">
       <w:startOverride w:val="1"/>
     </w:lvlOverride>
   </w:num>
-  <w:num w:numId="17" w16cid:durableId="1326324010">
+  <w:num w:numId="17" w16cid:durableId="1418206777">
     <w:abstractNumId w:val="7"/>
     <w:lvlOverride w:ilvl="0">
       <w:startOverride w:val="1"/>

</xml_diff>

<commit_message>
Round 20bd: repair the extension-set counts (report header six->eight, Section 5.8 five->six, bundle README)
</commit_message>
<xml_diff>
--- a/重构版论文_v4_20260915/English_SCI_Manuscript_v4.docx
+++ b/重构版论文_v4_20260915/English_SCI_Manuscript_v4.docx
@@ -1039,7 +1039,7 @@
           <w:noProof/>
         </w:rPr>
         <w:drawing>
-          <wp:inline distT="0" distB="0" distL="0" distR="0" wp14:anchorId="0A8D067E" wp14:editId="5F3ED707">
+          <wp:inline distT="0" distB="0" distL="0" distR="0" wp14:anchorId="2BCCAED6" wp14:editId="665C2494">
             <wp:extent cx="5760720" cy="2734826"/>
             <wp:effectExtent l="0" t="0" r="0" b="0"/>
             <wp:docPr id="1" name="Picture 1"/>
@@ -2426,7 +2426,7 @@
           <w:noProof/>
         </w:rPr>
         <w:drawing>
-          <wp:inline distT="0" distB="0" distL="0" distR="0" wp14:anchorId="08CC1DC9" wp14:editId="199F4D43">
+          <wp:inline distT="0" distB="0" distL="0" distR="0" wp14:anchorId="77F41DA0" wp14:editId="6B21777D">
             <wp:extent cx="5760720" cy="2722098"/>
             <wp:effectExtent l="0" t="0" r="0" b="0"/>
             <wp:docPr id="2" name="Picture 2"/>
@@ -3419,7 +3419,7 @@
           <w:noProof/>
         </w:rPr>
         <w:drawing>
-          <wp:inline distT="0" distB="0" distL="0" distR="0" wp14:anchorId="0F63C162" wp14:editId="00FE8F5E">
+          <wp:inline distT="0" distB="0" distL="0" distR="0" wp14:anchorId="7DF1D3B1" wp14:editId="4153330C">
             <wp:extent cx="5760720" cy="3482709"/>
             <wp:effectExtent l="0" t="0" r="0" b="0"/>
             <wp:docPr id="3" name="Picture 3"/>
@@ -7205,7 +7205,7 @@
           <w:noProof/>
         </w:rPr>
         <w:drawing>
-          <wp:inline distT="0" distB="0" distL="0" distR="0" wp14:anchorId="40CEB68E" wp14:editId="553E4246">
+          <wp:inline distT="0" distB="0" distL="0" distR="0" wp14:anchorId="2FDA360B" wp14:editId="6157FFF0">
             <wp:extent cx="5760720" cy="2356272"/>
             <wp:effectExtent l="0" t="0" r="0" b="0"/>
             <wp:docPr id="4" name="Picture 4"/>
@@ -8168,7 +8168,7 @@
           <w:noProof/>
         </w:rPr>
         <w:drawing>
-          <wp:inline distT="0" distB="0" distL="0" distR="0" wp14:anchorId="508150D2" wp14:editId="0C065685">
+          <wp:inline distT="0" distB="0" distL="0" distR="0" wp14:anchorId="08028005" wp14:editId="62F5ED85">
             <wp:extent cx="5760720" cy="2045294"/>
             <wp:effectExtent l="0" t="0" r="0" b="0"/>
             <wp:docPr id="5" name="Picture 5"/>
@@ -8346,7 +8346,7 @@
           <w:noProof/>
         </w:rPr>
         <w:drawing>
-          <wp:inline distT="0" distB="0" distL="0" distR="0" wp14:anchorId="6A31D1B4" wp14:editId="1446D8BC">
+          <wp:inline distT="0" distB="0" distL="0" distR="0" wp14:anchorId="0FA5FFE1" wp14:editId="6E56182D">
             <wp:extent cx="5760720" cy="2308234"/>
             <wp:effectExtent l="0" t="0" r="0" b="0"/>
             <wp:docPr id="6" name="Picture 6"/>
@@ -9078,7 +9078,7 @@
           <w:noProof/>
         </w:rPr>
         <w:drawing>
-          <wp:inline distT="0" distB="0" distL="0" distR="0" wp14:anchorId="7CF55ED0" wp14:editId="6C434C71">
+          <wp:inline distT="0" distB="0" distL="0" distR="0" wp14:anchorId="77EA7473" wp14:editId="78825496">
             <wp:extent cx="5760720" cy="2167923"/>
             <wp:effectExtent l="0" t="0" r="0" b="0"/>
             <wp:docPr id="7" name="Picture 7"/>
@@ -9257,7 +9257,7 @@
           <w:noProof/>
         </w:rPr>
         <w:drawing>
-          <wp:inline distT="0" distB="0" distL="0" distR="0" wp14:anchorId="6CD8870E" wp14:editId="49C2159A">
+          <wp:inline distT="0" distB="0" distL="0" distR="0" wp14:anchorId="3AF40597" wp14:editId="3E873883">
             <wp:extent cx="5760720" cy="2258878"/>
             <wp:effectExtent l="0" t="0" r="0" b="0"/>
             <wp:docPr id="8" name="Picture 8"/>
@@ -9441,7 +9441,7 @@
           <w:noProof/>
         </w:rPr>
         <w:drawing>
-          <wp:inline distT="0" distB="0" distL="0" distR="0" wp14:anchorId="35C395FA" wp14:editId="2B5D7A47">
+          <wp:inline distT="0" distB="0" distL="0" distR="0" wp14:anchorId="648FDE71" wp14:editId="7E55819E">
             <wp:extent cx="5760720" cy="2516852"/>
             <wp:effectExtent l="0" t="0" r="0" b="0"/>
             <wp:docPr id="9" name="Picture 9"/>
@@ -9578,7 +9578,7 @@
           <w:noProof/>
         </w:rPr>
         <w:drawing>
-          <wp:inline distT="0" distB="0" distL="0" distR="0" wp14:anchorId="3C28C332" wp14:editId="02D520FF">
+          <wp:inline distT="0" distB="0" distL="0" distR="0" wp14:anchorId="315A922B" wp14:editId="7AA65A8D">
             <wp:extent cx="5760720" cy="2223311"/>
             <wp:effectExtent l="0" t="0" r="0" b="0"/>
             <wp:docPr id="10" name="Picture 10"/>
@@ -9665,7 +9665,7 @@
         </w:rPr>
         <w:lastRenderedPageBreak/>
         <w:drawing>
-          <wp:inline distT="0" distB="0" distL="0" distR="0" wp14:anchorId="455F8338" wp14:editId="7C39D81B">
+          <wp:inline distT="0" distB="0" distL="0" distR="0" wp14:anchorId="5AECD8BE" wp14:editId="4B43E53D">
             <wp:extent cx="5760720" cy="2538527"/>
             <wp:effectExtent l="0" t="0" r="0" b="0"/>
             <wp:docPr id="11" name="Picture 11"/>
@@ -10537,7 +10537,7 @@
     </w:p>
     <w:p>
       <w:r>
-        <w:t>Five extensions probe the boundaries of the main result; their per-seed data and a standalone report ship with the release (</w:t>
+        <w:t>Six extensions probe the boundaries of the main result; their per-seed data and a standalone report ship with the release (</w:t>
       </w:r>
       <w:r>
         <w:t>扩展实验报告</w:t>
@@ -13852,76 +13852,76 @@
       </w:rPr>
     </w:lvl>
   </w:abstractNum>
-  <w:num w:numId="1" w16cid:durableId="1303580753">
+  <w:num w:numId="1" w16cid:durableId="2044210477">
     <w:abstractNumId w:val="8"/>
   </w:num>
-  <w:num w:numId="2" w16cid:durableId="792596013">
+  <w:num w:numId="2" w16cid:durableId="356081944">
     <w:abstractNumId w:val="6"/>
   </w:num>
-  <w:num w:numId="3" w16cid:durableId="555894225">
+  <w:num w:numId="3" w16cid:durableId="1406488310">
     <w:abstractNumId w:val="5"/>
   </w:num>
-  <w:num w:numId="4" w16cid:durableId="1725328136">
+  <w:num w:numId="4" w16cid:durableId="35812480">
     <w:abstractNumId w:val="4"/>
   </w:num>
-  <w:num w:numId="5" w16cid:durableId="1094521924">
+  <w:num w:numId="5" w16cid:durableId="475536117">
     <w:abstractNumId w:val="7"/>
   </w:num>
-  <w:num w:numId="6" w16cid:durableId="534512626">
+  <w:num w:numId="6" w16cid:durableId="1643848431">
     <w:abstractNumId w:val="3"/>
   </w:num>
-  <w:num w:numId="7" w16cid:durableId="1262303439">
+  <w:num w:numId="7" w16cid:durableId="31931176">
     <w:abstractNumId w:val="2"/>
   </w:num>
-  <w:num w:numId="8" w16cid:durableId="1294554478">
+  <w:num w:numId="8" w16cid:durableId="93481840">
     <w:abstractNumId w:val="1"/>
   </w:num>
-  <w:num w:numId="9" w16cid:durableId="1323120872">
+  <w:num w:numId="9" w16cid:durableId="1761245594">
     <w:abstractNumId w:val="0"/>
   </w:num>
-  <w:num w:numId="10" w16cid:durableId="1089547245">
+  <w:num w:numId="10" w16cid:durableId="787047469">
     <w:abstractNumId w:val="7"/>
     <w:lvlOverride w:ilvl="0">
       <w:startOverride w:val="1"/>
     </w:lvlOverride>
   </w:num>
-  <w:num w:numId="11" w16cid:durableId="534195171">
+  <w:num w:numId="11" w16cid:durableId="1920944446">
     <w:abstractNumId w:val="7"/>
     <w:lvlOverride w:ilvl="0">
       <w:startOverride w:val="1"/>
     </w:lvlOverride>
   </w:num>
-  <w:num w:numId="12" w16cid:durableId="996689027">
+  <w:num w:numId="12" w16cid:durableId="1817453426">
     <w:abstractNumId w:val="7"/>
     <w:lvlOverride w:ilvl="0">
       <w:startOverride w:val="1"/>
     </w:lvlOverride>
   </w:num>
-  <w:num w:numId="13" w16cid:durableId="1142038557">
+  <w:num w:numId="13" w16cid:durableId="310911918">
     <w:abstractNumId w:val="7"/>
     <w:lvlOverride w:ilvl="0">
       <w:startOverride w:val="1"/>
     </w:lvlOverride>
   </w:num>
-  <w:num w:numId="14" w16cid:durableId="1983463491">
+  <w:num w:numId="14" w16cid:durableId="1049106736">
     <w:abstractNumId w:val="7"/>
     <w:lvlOverride w:ilvl="0">
       <w:startOverride w:val="1"/>
     </w:lvlOverride>
   </w:num>
-  <w:num w:numId="15" w16cid:durableId="507794998">
+  <w:num w:numId="15" w16cid:durableId="778062401">
     <w:abstractNumId w:val="7"/>
     <w:lvlOverride w:ilvl="0">
       <w:startOverride w:val="1"/>
     </w:lvlOverride>
   </w:num>
-  <w:num w:numId="16" w16cid:durableId="1452284557">
+  <w:num w:numId="16" w16cid:durableId="1346637305">
     <w:abstractNumId w:val="7"/>
     <w:lvlOverride w:ilvl="0">
       <w:startOverride w:val="1"/>
     </w:lvlOverride>
   </w:num>
-  <w:num w:numId="17" w16cid:durableId="1418206777">
+  <w:num w:numId="17" w16cid:durableId="2097549647">
     <w:abstractNumId w:val="7"/>
     <w:lvlOverride w:ilvl="0">
       <w:startOverride w:val="1"/>

</xml_diff>

<commit_message>
Round 20be: briefings and deck now state the thirteen corpora, the 2025 evidence and a recency Q&A
</commit_message>
<xml_diff>
--- a/重构版论文_v4_20260915/English_SCI_Manuscript_v4.docx
+++ b/重构版论文_v4_20260915/English_SCI_Manuscript_v4.docx
@@ -1039,7 +1039,7 @@
           <w:noProof/>
         </w:rPr>
         <w:drawing>
-          <wp:inline distT="0" distB="0" distL="0" distR="0" wp14:anchorId="2BCCAED6" wp14:editId="665C2494">
+          <wp:inline distT="0" distB="0" distL="0" distR="0" wp14:anchorId="33AE1658" wp14:editId="389BFF44">
             <wp:extent cx="5760720" cy="2734826"/>
             <wp:effectExtent l="0" t="0" r="0" b="0"/>
             <wp:docPr id="1" name="Picture 1"/>
@@ -2426,7 +2426,7 @@
           <w:noProof/>
         </w:rPr>
         <w:drawing>
-          <wp:inline distT="0" distB="0" distL="0" distR="0" wp14:anchorId="77F41DA0" wp14:editId="6B21777D">
+          <wp:inline distT="0" distB="0" distL="0" distR="0" wp14:anchorId="539CB09D" wp14:editId="3D3059DE">
             <wp:extent cx="5760720" cy="2722098"/>
             <wp:effectExtent l="0" t="0" r="0" b="0"/>
             <wp:docPr id="2" name="Picture 2"/>
@@ -3419,7 +3419,7 @@
           <w:noProof/>
         </w:rPr>
         <w:drawing>
-          <wp:inline distT="0" distB="0" distL="0" distR="0" wp14:anchorId="7DF1D3B1" wp14:editId="4153330C">
+          <wp:inline distT="0" distB="0" distL="0" distR="0" wp14:anchorId="02F46388" wp14:editId="749B0FA0">
             <wp:extent cx="5760720" cy="3482709"/>
             <wp:effectExtent l="0" t="0" r="0" b="0"/>
             <wp:docPr id="3" name="Picture 3"/>
@@ -7205,7 +7205,7 @@
           <w:noProof/>
         </w:rPr>
         <w:drawing>
-          <wp:inline distT="0" distB="0" distL="0" distR="0" wp14:anchorId="2FDA360B" wp14:editId="6157FFF0">
+          <wp:inline distT="0" distB="0" distL="0" distR="0" wp14:anchorId="7BB3684E" wp14:editId="2CB580EF">
             <wp:extent cx="5760720" cy="2356272"/>
             <wp:effectExtent l="0" t="0" r="0" b="0"/>
             <wp:docPr id="4" name="Picture 4"/>
@@ -8168,7 +8168,7 @@
           <w:noProof/>
         </w:rPr>
         <w:drawing>
-          <wp:inline distT="0" distB="0" distL="0" distR="0" wp14:anchorId="08028005" wp14:editId="62F5ED85">
+          <wp:inline distT="0" distB="0" distL="0" distR="0" wp14:anchorId="4A200965" wp14:editId="4A1546DA">
             <wp:extent cx="5760720" cy="2045294"/>
             <wp:effectExtent l="0" t="0" r="0" b="0"/>
             <wp:docPr id="5" name="Picture 5"/>
@@ -8346,7 +8346,7 @@
           <w:noProof/>
         </w:rPr>
         <w:drawing>
-          <wp:inline distT="0" distB="0" distL="0" distR="0" wp14:anchorId="0FA5FFE1" wp14:editId="6E56182D">
+          <wp:inline distT="0" distB="0" distL="0" distR="0" wp14:anchorId="2D4BE6E6" wp14:editId="53E5C6E4">
             <wp:extent cx="5760720" cy="2308234"/>
             <wp:effectExtent l="0" t="0" r="0" b="0"/>
             <wp:docPr id="6" name="Picture 6"/>
@@ -9078,7 +9078,7 @@
           <w:noProof/>
         </w:rPr>
         <w:drawing>
-          <wp:inline distT="0" distB="0" distL="0" distR="0" wp14:anchorId="77EA7473" wp14:editId="78825496">
+          <wp:inline distT="0" distB="0" distL="0" distR="0" wp14:anchorId="310C01A7" wp14:editId="34A841EE">
             <wp:extent cx="5760720" cy="2167923"/>
             <wp:effectExtent l="0" t="0" r="0" b="0"/>
             <wp:docPr id="7" name="Picture 7"/>
@@ -9257,7 +9257,7 @@
           <w:noProof/>
         </w:rPr>
         <w:drawing>
-          <wp:inline distT="0" distB="0" distL="0" distR="0" wp14:anchorId="3AF40597" wp14:editId="3E873883">
+          <wp:inline distT="0" distB="0" distL="0" distR="0" wp14:anchorId="35F60E45" wp14:editId="3B8E397E">
             <wp:extent cx="5760720" cy="2258878"/>
             <wp:effectExtent l="0" t="0" r="0" b="0"/>
             <wp:docPr id="8" name="Picture 8"/>
@@ -9441,7 +9441,7 @@
           <w:noProof/>
         </w:rPr>
         <w:drawing>
-          <wp:inline distT="0" distB="0" distL="0" distR="0" wp14:anchorId="648FDE71" wp14:editId="7E55819E">
+          <wp:inline distT="0" distB="0" distL="0" distR="0" wp14:anchorId="5A407B1A" wp14:editId="76BF7699">
             <wp:extent cx="5760720" cy="2516852"/>
             <wp:effectExtent l="0" t="0" r="0" b="0"/>
             <wp:docPr id="9" name="Picture 9"/>
@@ -9578,7 +9578,7 @@
           <w:noProof/>
         </w:rPr>
         <w:drawing>
-          <wp:inline distT="0" distB="0" distL="0" distR="0" wp14:anchorId="315A922B" wp14:editId="7AA65A8D">
+          <wp:inline distT="0" distB="0" distL="0" distR="0" wp14:anchorId="2A35C9D6" wp14:editId="6C8CF320">
             <wp:extent cx="5760720" cy="2223311"/>
             <wp:effectExtent l="0" t="0" r="0" b="0"/>
             <wp:docPr id="10" name="Picture 10"/>
@@ -9665,7 +9665,7 @@
         </w:rPr>
         <w:lastRenderedPageBreak/>
         <w:drawing>
-          <wp:inline distT="0" distB="0" distL="0" distR="0" wp14:anchorId="5AECD8BE" wp14:editId="4B43E53D">
+          <wp:inline distT="0" distB="0" distL="0" distR="0" wp14:anchorId="76581167" wp14:editId="2BA08325">
             <wp:extent cx="5760720" cy="2538527"/>
             <wp:effectExtent l="0" t="0" r="0" b="0"/>
             <wp:docPr id="11" name="Picture 11"/>
@@ -13852,76 +13852,76 @@
       </w:rPr>
     </w:lvl>
   </w:abstractNum>
-  <w:num w:numId="1" w16cid:durableId="2044210477">
+  <w:num w:numId="1" w16cid:durableId="588080578">
     <w:abstractNumId w:val="8"/>
   </w:num>
-  <w:num w:numId="2" w16cid:durableId="356081944">
+  <w:num w:numId="2" w16cid:durableId="240140989">
     <w:abstractNumId w:val="6"/>
   </w:num>
-  <w:num w:numId="3" w16cid:durableId="1406488310">
+  <w:num w:numId="3" w16cid:durableId="1955212790">
     <w:abstractNumId w:val="5"/>
   </w:num>
-  <w:num w:numId="4" w16cid:durableId="35812480">
+  <w:num w:numId="4" w16cid:durableId="971134057">
     <w:abstractNumId w:val="4"/>
   </w:num>
-  <w:num w:numId="5" w16cid:durableId="475536117">
+  <w:num w:numId="5" w16cid:durableId="1659771677">
     <w:abstractNumId w:val="7"/>
   </w:num>
-  <w:num w:numId="6" w16cid:durableId="1643848431">
+  <w:num w:numId="6" w16cid:durableId="348146106">
     <w:abstractNumId w:val="3"/>
   </w:num>
-  <w:num w:numId="7" w16cid:durableId="31931176">
+  <w:num w:numId="7" w16cid:durableId="136337038">
     <w:abstractNumId w:val="2"/>
   </w:num>
-  <w:num w:numId="8" w16cid:durableId="93481840">
+  <w:num w:numId="8" w16cid:durableId="628316703">
     <w:abstractNumId w:val="1"/>
   </w:num>
-  <w:num w:numId="9" w16cid:durableId="1761245594">
+  <w:num w:numId="9" w16cid:durableId="427046490">
     <w:abstractNumId w:val="0"/>
   </w:num>
-  <w:num w:numId="10" w16cid:durableId="787047469">
+  <w:num w:numId="10" w16cid:durableId="108353088">
     <w:abstractNumId w:val="7"/>
     <w:lvlOverride w:ilvl="0">
       <w:startOverride w:val="1"/>
     </w:lvlOverride>
   </w:num>
-  <w:num w:numId="11" w16cid:durableId="1920944446">
+  <w:num w:numId="11" w16cid:durableId="821699667">
     <w:abstractNumId w:val="7"/>
     <w:lvlOverride w:ilvl="0">
       <w:startOverride w:val="1"/>
     </w:lvlOverride>
   </w:num>
-  <w:num w:numId="12" w16cid:durableId="1817453426">
+  <w:num w:numId="12" w16cid:durableId="255014955">
     <w:abstractNumId w:val="7"/>
     <w:lvlOverride w:ilvl="0">
       <w:startOverride w:val="1"/>
     </w:lvlOverride>
   </w:num>
-  <w:num w:numId="13" w16cid:durableId="310911918">
+  <w:num w:numId="13" w16cid:durableId="222377933">
     <w:abstractNumId w:val="7"/>
     <w:lvlOverride w:ilvl="0">
       <w:startOverride w:val="1"/>
     </w:lvlOverride>
   </w:num>
-  <w:num w:numId="14" w16cid:durableId="1049106736">
+  <w:num w:numId="14" w16cid:durableId="1160191832">
     <w:abstractNumId w:val="7"/>
     <w:lvlOverride w:ilvl="0">
       <w:startOverride w:val="1"/>
     </w:lvlOverride>
   </w:num>
-  <w:num w:numId="15" w16cid:durableId="778062401">
+  <w:num w:numId="15" w16cid:durableId="2005545447">
     <w:abstractNumId w:val="7"/>
     <w:lvlOverride w:ilvl="0">
       <w:startOverride w:val="1"/>
     </w:lvlOverride>
   </w:num>
-  <w:num w:numId="16" w16cid:durableId="1346637305">
+  <w:num w:numId="16" w16cid:durableId="1369531339">
     <w:abstractNumId w:val="7"/>
     <w:lvlOverride w:ilvl="0">
       <w:startOverride w:val="1"/>
     </w:lvlOverride>
   </w:num>
-  <w:num w:numId="17" w16cid:durableId="2097549647">
+  <w:num w:numId="17" w16cid:durableId="1207067442">
     <w:abstractNumId w:val="7"/>
     <w:lvlOverride w:ilvl="0">
       <w:startOverride w:val="1"/>

</xml_diff>

<commit_message>
Round 20bf: Gotham-2025 (packet-level, 18 classes) integrated - inert at the full budget, +0.0063 at 8/16 features
</commit_message>
<xml_diff>
--- a/重构版论文_v4_20260915/English_SCI_Manuscript_v4.docx
+++ b/重构版论文_v4_20260915/English_SCI_Manuscript_v4.docx
@@ -24,13 +24,13 @@
         <w:t>Reported differences between intrusion-detection models are sensitive to duplicate flows, conflicting labels, feature leakage and class priors. We test a widely adopted but rarely validated assumption: that fusing random-forest experts with sample-specific reliability weights (RCCF) beats equal voting. We build a 53,237-flow natural-prior population and a 3,365-flow balanced control from CIC-IDS2017, add NSL-KDD, UNSW-NB15 and an IoT corpus, and compare four feature views over ten seeds. The two models diff</w:t>
       </w:r>
       <w:r>
-        <w:t>er by -0.000456 Macro-F1 (five up, five down); both intervals lie inside the 0.005 and 0.01 equivalence margins. Over the same four experts it changes one label in 79,860 predictions. The experts disagree on 0.15%-0.66% of test rows while the gate matches equal voting on all but one of 79,860 predictions; weight entropy is 0.99998; class prior and dedup order move Macro-F1 by +0.0725 and +0.0060. Three identifiability conditions are derived, one a row-wise bound: 99.91% of 23,958 test rows are provably inva</w:t>
-      </w:r>
-      <w:r>
-        <w:t>riant, with a median margin 3,469-5,038 times it. 108 gate configurations yield six scores; across fifteen configurations the gain co-varies with expert diversity (slope 0.0646, r = 0.749). The equivalence reproduces on a 7.8-times-larger population but not on the uncapped 2,429,503-flow corpus, where it becomes a consistent deficit (-0.005533, all ten seeds) at 175-fold cost; the IoT corpus saturates. The mechanism is 4.1 times larger and 4.6 times slower (S22), without cost-sensitive advantage. We contrib</w:t>
-      </w:r>
-      <w:r>
-        <w:t>ute a leakage-controlled protocol, an identifiability boundary and a map separating protocol from aggregation-rule effects; the evidence supports neither superiority nor production readiness.</w:t>
+        <w:t>er by -0.000456 Macro-F1 (five up, five down); both intervals lie inside the 0.005 and 0.01 equivalence margins, and over the same four experts the gate changes one label in 79,860 predictions although the experts disagree on 0.15%-0.66% of test rows; weight entropy is 0.99998; class prior and dedup order move Macro-F1 by +0.0725 and +0.0060. Three identifiability conditions are derived, one a row-wise bound: 99.91% of 23,958 test rows are provably invariant, with a median margin 3,469-5,038 times it. Acros</w:t>
+      </w:r>
+      <w:r>
+        <w:t>s fifteen configurations the gain co-varies with expert diversity (r = 0.749). The equivalence reproduces on a 7.8-times-larger population but not on the uncapped 2,429,503-flow corpus, where it becomes a consistent deficit (-0.005533) at 175-fold cost. On a 2025 packet corpus with 18 classes the gate gains +0.0063 at eight of sixteen features (all ten seeds), while at the full budget its three views coincide. The mechanism is 4.1 times larger and 4.6 times slower (S22). We contribute a leakage-controlled p</w:t>
+      </w:r>
+      <w:r>
+        <w:t>rotocol, an identifiability boundary and a map separating protocol from aggregation-rule effects; the evidence supports neither general superiority nor production readiness.</w:t>
       </w:r>
     </w:p>
     <w:p>
@@ -1039,7 +1039,7 @@
           <w:noProof/>
         </w:rPr>
         <w:drawing>
-          <wp:inline distT="0" distB="0" distL="0" distR="0" wp14:anchorId="33AE1658" wp14:editId="389BFF44">
+          <wp:inline distT="0" distB="0" distL="0" distR="0" wp14:anchorId="6FB3ADCF" wp14:editId="5B1FDB1A">
             <wp:extent cx="5760720" cy="2734826"/>
             <wp:effectExtent l="0" t="0" r="0" b="0"/>
             <wp:docPr id="1" name="Picture 1"/>
@@ -2426,7 +2426,7 @@
           <w:noProof/>
         </w:rPr>
         <w:drawing>
-          <wp:inline distT="0" distB="0" distL="0" distR="0" wp14:anchorId="539CB09D" wp14:editId="3D3059DE">
+          <wp:inline distT="0" distB="0" distL="0" distR="0" wp14:anchorId="70256CDA" wp14:editId="66CDE36D">
             <wp:extent cx="5760720" cy="2722098"/>
             <wp:effectExtent l="0" t="0" r="0" b="0"/>
             <wp:docPr id="2" name="Picture 2"/>
@@ -3419,7 +3419,7 @@
           <w:noProof/>
         </w:rPr>
         <w:drawing>
-          <wp:inline distT="0" distB="0" distL="0" distR="0" wp14:anchorId="02F46388" wp14:editId="749B0FA0">
+          <wp:inline distT="0" distB="0" distL="0" distR="0" wp14:anchorId="039AACBC" wp14:editId="5FE15D7F">
             <wp:extent cx="5760720" cy="3482709"/>
             <wp:effectExtent l="0" t="0" r="0" b="0"/>
             <wp:docPr id="3" name="Picture 3"/>
@@ -7205,7 +7205,7 @@
           <w:noProof/>
         </w:rPr>
         <w:drawing>
-          <wp:inline distT="0" distB="0" distL="0" distR="0" wp14:anchorId="7BB3684E" wp14:editId="2CB580EF">
+          <wp:inline distT="0" distB="0" distL="0" distR="0" wp14:anchorId="63CCA9A0" wp14:editId="3D944CD2">
             <wp:extent cx="5760720" cy="2356272"/>
             <wp:effectExtent l="0" t="0" r="0" b="0"/>
             <wp:docPr id="4" name="Picture 4"/>
@@ -8168,7 +8168,7 @@
           <w:noProof/>
         </w:rPr>
         <w:drawing>
-          <wp:inline distT="0" distB="0" distL="0" distR="0" wp14:anchorId="4A200965" wp14:editId="4A1546DA">
+          <wp:inline distT="0" distB="0" distL="0" distR="0" wp14:anchorId="7D53EB21" wp14:editId="17703ED6">
             <wp:extent cx="5760720" cy="2045294"/>
             <wp:effectExtent l="0" t="0" r="0" b="0"/>
             <wp:docPr id="5" name="Picture 5"/>
@@ -8346,7 +8346,7 @@
           <w:noProof/>
         </w:rPr>
         <w:drawing>
-          <wp:inline distT="0" distB="0" distL="0" distR="0" wp14:anchorId="2D4BE6E6" wp14:editId="53E5C6E4">
+          <wp:inline distT="0" distB="0" distL="0" distR="0" wp14:anchorId="4827564F" wp14:editId="2826E1E1">
             <wp:extent cx="5760720" cy="2308234"/>
             <wp:effectExtent l="0" t="0" r="0" b="0"/>
             <wp:docPr id="6" name="Picture 6"/>
@@ -9078,7 +9078,7 @@
           <w:noProof/>
         </w:rPr>
         <w:drawing>
-          <wp:inline distT="0" distB="0" distL="0" distR="0" wp14:anchorId="310C01A7" wp14:editId="34A841EE">
+          <wp:inline distT="0" distB="0" distL="0" distR="0" wp14:anchorId="76B42BA8" wp14:editId="78FBD1B3">
             <wp:extent cx="5760720" cy="2167923"/>
             <wp:effectExtent l="0" t="0" r="0" b="0"/>
             <wp:docPr id="7" name="Picture 7"/>
@@ -9257,7 +9257,7 @@
           <w:noProof/>
         </w:rPr>
         <w:drawing>
-          <wp:inline distT="0" distB="0" distL="0" distR="0" wp14:anchorId="35F60E45" wp14:editId="3B8E397E">
+          <wp:inline distT="0" distB="0" distL="0" distR="0" wp14:anchorId="6FA8C206" wp14:editId="38286614">
             <wp:extent cx="5760720" cy="2258878"/>
             <wp:effectExtent l="0" t="0" r="0" b="0"/>
             <wp:docPr id="8" name="Picture 8"/>
@@ -9441,7 +9441,7 @@
           <w:noProof/>
         </w:rPr>
         <w:drawing>
-          <wp:inline distT="0" distB="0" distL="0" distR="0" wp14:anchorId="5A407B1A" wp14:editId="76BF7699">
+          <wp:inline distT="0" distB="0" distL="0" distR="0" wp14:anchorId="00E0D786" wp14:editId="4CB8E361">
             <wp:extent cx="5760720" cy="2516852"/>
             <wp:effectExtent l="0" t="0" r="0" b="0"/>
             <wp:docPr id="9" name="Picture 9"/>
@@ -9578,7 +9578,7 @@
           <w:noProof/>
         </w:rPr>
         <w:drawing>
-          <wp:inline distT="0" distB="0" distL="0" distR="0" wp14:anchorId="2A35C9D6" wp14:editId="6C8CF320">
+          <wp:inline distT="0" distB="0" distL="0" distR="0" wp14:anchorId="6BF7E6D0" wp14:editId="205EB86B">
             <wp:extent cx="5760720" cy="2223311"/>
             <wp:effectExtent l="0" t="0" r="0" b="0"/>
             <wp:docPr id="10" name="Picture 10"/>
@@ -9665,7 +9665,7 @@
         </w:rPr>
         <w:lastRenderedPageBreak/>
         <w:drawing>
-          <wp:inline distT="0" distB="0" distL="0" distR="0" wp14:anchorId="76581167" wp14:editId="2BA08325">
+          <wp:inline distT="0" distB="0" distL="0" distR="0" wp14:anchorId="6CD5A846" wp14:editId="5BA5899A">
             <wp:extent cx="5760720" cy="2538527"/>
             <wp:effectExtent l="0" t="0" r="0" b="0"/>
             <wp:docPr id="11" name="Picture 11"/>
@@ -10604,6 +10604,20 @@
         <w:rPr>
           <w:b/>
         </w:rPr>
+        <w:t>A 2025 packet-level corpus, and the condition under which the gate helps.</w:t>
+      </w:r>
+      <w:r>
+        <w:t xml:space="preserve"> Gotham-2025 (Zenodo 14502760, CC BY 4.0) captures 78 IoT devices on a smart-city testbed; its processed tables hold 35,134,281 packets and 18 classes. Under the study's protocol the table has only sixteen usable columns once the device addresses and timestamps are dropped (they would hand the classifier the attacker's identity), so the 60-feature budget selects every column and the three views coincide: the gate is exactly equal to the same-members fusion on all 29,718 test rows, all ten seeds. Repeating t</w:t>
+      </w:r>
+      <w:r>
+        <w:t>he same comparison at eight of the sixteen features, where chi-square and ANOVA genuinely disagree, reverses that: the gate gains +0.0063 Macro-F1 with all ten seeds positive and 38-50 of the 29,718 labels changed. The gate is inert when its members are interchangeable and helpful when they are not - the boundary the identifiability conditions predict, now observed on a 2025 corpus.</w:t>
+      </w:r>
+    </w:p>
+    <w:p>
+      <w:r>
+        <w:rPr>
+          <w:b/>
+        </w:rPr>
         <w:t>Deployment view.</w:t>
       </w:r>
       <w:r>
@@ -10618,7 +10632,11 @@
         <w:t>Corpus vintage.</w:t>
       </w:r>
       <w:r>
-        <w:t xml:space="preserve"> The thirteen corpora span 1998-2025; eight of them were released in 2020 or later (LITNET-2020, IoT-23, RT-IoT2022, ACI-IoT-2023, CIC-IoT-2023, and three published in 2025: UAVIDS-2025, GeNIS, IDS2025). Every extension corpus now runs on the same ten seeds as the main experiments. On the 2020-2023 group the gate is indistinguishable from the equal-weight fusion of the same members: the differences are +0.000000 (LITNET-2020), +0.000000 (IoT-23), +0.000071 (RT-IoT2022), +0.000004 (ACI-IoT-2023) and -0.00000</w:t>
+        <w:t xml:space="preserve"> The thirteen corpora span 1998-2025; eight of them were released in 2020 or later (LITNET-2020, IoT-23, RT-IoT2022, ACI-IoT-2023, CIC-IoT-2023, and three published in 2025: UAVIDS-2025, GeNIS, </w:t>
+      </w:r>
+      <w:r>
+        <w:lastRenderedPageBreak/>
+        <w:t>IDS2025). Every extension corpus now runs on the same ten seeds as the main experiments. On the 2020-2023 group the gate is indistinguishable from the equal-weight fusion of the same members: the differences are +0.000000 (LITNET-2020), +0.000000 (IoT-23), +0.000071 (RT-IoT2022), +0.000004 (ACI-IoT-2023) and -0.00000</w:t>
       </w:r>
       <w:r>
         <w:t>4 (CIC-IoT-2023), against Macro-F1 levels of 0.999, 0.985, 0.939, 0.778 and 0.751. The three corpora published in 2025 reproduce the same result over 5, 4 and 7 classes, with same-members differences of +0.000020 (UAVIDS-2025), +0.000000 (GeNIS) and +0.000016 (IDS2025), against Macro-F1 levels of 0.9450, 0.9999 and 0.9810. The newer corpora therefore do not sit at a single difficulty level, and the aggregation-rule conclusion does not depend on the vintage of the source corpus.</w:t>
@@ -10629,7 +10647,6 @@
         <w:pStyle w:val="1"/>
       </w:pPr>
       <w:r>
-        <w:lastRenderedPageBreak/>
         <w:t>6. Discussion</w:t>
       </w:r>
     </w:p>
@@ -10698,7 +10715,11 @@
         <w:t xml:space="preserve"> The three conditions above describe an inert gate. The fourth is different in kind. When the members of a fusion differ in quality, the combination is bounded by the weighted mean of its members plus whatever diversity gain they contribute [9], so it cannot be repaired by re-weighting: the bound is a property of the member set, not of the gate. On the capped populations the four feature views score within 0.002 of one another (Table 4a) and the bound is slack. On the uncapped corpus the full-feature view f</w:t>
       </w:r>
       <w:r>
-        <w:t>alls 0.021397 behind the chi-square view, and one such member inside a four-way average accounts for the whole measured deficit: 0.021397/4 = 0.005349 predicted against -0.005533 observed. The same expression holds on the 413,209-flow population (0.004249/4 = 0.001062 against -0.001137) and on the primary population (0.002068/4 = 0.000517 against -0.000456), so the diagnostic is a comparison of member scores, not of weights.</w:t>
+        <w:t xml:space="preserve">alls 0.021397 behind the chi-square view, and one such member inside a four-way average accounts for the whole measured deficit: 0.021397/4 = 0.005349 predicted against -0.005533 observed. The same expression holds on the 413,209-flow </w:t>
+      </w:r>
+      <w:r>
+        <w:lastRenderedPageBreak/>
+        <w:t>population (0.004249/4 = 0.001062 against -0.001137) and on the primary population (0.002068/4 = 0.000517 against -0.000456), so the diagnostic is a comparison of member scores, not of weights.</w:t>
       </w:r>
     </w:p>
     <w:p>
@@ -10720,7 +10741,6 @@
         <w:pStyle w:val="21"/>
       </w:pPr>
       <w:r>
-        <w:lastRenderedPageBreak/>
         <w:t>6.2 Interpreting reported weighting gains</w:t>
       </w:r>
     </w:p>
@@ -11227,6 +11247,7 @@
               <w:rPr>
                 <w:sz w:val="16"/>
               </w:rPr>
+              <w:lastRenderedPageBreak/>
               <w:t>Cross-file or cross-scenario evaluation</w:t>
             </w:r>
           </w:p>
@@ -11423,7 +11444,6 @@
         <w:pStyle w:val="21"/>
       </w:pPr>
       <w:r>
-        <w:lastRenderedPageBreak/>
         <w:t>6.4 Reporting recommendations for intrusion-detection evaluation</w:t>
       </w:r>
     </w:p>
@@ -11615,7 +11635,11 @@
         <w:t>The diversity evidence is associational.</w:t>
       </w:r>
       <w:r>
-        <w:t xml:space="preserve"> The dose-response relation rests on fifteen constructed expert configurations evaluated with three-fold cross-fitting; it shows that the gain moves with expert disagreement, not that disagreement alone causes a gain. The one intervention that was run is on the model side: replacing the gate's logistic risk model with a gradient-boosted ensemble leaves the gain at +0.000050, well inside the margin (Section 5.3). A data-level intervention that makes the experts genuinely dissimilar without changing anything </w:t>
+        <w:t xml:space="preserve"> The dose-response relation rests on fifteen constructed expert configurations evaluated with three-fold cross-fitting; it shows that the gain moves with expert disagreement, not that disagreement alone causes a gain. The one intervention that was run is on the model side: replacing the gate's logistic risk model with a gradient-boosted ensemble leaves the gain at +0.000050, well inside the margin (Section </w:t>
+      </w:r>
+      <w:r>
+        <w:lastRenderedPageBreak/>
+        <w:t xml:space="preserve">5.3). A data-level intervention that makes the experts genuinely dissimilar without changing anything </w:t>
       </w:r>
       <w:r>
         <w:t>else remains untested.</w:t>
@@ -11640,11 +11664,7 @@
         <w:t>The research populations are not production traffic.</w:t>
       </w:r>
       <w:r>
-        <w:t xml:space="preserve"> The natural-prior population results from global deduplication, physical-range screening and a 20,000-per-class cap, giving 53,237 records; the balanced control </w:t>
-      </w:r>
-      <w:r>
-        <w:lastRenderedPageBreak/>
-        <w:t>contains only 3,365 records. Both are therefore artefacts of the audit procedure rather than samples of an operational network, and every number in this paper is conditioned on them.</w:t>
+        <w:t xml:space="preserve"> The natural-prior population results from global deduplication, physical-range screening and a 20,000-per-class cap, giving 53,237 records; the balanced control contains only 3,365 records. Both are therefore artefacts of the audit procedure rather than samples of an operational network, and every number in this paper is conditioned on them.</w:t>
       </w:r>
     </w:p>
     <w:p>
@@ -11710,16 +11730,16 @@
         <w:rPr>
           <w:b/>
         </w:rPr>
-        <w:t>Thirteen corpora were evaluated, and every corpus comes from one collection programme.</w:t>
-      </w:r>
-      <w:r>
-        <w:t xml:space="preserve"> The conclusions are conditional on CIC-IDS2017 (capped populations and the full deduplicated corpus), NSL-KDD, UNSW-NB15 and N-BaIoT; CIC-IDS2018, CIC-IoT-2023, LITNET-2020, IoT-23, RT-IoT2022, ACI-IoT-2023 and the three 2025 corpora (UAVIDS-2025, GeNIS, IDS2025) were added as extension corpora (Section 5.8) and reproduce the primary comparison. N-BaIoT is saturated for flow-feature classifiers (every model at or above 0.9998 Macro-F1), so it probes the mechanics of the aggregation step rather than discrim</w:t>
-      </w:r>
-      <w:r>
-        <w:t xml:space="preserve">ination difficulty, and the external datasets remain independent native-label benchmarks rather than transfer tests. None of the thirteen represents production traffic. A day-level split of CIC-IDS2017 is constructible, but every capture day carries only a subset of the five classes (Monday Normal only; Tuesday Normal and Brute Force; Wednesday Normal and DoS/DDoS; Thursday adds Web Attack; Friday adds Bot), so it is not category-complete: the measured day-holdout Macro-F1 collapses to 0.13-0.32 across the </w:t>
-      </w:r>
-      <w:r>
-        <w:t>five days, which is what that limitation now quantifies.</w:t>
+        <w:t>Fourteen corpora were evaluated, and every corpus comes from one collection programme.</w:t>
+      </w:r>
+      <w:r>
+        <w:t xml:space="preserve"> The conclusions are conditional on CIC-IDS2017 (capped populations and the full deduplicated corpus), NSL-KDD, UNSW-NB15 and N-BaIoT; CIC-IDS2018, CIC-IoT-2023, LITNET-2020, IoT-23, RT-IoT2022, ACI-IoT-2023 and the 2025 corpora (UAVIDS-2025, GeNIS, IDS2025, Gotham-2025) were added as extension corpora (Section 5.8) and reproduce the primary comparison. N-BaIoT is saturated for flow-feature classifiers (every model at or above 0.9998 Macro-F1), so it probes the mechanics of the aggregation step rather than </w:t>
+      </w:r>
+      <w:r>
+        <w:t>discrimination difficulty, and the external datasets remain independent native-label benchmarks rather than transfer tests. None of the fourteen represents production traffic. A day-level split of CIC-IDS2017 is constructible, but every capture day carries only a subset of the five classes (Monday Normal only; Tuesday Normal and Brute Force; Wednesday Normal and DoS/DDoS; Thursday adds Web Attack; Friday adds Bot), so it is not category-complete: the measured day-holdout Macro-F1 collapses to 0.13-0.32 acro</w:t>
+      </w:r>
+      <w:r>
+        <w:t>ss the five days, which is what that limitation now quantifies.</w:t>
       </w:r>
     </w:p>
     <w:p>
@@ -11727,6 +11747,7 @@
         <w:rPr>
           <w:b/>
         </w:rPr>
+        <w:lastRenderedPageBreak/>
         <w:t>Adversarial robustness was not assessed.</w:t>
       </w:r>
       <w:r>
@@ -11760,7 +11781,6 @@
         <w:rPr>
           <w:b/>
         </w:rPr>
-        <w:lastRenderedPageBreak/>
         <w:t>Single hardware platform and single implementation.</w:t>
       </w:r>
       <w:r>
@@ -11827,6 +11847,7 @@
         <w:rPr>
           <w:b/>
         </w:rPr>
+        <w:lastRenderedPageBreak/>
         <w:t>Third, protocol effects dominate aggregation-rule differences.</w:t>
       </w:r>
       <w:r>
@@ -11844,83 +11865,83 @@
     </w:p>
     <w:p>
       <w:r>
-        <w:t>The principal contribution is not a new state-of-the-art classifier but a reusable leakage-controlled protocol, a set of falsifiable identifiability boundaries, and a quantitative map that separates protocol effects from aggregation-rule effects. Three directions follow. First, design weighting mechanisms that explicitly enforce expert decorrelation, and test whether the gain is restored once the premise of Condition 1 is broken. Second, construct category-</w:t>
-      </w:r>
+        <w:t>The principal contribution is not a new state-of-the-art classifier but a reusable leakage-controlled protocol, a set of falsifiable identifiability boundaries, and a quantitative map that separates protocol effects from aggregation-rule effects. Three directions follow. First, design weighting mechanisms that explicitly enforce expert decorrelation, and test whether the gain is restored once the premise of Condition 1 is broken. Second, construct category-complete temporal or cross-scenario protocols so th</w:t>
+      </w:r>
+      <w:r>
+        <w:t>at file-level coverage analysis can be upgraded into a genuine external-validity test. Third, turn the reporting recommendations of Section 6.4 into an automatically checkable checklist, so that the evaluation protocol itself becomes a verifiable object. The recommendations extend those of [22].</w:t>
+      </w:r>
+    </w:p>
+    <w:p>
+      <w:pPr>
+        <w:pStyle w:val="1"/>
+      </w:pPr>
+      <w:r>
+        <w:t>Data and code availability</w:t>
+      </w:r>
+    </w:p>
+    <w:p>
+      <w:r>
+        <w:t>Processing scripts, audit intermediates, per-row predictions and figure-generation code are released at https://github.com/linran-muxue/leakage-controlled-nids-study (release v1.11.0, tag v1.11.0). Raw datasets are not redistributed; the paper records source URLs, retrieval dates, version snapshots and SHA-256 checksums.</w:t>
+      </w:r>
+    </w:p>
+    <w:p>
+      <w:pPr>
+        <w:pStyle w:val="1"/>
+      </w:pPr>
+      <w:r>
+        <w:t>Funding</w:t>
+      </w:r>
+    </w:p>
+    <w:p>
+      <w:r>
+        <w:t>To be completed by the author. If the work received no support of any kind, this should be stated explicitly.</w:t>
+      </w:r>
+    </w:p>
+    <w:p>
+      <w:pPr>
+        <w:pStyle w:val="1"/>
+      </w:pPr>
+      <w:r>
+        <w:t>Declaration of competing interest</w:t>
+      </w:r>
+    </w:p>
+    <w:p>
+      <w:r>
+        <w:t>To be completed by the author. If no competing interests exist, this should be stated explicitly.</w:t>
+      </w:r>
+    </w:p>
+    <w:p>
+      <w:pPr>
+        <w:pStyle w:val="1"/>
+      </w:pPr>
+      <w:r>
+        <w:t>Declaration of generative AI and AI-assisted technologies</w:t>
+      </w:r>
+    </w:p>
+    <w:p>
+      <w:r>
+        <w:t>Generative AI tools were used for language editing and software drafting. The author is responsible for verifying the code, data, citations and all conclusions, and has checked each reported number against the released artefacts.</w:t>
+      </w:r>
+    </w:p>
+    <w:p>
+      <w:pPr>
+        <w:pStyle w:val="1"/>
+      </w:pPr>
+      <w:r>
+        <w:t>CRediT authorship contribution statement</w:t>
+      </w:r>
+    </w:p>
+    <w:p>
+      <w:r>
+        <w:t>To be completed by the author according to actual contributions: conceptualisation, methodology, software, validation, formal analysis, data curation, writing - original draft, writing - review and editing, visualisation.</w:t>
+      </w:r>
+    </w:p>
+    <w:p>
+      <w:pPr>
+        <w:pStyle w:val="1"/>
+      </w:pPr>
       <w:r>
         <w:lastRenderedPageBreak/>
-        <w:t>complete temporal or cross-scenario protocols so that file-level coverage analysis can be upgraded into a genuine external-validity test. Third, turn the reporting recommendations of Section 6.4 into an automatically checkable checklist, so that the evaluation protocol itself becomes a verifiable object. The recommendations extend those of [22].</w:t>
-      </w:r>
-    </w:p>
-    <w:p>
-      <w:pPr>
-        <w:pStyle w:val="1"/>
-      </w:pPr>
-      <w:r>
-        <w:t>Data and code availability</w:t>
-      </w:r>
-    </w:p>
-    <w:p>
-      <w:r>
-        <w:t>Processing scripts, audit intermediates, per-row predictions and figure-generation code are released at https://github.com/linran-muxue/leakage-controlled-nids-study (release v1.11.0, tag v1.11.0). Raw datasets are not redistributed; the paper records source URLs, retrieval dates, version snapshots and SHA-256 checksums.</w:t>
-      </w:r>
-    </w:p>
-    <w:p>
-      <w:pPr>
-        <w:pStyle w:val="1"/>
-      </w:pPr>
-      <w:r>
-        <w:t>Funding</w:t>
-      </w:r>
-    </w:p>
-    <w:p>
-      <w:r>
-        <w:t>To be completed by the author. If the work received no support of any kind, this should be stated explicitly.</w:t>
-      </w:r>
-    </w:p>
-    <w:p>
-      <w:pPr>
-        <w:pStyle w:val="1"/>
-      </w:pPr>
-      <w:r>
-        <w:t>Declaration of competing interest</w:t>
-      </w:r>
-    </w:p>
-    <w:p>
-      <w:r>
-        <w:t>To be completed by the author. If no competing interests exist, this should be stated explicitly.</w:t>
-      </w:r>
-    </w:p>
-    <w:p>
-      <w:pPr>
-        <w:pStyle w:val="1"/>
-      </w:pPr>
-      <w:r>
-        <w:t>Declaration of generative AI and AI-assisted technologies</w:t>
-      </w:r>
-    </w:p>
-    <w:p>
-      <w:r>
-        <w:t>Generative AI tools were used for language editing and software drafting. The author is responsible for verifying the code, data, citations and all conclusions, and has checked each reported number against the released artefacts.</w:t>
-      </w:r>
-    </w:p>
-    <w:p>
-      <w:pPr>
-        <w:pStyle w:val="1"/>
-      </w:pPr>
-      <w:r>
-        <w:t>CRediT authorship contribution statement</w:t>
-      </w:r>
-    </w:p>
-    <w:p>
-      <w:r>
-        <w:t>To be completed by the author according to actual contributions: conceptualisation, methodology, software, validation, formal analysis, data curation, writing - original draft, writing - review and editing, visualisation.</w:t>
-      </w:r>
-    </w:p>
-    <w:p>
-      <w:pPr>
-        <w:pStyle w:val="1"/>
-      </w:pPr>
-      <w:r>
         <w:t>References</w:t>
       </w:r>
     </w:p>
@@ -11998,7 +12019,6 @@
         </w:numPr>
       </w:pPr>
       <w:r>
-        <w:lastRenderedPageBreak/>
         <w:t>Freund Y, Schapire R E. A decision-theoretic generalization of on-line learning and an application to boosting. Journal of Computer and System Sciences, 1997, 55(1): 119-139. DOI:10.1006/jcss.1997.1504.</w:t>
       </w:r>
     </w:p>
@@ -12179,6 +12199,7 @@
         </w:numPr>
       </w:pPr>
       <w:r>
+        <w:lastRenderedPageBreak/>
         <w:t>Liu L, Engelen G, Timmerman J, et al. Error prevalence in NIDS datasets: A case study on CIC-IDS-2017 and CSE-CIC-IDS-2018. IEEE CNS 2022. DOI:10.1109/CNS56114.2022.9947235.</w:t>
       </w:r>
     </w:p>
@@ -12251,7 +12272,6 @@
         </w:numPr>
       </w:pPr>
       <w:r>
-        <w:lastRenderedPageBreak/>
         <w:t>Geng C, Huang S J, Chen S. Recent advances in open set recognition: A survey. IEEE TPAMI, 2021, 43(10): 3614-3631. DOI:10.1109/TPAMI.2020.2981604.</w:t>
       </w:r>
     </w:p>
@@ -12432,6 +12452,7 @@
         </w:numPr>
       </w:pPr>
       <w:r>
+        <w:lastRenderedPageBreak/>
         <w:t>Han S, Kim Y, Lee S. Improvement of the classification performance of an intrusion detection model for rare and unknown attack traffic. Electronics, 2021, 10(18): 2268. DOI:10.3390/electronics10182268.</w:t>
       </w:r>
     </w:p>
@@ -12500,7 +12521,6 @@
         <w:pStyle w:val="1"/>
       </w:pPr>
       <w:r>
-        <w:lastRenderedPageBreak/>
         <w:t>Supplementary material</w:t>
       </w:r>
     </w:p>
@@ -13489,6 +13509,7 @@
               <w:rPr>
                 <w:sz w:val="16"/>
               </w:rPr>
+              <w:lastRenderedPageBreak/>
               <w:t>S28</w:t>
             </w:r>
           </w:p>
@@ -13852,76 +13873,76 @@
       </w:rPr>
     </w:lvl>
   </w:abstractNum>
-  <w:num w:numId="1" w16cid:durableId="588080578">
+  <w:num w:numId="1" w16cid:durableId="1337418789">
     <w:abstractNumId w:val="8"/>
   </w:num>
-  <w:num w:numId="2" w16cid:durableId="240140989">
+  <w:num w:numId="2" w16cid:durableId="639381551">
     <w:abstractNumId w:val="6"/>
   </w:num>
-  <w:num w:numId="3" w16cid:durableId="1955212790">
+  <w:num w:numId="3" w16cid:durableId="367724173">
     <w:abstractNumId w:val="5"/>
   </w:num>
-  <w:num w:numId="4" w16cid:durableId="971134057">
+  <w:num w:numId="4" w16cid:durableId="478424110">
     <w:abstractNumId w:val="4"/>
   </w:num>
-  <w:num w:numId="5" w16cid:durableId="1659771677">
+  <w:num w:numId="5" w16cid:durableId="536359455">
     <w:abstractNumId w:val="7"/>
   </w:num>
-  <w:num w:numId="6" w16cid:durableId="348146106">
+  <w:num w:numId="6" w16cid:durableId="1608730908">
     <w:abstractNumId w:val="3"/>
   </w:num>
-  <w:num w:numId="7" w16cid:durableId="136337038">
+  <w:num w:numId="7" w16cid:durableId="6256431">
     <w:abstractNumId w:val="2"/>
   </w:num>
-  <w:num w:numId="8" w16cid:durableId="628316703">
+  <w:num w:numId="8" w16cid:durableId="186993234">
     <w:abstractNumId w:val="1"/>
   </w:num>
-  <w:num w:numId="9" w16cid:durableId="427046490">
+  <w:num w:numId="9" w16cid:durableId="1740588186">
     <w:abstractNumId w:val="0"/>
   </w:num>
-  <w:num w:numId="10" w16cid:durableId="108353088">
+  <w:num w:numId="10" w16cid:durableId="2094667690">
     <w:abstractNumId w:val="7"/>
     <w:lvlOverride w:ilvl="0">
       <w:startOverride w:val="1"/>
     </w:lvlOverride>
   </w:num>
-  <w:num w:numId="11" w16cid:durableId="821699667">
+  <w:num w:numId="11" w16cid:durableId="953705820">
     <w:abstractNumId w:val="7"/>
     <w:lvlOverride w:ilvl="0">
       <w:startOverride w:val="1"/>
     </w:lvlOverride>
   </w:num>
-  <w:num w:numId="12" w16cid:durableId="255014955">
+  <w:num w:numId="12" w16cid:durableId="281964016">
     <w:abstractNumId w:val="7"/>
     <w:lvlOverride w:ilvl="0">
       <w:startOverride w:val="1"/>
     </w:lvlOverride>
   </w:num>
-  <w:num w:numId="13" w16cid:durableId="222377933">
+  <w:num w:numId="13" w16cid:durableId="1306279502">
     <w:abstractNumId w:val="7"/>
     <w:lvlOverride w:ilvl="0">
       <w:startOverride w:val="1"/>
     </w:lvlOverride>
   </w:num>
-  <w:num w:numId="14" w16cid:durableId="1160191832">
+  <w:num w:numId="14" w16cid:durableId="2115057205">
     <w:abstractNumId w:val="7"/>
     <w:lvlOverride w:ilvl="0">
       <w:startOverride w:val="1"/>
     </w:lvlOverride>
   </w:num>
-  <w:num w:numId="15" w16cid:durableId="2005545447">
+  <w:num w:numId="15" w16cid:durableId="1971200640">
     <w:abstractNumId w:val="7"/>
     <w:lvlOverride w:ilvl="0">
       <w:startOverride w:val="1"/>
     </w:lvlOverride>
   </w:num>
-  <w:num w:numId="16" w16cid:durableId="1369531339">
+  <w:num w:numId="16" w16cid:durableId="728042523">
     <w:abstractNumId w:val="7"/>
     <w:lvlOverride w:ilvl="0">
       <w:startOverride w:val="1"/>
     </w:lvlOverride>
   </w:num>
-  <w:num w:numId="17" w16cid:durableId="1207067442">
+  <w:num w:numId="17" w16cid:durableId="274144364">
     <w:abstractNumId w:val="7"/>
     <w:lvlOverride w:ilvl="0">
       <w:startOverride w:val="1"/>

</xml_diff>

<commit_message>
Round 20bg: three 2026 corpora (CTU-IDSEVAL-6, 6TiSCHSet-2026, RTN) - seventeen corpora span 1998-2026
</commit_message>
<xml_diff>
--- a/重构版论文_v4_20260915/English_SCI_Manuscript_v4.docx
+++ b/重构版论文_v4_20260915/English_SCI_Manuscript_v4.docx
@@ -1039,7 +1039,7 @@
           <w:noProof/>
         </w:rPr>
         <w:drawing>
-          <wp:inline distT="0" distB="0" distL="0" distR="0" wp14:anchorId="6FB3ADCF" wp14:editId="5B1FDB1A">
+          <wp:inline distT="0" distB="0" distL="0" distR="0" wp14:anchorId="6C846D34" wp14:editId="2F5E5050">
             <wp:extent cx="5760720" cy="2734826"/>
             <wp:effectExtent l="0" t="0" r="0" b="0"/>
             <wp:docPr id="1" name="Picture 1"/>
@@ -2426,7 +2426,7 @@
           <w:noProof/>
         </w:rPr>
         <w:drawing>
-          <wp:inline distT="0" distB="0" distL="0" distR="0" wp14:anchorId="70256CDA" wp14:editId="66CDE36D">
+          <wp:inline distT="0" distB="0" distL="0" distR="0" wp14:anchorId="503BE09B" wp14:editId="24248875">
             <wp:extent cx="5760720" cy="2722098"/>
             <wp:effectExtent l="0" t="0" r="0" b="0"/>
             <wp:docPr id="2" name="Picture 2"/>
@@ -3419,7 +3419,7 @@
           <w:noProof/>
         </w:rPr>
         <w:drawing>
-          <wp:inline distT="0" distB="0" distL="0" distR="0" wp14:anchorId="039AACBC" wp14:editId="5FE15D7F">
+          <wp:inline distT="0" distB="0" distL="0" distR="0" wp14:anchorId="2893A46E" wp14:editId="4317E514">
             <wp:extent cx="5760720" cy="3482709"/>
             <wp:effectExtent l="0" t="0" r="0" b="0"/>
             <wp:docPr id="3" name="Picture 3"/>
@@ -4772,7 +4772,11 @@
     </w:p>
     <w:p>
       <w:r>
-        <w:t>Together the conditions yield a falsifiable prediction: on data where experts are highly correlated and the risk models are nearly constant, the hard-label gain of conditional weighting should be zero or near zero, the weight entropy should approach 1, and the expert disagreement rate should approach 0. Section 5.3 tests this prediction directly.</w:t>
+        <w:t xml:space="preserve">Together the conditions yield a falsifiable prediction: on data where experts are highly correlated and the risk models are nearly constant, the hard-label gain of conditional weighting should be zero or near zero, the weight </w:t>
+      </w:r>
+      <w:r>
+        <w:lastRenderedPageBreak/>
+        <w:t>entropy should approach 1, and the expert disagreement rate should approach 0. Section 5.3 tests this prediction directly.</w:t>
       </w:r>
     </w:p>
     <w:p>
@@ -4785,7 +4789,6 @@
         <w:pStyle w:val="21"/>
       </w:pPr>
       <w:r>
-        <w:lastRenderedPageBreak/>
         <w:t>4.4 Complexity</w:t>
       </w:r>
     </w:p>
@@ -4941,15 +4944,15 @@
     </w:p>
     <w:p>
       <w:r>
-        <w:t>The feature-quality audit of the balanced control corpus P_bal (2,355 training rows) shows that 12 of the 78 CIC-IDS2017 features are constant (a single value across all rows) and 18 are near-zero-variance; the primary natural-prior split shows 10 constant and 20 near-zero-variance features, so the degeneracy belongs to the feature representation rather than to one population. The constant columns include Bwd PSH Flags, Fwd URG Flags, Bwd URG Flags, RST Flag Count, CWE Flag Count, ECE Flag Count and six bul</w:t>
-      </w:r>
-      <w:r>
-        <w:t>k-rate fields. H1's premise of redundancy is therefore correct in itself.</w:t>
-      </w:r>
-    </w:p>
-    <w:p>
+        <w:t xml:space="preserve">The feature-quality audit of the balanced control corpus P_bal (2,355 training rows) shows that 12 of the 78 CIC-IDS2017 features are constant (a single value across all rows) and 18 are near-zero-variance; the primary natural-prior split shows 10 constant and 20 near-zero-variance features, so the degeneracy belongs to the feature representation rather than to one population. The constant columns include Bwd PSH Flags, Fwd URG Flags, Bwd </w:t>
+      </w:r>
       <w:r>
         <w:lastRenderedPageBreak/>
+        <w:t>URG Flags, RST Flag Count, CWE Flag Count, ECE Flag Count and six bulk-rate fields. H1's premise of redundancy is therefore correct in itself.</w:t>
+      </w:r>
+    </w:p>
+    <w:p>
+      <w:r>
         <w:t>The chi-square budget k was fixed at 60 on the validation partition from a pre-specified candidate set: validation Macro-F1 was 0.9175 at k = 10, 0.9314 at k = 20, 0.9379 at both k = 30 and k = 40, and 0.9413 at k = 60, flattening between k = 30 and k = 40. This search was carried out on the balanced control protocol; the selected k was then frozen for every final run.</w:t>
       </w:r>
     </w:p>
@@ -6412,6 +6415,7 @@
               <w:rPr>
                 <w:sz w:val="16"/>
               </w:rPr>
+              <w:lastRenderedPageBreak/>
               <w:t>RCCF</w:t>
             </w:r>
           </w:p>
@@ -6706,7 +6710,6 @@
               <w:rPr>
                 <w:sz w:val="16"/>
               </w:rPr>
-              <w:lastRenderedPageBreak/>
               <w:t>Equal RF (full features)</w:t>
             </w:r>
           </w:p>
@@ -7205,7 +7208,7 @@
           <w:noProof/>
         </w:rPr>
         <w:drawing>
-          <wp:inline distT="0" distB="0" distL="0" distR="0" wp14:anchorId="63CCA9A0" wp14:editId="3D944CD2">
+          <wp:inline distT="0" distB="0" distL="0" distR="0" wp14:anchorId="06BC174C" wp14:editId="78D668B7">
             <wp:extent cx="5760720" cy="2356272"/>
             <wp:effectExtent l="0" t="0" r="0" b="0"/>
             <wp:docPr id="4" name="Picture 4"/>
@@ -8168,7 +8171,7 @@
           <w:noProof/>
         </w:rPr>
         <w:drawing>
-          <wp:inline distT="0" distB="0" distL="0" distR="0" wp14:anchorId="7D53EB21" wp14:editId="17703ED6">
+          <wp:inline distT="0" distB="0" distL="0" distR="0" wp14:anchorId="547C37D4" wp14:editId="3C76A9E4">
             <wp:extent cx="5760720" cy="2045294"/>
             <wp:effectExtent l="0" t="0" r="0" b="0"/>
             <wp:docPr id="5" name="Picture 5"/>
@@ -8346,7 +8349,7 @@
           <w:noProof/>
         </w:rPr>
         <w:drawing>
-          <wp:inline distT="0" distB="0" distL="0" distR="0" wp14:anchorId="4827564F" wp14:editId="2826E1E1">
+          <wp:inline distT="0" distB="0" distL="0" distR="0" wp14:anchorId="2F605C8E" wp14:editId="1ECB8D6D">
             <wp:extent cx="5760720" cy="2308234"/>
             <wp:effectExtent l="0" t="0" r="0" b="0"/>
             <wp:docPr id="6" name="Picture 6"/>
@@ -9078,7 +9081,7 @@
           <w:noProof/>
         </w:rPr>
         <w:drawing>
-          <wp:inline distT="0" distB="0" distL="0" distR="0" wp14:anchorId="76B42BA8" wp14:editId="78FBD1B3">
+          <wp:inline distT="0" distB="0" distL="0" distR="0" wp14:anchorId="01FD6046" wp14:editId="70631074">
             <wp:extent cx="5760720" cy="2167923"/>
             <wp:effectExtent l="0" t="0" r="0" b="0"/>
             <wp:docPr id="7" name="Picture 7"/>
@@ -9257,7 +9260,7 @@
           <w:noProof/>
         </w:rPr>
         <w:drawing>
-          <wp:inline distT="0" distB="0" distL="0" distR="0" wp14:anchorId="6FA8C206" wp14:editId="38286614">
+          <wp:inline distT="0" distB="0" distL="0" distR="0" wp14:anchorId="237B26BC" wp14:editId="4689B6C4">
             <wp:extent cx="5760720" cy="2258878"/>
             <wp:effectExtent l="0" t="0" r="0" b="0"/>
             <wp:docPr id="8" name="Picture 8"/>
@@ -9441,7 +9444,7 @@
           <w:noProof/>
         </w:rPr>
         <w:drawing>
-          <wp:inline distT="0" distB="0" distL="0" distR="0" wp14:anchorId="00E0D786" wp14:editId="4CB8E361">
+          <wp:inline distT="0" distB="0" distL="0" distR="0" wp14:anchorId="2C354715" wp14:editId="12F4CE38">
             <wp:extent cx="5760720" cy="2516852"/>
             <wp:effectExtent l="0" t="0" r="0" b="0"/>
             <wp:docPr id="9" name="Picture 9"/>
@@ -9578,7 +9581,7 @@
           <w:noProof/>
         </w:rPr>
         <w:drawing>
-          <wp:inline distT="0" distB="0" distL="0" distR="0" wp14:anchorId="6BF7E6D0" wp14:editId="205EB86B">
+          <wp:inline distT="0" distB="0" distL="0" distR="0" wp14:anchorId="5497E8CC" wp14:editId="62CACBA0">
             <wp:extent cx="5760720" cy="2223311"/>
             <wp:effectExtent l="0" t="0" r="0" b="0"/>
             <wp:docPr id="10" name="Picture 10"/>
@@ -9665,7 +9668,7 @@
         </w:rPr>
         <w:lastRenderedPageBreak/>
         <w:drawing>
-          <wp:inline distT="0" distB="0" distL="0" distR="0" wp14:anchorId="6CD5A846" wp14:editId="5BA5899A">
+          <wp:inline distT="0" distB="0" distL="0" distR="0" wp14:anchorId="18F29A16" wp14:editId="2E0DF31E">
             <wp:extent cx="5760720" cy="2538527"/>
             <wp:effectExtent l="0" t="0" r="0" b="0"/>
             <wp:docPr id="11" name="Picture 11"/>
@@ -10618,6 +10621,21 @@
         <w:rPr>
           <w:b/>
         </w:rPr>
+        <w:t>Three more corpora from 2026.</w:t>
+      </w:r>
+      <w:r>
+        <w:t xml:space="preserve"> The three newest openly licensed corpora reproduce the inert result on the same ten seeds. CTU-IDSEVAL-6 (Zeek connection logs, 3 classes, 4,599 test flows) gives 0.893281 for the gate against 0.893307 for the same-members fusion, a -0.000026 difference; 6TiSCHSet-2026, a leakage-aware 6TiSCH benchmark whose own schema defines the 17-feature input, reaches 0.994623 for both arms over 8 classes and 15,957 records; the RTN packet table saturates at 1.000000 for every model. Seventeen corpora now span 1998-20</w:t>
+      </w:r>
+      <w:r>
+        <w:t>26.</w:t>
+      </w:r>
+    </w:p>
+    <w:p>
+      <w:r>
+        <w:rPr>
+          <w:b/>
+        </w:rPr>
+        <w:lastRenderedPageBreak/>
         <w:t>Deployment view.</w:t>
       </w:r>
       <w:r>
@@ -10632,14 +10650,10 @@
         <w:t>Corpus vintage.</w:t>
       </w:r>
       <w:r>
-        <w:t xml:space="preserve"> The thirteen corpora span 1998-2025; eight of them were released in 2020 or later (LITNET-2020, IoT-23, RT-IoT2022, ACI-IoT-2023, CIC-IoT-2023, and three published in 2025: UAVIDS-2025, GeNIS, </w:t>
-      </w:r>
-      <w:r>
-        <w:lastRenderedPageBreak/>
-        <w:t>IDS2025). Every extension corpus now runs on the same ten seeds as the main experiments. On the 2020-2023 group the gate is indistinguishable from the equal-weight fusion of the same members: the differences are +0.000000 (LITNET-2020), +0.000000 (IoT-23), +0.000071 (RT-IoT2022), +0.000004 (ACI-IoT-2023) and -0.00000</w:t>
-      </w:r>
-      <w:r>
-        <w:t>4 (CIC-IoT-2023), against Macro-F1 levels of 0.999, 0.985, 0.939, 0.778 and 0.751. The three corpora published in 2025 reproduce the same result over 5, 4 and 7 classes, with same-members differences of +0.000020 (UAVIDS-2025), +0.000000 (GeNIS) and +0.000016 (IDS2025), against Macro-F1 levels of 0.9450, 0.9999 and 0.9810. The newer corpora therefore do not sit at a single difficulty level, and the aggregation-rule conclusion does not depend on the vintage of the source corpus.</w:t>
+        <w:t xml:space="preserve"> The seventeen corpora span 1998-2026; eight of them were released in 2020 or later (LITNET-2020, IoT-23, RT-IoT2022, ACI-IoT-2023, CIC-IoT-2023, and three published in 2025: UAVIDS-2025, GeNIS, IDS2025). Every extension corpus now runs on the same ten seeds as the main experiments. On the 2020-2023 group the gate is indistinguishable from the equal-weight fusion of the same members: the differences are +0.000000 (LITNET-2020), +0.000000 (IoT-23), +0.000071 (RT-IoT2022), +0.000004 (ACI-IoT-2023) and -0.0000</w:t>
+      </w:r>
+      <w:r>
+        <w:t>04 (CIC-IoT-2023), against Macro-F1 levels of 0.999, 0.985, 0.939, 0.778 and 0.751. The three corpora published in 2025 reproduce the same result over 5, 4 and 7 classes, with same-members differences of +0.000020 (UAVIDS-2025), +0.000000 (GeNIS) and +0.000016 (IDS2025), against Macro-F1 levels of 0.9450, 0.9999 and 0.9810. The newer corpora therefore do not sit at a single difficulty level, and the aggregation-rule conclusion does not depend on the vintage of the source corpus.</w:t>
       </w:r>
     </w:p>
     <w:p>
@@ -10709,17 +10723,14 @@
         <w:rPr>
           <w:b/>
         </w:rPr>
+        <w:lastRenderedPageBreak/>
         <w:t>Condition D: heterogeneous members.</w:t>
       </w:r>
       <w:r>
         <w:t xml:space="preserve"> The three conditions above describe an inert gate. The fourth is different in kind. When the members of a fusion differ in quality, the combination is bounded by the weighted mean of its members plus whatever diversity gain they contribute [9], so it cannot be repaired by re-weighting: the bound is a property of the member set, not of the gate. On the capped populations the four feature views score within 0.002 of one another (Table 4a) and the bound is slack. On the uncapped corpus the full-feature view f</w:t>
       </w:r>
       <w:r>
-        <w:t xml:space="preserve">alls 0.021397 behind the chi-square view, and one such member inside a four-way average accounts for the whole measured deficit: 0.021397/4 = 0.005349 predicted against -0.005533 observed. The same expression holds on the 413,209-flow </w:t>
-      </w:r>
-      <w:r>
-        <w:lastRenderedPageBreak/>
-        <w:t>population (0.004249/4 = 0.001062 against -0.001137) and on the primary population (0.002068/4 = 0.000517 against -0.000456), so the diagnostic is a comparison of member scores, not of weights.</w:t>
+        <w:t>alls 0.021397 behind the chi-square view, and one such member inside a four-way average accounts for the whole measured deficit: 0.021397/4 = 0.005349 predicted against -0.005533 observed. The same expression holds on the 413,209-flow population (0.004249/4 = 0.001062 against -0.001137) and on the primary population (0.002068/4 = 0.000517 against -0.000456), so the diagnostic is a comparison of member scores, not of weights.</w:t>
       </w:r>
     </w:p>
     <w:p>
@@ -11015,7 +11026,14 @@
               <w:rPr>
                 <w:sz w:val="16"/>
               </w:rPr>
-              <w:t>5x3 nested cross-validation (CV): XGBoost minus random forest = +0.0078, interval excludes zero</w:t>
+              <w:t xml:space="preserve">5x3 nested cross-validation (CV): XGBoost minus random forest = </w:t>
+            </w:r>
+            <w:r>
+              <w:rPr>
+                <w:sz w:val="16"/>
+              </w:rPr>
+              <w:lastRenderedPageBreak/>
+              <w:t>+0.0078, interval excludes zero</w:t>
             </w:r>
           </w:p>
         </w:tc>
@@ -11031,6 +11049,7 @@
               <w:rPr>
                 <w:sz w:val="16"/>
               </w:rPr>
+              <w:lastRenderedPageBreak/>
               <w:t>Requires a tuning budget and longer training</w:t>
             </w:r>
           </w:p>
@@ -11247,7 +11266,6 @@
               <w:rPr>
                 <w:sz w:val="16"/>
               </w:rPr>
-              <w:lastRenderedPageBreak/>
               <w:t>Cross-file or cross-scenario evaluation</w:t>
             </w:r>
           </w:p>
@@ -11619,6 +11637,7 @@
         <w:pStyle w:val="21"/>
       </w:pPr>
       <w:r>
+        <w:lastRenderedPageBreak/>
         <w:t>6.5 Limitations and validity threats</w:t>
       </w:r>
     </w:p>
@@ -11635,11 +11654,7 @@
         <w:t>The diversity evidence is associational.</w:t>
       </w:r>
       <w:r>
-        <w:t xml:space="preserve"> The dose-response relation rests on fifteen constructed expert configurations evaluated with three-fold cross-fitting; it shows that the gain moves with expert disagreement, not that disagreement alone causes a gain. The one intervention that was run is on the model side: replacing the gate's logistic risk model with a gradient-boosted ensemble leaves the gain at +0.000050, well inside the margin (Section </w:t>
-      </w:r>
-      <w:r>
-        <w:lastRenderedPageBreak/>
-        <w:t xml:space="preserve">5.3). A data-level intervention that makes the experts genuinely dissimilar without changing anything </w:t>
+        <w:t xml:space="preserve"> The dose-response relation rests on fifteen constructed expert configurations evaluated with three-fold cross-fitting; it shows that the gain moves with expert disagreement, not that disagreement alone causes a gain. The one intervention that was run is on the model side: replacing the gate's logistic risk model with a gradient-boosted ensemble leaves the gain at +0.000050, well inside the margin (Section 5.3). A data-level intervention that makes the experts genuinely dissimilar without changing anything </w:t>
       </w:r>
       <w:r>
         <w:t>else remains untested.</w:t>
@@ -11730,16 +11745,105 @@
         <w:rPr>
           <w:b/>
         </w:rPr>
-        <w:t>Fourteen corpora were evaluated, and every corpus comes from one collection programme.</w:t>
-      </w:r>
-      <w:r>
-        <w:t xml:space="preserve"> The conclusions are conditional on CIC-IDS2017 (capped populations and the full deduplicated corpus), NSL-KDD, UNSW-NB15 and N-BaIoT; CIC-IDS2018, CIC-IoT-2023, LITNET-2020, IoT-23, RT-IoT2022, ACI-IoT-2023 and the 2025 corpora (UAVIDS-2025, GeNIS, IDS2025, Gotham-2025) were added as extension corpora (Section 5.8) and reproduce the primary comparison. N-BaIoT is saturated for flow-feature classifiers (every model at or above 0.9998 Macro-F1), so it probes the mechanics of the aggregation step rather than </w:t>
-      </w:r>
-      <w:r>
-        <w:t>discrimination difficulty, and the external datasets remain independent native-label benchmarks rather than transfer tests. None of the fourteen represents production traffic. A day-level split of CIC-IDS2017 is constructible, but every capture day carries only a subset of the five classes (Monday Normal only; Tuesday Normal and Brute Force; Wednesday Normal and DoS/DDoS; Thursday adds Web Attack; Friday adds Bot), so it is not category-complete: the measured day-holdout Macro-F1 collapses to 0.13-0.32 acro</w:t>
-      </w:r>
-      <w:r>
-        <w:t>ss the five days, which is what that limitation now quantifies.</w:t>
+        <w:t>Seventeen corpora were evaluated, and every corpus comes from one collection programme.</w:t>
+      </w:r>
+      <w:r>
+        <w:t xml:space="preserve"> The conclusions are conditional on CIC-IDS2017 (capped populations and the full deduplicated corpus), NSL-KDD, UNSW-NB15 and N-BaIoT; CIC-IDS2018, CIC-IoT-2023, LITNET-2020, IoT-23, RT-IoT2022, ACI-IoT-2023 and the recent corpora (from UAVIDS-2025 and GeNIS in early 2025 to CTU-IDSEVAL-6, 6TiSCHSet-2026 and the RTN </w:t>
+      </w:r>
+      <w:r>
+        <w:lastRenderedPageBreak/>
+        <w:t>packet table in 2026) were added as extension corpora (Section 5.8) and reproduce the primary comparison. N-BaIoT is saturated for flow-feature classifiers (every model at or above 0.9998 Macro-</w:t>
+      </w:r>
+      <w:r>
+        <w:t>F1), so it probes the mechanics of the aggregation step rather than discrimination difficulty, and the external datasets remain independent native-label benchmarks rather than transfer tests. None of the seventeen represents production traffic. A day-level split of CIC-IDS2017 is constructible, but every capture day carries only a subset of the five classes (Monday Normal only; Tuesday Normal and Brute Force; Wednesday Normal and DoS/DDoS; Thursday adds Web Attack; Friday adds Bot), so it is not category-co</w:t>
+      </w:r>
+      <w:r>
+        <w:t>mplete: the measured day-holdout Macro-F1 collapses to 0.13-0.32 across the five days, which is what that limitation now quantifies.</w:t>
+      </w:r>
+    </w:p>
+    <w:p>
+      <w:r>
+        <w:rPr>
+          <w:b/>
+        </w:rPr>
+        <w:t>Adversarial robustness was not assessed.</w:t>
+      </w:r>
+      <w:r>
+        <w:t xml:space="preserve"> Only random perturbations and feature masking were applied. No evasion or gradient-based attack was constructed, and the reported degradation figures are not robustness guarantees against an adaptive adversary.</w:t>
+      </w:r>
+    </w:p>
+    <w:p>
+      <w:r>
+        <w:rPr>
+          <w:b/>
+        </w:rPr>
+        <w:t>Unknown-family support is uneven.</w:t>
+      </w:r>
+      <w:r>
+        <w:t xml:space="preserve"> PortScan contributes 158,930 records while Infiltration contributes 36 and Heartbleed 11. Open-set metrics are highly sensitive to which family is held out, so only per-family results are reported and no pooled open-set conclusion is drawn; the family-combination matrix is in Supplementary S30.</w:t>
+      </w:r>
+    </w:p>
+    <w:p>
+      <w:r>
+        <w:rPr>
+          <w:b/>
+        </w:rPr>
+        <w:t>Bootstrap intervals have a limited interpretation.</w:t>
+      </w:r>
+      <w:r>
+        <w:t xml:space="preserve"> The paired bootstrap quantifies test-row resampling uncertainty only; it does not capture changes in network environment, temporal drift or traffic composition.</w:t>
+      </w:r>
+    </w:p>
+    <w:p>
+      <w:r>
+        <w:rPr>
+          <w:b/>
+        </w:rPr>
+        <w:t>Single hardware platform and single implementation.</w:t>
+      </w:r>
+      <w:r>
+        <w:t xml:space="preserve"> Latency depends on hardware, the BLAS backend and thread settings. The environment is fixed and recorded, but no cross-platform portability is claimed.</w:t>
+      </w:r>
+    </w:p>
+    <w:p>
+      <w:pPr>
+        <w:pStyle w:val="1"/>
+      </w:pPr>
+      <w:r>
+        <w:t>7. Conclusion</w:t>
+      </w:r>
+    </w:p>
+    <w:p>
+      <w:r>
+        <w:t>This study tested the widely adopted assumption that sample-conditional ensemble weighting is better than equal voting, under a strict leakage-controlled protocol. Three conclusions follow.</w:t>
+      </w:r>
+    </w:p>
+    <w:p>
+      <w:r>
+        <w:rPr>
+          <w:b/>
+        </w:rPr>
+        <w:t>First, relative to the most direct equal-weight control the gain lies inside an equivalence boundary.</w:t>
+      </w:r>
+      <w:r>
+        <w:t xml:space="preserve"> Averaged over ten seeds on the natural-prior population of CIC-IDS2017, the Macro-F1 difference between conditional weighting and an equal-weight chi-square forest is -0.000456, with the per-seed sign split five to five. Against the equal-weight fusion of those same four experts the gated model changes one label in 79,860 test predictions (-0.000010), which locates the single-view gap in the composition of the ensemble rather than in the gate. Both the seed-level 90% interval [-0.00112, +0.00021] and the t</w:t>
+      </w:r>
+      <w:r>
+        <w:t>est-row paired bootstrap interval [-0.00425, +0.00338] lie inside equivalence margins of 0.005 and 0.01. The four experts disagree on 0.15%-0.66% of test rows, yet the gate matches equal voting on all but one of 79,860 predictions; weight entropy is 0.99998. The cost is about an 80-fold increase in training time and a fivefold increase in batch inference time (ten-seed means, Table 4(a)).</w:t>
+      </w:r>
+    </w:p>
+    <w:p>
+      <w:r>
+        <w:rPr>
+          <w:b/>
+        </w:rPr>
+        <w:t>A qualification on the first conclusion.</w:t>
+      </w:r>
+      <w:r>
+        <w:t xml:space="preserve"> It is a property of the population, not of the mechanism. On the fully uncapped 2,429,503-flow corpus the same comparison turns into a consistent deficit of -0.005533 across all ten seeds (equivalent at 0.01 but not at 0.005), at a 175-fold training cost. The cause is not the weighting - Section 5.3 shows the weights changed one label in 79,860 predictions - but the price of averaging over feature views whose quality diverges at scale: the full-feature view falls 0.021397 behind the chi-square view, and on</w:t>
+      </w:r>
+      <w:r>
+        <w:t>e such expert inside a four-way average accounts for the whole gap (0.005349 predicted against -0.005533 measured). Against a full-feature equal forest the gate is reliably better over ten seeds, but the magnitude matches that of a feature-view change.</w:t>
       </w:r>
     </w:p>
     <w:p>
@@ -11748,10 +11852,13 @@
           <w:b/>
         </w:rPr>
         <w:lastRenderedPageBreak/>
-        <w:t>Adversarial robustness was not assessed.</w:t>
-      </w:r>
-      <w:r>
-        <w:t xml:space="preserve"> Only random perturbations and feature masking were applied. No evasion or gradient-based attack was constructed, and the reported degradation figures are not robustness guarantees against an adaptive adversary.</w:t>
+        <w:t>Second, the failure is explainable and quantified.</w:t>
+      </w:r>
+      <w:r>
+        <w:t xml:space="preserve"> Three identifiability conditions are derived and one of them is turned into a row-wise computable bound, under which 99.91% of 23,958 test rows are provably invariant to the weighting, with a decision margin 3,469 to 5,038 times the perturbation bound. A search over all 108 gate hyper-parameter configurations yields only six distinct validation scores, excluding insufficient tuning. A deliberately constructed reverse experiment shows that the gain moves with expert diversity: two low-diversity expert sets </w:t>
+      </w:r>
+      <w:r>
+        <w:t>gain exactly zero in all six runs, whereas three decorrelated sets gain positively in all nine runs (slope 0.0646, Pearson r = 0.749). The inertness of conditional weighting is therefore not an implementation or tuning artefact but a direct consequence of filter-based multi-view experts being too similar on this kind of data.</w:t>
       </w:r>
     </w:p>
     <w:p>
@@ -11759,95 +11866,6 @@
         <w:rPr>
           <w:b/>
         </w:rPr>
-        <w:t>Unknown-family support is uneven.</w:t>
-      </w:r>
-      <w:r>
-        <w:t xml:space="preserve"> PortScan contributes 158,930 records while Infiltration contributes 36 and Heartbleed 11. Open-set metrics are highly sensitive to which family is held out, so only per-family results are reported and no pooled open-set conclusion is drawn; the family-combination matrix is in Supplementary S30.</w:t>
-      </w:r>
-    </w:p>
-    <w:p>
-      <w:r>
-        <w:rPr>
-          <w:b/>
-        </w:rPr>
-        <w:t>Bootstrap intervals have a limited interpretation.</w:t>
-      </w:r>
-      <w:r>
-        <w:t xml:space="preserve"> The paired bootstrap quantifies test-row resampling uncertainty only; it does not capture changes in network environment, temporal drift or traffic composition.</w:t>
-      </w:r>
-    </w:p>
-    <w:p>
-      <w:r>
-        <w:rPr>
-          <w:b/>
-        </w:rPr>
-        <w:t>Single hardware platform and single implementation.</w:t>
-      </w:r>
-      <w:r>
-        <w:t xml:space="preserve"> Latency depends on hardware, the BLAS backend and thread settings. The environment is fixed and recorded, but no cross-platform portability is claimed.</w:t>
-      </w:r>
-    </w:p>
-    <w:p>
-      <w:pPr>
-        <w:pStyle w:val="1"/>
-      </w:pPr>
-      <w:r>
-        <w:t>7. Conclusion</w:t>
-      </w:r>
-    </w:p>
-    <w:p>
-      <w:r>
-        <w:t>This study tested the widely adopted assumption that sample-conditional ensemble weighting is better than equal voting, under a strict leakage-controlled protocol. Three conclusions follow.</w:t>
-      </w:r>
-    </w:p>
-    <w:p>
-      <w:r>
-        <w:rPr>
-          <w:b/>
-        </w:rPr>
-        <w:t>First, relative to the most direct equal-weight control the gain lies inside an equivalence boundary.</w:t>
-      </w:r>
-      <w:r>
-        <w:t xml:space="preserve"> Averaged over ten seeds on the natural-prior population of CIC-IDS2017, the Macro-F1 difference between conditional weighting and an equal-weight chi-square forest is -0.000456, with the per-seed sign split five to five. Against the equal-weight fusion of those same four experts the gated model changes one label in 79,860 test predictions (-0.000010), which locates the single-view gap in the composition of the ensemble rather than in the gate. Both the seed-level 90% interval [-0.00112, +0.00021] and the t</w:t>
-      </w:r>
-      <w:r>
-        <w:t>est-row paired bootstrap interval [-0.00425, +0.00338] lie inside equivalence margins of 0.005 and 0.01. The four experts disagree on 0.15%-0.66% of test rows, yet the gate matches equal voting on all but one of 79,860 predictions; weight entropy is 0.99998. The cost is about an 80-fold increase in training time and a fivefold increase in batch inference time (ten-seed means, Table 4(a)).</w:t>
-      </w:r>
-    </w:p>
-    <w:p>
-      <w:r>
-        <w:rPr>
-          <w:b/>
-        </w:rPr>
-        <w:t>A qualification on the first conclusion.</w:t>
-      </w:r>
-      <w:r>
-        <w:t xml:space="preserve"> It is a property of the population, not of the mechanism. On the fully uncapped 2,429,503-flow corpus the same comparison turns into a consistent deficit of -0.005533 across all ten seeds (equivalent at 0.01 but not at 0.005), at a 175-fold training cost. The cause is not the weighting - Section 5.3 shows the weights changed one label in 79,860 predictions - but the price of averaging over feature views whose quality diverges at scale: the full-feature view falls 0.021397 behind the chi-square view, and on</w:t>
-      </w:r>
-      <w:r>
-        <w:t>e such expert inside a four-way average accounts for the whole gap (0.005349 predicted against -0.005533 measured). Against a full-feature equal forest the gate is reliably better over ten seeds, but the magnitude matches that of a feature-view change.</w:t>
-      </w:r>
-    </w:p>
-    <w:p>
-      <w:r>
-        <w:rPr>
-          <w:b/>
-        </w:rPr>
-        <w:t>Second, the failure is explainable and quantified.</w:t>
-      </w:r>
-      <w:r>
-        <w:t xml:space="preserve"> Three identifiability conditions are derived and one of them is turned into a row-wise computable bound, under which 99.91% of 23,958 test rows are provably invariant to the weighting, with a decision margin 3,469 to 5,038 times the perturbation bound. A search over all 108 gate hyper-parameter configurations yields only six distinct validation scores, excluding insufficient tuning. A deliberately constructed reverse experiment shows that the gain moves with expert diversity: two low-diversity expert sets </w:t>
-      </w:r>
-      <w:r>
-        <w:t>gain exactly zero in all six runs, whereas three decorrelated sets gain positively in all nine runs (slope 0.0646, Pearson r = 0.749). The inertness of conditional weighting is therefore not an implementation or tuning artefact but a direct consequence of filter-based multi-view experts being too similar on this kind of data.</w:t>
-      </w:r>
-    </w:p>
-    <w:p>
-      <w:r>
-        <w:rPr>
-          <w:b/>
-        </w:rPr>
-        <w:lastRenderedPageBreak/>
         <w:t>Third, protocol effects dominate aggregation-rule differences.</w:t>
       </w:r>
       <w:r>
@@ -11928,6 +11946,7 @@
         <w:pStyle w:val="1"/>
       </w:pPr>
       <w:r>
+        <w:lastRenderedPageBreak/>
         <w:t>CRediT authorship contribution statement</w:t>
       </w:r>
     </w:p>
@@ -11941,7 +11960,6 @@
         <w:pStyle w:val="1"/>
       </w:pPr>
       <w:r>
-        <w:lastRenderedPageBreak/>
         <w:t>References</w:t>
       </w:r>
     </w:p>
@@ -12163,6 +12181,7 @@
         </w:numPr>
       </w:pPr>
       <w:r>
+        <w:lastRenderedPageBreak/>
         <w:t>UCI Machine Learning Repository. Detection of IoT botnet attacks N-BaIoT [dataset]. 2018. DOI:10.24432/C5RC8J.</w:t>
       </w:r>
     </w:p>
@@ -12199,7 +12218,6 @@
         </w:numPr>
       </w:pPr>
       <w:r>
-        <w:lastRenderedPageBreak/>
         <w:t>Liu L, Engelen G, Timmerman J, et al. Error prevalence in NIDS datasets: A case study on CIC-IDS-2017 and CSE-CIC-IDS-2018. IEEE CNS 2022. DOI:10.1109/CNS56114.2022.9947235.</w:t>
       </w:r>
     </w:p>
@@ -12416,6 +12434,7 @@
         </w:numPr>
       </w:pPr>
       <w:r>
+        <w:lastRenderedPageBreak/>
         <w:t>Holm S. A simple sequentially rejective multiple test procedure. Scandinavian Journal of Statistics, 1979, 6(2): 65-70. [no DOI; JSTOR stable record 4615733]</w:t>
       </w:r>
     </w:p>
@@ -12452,7 +12471,6 @@
         </w:numPr>
       </w:pPr>
       <w:r>
-        <w:lastRenderedPageBreak/>
         <w:t>Han S, Kim Y, Lee S. Improvement of the classification performance of an intrusion detection model for rare and unknown attack traffic. Electronics, 2021, 10(18): 2268. DOI:10.3390/electronics10182268.</w:t>
       </w:r>
     </w:p>
@@ -13305,6 +13323,7 @@
               <w:rPr>
                 <w:sz w:val="16"/>
               </w:rPr>
+              <w:lastRenderedPageBreak/>
               <w:t>S22</w:t>
             </w:r>
           </w:p>
@@ -13509,7 +13528,6 @@
               <w:rPr>
                 <w:sz w:val="16"/>
               </w:rPr>
-              <w:lastRenderedPageBreak/>
               <w:t>S28</w:t>
             </w:r>
           </w:p>
@@ -13873,76 +13891,76 @@
       </w:rPr>
     </w:lvl>
   </w:abstractNum>
-  <w:num w:numId="1" w16cid:durableId="1337418789">
+  <w:num w:numId="1" w16cid:durableId="78017460">
     <w:abstractNumId w:val="8"/>
   </w:num>
-  <w:num w:numId="2" w16cid:durableId="639381551">
+  <w:num w:numId="2" w16cid:durableId="865021614">
     <w:abstractNumId w:val="6"/>
   </w:num>
-  <w:num w:numId="3" w16cid:durableId="367724173">
+  <w:num w:numId="3" w16cid:durableId="1461605436">
     <w:abstractNumId w:val="5"/>
   </w:num>
-  <w:num w:numId="4" w16cid:durableId="478424110">
+  <w:num w:numId="4" w16cid:durableId="1187600765">
     <w:abstractNumId w:val="4"/>
   </w:num>
-  <w:num w:numId="5" w16cid:durableId="536359455">
+  <w:num w:numId="5" w16cid:durableId="1171602150">
     <w:abstractNumId w:val="7"/>
   </w:num>
-  <w:num w:numId="6" w16cid:durableId="1608730908">
+  <w:num w:numId="6" w16cid:durableId="1978099579">
     <w:abstractNumId w:val="3"/>
   </w:num>
-  <w:num w:numId="7" w16cid:durableId="6256431">
+  <w:num w:numId="7" w16cid:durableId="817645722">
     <w:abstractNumId w:val="2"/>
   </w:num>
-  <w:num w:numId="8" w16cid:durableId="186993234">
+  <w:num w:numId="8" w16cid:durableId="185027331">
     <w:abstractNumId w:val="1"/>
   </w:num>
-  <w:num w:numId="9" w16cid:durableId="1740588186">
+  <w:num w:numId="9" w16cid:durableId="316963474">
     <w:abstractNumId w:val="0"/>
   </w:num>
-  <w:num w:numId="10" w16cid:durableId="2094667690">
+  <w:num w:numId="10" w16cid:durableId="995038734">
     <w:abstractNumId w:val="7"/>
     <w:lvlOverride w:ilvl="0">
       <w:startOverride w:val="1"/>
     </w:lvlOverride>
   </w:num>
-  <w:num w:numId="11" w16cid:durableId="953705820">
+  <w:num w:numId="11" w16cid:durableId="535964900">
     <w:abstractNumId w:val="7"/>
     <w:lvlOverride w:ilvl="0">
       <w:startOverride w:val="1"/>
     </w:lvlOverride>
   </w:num>
-  <w:num w:numId="12" w16cid:durableId="281964016">
+  <w:num w:numId="12" w16cid:durableId="982856137">
     <w:abstractNumId w:val="7"/>
     <w:lvlOverride w:ilvl="0">
       <w:startOverride w:val="1"/>
     </w:lvlOverride>
   </w:num>
-  <w:num w:numId="13" w16cid:durableId="1306279502">
+  <w:num w:numId="13" w16cid:durableId="547189094">
     <w:abstractNumId w:val="7"/>
     <w:lvlOverride w:ilvl="0">
       <w:startOverride w:val="1"/>
     </w:lvlOverride>
   </w:num>
-  <w:num w:numId="14" w16cid:durableId="2115057205">
+  <w:num w:numId="14" w16cid:durableId="1523787081">
     <w:abstractNumId w:val="7"/>
     <w:lvlOverride w:ilvl="0">
       <w:startOverride w:val="1"/>
     </w:lvlOverride>
   </w:num>
-  <w:num w:numId="15" w16cid:durableId="1971200640">
+  <w:num w:numId="15" w16cid:durableId="907106920">
     <w:abstractNumId w:val="7"/>
     <w:lvlOverride w:ilvl="0">
       <w:startOverride w:val="1"/>
     </w:lvlOverride>
   </w:num>
-  <w:num w:numId="16" w16cid:durableId="728042523">
+  <w:num w:numId="16" w16cid:durableId="1326474469">
     <w:abstractNumId w:val="7"/>
     <w:lvlOverride w:ilvl="0">
       <w:startOverride w:val="1"/>
     </w:lvlOverride>
   </w:num>
-  <w:num w:numId="17" w16cid:durableId="274144364">
+  <w:num w:numId="17" w16cid:durableId="1055196934">
     <w:abstractNumId w:val="7"/>
     <w:lvlOverride w:ilvl="0">
       <w:startOverride w:val="1"/>

</xml_diff>

<commit_message>
Round 20bh: pooled modern-corpus replication - 12 corpora (2020-2026), 120 seed comparisons, +0.000007 [-0.000006, +0.000020]
</commit_message>
<xml_diff>
--- a/重构版论文_v4_20260915/English_SCI_Manuscript_v4.docx
+++ b/重构版论文_v4_20260915/English_SCI_Manuscript_v4.docx
@@ -1039,7 +1039,7 @@
           <w:noProof/>
         </w:rPr>
         <w:drawing>
-          <wp:inline distT="0" distB="0" distL="0" distR="0" wp14:anchorId="6C846D34" wp14:editId="2F5E5050">
+          <wp:inline distT="0" distB="0" distL="0" distR="0" wp14:anchorId="23334892" wp14:editId="0173CD74">
             <wp:extent cx="5760720" cy="2734826"/>
             <wp:effectExtent l="0" t="0" r="0" b="0"/>
             <wp:docPr id="1" name="Picture 1"/>
@@ -2426,7 +2426,7 @@
           <w:noProof/>
         </w:rPr>
         <w:drawing>
-          <wp:inline distT="0" distB="0" distL="0" distR="0" wp14:anchorId="503BE09B" wp14:editId="24248875">
+          <wp:inline distT="0" distB="0" distL="0" distR="0" wp14:anchorId="529D8866" wp14:editId="00867FCF">
             <wp:extent cx="5760720" cy="2722098"/>
             <wp:effectExtent l="0" t="0" r="0" b="0"/>
             <wp:docPr id="2" name="Picture 2"/>
@@ -3419,7 +3419,7 @@
           <w:noProof/>
         </w:rPr>
         <w:drawing>
-          <wp:inline distT="0" distB="0" distL="0" distR="0" wp14:anchorId="2893A46E" wp14:editId="4317E514">
+          <wp:inline distT="0" distB="0" distL="0" distR="0" wp14:anchorId="42E1E378" wp14:editId="6EE04011">
             <wp:extent cx="5760720" cy="3482709"/>
             <wp:effectExtent l="0" t="0" r="0" b="0"/>
             <wp:docPr id="3" name="Picture 3"/>
@@ -4772,23 +4772,20 @@
     </w:p>
     <w:p>
       <w:r>
-        <w:t xml:space="preserve">Together the conditions yield a falsifiable prediction: on data where experts are highly correlated and the risk models are nearly constant, the hard-label gain of conditional weighting should be zero or near zero, the weight </w:t>
-      </w:r>
+        <w:t>Together the conditions yield a falsifiable prediction: on data where experts are highly correlated and the risk models are nearly constant, the hard-label gain of conditional weighting should be zero or near zero, the weight entropy should approach 1, and the expert disagreement rate should approach 0. Section 5.3 tests this prediction directly.</w:t>
+      </w:r>
+    </w:p>
+    <w:p>
+      <w:r>
+        <w:t>The row-wise margin bound and the quantification of Condition 3 are provided in Supplementary S17 and S25.</w:t>
+      </w:r>
+    </w:p>
+    <w:p>
+      <w:pPr>
+        <w:pStyle w:val="21"/>
+      </w:pPr>
       <w:r>
         <w:lastRenderedPageBreak/>
-        <w:t>entropy should approach 1, and the expert disagreement rate should approach 0. Section 5.3 tests this prediction directly.</w:t>
-      </w:r>
-    </w:p>
-    <w:p>
-      <w:r>
-        <w:t>The row-wise margin bound and the quantification of Condition 3 are provided in Supplementary S17 and S25.</w:t>
-      </w:r>
-    </w:p>
-    <w:p>
-      <w:pPr>
-        <w:pStyle w:val="21"/>
-      </w:pPr>
-      <w:r>
         <w:t>4.4 Complexity</w:t>
       </w:r>
     </w:p>
@@ -4931,7 +4928,7 @@
     </w:p>
     <w:p>
       <w:r>
-        <w:t>The chapter follows RQ1 to RQ4. RQ1 is answered in 5.1; RQ2 in 5.2, with the mechanism that explains its outcome in 5.3; RQ3 in 5.4 and again at scale in 5.7; RQ4 in 5.5. Section 5.6 reports calibration, robustness, latency and open-set behaviour, which qualify the comparisons without answering a question of their own.</w:t>
+        <w:t>The chapter follows RQ1 to RQ4. RQ1 is answered in 5.1; RQ2 in 5.2, with the mechanism that explains its outcome in 5.3; RQ3 in 5.4 and again at scale in 5.7; RQ4 in 5.5. Section 5.6 reports calibration, robustness, latency and open-set behaviour, which qualify the comparisons without answering a question of their own. Sections 5.7 to 5.9 extend the same comparisons to scale, to seventeen corpora and to their pooled equivalence test.</w:t>
       </w:r>
     </w:p>
     <w:p>
@@ -4944,15 +4941,15 @@
     </w:p>
     <w:p>
       <w:r>
-        <w:t xml:space="preserve">The feature-quality audit of the balanced control corpus P_bal (2,355 training rows) shows that 12 of the 78 CIC-IDS2017 features are constant (a single value across all rows) and 18 are near-zero-variance; the primary natural-prior split shows 10 constant and 20 near-zero-variance features, so the degeneracy belongs to the feature representation rather than to one population. The constant columns include Bwd PSH Flags, Fwd URG Flags, Bwd </w:t>
-      </w:r>
+        <w:t>The feature-quality audit of the balanced control corpus P_bal (2,355 training rows) shows that 12 of the 78 CIC-IDS2017 features are constant (a single value across all rows) and 18 are near-zero-variance; the primary natural-prior split shows 10 constant and 20 near-zero-variance features, so the degeneracy belongs to the feature representation rather than to one population. The constant columns include Bwd PSH Flags, Fwd URG Flags, Bwd URG Flags, RST Flag Count, CWE Flag Count, ECE Flag Count and six bul</w:t>
+      </w:r>
+      <w:r>
+        <w:t>k-rate fields. H1's premise of redundancy is therefore correct in itself.</w:t>
+      </w:r>
+    </w:p>
+    <w:p>
       <w:r>
         <w:lastRenderedPageBreak/>
-        <w:t>URG Flags, RST Flag Count, CWE Flag Count, ECE Flag Count and six bulk-rate fields. H1's premise of redundancy is therefore correct in itself.</w:t>
-      </w:r>
-    </w:p>
-    <w:p>
-      <w:r>
         <w:t>The chi-square budget k was fixed at 60 on the validation partition from a pre-specified candidate set: validation Macro-F1 was 0.9175 at k = 10, 0.9314 at k = 20, 0.9379 at both k = 30 and k = 40, and 0.9413 at k = 60, flattening between k = 30 and k = 40. This search was carried out on the balanced control protocol; the selected k was then frozen for every final run.</w:t>
       </w:r>
     </w:p>
@@ -6415,7 +6412,6 @@
               <w:rPr>
                 <w:sz w:val="16"/>
               </w:rPr>
-              <w:lastRenderedPageBreak/>
               <w:t>RCCF</w:t>
             </w:r>
           </w:p>
@@ -6710,6 +6706,7 @@
               <w:rPr>
                 <w:sz w:val="16"/>
               </w:rPr>
+              <w:lastRenderedPageBreak/>
               <w:t>Equal RF (full features)</w:t>
             </w:r>
           </w:p>
@@ -7208,7 +7205,7 @@
           <w:noProof/>
         </w:rPr>
         <w:drawing>
-          <wp:inline distT="0" distB="0" distL="0" distR="0" wp14:anchorId="06BC174C" wp14:editId="78D668B7">
+          <wp:inline distT="0" distB="0" distL="0" distR="0" wp14:anchorId="2C06D0CD" wp14:editId="1C850F6F">
             <wp:extent cx="5760720" cy="2356272"/>
             <wp:effectExtent l="0" t="0" r="0" b="0"/>
             <wp:docPr id="4" name="Picture 4"/>
@@ -8171,7 +8168,7 @@
           <w:noProof/>
         </w:rPr>
         <w:drawing>
-          <wp:inline distT="0" distB="0" distL="0" distR="0" wp14:anchorId="547C37D4" wp14:editId="3C76A9E4">
+          <wp:inline distT="0" distB="0" distL="0" distR="0" wp14:anchorId="37ADC953" wp14:editId="2111513E">
             <wp:extent cx="5760720" cy="2045294"/>
             <wp:effectExtent l="0" t="0" r="0" b="0"/>
             <wp:docPr id="5" name="Picture 5"/>
@@ -8349,7 +8346,7 @@
           <w:noProof/>
         </w:rPr>
         <w:drawing>
-          <wp:inline distT="0" distB="0" distL="0" distR="0" wp14:anchorId="2F605C8E" wp14:editId="1ECB8D6D">
+          <wp:inline distT="0" distB="0" distL="0" distR="0" wp14:anchorId="30667411" wp14:editId="657F8105">
             <wp:extent cx="5760720" cy="2308234"/>
             <wp:effectExtent l="0" t="0" r="0" b="0"/>
             <wp:docPr id="6" name="Picture 6"/>
@@ -9081,7 +9078,7 @@
           <w:noProof/>
         </w:rPr>
         <w:drawing>
-          <wp:inline distT="0" distB="0" distL="0" distR="0" wp14:anchorId="01FD6046" wp14:editId="70631074">
+          <wp:inline distT="0" distB="0" distL="0" distR="0" wp14:anchorId="67859CA4" wp14:editId="0BD73B23">
             <wp:extent cx="5760720" cy="2167923"/>
             <wp:effectExtent l="0" t="0" r="0" b="0"/>
             <wp:docPr id="7" name="Picture 7"/>
@@ -9260,7 +9257,7 @@
           <w:noProof/>
         </w:rPr>
         <w:drawing>
-          <wp:inline distT="0" distB="0" distL="0" distR="0" wp14:anchorId="237B26BC" wp14:editId="4689B6C4">
+          <wp:inline distT="0" distB="0" distL="0" distR="0" wp14:anchorId="5B047558" wp14:editId="5516A3AF">
             <wp:extent cx="5760720" cy="2258878"/>
             <wp:effectExtent l="0" t="0" r="0" b="0"/>
             <wp:docPr id="8" name="Picture 8"/>
@@ -9444,7 +9441,7 @@
           <w:noProof/>
         </w:rPr>
         <w:drawing>
-          <wp:inline distT="0" distB="0" distL="0" distR="0" wp14:anchorId="2C354715" wp14:editId="12F4CE38">
+          <wp:inline distT="0" distB="0" distL="0" distR="0" wp14:anchorId="60924DEF" wp14:editId="67C4B019">
             <wp:extent cx="5760720" cy="2516852"/>
             <wp:effectExtent l="0" t="0" r="0" b="0"/>
             <wp:docPr id="9" name="Picture 9"/>
@@ -9581,7 +9578,7 @@
           <w:noProof/>
         </w:rPr>
         <w:drawing>
-          <wp:inline distT="0" distB="0" distL="0" distR="0" wp14:anchorId="5497E8CC" wp14:editId="62CACBA0">
+          <wp:inline distT="0" distB="0" distL="0" distR="0" wp14:anchorId="7FA4ACF5" wp14:editId="6B8C3933">
             <wp:extent cx="5760720" cy="2223311"/>
             <wp:effectExtent l="0" t="0" r="0" b="0"/>
             <wp:docPr id="10" name="Picture 10"/>
@@ -9668,7 +9665,7 @@
         </w:rPr>
         <w:lastRenderedPageBreak/>
         <w:drawing>
-          <wp:inline distT="0" distB="0" distL="0" distR="0" wp14:anchorId="18F29A16" wp14:editId="2E0DF31E">
+          <wp:inline distT="0" distB="0" distL="0" distR="0" wp14:anchorId="7D7B3FA7" wp14:editId="7C45D9AF">
             <wp:extent cx="5760720" cy="2538527"/>
             <wp:effectExtent l="0" t="0" r="0" b="0"/>
             <wp:docPr id="11" name="Picture 11"/>
@@ -10658,6 +10655,22 @@
     </w:p>
     <w:p>
       <w:pPr>
+        <w:pStyle w:val="21"/>
+      </w:pPr>
+      <w:r>
+        <w:t>5.9 Modern replication across twelve corpora</w:t>
+      </w:r>
+    </w:p>
+    <w:p>
+      <w:r>
+        <w:t>The equivalence result above rests on CIC-IDS2017. Twelve further corpora published between 2020 and 2026 - four of them in 2025 and three in 2026 - were run under the same protocol, the same ten seeds and the same-members control, and all of them released their per-row predictions. Re-deriving the paired difference from those predictions gives 120 seed-level comparisons with a pooled mean of +0.000007 Macro-F1 and a 90% interval of [-0.000006, +0.000020] - inside both the 0.005 and the 0.01 margin. One cor</w:t>
+      </w:r>
+      <w:r>
+        <w:t>pus is excluded from that pool and reported on its own: Gotham-2025 with the feature budget cut to eight of sixteen columns, where the gate wins +0.006252 with 10 of 10 seeds positive. Adding that case back in still leaves the aggregate equivalent (+0.000487, 90% interval [+0.000243, +0.000732]). The aggregation-rule conclusion therefore does not depend on the vintage of the corpus, and the single deviation from it is the condition the identifiability analysis predicts.</w:t>
+      </w:r>
+    </w:p>
+    <w:p>
+      <w:pPr>
         <w:pStyle w:val="1"/>
       </w:pPr>
       <w:r>
@@ -10693,7 +10706,11 @@
         <w:t xml:space="preserve"> When forests trained on different feature views return the same posterior for a given input, no convex weighting can change the output (Condition 1). In flow-feature settings this is more common than intuition suggests: the top-60 features selected by chi-square, mutual information and ANOVA overlap heavily, and 12 of the extra columns in the full view are constant. Measurement 6 quantifies the boundary: when pairwise disagreement is 0.20%-0.36%, the gate gains exactly zero in six of six runs; only when di</w:t>
       </w:r>
       <w:r>
-        <w:t>sagreement rises to 3%-6% does the gain become consistently positive. Condition A is therefore not the idealised case of "identical experts" but a loose condition that real flow-feature data satisfies easily.</w:t>
+        <w:t xml:space="preserve">sagreement </w:t>
+      </w:r>
+      <w:r>
+        <w:lastRenderedPageBreak/>
+        <w:t>rises to 3%-6% does the gain become consistently positive. Condition A is therefore not the idealised case of "identical experts" but a loose condition that real flow-feature data satisfies easily.</w:t>
       </w:r>
     </w:p>
     <w:p>
@@ -10723,7 +10740,6 @@
         <w:rPr>
           <w:b/>
         </w:rPr>
-        <w:lastRenderedPageBreak/>
         <w:t>Condition D: heterogeneous members.</w:t>
       </w:r>
       <w:r>
@@ -10861,6 +10877,7 @@
     </w:p>
     <w:p>
       <w:r>
+        <w:lastRenderedPageBreak/>
         <w:t xml:space="preserve">The contribution to the literature is therefore a threshold rather than a refutation: </w:t>
       </w:r>
       <w:r>
@@ -11026,14 +11043,7 @@
               <w:rPr>
                 <w:sz w:val="16"/>
               </w:rPr>
-              <w:t xml:space="preserve">5x3 nested cross-validation (CV): XGBoost minus random forest = </w:t>
-            </w:r>
-            <w:r>
-              <w:rPr>
-                <w:sz w:val="16"/>
-              </w:rPr>
-              <w:lastRenderedPageBreak/>
-              <w:t>+0.0078, interval excludes zero</w:t>
+              <w:t>5x3 nested cross-validation (CV): XGBoost minus random forest = +0.0078, interval excludes zero</w:t>
             </w:r>
           </w:p>
         </w:tc>
@@ -11049,7 +11059,6 @@
               <w:rPr>
                 <w:sz w:val="16"/>
               </w:rPr>
-              <w:lastRenderedPageBreak/>
               <w:t>Requires a tuning budget and longer training</w:t>
             </w:r>
           </w:p>
@@ -11572,6 +11581,7 @@
         <w:rPr>
           <w:b/>
         </w:rPr>
+        <w:lastRenderedPageBreak/>
         <w:t>Paired statistics and effect sizes</w:t>
       </w:r>
       <w:r>
@@ -11637,7 +11647,6 @@
         <w:pStyle w:val="21"/>
       </w:pPr>
       <w:r>
-        <w:lastRenderedPageBreak/>
         <w:t>6.5 Limitations and validity threats</w:t>
       </w:r>
     </w:p>
@@ -11734,7 +11743,11 @@
         <w:t>Near-duplicates are removed only in their exact form.</w:t>
       </w:r>
       <w:r>
-        <w:t xml:space="preserve"> The introduction identifies near-duplicate flows as a hazard of public datasets, and the audit removes exact duplicate feature vectors. Rounding every feature to four significant digits and hashing the result shows that a further 0.36% of the study population forms near-duplicate groups at that resolution, and that 104 rows sit in near-duplicate groups that span the partitions, of which 17 test rows (0.21% of the test set) share a rounded feature vector with a training row. Removing those rows changes Macr</w:t>
+        <w:t xml:space="preserve"> The introduction identifies near-duplicate flows as a hazard of public datasets, and the audit removes exact duplicate feature vectors. Rounding every feature to four </w:t>
+      </w:r>
+      <w:r>
+        <w:lastRenderedPageBreak/>
+        <w:t>significant digits and hashing the result shows that a further 0.36% of the study population forms near-duplicate groups at that resolution, and that 104 rows sit in near-duplicate groups that span the partitions, of which 17 test rows (0.21% of the test set) share a rounded feature vector with a training row. Removing those rows changes Macr</w:t>
       </w:r>
       <w:r>
         <w:t>o-F1 by at most 0.00057 for any of the three models, so the overlap cannot explain the reported differences; coarser resolutions are reported in the supplementary material.</w:t>
@@ -11748,17 +11761,13 @@
         <w:t>Seventeen corpora were evaluated, and every corpus comes from one collection programme.</w:t>
       </w:r>
       <w:r>
-        <w:t xml:space="preserve"> The conclusions are conditional on CIC-IDS2017 (capped populations and the full deduplicated corpus), NSL-KDD, UNSW-NB15 and N-BaIoT; CIC-IDS2018, CIC-IoT-2023, LITNET-2020, IoT-23, RT-IoT2022, ACI-IoT-2023 and the recent corpora (from UAVIDS-2025 and GeNIS in early 2025 to CTU-IDSEVAL-6, 6TiSCHSet-2026 and the RTN </w:t>
-      </w:r>
-      <w:r>
-        <w:lastRenderedPageBreak/>
-        <w:t>packet table in 2026) were added as extension corpora (Section 5.8) and reproduce the primary comparison. N-BaIoT is saturated for flow-feature classifiers (every model at or above 0.9998 Macro-</w:t>
-      </w:r>
-      <w:r>
-        <w:t>F1), so it probes the mechanics of the aggregation step rather than discrimination difficulty, and the external datasets remain independent native-label benchmarks rather than transfer tests. None of the seventeen represents production traffic. A day-level split of CIC-IDS2017 is constructible, but every capture day carries only a subset of the five classes (Monday Normal only; Tuesday Normal and Brute Force; Wednesday Normal and DoS/DDoS; Thursday adds Web Attack; Friday adds Bot), so it is not category-co</w:t>
-      </w:r>
-      <w:r>
-        <w:t>mplete: the measured day-holdout Macro-F1 collapses to 0.13-0.32 across the five days, which is what that limitation now quantifies.</w:t>
+        <w:t xml:space="preserve"> The conclusions are conditional on CIC-IDS2017 (capped populations and the full deduplicated corpus), NSL-KDD, UNSW-NB15 and N-BaIoT; CIC-IDS2018, CIC-IoT-2023, LITNET-2020, IoT-23, RT-IoT2022, ACI-IoT-2023 and the recent corpora (from UAVIDS-2025 and GeNIS in early 2025 to CTU-IDSEVAL-6, 6TiSCHSet-2026 and the RTN packet table in 2026) were added as extension corpora (Section 5.8) and reproduce the primary comparison. N-BaIoT is saturated for flow-feature classifiers (every model at or above 0.9998 Macro-</w:t>
+      </w:r>
+      <w:r>
+        <w:t>F1), so it probes the mechanics of the aggregation step rather than discrimination difficulty, and the external datasets remain independent native-label benchmarks rather than transfer tests. None of the seventeen represents production traffic. Pooling the twelve published in 2020 or later gives 120 seed-level comparisons whose 90% interval, [-0.000006, +0.000020] on a mean of +0.000007, lies inside the 0.005 margin - so the equivalence claim does not rest on the 2017 corpus alone. A day-level split of CIC-</w:t>
+      </w:r>
+      <w:r>
+        <w:t>IDS2017 is constructible, but every capture day carries only a subset of the five classes (Monday Normal only; Tuesday Normal and Brute Force; Wednesday Normal and DoS/DDoS; Thursday adds Web Attack; Friday adds Bot), so it is not category-complete: the measured day-holdout Macro-F1 collapses to 0.13-0.32 across the five days, which is what that limitation now quantifies.</w:t>
       </w:r>
     </w:p>
     <w:p>
@@ -11829,7 +11838,11 @@
         <w:t xml:space="preserve"> Averaged over ten seeds on the natural-prior population of CIC-IDS2017, the Macro-F1 difference between conditional weighting and an equal-weight chi-square forest is -0.000456, with the per-seed sign split five to five. Against the equal-weight fusion of those same four experts the gated model changes one label in 79,860 test predictions (-0.000010), which locates the single-view gap in the composition of the ensemble rather than in the gate. Both the seed-level 90% interval [-0.00112, +0.00021] and the t</w:t>
       </w:r>
       <w:r>
-        <w:t>est-row paired bootstrap interval [-0.00425, +0.00338] lie inside equivalence margins of 0.005 and 0.01. The four experts disagree on 0.15%-0.66% of test rows, yet the gate matches equal voting on all but one of 79,860 predictions; weight entropy is 0.99998. The cost is about an 80-fold increase in training time and a fivefold increase in batch inference time (ten-seed means, Table 4(a)).</w:t>
+        <w:t xml:space="preserve">est-row paired bootstrap interval [-0.00425, +0.00338] lie </w:t>
+      </w:r>
+      <w:r>
+        <w:lastRenderedPageBreak/>
+        <w:t>inside equivalence margins of 0.005 and 0.01. The four experts disagree on 0.15%-0.66% of test rows, yet the gate matches equal voting on all but one of 79,860 predictions; weight entropy is 0.99998. The cost is about an 80-fold increase in training time and a fivefold increase in batch inference time (ten-seed means, Table 4(a)).</w:t>
       </w:r>
     </w:p>
     <w:p>
@@ -11851,7 +11864,6 @@
         <w:rPr>
           <w:b/>
         </w:rPr>
-        <w:lastRenderedPageBreak/>
         <w:t>Second, the failure is explainable and quantified.</w:t>
       </w:r>
       <w:r>
@@ -11907,6 +11919,7 @@
         <w:pStyle w:val="1"/>
       </w:pPr>
       <w:r>
+        <w:lastRenderedPageBreak/>
         <w:t>Funding</w:t>
       </w:r>
     </w:p>
@@ -11946,7 +11959,6 @@
         <w:pStyle w:val="1"/>
       </w:pPr>
       <w:r>
-        <w:lastRenderedPageBreak/>
         <w:t>CRediT authorship contribution statement</w:t>
       </w:r>
     </w:p>
@@ -12109,6 +12121,7 @@
         </w:numPr>
       </w:pPr>
       <w:r>
+        <w:lastRenderedPageBreak/>
         <w:t>Liu H, Setiono R. Chi2: Feature selection and discretization of numeric attributes. ICTAI 1995: 388-391. DOI:10.1109/TAI.1995.479783.</w:t>
       </w:r>
     </w:p>
@@ -12181,7 +12194,6 @@
         </w:numPr>
       </w:pPr>
       <w:r>
-        <w:lastRenderedPageBreak/>
         <w:t>UCI Machine Learning Repository. Detection of IoT botnet attacks N-BaIoT [dataset]. 2018. DOI:10.24432/C5RC8J.</w:t>
       </w:r>
     </w:p>
@@ -12350,6 +12362,7 @@
         </w:numPr>
       </w:pPr>
       <w:r>
+        <w:lastRenderedPageBreak/>
         <w:t>Angelopoulos A N, Bates S. Conformal prediction: A gentle introduction. Foundations and Trends in Machine Learning, 2023, 16(4): 494-591. DOI:10.1561/2200000101.</w:t>
       </w:r>
     </w:p>
@@ -12434,7 +12447,6 @@
         </w:numPr>
       </w:pPr>
       <w:r>
-        <w:lastRenderedPageBreak/>
         <w:t>Holm S. A simple sequentially rejective multiple test procedure. Scandinavian Journal of Statistics, 1979, 6(2): 65-70. [no DOI; JSTOR stable record 4615733]</w:t>
       </w:r>
     </w:p>
@@ -12881,6 +12893,7 @@
               <w:rPr>
                 <w:sz w:val="16"/>
               </w:rPr>
+              <w:lastRenderedPageBreak/>
               <w:t>S09</w:t>
             </w:r>
           </w:p>
@@ -13323,7 +13336,6 @@
               <w:rPr>
                 <w:sz w:val="16"/>
               </w:rPr>
-              <w:lastRenderedPageBreak/>
               <w:t>S22</w:t>
             </w:r>
           </w:p>
@@ -13891,76 +13903,76 @@
       </w:rPr>
     </w:lvl>
   </w:abstractNum>
-  <w:num w:numId="1" w16cid:durableId="78017460">
+  <w:num w:numId="1" w16cid:durableId="1917670296">
     <w:abstractNumId w:val="8"/>
   </w:num>
-  <w:num w:numId="2" w16cid:durableId="865021614">
+  <w:num w:numId="2" w16cid:durableId="1281571264">
     <w:abstractNumId w:val="6"/>
   </w:num>
-  <w:num w:numId="3" w16cid:durableId="1461605436">
+  <w:num w:numId="3" w16cid:durableId="627319782">
     <w:abstractNumId w:val="5"/>
   </w:num>
-  <w:num w:numId="4" w16cid:durableId="1187600765">
+  <w:num w:numId="4" w16cid:durableId="1466773745">
     <w:abstractNumId w:val="4"/>
   </w:num>
-  <w:num w:numId="5" w16cid:durableId="1171602150">
+  <w:num w:numId="5" w16cid:durableId="224148272">
     <w:abstractNumId w:val="7"/>
   </w:num>
-  <w:num w:numId="6" w16cid:durableId="1978099579">
+  <w:num w:numId="6" w16cid:durableId="548346742">
     <w:abstractNumId w:val="3"/>
   </w:num>
-  <w:num w:numId="7" w16cid:durableId="817645722">
+  <w:num w:numId="7" w16cid:durableId="598410886">
     <w:abstractNumId w:val="2"/>
   </w:num>
-  <w:num w:numId="8" w16cid:durableId="185027331">
+  <w:num w:numId="8" w16cid:durableId="1946033980">
     <w:abstractNumId w:val="1"/>
   </w:num>
-  <w:num w:numId="9" w16cid:durableId="316963474">
+  <w:num w:numId="9" w16cid:durableId="1781215892">
     <w:abstractNumId w:val="0"/>
   </w:num>
-  <w:num w:numId="10" w16cid:durableId="995038734">
+  <w:num w:numId="10" w16cid:durableId="205684690">
     <w:abstractNumId w:val="7"/>
     <w:lvlOverride w:ilvl="0">
       <w:startOverride w:val="1"/>
     </w:lvlOverride>
   </w:num>
-  <w:num w:numId="11" w16cid:durableId="535964900">
+  <w:num w:numId="11" w16cid:durableId="1080565273">
     <w:abstractNumId w:val="7"/>
     <w:lvlOverride w:ilvl="0">
       <w:startOverride w:val="1"/>
     </w:lvlOverride>
   </w:num>
-  <w:num w:numId="12" w16cid:durableId="982856137">
+  <w:num w:numId="12" w16cid:durableId="1786343751">
     <w:abstractNumId w:val="7"/>
     <w:lvlOverride w:ilvl="0">
       <w:startOverride w:val="1"/>
     </w:lvlOverride>
   </w:num>
-  <w:num w:numId="13" w16cid:durableId="547189094">
+  <w:num w:numId="13" w16cid:durableId="1459837748">
     <w:abstractNumId w:val="7"/>
     <w:lvlOverride w:ilvl="0">
       <w:startOverride w:val="1"/>
     </w:lvlOverride>
   </w:num>
-  <w:num w:numId="14" w16cid:durableId="1523787081">
+  <w:num w:numId="14" w16cid:durableId="52890942">
     <w:abstractNumId w:val="7"/>
     <w:lvlOverride w:ilvl="0">
       <w:startOverride w:val="1"/>
     </w:lvlOverride>
   </w:num>
-  <w:num w:numId="15" w16cid:durableId="907106920">
+  <w:num w:numId="15" w16cid:durableId="160857403">
     <w:abstractNumId w:val="7"/>
     <w:lvlOverride w:ilvl="0">
       <w:startOverride w:val="1"/>
     </w:lvlOverride>
   </w:num>
-  <w:num w:numId="16" w16cid:durableId="1326474469">
+  <w:num w:numId="16" w16cid:durableId="1411929975">
     <w:abstractNumId w:val="7"/>
     <w:lvlOverride w:ilvl="0">
       <w:startOverride w:val="1"/>
     </w:lvlOverride>
   </w:num>
-  <w:num w:numId="17" w16cid:durableId="1055196934">
+  <w:num w:numId="17" w16cid:durableId="1855536431">
     <w:abstractNumId w:val="7"/>
     <w:lvlOverride w:ilvl="0">
       <w:startOverride w:val="1"/>

</xml_diff>

<commit_message>
Round 20bi: modern-corpus ladder - B/C rungs, uncapped Gotham (7.19M test rows, +0.000009), source holdouts (Gotham 12/78 devices, 6TiSCH 12/122 runs), feature-budget sweep, mechanism suite; 53-check gate green
</commit_message>
<xml_diff>
--- a/重构版论文_v4_20260915/English_SCI_Manuscript_v4.docx
+++ b/重构版论文_v4_20260915/English_SCI_Manuscript_v4.docx
@@ -1039,7 +1039,7 @@
           <w:noProof/>
         </w:rPr>
         <w:drawing>
-          <wp:inline distT="0" distB="0" distL="0" distR="0" wp14:anchorId="23334892" wp14:editId="0173CD74">
+          <wp:inline distT="0" distB="0" distL="0" distR="0" wp14:anchorId="78D16E28" wp14:editId="157BFD0E">
             <wp:extent cx="5760720" cy="2734826"/>
             <wp:effectExtent l="0" t="0" r="0" b="0"/>
             <wp:docPr id="1" name="Picture 1"/>
@@ -2426,7 +2426,7 @@
           <w:noProof/>
         </w:rPr>
         <w:drawing>
-          <wp:inline distT="0" distB="0" distL="0" distR="0" wp14:anchorId="529D8866" wp14:editId="00867FCF">
+          <wp:inline distT="0" distB="0" distL="0" distR="0" wp14:anchorId="50A7B3C3" wp14:editId="4CA82A16">
             <wp:extent cx="5760720" cy="2722098"/>
             <wp:effectExtent l="0" t="0" r="0" b="0"/>
             <wp:docPr id="2" name="Picture 2"/>
@@ -3419,7 +3419,7 @@
           <w:noProof/>
         </w:rPr>
         <w:drawing>
-          <wp:inline distT="0" distB="0" distL="0" distR="0" wp14:anchorId="42E1E378" wp14:editId="6EE04011">
+          <wp:inline distT="0" distB="0" distL="0" distR="0" wp14:anchorId="6A637D8F" wp14:editId="05D4C28D">
             <wp:extent cx="5760720" cy="3482709"/>
             <wp:effectExtent l="0" t="0" r="0" b="0"/>
             <wp:docPr id="3" name="Picture 3"/>
@@ -7205,7 +7205,7 @@
           <w:noProof/>
         </w:rPr>
         <w:drawing>
-          <wp:inline distT="0" distB="0" distL="0" distR="0" wp14:anchorId="2C06D0CD" wp14:editId="1C850F6F">
+          <wp:inline distT="0" distB="0" distL="0" distR="0" wp14:anchorId="4E384867" wp14:editId="603E8590">
             <wp:extent cx="5760720" cy="2356272"/>
             <wp:effectExtent l="0" t="0" r="0" b="0"/>
             <wp:docPr id="4" name="Picture 4"/>
@@ -8168,7 +8168,7 @@
           <w:noProof/>
         </w:rPr>
         <w:drawing>
-          <wp:inline distT="0" distB="0" distL="0" distR="0" wp14:anchorId="37ADC953" wp14:editId="2111513E">
+          <wp:inline distT="0" distB="0" distL="0" distR="0" wp14:anchorId="5996BF9A" wp14:editId="07414C11">
             <wp:extent cx="5760720" cy="2045294"/>
             <wp:effectExtent l="0" t="0" r="0" b="0"/>
             <wp:docPr id="5" name="Picture 5"/>
@@ -8346,7 +8346,7 @@
           <w:noProof/>
         </w:rPr>
         <w:drawing>
-          <wp:inline distT="0" distB="0" distL="0" distR="0" wp14:anchorId="30667411" wp14:editId="657F8105">
+          <wp:inline distT="0" distB="0" distL="0" distR="0" wp14:anchorId="6F0FE8D6" wp14:editId="50645094">
             <wp:extent cx="5760720" cy="2308234"/>
             <wp:effectExtent l="0" t="0" r="0" b="0"/>
             <wp:docPr id="6" name="Picture 6"/>
@@ -9078,7 +9078,7 @@
           <w:noProof/>
         </w:rPr>
         <w:drawing>
-          <wp:inline distT="0" distB="0" distL="0" distR="0" wp14:anchorId="67859CA4" wp14:editId="0BD73B23">
+          <wp:inline distT="0" distB="0" distL="0" distR="0" wp14:anchorId="33741AE7" wp14:editId="0838E14B">
             <wp:extent cx="5760720" cy="2167923"/>
             <wp:effectExtent l="0" t="0" r="0" b="0"/>
             <wp:docPr id="7" name="Picture 7"/>
@@ -9257,7 +9257,7 @@
           <w:noProof/>
         </w:rPr>
         <w:drawing>
-          <wp:inline distT="0" distB="0" distL="0" distR="0" wp14:anchorId="5B047558" wp14:editId="5516A3AF">
+          <wp:inline distT="0" distB="0" distL="0" distR="0" wp14:anchorId="0927B7C4" wp14:editId="53C1928C">
             <wp:extent cx="5760720" cy="2258878"/>
             <wp:effectExtent l="0" t="0" r="0" b="0"/>
             <wp:docPr id="8" name="Picture 8"/>
@@ -9441,7 +9441,7 @@
           <w:noProof/>
         </w:rPr>
         <w:drawing>
-          <wp:inline distT="0" distB="0" distL="0" distR="0" wp14:anchorId="60924DEF" wp14:editId="67C4B019">
+          <wp:inline distT="0" distB="0" distL="0" distR="0" wp14:anchorId="441FF57A" wp14:editId="19192363">
             <wp:extent cx="5760720" cy="2516852"/>
             <wp:effectExtent l="0" t="0" r="0" b="0"/>
             <wp:docPr id="9" name="Picture 9"/>
@@ -9578,7 +9578,7 @@
           <w:noProof/>
         </w:rPr>
         <w:drawing>
-          <wp:inline distT="0" distB="0" distL="0" distR="0" wp14:anchorId="7FA4ACF5" wp14:editId="6B8C3933">
+          <wp:inline distT="0" distB="0" distL="0" distR="0" wp14:anchorId="746F4D2D" wp14:editId="6CF0AABC">
             <wp:extent cx="5760720" cy="2223311"/>
             <wp:effectExtent l="0" t="0" r="0" b="0"/>
             <wp:docPr id="10" name="Picture 10"/>
@@ -9665,7 +9665,7 @@
         </w:rPr>
         <w:lastRenderedPageBreak/>
         <w:drawing>
-          <wp:inline distT="0" distB="0" distL="0" distR="0" wp14:anchorId="7D7B3FA7" wp14:editId="7C45D9AF">
+          <wp:inline distT="0" distB="0" distL="0" distR="0" wp14:anchorId="67D2E402" wp14:editId="2082085B">
             <wp:extent cx="5760720" cy="2538527"/>
             <wp:effectExtent l="0" t="0" r="0" b="0"/>
             <wp:docPr id="11" name="Picture 11"/>
@@ -10618,13 +10618,17 @@
         <w:rPr>
           <w:b/>
         </w:rPr>
-        <w:t>Three more corpora from 2026.</w:t>
-      </w:r>
-      <w:r>
-        <w:t xml:space="preserve"> The three newest openly licensed corpora reproduce the inert result on the same ten seeds. CTU-IDSEVAL-6 (Zeek connection logs, 3 classes, 4,599 test flows) gives 0.893281 for the gate against 0.893307 for the same-members fusion, a -0.000026 difference; 6TiSCHSet-2026, a leakage-aware 6TiSCH benchmark whose own schema defines the 17-feature input, reaches 0.994623 for both arms over 8 classes and 15,957 records; the RTN packet table saturates at 1.000000 for every model. Seventeen corpora now span 1998-20</w:t>
-      </w:r>
-      <w:r>
-        <w:t>26.</w:t>
+        <w:t>The modern-corpus ladder.</w:t>
+      </w:r>
+      <w:r>
+        <w:t xml:space="preserve"> The 2017 scale ladder was re-run on modern corpora: CIC-IoT-2023 at 200k per class (307,516 test rows) differs by -0.000021 and at 500k per class (599,792 rows) by -0.000004; Gotham-2025 differs by +0.000011 at 200k per class (415,223 rows) and by +0.000009 on the uncapped 7,189,693-row corpus (18 classes). The feature-budget sweep is monotone (k=8 +0.001663, k=16 +0.000402, k=32 -0.000002, k=60 -0.000004). Source holdouts give the distribution-shift control: 12/78 Gotham devices, RCCF mean 0.967127, arm g</w:t>
+      </w:r>
+      <w:r>
+        <w:t xml:space="preserve">ap +0.000000; 12/122 6TiSCH runs, mean 0.522326, gap +0.000123. The mechanism suite explains why: the arms </w:t>
+      </w:r>
+      <w:r>
+        <w:lastRenderedPageBreak/>
+        <w:t>change 0 of 297,180 Gotham labels and 12 of 375,160 CIC-IoT-2023 labels (99.45% ruled out by the bound), with tree weights within about ±3% of uniform.</w:t>
       </w:r>
     </w:p>
     <w:p>
@@ -10632,7 +10636,20 @@
         <w:rPr>
           <w:b/>
         </w:rPr>
-        <w:lastRenderedPageBreak/>
+        <w:t>Three more corpora from 2026.</w:t>
+      </w:r>
+      <w:r>
+        <w:t xml:space="preserve"> The three newest openly licensed corpora reproduce the inert result on the same ten seeds. CTU-IDSEVAL-6 (Zeek connection logs, 3 classes, 4,599 test flows) gives 0.893281 for the gate against 0.893307 for the same-members fusion, a -0.000026 difference; 6TiSCHSet-2026, a leakage-aware 6TiSCH benchmark whose own schema defines the 17-feature input, reaches 0.994623 for both arms over 8 classes and 15,957 records; the RTN packet table saturates at 1.000000 for every model. Seventeen corpora now span 1998-20</w:t>
+      </w:r>
+      <w:r>
+        <w:t>26.</w:t>
+      </w:r>
+    </w:p>
+    <w:p>
+      <w:r>
+        <w:rPr>
+          <w:b/>
+        </w:rPr>
         <w:t>Deployment view.</w:t>
       </w:r>
       <w:r>
@@ -10650,7 +10667,10 @@
         <w:t xml:space="preserve"> The seventeen corpora span 1998-2026; eight of them were released in 2020 or later (LITNET-2020, IoT-23, RT-IoT2022, ACI-IoT-2023, CIC-IoT-2023, and three published in 2025: UAVIDS-2025, GeNIS, IDS2025). Every extension corpus now runs on the same ten seeds as the main experiments. On the 2020-2023 group the gate is indistinguishable from the equal-weight fusion of the same members: the differences are +0.000000 (LITNET-2020), +0.000000 (IoT-23), +0.000071 (RT-IoT2022), +0.000004 (ACI-IoT-2023) and -0.0000</w:t>
       </w:r>
       <w:r>
-        <w:t>04 (CIC-IoT-2023), against Macro-F1 levels of 0.999, 0.985, 0.939, 0.778 and 0.751. The three corpora published in 2025 reproduce the same result over 5, 4 and 7 classes, with same-members differences of +0.000020 (UAVIDS-2025), +0.000000 (GeNIS) and +0.000016 (IDS2025), against Macro-F1 levels of 0.9450, 0.9999 and 0.9810. The newer corpora therefore do not sit at a single difficulty level, and the aggregation-rule conclusion does not depend on the vintage of the source corpus.</w:t>
+        <w:t>04 (CIC-IoT-2023), against Macro-F1 levels of 0.999, 0.985, 0.939, 0.778 and 0.751. The three corpora published in 2025 reproduce the same result over 5, 4 and 7 classes, with same-members differences of +0.000020 (UAVIDS-2025), +0.000000 (GeNIS) and +0.000016 (IDS2025), against Macro-F1 levels of 0.9450, 0.9999 and 0.9810. The newer corpora therefore do not sit at a single difficulty level, and the aggregation-rule conclusion does not depend on the vintage of the source corpus. The modern-corpus ladder ext</w:t>
+      </w:r>
+      <w:r>
+        <w:t>ends the same comparison to scale rungs (CIC-IoT-2023 at 200k and 500k per class, Gotham-2025 at 200k per class and uncapped), to source holdouts (12/78 Gotham devices, 12/122 6TiSCH runs) and to the mechanism decomposition.</w:t>
       </w:r>
     </w:p>
     <w:p>
@@ -10687,6 +10707,7 @@
         <w:pStyle w:val="21"/>
       </w:pPr>
       <w:r>
+        <w:lastRenderedPageBreak/>
         <w:t>6.1 Four failure conditions for conditional weighting</w:t>
       </w:r>
     </w:p>
@@ -10706,11 +10727,7 @@
         <w:t xml:space="preserve"> When forests trained on different feature views return the same posterior for a given input, no convex weighting can change the output (Condition 1). In flow-feature settings this is more common than intuition suggests: the top-60 features selected by chi-square, mutual information and ANOVA overlap heavily, and 12 of the extra columns in the full view are constant. Measurement 6 quantifies the boundary: when pairwise disagreement is 0.20%-0.36%, the gate gains exactly zero in six of six runs; only when di</w:t>
       </w:r>
       <w:r>
-        <w:t xml:space="preserve">sagreement </w:t>
-      </w:r>
-      <w:r>
-        <w:lastRenderedPageBreak/>
-        <w:t>rises to 3%-6% does the gain become consistently positive. Condition A is therefore not the idealised case of "identical experts" but a loose condition that real flow-feature data satisfies easily.</w:t>
+        <w:t>sagreement rises to 3%-6% does the gain become consistently positive. Condition A is therefore not the idealised case of "identical experts" but a loose condition that real flow-feature data satisfies easily.</w:t>
       </w:r>
     </w:p>
     <w:p>
@@ -10797,6 +10814,7 @@
         <w:rPr>
           <w:b/>
         </w:rPr>
+        <w:lastRenderedPageBreak/>
         <w:t>Split noise.</w:t>
       </w:r>
       <w:r>
@@ -10877,7 +10895,6 @@
     </w:p>
     <w:p>
       <w:r>
-        <w:lastRenderedPageBreak/>
         <w:t xml:space="preserve">The contribution to the literature is therefore a threshold rather than a refutation: </w:t>
       </w:r>
       <w:r>
@@ -11491,6 +11508,7 @@
         <w:rPr>
           <w:b/>
         </w:rPr>
+        <w:lastRenderedPageBreak/>
         <w:t>A raw-to-final counting chain</w:t>
       </w:r>
       <w:r>
@@ -11581,7 +11599,6 @@
         <w:rPr>
           <w:b/>
         </w:rPr>
-        <w:lastRenderedPageBreak/>
         <w:t>Paired statistics and effect sizes</w:t>
       </w:r>
       <w:r>
@@ -11699,7 +11716,14 @@
         <w:t>The equivalence depends on how the population is built.</w:t>
       </w:r>
       <w:r>
-        <w:t xml:space="preserve"> It holds on the 53,237-flow natural-prior population and on the 7.8-fold larger one, but not on the fully uncapped 2,429,503-flow corpus, where the same comparison becomes a small, consistent deficit. The statement that conditional weighting is indistinguishable from equal voting must therefore always be quoted together with the population it was measured on; it is not a scale-free property.</w:t>
+        <w:t xml:space="preserve"> It holds on the 53,237-flow natural-prior population and on the 7.8-fold larger one, but not on the fully uncapped 2,429,503-flow CIC-IDS2017 corpus, where the same comparison becomes a small, consistent deficit (-0.005533). That deficit did not reproduce on modern corpora: </w:t>
+      </w:r>
+      <w:r>
+        <w:lastRenderedPageBreak/>
+        <w:t>CIC-IoT-2023 differs by -0.000004 at 2,460,000 training rows and the uncapped Gotham-2025 by +0.000009 at 14,250,000 training rows and 7,190,000 test rows, on all ten seeds. The statement must still be quoted with its population, but it</w:t>
+      </w:r>
+      <w:r>
+        <w:t xml:space="preserve"> is not mechanically broken by corpus vintage or training scale; what governs it is member interchangeability, quantified by the feature-budget sweep (k=8 +0.001663 down to k=32 -0.000002) and the mechanism suite (0-12 relabelled rows, weights within about ±3% of uniform).</w:t>
       </w:r>
     </w:p>
     <w:p>
@@ -11743,11 +11767,7 @@
         <w:t>Near-duplicates are removed only in their exact form.</w:t>
       </w:r>
       <w:r>
-        <w:t xml:space="preserve"> The introduction identifies near-duplicate flows as a hazard of public datasets, and the audit removes exact duplicate feature vectors. Rounding every feature to four </w:t>
-      </w:r>
-      <w:r>
-        <w:lastRenderedPageBreak/>
-        <w:t>significant digits and hashing the result shows that a further 0.36% of the study population forms near-duplicate groups at that resolution, and that 104 rows sit in near-duplicate groups that span the partitions, of which 17 test rows (0.21% of the test set) share a rounded feature vector with a training row. Removing those rows changes Macr</w:t>
+        <w:t xml:space="preserve"> The introduction identifies near-duplicate flows as a hazard of public datasets, and the audit removes exact duplicate feature vectors. Rounding every feature to four significant digits and hashing the result shows that a further 0.36% of the study population forms near-duplicate groups at that resolution, and that 104 rows sit in near-duplicate groups that span the partitions, of which 17 test rows (0.21% of the test set) share a rounded feature vector with a training row. Removing those rows changes Macr</w:t>
       </w:r>
       <w:r>
         <w:t>o-F1 by at most 0.00057 for any of the three models, so the overlap cannot explain the reported differences; coarser resolutions are reported in the supplementary material.</w:t>
@@ -11797,6 +11817,7 @@
         <w:rPr>
           <w:b/>
         </w:rPr>
+        <w:lastRenderedPageBreak/>
         <w:t>Bootstrap intervals have a limited interpretation.</w:t>
       </w:r>
       <w:r>
@@ -11838,11 +11859,7 @@
         <w:t xml:space="preserve"> Averaged over ten seeds on the natural-prior population of CIC-IDS2017, the Macro-F1 difference between conditional weighting and an equal-weight chi-square forest is -0.000456, with the per-seed sign split five to five. Against the equal-weight fusion of those same four experts the gated model changes one label in 79,860 test predictions (-0.000010), which locates the single-view gap in the composition of the ensemble rather than in the gate. Both the seed-level 90% interval [-0.00112, +0.00021] and the t</w:t>
       </w:r>
       <w:r>
-        <w:t xml:space="preserve">est-row paired bootstrap interval [-0.00425, +0.00338] lie </w:t>
-      </w:r>
-      <w:r>
-        <w:lastRenderedPageBreak/>
-        <w:t>inside equivalence margins of 0.005 and 0.01. The four experts disagree on 0.15%-0.66% of test rows, yet the gate matches equal voting on all but one of 79,860 predictions; weight entropy is 0.99998. The cost is about an 80-fold increase in training time and a fivefold increase in batch inference time (ten-seed means, Table 4(a)).</w:t>
+        <w:t>est-row paired bootstrap interval [-0.00425, +0.00338] lie inside equivalence margins of 0.005 and 0.01. The four experts disagree on 0.15%-0.66% of test rows, yet the gate matches equal voting on all but one of 79,860 predictions; weight entropy is 0.99998. The cost is about an 80-fold increase in training time and a fivefold increase in batch inference time (ten-seed means, Table 4(a)).</w:t>
       </w:r>
     </w:p>
     <w:p>
@@ -11895,6 +11912,7 @@
     </w:p>
     <w:p>
       <w:r>
+        <w:lastRenderedPageBreak/>
         <w:t>The principal contribution is not a new state-of-the-art classifier but a reusable leakage-controlled protocol, a set of falsifiable identifiability boundaries, and a quantitative map that separates protocol effects from aggregation-rule effects. Three directions follow. First, design weighting mechanisms that explicitly enforce expert decorrelation, and test whether the gain is restored once the premise of Condition 1 is broken. Second, construct category-complete temporal or cross-scenario protocols so th</w:t>
       </w:r>
       <w:r>
@@ -11919,7 +11937,6 @@
         <w:pStyle w:val="1"/>
       </w:pPr>
       <w:r>
-        <w:lastRenderedPageBreak/>
         <w:t>Funding</w:t>
       </w:r>
     </w:p>
@@ -12025,6 +12042,7 @@
         </w:numPr>
       </w:pPr>
       <w:r>
+        <w:lastRenderedPageBreak/>
         <w:t>Chen T, Guestrin C. XGBoost: A scalable tree boosting system. KDD 2016: 785-794. DOI:10.1145/2939672.2939785.</w:t>
       </w:r>
     </w:p>
@@ -12121,7 +12139,6 @@
         </w:numPr>
       </w:pPr>
       <w:r>
-        <w:lastRenderedPageBreak/>
         <w:t>Liu H, Setiono R. Chi2: Feature selection and discretization of numeric attributes. ICTAI 1995: 388-391. DOI:10.1109/TAI.1995.479783.</w:t>
       </w:r>
     </w:p>
@@ -12278,6 +12295,7 @@
         </w:numPr>
       </w:pPr>
       <w:r>
+        <w:lastRenderedPageBreak/>
         <w:t>Khraisat A, Gondal I, Vamplew P, Kamruzzaman J. Survey of intrusion detection systems: Techniques, datasets and challenges. Cybersecurity, 2019, 2: 20. DOI:10.1186/s42400-019-0038-7.</w:t>
       </w:r>
     </w:p>
@@ -12362,7 +12380,6 @@
         </w:numPr>
       </w:pPr>
       <w:r>
-        <w:lastRenderedPageBreak/>
         <w:t>Angelopoulos A N, Bates S. Conformal prediction: A gentle introduction. Foundations and Trends in Machine Learning, 2023, 16(4): 494-591. DOI:10.1561/2200000101.</w:t>
       </w:r>
     </w:p>
@@ -12543,6 +12560,7 @@
         </w:numPr>
       </w:pPr>
       <w:r>
+        <w:lastRenderedPageBreak/>
         <w:t>Hunter J D. Matplotlib: A 2D graphics environment. Computing in Science &amp; Engineering, 2007, 9(3): 90-95. DOI:10.1109/MCSE.2007.55.</w:t>
       </w:r>
     </w:p>
@@ -12893,7 +12911,6 @@
               <w:rPr>
                 <w:sz w:val="16"/>
               </w:rPr>
-              <w:lastRenderedPageBreak/>
               <w:t>S09</w:t>
             </w:r>
           </w:p>
@@ -13903,76 +13920,76 @@
       </w:rPr>
     </w:lvl>
   </w:abstractNum>
-  <w:num w:numId="1" w16cid:durableId="1917670296">
+  <w:num w:numId="1" w16cid:durableId="2126728364">
     <w:abstractNumId w:val="8"/>
   </w:num>
-  <w:num w:numId="2" w16cid:durableId="1281571264">
+  <w:num w:numId="2" w16cid:durableId="1974754575">
     <w:abstractNumId w:val="6"/>
   </w:num>
-  <w:num w:numId="3" w16cid:durableId="627319782">
+  <w:num w:numId="3" w16cid:durableId="2001495176">
     <w:abstractNumId w:val="5"/>
   </w:num>
-  <w:num w:numId="4" w16cid:durableId="1466773745">
+  <w:num w:numId="4" w16cid:durableId="400712767">
     <w:abstractNumId w:val="4"/>
   </w:num>
-  <w:num w:numId="5" w16cid:durableId="224148272">
+  <w:num w:numId="5" w16cid:durableId="258953991">
     <w:abstractNumId w:val="7"/>
   </w:num>
-  <w:num w:numId="6" w16cid:durableId="548346742">
+  <w:num w:numId="6" w16cid:durableId="1188175387">
     <w:abstractNumId w:val="3"/>
   </w:num>
-  <w:num w:numId="7" w16cid:durableId="598410886">
+  <w:num w:numId="7" w16cid:durableId="1766342138">
     <w:abstractNumId w:val="2"/>
   </w:num>
-  <w:num w:numId="8" w16cid:durableId="1946033980">
+  <w:num w:numId="8" w16cid:durableId="1695377573">
     <w:abstractNumId w:val="1"/>
   </w:num>
-  <w:num w:numId="9" w16cid:durableId="1781215892">
+  <w:num w:numId="9" w16cid:durableId="862792368">
     <w:abstractNumId w:val="0"/>
   </w:num>
-  <w:num w:numId="10" w16cid:durableId="205684690">
+  <w:num w:numId="10" w16cid:durableId="1700008251">
     <w:abstractNumId w:val="7"/>
     <w:lvlOverride w:ilvl="0">
       <w:startOverride w:val="1"/>
     </w:lvlOverride>
   </w:num>
-  <w:num w:numId="11" w16cid:durableId="1080565273">
+  <w:num w:numId="11" w16cid:durableId="342781634">
     <w:abstractNumId w:val="7"/>
     <w:lvlOverride w:ilvl="0">
       <w:startOverride w:val="1"/>
     </w:lvlOverride>
   </w:num>
-  <w:num w:numId="12" w16cid:durableId="1786343751">
+  <w:num w:numId="12" w16cid:durableId="162549864">
     <w:abstractNumId w:val="7"/>
     <w:lvlOverride w:ilvl="0">
       <w:startOverride w:val="1"/>
     </w:lvlOverride>
   </w:num>
-  <w:num w:numId="13" w16cid:durableId="1459837748">
+  <w:num w:numId="13" w16cid:durableId="1296368765">
     <w:abstractNumId w:val="7"/>
     <w:lvlOverride w:ilvl="0">
       <w:startOverride w:val="1"/>
     </w:lvlOverride>
   </w:num>
-  <w:num w:numId="14" w16cid:durableId="52890942">
+  <w:num w:numId="14" w16cid:durableId="247734087">
     <w:abstractNumId w:val="7"/>
     <w:lvlOverride w:ilvl="0">
       <w:startOverride w:val="1"/>
     </w:lvlOverride>
   </w:num>
-  <w:num w:numId="15" w16cid:durableId="160857403">
+  <w:num w:numId="15" w16cid:durableId="1997490954">
     <w:abstractNumId w:val="7"/>
     <w:lvlOverride w:ilvl="0">
       <w:startOverride w:val="1"/>
     </w:lvlOverride>
   </w:num>
-  <w:num w:numId="16" w16cid:durableId="1411929975">
+  <w:num w:numId="16" w16cid:durableId="1995335151">
     <w:abstractNumId w:val="7"/>
     <w:lvlOverride w:ilvl="0">
       <w:startOverride w:val="1"/>
     </w:lvlOverride>
   </w:num>
-  <w:num w:numId="17" w16cid:durableId="1855536431">
+  <w:num w:numId="17" w16cid:durableId="541476389">
     <w:abstractNumId w:val="7"/>
     <w:lvlOverride w:ilvl="0">
       <w:startOverride w:val="1"/>

</xml_diff>

<commit_message>
Round 20bj: close the Round 20 documentation debt and refresh the meta layer - review report to Round 20, gap audit/self-check/work log, briefings and a 13-slide deck, Figure 12 (ladder), JISA abstract back under 250 words, tree-weight claim stated exactly, desktop-sync and archive scripts, memory guard; 53-check gate green
</commit_message>
<xml_diff>
--- a/重构版论文_v4_20260915/English_SCI_Manuscript_v4.docx
+++ b/重构版论文_v4_20260915/English_SCI_Manuscript_v4.docx
@@ -1039,7 +1039,7 @@
           <w:noProof/>
         </w:rPr>
         <w:drawing>
-          <wp:inline distT="0" distB="0" distL="0" distR="0" wp14:anchorId="78D16E28" wp14:editId="157BFD0E">
+          <wp:inline distT="0" distB="0" distL="0" distR="0" wp14:anchorId="7DD9CC6E" wp14:editId="2784935F">
             <wp:extent cx="5760720" cy="2734826"/>
             <wp:effectExtent l="0" t="0" r="0" b="0"/>
             <wp:docPr id="1" name="Picture 1"/>
@@ -2426,7 +2426,7 @@
           <w:noProof/>
         </w:rPr>
         <w:drawing>
-          <wp:inline distT="0" distB="0" distL="0" distR="0" wp14:anchorId="50A7B3C3" wp14:editId="4CA82A16">
+          <wp:inline distT="0" distB="0" distL="0" distR="0" wp14:anchorId="24165D49" wp14:editId="09056EB9">
             <wp:extent cx="5760720" cy="2722098"/>
             <wp:effectExtent l="0" t="0" r="0" b="0"/>
             <wp:docPr id="2" name="Picture 2"/>
@@ -3419,7 +3419,7 @@
           <w:noProof/>
         </w:rPr>
         <w:drawing>
-          <wp:inline distT="0" distB="0" distL="0" distR="0" wp14:anchorId="6A637D8F" wp14:editId="05D4C28D">
+          <wp:inline distT="0" distB="0" distL="0" distR="0" wp14:anchorId="30756156" wp14:editId="2223E793">
             <wp:extent cx="5760720" cy="3482709"/>
             <wp:effectExtent l="0" t="0" r="0" b="0"/>
             <wp:docPr id="3" name="Picture 3"/>
@@ -4777,6 +4777,7 @@
     </w:p>
     <w:p>
       <w:r>
+        <w:lastRenderedPageBreak/>
         <w:t>The row-wise margin bound and the quantification of Condition 3 are provided in Supplementary S17 and S25.</w:t>
       </w:r>
     </w:p>
@@ -4785,7 +4786,6 @@
         <w:pStyle w:val="21"/>
       </w:pPr>
       <w:r>
-        <w:lastRenderedPageBreak/>
         <w:t>4.4 Complexity</w:t>
       </w:r>
     </w:p>
@@ -4941,15 +4941,15 @@
     </w:p>
     <w:p>
       <w:r>
-        <w:t>The feature-quality audit of the balanced control corpus P_bal (2,355 training rows) shows that 12 of the 78 CIC-IDS2017 features are constant (a single value across all rows) and 18 are near-zero-variance; the primary natural-prior split shows 10 constant and 20 near-zero-variance features, so the degeneracy belongs to the feature representation rather than to one population. The constant columns include Bwd PSH Flags, Fwd URG Flags, Bwd URG Flags, RST Flag Count, CWE Flag Count, ECE Flag Count and six bul</w:t>
-      </w:r>
-      <w:r>
-        <w:t>k-rate fields. H1's premise of redundancy is therefore correct in itself.</w:t>
-      </w:r>
-    </w:p>
-    <w:p>
+        <w:t xml:space="preserve">The feature-quality audit of the balanced control corpus P_bal (2,355 training rows) shows that 12 of the 78 CIC-IDS2017 features are constant (a single value across all rows) and 18 are near-zero-variance; the primary natural-prior split shows 10 constant and 20 near-zero-variance features, so the degeneracy belongs to the feature representation rather than to one population. The constant columns include Bwd PSH Flags, Fwd URG Flags, Bwd </w:t>
+      </w:r>
       <w:r>
         <w:lastRenderedPageBreak/>
+        <w:t>URG Flags, RST Flag Count, CWE Flag Count, ECE Flag Count and six bulk-rate fields. H1's premise of redundancy is therefore correct in itself.</w:t>
+      </w:r>
+    </w:p>
+    <w:p>
+      <w:r>
         <w:t>The chi-square budget k was fixed at 60 on the validation partition from a pre-specified candidate set: validation Macro-F1 was 0.9175 at k = 10, 0.9314 at k = 20, 0.9379 at both k = 30 and k = 40, and 0.9413 at k = 60, flattening between k = 30 and k = 40. This search was carried out on the balanced control protocol; the selected k was then frozen for every final run.</w:t>
       </w:r>
     </w:p>
@@ -6412,6 +6412,7 @@
               <w:rPr>
                 <w:sz w:val="16"/>
               </w:rPr>
+              <w:lastRenderedPageBreak/>
               <w:t>RCCF</w:t>
             </w:r>
           </w:p>
@@ -6706,7 +6707,6 @@
               <w:rPr>
                 <w:sz w:val="16"/>
               </w:rPr>
-              <w:lastRenderedPageBreak/>
               <w:t>Equal RF (full features)</w:t>
             </w:r>
           </w:p>
@@ -7205,7 +7205,7 @@
           <w:noProof/>
         </w:rPr>
         <w:drawing>
-          <wp:inline distT="0" distB="0" distL="0" distR="0" wp14:anchorId="4E384867" wp14:editId="603E8590">
+          <wp:inline distT="0" distB="0" distL="0" distR="0" wp14:anchorId="5677C93E" wp14:editId="4C703D5E">
             <wp:extent cx="5760720" cy="2356272"/>
             <wp:effectExtent l="0" t="0" r="0" b="0"/>
             <wp:docPr id="4" name="Picture 4"/>
@@ -7267,11 +7267,11 @@
         <w:t>Second, the paired statistics establish equivalence at a strict margin.</w:t>
       </w:r>
       <w:r>
-        <w:t xml:space="preserve"> With ten seeds the mean paired difference is -0.000456 with a standard deviation of 0.001152. Two interval estimates are reported because they answer different questions: the seed-level 90% interval [-0.001124, +0.000212] reflects model-to-model variability, while the test-row paired bootstrap interval [-0.004251, +0.003382] reflects resampling uncertainty over the locked test set. Both lie inside equivalence margins of 0.005 and 0.01 Macro-F1, so equivalence can be asserted at alpha = 0.05 </w:t>
+        <w:t xml:space="preserve"> With ten seeds the mean paired difference is -0.000456 with a standard deviation of 0.001152. Two interval estimates are reported because they answer </w:t>
       </w:r>
       <w:r>
         <w:lastRenderedPageBreak/>
-        <w:t xml:space="preserve">against either </w:t>
+        <w:t xml:space="preserve">different questions: the seed-level 90% interval [-0.001124, +0.000212] reflects model-to-model variability, while the test-row paired bootstrap interval [-0.004251, +0.003382] reflects resampling uncertainty over the locked test set. Both lie inside equivalence margins of 0.005 and 0.01 Macro-F1, so equivalence can be asserted at alpha = 0.05 against either </w:t>
       </w:r>
       <w:r>
         <w:t xml:space="preserve">margin. This strengthens the three-seed analysis, for which the 0.005 margin was not attainable. The sign of the difference is split five to five across seeds, and exact McNemar tests on the test rows are non-significant. Under the pre-declared decision rule - stable, consistent in sign, and bounded away from zero - </w:t>
@@ -8110,14 +8110,11 @@
         <w:rPr>
           <w:b/>
         </w:rPr>
+        <w:lastRenderedPageBreak/>
         <w:t>Fifth, a neural baseline shows how badly accuracy can mislead.</w:t>
       </w:r>
       <w:r>
-        <w:t xml:space="preserve"> A multilayer perceptron given the same feature budget and a full training budget (128 hidden units, hyper-parameters selected on the validation partition) reaches 0.97679 accuracy against RCCF's 0.97792, but only 0.797654 Macro-F1 against 0.889955, i.e. 0.092 lower. Its balanced accuracy is 0.79666 against 0.94920 and its Brier score is 0.036701 against 0.006312. Every comparison </w:t>
-      </w:r>
-      <w:r>
-        <w:lastRenderedPageBreak/>
-        <w:t>in this paragraph is computed on the three seeds common to both runs (42, 2024, 3407), the seeds on which the neural baseline wa</w:t>
+        <w:t xml:space="preserve"> A multilayer perceptron given the same feature budget and a full training budget (128 hidden units, hyper-parameters selected on the validation partition) reaches 0.97679 accuracy against RCCF's 0.97792, but only 0.797654 Macro-F1 against 0.889955, i.e. 0.092 lower. Its balanced accuracy is 0.79666 against 0.94920 and its Brier score is 0.036701 against 0.006312. Every comparison in this paragraph is computed on the three seeds common to both runs (42, 2024, 3407), the seeds on which the neural baseline wa</w:t>
       </w:r>
       <w:r>
         <w:t xml:space="preserve">s trained; Table 4(a) gives the corresponding ten-seed RCCF values. Notably, a paired McNemar test on overall correctness is not significant (pooled p = 0.383 over 23,958 rows; per-seed 1.000 / 0.768 / 0.261), because the two models make a similar </w:t>
@@ -8168,7 +8165,7 @@
           <w:noProof/>
         </w:rPr>
         <w:drawing>
-          <wp:inline distT="0" distB="0" distL="0" distR="0" wp14:anchorId="5996BF9A" wp14:editId="07414C11">
+          <wp:inline distT="0" distB="0" distL="0" distR="0" wp14:anchorId="08EF23EE" wp14:editId="594220B3">
             <wp:extent cx="5760720" cy="2045294"/>
             <wp:effectExtent l="0" t="0" r="0" b="0"/>
             <wp:docPr id="5" name="Picture 5"/>
@@ -8282,6 +8279,7 @@
         <w:rPr>
           <w:b/>
         </w:rPr>
+        <w:lastRenderedPageBreak/>
         <w:t>Measurement 4: the margin bound proves invariance.</w:t>
       </w:r>
       <w:r>
@@ -8330,11 +8328,7 @@
         <w:t>3,469 to 5,038</w:t>
       </w:r>
       <w:r>
-        <w:t xml:space="preserve"> across </w:t>
-      </w:r>
-      <w:r>
-        <w:lastRenderedPageBreak/>
-        <w:t>seeds. In other words, fused probabilities are close to one-hot and the weight-induced probability movement is three orders of magnitude smaller than the decision margin.</w:t>
+        <w:t xml:space="preserve"> across seeds. In other words, fused probabilities are close to one-hot and the weight-induced probability movement is three orders of magnitude smaller than the decision margin.</w:t>
       </w:r>
     </w:p>
     <w:p>
@@ -8346,7 +8340,7 @@
           <w:noProof/>
         </w:rPr>
         <w:drawing>
-          <wp:inline distT="0" distB="0" distL="0" distR="0" wp14:anchorId="6F0FE8D6" wp14:editId="50645094">
+          <wp:inline distT="0" distB="0" distL="0" distR="0" wp14:anchorId="58ED588E" wp14:editId="246B1E26">
             <wp:extent cx="5760720" cy="2308234"/>
             <wp:effectExtent l="0" t="0" r="0" b="0"/>
             <wp:docPr id="6" name="Picture 6"/>
@@ -8585,7 +8579,14 @@
               <w:rPr>
                 <w:sz w:val="16"/>
               </w:rPr>
-              <w:t>Same view, different seeds</w:t>
+              <w:t xml:space="preserve">Same view, different </w:t>
+            </w:r>
+            <w:r>
+              <w:rPr>
+                <w:sz w:val="16"/>
+              </w:rPr>
+              <w:lastRenderedPageBreak/>
+              <w:t>seeds</w:t>
             </w:r>
           </w:p>
         </w:tc>
@@ -8601,6 +8602,7 @@
               <w:rPr>
                 <w:sz w:val="16"/>
               </w:rPr>
+              <w:lastRenderedPageBreak/>
               <w:t>0.20%</w:t>
             </w:r>
           </w:p>
@@ -8977,7 +8979,6 @@
               <w:rPr>
                 <w:sz w:val="16"/>
               </w:rPr>
-              <w:lastRenderedPageBreak/>
               <w:t>Disjoint feature blocks</w:t>
             </w:r>
           </w:p>
@@ -9078,7 +9079,7 @@
           <w:noProof/>
         </w:rPr>
         <w:drawing>
-          <wp:inline distT="0" distB="0" distL="0" distR="0" wp14:anchorId="33741AE7" wp14:editId="0838E14B">
+          <wp:inline distT="0" distB="0" distL="0" distR="0" wp14:anchorId="3C70541F" wp14:editId="3C580B91">
             <wp:extent cx="5760720" cy="2167923"/>
             <wp:effectExtent l="0" t="0" r="0" b="0"/>
             <wp:docPr id="7" name="Picture 7"/>
@@ -9226,7 +9227,11 @@
         <w:t>0.370%</w:t>
       </w:r>
       <w:r>
-        <w:t>). What is identical is the labelled output - the gate reproduces equal voting on all but one of 79,860 predictions - so the disagreements exist but sit far from the decision boundary, which is what Condition 2 asserts.</w:t>
+        <w:t xml:space="preserve">). </w:t>
+      </w:r>
+      <w:r>
+        <w:lastRenderedPageBreak/>
+        <w:t>What is identical is the labelled output - the gate reproduces equal voting on all but one of 79,860 predictions - so the disagreements exist but sit far from the decision boundary, which is what Condition 2 asserts.</w:t>
       </w:r>
     </w:p>
     <w:p>
@@ -9239,7 +9244,6 @@
         <w:pStyle w:val="21"/>
       </w:pPr>
       <w:r>
-        <w:lastRenderedPageBreak/>
         <w:t>5.4 RQ3: Protocol effects exceed aggregation-rule differences by an order of magnitude</w:t>
       </w:r>
     </w:p>
@@ -9257,7 +9261,7 @@
           <w:noProof/>
         </w:rPr>
         <w:drawing>
-          <wp:inline distT="0" distB="0" distL="0" distR="0" wp14:anchorId="0927B7C4" wp14:editId="53C1928C">
+          <wp:inline distT="0" distB="0" distL="0" distR="0" wp14:anchorId="18C09F82" wp14:editId="30B3EBEF">
             <wp:extent cx="5760720" cy="2258878"/>
             <wp:effectExtent l="0" t="0" r="0" b="0"/>
             <wp:docPr id="8" name="Picture 8"/>
@@ -9394,6 +9398,7 @@
     </w:p>
     <w:p>
       <w:r>
+        <w:lastRenderedPageBreak/>
         <w:t xml:space="preserve">Placing the five magnitudes side by side: aggregation 0.0005, feature view +0.0021, deduplication order +0.0014 (maximum 0.0060), tuning budget +0.0078 and class prior +0.0725. </w:t>
       </w:r>
       <w:r>
@@ -9412,11 +9417,7 @@
         <w:t>families</w:t>
       </w:r>
       <w:r>
-        <w:t xml:space="preserve"> are larger: the multilayer perceptron trails the forests by 0.0916 Macro-F1 and extremely randomised trees by 0.0318, both of which exceed the class-</w:t>
-      </w:r>
-      <w:r>
-        <w:lastRenderedPageBreak/>
-        <w:t>prior effect of 0.0725 in the first case. The defensible statement is therefore that aggregation-rule differences are dominated by protocol choices, whereas model-family differences are not.</w:t>
+        <w:t xml:space="preserve"> are larger: the multilayer perceptron trails the forests by 0.0916 Macro-F1 and extremely randomised trees by 0.0318, both of which exceed the class-prior effect of 0.0725 in the first case. The defensible statement is therefore that aggregation-rule differences are dominated by protocol choices, whereas model-family differences are not.</w:t>
       </w:r>
     </w:p>
     <w:p>
@@ -9441,7 +9442,7 @@
           <w:noProof/>
         </w:rPr>
         <w:drawing>
-          <wp:inline distT="0" distB="0" distL="0" distR="0" wp14:anchorId="441FF57A" wp14:editId="19192363">
+          <wp:inline distT="0" distB="0" distL="0" distR="0" wp14:anchorId="016F0206" wp14:editId="1AAD5DA0">
             <wp:extent cx="5760720" cy="2516852"/>
             <wp:effectExtent l="0" t="0" r="0" b="0"/>
             <wp:docPr id="9" name="Picture 9"/>
@@ -9552,12 +9553,12 @@
     </w:p>
     <w:p>
       <w:r>
+        <w:lastRenderedPageBreak/>
         <w:t>Together the three experiments give a negative answer to RQ4: the conclusions of this study do not extend beyond the CIC-IDS2017 research populations, and within CIC-IDS2017 there is no single extrapolable distribution. This both reinforces the falsification of H3 and shows that "multi-dataset validation" must be kept strictly distinct from "cross-dataset transfer".</w:t>
       </w:r>
     </w:p>
     <w:p>
       <w:r>
-        <w:lastRenderedPageBreak/>
         <w:t>The external benchmarks, the file-level extrapolation and the neural baseline comparison are provided in Supplementary S12-S14 and S19.</w:t>
       </w:r>
     </w:p>
@@ -9578,7 +9579,7 @@
           <w:noProof/>
         </w:rPr>
         <w:drawing>
-          <wp:inline distT="0" distB="0" distL="0" distR="0" wp14:anchorId="746F4D2D" wp14:editId="6CF0AABC">
+          <wp:inline distT="0" distB="0" distL="0" distR="0" wp14:anchorId="07ED7482" wp14:editId="3B9B52BE">
             <wp:extent cx="5760720" cy="2223311"/>
             <wp:effectExtent l="0" t="0" r="0" b="0"/>
             <wp:docPr id="10" name="Picture 10"/>
@@ -9665,7 +9666,7 @@
         </w:rPr>
         <w:lastRenderedPageBreak/>
         <w:drawing>
-          <wp:inline distT="0" distB="0" distL="0" distR="0" wp14:anchorId="67D2E402" wp14:editId="2082085B">
+          <wp:inline distT="0" distB="0" distL="0" distR="0" wp14:anchorId="50C204FF" wp14:editId="3E46952F">
             <wp:extent cx="5760720" cy="2538527"/>
             <wp:effectExtent l="0" t="0" r="0" b="0"/>
             <wp:docPr id="11" name="Picture 11"/>
@@ -10537,7 +10538,7 @@
     </w:p>
     <w:p>
       <w:r>
-        <w:t>Six extensions probe the boundaries of the main result; their per-seed data and a standalone report ship with the release (</w:t>
+        <w:t>Fourteen extensions probe the boundaries of the main result; their per-seed data and a standalone report ship with the release (</w:t>
       </w:r>
       <w:r>
         <w:t>扩展实验报告</w:t>
@@ -10628,7 +10629,65 @@
       </w:r>
       <w:r>
         <w:lastRenderedPageBreak/>
-        <w:t>change 0 of 297,180 Gotham labels and 12 of 375,160 CIC-IoT-2023 labels (99.45% ruled out by the bound), with tree weights within about ±3% of uniform.</w:t>
+        <w:t>change 0 of 297,180 Gotham labels and 12 of 375,160 CIC-IoT-2023 labels (99.45% ruled out by the bound), with tree weights in 0.0091-0.0102 against the 0.01 uniform value.</w:t>
+      </w:r>
+    </w:p>
+    <w:p>
+      <w:pPr>
+        <w:jc w:val="center"/>
+      </w:pPr>
+      <w:r>
+        <w:rPr>
+          <w:noProof/>
+        </w:rPr>
+        <w:drawing>
+          <wp:inline distT="0" distB="0" distL="0" distR="0" wp14:anchorId="34D61127" wp14:editId="135CE049">
+            <wp:extent cx="5760720" cy="1441223"/>
+            <wp:effectExtent l="0" t="0" r="0" b="0"/>
+            <wp:docPr id="12" name="Picture 12"/>
+            <wp:cNvGraphicFramePr>
+              <a:graphicFrameLocks xmlns:a="http://schemas.openxmlformats.org/drawingml/2006/main" noChangeAspect="1"/>
+            </wp:cNvGraphicFramePr>
+            <a:graphic xmlns:a="http://schemas.openxmlformats.org/drawingml/2006/main">
+              <a:graphicData uri="http://schemas.openxmlformats.org/drawingml/2006/picture">
+                <pic:pic xmlns:pic="http://schemas.openxmlformats.org/drawingml/2006/picture">
+                  <pic:nvPicPr>
+                    <pic:cNvPr id="0" name="fig12_ladder_modern.png"/>
+                    <pic:cNvPicPr/>
+                  </pic:nvPicPr>
+                  <pic:blipFill>
+                    <a:blip r:embed="rId19"/>
+                    <a:stretch>
+                      <a:fillRect/>
+                    </a:stretch>
+                  </pic:blipFill>
+                  <pic:spPr>
+                    <a:xfrm>
+                      <a:off x="0" y="0"/>
+                      <a:ext cx="5760720" cy="1441223"/>
+                    </a:xfrm>
+                    <a:prstGeom prst="rect">
+                      <a:avLst/>
+                    </a:prstGeom>
+                  </pic:spPr>
+                </pic:pic>
+              </a:graphicData>
+            </a:graphic>
+          </wp:inline>
+        </w:drawing>
+      </w:r>
+    </w:p>
+    <w:p>
+      <w:pPr>
+        <w:jc w:val="center"/>
+      </w:pPr>
+      <w:r>
+        <w:rPr>
+          <w:i/>
+          <w:color w:val="404040"/>
+          <w:sz w:val="18"/>
+        </w:rPr>
+        <w:t>Figure 12. The modern-corpus ladder: scale rungs, feature budget and mechanism</w:t>
       </w:r>
     </w:p>
     <w:p>
@@ -10686,7 +10745,11 @@
         <w:t>The equivalence result above rests on CIC-IDS2017. Twelve further corpora published between 2020 and 2026 - four of them in 2025 and three in 2026 - were run under the same protocol, the same ten seeds and the same-members control, and all of them released their per-row predictions. Re-deriving the paired difference from those predictions gives 120 seed-level comparisons with a pooled mean of +0.000007 Macro-F1 and a 90% interval of [-0.000006, +0.000020] - inside both the 0.005 and the 0.01 margin. One cor</w:t>
       </w:r>
       <w:r>
-        <w:t>pus is excluded from that pool and reported on its own: Gotham-2025 with the feature budget cut to eight of sixteen columns, where the gate wins +0.006252 with 10 of 10 seeds positive. Adding that case back in still leaves the aggregate equivalent (+0.000487, 90% interval [+0.000243, +0.000732]). The aggregation-rule conclusion therefore does not depend on the vintage of the corpus, and the single deviation from it is the condition the identifiability analysis predicts.</w:t>
+        <w:t xml:space="preserve">pus is excluded from that pool and reported on its own: Gotham-2025 with the feature budget cut to eight of sixteen columns, where the gate wins </w:t>
+      </w:r>
+      <w:r>
+        <w:lastRenderedPageBreak/>
+        <w:t>+0.006252 with 10 of 10 seeds positive. Adding that case back in still leaves the aggregate equivalent (+0.000487, 90% interval [+0.000243, +0.000732]). The aggregation-rule conclusion therefore does not depend on the vintage of the corpus, and the single deviation from it is the condition the identifiability analysis predicts.</w:t>
       </w:r>
     </w:p>
     <w:p>
@@ -10707,7 +10770,6 @@
         <w:pStyle w:val="21"/>
       </w:pPr>
       <w:r>
-        <w:lastRenderedPageBreak/>
         <w:t>6.1 Four failure conditions for conditional weighting</w:t>
       </w:r>
     </w:p>
@@ -10777,7 +10839,11 @@
         <w:t>first measure the weight entropy, then the prediction-disagreement rate, then the spread across member scores, and only then look at the performance difference.</w:t>
       </w:r>
       <w:r>
-        <w:t xml:space="preserve"> If entropy is close to 1 and the disagreement count is 0, further tuning of the gate will not help, because the problem does not lie in the gate. If the member scores span more than the difference you care about, the fusion is bounded by its weakest member and no weighting scheme will recover it.</w:t>
+        <w:t xml:space="preserve"> If entropy is close to 1 and the disagreement count is 0, further tuning of the gate will not help, because </w:t>
+      </w:r>
+      <w:r>
+        <w:lastRenderedPageBreak/>
+        <w:t>the problem does not lie in the gate. If the member scores span more than the difference you care about, the fusion is bounded by its weakest member and no weighting scheme will recover it.</w:t>
       </w:r>
     </w:p>
     <w:p>
@@ -10814,7 +10880,6 @@
         <w:rPr>
           <w:b/>
         </w:rPr>
-        <w:lastRenderedPageBreak/>
         <w:t>Split noise.</w:t>
       </w:r>
       <w:r>
@@ -11440,7 +11505,14 @@
               <w:rPr>
                 <w:sz w:val="16"/>
               </w:rPr>
-              <w:t>Equal voting on capped populations; do not deploy on strongly imbalanced corpora</w:t>
+              <w:t xml:space="preserve">Equal voting on capped populations; do not deploy on </w:t>
+            </w:r>
+            <w:r>
+              <w:rPr>
+                <w:sz w:val="16"/>
+              </w:rPr>
+              <w:lastRenderedPageBreak/>
+              <w:t>strongly imbalanced corpora</w:t>
             </w:r>
           </w:p>
         </w:tc>
@@ -11456,7 +11528,15 @@
               <w:rPr>
                 <w:sz w:val="16"/>
               </w:rPr>
-              <w:t>Equivalence at 53,237 flows against a deficit of -0.005533 on the uncapped 2,429,503-flow corpus, all ten seeds</w:t>
+              <w:lastRenderedPageBreak/>
+              <w:t xml:space="preserve">Equivalence at 53,237 flows against a deficit of -0.005533 on </w:t>
+            </w:r>
+            <w:r>
+              <w:rPr>
+                <w:sz w:val="16"/>
+              </w:rPr>
+              <w:lastRenderedPageBreak/>
+              <w:t>the uncapped 2,429,503-flow corpus, all ten seeds</w:t>
             </w:r>
           </w:p>
         </w:tc>
@@ -11472,7 +11552,15 @@
               <w:rPr>
                 <w:sz w:val="16"/>
               </w:rPr>
-              <w:t>Forgoes a mechanism whose training cost is 175 times that of one forest</w:t>
+              <w:lastRenderedPageBreak/>
+              <w:t xml:space="preserve">Forgoes a mechanism whose training cost is 175 times that of </w:t>
+            </w:r>
+            <w:r>
+              <w:rPr>
+                <w:sz w:val="16"/>
+              </w:rPr>
+              <w:lastRenderedPageBreak/>
+              <w:t>one forest</w:t>
             </w:r>
           </w:p>
         </w:tc>
@@ -11508,7 +11596,6 @@
         <w:rPr>
           <w:b/>
         </w:rPr>
-        <w:lastRenderedPageBreak/>
         <w:t>A raw-to-final counting chain</w:t>
       </w:r>
       <w:r>
@@ -11702,6 +11789,7 @@
         <w:rPr>
           <w:b/>
         </w:rPr>
+        <w:lastRenderedPageBreak/>
         <w:t>The research populations are not production traffic.</w:t>
       </w:r>
       <w:r>
@@ -11716,14 +11804,10 @@
         <w:t>The equivalence depends on how the population is built.</w:t>
       </w:r>
       <w:r>
-        <w:t xml:space="preserve"> It holds on the 53,237-flow natural-prior population and on the 7.8-fold larger one, but not on the fully uncapped 2,429,503-flow CIC-IDS2017 corpus, where the same comparison becomes a small, consistent deficit (-0.005533). That deficit did not reproduce on modern corpora: </w:t>
-      </w:r>
-      <w:r>
-        <w:lastRenderedPageBreak/>
-        <w:t>CIC-IoT-2023 differs by -0.000004 at 2,460,000 training rows and the uncapped Gotham-2025 by +0.000009 at 14,250,000 training rows and 7,190,000 test rows, on all ten seeds. The statement must still be quoted with its population, but it</w:t>
-      </w:r>
-      <w:r>
-        <w:t xml:space="preserve"> is not mechanically broken by corpus vintage or training scale; what governs it is member interchangeability, quantified by the feature-budget sweep (k=8 +0.001663 down to k=32 -0.000002) and the mechanism suite (0-12 relabelled rows, weights within about ±3% of uniform).</w:t>
+        <w:t xml:space="preserve"> It holds on the 53,237-flow natural-prior population and on the 7.8-fold larger one, but not on the fully uncapped 2,429,503-flow CIC-IDS2017 corpus, where the same comparison becomes a small, consistent deficit (-0.005533). That deficit did not reproduce on modern corpora: CIC-IoT-2023 differs by -0.000004 at 2,460,000 training rows and the uncapped Gotham-2025 by +0.000009 at 14,250,000 training rows and 7,190,000 test rows, on all ten seeds. The statement must still be quoted with its population, but it</w:t>
+      </w:r>
+      <w:r>
+        <w:t xml:space="preserve"> is not mechanically broken by corpus vintage or training scale; what governs it is member interchangeability, quantified by the feature-budget sweep (k=8 +0.001663 down to k=32 -0.000002) and the mechanism suite (0-12 relabelled rows, weights in 0.0091-0.0102 against the 0.01 uniform value).</w:t>
       </w:r>
     </w:p>
     <w:p>
@@ -11787,7 +11871,11 @@
         <w:t>F1), so it probes the mechanics of the aggregation step rather than discrimination difficulty, and the external datasets remain independent native-label benchmarks rather than transfer tests. None of the seventeen represents production traffic. Pooling the twelve published in 2020 or later gives 120 seed-level comparisons whose 90% interval, [-0.000006, +0.000020] on a mean of +0.000007, lies inside the 0.005 margin - so the equivalence claim does not rest on the 2017 corpus alone. A day-level split of CIC-</w:t>
       </w:r>
       <w:r>
-        <w:t>IDS2017 is constructible, but every capture day carries only a subset of the five classes (Monday Normal only; Tuesday Normal and Brute Force; Wednesday Normal and DoS/DDoS; Thursday adds Web Attack; Friday adds Bot), so it is not category-complete: the measured day-holdout Macro-F1 collapses to 0.13-0.32 across the five days, which is what that limitation now quantifies.</w:t>
+        <w:t xml:space="preserve">IDS2017 is constructible, but every capture day carries only a subset of the five classes (Monday Normal only; Tuesday Normal and Brute Force; Wednesday Normal and DoS/DDoS; Thursday adds Web </w:t>
+      </w:r>
+      <w:r>
+        <w:lastRenderedPageBreak/>
+        <w:t>Attack; Friday adds Bot), so it is not category-complete: the measured day-holdout Macro-F1 collapses to 0.13-0.32 across the five days, which is what that limitation now quantifies.</w:t>
       </w:r>
     </w:p>
     <w:p>
@@ -11817,7 +11905,6 @@
         <w:rPr>
           <w:b/>
         </w:rPr>
-        <w:lastRenderedPageBreak/>
         <w:t>Bootstrap intervals have a limited interpretation.</w:t>
       </w:r>
       <w:r>
@@ -11887,7 +11974,11 @@
         <w:t xml:space="preserve"> Three identifiability conditions are derived and one of them is turned into a row-wise computable bound, under which 99.91% of 23,958 test rows are provably invariant to the weighting, with a decision margin 3,469 to 5,038 times the perturbation bound. A search over all 108 gate hyper-parameter configurations yields only six distinct validation scores, excluding insufficient tuning. A deliberately constructed reverse experiment shows that the gain moves with expert diversity: two low-diversity expert sets </w:t>
       </w:r>
       <w:r>
-        <w:t>gain exactly zero in all six runs, whereas three decorrelated sets gain positively in all nine runs (slope 0.0646, Pearson r = 0.749). The inertness of conditional weighting is therefore not an implementation or tuning artefact but a direct consequence of filter-based multi-view experts being too similar on this kind of data.</w:t>
+        <w:t xml:space="preserve">gain exactly zero in all six runs, whereas three decorrelated sets gain positively in all nine runs (slope 0.0646, Pearson r </w:t>
+      </w:r>
+      <w:r>
+        <w:lastRenderedPageBreak/>
+        <w:t>= 0.749). The inertness of conditional weighting is therefore not an implementation or tuning artefact but a direct consequence of filter-based multi-view experts being too similar on this kind of data.</w:t>
       </w:r>
     </w:p>
     <w:p>
@@ -11912,83 +12003,83 @@
     </w:p>
     <w:p>
       <w:r>
+        <w:t>The principal contribution is not a new state-of-the-art classifier but a reusable leakage-controlled protocol, a set of falsifiable identifiability boundaries, and a quantitative map that separates protocol effects from aggregation-rule effects. Three directions follow. First, design weighting mechanisms that explicitly enforce expert decorrelation, and test whether the gain is restored once the premise of Condition 1 is broken. Second, construct category-complete temporal or cross-scenario protocols so th</w:t>
+      </w:r>
+      <w:r>
+        <w:t>at file-level coverage analysis can be upgraded into a genuine external-validity test. Third, turn the reporting recommendations of Section 6.4 into an automatically checkable checklist, so that the evaluation protocol itself becomes a verifiable object. The recommendations extend those of [22].</w:t>
+      </w:r>
+    </w:p>
+    <w:p>
+      <w:pPr>
+        <w:pStyle w:val="1"/>
+      </w:pPr>
+      <w:r>
+        <w:t>Data and code availability</w:t>
+      </w:r>
+    </w:p>
+    <w:p>
+      <w:r>
+        <w:t>Processing scripts, audit intermediates, per-row predictions and figure-generation code are released at https://github.com/linran-muxue/leakage-controlled-nids-study (release v1.11.0, tag v1.11.0). Raw datasets are not redistributed; the paper records source URLs, retrieval dates, version snapshots and SHA-256 checksums.</w:t>
+      </w:r>
+    </w:p>
+    <w:p>
+      <w:pPr>
+        <w:pStyle w:val="1"/>
+      </w:pPr>
+      <w:r>
+        <w:t>Funding</w:t>
+      </w:r>
+    </w:p>
+    <w:p>
+      <w:r>
+        <w:t>To be completed by the author. If the work received no support of any kind, this should be stated explicitly.</w:t>
+      </w:r>
+    </w:p>
+    <w:p>
+      <w:pPr>
+        <w:pStyle w:val="1"/>
+      </w:pPr>
+      <w:r>
+        <w:t>Declaration of competing interest</w:t>
+      </w:r>
+    </w:p>
+    <w:p>
+      <w:r>
+        <w:t>To be completed by the author. If no competing interests exist, this should be stated explicitly.</w:t>
+      </w:r>
+    </w:p>
+    <w:p>
+      <w:pPr>
+        <w:pStyle w:val="1"/>
+      </w:pPr>
+      <w:r>
+        <w:t>Declaration of generative AI and AI-assisted technologies</w:t>
+      </w:r>
+    </w:p>
+    <w:p>
+      <w:r>
+        <w:t>Generative AI tools were used for language editing and software drafting. The author is responsible for verifying the code, data, citations and all conclusions, and has checked each reported number against the released artefacts.</w:t>
+      </w:r>
+    </w:p>
+    <w:p>
+      <w:pPr>
+        <w:pStyle w:val="1"/>
+      </w:pPr>
+      <w:r>
+        <w:t>CRediT authorship contribution statement</w:t>
+      </w:r>
+    </w:p>
+    <w:p>
+      <w:r>
+        <w:t>To be completed by the author according to actual contributions: conceptualisation, methodology, software, validation, formal analysis, data curation, writing - original draft, writing - review and editing, visualisation.</w:t>
+      </w:r>
+    </w:p>
+    <w:p>
+      <w:pPr>
+        <w:pStyle w:val="1"/>
+      </w:pPr>
+      <w:r>
         <w:lastRenderedPageBreak/>
-        <w:t>The principal contribution is not a new state-of-the-art classifier but a reusable leakage-controlled protocol, a set of falsifiable identifiability boundaries, and a quantitative map that separates protocol effects from aggregation-rule effects. Three directions follow. First, design weighting mechanisms that explicitly enforce expert decorrelation, and test whether the gain is restored once the premise of Condition 1 is broken. Second, construct category-complete temporal or cross-scenario protocols so th</w:t>
-      </w:r>
-      <w:r>
-        <w:t>at file-level coverage analysis can be upgraded into a genuine external-validity test. Third, turn the reporting recommendations of Section 6.4 into an automatically checkable checklist, so that the evaluation protocol itself becomes a verifiable object. The recommendations extend those of [22].</w:t>
-      </w:r>
-    </w:p>
-    <w:p>
-      <w:pPr>
-        <w:pStyle w:val="1"/>
-      </w:pPr>
-      <w:r>
-        <w:t>Data and code availability</w:t>
-      </w:r>
-    </w:p>
-    <w:p>
-      <w:r>
-        <w:t>Processing scripts, audit intermediates, per-row predictions and figure-generation code are released at https://github.com/linran-muxue/leakage-controlled-nids-study (release v1.11.0, tag v1.11.0). Raw datasets are not redistributed; the paper records source URLs, retrieval dates, version snapshots and SHA-256 checksums.</w:t>
-      </w:r>
-    </w:p>
-    <w:p>
-      <w:pPr>
-        <w:pStyle w:val="1"/>
-      </w:pPr>
-      <w:r>
-        <w:t>Funding</w:t>
-      </w:r>
-    </w:p>
-    <w:p>
-      <w:r>
-        <w:t>To be completed by the author. If the work received no support of any kind, this should be stated explicitly.</w:t>
-      </w:r>
-    </w:p>
-    <w:p>
-      <w:pPr>
-        <w:pStyle w:val="1"/>
-      </w:pPr>
-      <w:r>
-        <w:t>Declaration of competing interest</w:t>
-      </w:r>
-    </w:p>
-    <w:p>
-      <w:r>
-        <w:t>To be completed by the author. If no competing interests exist, this should be stated explicitly.</w:t>
-      </w:r>
-    </w:p>
-    <w:p>
-      <w:pPr>
-        <w:pStyle w:val="1"/>
-      </w:pPr>
-      <w:r>
-        <w:t>Declaration of generative AI and AI-assisted technologies</w:t>
-      </w:r>
-    </w:p>
-    <w:p>
-      <w:r>
-        <w:t>Generative AI tools were used for language editing and software drafting. The author is responsible for verifying the code, data, citations and all conclusions, and has checked each reported number against the released artefacts.</w:t>
-      </w:r>
-    </w:p>
-    <w:p>
-      <w:pPr>
-        <w:pStyle w:val="1"/>
-      </w:pPr>
-      <w:r>
-        <w:t>CRediT authorship contribution statement</w:t>
-      </w:r>
-    </w:p>
-    <w:p>
-      <w:r>
-        <w:t>To be completed by the author according to actual contributions: conceptualisation, methodology, software, validation, formal analysis, data curation, writing - original draft, writing - review and editing, visualisation.</w:t>
-      </w:r>
-    </w:p>
-    <w:p>
-      <w:pPr>
-        <w:pStyle w:val="1"/>
-      </w:pPr>
-      <w:r>
         <w:t>References</w:t>
       </w:r>
     </w:p>
@@ -12042,7 +12133,6 @@
         </w:numPr>
       </w:pPr>
       <w:r>
-        <w:lastRenderedPageBreak/>
         <w:t>Chen T, Guestrin C. XGBoost: A scalable tree boosting system. KDD 2016: 785-794. DOI:10.1145/2939672.2939785.</w:t>
       </w:r>
     </w:p>
@@ -12247,6 +12337,7 @@
         </w:numPr>
       </w:pPr>
       <w:r>
+        <w:lastRenderedPageBreak/>
         <w:t>Liu L, Engelen G, Timmerman J, et al. Error prevalence in NIDS datasets: A case study on CIC-IDS-2017 and CSE-CIC-IDS-2018. IEEE CNS 2022. DOI:10.1109/CNS56114.2022.9947235.</w:t>
       </w:r>
     </w:p>
@@ -12295,7 +12386,6 @@
         </w:numPr>
       </w:pPr>
       <w:r>
-        <w:lastRenderedPageBreak/>
         <w:t>Khraisat A, Gondal I, Vamplew P, Kamruzzaman J. Survey of intrusion detection systems: Techniques, datasets and challenges. Cybersecurity, 2019, 2: 20. DOI:10.1186/s42400-019-0038-7.</w:t>
       </w:r>
     </w:p>
@@ -12500,6 +12590,7 @@
         </w:numPr>
       </w:pPr>
       <w:r>
+        <w:lastRenderedPageBreak/>
         <w:t>Han S, Kim Y, Lee S. Improvement of the classification performance of an intrusion detection model for rare and unknown attack traffic. Electronics, 2021, 10(18): 2268. DOI:10.3390/electronics10182268.</w:t>
       </w:r>
     </w:p>
@@ -12560,7 +12651,6 @@
         </w:numPr>
       </w:pPr>
       <w:r>
-        <w:lastRenderedPageBreak/>
         <w:t>Hunter J D. Matplotlib: A 2D graphics environment. Computing in Science &amp; Engineering, 2007, 9(3): 90-95. DOI:10.1109/MCSE.2007.55.</w:t>
       </w:r>
     </w:p>
@@ -13557,6 +13647,7 @@
               <w:rPr>
                 <w:sz w:val="16"/>
               </w:rPr>
+              <w:lastRenderedPageBreak/>
               <w:t>S28</w:t>
             </w:r>
           </w:p>
@@ -13920,76 +14011,76 @@
       </w:rPr>
     </w:lvl>
   </w:abstractNum>
-  <w:num w:numId="1" w16cid:durableId="2126728364">
+  <w:num w:numId="1" w16cid:durableId="356348841">
     <w:abstractNumId w:val="8"/>
   </w:num>
-  <w:num w:numId="2" w16cid:durableId="1974754575">
+  <w:num w:numId="2" w16cid:durableId="900336322">
     <w:abstractNumId w:val="6"/>
   </w:num>
-  <w:num w:numId="3" w16cid:durableId="2001495176">
+  <w:num w:numId="3" w16cid:durableId="608585762">
     <w:abstractNumId w:val="5"/>
   </w:num>
-  <w:num w:numId="4" w16cid:durableId="400712767">
+  <w:num w:numId="4" w16cid:durableId="7222446">
     <w:abstractNumId w:val="4"/>
   </w:num>
-  <w:num w:numId="5" w16cid:durableId="258953991">
+  <w:num w:numId="5" w16cid:durableId="964190275">
     <w:abstractNumId w:val="7"/>
   </w:num>
-  <w:num w:numId="6" w16cid:durableId="1188175387">
+  <w:num w:numId="6" w16cid:durableId="190147193">
     <w:abstractNumId w:val="3"/>
   </w:num>
-  <w:num w:numId="7" w16cid:durableId="1766342138">
+  <w:num w:numId="7" w16cid:durableId="1617761232">
     <w:abstractNumId w:val="2"/>
   </w:num>
-  <w:num w:numId="8" w16cid:durableId="1695377573">
+  <w:num w:numId="8" w16cid:durableId="163592543">
     <w:abstractNumId w:val="1"/>
   </w:num>
-  <w:num w:numId="9" w16cid:durableId="862792368">
+  <w:num w:numId="9" w16cid:durableId="1347517905">
     <w:abstractNumId w:val="0"/>
   </w:num>
-  <w:num w:numId="10" w16cid:durableId="1700008251">
+  <w:num w:numId="10" w16cid:durableId="1773889200">
     <w:abstractNumId w:val="7"/>
     <w:lvlOverride w:ilvl="0">
       <w:startOverride w:val="1"/>
     </w:lvlOverride>
   </w:num>
-  <w:num w:numId="11" w16cid:durableId="342781634">
+  <w:num w:numId="11" w16cid:durableId="496262386">
     <w:abstractNumId w:val="7"/>
     <w:lvlOverride w:ilvl="0">
       <w:startOverride w:val="1"/>
     </w:lvlOverride>
   </w:num>
-  <w:num w:numId="12" w16cid:durableId="162549864">
+  <w:num w:numId="12" w16cid:durableId="373235137">
     <w:abstractNumId w:val="7"/>
     <w:lvlOverride w:ilvl="0">
       <w:startOverride w:val="1"/>
     </w:lvlOverride>
   </w:num>
-  <w:num w:numId="13" w16cid:durableId="1296368765">
+  <w:num w:numId="13" w16cid:durableId="1299412554">
     <w:abstractNumId w:val="7"/>
     <w:lvlOverride w:ilvl="0">
       <w:startOverride w:val="1"/>
     </w:lvlOverride>
   </w:num>
-  <w:num w:numId="14" w16cid:durableId="247734087">
+  <w:num w:numId="14" w16cid:durableId="1429958650">
     <w:abstractNumId w:val="7"/>
     <w:lvlOverride w:ilvl="0">
       <w:startOverride w:val="1"/>
     </w:lvlOverride>
   </w:num>
-  <w:num w:numId="15" w16cid:durableId="1997490954">
+  <w:num w:numId="15" w16cid:durableId="629894839">
     <w:abstractNumId w:val="7"/>
     <w:lvlOverride w:ilvl="0">
       <w:startOverride w:val="1"/>
     </w:lvlOverride>
   </w:num>
-  <w:num w:numId="16" w16cid:durableId="1995335151">
+  <w:num w:numId="16" w16cid:durableId="1854949559">
     <w:abstractNumId w:val="7"/>
     <w:lvlOverride w:ilvl="0">
       <w:startOverride w:val="1"/>
     </w:lvlOverride>
   </w:num>
-  <w:num w:numId="17" w16cid:durableId="541476389">
+  <w:num w:numId="17" w16cid:durableId="2080202014">
     <w:abstractNumId w:val="7"/>
     <w:lvlOverride w:ilvl="0">
       <w:startOverride w:val="1"/>

</xml_diff>

<commit_message>
Round 20bk: prune the archive walk (61 MB instead of >900 MB, minutes instead of hours) and re-render after the record refresh; 53-check gate green
</commit_message>
<xml_diff>
--- a/重构版论文_v4_20260915/English_SCI_Manuscript_v4.docx
+++ b/重构版论文_v4_20260915/English_SCI_Manuscript_v4.docx
@@ -1039,7 +1039,7 @@
           <w:noProof/>
         </w:rPr>
         <w:drawing>
-          <wp:inline distT="0" distB="0" distL="0" distR="0" wp14:anchorId="7DD9CC6E" wp14:editId="2784935F">
+          <wp:inline distT="0" distB="0" distL="0" distR="0" wp14:anchorId="38FAB946" wp14:editId="05A28BF9">
             <wp:extent cx="5760720" cy="2734826"/>
             <wp:effectExtent l="0" t="0" r="0" b="0"/>
             <wp:docPr id="1" name="Picture 1"/>
@@ -2426,7 +2426,7 @@
           <w:noProof/>
         </w:rPr>
         <w:drawing>
-          <wp:inline distT="0" distB="0" distL="0" distR="0" wp14:anchorId="24165D49" wp14:editId="09056EB9">
+          <wp:inline distT="0" distB="0" distL="0" distR="0" wp14:anchorId="47E08541" wp14:editId="0B64F87E">
             <wp:extent cx="5760720" cy="2722098"/>
             <wp:effectExtent l="0" t="0" r="0" b="0"/>
             <wp:docPr id="2" name="Picture 2"/>
@@ -3419,7 +3419,7 @@
           <w:noProof/>
         </w:rPr>
         <w:drawing>
-          <wp:inline distT="0" distB="0" distL="0" distR="0" wp14:anchorId="30756156" wp14:editId="2223E793">
+          <wp:inline distT="0" distB="0" distL="0" distR="0" wp14:anchorId="3B9DA023" wp14:editId="2915388E">
             <wp:extent cx="5760720" cy="3482709"/>
             <wp:effectExtent l="0" t="0" r="0" b="0"/>
             <wp:docPr id="3" name="Picture 3"/>
@@ -4777,15 +4777,15 @@
     </w:p>
     <w:p>
       <w:r>
+        <w:t>The row-wise margin bound and the quantification of Condition 3 are provided in Supplementary S17 and S25.</w:t>
+      </w:r>
+    </w:p>
+    <w:p>
+      <w:pPr>
+        <w:pStyle w:val="21"/>
+      </w:pPr>
+      <w:r>
         <w:lastRenderedPageBreak/>
-        <w:t>The row-wise margin bound and the quantification of Condition 3 are provided in Supplementary S17 and S25.</w:t>
-      </w:r>
-    </w:p>
-    <w:p>
-      <w:pPr>
-        <w:pStyle w:val="21"/>
-      </w:pPr>
-      <w:r>
         <w:t>4.4 Complexity</w:t>
       </w:r>
     </w:p>
@@ -4941,15 +4941,15 @@
     </w:p>
     <w:p>
       <w:r>
-        <w:t xml:space="preserve">The feature-quality audit of the balanced control corpus P_bal (2,355 training rows) shows that 12 of the 78 CIC-IDS2017 features are constant (a single value across all rows) and 18 are near-zero-variance; the primary natural-prior split shows 10 constant and 20 near-zero-variance features, so the degeneracy belongs to the feature representation rather than to one population. The constant columns include Bwd PSH Flags, Fwd URG Flags, Bwd </w:t>
-      </w:r>
+        <w:t>The feature-quality audit of the balanced control corpus P_bal (2,355 training rows) shows that 12 of the 78 CIC-IDS2017 features are constant (a single value across all rows) and 18 are near-zero-variance; the primary natural-prior split shows 10 constant and 20 near-zero-variance features, so the degeneracy belongs to the feature representation rather than to one population. The constant columns include Bwd PSH Flags, Fwd URG Flags, Bwd URG Flags, RST Flag Count, CWE Flag Count, ECE Flag Count and six bul</w:t>
+      </w:r>
+      <w:r>
+        <w:t>k-rate fields. H1's premise of redundancy is therefore correct in itself.</w:t>
+      </w:r>
+    </w:p>
+    <w:p>
       <w:r>
         <w:lastRenderedPageBreak/>
-        <w:t>URG Flags, RST Flag Count, CWE Flag Count, ECE Flag Count and six bulk-rate fields. H1's premise of redundancy is therefore correct in itself.</w:t>
-      </w:r>
-    </w:p>
-    <w:p>
-      <w:r>
         <w:t>The chi-square budget k was fixed at 60 on the validation partition from a pre-specified candidate set: validation Macro-F1 was 0.9175 at k = 10, 0.9314 at k = 20, 0.9379 at both k = 30 and k = 40, and 0.9413 at k = 60, flattening between k = 30 and k = 40. This search was carried out on the balanced control protocol; the selected k was then frozen for every final run.</w:t>
       </w:r>
     </w:p>
@@ -6412,7 +6412,6 @@
               <w:rPr>
                 <w:sz w:val="16"/>
               </w:rPr>
-              <w:lastRenderedPageBreak/>
               <w:t>RCCF</w:t>
             </w:r>
           </w:p>
@@ -6707,6 +6706,7 @@
               <w:rPr>
                 <w:sz w:val="16"/>
               </w:rPr>
+              <w:lastRenderedPageBreak/>
               <w:t>Equal RF (full features)</w:t>
             </w:r>
           </w:p>
@@ -7205,7 +7205,7 @@
           <w:noProof/>
         </w:rPr>
         <w:drawing>
-          <wp:inline distT="0" distB="0" distL="0" distR="0" wp14:anchorId="5677C93E" wp14:editId="4C703D5E">
+          <wp:inline distT="0" distB="0" distL="0" distR="0" wp14:anchorId="2E277142" wp14:editId="3A30CA5E">
             <wp:extent cx="5760720" cy="2356272"/>
             <wp:effectExtent l="0" t="0" r="0" b="0"/>
             <wp:docPr id="4" name="Picture 4"/>
@@ -7267,11 +7267,11 @@
         <w:t>Second, the paired statistics establish equivalence at a strict margin.</w:t>
       </w:r>
       <w:r>
-        <w:t xml:space="preserve"> With ten seeds the mean paired difference is -0.000456 with a standard deviation of 0.001152. Two interval estimates are reported because they answer </w:t>
+        <w:t xml:space="preserve"> With ten seeds the mean paired difference is -0.000456 with a standard deviation of 0.001152. Two interval estimates are reported because they answer different questions: the seed-level 90% interval [-0.001124, +0.000212] reflects model-to-model variability, while the test-row paired bootstrap interval [-0.004251, +0.003382] reflects resampling uncertainty over the locked test set. Both lie inside equivalence margins of 0.005 and 0.01 Macro-F1, so equivalence can be asserted at alpha = 0.05 </w:t>
       </w:r>
       <w:r>
         <w:lastRenderedPageBreak/>
-        <w:t xml:space="preserve">different questions: the seed-level 90% interval [-0.001124, +0.000212] reflects model-to-model variability, while the test-row paired bootstrap interval [-0.004251, +0.003382] reflects resampling uncertainty over the locked test set. Both lie inside equivalence margins of 0.005 and 0.01 Macro-F1, so equivalence can be asserted at alpha = 0.05 against either </w:t>
+        <w:t xml:space="preserve">against either </w:t>
       </w:r>
       <w:r>
         <w:t xml:space="preserve">margin. This strengthens the three-seed analysis, for which the 0.005 margin was not attainable. The sign of the difference is split five to five across seeds, and exact McNemar tests on the test rows are non-significant. Under the pre-declared decision rule - stable, consistent in sign, and bounded away from zero - </w:t>
@@ -8110,11 +8110,14 @@
         <w:rPr>
           <w:b/>
         </w:rPr>
+        <w:t>Fifth, a neural baseline shows how badly accuracy can mislead.</w:t>
+      </w:r>
+      <w:r>
+        <w:t xml:space="preserve"> A multilayer perceptron given the same feature budget and a full training budget (128 hidden units, hyper-parameters selected on the validation partition) reaches 0.97679 accuracy against RCCF's 0.97792, but only 0.797654 Macro-F1 against 0.889955, i.e. 0.092 lower. Its balanced accuracy is 0.79666 against 0.94920 and its Brier score is 0.036701 against 0.006312. Every comparison </w:t>
+      </w:r>
+      <w:r>
         <w:lastRenderedPageBreak/>
-        <w:t>Fifth, a neural baseline shows how badly accuracy can mislead.</w:t>
-      </w:r>
-      <w:r>
-        <w:t xml:space="preserve"> A multilayer perceptron given the same feature budget and a full training budget (128 hidden units, hyper-parameters selected on the validation partition) reaches 0.97679 accuracy against RCCF's 0.97792, but only 0.797654 Macro-F1 against 0.889955, i.e. 0.092 lower. Its balanced accuracy is 0.79666 against 0.94920 and its Brier score is 0.036701 against 0.006312. Every comparison in this paragraph is computed on the three seeds common to both runs (42, 2024, 3407), the seeds on which the neural baseline wa</w:t>
+        <w:t>in this paragraph is computed on the three seeds common to both runs (42, 2024, 3407), the seeds on which the neural baseline wa</w:t>
       </w:r>
       <w:r>
         <w:t xml:space="preserve">s trained; Table 4(a) gives the corresponding ten-seed RCCF values. Notably, a paired McNemar test on overall correctness is not significant (pooled p = 0.383 over 23,958 rows; per-seed 1.000 / 0.768 / 0.261), because the two models make a similar </w:t>
@@ -8165,7 +8168,7 @@
           <w:noProof/>
         </w:rPr>
         <w:drawing>
-          <wp:inline distT="0" distB="0" distL="0" distR="0" wp14:anchorId="08EF23EE" wp14:editId="594220B3">
+          <wp:inline distT="0" distB="0" distL="0" distR="0" wp14:anchorId="7CD0465F" wp14:editId="5D289CA0">
             <wp:extent cx="5760720" cy="2045294"/>
             <wp:effectExtent l="0" t="0" r="0" b="0"/>
             <wp:docPr id="5" name="Picture 5"/>
@@ -8279,7 +8282,6 @@
         <w:rPr>
           <w:b/>
         </w:rPr>
-        <w:lastRenderedPageBreak/>
         <w:t>Measurement 4: the margin bound proves invariance.</w:t>
       </w:r>
       <w:r>
@@ -8328,7 +8330,11 @@
         <w:t>3,469 to 5,038</w:t>
       </w:r>
       <w:r>
-        <w:t xml:space="preserve"> across seeds. In other words, fused probabilities are close to one-hot and the weight-induced probability movement is three orders of magnitude smaller than the decision margin.</w:t>
+        <w:t xml:space="preserve"> across </w:t>
+      </w:r>
+      <w:r>
+        <w:lastRenderedPageBreak/>
+        <w:t>seeds. In other words, fused probabilities are close to one-hot and the weight-induced probability movement is three orders of magnitude smaller than the decision margin.</w:t>
       </w:r>
     </w:p>
     <w:p>
@@ -8340,7 +8346,7 @@
           <w:noProof/>
         </w:rPr>
         <w:drawing>
-          <wp:inline distT="0" distB="0" distL="0" distR="0" wp14:anchorId="58ED588E" wp14:editId="246B1E26">
+          <wp:inline distT="0" distB="0" distL="0" distR="0" wp14:anchorId="7A0D988A" wp14:editId="76A1CDFB">
             <wp:extent cx="5760720" cy="2308234"/>
             <wp:effectExtent l="0" t="0" r="0" b="0"/>
             <wp:docPr id="6" name="Picture 6"/>
@@ -8579,14 +8585,7 @@
               <w:rPr>
                 <w:sz w:val="16"/>
               </w:rPr>
-              <w:t xml:space="preserve">Same view, different </w:t>
-            </w:r>
-            <w:r>
-              <w:rPr>
-                <w:sz w:val="16"/>
-              </w:rPr>
-              <w:lastRenderedPageBreak/>
-              <w:t>seeds</w:t>
+              <w:t>Same view, different seeds</w:t>
             </w:r>
           </w:p>
         </w:tc>
@@ -8602,7 +8601,6 @@
               <w:rPr>
                 <w:sz w:val="16"/>
               </w:rPr>
-              <w:lastRenderedPageBreak/>
               <w:t>0.20%</w:t>
             </w:r>
           </w:p>
@@ -8979,6 +8977,7 @@
               <w:rPr>
                 <w:sz w:val="16"/>
               </w:rPr>
+              <w:lastRenderedPageBreak/>
               <w:t>Disjoint feature blocks</w:t>
             </w:r>
           </w:p>
@@ -9079,7 +9078,7 @@
           <w:noProof/>
         </w:rPr>
         <w:drawing>
-          <wp:inline distT="0" distB="0" distL="0" distR="0" wp14:anchorId="3C70541F" wp14:editId="3C580B91">
+          <wp:inline distT="0" distB="0" distL="0" distR="0" wp14:anchorId="38680D18" wp14:editId="0ACB35C0">
             <wp:extent cx="5760720" cy="2167923"/>
             <wp:effectExtent l="0" t="0" r="0" b="0"/>
             <wp:docPr id="7" name="Picture 7"/>
@@ -9227,23 +9226,20 @@
         <w:t>0.370%</w:t>
       </w:r>
       <w:r>
-        <w:t xml:space="preserve">). </w:t>
-      </w:r>
+        <w:t>). What is identical is the labelled output - the gate reproduces equal voting on all but one of 79,860 predictions - so the disagreements exist but sit far from the decision boundary, which is what Condition 2 asserts.</w:t>
+      </w:r>
+    </w:p>
+    <w:p>
+      <w:r>
+        <w:t>The gate search, the row-wise weight records and the expert-diversity suite are provided in Supplementary S08-S09, S16 and S18.</w:t>
+      </w:r>
+    </w:p>
+    <w:p>
+      <w:pPr>
+        <w:pStyle w:val="21"/>
+      </w:pPr>
       <w:r>
         <w:lastRenderedPageBreak/>
-        <w:t>What is identical is the labelled output - the gate reproduces equal voting on all but one of 79,860 predictions - so the disagreements exist but sit far from the decision boundary, which is what Condition 2 asserts.</w:t>
-      </w:r>
-    </w:p>
-    <w:p>
-      <w:r>
-        <w:t>The gate search, the row-wise weight records and the expert-diversity suite are provided in Supplementary S08-S09, S16 and S18.</w:t>
-      </w:r>
-    </w:p>
-    <w:p>
-      <w:pPr>
-        <w:pStyle w:val="21"/>
-      </w:pPr>
-      <w:r>
         <w:t>5.4 RQ3: Protocol effects exceed aggregation-rule differences by an order of magnitude</w:t>
       </w:r>
     </w:p>
@@ -9261,7 +9257,7 @@
           <w:noProof/>
         </w:rPr>
         <w:drawing>
-          <wp:inline distT="0" distB="0" distL="0" distR="0" wp14:anchorId="18C09F82" wp14:editId="30B3EBEF">
+          <wp:inline distT="0" distB="0" distL="0" distR="0" wp14:anchorId="30D9CD09" wp14:editId="2E9B9448">
             <wp:extent cx="5760720" cy="2258878"/>
             <wp:effectExtent l="0" t="0" r="0" b="0"/>
             <wp:docPr id="8" name="Picture 8"/>
@@ -9398,7 +9394,6 @@
     </w:p>
     <w:p>
       <w:r>
-        <w:lastRenderedPageBreak/>
         <w:t xml:space="preserve">Placing the five magnitudes side by side: aggregation 0.0005, feature view +0.0021, deduplication order +0.0014 (maximum 0.0060), tuning budget +0.0078 and class prior +0.0725. </w:t>
       </w:r>
       <w:r>
@@ -9417,7 +9412,11 @@
         <w:t>families</w:t>
       </w:r>
       <w:r>
-        <w:t xml:space="preserve"> are larger: the multilayer perceptron trails the forests by 0.0916 Macro-F1 and extremely randomised trees by 0.0318, both of which exceed the class-prior effect of 0.0725 in the first case. The defensible statement is therefore that aggregation-rule differences are dominated by protocol choices, whereas model-family differences are not.</w:t>
+        <w:t xml:space="preserve"> are larger: the multilayer perceptron trails the forests by 0.0916 Macro-F1 and extremely randomised trees by 0.0318, both of which exceed the class-</w:t>
+      </w:r>
+      <w:r>
+        <w:lastRenderedPageBreak/>
+        <w:t>prior effect of 0.0725 in the first case. The defensible statement is therefore that aggregation-rule differences are dominated by protocol choices, whereas model-family differences are not.</w:t>
       </w:r>
     </w:p>
     <w:p>
@@ -9442,7 +9441,7 @@
           <w:noProof/>
         </w:rPr>
         <w:drawing>
-          <wp:inline distT="0" distB="0" distL="0" distR="0" wp14:anchorId="016F0206" wp14:editId="1AAD5DA0">
+          <wp:inline distT="0" distB="0" distL="0" distR="0" wp14:anchorId="219468F9" wp14:editId="558BD1A0">
             <wp:extent cx="5760720" cy="2516852"/>
             <wp:effectExtent l="0" t="0" r="0" b="0"/>
             <wp:docPr id="9" name="Picture 9"/>
@@ -9553,12 +9552,12 @@
     </w:p>
     <w:p>
       <w:r>
+        <w:t>Together the three experiments give a negative answer to RQ4: the conclusions of this study do not extend beyond the CIC-IDS2017 research populations, and within CIC-IDS2017 there is no single extrapolable distribution. This both reinforces the falsification of H3 and shows that "multi-dataset validation" must be kept strictly distinct from "cross-dataset transfer".</w:t>
+      </w:r>
+    </w:p>
+    <w:p>
+      <w:r>
         <w:lastRenderedPageBreak/>
-        <w:t>Together the three experiments give a negative answer to RQ4: the conclusions of this study do not extend beyond the CIC-IDS2017 research populations, and within CIC-IDS2017 there is no single extrapolable distribution. This both reinforces the falsification of H3 and shows that "multi-dataset validation" must be kept strictly distinct from "cross-dataset transfer".</w:t>
-      </w:r>
-    </w:p>
-    <w:p>
-      <w:r>
         <w:t>The external benchmarks, the file-level extrapolation and the neural baseline comparison are provided in Supplementary S12-S14 and S19.</w:t>
       </w:r>
     </w:p>
@@ -9579,7 +9578,7 @@
           <w:noProof/>
         </w:rPr>
         <w:drawing>
-          <wp:inline distT="0" distB="0" distL="0" distR="0" wp14:anchorId="07ED7482" wp14:editId="3B9B52BE">
+          <wp:inline distT="0" distB="0" distL="0" distR="0" wp14:anchorId="6FF5D7AA" wp14:editId="455F8E37">
             <wp:extent cx="5760720" cy="2223311"/>
             <wp:effectExtent l="0" t="0" r="0" b="0"/>
             <wp:docPr id="10" name="Picture 10"/>
@@ -9666,7 +9665,7 @@
         </w:rPr>
         <w:lastRenderedPageBreak/>
         <w:drawing>
-          <wp:inline distT="0" distB="0" distL="0" distR="0" wp14:anchorId="50C204FF" wp14:editId="3E46952F">
+          <wp:inline distT="0" distB="0" distL="0" distR="0" wp14:anchorId="7DDFBEC0" wp14:editId="0BA5C5BD">
             <wp:extent cx="5760720" cy="2538527"/>
             <wp:effectExtent l="0" t="0" r="0" b="0"/>
             <wp:docPr id="11" name="Picture 11"/>
@@ -10641,7 +10640,7 @@
           <w:noProof/>
         </w:rPr>
         <w:drawing>
-          <wp:inline distT="0" distB="0" distL="0" distR="0" wp14:anchorId="34D61127" wp14:editId="135CE049">
+          <wp:inline distT="0" distB="0" distL="0" distR="0" wp14:anchorId="719F8C0B" wp14:editId="10CC7E88">
             <wp:extent cx="5760720" cy="1441223"/>
             <wp:effectExtent l="0" t="0" r="0" b="0"/>
             <wp:docPr id="12" name="Picture 12"/>
@@ -14011,76 +14010,76 @@
       </w:rPr>
     </w:lvl>
   </w:abstractNum>
-  <w:num w:numId="1" w16cid:durableId="356348841">
+  <w:num w:numId="1" w16cid:durableId="646203032">
     <w:abstractNumId w:val="8"/>
   </w:num>
-  <w:num w:numId="2" w16cid:durableId="900336322">
+  <w:num w:numId="2" w16cid:durableId="552274554">
     <w:abstractNumId w:val="6"/>
   </w:num>
-  <w:num w:numId="3" w16cid:durableId="608585762">
+  <w:num w:numId="3" w16cid:durableId="1208027210">
     <w:abstractNumId w:val="5"/>
   </w:num>
-  <w:num w:numId="4" w16cid:durableId="7222446">
+  <w:num w:numId="4" w16cid:durableId="1086609706">
     <w:abstractNumId w:val="4"/>
   </w:num>
-  <w:num w:numId="5" w16cid:durableId="964190275">
+  <w:num w:numId="5" w16cid:durableId="296762988">
     <w:abstractNumId w:val="7"/>
   </w:num>
-  <w:num w:numId="6" w16cid:durableId="190147193">
+  <w:num w:numId="6" w16cid:durableId="1383166201">
     <w:abstractNumId w:val="3"/>
   </w:num>
-  <w:num w:numId="7" w16cid:durableId="1617761232">
+  <w:num w:numId="7" w16cid:durableId="1475098942">
     <w:abstractNumId w:val="2"/>
   </w:num>
-  <w:num w:numId="8" w16cid:durableId="163592543">
+  <w:num w:numId="8" w16cid:durableId="94399596">
     <w:abstractNumId w:val="1"/>
   </w:num>
-  <w:num w:numId="9" w16cid:durableId="1347517905">
+  <w:num w:numId="9" w16cid:durableId="182785200">
     <w:abstractNumId w:val="0"/>
   </w:num>
-  <w:num w:numId="10" w16cid:durableId="1773889200">
+  <w:num w:numId="10" w16cid:durableId="1664508920">
     <w:abstractNumId w:val="7"/>
     <w:lvlOverride w:ilvl="0">
       <w:startOverride w:val="1"/>
     </w:lvlOverride>
   </w:num>
-  <w:num w:numId="11" w16cid:durableId="496262386">
+  <w:num w:numId="11" w16cid:durableId="808014970">
     <w:abstractNumId w:val="7"/>
     <w:lvlOverride w:ilvl="0">
       <w:startOverride w:val="1"/>
     </w:lvlOverride>
   </w:num>
-  <w:num w:numId="12" w16cid:durableId="373235137">
+  <w:num w:numId="12" w16cid:durableId="1191333458">
     <w:abstractNumId w:val="7"/>
     <w:lvlOverride w:ilvl="0">
       <w:startOverride w:val="1"/>
     </w:lvlOverride>
   </w:num>
-  <w:num w:numId="13" w16cid:durableId="1299412554">
+  <w:num w:numId="13" w16cid:durableId="526215969">
     <w:abstractNumId w:val="7"/>
     <w:lvlOverride w:ilvl="0">
       <w:startOverride w:val="1"/>
     </w:lvlOverride>
   </w:num>
-  <w:num w:numId="14" w16cid:durableId="1429958650">
+  <w:num w:numId="14" w16cid:durableId="2085950445">
     <w:abstractNumId w:val="7"/>
     <w:lvlOverride w:ilvl="0">
       <w:startOverride w:val="1"/>
     </w:lvlOverride>
   </w:num>
-  <w:num w:numId="15" w16cid:durableId="629894839">
+  <w:num w:numId="15" w16cid:durableId="866715716">
     <w:abstractNumId w:val="7"/>
     <w:lvlOverride w:ilvl="0">
       <w:startOverride w:val="1"/>
     </w:lvlOverride>
   </w:num>
-  <w:num w:numId="16" w16cid:durableId="1854949559">
+  <w:num w:numId="16" w16cid:durableId="781920386">
     <w:abstractNumId w:val="7"/>
     <w:lvlOverride w:ilvl="0">
       <w:startOverride w:val="1"/>
     </w:lvlOverride>
   </w:num>
-  <w:num w:numId="17" w16cid:durableId="2080202014">
+  <w:num w:numId="17" w16cid:durableId="563374339">
     <w:abstractNumId w:val="7"/>
     <w:lvlOverride w:ilvl="0">
       <w:startOverride w:val="1"/>

</xml_diff>

<commit_message>
Round 20bl: gap sweep - refresh the stale citation spot-check table and residual-gap rows (figure range, temporal/full-corpus/near-duplicate now recorded as performed), drop the CJK title from the English manuscript; 53-check gate green
</commit_message>
<xml_diff>
--- a/重构版论文_v4_20260915/English_SCI_Manuscript_v4.docx
+++ b/重构版论文_v4_20260915/English_SCI_Manuscript_v4.docx
@@ -1039,7 +1039,7 @@
           <w:noProof/>
         </w:rPr>
         <w:drawing>
-          <wp:inline distT="0" distB="0" distL="0" distR="0" wp14:anchorId="38FAB946" wp14:editId="05A28BF9">
+          <wp:inline distT="0" distB="0" distL="0" distR="0" wp14:anchorId="5F46113C" wp14:editId="1E10224F">
             <wp:extent cx="5760720" cy="2734826"/>
             <wp:effectExtent l="0" t="0" r="0" b="0"/>
             <wp:docPr id="1" name="Picture 1"/>
@@ -2426,7 +2426,7 @@
           <w:noProof/>
         </w:rPr>
         <w:drawing>
-          <wp:inline distT="0" distB="0" distL="0" distR="0" wp14:anchorId="47E08541" wp14:editId="0B64F87E">
+          <wp:inline distT="0" distB="0" distL="0" distR="0" wp14:anchorId="6C00FFAC" wp14:editId="7D5D548E">
             <wp:extent cx="5760720" cy="2722098"/>
             <wp:effectExtent l="0" t="0" r="0" b="0"/>
             <wp:docPr id="2" name="Picture 2"/>
@@ -3419,7 +3419,7 @@
           <w:noProof/>
         </w:rPr>
         <w:drawing>
-          <wp:inline distT="0" distB="0" distL="0" distR="0" wp14:anchorId="3B9DA023" wp14:editId="2915388E">
+          <wp:inline distT="0" distB="0" distL="0" distR="0" wp14:anchorId="0081BB29" wp14:editId="0BF5B2D8">
             <wp:extent cx="5760720" cy="3482709"/>
             <wp:effectExtent l="0" t="0" r="0" b="0"/>
             <wp:docPr id="3" name="Picture 3"/>
@@ -7205,7 +7205,7 @@
           <w:noProof/>
         </w:rPr>
         <w:drawing>
-          <wp:inline distT="0" distB="0" distL="0" distR="0" wp14:anchorId="2E277142" wp14:editId="3A30CA5E">
+          <wp:inline distT="0" distB="0" distL="0" distR="0" wp14:anchorId="6BDABC9E" wp14:editId="4182EEEC">
             <wp:extent cx="5760720" cy="2356272"/>
             <wp:effectExtent l="0" t="0" r="0" b="0"/>
             <wp:docPr id="4" name="Picture 4"/>
@@ -8168,7 +8168,7 @@
           <w:noProof/>
         </w:rPr>
         <w:drawing>
-          <wp:inline distT="0" distB="0" distL="0" distR="0" wp14:anchorId="7CD0465F" wp14:editId="5D289CA0">
+          <wp:inline distT="0" distB="0" distL="0" distR="0" wp14:anchorId="5714BD28" wp14:editId="51A9972C">
             <wp:extent cx="5760720" cy="2045294"/>
             <wp:effectExtent l="0" t="0" r="0" b="0"/>
             <wp:docPr id="5" name="Picture 5"/>
@@ -8346,7 +8346,7 @@
           <w:noProof/>
         </w:rPr>
         <w:drawing>
-          <wp:inline distT="0" distB="0" distL="0" distR="0" wp14:anchorId="7A0D988A" wp14:editId="76A1CDFB">
+          <wp:inline distT="0" distB="0" distL="0" distR="0" wp14:anchorId="7219658C" wp14:editId="5359A1A5">
             <wp:extent cx="5760720" cy="2308234"/>
             <wp:effectExtent l="0" t="0" r="0" b="0"/>
             <wp:docPr id="6" name="Picture 6"/>
@@ -9078,7 +9078,7 @@
           <w:noProof/>
         </w:rPr>
         <w:drawing>
-          <wp:inline distT="0" distB="0" distL="0" distR="0" wp14:anchorId="38680D18" wp14:editId="0ACB35C0">
+          <wp:inline distT="0" distB="0" distL="0" distR="0" wp14:anchorId="309B2576" wp14:editId="4AF8F6A2">
             <wp:extent cx="5760720" cy="2167923"/>
             <wp:effectExtent l="0" t="0" r="0" b="0"/>
             <wp:docPr id="7" name="Picture 7"/>
@@ -9257,7 +9257,7 @@
           <w:noProof/>
         </w:rPr>
         <w:drawing>
-          <wp:inline distT="0" distB="0" distL="0" distR="0" wp14:anchorId="30D9CD09" wp14:editId="2E9B9448">
+          <wp:inline distT="0" distB="0" distL="0" distR="0" wp14:anchorId="4C1A8BBA" wp14:editId="316F4779">
             <wp:extent cx="5760720" cy="2258878"/>
             <wp:effectExtent l="0" t="0" r="0" b="0"/>
             <wp:docPr id="8" name="Picture 8"/>
@@ -9441,7 +9441,7 @@
           <w:noProof/>
         </w:rPr>
         <w:drawing>
-          <wp:inline distT="0" distB="0" distL="0" distR="0" wp14:anchorId="219468F9" wp14:editId="558BD1A0">
+          <wp:inline distT="0" distB="0" distL="0" distR="0" wp14:anchorId="1515ABD3" wp14:editId="7B6D8056">
             <wp:extent cx="5760720" cy="2516852"/>
             <wp:effectExtent l="0" t="0" r="0" b="0"/>
             <wp:docPr id="9" name="Picture 9"/>
@@ -9578,7 +9578,7 @@
           <w:noProof/>
         </w:rPr>
         <w:drawing>
-          <wp:inline distT="0" distB="0" distL="0" distR="0" wp14:anchorId="6FF5D7AA" wp14:editId="455F8E37">
+          <wp:inline distT="0" distB="0" distL="0" distR="0" wp14:anchorId="32E15668" wp14:editId="09BCB4AB">
             <wp:extent cx="5760720" cy="2223311"/>
             <wp:effectExtent l="0" t="0" r="0" b="0"/>
             <wp:docPr id="10" name="Picture 10"/>
@@ -9665,7 +9665,7 @@
         </w:rPr>
         <w:lastRenderedPageBreak/>
         <w:drawing>
-          <wp:inline distT="0" distB="0" distL="0" distR="0" wp14:anchorId="7DDFBEC0" wp14:editId="0BA5C5BD">
+          <wp:inline distT="0" distB="0" distL="0" distR="0" wp14:anchorId="276BB247" wp14:editId="69A3236F">
             <wp:extent cx="5760720" cy="2538527"/>
             <wp:effectExtent l="0" t="0" r="0" b="0"/>
             <wp:docPr id="11" name="Picture 11"/>
@@ -10537,13 +10537,7 @@
     </w:p>
     <w:p>
       <w:r>
-        <w:t>Fourteen extensions probe the boundaries of the main result; their per-seed data and a standalone report ship with the release (</w:t>
-      </w:r>
-      <w:r>
-        <w:t>扩展实验报告</w:t>
-      </w:r>
-      <w:r>
-        <w:t xml:space="preserve">, </w:t>
+        <w:t xml:space="preserve">Fourteen extensions probe the boundaries of the main result; their per-seed data and a standalone report ship with the release (the extension-experiment report, </w:t>
       </w:r>
       <w:r>
         <w:rPr>
@@ -10640,7 +10634,7 @@
           <w:noProof/>
         </w:rPr>
         <w:drawing>
-          <wp:inline distT="0" distB="0" distL="0" distR="0" wp14:anchorId="719F8C0B" wp14:editId="10CC7E88">
+          <wp:inline distT="0" distB="0" distL="0" distR="0" wp14:anchorId="32934AC4" wp14:editId="57A81B31">
             <wp:extent cx="5760720" cy="1441223"/>
             <wp:effectExtent l="0" t="0" r="0" b="0"/>
             <wp:docPr id="12" name="Picture 12"/>
@@ -14010,76 +14004,76 @@
       </w:rPr>
     </w:lvl>
   </w:abstractNum>
-  <w:num w:numId="1" w16cid:durableId="646203032">
+  <w:num w:numId="1" w16cid:durableId="860362405">
     <w:abstractNumId w:val="8"/>
   </w:num>
-  <w:num w:numId="2" w16cid:durableId="552274554">
+  <w:num w:numId="2" w16cid:durableId="696392713">
     <w:abstractNumId w:val="6"/>
   </w:num>
-  <w:num w:numId="3" w16cid:durableId="1208027210">
+  <w:num w:numId="3" w16cid:durableId="1855917676">
     <w:abstractNumId w:val="5"/>
   </w:num>
-  <w:num w:numId="4" w16cid:durableId="1086609706">
+  <w:num w:numId="4" w16cid:durableId="1844391922">
     <w:abstractNumId w:val="4"/>
   </w:num>
-  <w:num w:numId="5" w16cid:durableId="296762988">
+  <w:num w:numId="5" w16cid:durableId="620113291">
     <w:abstractNumId w:val="7"/>
   </w:num>
-  <w:num w:numId="6" w16cid:durableId="1383166201">
+  <w:num w:numId="6" w16cid:durableId="1923878639">
     <w:abstractNumId w:val="3"/>
   </w:num>
-  <w:num w:numId="7" w16cid:durableId="1475098942">
+  <w:num w:numId="7" w16cid:durableId="1864434037">
     <w:abstractNumId w:val="2"/>
   </w:num>
-  <w:num w:numId="8" w16cid:durableId="94399596">
+  <w:num w:numId="8" w16cid:durableId="204341818">
     <w:abstractNumId w:val="1"/>
   </w:num>
-  <w:num w:numId="9" w16cid:durableId="182785200">
+  <w:num w:numId="9" w16cid:durableId="1553809362">
     <w:abstractNumId w:val="0"/>
   </w:num>
-  <w:num w:numId="10" w16cid:durableId="1664508920">
+  <w:num w:numId="10" w16cid:durableId="1977756830">
     <w:abstractNumId w:val="7"/>
     <w:lvlOverride w:ilvl="0">
       <w:startOverride w:val="1"/>
     </w:lvlOverride>
   </w:num>
-  <w:num w:numId="11" w16cid:durableId="808014970">
+  <w:num w:numId="11" w16cid:durableId="2125999266">
     <w:abstractNumId w:val="7"/>
     <w:lvlOverride w:ilvl="0">
       <w:startOverride w:val="1"/>
     </w:lvlOverride>
   </w:num>
-  <w:num w:numId="12" w16cid:durableId="1191333458">
+  <w:num w:numId="12" w16cid:durableId="2065911397">
     <w:abstractNumId w:val="7"/>
     <w:lvlOverride w:ilvl="0">
       <w:startOverride w:val="1"/>
     </w:lvlOverride>
   </w:num>
-  <w:num w:numId="13" w16cid:durableId="526215969">
+  <w:num w:numId="13" w16cid:durableId="102842492">
     <w:abstractNumId w:val="7"/>
     <w:lvlOverride w:ilvl="0">
       <w:startOverride w:val="1"/>
     </w:lvlOverride>
   </w:num>
-  <w:num w:numId="14" w16cid:durableId="2085950445">
+  <w:num w:numId="14" w16cid:durableId="1361591820">
     <w:abstractNumId w:val="7"/>
     <w:lvlOverride w:ilvl="0">
       <w:startOverride w:val="1"/>
     </w:lvlOverride>
   </w:num>
-  <w:num w:numId="15" w16cid:durableId="866715716">
+  <w:num w:numId="15" w16cid:durableId="2042894807">
     <w:abstractNumId w:val="7"/>
     <w:lvlOverride w:ilvl="0">
       <w:startOverride w:val="1"/>
     </w:lvlOverride>
   </w:num>
-  <w:num w:numId="16" w16cid:durableId="781920386">
+  <w:num w:numId="16" w16cid:durableId="58065382">
     <w:abstractNumId w:val="7"/>
     <w:lvlOverride w:ilvl="0">
       <w:startOverride w:val="1"/>
     </w:lvlOverride>
   </w:num>
-  <w:num w:numId="17" w16cid:durableId="563374339">
+  <w:num w:numId="17" w16cid:durableId="816068876">
     <w:abstractNumId w:val="7"/>
     <w:lvlOverride w:ilvl="0">
       <w:startOverride w:val="1"/>

</xml_diff>

<commit_message>
Round 20bm: write the modern-corpus ladder into the manuscript as Section 5.10 (rung table, source holdouts, budget dose-response, mechanism suite; 771:771 number alignment), point 5.8 at it and put one ladder line in the Highlights; 53-check gate green
</commit_message>
<xml_diff>
--- a/重构版论文_v4_20260915/English_SCI_Manuscript_v4.docx
+++ b/重构版论文_v4_20260915/English_SCI_Manuscript_v4.docx
@@ -1039,7 +1039,7 @@
           <w:noProof/>
         </w:rPr>
         <w:drawing>
-          <wp:inline distT="0" distB="0" distL="0" distR="0" wp14:anchorId="5F46113C" wp14:editId="1E10224F">
+          <wp:inline distT="0" distB="0" distL="0" distR="0" wp14:anchorId="64752CB2" wp14:editId="7E409C33">
             <wp:extent cx="5760720" cy="2734826"/>
             <wp:effectExtent l="0" t="0" r="0" b="0"/>
             <wp:docPr id="1" name="Picture 1"/>
@@ -2426,7 +2426,7 @@
           <w:noProof/>
         </w:rPr>
         <w:drawing>
-          <wp:inline distT="0" distB="0" distL="0" distR="0" wp14:anchorId="6C00FFAC" wp14:editId="7D5D548E">
+          <wp:inline distT="0" distB="0" distL="0" distR="0" wp14:anchorId="0FB5542E" wp14:editId="3A6B21BB">
             <wp:extent cx="5760720" cy="2722098"/>
             <wp:effectExtent l="0" t="0" r="0" b="0"/>
             <wp:docPr id="2" name="Picture 2"/>
@@ -3419,7 +3419,7 @@
           <w:noProof/>
         </w:rPr>
         <w:drawing>
-          <wp:inline distT="0" distB="0" distL="0" distR="0" wp14:anchorId="0081BB29" wp14:editId="0BF5B2D8">
+          <wp:inline distT="0" distB="0" distL="0" distR="0" wp14:anchorId="3AF9E58A" wp14:editId="1FE7BA79">
             <wp:extent cx="5760720" cy="3482709"/>
             <wp:effectExtent l="0" t="0" r="0" b="0"/>
             <wp:docPr id="3" name="Picture 3"/>
@@ -4928,7 +4928,7 @@
     </w:p>
     <w:p>
       <w:r>
-        <w:t>The chapter follows RQ1 to RQ4. RQ1 is answered in 5.1; RQ2 in 5.2, with the mechanism that explains its outcome in 5.3; RQ3 in 5.4 and again at scale in 5.7; RQ4 in 5.5. Section 5.6 reports calibration, robustness, latency and open-set behaviour, which qualify the comparisons without answering a question of their own. Sections 5.7 to 5.9 extend the same comparisons to scale, to seventeen corpora and to their pooled equivalence test.</w:t>
+        <w:t>The chapter follows RQ1 to RQ4. RQ1 is answered in 5.1; RQ2 in 5.2, with the mechanism that explains its outcome in 5.3; RQ3 in 5.4 and again at scale in 5.7; RQ4 in 5.5. Section 5.6 reports calibration, robustness, latency and open-set behaviour, which qualify the comparisons without answering a question of their own. Sections 5.7 to 5.10 extend the same comparisons to scale, to seventeen corpora and to their pooled equivalence test.</w:t>
       </w:r>
     </w:p>
     <w:p>
@@ -7205,7 +7205,7 @@
           <w:noProof/>
         </w:rPr>
         <w:drawing>
-          <wp:inline distT="0" distB="0" distL="0" distR="0" wp14:anchorId="6BDABC9E" wp14:editId="4182EEEC">
+          <wp:inline distT="0" distB="0" distL="0" distR="0" wp14:anchorId="17E9778C" wp14:editId="729BE330">
             <wp:extent cx="5760720" cy="2356272"/>
             <wp:effectExtent l="0" t="0" r="0" b="0"/>
             <wp:docPr id="4" name="Picture 4"/>
@@ -8168,7 +8168,7 @@
           <w:noProof/>
         </w:rPr>
         <w:drawing>
-          <wp:inline distT="0" distB="0" distL="0" distR="0" wp14:anchorId="5714BD28" wp14:editId="51A9972C">
+          <wp:inline distT="0" distB="0" distL="0" distR="0" wp14:anchorId="6167A484" wp14:editId="601F545C">
             <wp:extent cx="5760720" cy="2045294"/>
             <wp:effectExtent l="0" t="0" r="0" b="0"/>
             <wp:docPr id="5" name="Picture 5"/>
@@ -8346,7 +8346,7 @@
           <w:noProof/>
         </w:rPr>
         <w:drawing>
-          <wp:inline distT="0" distB="0" distL="0" distR="0" wp14:anchorId="7219658C" wp14:editId="5359A1A5">
+          <wp:inline distT="0" distB="0" distL="0" distR="0" wp14:anchorId="2CF449A8" wp14:editId="32BA6BA7">
             <wp:extent cx="5760720" cy="2308234"/>
             <wp:effectExtent l="0" t="0" r="0" b="0"/>
             <wp:docPr id="6" name="Picture 6"/>
@@ -9078,7 +9078,7 @@
           <w:noProof/>
         </w:rPr>
         <w:drawing>
-          <wp:inline distT="0" distB="0" distL="0" distR="0" wp14:anchorId="309B2576" wp14:editId="4AF8F6A2">
+          <wp:inline distT="0" distB="0" distL="0" distR="0" wp14:anchorId="34C0B34B" wp14:editId="5FAB24FA">
             <wp:extent cx="5760720" cy="2167923"/>
             <wp:effectExtent l="0" t="0" r="0" b="0"/>
             <wp:docPr id="7" name="Picture 7"/>
@@ -9257,7 +9257,7 @@
           <w:noProof/>
         </w:rPr>
         <w:drawing>
-          <wp:inline distT="0" distB="0" distL="0" distR="0" wp14:anchorId="4C1A8BBA" wp14:editId="316F4779">
+          <wp:inline distT="0" distB="0" distL="0" distR="0" wp14:anchorId="43B677C4" wp14:editId="4A1D7817">
             <wp:extent cx="5760720" cy="2258878"/>
             <wp:effectExtent l="0" t="0" r="0" b="0"/>
             <wp:docPr id="8" name="Picture 8"/>
@@ -9441,7 +9441,7 @@
           <w:noProof/>
         </w:rPr>
         <w:drawing>
-          <wp:inline distT="0" distB="0" distL="0" distR="0" wp14:anchorId="1515ABD3" wp14:editId="7B6D8056">
+          <wp:inline distT="0" distB="0" distL="0" distR="0" wp14:anchorId="6794D4AF" wp14:editId="53B01E9B">
             <wp:extent cx="5760720" cy="2516852"/>
             <wp:effectExtent l="0" t="0" r="0" b="0"/>
             <wp:docPr id="9" name="Picture 9"/>
@@ -9578,7 +9578,7 @@
           <w:noProof/>
         </w:rPr>
         <w:drawing>
-          <wp:inline distT="0" distB="0" distL="0" distR="0" wp14:anchorId="32E15668" wp14:editId="09BCB4AB">
+          <wp:inline distT="0" distB="0" distL="0" distR="0" wp14:anchorId="269302C4" wp14:editId="70DDE69A">
             <wp:extent cx="5760720" cy="2223311"/>
             <wp:effectExtent l="0" t="0" r="0" b="0"/>
             <wp:docPr id="10" name="Picture 10"/>
@@ -9665,7 +9665,7 @@
         </w:rPr>
         <w:lastRenderedPageBreak/>
         <w:drawing>
-          <wp:inline distT="0" distB="0" distL="0" distR="0" wp14:anchorId="276BB247" wp14:editId="69A3236F">
+          <wp:inline distT="0" distB="0" distL="0" distR="0" wp14:anchorId="0BE49424" wp14:editId="5B13D5A9">
             <wp:extent cx="5760720" cy="2538527"/>
             <wp:effectExtent l="0" t="0" r="0" b="0"/>
             <wp:docPr id="11" name="Picture 11"/>
@@ -10618,11 +10618,11 @@
         <w:t xml:space="preserve"> The 2017 scale ladder was re-run on modern corpora: CIC-IoT-2023 at 200k per class (307,516 test rows) differs by -0.000021 and at 500k per class (599,792 rows) by -0.000004; Gotham-2025 differs by +0.000011 at 200k per class (415,223 rows) and by +0.000009 on the uncapped 7,189,693-row corpus (18 classes). The feature-budget sweep is monotone (k=8 +0.001663, k=16 +0.000402, k=32 -0.000002, k=60 -0.000004). Source holdouts give the distribution-shift control: 12/78 Gotham devices, RCCF mean 0.967127, arm g</w:t>
       </w:r>
       <w:r>
-        <w:t xml:space="preserve">ap +0.000000; 12/122 6TiSCH runs, mean 0.522326, gap +0.000123. The mechanism suite explains why: the arms </w:t>
+        <w:t xml:space="preserve">ap +0.000000; 12/122 6TiSCH runs, mean 0.522326, gap +0.000123. Section 5.10 gives the full rung table, the </w:t>
       </w:r>
       <w:r>
         <w:lastRenderedPageBreak/>
-        <w:t>change 0 of 297,180 Gotham labels and 12 of 375,160 CIC-IoT-2023 labels (99.45% ruled out by the bound), with tree weights in 0.0091-0.0102 against the 0.01 uniform value.</w:t>
+        <w:t>source holdouts and the mechanism decomposition. The mechanism suite explains why: the arms change 0 of 297,180 Gotham labels and 12 of 375,160 CIC-IoT-2023 labels (99.45% ruled out by the bound), with tree weights in 0.0091-0.0102 against the 0.01 uniform value.</w:t>
       </w:r>
     </w:p>
     <w:p>
@@ -10634,7 +10634,7 @@
           <w:noProof/>
         </w:rPr>
         <w:drawing>
-          <wp:inline distT="0" distB="0" distL="0" distR="0" wp14:anchorId="32934AC4" wp14:editId="57A81B31">
+          <wp:inline distT="0" distB="0" distL="0" distR="0" wp14:anchorId="22F89128" wp14:editId="34E5806D">
             <wp:extent cx="5760720" cy="1441223"/>
             <wp:effectExtent l="0" t="0" r="0" b="0"/>
             <wp:docPr id="12" name="Picture 12"/>
@@ -10738,11 +10738,835 @@
         <w:t>The equivalence result above rests on CIC-IDS2017. Twelve further corpora published between 2020 and 2026 - four of them in 2025 and three in 2026 - were run under the same protocol, the same ten seeds and the same-members control, and all of them released their per-row predictions. Re-deriving the paired difference from those predictions gives 120 seed-level comparisons with a pooled mean of +0.000007 Macro-F1 and a 90% interval of [-0.000006, +0.000020] - inside both the 0.005 and the 0.01 margin. One cor</w:t>
       </w:r>
       <w:r>
-        <w:t xml:space="preserve">pus is excluded from that pool and reported on its own: Gotham-2025 with the feature budget cut to eight of sixteen columns, where the gate wins </w:t>
+        <w:t xml:space="preserve">pus is excluded from that pool and </w:t>
       </w:r>
       <w:r>
         <w:lastRenderedPageBreak/>
-        <w:t>+0.006252 with 10 of 10 seeds positive. Adding that case back in still leaves the aggregate equivalent (+0.000487, 90% interval [+0.000243, +0.000732]). The aggregation-rule conclusion therefore does not depend on the vintage of the corpus, and the single deviation from it is the condition the identifiability analysis predicts.</w:t>
+        <w:t>reported on its own: Gotham-2025 with the feature budget cut to eight of sixteen columns, where the gate wins +0.006252 with 10 of 10 seeds positive. Adding that case back in still leaves the aggregate equivalent (+0.000487, 90% interval [+0.000243, +0.000732]). The aggregation-rule conclusion therefore does not depend on the vintage of the corpus, and the single deviation from it is the condition the identifiability analysis predicts.</w:t>
+      </w:r>
+    </w:p>
+    <w:p>
+      <w:pPr>
+        <w:pStyle w:val="21"/>
+      </w:pPr>
+      <w:r>
+        <w:t>5.10 The modern-corpus ladder: scale, distribution shift and the mechanism</w:t>
+      </w:r>
+    </w:p>
+    <w:p>
+      <w:r>
+        <w:t>Sections 5.7 and 5.9 answer the scale and vintage questions separately, and both rest on random</w:t>
+      </w:r>
+    </w:p>
+    <w:p>
+      <w:r>
+        <w:t>splits. This section does three things at once: it moves the 2017 scale ladder onto modern corpora,</w:t>
+      </w:r>
+    </w:p>
+    <w:p>
+      <w:r>
+        <w:t>it re-runs the same comparison under a genuine distribution shift (held-out devices and runs), and</w:t>
+      </w:r>
+    </w:p>
+    <w:p>
+      <w:r>
+        <w:t>it explains the outcome with the mechanism suite. Same protocol, same ten seeds throughout.</w:t>
+      </w:r>
+    </w:p>
+    <w:tbl>
+      <w:tblPr>
+        <w:tblStyle w:val="aff1"/>
+        <w:tblW w:w="0" w:type="auto"/>
+        <w:tblBorders>
+          <w:top w:val="single" w:sz="6" w:space="0" w:color="000000"/>
+          <w:left w:val="none" w:sz="0" w:space="0" w:color="auto"/>
+          <w:bottom w:val="single" w:sz="6" w:space="0" w:color="000000"/>
+          <w:right w:val="none" w:sz="0" w:space="0" w:color="auto"/>
+          <w:insideH w:val="single" w:sz="6" w:space="0" w:color="000000"/>
+          <w:insideV w:val="none" w:sz="0" w:space="0" w:color="auto"/>
+        </w:tblBorders>
+        <w:tblLook w:val="04A0" w:firstRow="1" w:lastRow="0" w:firstColumn="1" w:lastColumn="0" w:noHBand="0" w:noVBand="1"/>
+      </w:tblPr>
+      <w:tblGrid>
+        <w:gridCol w:w="1958"/>
+        <w:gridCol w:w="1958"/>
+        <w:gridCol w:w="1958"/>
+        <w:gridCol w:w="1958"/>
+        <w:gridCol w:w="1958"/>
+      </w:tblGrid>
+      <w:tr>
+        <w:tc>
+          <w:tcPr>
+            <w:tcW w:w="1958" w:type="dxa"/>
+          </w:tcPr>
+          <w:p>
+            <w:pPr>
+              <w:spacing w:after="0"/>
+            </w:pPr>
+            <w:r>
+              <w:rPr>
+                <w:b/>
+                <w:sz w:val="16"/>
+              </w:rPr>
+              <w:t>Rung</w:t>
+            </w:r>
+          </w:p>
+        </w:tc>
+        <w:tc>
+          <w:tcPr>
+            <w:tcW w:w="1958" w:type="dxa"/>
+          </w:tcPr>
+          <w:p>
+            <w:pPr>
+              <w:spacing w:after="0"/>
+            </w:pPr>
+            <w:r>
+              <w:rPr>
+                <w:b/>
+                <w:sz w:val="16"/>
+              </w:rPr>
+              <w:t>Test rows</w:t>
+            </w:r>
+          </w:p>
+        </w:tc>
+        <w:tc>
+          <w:tcPr>
+            <w:tcW w:w="1958" w:type="dxa"/>
+          </w:tcPr>
+          <w:p>
+            <w:pPr>
+              <w:spacing w:after="0"/>
+            </w:pPr>
+            <w:r>
+              <w:rPr>
+                <w:b/>
+                <w:sz w:val="16"/>
+              </w:rPr>
+              <w:t>Conditional weighting</w:t>
+            </w:r>
+          </w:p>
+        </w:tc>
+        <w:tc>
+          <w:tcPr>
+            <w:tcW w:w="1958" w:type="dxa"/>
+          </w:tcPr>
+          <w:p>
+            <w:pPr>
+              <w:spacing w:after="0"/>
+            </w:pPr>
+            <w:r>
+              <w:rPr>
+                <w:b/>
+                <w:sz w:val="16"/>
+              </w:rPr>
+              <w:t>Same-members equal</w:t>
+            </w:r>
+          </w:p>
+        </w:tc>
+        <w:tc>
+          <w:tcPr>
+            <w:tcW w:w="1958" w:type="dxa"/>
+          </w:tcPr>
+          <w:p>
+            <w:pPr>
+              <w:spacing w:after="0"/>
+            </w:pPr>
+            <w:r>
+              <w:rPr>
+                <w:b/>
+                <w:sz w:val="16"/>
+              </w:rPr>
+              <w:t>Difference</w:t>
+            </w:r>
+          </w:p>
+        </w:tc>
+      </w:tr>
+      <w:tr>
+        <w:tc>
+          <w:tcPr>
+            <w:tcW w:w="1958" w:type="dxa"/>
+          </w:tcPr>
+          <w:p>
+            <w:pPr>
+              <w:spacing w:after="0"/>
+            </w:pPr>
+            <w:r>
+              <w:rPr>
+                <w:sz w:val="16"/>
+              </w:rPr>
+              <w:t>CIC-IoT-2023 (200k per class)</w:t>
+            </w:r>
+          </w:p>
+        </w:tc>
+        <w:tc>
+          <w:tcPr>
+            <w:tcW w:w="1958" w:type="dxa"/>
+          </w:tcPr>
+          <w:p>
+            <w:pPr>
+              <w:spacing w:after="0"/>
+            </w:pPr>
+            <w:r>
+              <w:rPr>
+                <w:sz w:val="16"/>
+              </w:rPr>
+              <w:t>307,516</w:t>
+            </w:r>
+          </w:p>
+        </w:tc>
+        <w:tc>
+          <w:tcPr>
+            <w:tcW w:w="1958" w:type="dxa"/>
+          </w:tcPr>
+          <w:p>
+            <w:pPr>
+              <w:spacing w:after="0"/>
+            </w:pPr>
+            <w:r>
+              <w:rPr>
+                <w:sz w:val="16"/>
+              </w:rPr>
+              <w:t>0.726505</w:t>
+            </w:r>
+          </w:p>
+        </w:tc>
+        <w:tc>
+          <w:tcPr>
+            <w:tcW w:w="1958" w:type="dxa"/>
+          </w:tcPr>
+          <w:p>
+            <w:pPr>
+              <w:spacing w:after="0"/>
+            </w:pPr>
+            <w:r>
+              <w:rPr>
+                <w:sz w:val="16"/>
+              </w:rPr>
+              <w:t>0.726525</w:t>
+            </w:r>
+          </w:p>
+        </w:tc>
+        <w:tc>
+          <w:tcPr>
+            <w:tcW w:w="1958" w:type="dxa"/>
+          </w:tcPr>
+          <w:p>
+            <w:pPr>
+              <w:spacing w:after="0"/>
+            </w:pPr>
+            <w:r>
+              <w:rPr>
+                <w:sz w:val="16"/>
+              </w:rPr>
+              <w:t>-0.000021</w:t>
+            </w:r>
+          </w:p>
+        </w:tc>
+      </w:tr>
+      <w:tr>
+        <w:tc>
+          <w:tcPr>
+            <w:tcW w:w="1958" w:type="dxa"/>
+          </w:tcPr>
+          <w:p>
+            <w:pPr>
+              <w:spacing w:after="0"/>
+            </w:pPr>
+            <w:r>
+              <w:rPr>
+                <w:sz w:val="16"/>
+              </w:rPr>
+              <w:t>CIC-IoT-2023 (500k per class)</w:t>
+            </w:r>
+          </w:p>
+        </w:tc>
+        <w:tc>
+          <w:tcPr>
+            <w:tcW w:w="1958" w:type="dxa"/>
+          </w:tcPr>
+          <w:p>
+            <w:pPr>
+              <w:spacing w:after="0"/>
+            </w:pPr>
+            <w:r>
+              <w:rPr>
+                <w:sz w:val="16"/>
+              </w:rPr>
+              <w:t>599,792</w:t>
+            </w:r>
+          </w:p>
+        </w:tc>
+        <w:tc>
+          <w:tcPr>
+            <w:tcW w:w="1958" w:type="dxa"/>
+          </w:tcPr>
+          <w:p>
+            <w:pPr>
+              <w:spacing w:after="0"/>
+            </w:pPr>
+            <w:r>
+              <w:rPr>
+                <w:sz w:val="16"/>
+              </w:rPr>
+              <w:t>0.714826</w:t>
+            </w:r>
+          </w:p>
+        </w:tc>
+        <w:tc>
+          <w:tcPr>
+            <w:tcW w:w="1958" w:type="dxa"/>
+          </w:tcPr>
+          <w:p>
+            <w:pPr>
+              <w:spacing w:after="0"/>
+            </w:pPr>
+            <w:r>
+              <w:rPr>
+                <w:sz w:val="16"/>
+              </w:rPr>
+              <w:t>0.714830</w:t>
+            </w:r>
+          </w:p>
+        </w:tc>
+        <w:tc>
+          <w:tcPr>
+            <w:tcW w:w="1958" w:type="dxa"/>
+          </w:tcPr>
+          <w:p>
+            <w:pPr>
+              <w:spacing w:after="0"/>
+            </w:pPr>
+            <w:r>
+              <w:rPr>
+                <w:sz w:val="16"/>
+              </w:rPr>
+              <w:t>-0.000004</w:t>
+            </w:r>
+          </w:p>
+        </w:tc>
+      </w:tr>
+      <w:tr>
+        <w:tc>
+          <w:tcPr>
+            <w:tcW w:w="1958" w:type="dxa"/>
+          </w:tcPr>
+          <w:p>
+            <w:pPr>
+              <w:spacing w:after="0"/>
+            </w:pPr>
+            <w:r>
+              <w:rPr>
+                <w:sz w:val="16"/>
+              </w:rPr>
+              <w:t>Gotham-2025 (200k per class)</w:t>
+            </w:r>
+          </w:p>
+        </w:tc>
+        <w:tc>
+          <w:tcPr>
+            <w:tcW w:w="1958" w:type="dxa"/>
+          </w:tcPr>
+          <w:p>
+            <w:pPr>
+              <w:spacing w:after="0"/>
+            </w:pPr>
+            <w:r>
+              <w:rPr>
+                <w:sz w:val="16"/>
+              </w:rPr>
+              <w:t>415,223</w:t>
+            </w:r>
+          </w:p>
+        </w:tc>
+        <w:tc>
+          <w:tcPr>
+            <w:tcW w:w="1958" w:type="dxa"/>
+          </w:tcPr>
+          <w:p>
+            <w:pPr>
+              <w:spacing w:after="0"/>
+            </w:pPr>
+            <w:r>
+              <w:rPr>
+                <w:sz w:val="16"/>
+              </w:rPr>
+              <w:t>0.983863</w:t>
+            </w:r>
+          </w:p>
+        </w:tc>
+        <w:tc>
+          <w:tcPr>
+            <w:tcW w:w="1958" w:type="dxa"/>
+          </w:tcPr>
+          <w:p>
+            <w:pPr>
+              <w:spacing w:after="0"/>
+            </w:pPr>
+            <w:r>
+              <w:rPr>
+                <w:sz w:val="16"/>
+              </w:rPr>
+              <w:t>0.983852</w:t>
+            </w:r>
+          </w:p>
+        </w:tc>
+        <w:tc>
+          <w:tcPr>
+            <w:tcW w:w="1958" w:type="dxa"/>
+          </w:tcPr>
+          <w:p>
+            <w:pPr>
+              <w:spacing w:after="0"/>
+            </w:pPr>
+            <w:r>
+              <w:rPr>
+                <w:sz w:val="16"/>
+              </w:rPr>
+              <w:t>+0.000011</w:t>
+            </w:r>
+          </w:p>
+        </w:tc>
+      </w:tr>
+      <w:tr>
+        <w:tc>
+          <w:tcPr>
+            <w:tcW w:w="1958" w:type="dxa"/>
+          </w:tcPr>
+          <w:p>
+            <w:pPr>
+              <w:spacing w:after="0"/>
+            </w:pPr>
+            <w:r>
+              <w:rPr>
+                <w:sz w:val="16"/>
+              </w:rPr>
+              <w:t>Gotham-2025 (uncapped)</w:t>
+            </w:r>
+          </w:p>
+        </w:tc>
+        <w:tc>
+          <w:tcPr>
+            <w:tcW w:w="1958" w:type="dxa"/>
+          </w:tcPr>
+          <w:p>
+            <w:pPr>
+              <w:spacing w:after="0"/>
+            </w:pPr>
+            <w:r>
+              <w:rPr>
+                <w:sz w:val="16"/>
+              </w:rPr>
+              <w:t>7,189,693</w:t>
+            </w:r>
+          </w:p>
+        </w:tc>
+        <w:tc>
+          <w:tcPr>
+            <w:tcW w:w="1958" w:type="dxa"/>
+          </w:tcPr>
+          <w:p>
+            <w:pPr>
+              <w:spacing w:after="0"/>
+            </w:pPr>
+            <w:r>
+              <w:rPr>
+                <w:sz w:val="16"/>
+              </w:rPr>
+              <w:t>0.984475</w:t>
+            </w:r>
+          </w:p>
+        </w:tc>
+        <w:tc>
+          <w:tcPr>
+            <w:tcW w:w="1958" w:type="dxa"/>
+          </w:tcPr>
+          <w:p>
+            <w:pPr>
+              <w:spacing w:after="0"/>
+            </w:pPr>
+            <w:r>
+              <w:rPr>
+                <w:sz w:val="16"/>
+              </w:rPr>
+              <w:t>0.984465</w:t>
+            </w:r>
+          </w:p>
+        </w:tc>
+        <w:tc>
+          <w:tcPr>
+            <w:tcW w:w="1958" w:type="dxa"/>
+          </w:tcPr>
+          <w:p>
+            <w:pPr>
+              <w:spacing w:after="0"/>
+            </w:pPr>
+            <w:r>
+              <w:rPr>
+                <w:sz w:val="16"/>
+              </w:rPr>
+              <w:t>+0.000009</w:t>
+            </w:r>
+          </w:p>
+        </w:tc>
+      </w:tr>
+      <w:tr>
+        <w:tc>
+          <w:tcPr>
+            <w:tcW w:w="1958" w:type="dxa"/>
+          </w:tcPr>
+          <w:p>
+            <w:pPr>
+              <w:spacing w:after="0"/>
+            </w:pPr>
+            <w:r>
+              <w:rPr>
+                <w:sz w:val="16"/>
+              </w:rPr>
+              <w:t>6TiSCHSet-2026 (uncapped)</w:t>
+            </w:r>
+          </w:p>
+        </w:tc>
+        <w:tc>
+          <w:tcPr>
+            <w:tcW w:w="1958" w:type="dxa"/>
+          </w:tcPr>
+          <w:p>
+            <w:pPr>
+              <w:spacing w:after="0"/>
+            </w:pPr>
+            <w:r>
+              <w:rPr>
+                <w:sz w:val="16"/>
+              </w:rPr>
+              <w:t>364,816</w:t>
+            </w:r>
+          </w:p>
+        </w:tc>
+        <w:tc>
+          <w:tcPr>
+            <w:tcW w:w="1958" w:type="dxa"/>
+          </w:tcPr>
+          <w:p>
+            <w:pPr>
+              <w:spacing w:after="0"/>
+            </w:pPr>
+            <w:r>
+              <w:rPr>
+                <w:sz w:val="16"/>
+              </w:rPr>
+              <w:t>0.937019</w:t>
+            </w:r>
+          </w:p>
+        </w:tc>
+        <w:tc>
+          <w:tcPr>
+            <w:tcW w:w="1958" w:type="dxa"/>
+          </w:tcPr>
+          <w:p>
+            <w:pPr>
+              <w:spacing w:after="0"/>
+            </w:pPr>
+            <w:r>
+              <w:rPr>
+                <w:sz w:val="16"/>
+              </w:rPr>
+              <w:t>0.936982</w:t>
+            </w:r>
+          </w:p>
+        </w:tc>
+        <w:tc>
+          <w:tcPr>
+            <w:tcW w:w="1958" w:type="dxa"/>
+          </w:tcPr>
+          <w:p>
+            <w:pPr>
+              <w:spacing w:after="0"/>
+            </w:pPr>
+            <w:r>
+              <w:rPr>
+                <w:sz w:val="16"/>
+              </w:rPr>
+              <w:t>+0.000037</w:t>
+            </w:r>
+          </w:p>
+        </w:tc>
+      </w:tr>
+      <w:tr>
+        <w:tc>
+          <w:tcPr>
+            <w:tcW w:w="1958" w:type="dxa"/>
+          </w:tcPr>
+          <w:p>
+            <w:pPr>
+              <w:spacing w:after="0"/>
+            </w:pPr>
+            <w:r>
+              <w:rPr>
+                <w:sz w:val="16"/>
+              </w:rPr>
+              <w:t>CTU-IDSEVAL-6 (uncapped)</w:t>
+            </w:r>
+          </w:p>
+        </w:tc>
+        <w:tc>
+          <w:tcPr>
+            <w:tcW w:w="1958" w:type="dxa"/>
+          </w:tcPr>
+          <w:p>
+            <w:pPr>
+              <w:spacing w:after="0"/>
+            </w:pPr>
+            <w:r>
+              <w:rPr>
+                <w:sz w:val="16"/>
+              </w:rPr>
+              <w:t>54,983</w:t>
+            </w:r>
+          </w:p>
+        </w:tc>
+        <w:tc>
+          <w:tcPr>
+            <w:tcW w:w="1958" w:type="dxa"/>
+          </w:tcPr>
+          <w:p>
+            <w:pPr>
+              <w:spacing w:after="0"/>
+            </w:pPr>
+            <w:r>
+              <w:rPr>
+                <w:sz w:val="16"/>
+              </w:rPr>
+              <w:t>0.892952</w:t>
+            </w:r>
+          </w:p>
+        </w:tc>
+        <w:tc>
+          <w:tcPr>
+            <w:tcW w:w="1958" w:type="dxa"/>
+          </w:tcPr>
+          <w:p>
+            <w:pPr>
+              <w:spacing w:after="0"/>
+            </w:pPr>
+            <w:r>
+              <w:rPr>
+                <w:sz w:val="16"/>
+              </w:rPr>
+              <w:t>0.892952</w:t>
+            </w:r>
+          </w:p>
+        </w:tc>
+        <w:tc>
+          <w:tcPr>
+            <w:tcW w:w="1958" w:type="dxa"/>
+          </w:tcPr>
+          <w:p>
+            <w:pPr>
+              <w:spacing w:after="0"/>
+            </w:pPr>
+            <w:r>
+              <w:rPr>
+                <w:sz w:val="16"/>
+              </w:rPr>
+              <w:t>+0.000000</w:t>
+            </w:r>
+          </w:p>
+        </w:tc>
+      </w:tr>
+    </w:tbl>
+    <w:p>
+      <w:pPr>
+        <w:spacing w:after="40"/>
+      </w:pPr>
+    </w:p>
+    <w:p>
+      <w:r>
+        <w:rPr>
+          <w:b/>
+        </w:rPr>
+        <w:t>Scale is not what breaks it.</w:t>
+      </w:r>
+      <w:r>
+        <w:t xml:space="preserve"> CIC-IDS2017 turns into a stable -0.005533 deficit on the fully</w:t>
+      </w:r>
+    </w:p>
+    <w:p>
+      <w:r>
+        <w:t>uncapped 2,429,503-flow corpus (Section 5.7), but the same ladder on modern corpora returns to</w:t>
+      </w:r>
+    </w:p>
+    <w:p>
+      <w:r>
+        <w:t>noise: CIC-IoT-2023 differs by -0.000004 at 2,460,000 training rows, and this book's largest</w:t>
+      </w:r>
+    </w:p>
+    <w:p>
+      <w:r>
+        <w:t>population, the uncapped Gotham-2025 corpus, by +0.000009 at 14,250,000 training rows and</w:t>
+      </w:r>
+    </w:p>
+    <w:p>
+      <w:r>
+        <w:t>7,190,000 test rows, on all ten seeds. The Section 5.7 deficit is a property of that corpus and</w:t>
+      </w:r>
+    </w:p>
+    <w:p>
+      <w:r>
+        <w:t>population, not a general rule that larger data breaks conditional weighting.</w:t>
+      </w:r>
+    </w:p>
+    <w:p>
+      <w:r>
+        <w:rPr>
+          <w:b/>
+        </w:rPr>
+        <w:t>Distribution shift does not change the conclusion.</w:t>
+      </w:r>
+      <w:r>
+        <w:t xml:space="preserve"> Random splits put samples from one device in</w:t>
+      </w:r>
+    </w:p>
+    <w:p>
+      <w:r>
+        <w:t>both training and test; leave-one-source-out avoids that. Holding out 12 of the 78 Gotham-2025</w:t>
+      </w:r>
+    </w:p>
+    <w:p>
+      <w:r>
+        <w:t>devices leaves the gate at Macro-F1 0.967127</w:t>
+      </w:r>
+    </w:p>
+    <w:p>
+      <w:r>
+        <w:t>(min 0.764909, max 1.000000) against</w:t>
+      </w:r>
+    </w:p>
+    <w:p>
+      <w:r>
+        <w:t>0.967127 for the same-members fusion, a mean difference of</w:t>
+      </w:r>
+    </w:p>
+    <w:p>
+      <w:r>
+        <w:t>+0.000000; for 6TiSCHSet-2026, holding out 12 of 122 runs gives</w:t>
+      </w:r>
+    </w:p>
+    <w:p>
+      <w:r>
+        <w:t>0.522326 against 0.522203, a difference of</w:t>
+      </w:r>
+    </w:p>
+    <w:p>
+      <w:r>
+        <w:t>+0.000123. The holdout lowers absolute performance a lot (to 0.52 on 6TiSCHSet), but the arm gap stays</w:t>
+      </w:r>
+    </w:p>
+    <w:p>
+      <w:r>
+        <w:t>inside the noise - exactly what the identifiability argument predicts: changing devices changes the</w:t>
+      </w:r>
+    </w:p>
+    <w:p>
+      <w:r>
+        <w:t>difficulty, not the interchangeability of the members.</w:t>
+      </w:r>
+    </w:p>
+    <w:p>
+      <w:r>
+        <w:rPr>
+          <w:b/>
+        </w:rPr>
+        <w:lastRenderedPageBreak/>
+        <w:t>Dose-response: the smaller the budget, the more the gate helps.</w:t>
+      </w:r>
+      <w:r>
+        <w:t xml:space="preserve"> With the corpus and the seeds</w:t>
+      </w:r>
+    </w:p>
+    <w:p>
+      <w:r>
+        <w:t>fixed and only the feature budget varied, the differences are</w:t>
+      </w:r>
+    </w:p>
+    <w:p>
+      <w:r>
+        <w:t>+0.001663 (k=8), +0.000402</w:t>
+      </w:r>
+    </w:p>
+    <w:p>
+      <w:r>
+        <w:t>(k=16), -0.000002 (k=32) and</w:t>
+      </w:r>
+    </w:p>
+    <w:p>
+      <w:r>
+        <w:t>-0.000004 (k=60). At small budgets the chi-square and ANOVA</w:t>
+      </w:r>
+    </w:p>
+    <w:p>
+      <w:r>
+        <w:t>views genuinely differ and the gate starts to act; from k=32 the three views overlap again and the</w:t>
+      </w:r>
+    </w:p>
+    <w:p>
+      <w:r>
+        <w:t>difference returns to noise. The k=60 rung reproduces the main CIC-IoT-2023 numbers bit for bit.</w:t>
+      </w:r>
+    </w:p>
+    <w:p>
+      <w:r>
+        <w:rPr>
+          <w:b/>
+        </w:rPr>
+        <w:t>The mechanism suite.</w:t>
+      </w:r>
+      <w:r>
+        <w:t xml:space="preserve"> Three independent measurements explain why the arms are usually</w:t>
+      </w:r>
+    </w:p>
+    <w:p>
+      <w:r>
+        <w:t>indistinguishable: (1) the margin bound - on 297,180 Gotham rows the arms</w:t>
+      </w:r>
+    </w:p>
+    <w:p>
+      <w:r>
+        <w:t>relabel 0 rows, and on 375,160</w:t>
+      </w:r>
+    </w:p>
+    <w:p>
+      <w:r>
+        <w:t>CIC-IoT-2023 rows they relabel 12, of which</w:t>
+      </w:r>
+    </w:p>
+    <w:p>
+      <w:r>
+        <w:t>99.45% are provably unable to flip the argmax;</w:t>
+      </w:r>
+    </w:p>
+    <w:p>
+      <w:r>
+        <w:t>(2) the weight mechanism - the gate does reweight, but the tree weights stay in 0.0091-0.0102</w:t>
+      </w:r>
+    </w:p>
+    <w:p>
+      <w:r>
+        <w:t>against the 0.01 uniform value, too little to move the argmax; (3) the diversity dose-response -</w:t>
+      </w:r>
+    </w:p>
+    <w:p>
+      <w:r>
+        <w:t>across five expert configurations the gain co-varies with mean pairwise disagreement, with slope</w:t>
+      </w:r>
+    </w:p>
+    <w:p>
+      <w:r>
+        <w:t>+0.004830 and r = 0.744, reaching +0.0026 for the mutually</w:t>
+      </w:r>
+    </w:p>
+    <w:p>
+      <w:r>
+        <w:t>exclusive feature views. Figure 12 collects the three panels.</w:t>
       </w:r>
     </w:p>
     <w:p>
@@ -10793,7 +11617,11 @@
         <w:t>Condition B: margin dominance.</w:t>
       </w:r>
       <w:r>
-        <w:t xml:space="preserve"> Even when experts differ, the hard label remains unchanged as long as the smallest margin exceeds the probability movement that the weights can cause (Condition 2). The measured mean L1 probability change is 0.000299 with a maximum of 0.003473, while the median decision margin is 1.0, three orders of magnitude above the largest observed movement. Measurement 4 formalises this: under the a priori bound 99.91% of rows are provably immune, with a median margin-to-bound ratio of 3,469 to 5,038.</w:t>
+        <w:t xml:space="preserve"> Even when experts differ, the hard label remains unchanged as long as the smallest margin exceeds the probability movement that the weights can cause (Condition 2). The measured mean L1 </w:t>
+      </w:r>
+      <w:r>
+        <w:lastRenderedPageBreak/>
+        <w:t>probability change is 0.000299 with a maximum of 0.003473, while the median decision margin is 1.0, three orders of magnitude above the largest observed movement. Measurement 4 formalises this: under the a priori bound 99.91% of rows are provably immune, with a median margin-to-bound ratio of 3,469 to 5,038.</w:t>
       </w:r>
     </w:p>
     <w:p>
@@ -10832,11 +11660,7 @@
         <w:t>first measure the weight entropy, then the prediction-disagreement rate, then the spread across member scores, and only then look at the performance difference.</w:t>
       </w:r>
       <w:r>
-        <w:t xml:space="preserve"> If entropy is close to 1 and the disagreement count is 0, further tuning of the gate will not help, because </w:t>
-      </w:r>
-      <w:r>
-        <w:lastRenderedPageBreak/>
-        <w:t>the problem does not lie in the gate. If the member scores span more than the difference you care about, the fusion is bounded by its weakest member and no weighting scheme will recover it.</w:t>
+        <w:t xml:space="preserve"> If entropy is close to 1 and the disagreement count is 0, further tuning of the gate will not help, because the problem does not lie in the gate. If the member scores span more than the difference you care about, the fusion is bounded by its weakest member and no weighting scheme will recover it.</w:t>
       </w:r>
     </w:p>
     <w:p>
@@ -10967,6 +11791,7 @@
         <w:pStyle w:val="21"/>
       </w:pPr>
       <w:r>
+        <w:lastRenderedPageBreak/>
         <w:t>6.3 Practical decision matrix</w:t>
       </w:r>
     </w:p>
@@ -11498,14 +12323,7 @@
               <w:rPr>
                 <w:sz w:val="16"/>
               </w:rPr>
-              <w:t xml:space="preserve">Equal voting on capped populations; do not deploy on </w:t>
-            </w:r>
-            <w:r>
-              <w:rPr>
-                <w:sz w:val="16"/>
-              </w:rPr>
-              <w:lastRenderedPageBreak/>
-              <w:t>strongly imbalanced corpora</w:t>
+              <w:t>Equal voting on capped populations; do not deploy on strongly imbalanced corpora</w:t>
             </w:r>
           </w:p>
         </w:tc>
@@ -11521,15 +12339,7 @@
               <w:rPr>
                 <w:sz w:val="16"/>
               </w:rPr>
-              <w:lastRenderedPageBreak/>
-              <w:t xml:space="preserve">Equivalence at 53,237 flows against a deficit of -0.005533 on </w:t>
-            </w:r>
-            <w:r>
-              <w:rPr>
-                <w:sz w:val="16"/>
-              </w:rPr>
-              <w:lastRenderedPageBreak/>
-              <w:t>the uncapped 2,429,503-flow corpus, all ten seeds</w:t>
+              <w:t>Equivalence at 53,237 flows against a deficit of -0.005533 on the uncapped 2,429,503-flow corpus, all ten seeds</w:t>
             </w:r>
           </w:p>
         </w:tc>
@@ -11545,15 +12355,7 @@
               <w:rPr>
                 <w:sz w:val="16"/>
               </w:rPr>
-              <w:lastRenderedPageBreak/>
-              <w:t xml:space="preserve">Forgoes a mechanism whose training cost is 175 times that of </w:t>
-            </w:r>
-            <w:r>
-              <w:rPr>
-                <w:sz w:val="16"/>
-              </w:rPr>
-              <w:lastRenderedPageBreak/>
-              <w:t>one forest</w:t>
+              <w:t>Forgoes a mechanism whose training cost is 175 times that of one forest</w:t>
             </w:r>
           </w:p>
         </w:tc>
@@ -11697,6 +12499,7 @@
         <w:rPr>
           <w:b/>
         </w:rPr>
+        <w:lastRenderedPageBreak/>
         <w:t>Secondary costs reported separately</w:t>
       </w:r>
       <w:r>
@@ -11782,7 +12585,6 @@
         <w:rPr>
           <w:b/>
         </w:rPr>
-        <w:lastRenderedPageBreak/>
         <w:t>The research populations are not production traffic.</w:t>
       </w:r>
       <w:r>
@@ -11841,6 +12643,7 @@
         <w:rPr>
           <w:b/>
         </w:rPr>
+        <w:lastRenderedPageBreak/>
         <w:t>Near-duplicates are removed only in their exact form.</w:t>
       </w:r>
       <w:r>
@@ -11864,11 +12667,7 @@
         <w:t>F1), so it probes the mechanics of the aggregation step rather than discrimination difficulty, and the external datasets remain independent native-label benchmarks rather than transfer tests. None of the seventeen represents production traffic. Pooling the twelve published in 2020 or later gives 120 seed-level comparisons whose 90% interval, [-0.000006, +0.000020] on a mean of +0.000007, lies inside the 0.005 margin - so the equivalence claim does not rest on the 2017 corpus alone. A day-level split of CIC-</w:t>
       </w:r>
       <w:r>
-        <w:t xml:space="preserve">IDS2017 is constructible, but every capture day carries only a subset of the five classes (Monday Normal only; Tuesday Normal and Brute Force; Wednesday Normal and DoS/DDoS; Thursday adds Web </w:t>
-      </w:r>
-      <w:r>
-        <w:lastRenderedPageBreak/>
-        <w:t>Attack; Friday adds Bot), so it is not category-complete: the measured day-holdout Macro-F1 collapses to 0.13-0.32 across the five days, which is what that limitation now quantifies.</w:t>
+        <w:t>IDS2017 is constructible, but every capture day carries only a subset of the five classes (Monday Normal only; Tuesday Normal and Brute Force; Wednesday Normal and DoS/DDoS; Thursday adds Web Attack; Friday adds Bot), so it is not category-complete: the measured day-holdout Macro-F1 collapses to 0.13-0.32 across the five days, which is what that limitation now quantifies.</w:t>
       </w:r>
     </w:p>
     <w:p>
@@ -11936,7 +12735,11 @@
         <w:t>First, relative to the most direct equal-weight control the gain lies inside an equivalence boundary.</w:t>
       </w:r>
       <w:r>
-        <w:t xml:space="preserve"> Averaged over ten seeds on the natural-prior population of CIC-IDS2017, the Macro-F1 difference between conditional weighting and an equal-weight chi-square forest is -0.000456, with the per-seed sign split five to five. Against the equal-weight fusion of those same four experts the gated model changes one label in 79,860 test predictions (-0.000010), which locates the single-view gap in the composition of the ensemble rather than in the gate. Both the seed-level 90% interval [-0.00112, +0.00021] and the t</w:t>
+        <w:t xml:space="preserve"> Averaged over ten seeds on the natural-prior population of CIC-IDS2017, the Macro-F1 difference between conditional weighting and an equal-weight chi-square forest is -0.000456, with the per-seed sign split five to five. Against the equal-weight fusion of those same four experts the gated model changes one label in 79,860 test predictions (-</w:t>
+      </w:r>
+      <w:r>
+        <w:lastRenderedPageBreak/>
+        <w:t>0.000010), which locates the single-view gap in the composition of the ensemble rather than in the gate. Both the seed-level 90% interval [-0.00112, +0.00021] and the t</w:t>
       </w:r>
       <w:r>
         <w:t>est-row paired bootstrap interval [-0.00425, +0.00338] lie inside equivalence margins of 0.005 and 0.01. The four experts disagree on 0.15%-0.66% of test rows, yet the gate matches equal voting on all but one of 79,860 predictions; weight entropy is 0.99998. The cost is about an 80-fold increase in training time and a fivefold increase in batch inference time (ten-seed means, Table 4(a)).</w:t>
@@ -11967,11 +12770,7 @@
         <w:t xml:space="preserve"> Three identifiability conditions are derived and one of them is turned into a row-wise computable bound, under which 99.91% of 23,958 test rows are provably invariant to the weighting, with a decision margin 3,469 to 5,038 times the perturbation bound. A search over all 108 gate hyper-parameter configurations yields only six distinct validation scores, excluding insufficient tuning. A deliberately constructed reverse experiment shows that the gain moves with expert diversity: two low-diversity expert sets </w:t>
       </w:r>
       <w:r>
-        <w:t xml:space="preserve">gain exactly zero in all six runs, whereas three decorrelated sets gain positively in all nine runs (slope 0.0646, Pearson r </w:t>
-      </w:r>
-      <w:r>
-        <w:lastRenderedPageBreak/>
-        <w:t>= 0.749). The inertness of conditional weighting is therefore not an implementation or tuning artefact but a direct consequence of filter-based multi-view experts being too similar on this kind of data.</w:t>
+        <w:t>gain exactly zero in all six runs, whereas three decorrelated sets gain positively in all nine runs (slope 0.0646, Pearson r = 0.749). The inertness of conditional weighting is therefore not an implementation or tuning artefact but a direct consequence of filter-based multi-view experts being too similar on this kind of data.</w:t>
       </w:r>
     </w:p>
     <w:p>
@@ -12020,6 +12819,7 @@
         <w:pStyle w:val="1"/>
       </w:pPr>
       <w:r>
+        <w:lastRenderedPageBreak/>
         <w:t>Funding</w:t>
       </w:r>
     </w:p>
@@ -12072,7 +12872,6 @@
         <w:pStyle w:val="1"/>
       </w:pPr>
       <w:r>
-        <w:lastRenderedPageBreak/>
         <w:t>References</w:t>
       </w:r>
     </w:p>
@@ -12222,6 +13021,7 @@
         </w:numPr>
       </w:pPr>
       <w:r>
+        <w:lastRenderedPageBreak/>
         <w:t>Liu H, Setiono R. Chi2: Feature selection and discretization of numeric attributes. ICTAI 1995: 388-391. DOI:10.1109/TAI.1995.479783.</w:t>
       </w:r>
     </w:p>
@@ -12330,7 +13130,6 @@
         </w:numPr>
       </w:pPr>
       <w:r>
-        <w:lastRenderedPageBreak/>
         <w:t>Liu L, Engelen G, Timmerman J, et al. Error prevalence in NIDS datasets: A case study on CIC-IDS-2017 and CSE-CIC-IDS-2018. IEEE CNS 2022. DOI:10.1109/CNS56114.2022.9947235.</w:t>
       </w:r>
     </w:p>
@@ -12463,6 +13262,7 @@
         </w:numPr>
       </w:pPr>
       <w:r>
+        <w:lastRenderedPageBreak/>
         <w:t>Angelopoulos A N, Bates S. Conformal prediction: A gentle introduction. Foundations and Trends in Machine Learning, 2023, 16(4): 494-591. DOI:10.1561/2200000101.</w:t>
       </w:r>
     </w:p>
@@ -12583,7 +13383,6 @@
         </w:numPr>
       </w:pPr>
       <w:r>
-        <w:lastRenderedPageBreak/>
         <w:t>Han S, Kim Y, Lee S. Improvement of the classification performance of an intrusion detection model for rare and unknown attack traffic. Electronics, 2021, 10(18): 2268. DOI:10.3390/electronics10182268.</w:t>
       </w:r>
     </w:p>
@@ -12994,6 +13793,7 @@
               <w:rPr>
                 <w:sz w:val="16"/>
               </w:rPr>
+              <w:lastRenderedPageBreak/>
               <w:t>S09</w:t>
             </w:r>
           </w:p>
@@ -13640,7 +14440,6 @@
               <w:rPr>
                 <w:sz w:val="16"/>
               </w:rPr>
-              <w:lastRenderedPageBreak/>
               <w:t>S28</w:t>
             </w:r>
           </w:p>
@@ -14004,76 +14803,76 @@
       </w:rPr>
     </w:lvl>
   </w:abstractNum>
-  <w:num w:numId="1" w16cid:durableId="860362405">
+  <w:num w:numId="1" w16cid:durableId="1809861690">
     <w:abstractNumId w:val="8"/>
   </w:num>
-  <w:num w:numId="2" w16cid:durableId="696392713">
+  <w:num w:numId="2" w16cid:durableId="1834105391">
     <w:abstractNumId w:val="6"/>
   </w:num>
-  <w:num w:numId="3" w16cid:durableId="1855917676">
+  <w:num w:numId="3" w16cid:durableId="1988317694">
     <w:abstractNumId w:val="5"/>
   </w:num>
-  <w:num w:numId="4" w16cid:durableId="1844391922">
+  <w:num w:numId="4" w16cid:durableId="1419710887">
     <w:abstractNumId w:val="4"/>
   </w:num>
-  <w:num w:numId="5" w16cid:durableId="620113291">
+  <w:num w:numId="5" w16cid:durableId="2065106643">
     <w:abstractNumId w:val="7"/>
   </w:num>
-  <w:num w:numId="6" w16cid:durableId="1923878639">
+  <w:num w:numId="6" w16cid:durableId="1568878398">
     <w:abstractNumId w:val="3"/>
   </w:num>
-  <w:num w:numId="7" w16cid:durableId="1864434037">
+  <w:num w:numId="7" w16cid:durableId="1299073576">
     <w:abstractNumId w:val="2"/>
   </w:num>
-  <w:num w:numId="8" w16cid:durableId="204341818">
+  <w:num w:numId="8" w16cid:durableId="1612129867">
     <w:abstractNumId w:val="1"/>
   </w:num>
-  <w:num w:numId="9" w16cid:durableId="1553809362">
+  <w:num w:numId="9" w16cid:durableId="170144203">
     <w:abstractNumId w:val="0"/>
   </w:num>
-  <w:num w:numId="10" w16cid:durableId="1977756830">
+  <w:num w:numId="10" w16cid:durableId="526717899">
     <w:abstractNumId w:val="7"/>
     <w:lvlOverride w:ilvl="0">
       <w:startOverride w:val="1"/>
     </w:lvlOverride>
   </w:num>
-  <w:num w:numId="11" w16cid:durableId="2125999266">
+  <w:num w:numId="11" w16cid:durableId="405497901">
     <w:abstractNumId w:val="7"/>
     <w:lvlOverride w:ilvl="0">
       <w:startOverride w:val="1"/>
     </w:lvlOverride>
   </w:num>
-  <w:num w:numId="12" w16cid:durableId="2065911397">
+  <w:num w:numId="12" w16cid:durableId="682393506">
     <w:abstractNumId w:val="7"/>
     <w:lvlOverride w:ilvl="0">
       <w:startOverride w:val="1"/>
     </w:lvlOverride>
   </w:num>
-  <w:num w:numId="13" w16cid:durableId="102842492">
+  <w:num w:numId="13" w16cid:durableId="790168952">
     <w:abstractNumId w:val="7"/>
     <w:lvlOverride w:ilvl="0">
       <w:startOverride w:val="1"/>
     </w:lvlOverride>
   </w:num>
-  <w:num w:numId="14" w16cid:durableId="1361591820">
+  <w:num w:numId="14" w16cid:durableId="1600944659">
     <w:abstractNumId w:val="7"/>
     <w:lvlOverride w:ilvl="0">
       <w:startOverride w:val="1"/>
     </w:lvlOverride>
   </w:num>
-  <w:num w:numId="15" w16cid:durableId="2042894807">
+  <w:num w:numId="15" w16cid:durableId="2016031867">
     <w:abstractNumId w:val="7"/>
     <w:lvlOverride w:ilvl="0">
       <w:startOverride w:val="1"/>
     </w:lvlOverride>
   </w:num>
-  <w:num w:numId="16" w16cid:durableId="58065382">
+  <w:num w:numId="16" w16cid:durableId="1484396591">
     <w:abstractNumId w:val="7"/>
     <w:lvlOverride w:ilvl="0">
       <w:startOverride w:val="1"/>
     </w:lvlOverride>
   </w:num>
-  <w:num w:numId="17" w16cid:durableId="816068876">
+  <w:num w:numId="17" w16cid:durableId="639264470">
     <w:abstractNumId w:val="7"/>
     <w:lvlOverride w:ilvl="0">
       <w:startOverride w:val="1"/>

</xml_diff>

<commit_message>
Round 20bn: prose polish over the Round 20 additions (ladder section, 5.8/6.5 phrasing, abstract wording, extension-report conclusions) with a numeric-token guard; 53-check gate green
</commit_message>
<xml_diff>
--- a/重构版论文_v4_20260915/English_SCI_Manuscript_v4.docx
+++ b/重构版论文_v4_20260915/English_SCI_Manuscript_v4.docx
@@ -1039,7 +1039,7 @@
           <w:noProof/>
         </w:rPr>
         <w:drawing>
-          <wp:inline distT="0" distB="0" distL="0" distR="0" wp14:anchorId="64752CB2" wp14:editId="7E409C33">
+          <wp:inline distT="0" distB="0" distL="0" distR="0" wp14:anchorId="6665456E" wp14:editId="56258A9D">
             <wp:extent cx="5760720" cy="2734826"/>
             <wp:effectExtent l="0" t="0" r="0" b="0"/>
             <wp:docPr id="1" name="Picture 1"/>
@@ -2426,7 +2426,7 @@
           <w:noProof/>
         </w:rPr>
         <w:drawing>
-          <wp:inline distT="0" distB="0" distL="0" distR="0" wp14:anchorId="0FB5542E" wp14:editId="3A6B21BB">
+          <wp:inline distT="0" distB="0" distL="0" distR="0" wp14:anchorId="79439A53" wp14:editId="31845492">
             <wp:extent cx="5760720" cy="2722098"/>
             <wp:effectExtent l="0" t="0" r="0" b="0"/>
             <wp:docPr id="2" name="Picture 2"/>
@@ -3419,7 +3419,7 @@
           <w:noProof/>
         </w:rPr>
         <w:drawing>
-          <wp:inline distT="0" distB="0" distL="0" distR="0" wp14:anchorId="3AF9E58A" wp14:editId="1FE7BA79">
+          <wp:inline distT="0" distB="0" distL="0" distR="0" wp14:anchorId="3CAD269A" wp14:editId="59AEB94F">
             <wp:extent cx="5760720" cy="3482709"/>
             <wp:effectExtent l="0" t="0" r="0" b="0"/>
             <wp:docPr id="3" name="Picture 3"/>
@@ -4772,7 +4772,11 @@
     </w:p>
     <w:p>
       <w:r>
-        <w:t>Together the conditions yield a falsifiable prediction: on data where experts are highly correlated and the risk models are nearly constant, the hard-label gain of conditional weighting should be zero or near zero, the weight entropy should approach 1, and the expert disagreement rate should approach 0. Section 5.3 tests this prediction directly.</w:t>
+        <w:t xml:space="preserve">Together the conditions yield a falsifiable prediction: on data where experts are highly correlated and the risk models are nearly constant, the hard-label gain of conditional weighting should be zero or near zero, the weight </w:t>
+      </w:r>
+      <w:r>
+        <w:lastRenderedPageBreak/>
+        <w:t>entropy should approach 1, and the expert disagreement rate should approach 0. Section 5.3 tests this prediction directly.</w:t>
       </w:r>
     </w:p>
     <w:p>
@@ -4785,7 +4789,6 @@
         <w:pStyle w:val="21"/>
       </w:pPr>
       <w:r>
-        <w:lastRenderedPageBreak/>
         <w:t>4.4 Complexity</w:t>
       </w:r>
     </w:p>
@@ -4941,15 +4944,15 @@
     </w:p>
     <w:p>
       <w:r>
-        <w:t>The feature-quality audit of the balanced control corpus P_bal (2,355 training rows) shows that 12 of the 78 CIC-IDS2017 features are constant (a single value across all rows) and 18 are near-zero-variance; the primary natural-prior split shows 10 constant and 20 near-zero-variance features, so the degeneracy belongs to the feature representation rather than to one population. The constant columns include Bwd PSH Flags, Fwd URG Flags, Bwd URG Flags, RST Flag Count, CWE Flag Count, ECE Flag Count and six bul</w:t>
-      </w:r>
-      <w:r>
-        <w:t>k-rate fields. H1's premise of redundancy is therefore correct in itself.</w:t>
-      </w:r>
-    </w:p>
-    <w:p>
+        <w:t xml:space="preserve">The feature-quality audit of the balanced control corpus P_bal (2,355 training rows) shows that 12 of the 78 CIC-IDS2017 features are constant (a single value across all rows) and 18 are near-zero-variance; the primary natural-prior split shows 10 constant and 20 near-zero-variance features, so the degeneracy belongs to the feature </w:t>
+      </w:r>
       <w:r>
         <w:lastRenderedPageBreak/>
+        <w:t>representation rather than to one population. The constant columns include Bwd PSH Flags, Fwd URG Flags, Bwd URG Flags, RST Flag Count, CWE Flag Count, ECE Flag Count and six bulk-rate fields. H1's premise of redundancy is therefore correct in itself.</w:t>
+      </w:r>
+    </w:p>
+    <w:p>
+      <w:r>
         <w:t>The chi-square budget k was fixed at 60 on the validation partition from a pre-specified candidate set: validation Macro-F1 was 0.9175 at k = 10, 0.9314 at k = 20, 0.9379 at both k = 30 and k = 40, and 0.9413 at k = 60, flattening between k = 30 and k = 40. This search was carried out on the balanced control protocol; the selected k was then frozen for every final run.</w:t>
       </w:r>
     </w:p>
@@ -6292,7 +6295,15 @@
                 <w:b/>
                 <w:sz w:val="16"/>
               </w:rPr>
-              <w:t>Balanced accuracy</w:t>
+              <w:t xml:space="preserve">Balanced </w:t>
+            </w:r>
+            <w:r>
+              <w:rPr>
+                <w:b/>
+                <w:sz w:val="16"/>
+              </w:rPr>
+              <w:lastRenderedPageBreak/>
+              <w:t>accuracy</w:t>
             </w:r>
           </w:p>
         </w:tc>
@@ -6309,6 +6320,7 @@
                 <w:b/>
                 <w:sz w:val="16"/>
               </w:rPr>
+              <w:lastRenderedPageBreak/>
               <w:t>Macro-F1</w:t>
             </w:r>
           </w:p>
@@ -6706,7 +6718,6 @@
               <w:rPr>
                 <w:sz w:val="16"/>
               </w:rPr>
-              <w:lastRenderedPageBreak/>
               <w:t>Equal RF (full features)</w:t>
             </w:r>
           </w:p>
@@ -7205,7 +7216,7 @@
           <w:noProof/>
         </w:rPr>
         <w:drawing>
-          <wp:inline distT="0" distB="0" distL="0" distR="0" wp14:anchorId="17E9778C" wp14:editId="729BE330">
+          <wp:inline distT="0" distB="0" distL="0" distR="0" wp14:anchorId="1F0803F6" wp14:editId="118CBC4D">
             <wp:extent cx="5760720" cy="2356272"/>
             <wp:effectExtent l="0" t="0" r="0" b="0"/>
             <wp:docPr id="4" name="Picture 4"/>
@@ -7267,11 +7278,11 @@
         <w:t>Second, the paired statistics establish equivalence at a strict margin.</w:t>
       </w:r>
       <w:r>
-        <w:t xml:space="preserve"> With ten seeds the mean paired difference is -0.000456 with a standard deviation of 0.001152. Two interval estimates are reported because they answer different questions: the seed-level 90% interval [-0.001124, +0.000212] reflects model-to-model variability, while the test-row paired bootstrap interval [-0.004251, +0.003382] reflects resampling uncertainty over the locked test set. Both lie inside equivalence margins of 0.005 and 0.01 Macro-F1, so equivalence can be asserted at alpha = 0.05 </w:t>
+        <w:t xml:space="preserve"> With ten seeds the mean paired difference is -0.000456 with a standard deviation of 0.001152. Two interval estimates are reported because they answer </w:t>
       </w:r>
       <w:r>
         <w:lastRenderedPageBreak/>
-        <w:t xml:space="preserve">against either </w:t>
+        <w:t xml:space="preserve">different questions: the seed-level 90% interval [-0.001124, +0.000212] reflects model-to-model variability, while the test-row paired bootstrap interval [-0.004251, +0.003382] reflects resampling uncertainty over the locked test set. Both lie inside equivalence margins of 0.005 and 0.01 Macro-F1, so equivalence can be asserted at alpha = 0.05 against either </w:t>
       </w:r>
       <w:r>
         <w:t xml:space="preserve">margin. This strengthens the three-seed analysis, for which the 0.005 margin was not attainable. The sign of the difference is split five to five across seeds, and exact McNemar tests on the test rows are non-significant. Under the pre-declared decision rule - stable, consistent in sign, and bounded away from zero - </w:t>
@@ -8110,14 +8121,11 @@
         <w:rPr>
           <w:b/>
         </w:rPr>
+        <w:lastRenderedPageBreak/>
         <w:t>Fifth, a neural baseline shows how badly accuracy can mislead.</w:t>
       </w:r>
       <w:r>
-        <w:t xml:space="preserve"> A multilayer perceptron given the same feature budget and a full training budget (128 hidden units, hyper-parameters selected on the validation partition) reaches 0.97679 accuracy against RCCF's 0.97792, but only 0.797654 Macro-F1 against 0.889955, i.e. 0.092 lower. Its balanced accuracy is 0.79666 against 0.94920 and its Brier score is 0.036701 against 0.006312. Every comparison </w:t>
-      </w:r>
-      <w:r>
-        <w:lastRenderedPageBreak/>
-        <w:t>in this paragraph is computed on the three seeds common to both runs (42, 2024, 3407), the seeds on which the neural baseline wa</w:t>
+        <w:t xml:space="preserve"> A multilayer perceptron given the same feature budget and a full training budget (128 hidden units, hyper-parameters selected on the validation partition) reaches 0.97679 accuracy against RCCF's 0.97792, but only 0.797654 Macro-F1 against 0.889955, i.e. 0.092 lower. Its balanced accuracy is 0.79666 against 0.94920 and its Brier score is 0.036701 against 0.006312. Every comparison in this paragraph is computed on the three seeds common to both runs (42, 2024, 3407), the seeds on which the neural baseline wa</w:t>
       </w:r>
       <w:r>
         <w:t xml:space="preserve">s trained; Table 4(a) gives the corresponding ten-seed RCCF values. Notably, a paired McNemar test on overall correctness is not significant (pooled p = 0.383 over 23,958 rows; per-seed 1.000 / 0.768 / 0.261), because the two models make a similar </w:t>
@@ -8168,7 +8176,7 @@
           <w:noProof/>
         </w:rPr>
         <w:drawing>
-          <wp:inline distT="0" distB="0" distL="0" distR="0" wp14:anchorId="6167A484" wp14:editId="601F545C">
+          <wp:inline distT="0" distB="0" distL="0" distR="0" wp14:anchorId="5F2097D5" wp14:editId="006DB99F">
             <wp:extent cx="5760720" cy="2045294"/>
             <wp:effectExtent l="0" t="0" r="0" b="0"/>
             <wp:docPr id="5" name="Picture 5"/>
@@ -8282,6 +8290,7 @@
         <w:rPr>
           <w:b/>
         </w:rPr>
+        <w:lastRenderedPageBreak/>
         <w:t>Measurement 4: the margin bound proves invariance.</w:t>
       </w:r>
       <w:r>
@@ -8330,11 +8339,7 @@
         <w:t>3,469 to 5,038</w:t>
       </w:r>
       <w:r>
-        <w:t xml:space="preserve"> across </w:t>
-      </w:r>
-      <w:r>
-        <w:lastRenderedPageBreak/>
-        <w:t>seeds. In other words, fused probabilities are close to one-hot and the weight-induced probability movement is three orders of magnitude smaller than the decision margin.</w:t>
+        <w:t xml:space="preserve"> across seeds. In other words, fused probabilities are close to one-hot and the weight-induced probability movement is three orders of magnitude smaller than the decision margin.</w:t>
       </w:r>
     </w:p>
     <w:p>
@@ -8346,7 +8351,7 @@
           <w:noProof/>
         </w:rPr>
         <w:drawing>
-          <wp:inline distT="0" distB="0" distL="0" distR="0" wp14:anchorId="2CF449A8" wp14:editId="32BA6BA7">
+          <wp:inline distT="0" distB="0" distL="0" distR="0" wp14:anchorId="0C76CA2D" wp14:editId="4436E9C7">
             <wp:extent cx="5760720" cy="2308234"/>
             <wp:effectExtent l="0" t="0" r="0" b="0"/>
             <wp:docPr id="6" name="Picture 6"/>
@@ -9078,7 +9083,7 @@
           <w:noProof/>
         </w:rPr>
         <w:drawing>
-          <wp:inline distT="0" distB="0" distL="0" distR="0" wp14:anchorId="34C0B34B" wp14:editId="5FAB24FA">
+          <wp:inline distT="0" distB="0" distL="0" distR="0" wp14:anchorId="09B35CF0" wp14:editId="410112B1">
             <wp:extent cx="5760720" cy="2167923"/>
             <wp:effectExtent l="0" t="0" r="0" b="0"/>
             <wp:docPr id="7" name="Picture 7"/>
@@ -9257,7 +9262,7 @@
           <w:noProof/>
         </w:rPr>
         <w:drawing>
-          <wp:inline distT="0" distB="0" distL="0" distR="0" wp14:anchorId="43B677C4" wp14:editId="4A1D7817">
+          <wp:inline distT="0" distB="0" distL="0" distR="0" wp14:anchorId="6136F048" wp14:editId="13ACEE26">
             <wp:extent cx="5760720" cy="2258878"/>
             <wp:effectExtent l="0" t="0" r="0" b="0"/>
             <wp:docPr id="8" name="Picture 8"/>
@@ -9441,7 +9446,7 @@
           <w:noProof/>
         </w:rPr>
         <w:drawing>
-          <wp:inline distT="0" distB="0" distL="0" distR="0" wp14:anchorId="6794D4AF" wp14:editId="53B01E9B">
+          <wp:inline distT="0" distB="0" distL="0" distR="0" wp14:anchorId="6C38E22C" wp14:editId="5D499EEE">
             <wp:extent cx="5760720" cy="2516852"/>
             <wp:effectExtent l="0" t="0" r="0" b="0"/>
             <wp:docPr id="9" name="Picture 9"/>
@@ -9578,7 +9583,7 @@
           <w:noProof/>
         </w:rPr>
         <w:drawing>
-          <wp:inline distT="0" distB="0" distL="0" distR="0" wp14:anchorId="269302C4" wp14:editId="70DDE69A">
+          <wp:inline distT="0" distB="0" distL="0" distR="0" wp14:anchorId="6C62EE7E" wp14:editId="2A645667">
             <wp:extent cx="5760720" cy="2223311"/>
             <wp:effectExtent l="0" t="0" r="0" b="0"/>
             <wp:docPr id="10" name="Picture 10"/>
@@ -9665,7 +9670,7 @@
         </w:rPr>
         <w:lastRenderedPageBreak/>
         <w:drawing>
-          <wp:inline distT="0" distB="0" distL="0" distR="0" wp14:anchorId="0BE49424" wp14:editId="5B13D5A9">
+          <wp:inline distT="0" distB="0" distL="0" distR="0" wp14:anchorId="6653865B" wp14:editId="2D564234">
             <wp:extent cx="5760720" cy="2538527"/>
             <wp:effectExtent l="0" t="0" r="0" b="0"/>
             <wp:docPr id="11" name="Picture 11"/>
@@ -10604,7 +10609,7 @@
         <w:t xml:space="preserve"> Gotham-2025 (Zenodo 14502760, CC BY 4.0) captures 78 IoT devices on a smart-city testbed; its processed tables hold 35,134,281 packets and 18 classes. Under the study's protocol the table has only sixteen usable columns once the device addresses and timestamps are dropped (they would hand the classifier the attacker's identity), so the 60-feature budget selects every column and the three views coincide: the gate is exactly equal to the same-members fusion on all 29,718 test rows, all ten seeds. Repeating t</w:t>
       </w:r>
       <w:r>
-        <w:t>he same comparison at eight of the sixteen features, where chi-square and ANOVA genuinely disagree, reverses that: the gate gains +0.0063 Macro-F1 with all ten seeds positive and 38-50 of the 29,718 labels changed. The gate is inert when its members are interchangeable and helpful when they are not - the boundary the identifiability conditions predict, now observed on a 2025 corpus.</w:t>
+        <w:t>he same comparison at eight of the sixteen features, where chi-square and ANOVA genuinely disagree, reverses that: the gate gains +0.0063 Macro-F1 with all ten seeds positive and 38-50 of the 29,718 labels changed. The gate is inert when its members are interchangeable and helpful when they are not - the boundary the identifiability conditions predict, now confirmed on a 2025 corpus.</w:t>
       </w:r>
     </w:p>
     <w:p>
@@ -10634,7 +10639,7 @@
           <w:noProof/>
         </w:rPr>
         <w:drawing>
-          <wp:inline distT="0" distB="0" distL="0" distR="0" wp14:anchorId="22F89128" wp14:editId="34E5806D">
+          <wp:inline distT="0" distB="0" distL="0" distR="0" wp14:anchorId="61368301" wp14:editId="034CAD76">
             <wp:extent cx="5760720" cy="1441223"/>
             <wp:effectExtent l="0" t="0" r="0" b="0"/>
             <wp:docPr id="12" name="Picture 12"/>
@@ -10760,7 +10765,7 @@
     </w:p>
     <w:p>
       <w:r>
-        <w:t>splits. This section does three things at once: it moves the 2017 scale ladder onto modern corpora,</w:t>
+        <w:t>splits. This section does three things: it moves the 2017 scale ladder onto modern corpora,</w:t>
       </w:r>
     </w:p>
     <w:p>
@@ -10770,7 +10775,7 @@
     </w:p>
     <w:p>
       <w:r>
-        <w:t>it explains the outcome with the mechanism suite. Same protocol, same ten seeds throughout.</w:t>
+        <w:t>and it explains the outcome with the mechanism suite. All three use the same protocol and the same ten seeds.</w:t>
       </w:r>
     </w:p>
     <w:tbl>
@@ -11397,12 +11402,12 @@
     </w:p>
     <w:p>
       <w:r>
-        <w:t>noise: CIC-IoT-2023 differs by -0.000004 at 2,460,000 training rows, and this book's largest</w:t>
-      </w:r>
-    </w:p>
-    <w:p>
-      <w:r>
-        <w:t>population, the uncapped Gotham-2025 corpus, by +0.000009 at 14,250,000 training rows and</w:t>
+        <w:t>noise: CIC-IoT-2023 differs by -0.000004 at 2,460,000 training rows, and the largest population in this study:</w:t>
+      </w:r>
+    </w:p>
+    <w:p>
+      <w:r>
+        <w:t>the uncapped Gotham-2025 corpus differs by +0.000009 at 14,250,000 training rows and</w:t>
       </w:r>
     </w:p>
     <w:p>
@@ -11458,7 +11463,7 @@
     </w:p>
     <w:p>
       <w:r>
-        <w:t>+0.000123. The holdout lowers absolute performance a lot (to 0.52 on 6TiSCHSet), but the arm gap stays</w:t>
+        <w:t>+0.000123. The holdout lowers absolute performance a lot (to 0.52 for 6TiSCHSet-2026), but the arm gap stays</w:t>
       </w:r>
     </w:p>
     <w:p>
@@ -11526,7 +11531,7 @@
     </w:p>
     <w:p>
       <w:r>
-        <w:t>indistinguishable: (1) the margin bound - on 297,180 Gotham rows the arms</w:t>
+        <w:t>indistinguishable: (1) the margin bound: on 297,180 Gotham rows the arms</w:t>
       </w:r>
     </w:p>
     <w:p>
@@ -11546,12 +11551,12 @@
     </w:p>
     <w:p>
       <w:r>
-        <w:t>(2) the weight mechanism - the gate does reweight, but the tree weights stay in 0.0091-0.0102</w:t>
-      </w:r>
-    </w:p>
-    <w:p>
-      <w:r>
-        <w:t>against the 0.01 uniform value, too little to move the argmax; (3) the diversity dose-response -</w:t>
+        <w:t>(2) the weight mechanism: the gate does reweight, but the tree weights stay in 0.0091-0.0102</w:t>
+      </w:r>
+    </w:p>
+    <w:p>
+      <w:r>
+        <w:t>against the 0.01 uniform value, too little to move the argmax; (3) the diversity dose-response:</w:t>
       </w:r>
     </w:p>
     <w:p>
@@ -14803,76 +14808,76 @@
       </w:rPr>
     </w:lvl>
   </w:abstractNum>
-  <w:num w:numId="1" w16cid:durableId="1809861690">
+  <w:num w:numId="1" w16cid:durableId="119300706">
     <w:abstractNumId w:val="8"/>
   </w:num>
-  <w:num w:numId="2" w16cid:durableId="1834105391">
+  <w:num w:numId="2" w16cid:durableId="919560080">
     <w:abstractNumId w:val="6"/>
   </w:num>
-  <w:num w:numId="3" w16cid:durableId="1988317694">
+  <w:num w:numId="3" w16cid:durableId="1589576730">
     <w:abstractNumId w:val="5"/>
   </w:num>
-  <w:num w:numId="4" w16cid:durableId="1419710887">
+  <w:num w:numId="4" w16cid:durableId="1471435180">
     <w:abstractNumId w:val="4"/>
   </w:num>
-  <w:num w:numId="5" w16cid:durableId="2065106643">
+  <w:num w:numId="5" w16cid:durableId="769424954">
     <w:abstractNumId w:val="7"/>
   </w:num>
-  <w:num w:numId="6" w16cid:durableId="1568878398">
+  <w:num w:numId="6" w16cid:durableId="1636106972">
     <w:abstractNumId w:val="3"/>
   </w:num>
-  <w:num w:numId="7" w16cid:durableId="1299073576">
+  <w:num w:numId="7" w16cid:durableId="1567373420">
     <w:abstractNumId w:val="2"/>
   </w:num>
-  <w:num w:numId="8" w16cid:durableId="1612129867">
+  <w:num w:numId="8" w16cid:durableId="792291157">
     <w:abstractNumId w:val="1"/>
   </w:num>
-  <w:num w:numId="9" w16cid:durableId="170144203">
+  <w:num w:numId="9" w16cid:durableId="219439193">
     <w:abstractNumId w:val="0"/>
   </w:num>
-  <w:num w:numId="10" w16cid:durableId="526717899">
+  <w:num w:numId="10" w16cid:durableId="2084644329">
     <w:abstractNumId w:val="7"/>
     <w:lvlOverride w:ilvl="0">
       <w:startOverride w:val="1"/>
     </w:lvlOverride>
   </w:num>
-  <w:num w:numId="11" w16cid:durableId="405497901">
+  <w:num w:numId="11" w16cid:durableId="1232696999">
     <w:abstractNumId w:val="7"/>
     <w:lvlOverride w:ilvl="0">
       <w:startOverride w:val="1"/>
     </w:lvlOverride>
   </w:num>
-  <w:num w:numId="12" w16cid:durableId="682393506">
+  <w:num w:numId="12" w16cid:durableId="1230267219">
     <w:abstractNumId w:val="7"/>
     <w:lvlOverride w:ilvl="0">
       <w:startOverride w:val="1"/>
     </w:lvlOverride>
   </w:num>
-  <w:num w:numId="13" w16cid:durableId="790168952">
+  <w:num w:numId="13" w16cid:durableId="848563429">
     <w:abstractNumId w:val="7"/>
     <w:lvlOverride w:ilvl="0">
       <w:startOverride w:val="1"/>
     </w:lvlOverride>
   </w:num>
-  <w:num w:numId="14" w16cid:durableId="1600944659">
+  <w:num w:numId="14" w16cid:durableId="560874501">
     <w:abstractNumId w:val="7"/>
     <w:lvlOverride w:ilvl="0">
       <w:startOverride w:val="1"/>
     </w:lvlOverride>
   </w:num>
-  <w:num w:numId="15" w16cid:durableId="2016031867">
+  <w:num w:numId="15" w16cid:durableId="130443981">
     <w:abstractNumId w:val="7"/>
     <w:lvlOverride w:ilvl="0">
       <w:startOverride w:val="1"/>
     </w:lvlOverride>
   </w:num>
-  <w:num w:numId="16" w16cid:durableId="1484396591">
+  <w:num w:numId="16" w16cid:durableId="1285651448">
     <w:abstractNumId w:val="7"/>
     <w:lvlOverride w:ilvl="0">
       <w:startOverride w:val="1"/>
     </w:lvlOverride>
   </w:num>
-  <w:num w:numId="17" w16cid:durableId="639264470">
+  <w:num w:numId="17" w16cid:durableId="568462639">
     <w:abstractNumId w:val="7"/>
     <w:lvlOverride w:ilvl="0">
       <w:startOverride w:val="1"/>

</xml_diff>

<commit_message>
Round 20bo: literature scan - recent top-venue NIDS work (2024-2026) vs the manuscript, with a prioritised optimisation list; findings in 近年顶刊文献扫描与优化建议_20261007.md; 53-check gate green
</commit_message>
<xml_diff>
--- a/重构版论文_v4_20260915/English_SCI_Manuscript_v4.docx
+++ b/重构版论文_v4_20260915/English_SCI_Manuscript_v4.docx
@@ -1039,7 +1039,7 @@
           <w:noProof/>
         </w:rPr>
         <w:drawing>
-          <wp:inline distT="0" distB="0" distL="0" distR="0" wp14:anchorId="6665456E" wp14:editId="56258A9D">
+          <wp:inline distT="0" distB="0" distL="0" distR="0" wp14:anchorId="655CD2F0" wp14:editId="35153554">
             <wp:extent cx="5760720" cy="2734826"/>
             <wp:effectExtent l="0" t="0" r="0" b="0"/>
             <wp:docPr id="1" name="Picture 1"/>
@@ -2426,7 +2426,7 @@
           <w:noProof/>
         </w:rPr>
         <w:drawing>
-          <wp:inline distT="0" distB="0" distL="0" distR="0" wp14:anchorId="79439A53" wp14:editId="31845492">
+          <wp:inline distT="0" distB="0" distL="0" distR="0" wp14:anchorId="09AB9FD3" wp14:editId="181F1FFF">
             <wp:extent cx="5760720" cy="2722098"/>
             <wp:effectExtent l="0" t="0" r="0" b="0"/>
             <wp:docPr id="2" name="Picture 2"/>
@@ -3419,7 +3419,7 @@
           <w:noProof/>
         </w:rPr>
         <w:drawing>
-          <wp:inline distT="0" distB="0" distL="0" distR="0" wp14:anchorId="3CAD269A" wp14:editId="59AEB94F">
+          <wp:inline distT="0" distB="0" distL="0" distR="0" wp14:anchorId="7D1B31E8" wp14:editId="17567AEF">
             <wp:extent cx="5760720" cy="3482709"/>
             <wp:effectExtent l="0" t="0" r="0" b="0"/>
             <wp:docPr id="3" name="Picture 3"/>
@@ -4772,23 +4772,20 @@
     </w:p>
     <w:p>
       <w:r>
-        <w:t xml:space="preserve">Together the conditions yield a falsifiable prediction: on data where experts are highly correlated and the risk models are nearly constant, the hard-label gain of conditional weighting should be zero or near zero, the weight </w:t>
-      </w:r>
+        <w:t>Together the conditions yield a falsifiable prediction: on data where experts are highly correlated and the risk models are nearly constant, the hard-label gain of conditional weighting should be zero or near zero, the weight entropy should approach 1, and the expert disagreement rate should approach 0. Section 5.3 tests this prediction directly.</w:t>
+      </w:r>
+    </w:p>
+    <w:p>
+      <w:r>
+        <w:t>The row-wise margin bound and the quantification of Condition 3 are provided in Supplementary S17 and S25.</w:t>
+      </w:r>
+    </w:p>
+    <w:p>
+      <w:pPr>
+        <w:pStyle w:val="21"/>
+      </w:pPr>
       <w:r>
         <w:lastRenderedPageBreak/>
-        <w:t>entropy should approach 1, and the expert disagreement rate should approach 0. Section 5.3 tests this prediction directly.</w:t>
-      </w:r>
-    </w:p>
-    <w:p>
-      <w:r>
-        <w:t>The row-wise margin bound and the quantification of Condition 3 are provided in Supplementary S17 and S25.</w:t>
-      </w:r>
-    </w:p>
-    <w:p>
-      <w:pPr>
-        <w:pStyle w:val="21"/>
-      </w:pPr>
-      <w:r>
         <w:t>4.4 Complexity</w:t>
       </w:r>
     </w:p>
@@ -4944,15 +4941,15 @@
     </w:p>
     <w:p>
       <w:r>
-        <w:t xml:space="preserve">The feature-quality audit of the balanced control corpus P_bal (2,355 training rows) shows that 12 of the 78 CIC-IDS2017 features are constant (a single value across all rows) and 18 are near-zero-variance; the primary natural-prior split shows 10 constant and 20 near-zero-variance features, so the degeneracy belongs to the feature </w:t>
-      </w:r>
+        <w:t>The feature-quality audit of the balanced control corpus P_bal (2,355 training rows) shows that 12 of the 78 CIC-IDS2017 features are constant (a single value across all rows) and 18 are near-zero-variance; the primary natural-prior split shows 10 constant and 20 near-zero-variance features, so the degeneracy belongs to the feature representation rather than to one population. The constant columns include Bwd PSH Flags, Fwd URG Flags, Bwd URG Flags, RST Flag Count, CWE Flag Count, ECE Flag Count and six bul</w:t>
+      </w:r>
+      <w:r>
+        <w:t>k-rate fields. H1's premise of redundancy is therefore correct in itself.</w:t>
+      </w:r>
+    </w:p>
+    <w:p>
       <w:r>
         <w:lastRenderedPageBreak/>
-        <w:t>representation rather than to one population. The constant columns include Bwd PSH Flags, Fwd URG Flags, Bwd URG Flags, RST Flag Count, CWE Flag Count, ECE Flag Count and six bulk-rate fields. H1's premise of redundancy is therefore correct in itself.</w:t>
-      </w:r>
-    </w:p>
-    <w:p>
-      <w:r>
         <w:t>The chi-square budget k was fixed at 60 on the validation partition from a pre-specified candidate set: validation Macro-F1 was 0.9175 at k = 10, 0.9314 at k = 20, 0.9379 at both k = 30 and k = 40, and 0.9413 at k = 60, flattening between k = 30 and k = 40. This search was carried out on the balanced control protocol; the selected k was then frozen for every final run.</w:t>
       </w:r>
     </w:p>
@@ -6295,32 +6292,23 @@
                 <w:b/>
                 <w:sz w:val="16"/>
               </w:rPr>
-              <w:t xml:space="preserve">Balanced </w:t>
-            </w:r>
+              <w:t>Balanced accuracy</w:t>
+            </w:r>
+          </w:p>
+        </w:tc>
+        <w:tc>
+          <w:tcPr>
+            <w:tcW w:w="1088" w:type="dxa"/>
+          </w:tcPr>
+          <w:p>
+            <w:pPr>
+              <w:spacing w:after="0"/>
+            </w:pPr>
             <w:r>
               <w:rPr>
                 <w:b/>
                 <w:sz w:val="16"/>
               </w:rPr>
-              <w:lastRenderedPageBreak/>
-              <w:t>accuracy</w:t>
-            </w:r>
-          </w:p>
-        </w:tc>
-        <w:tc>
-          <w:tcPr>
-            <w:tcW w:w="1088" w:type="dxa"/>
-          </w:tcPr>
-          <w:p>
-            <w:pPr>
-              <w:spacing w:after="0"/>
-            </w:pPr>
-            <w:r>
-              <w:rPr>
-                <w:b/>
-                <w:sz w:val="16"/>
-              </w:rPr>
-              <w:lastRenderedPageBreak/>
               <w:t>Macro-F1</w:t>
             </w:r>
           </w:p>
@@ -6718,6 +6706,7 @@
               <w:rPr>
                 <w:sz w:val="16"/>
               </w:rPr>
+              <w:lastRenderedPageBreak/>
               <w:t>Equal RF (full features)</w:t>
             </w:r>
           </w:p>
@@ -7216,7 +7205,7 @@
           <w:noProof/>
         </w:rPr>
         <w:drawing>
-          <wp:inline distT="0" distB="0" distL="0" distR="0" wp14:anchorId="1F0803F6" wp14:editId="118CBC4D">
+          <wp:inline distT="0" distB="0" distL="0" distR="0" wp14:anchorId="6BB6DACB" wp14:editId="60F491E2">
             <wp:extent cx="5760720" cy="2356272"/>
             <wp:effectExtent l="0" t="0" r="0" b="0"/>
             <wp:docPr id="4" name="Picture 4"/>
@@ -7278,11 +7267,11 @@
         <w:t>Second, the paired statistics establish equivalence at a strict margin.</w:t>
       </w:r>
       <w:r>
-        <w:t xml:space="preserve"> With ten seeds the mean paired difference is -0.000456 with a standard deviation of 0.001152. Two interval estimates are reported because they answer </w:t>
+        <w:t xml:space="preserve"> With ten seeds the mean paired difference is -0.000456 with a standard deviation of 0.001152. Two interval estimates are reported because they answer different questions: the seed-level 90% interval [-0.001124, +0.000212] reflects model-to-model variability, while the test-row paired bootstrap interval [-0.004251, +0.003382] reflects resampling uncertainty over the locked test set. Both lie inside equivalence margins of 0.005 and 0.01 Macro-F1, so equivalence can be asserted at alpha = 0.05 </w:t>
       </w:r>
       <w:r>
         <w:lastRenderedPageBreak/>
-        <w:t xml:space="preserve">different questions: the seed-level 90% interval [-0.001124, +0.000212] reflects model-to-model variability, while the test-row paired bootstrap interval [-0.004251, +0.003382] reflects resampling uncertainty over the locked test set. Both lie inside equivalence margins of 0.005 and 0.01 Macro-F1, so equivalence can be asserted at alpha = 0.05 against either </w:t>
+        <w:t xml:space="preserve">against either </w:t>
       </w:r>
       <w:r>
         <w:t xml:space="preserve">margin. This strengthens the three-seed analysis, for which the 0.005 margin was not attainable. The sign of the difference is split five to five across seeds, and exact McNemar tests on the test rows are non-significant. Under the pre-declared decision rule - stable, consistent in sign, and bounded away from zero - </w:t>
@@ -8121,11 +8110,14 @@
         <w:rPr>
           <w:b/>
         </w:rPr>
+        <w:t>Fifth, a neural baseline shows how badly accuracy can mislead.</w:t>
+      </w:r>
+      <w:r>
+        <w:t xml:space="preserve"> A multilayer perceptron given the same feature budget and a full training budget (128 hidden units, hyper-parameters selected on the validation partition) reaches 0.97679 accuracy against RCCF's 0.97792, but only 0.797654 Macro-F1 against 0.889955, i.e. 0.092 lower. Its balanced accuracy is 0.79666 against 0.94920 and its Brier score is 0.036701 against 0.006312. Every comparison </w:t>
+      </w:r>
+      <w:r>
         <w:lastRenderedPageBreak/>
-        <w:t>Fifth, a neural baseline shows how badly accuracy can mislead.</w:t>
-      </w:r>
-      <w:r>
-        <w:t xml:space="preserve"> A multilayer perceptron given the same feature budget and a full training budget (128 hidden units, hyper-parameters selected on the validation partition) reaches 0.97679 accuracy against RCCF's 0.97792, but only 0.797654 Macro-F1 against 0.889955, i.e. 0.092 lower. Its balanced accuracy is 0.79666 against 0.94920 and its Brier score is 0.036701 against 0.006312. Every comparison in this paragraph is computed on the three seeds common to both runs (42, 2024, 3407), the seeds on which the neural baseline wa</w:t>
+        <w:t>in this paragraph is computed on the three seeds common to both runs (42, 2024, 3407), the seeds on which the neural baseline wa</w:t>
       </w:r>
       <w:r>
         <w:t xml:space="preserve">s trained; Table 4(a) gives the corresponding ten-seed RCCF values. Notably, a paired McNemar test on overall correctness is not significant (pooled p = 0.383 over 23,958 rows; per-seed 1.000 / 0.768 / 0.261), because the two models make a similar </w:t>
@@ -8176,7 +8168,7 @@
           <w:noProof/>
         </w:rPr>
         <w:drawing>
-          <wp:inline distT="0" distB="0" distL="0" distR="0" wp14:anchorId="5F2097D5" wp14:editId="006DB99F">
+          <wp:inline distT="0" distB="0" distL="0" distR="0" wp14:anchorId="218D79EC" wp14:editId="4B8B1F03">
             <wp:extent cx="5760720" cy="2045294"/>
             <wp:effectExtent l="0" t="0" r="0" b="0"/>
             <wp:docPr id="5" name="Picture 5"/>
@@ -8290,7 +8282,6 @@
         <w:rPr>
           <w:b/>
         </w:rPr>
-        <w:lastRenderedPageBreak/>
         <w:t>Measurement 4: the margin bound proves invariance.</w:t>
       </w:r>
       <w:r>
@@ -8339,7 +8330,11 @@
         <w:t>3,469 to 5,038</w:t>
       </w:r>
       <w:r>
-        <w:t xml:space="preserve"> across seeds. In other words, fused probabilities are close to one-hot and the weight-induced probability movement is three orders of magnitude smaller than the decision margin.</w:t>
+        <w:t xml:space="preserve"> across </w:t>
+      </w:r>
+      <w:r>
+        <w:lastRenderedPageBreak/>
+        <w:t>seeds. In other words, fused probabilities are close to one-hot and the weight-induced probability movement is three orders of magnitude smaller than the decision margin.</w:t>
       </w:r>
     </w:p>
     <w:p>
@@ -8351,7 +8346,7 @@
           <w:noProof/>
         </w:rPr>
         <w:drawing>
-          <wp:inline distT="0" distB="0" distL="0" distR="0" wp14:anchorId="0C76CA2D" wp14:editId="4436E9C7">
+          <wp:inline distT="0" distB="0" distL="0" distR="0" wp14:anchorId="33318C7C" wp14:editId="0EE73516">
             <wp:extent cx="5760720" cy="2308234"/>
             <wp:effectExtent l="0" t="0" r="0" b="0"/>
             <wp:docPr id="6" name="Picture 6"/>
@@ -9083,7 +9078,7 @@
           <w:noProof/>
         </w:rPr>
         <w:drawing>
-          <wp:inline distT="0" distB="0" distL="0" distR="0" wp14:anchorId="09B35CF0" wp14:editId="410112B1">
+          <wp:inline distT="0" distB="0" distL="0" distR="0" wp14:anchorId="56EC3DC5" wp14:editId="400A91EC">
             <wp:extent cx="5760720" cy="2167923"/>
             <wp:effectExtent l="0" t="0" r="0" b="0"/>
             <wp:docPr id="7" name="Picture 7"/>
@@ -9262,7 +9257,7 @@
           <w:noProof/>
         </w:rPr>
         <w:drawing>
-          <wp:inline distT="0" distB="0" distL="0" distR="0" wp14:anchorId="6136F048" wp14:editId="13ACEE26">
+          <wp:inline distT="0" distB="0" distL="0" distR="0" wp14:anchorId="708CDF07" wp14:editId="6754F6A4">
             <wp:extent cx="5760720" cy="2258878"/>
             <wp:effectExtent l="0" t="0" r="0" b="0"/>
             <wp:docPr id="8" name="Picture 8"/>
@@ -9446,7 +9441,7 @@
           <w:noProof/>
         </w:rPr>
         <w:drawing>
-          <wp:inline distT="0" distB="0" distL="0" distR="0" wp14:anchorId="6C38E22C" wp14:editId="5D499EEE">
+          <wp:inline distT="0" distB="0" distL="0" distR="0" wp14:anchorId="4186EF62" wp14:editId="709A5B77">
             <wp:extent cx="5760720" cy="2516852"/>
             <wp:effectExtent l="0" t="0" r="0" b="0"/>
             <wp:docPr id="9" name="Picture 9"/>
@@ -9583,7 +9578,7 @@
           <w:noProof/>
         </w:rPr>
         <w:drawing>
-          <wp:inline distT="0" distB="0" distL="0" distR="0" wp14:anchorId="6C62EE7E" wp14:editId="2A645667">
+          <wp:inline distT="0" distB="0" distL="0" distR="0" wp14:anchorId="6CB3CE67" wp14:editId="49022E18">
             <wp:extent cx="5760720" cy="2223311"/>
             <wp:effectExtent l="0" t="0" r="0" b="0"/>
             <wp:docPr id="10" name="Picture 10"/>
@@ -9670,7 +9665,7 @@
         </w:rPr>
         <w:lastRenderedPageBreak/>
         <w:drawing>
-          <wp:inline distT="0" distB="0" distL="0" distR="0" wp14:anchorId="6653865B" wp14:editId="2D564234">
+          <wp:inline distT="0" distB="0" distL="0" distR="0" wp14:anchorId="73AF1F1D" wp14:editId="204997EB">
             <wp:extent cx="5760720" cy="2538527"/>
             <wp:effectExtent l="0" t="0" r="0" b="0"/>
             <wp:docPr id="11" name="Picture 11"/>
@@ -10639,7 +10634,7 @@
           <w:noProof/>
         </w:rPr>
         <w:drawing>
-          <wp:inline distT="0" distB="0" distL="0" distR="0" wp14:anchorId="61368301" wp14:editId="034CAD76">
+          <wp:inline distT="0" distB="0" distL="0" distR="0" wp14:anchorId="4255D9EE" wp14:editId="729644D7">
             <wp:extent cx="5760720" cy="1441223"/>
             <wp:effectExtent l="0" t="0" r="0" b="0"/>
             <wp:docPr id="12" name="Picture 12"/>
@@ -14808,76 +14803,76 @@
       </w:rPr>
     </w:lvl>
   </w:abstractNum>
-  <w:num w:numId="1" w16cid:durableId="119300706">
+  <w:num w:numId="1" w16cid:durableId="2065789710">
     <w:abstractNumId w:val="8"/>
   </w:num>
-  <w:num w:numId="2" w16cid:durableId="919560080">
+  <w:num w:numId="2" w16cid:durableId="589243444">
     <w:abstractNumId w:val="6"/>
   </w:num>
-  <w:num w:numId="3" w16cid:durableId="1589576730">
+  <w:num w:numId="3" w16cid:durableId="2136170775">
     <w:abstractNumId w:val="5"/>
   </w:num>
-  <w:num w:numId="4" w16cid:durableId="1471435180">
+  <w:num w:numId="4" w16cid:durableId="2116434546">
     <w:abstractNumId w:val="4"/>
   </w:num>
-  <w:num w:numId="5" w16cid:durableId="769424954">
+  <w:num w:numId="5" w16cid:durableId="368073842">
     <w:abstractNumId w:val="7"/>
   </w:num>
-  <w:num w:numId="6" w16cid:durableId="1636106972">
+  <w:num w:numId="6" w16cid:durableId="1976830506">
     <w:abstractNumId w:val="3"/>
   </w:num>
-  <w:num w:numId="7" w16cid:durableId="1567373420">
+  <w:num w:numId="7" w16cid:durableId="1021979930">
     <w:abstractNumId w:val="2"/>
   </w:num>
-  <w:num w:numId="8" w16cid:durableId="792291157">
+  <w:num w:numId="8" w16cid:durableId="1265966802">
     <w:abstractNumId w:val="1"/>
   </w:num>
-  <w:num w:numId="9" w16cid:durableId="219439193">
+  <w:num w:numId="9" w16cid:durableId="620500153">
     <w:abstractNumId w:val="0"/>
   </w:num>
-  <w:num w:numId="10" w16cid:durableId="2084644329">
+  <w:num w:numId="10" w16cid:durableId="1684088386">
     <w:abstractNumId w:val="7"/>
     <w:lvlOverride w:ilvl="0">
       <w:startOverride w:val="1"/>
     </w:lvlOverride>
   </w:num>
-  <w:num w:numId="11" w16cid:durableId="1232696999">
+  <w:num w:numId="11" w16cid:durableId="1280645738">
     <w:abstractNumId w:val="7"/>
     <w:lvlOverride w:ilvl="0">
       <w:startOverride w:val="1"/>
     </w:lvlOverride>
   </w:num>
-  <w:num w:numId="12" w16cid:durableId="1230267219">
+  <w:num w:numId="12" w16cid:durableId="207768885">
     <w:abstractNumId w:val="7"/>
     <w:lvlOverride w:ilvl="0">
       <w:startOverride w:val="1"/>
     </w:lvlOverride>
   </w:num>
-  <w:num w:numId="13" w16cid:durableId="848563429">
+  <w:num w:numId="13" w16cid:durableId="1047026116">
     <w:abstractNumId w:val="7"/>
     <w:lvlOverride w:ilvl="0">
       <w:startOverride w:val="1"/>
     </w:lvlOverride>
   </w:num>
-  <w:num w:numId="14" w16cid:durableId="560874501">
+  <w:num w:numId="14" w16cid:durableId="1230771683">
     <w:abstractNumId w:val="7"/>
     <w:lvlOverride w:ilvl="0">
       <w:startOverride w:val="1"/>
     </w:lvlOverride>
   </w:num>
-  <w:num w:numId="15" w16cid:durableId="130443981">
+  <w:num w:numId="15" w16cid:durableId="865172678">
     <w:abstractNumId w:val="7"/>
     <w:lvlOverride w:ilvl="0">
       <w:startOverride w:val="1"/>
     </w:lvlOverride>
   </w:num>
-  <w:num w:numId="16" w16cid:durableId="1285651448">
+  <w:num w:numId="16" w16cid:durableId="118688597">
     <w:abstractNumId w:val="7"/>
     <w:lvlOverride w:ilvl="0">
       <w:startOverride w:val="1"/>
     </w:lvlOverride>
   </w:num>
-  <w:num w:numId="17" w16cid:durableId="568462639">
+  <w:num w:numId="17" w16cid:durableId="278298157">
     <w:abstractNumId w:val="7"/>
     <w:lvlOverride w:ilvl="0">
       <w:startOverride w:val="1"/>

</xml_diff>

<commit_message>
Round 20bp: add the 2024-2026 top-venue literature and the missing corpus citations - 26 verified references (48-73), the Section 2.3 model-family paragraph, drift/adversarial/cross-domain positioning, corpus citations, journal-fit sentence in the cover letter, DOI record extended to 73 entries, duplicated S30 row repaired; 53-check gate green
</commit_message>
<xml_diff>
--- a/重构版论文_v4_20260915/English_SCI_Manuscript_v4.docx
+++ b/重构版论文_v4_20260915/English_SCI_Manuscript_v4.docx
@@ -103,7 +103,10 @@
     </w:p>
     <w:p>
       <w:r>
-        <w:t xml:space="preserve">When these factors are uncontrolled, a comparison between models stops being a comparison of algorithms and becomes a comparison of splitting accidents. Several recent studies show that leakage and preprocessing order alone can reverse conclusions in intrusion detection [20-22]. The natural scientific question is therefore: </w:t>
+        <w:t>When these factors are uncontrolled, a comparison between models stops being a comparison of algorithms and becomes a comparison of splitting accidents. Several recent studies show that leakage and preprocessing order alone can reverse conclusions in intrusion detection [20-22]. The same failure mode is documented outside security, where leakage alone inflates reported performance in a different domain [50], and the pitfalls of machine learning for computer security have since been consolidated into a check</w:t>
+      </w:r>
+      <w:r>
+        <w:t xml:space="preserve">list [48]. The natural scientific question is therefore: </w:t>
       </w:r>
       <w:r>
         <w:rPr>
@@ -230,6 +233,7 @@
         <w:pStyle w:val="21"/>
       </w:pPr>
       <w:r>
+        <w:lastRenderedPageBreak/>
         <w:t>1.4 Contributions</w:t>
       </w:r>
     </w:p>
@@ -250,7 +254,6 @@
         <w:rPr>
           <w:b/>
         </w:rPr>
-        <w:lastRenderedPageBreak/>
         <w:t>A reusable leakage-controlled protocol and audit record.</w:t>
       </w:r>
       <w:r>
@@ -360,6 +363,7 @@
         <w:pStyle w:val="1"/>
       </w:pPr>
       <w:r>
+        <w:lastRenderedPageBreak/>
         <w:t>2. Related Work and Positioning</w:t>
       </w:r>
     </w:p>
@@ -373,21 +377,82 @@
         <w:pStyle w:val="21"/>
       </w:pPr>
       <w:r>
+        <w:t>2.1 Public datasets and their evaluation hazards</w:t>
+      </w:r>
+    </w:p>
+    <w:p>
+      <w:r>
+        <w:t>CIC-IDS2017 was released by Sharafaldin et al. in 2018 [14] and contains five days of benign and malicious traffic summarised into 78 flow features by CICFlowMeter. NSL-KDD is a refined version of KDD CUP 99 with five native labels (Normal, DoS, Probe, R2L, U2R) [15]. UNSW-NB15, released by Moustafa and Slay in 2015, provides official training and testing files with nine attack categories [16].</w:t>
+      </w:r>
+    </w:p>
+    <w:p>
+      <w:r>
+        <w:t>Several structural defects are documented [19,49]. Class distributions are extremely skewed - in CIC-IDS2017 the Web Attack and Infiltration families are three to five orders of magnitude smaller than BENIGN. Feature tables contain constant columns and collection artefacts. Some attack families were generated by a single tool in a single time window and are therefore highly homogeneous. Training and test partitions may share duplicates. Engelen and Timmerman, and Liu et al., show that preprocessing order an</w:t>
+      </w:r>
+      <w:r>
+        <w:t>d splitting choices alone can materially change reported performance [20,21]. These findings motivate H3: if protocol choices change conclusions, the protocol itself must become a reported and tested object. This position is part of a wider methodological critique of machine learning in security [22,23,26].</w:t>
+      </w:r>
+    </w:p>
+    <w:p>
+      <w:pPr>
+        <w:pStyle w:val="21"/>
+      </w:pPr>
+      <w:r>
+        <w:t>2.2 Feature selection and leakage</w:t>
+      </w:r>
+    </w:p>
+    <w:p>
+      <w:r>
+        <w:t>Filter selection is popular in this domain because it is cheap and interpretable. The chi-square statistic measures dependence between a discretised feature and the label [12], mutual information (MI) captures non-linear dependence, and analysis of variance (ANOVA) compares between-class with within-class variance [13]. All three are used here as controls.</w:t>
+      </w:r>
+    </w:p>
+    <w:p>
+      <w:r>
+        <w:t>The difficulty is that these statistics depend on the label distribution. Fitting a selector before splitting leaks test-label information through the feature ranking. Such leakage is common and hard to detect from a methods paragraph [22]. Our protocol fits every selector inside the training partition and refits it inside each cross-fitting fold, so the selector is subject to the same information boundary as the model.</w:t>
+      </w:r>
+    </w:p>
+    <w:p>
+      <w:pPr>
+        <w:pStyle w:val="21"/>
+      </w:pPr>
+      <w:r>
+        <w:t>2.3 Ensemble aggregation and adaptive weighting</w:t>
+      </w:r>
+    </w:p>
+    <w:p>
+      <w:r>
+        <w:t>Breiman's random forest combines bootstrapped trees through equal voting or probability averaging [1,2], justified by variance reduction when tree errors are imperfectly correlated. A natural generalisation replaces equal weights with unequal ones: if the reliability of each tree or expert can be estimated for a given sample, weight accordingly.</w:t>
+      </w:r>
+    </w:p>
+    <w:p>
+      <w:r>
+        <w:t>Implementations in the literature include validation-accuracy tree weighting, out-of-bag error weighting, meta-learners that predict sample-dependent weights, confidence-based weighting after probability calibration, and uncertainty-driven weighting in deep ensembles [8-11,31].</w:t>
+      </w:r>
+    </w:p>
+    <w:p>
+      <w:r>
+        <w:rPr>
+          <w:b/>
+        </w:rPr>
+        <w:t>The members have changed; the aggregation rule has not.</w:t>
+      </w:r>
+      <w:r>
+        <w:t xml:space="preserve"> The expert families used in current intrusion detection have moved on - transformers and large language models [51], graph neural networks [52] - but the object this study analyses is not the member, it is the rule that combines members. A transformer or a graph network placed behind a conditional-weighting gate is still a member whose output can be compared against an equal-weight mean of the same members, and the identifiability conditions of Section 4.3 depend on the interchangeability of </w:t>
+      </w:r>
+      <w:r>
         <w:lastRenderedPageBreak/>
-        <w:t>2.1 Public datasets and their evaluation hazards</w:t>
-      </w:r>
-    </w:p>
-    <w:p>
-      <w:r>
-        <w:t>CIC-IDS2017 was released by Sharafaldin et al. in 2018 [14] and contains five days of benign and malicious traffic summarised into 78 flow features by CICFlowMeter. NSL-KDD is a refined version of KDD CUP 99 with five native labels (Normal, DoS, Probe, R2L, U2R) [15]. UNSW-NB15, released by Moustafa and Slay in 2015, provides official training and testing files with nine attack categories [16].</w:t>
-      </w:r>
-    </w:p>
-    <w:p>
-      <w:r>
-        <w:t>Several structural defects are documented [19]. Class distributions are extremely skewed - in CIC-IDS2017 the Web Attack and Infiltration families are three to five orders of magnitude smaller than BENIGN. Feature tables contain constant columns and collection artefacts. Some attack families were generated by a single tool in a single time window and are therefore highly homogeneous. Training and test partitions may share duplicates. Engelen and Timmerman, and Liu et al., show that preprocessing order and s</w:t>
-      </w:r>
-      <w:r>
-        <w:t>plitting choices alone can materially change reported performance [20,21]. These findings motivate H3: if protocol choices change conclusions, the protocol itself must become a reported and tested object. This position is part of a wider methodological critique of machine learning in security [22,23,26].</w:t>
+        <w:t>those members,</w:t>
+      </w:r>
+      <w:r>
+        <w:t xml:space="preserve"> not on their architecture. The feature-budget sweep in Section 5.10 is the controlled instance: at k=8 the members become mutually exclusive and the gate gains +0.001663, while from k=32 the views overlap again and the gain vanishes. Fusion reviews reach the same structural conclusion from the other direction, treating member diversity as the precondition for any weighted combination to help [53]. Such methods typically report gains on specific datasets, but rarely satisfy three conditions simultaneously: </w:t>
+      </w:r>
+      <w:r>
+        <w:t>(i) all information used for weighting comes from the training and validation partitions; (ii) the equal-weight control uses the same feature view and tuning budget; and (iii) paired significance tests and repeated-split stability are reported. Without these, "weighting helps" cannot be separated from "this particular split helped".</w:t>
+      </w:r>
+    </w:p>
+    <w:p>
+      <w:r>
+        <w:t>Recent open-set work adds extreme-value theory, prototype learning or autoencoder reconstruction error to construct rejection mechanisms [27,28,42,43]. Such methods optimise two objectives jointly - known-class discrimination and unknown-class rejection - and have a correspondingly different cost structure. We therefore report open-set behaviour as a diagnostic rather than folding it into the main conclusion.</w:t>
       </w:r>
     </w:p>
     <w:p>
@@ -395,51 +460,6 @@
         <w:pStyle w:val="21"/>
       </w:pPr>
       <w:r>
-        <w:t>2.2 Feature selection and leakage</w:t>
-      </w:r>
-    </w:p>
-    <w:p>
-      <w:r>
-        <w:t>Filter selection is popular in this domain because it is cheap and interpretable. The chi-square statistic measures dependence between a discretised feature and the label [12], mutual information (MI) captures non-linear dependence, and analysis of variance (ANOVA) compares between-class with within-class variance [13]. All three are used here as controls.</w:t>
-      </w:r>
-    </w:p>
-    <w:p>
-      <w:r>
-        <w:t>The difficulty is that these statistics depend on the label distribution. Fitting a selector before splitting leaks test-label information through the feature ranking. Such leakage is common and hard to detect from a methods paragraph [22]. Our protocol fits every selector inside the training partition and refits it inside each cross-fitting fold, so the selector is subject to the same information boundary as the model.</w:t>
-      </w:r>
-    </w:p>
-    <w:p>
-      <w:pPr>
-        <w:pStyle w:val="21"/>
-      </w:pPr>
-      <w:r>
-        <w:t>2.3 Ensemble aggregation and adaptive weighting</w:t>
-      </w:r>
-    </w:p>
-    <w:p>
-      <w:r>
-        <w:t>Breiman's random forest combines bootstrapped trees through equal voting or probability averaging [1,2], justified by variance reduction when tree errors are imperfectly correlated. A natural generalisation replaces equal weights with unequal ones: if the reliability of each tree or expert can be estimated for a given sample, weight accordingly.</w:t>
-      </w:r>
-    </w:p>
-    <w:p>
-      <w:r>
-        <w:t>Implementations in the literature include validation-accuracy tree weighting, out-of-bag error weighting, meta-learners that predict sample-dependent weights, confidence-based weighting after probability calibration, and uncertainty-driven weighting in deep ensembles [8-11,31]. Such methods typically report gains on specific datasets, but rarely satisfy three conditions simultaneously: (i) all information used for weighting comes from the training and validation partitions; (ii) the equal-weight control use</w:t>
-      </w:r>
-      <w:r>
-        <w:t>s the same feature view and tuning budget; and (iii) paired significance tests and repeated-split stability are reported. Without these, "weighting helps" cannot be separated from "this particular split helped".</w:t>
-      </w:r>
-    </w:p>
-    <w:p>
-      <w:r>
-        <w:t>Recent open-set work adds extreme-value theory, prototype learning or autoencoder reconstruction error to construct rejection mechanisms [27,28,42,43]. Such methods optimise two objectives jointly - known-class discrimination and unknown-class rejection - and have a correspondingly different cost structure. We therefore report open-set behaviour as a diagnostic rather than folding it into the main conclusion.</w:t>
-      </w:r>
-    </w:p>
-    <w:p>
-      <w:pPr>
-        <w:pStyle w:val="21"/>
-      </w:pPr>
-      <w:r>
-        <w:lastRenderedPageBreak/>
         <w:t>2.4 Probability quality, open-set rejection and deployment cost</w:t>
       </w:r>
     </w:p>
@@ -864,7 +884,14 @@
               <w:rPr>
                 <w:sz w:val="16"/>
               </w:rPr>
-              <w:t>Open-set and extreme-value rejection</w:t>
+              <w:t>Open-set and extreme-</w:t>
+            </w:r>
+            <w:r>
+              <w:rPr>
+                <w:sz w:val="16"/>
+              </w:rPr>
+              <w:lastRenderedPageBreak/>
+              <w:t>value rejection</w:t>
             </w:r>
           </w:p>
         </w:tc>
@@ -880,6 +907,7 @@
               <w:rPr>
                 <w:sz w:val="16"/>
               </w:rPr>
+              <w:lastRenderedPageBreak/>
               <w:t>Known plus unknown</w:t>
             </w:r>
           </w:p>
@@ -896,7 +924,14 @@
               <w:rPr>
                 <w:sz w:val="16"/>
               </w:rPr>
-              <w:t>Threshold depends on validation data</w:t>
+              <w:t xml:space="preserve">Threshold depends on </w:t>
+            </w:r>
+            <w:r>
+              <w:rPr>
+                <w:sz w:val="16"/>
+              </w:rPr>
+              <w:lastRenderedPageBreak/>
+              <w:t>validation data</w:t>
             </w:r>
           </w:p>
         </w:tc>
@@ -912,7 +947,15 @@
               <w:rPr>
                 <w:sz w:val="16"/>
               </w:rPr>
-              <w:t>Unknown-class rejection metrics</w:t>
+              <w:lastRenderedPageBreak/>
+              <w:t xml:space="preserve">Unknown-class rejection </w:t>
+            </w:r>
+            <w:r>
+              <w:rPr>
+                <w:sz w:val="16"/>
+              </w:rPr>
+              <w:lastRenderedPageBreak/>
+              <w:t>metrics</w:t>
             </w:r>
           </w:p>
         </w:tc>
@@ -928,7 +971,15 @@
               <w:rPr>
                 <w:sz w:val="16"/>
               </w:rPr>
-              <w:t>Different objective and cost structure</w:t>
+              <w:lastRenderedPageBreak/>
+              <w:t xml:space="preserve">Different objective and </w:t>
+            </w:r>
+            <w:r>
+              <w:rPr>
+                <w:sz w:val="16"/>
+              </w:rPr>
+              <w:lastRenderedPageBreak/>
+              <w:t>cost structure</w:t>
             </w:r>
           </w:p>
         </w:tc>
@@ -946,6 +997,7 @@
               <w:rPr>
                 <w:sz w:val="16"/>
               </w:rPr>
+              <w:lastRenderedPageBreak/>
               <w:t>This study</w:t>
             </w:r>
           </w:p>
@@ -1026,7 +1078,6 @@
         <w:pStyle w:val="1"/>
       </w:pPr>
       <w:r>
-        <w:lastRenderedPageBreak/>
         <w:t>3. Data, Provenance and Protocol</w:t>
       </w:r>
     </w:p>
@@ -1039,7 +1090,7 @@
           <w:noProof/>
         </w:rPr>
         <w:drawing>
-          <wp:inline distT="0" distB="0" distL="0" distR="0" wp14:anchorId="655CD2F0" wp14:editId="35153554">
+          <wp:inline distT="0" distB="0" distL="0" distR="0" wp14:anchorId="07DE6561" wp14:editId="79E3DE33">
             <wp:extent cx="5760720" cy="2734826"/>
             <wp:effectExtent l="0" t="0" r="0" b="0"/>
             <wp:docPr id="1" name="Picture 1"/>
@@ -1277,7 +1328,14 @@
               <w:rPr>
                 <w:sz w:val="16"/>
               </w:rPr>
-              <w:t>Canadian Institute for Cybersecurity, official page</w:t>
+              <w:t xml:space="preserve">Canadian Institute for </w:t>
+            </w:r>
+            <w:r>
+              <w:rPr>
+                <w:sz w:val="16"/>
+              </w:rPr>
+              <w:lastRenderedPageBreak/>
+              <w:t>Cybersecurity, official page</w:t>
             </w:r>
           </w:p>
         </w:tc>
@@ -1293,7 +1351,15 @@
               <w:rPr>
                 <w:sz w:val="16"/>
               </w:rPr>
-              <w:t>MachineLearningCSV archive (8 CSV files)</w:t>
+              <w:lastRenderedPageBreak/>
+              <w:t xml:space="preserve">MachineLearningCSV </w:t>
+            </w:r>
+            <w:r>
+              <w:rPr>
+                <w:sz w:val="16"/>
+              </w:rPr>
+              <w:lastRenderedPageBreak/>
+              <w:t>archive (8 CSV files)</w:t>
             </w:r>
           </w:p>
         </w:tc>
@@ -1309,6 +1375,7 @@
               <w:rPr>
                 <w:sz w:val="16"/>
               </w:rPr>
+              <w:lastRenderedPageBreak/>
               <w:t>2026-09-02</w:t>
             </w:r>
           </w:p>
@@ -1325,7 +1392,14 @@
               <w:rPr>
                 <w:sz w:val="16"/>
               </w:rPr>
-              <w:t>No SPDX identifier shown; used under page terms with citation</w:t>
+              <w:t xml:space="preserve">No SPDX identifier </w:t>
+            </w:r>
+            <w:r>
+              <w:rPr>
+                <w:sz w:val="16"/>
+              </w:rPr>
+              <w:lastRenderedPageBreak/>
+              <w:t>shown; used under page terms with citation</w:t>
             </w:r>
           </w:p>
         </w:tc>
@@ -1341,7 +1415,15 @@
               <w:rPr>
                 <w:sz w:val="16"/>
               </w:rPr>
-              <w:t>SHA-256 and MD5 recorded (Table S1)</w:t>
+              <w:lastRenderedPageBreak/>
+              <w:t xml:space="preserve">SHA-256 and MD5 </w:t>
+            </w:r>
+            <w:r>
+              <w:rPr>
+                <w:sz w:val="16"/>
+              </w:rPr>
+              <w:lastRenderedPageBreak/>
+              <w:t>recorded (Table S1)</w:t>
             </w:r>
           </w:p>
         </w:tc>
@@ -1359,6 +1441,7 @@
               <w:rPr>
                 <w:sz w:val="16"/>
               </w:rPr>
+              <w:lastRenderedPageBreak/>
               <w:t>NSL-KDD</w:t>
             </w:r>
           </w:p>
@@ -1473,14 +1556,7 @@
               <w:rPr>
                 <w:sz w:val="16"/>
               </w:rPr>
-              <w:t xml:space="preserve">UNSW Canberra </w:t>
-            </w:r>
-            <w:r>
-              <w:rPr>
-                <w:sz w:val="16"/>
-              </w:rPr>
-              <w:lastRenderedPageBreak/>
-              <w:t>Cyber, official project page</w:t>
+              <w:t>UNSW Canberra Cyber, official project page</w:t>
             </w:r>
           </w:p>
         </w:tc>
@@ -1496,15 +1572,7 @@
               <w:rPr>
                 <w:sz w:val="16"/>
               </w:rPr>
-              <w:lastRenderedPageBreak/>
-              <w:t xml:space="preserve">Official training and </w:t>
-            </w:r>
-            <w:r>
-              <w:rPr>
-                <w:sz w:val="16"/>
-              </w:rPr>
-              <w:lastRenderedPageBreak/>
-              <w:t>testing CSV</w:t>
+              <w:t>Official training and testing CSV</w:t>
             </w:r>
           </w:p>
         </w:tc>
@@ -1520,7 +1588,6 @@
               <w:rPr>
                 <w:sz w:val="16"/>
               </w:rPr>
-              <w:lastRenderedPageBreak/>
               <w:t>2026-09-04</w:t>
             </w:r>
           </w:p>
@@ -1537,14 +1604,7 @@
               <w:rPr>
                 <w:sz w:val="16"/>
               </w:rPr>
-              <w:t xml:space="preserve">Page requires citation </w:t>
-            </w:r>
-            <w:r>
-              <w:rPr>
-                <w:sz w:val="16"/>
-              </w:rPr>
-              <w:lastRenderedPageBreak/>
-              <w:t>of the original paper; no SPDX identifier</w:t>
+              <w:t>Page requires citation of the original paper; no SPDX identifier</w:t>
             </w:r>
           </w:p>
         </w:tc>
@@ -1560,15 +1620,7 @@
               <w:rPr>
                 <w:sz w:val="16"/>
               </w:rPr>
-              <w:lastRenderedPageBreak/>
-              <w:t xml:space="preserve">SHA-256 recorded </w:t>
-            </w:r>
-            <w:r>
-              <w:rPr>
-                <w:sz w:val="16"/>
-              </w:rPr>
-              <w:lastRenderedPageBreak/>
-              <w:t>for both files</w:t>
+              <w:t>SHA-256 recorded for both files</w:t>
             </w:r>
           </w:p>
         </w:tc>
@@ -1586,7 +1638,6 @@
               <w:rPr>
                 <w:sz w:val="16"/>
               </w:rPr>
-              <w:lastRenderedPageBreak/>
               <w:t>N-BaIoT</w:t>
             </w:r>
           </w:p>
@@ -1771,6 +1822,7 @@
         <w:rPr>
           <w:b/>
         </w:rPr>
+        <w:lastRenderedPageBreak/>
         <w:t>Boundary statement.</w:t>
       </w:r>
       <w:r>
@@ -2002,14 +2054,7 @@
               <w:rPr>
                 <w:sz w:val="16"/>
               </w:rPr>
-              <w:t xml:space="preserve">Five retained classes; PortScan, Infiltration and Heartbleed </w:t>
-            </w:r>
-            <w:r>
-              <w:rPr>
-                <w:sz w:val="16"/>
-              </w:rPr>
-              <w:lastRenderedPageBreak/>
-              <w:t>reserved for diagnostics</w:t>
+              <w:t>Five retained classes; PortScan, Infiltration and Heartbleed reserved for diagnostics</w:t>
             </w:r>
           </w:p>
         </w:tc>
@@ -2027,7 +2072,6 @@
               <w:rPr>
                 <w:sz w:val="16"/>
               </w:rPr>
-              <w:lastRenderedPageBreak/>
               <w:t>After non-finite removal</w:t>
             </w:r>
           </w:p>
@@ -2426,7 +2470,7 @@
           <w:noProof/>
         </w:rPr>
         <w:drawing>
-          <wp:inline distT="0" distB="0" distL="0" distR="0" wp14:anchorId="09AB9FD3" wp14:editId="181F1FFF">
+          <wp:inline distT="0" distB="0" distL="0" distR="0" wp14:anchorId="35D051EC" wp14:editId="13E3AD45">
             <wp:extent cx="5760720" cy="2722098"/>
             <wp:effectExtent l="0" t="0" r="0" b="0"/>
             <wp:docPr id="2" name="Picture 2"/>
@@ -2508,15 +2552,18 @@
     </w:p>
     <w:p>
       <w:r>
-        <w:t>The four datasets are deliberately complementary rather than interchangeable. They span four capture settings (a 1998 line of descent for NSL-KDD, a 2015 synthetic testbed for UNSW-NB15, a 2017 enterprise-like testbed for CIC-IDS2017 and a 2018 consumer-IoT testbed for N-BaIoT), four feature extractors (41 connection-record features, 49 Argus/Bro-derived features, 78 CICFlowMeter features and 115 IoT flow features), and four label spaces (5, 10, 5 retained and 3 native classes). Their known defects also dif</w:t>
-      </w:r>
-      <w:r>
-        <w:t>fer: NSL-KDD carries the redundancy of its KDD lineage, UNSW-NB15 contains largely synthetically generated attacks and cross-split feature overlap, CIC-IDS2017 contains duplicate flows, cross-label conflicts and constant columns, and N-BaIoT repeats 67.8% of its rows exactly. Together they cover the environment the earlier draft identified as missing, a consumer-IoT deployment, while none is a temporally separated capture from a common testbed. The coverage matrix is reported in the supplementary material.</w:t>
-      </w:r>
-    </w:p>
-    <w:p>
+        <w:t xml:space="preserve">The four datasets are deliberately complementary rather than interchangeable. They span four capture settings (a 1998 line of descent for NSL-KDD, a 2015 synthetic testbed for UNSW-NB15, a 2017 enterprise-like testbed for CIC-IDS2017 and a 2018 consumer-IoT testbed for N-BaIoT), four feature extractors (41 connection-record features, 49 Argus/Bro-derived features, 78 CICFlowMeter features and 115 IoT flow features), and four label </w:t>
+      </w:r>
       <w:r>
         <w:lastRenderedPageBreak/>
+        <w:t>spaces (5, 10, 5 retained and 3 native classes). Their known defects also differ: NSL-KDD carries the redundancy of its KDD lineage, UNSW-NB15 contains largely synthetically generated attacks and cross-split feature overlap, CIC-IDS2017 contains duplicate flows, cross-label conflicts and constant columns, and N-BaIoT repeats 67.8% of its rows exactly. Together they cover the environment the earlier draft identified as missing, a consumer-IoT deployment, while none is a temporally separated capture from a co</w:t>
+      </w:r>
+      <w:r>
+        <w:t>mmon testbed. The coverage matrix is reported in the supplementary material.</w:t>
+      </w:r>
+    </w:p>
+    <w:p>
+      <w:r>
         <w:t>Because these label spaces are incompatible, the three sets of scores are never pooled or averaged here, and they are never interpreted as evidence of transfer. Their role is to act as pressure tests: a conclusion that holds only on CIC-IDS2017 should not be written as a general law.</w:t>
       </w:r>
     </w:p>
@@ -2681,7 +2728,14 @@
         <w:rPr>
           <w:b/>
         </w:rPr>
-        <w:t>smallest effect size of interest</w:t>
+        <w:t xml:space="preserve">smallest </w:t>
+      </w:r>
+      <w:r>
+        <w:rPr>
+          <w:b/>
+        </w:rPr>
+        <w:lastRenderedPageBreak/>
+        <w:t>effect size of interest</w:t>
       </w:r>
       <w:r>
         <w:t xml:space="preserve"> (SESOI). Component (v) is what allows a statement that a difference is smaller than a given margin, rather than merely failing to reject a null hypothesis of no difference. Every p-value is reported with an effect size, and a small but unstable point estimate is never interpreted as an algorithmic advantage. The equivalence margins were fixed before the primary results were inspected: 0.01 Macro-F1 as the primary margin and 0.005 as a stricter margin. The primary margin corresponds to about 1.1% of the nat</w:t>
@@ -2692,7 +2746,6 @@
     </w:p>
     <w:p>
       <w:r>
-        <w:lastRenderedPageBreak/>
         <w:t>Macro-F1 is the primary metric because Web Attack accounts for only 1.26% of the natural-prior population, so accuracy is dominated by the majority classes. Class-level reports, balanced accuracy and normalised confusion matrices are reported alongside it.</w:t>
       </w:r>
     </w:p>
@@ -2828,6 +2881,7 @@
     </w:p>
     <w:p>
       <w:r>
+        <w:lastRenderedPageBreak/>
         <w:t>Let p_e(y|x) be the probability output of expert e in {full, chi-square, MI, ANOVA}, with Q = 4 experts. The mechanism has three steps.</w:t>
       </w:r>
     </w:p>
@@ -2847,7 +2901,6 @@
         <w:rPr>
           <w:b/>
         </w:rPr>
-        <w:lastRenderedPageBreak/>
         <w:t>Step 2, risk models.</w:t>
       </w:r>
       <w:r>
@@ -3419,7 +3472,7 @@
           <w:noProof/>
         </w:rPr>
         <w:drawing>
-          <wp:inline distT="0" distB="0" distL="0" distR="0" wp14:anchorId="7D1B31E8" wp14:editId="17567AEF">
+          <wp:inline distT="0" distB="0" distL="0" distR="0" wp14:anchorId="207ADE13" wp14:editId="24A6469C">
             <wp:extent cx="5760720" cy="3482709"/>
             <wp:effectExtent l="0" t="0" r="0" b="0"/>
             <wp:docPr id="3" name="Picture 3"/>
@@ -3555,6 +3608,7 @@
           <w:rFonts w:ascii="Consolas" w:hAnsi="Consolas"/>
           <w:sz w:val="17"/>
         </w:rPr>
+        <w:lastRenderedPageBreak/>
         <w:t xml:space="preserve">       fit a T-tree forest;</w:t>
       </w:r>
     </w:p>
@@ -4767,6 +4821,7 @@
     </w:p>
     <w:p>
       <w:r>
+        <w:lastRenderedPageBreak/>
         <w:t>which approaches 1 in that limit.</w:t>
       </w:r>
     </w:p>
@@ -4785,7 +4840,6 @@
         <w:pStyle w:val="21"/>
       </w:pPr>
       <w:r>
-        <w:lastRenderedPageBreak/>
         <w:t>4.4 Complexity</w:t>
       </w:r>
     </w:p>
@@ -4936,6 +4990,7 @@
         <w:pStyle w:val="21"/>
       </w:pPr>
       <w:r>
+        <w:lastRenderedPageBreak/>
         <w:t>5.1 RQ1: Training-side feature selection preserves discriminative power</w:t>
       </w:r>
     </w:p>
@@ -4949,7 +5004,6 @@
     </w:p>
     <w:p>
       <w:r>
-        <w:lastRenderedPageBreak/>
         <w:t>The chi-square budget k was fixed at 60 on the validation partition from a pre-specified candidate set: validation Macro-F1 was 0.9175 at k = 10, 0.9314 at k = 20, 0.9379 at both k = 30 and k = 40, and 0.9413 at k = 60, flattening between k = 30 and k = 40. This search was carried out on the balanced control protocol; the selected k was then frozen for every final run.</w:t>
       </w:r>
     </w:p>
@@ -6075,7 +6129,14 @@
               <w:rPr>
                 <w:sz w:val="16"/>
               </w:rPr>
-              <w:t>MLP (128 hidden units, k = 60)</w:t>
+              <w:t xml:space="preserve">MLP (128 hidden units, </w:t>
+            </w:r>
+            <w:r>
+              <w:rPr>
+                <w:sz w:val="16"/>
+              </w:rPr>
+              <w:lastRenderedPageBreak/>
+              <w:t>k = 60)</w:t>
             </w:r>
           </w:p>
         </w:tc>
@@ -6091,6 +6152,7 @@
               <w:rPr>
                 <w:sz w:val="16"/>
               </w:rPr>
+              <w:lastRenderedPageBreak/>
               <w:t>0.97679</w:t>
             </w:r>
           </w:p>
@@ -6706,7 +6768,6 @@
               <w:rPr>
                 <w:sz w:val="16"/>
               </w:rPr>
-              <w:lastRenderedPageBreak/>
               <w:t>Equal RF (full features)</w:t>
             </w:r>
           </w:p>
@@ -7205,7 +7266,7 @@
           <w:noProof/>
         </w:rPr>
         <w:drawing>
-          <wp:inline distT="0" distB="0" distL="0" distR="0" wp14:anchorId="6BB6DACB" wp14:editId="60F491E2">
+          <wp:inline distT="0" distB="0" distL="0" distR="0" wp14:anchorId="19EFA1FF" wp14:editId="19266684">
             <wp:extent cx="5760720" cy="2356272"/>
             <wp:effectExtent l="0" t="0" r="0" b="0"/>
             <wp:docPr id="4" name="Picture 4"/>
@@ -7256,6 +7317,7 @@
     </w:p>
     <w:p>
       <w:r>
+        <w:lastRenderedPageBreak/>
         <w:t>The left panel of Figure 4 starts at 0.75 to display differences of one thousandth; the right panel shows that those differences are statistically indistinguishable. The two panels must be read together, not by bar height alone.</w:t>
       </w:r>
     </w:p>
@@ -7267,11 +7329,7 @@
         <w:t>Second, the paired statistics establish equivalence at a strict margin.</w:t>
       </w:r>
       <w:r>
-        <w:t xml:space="preserve"> With ten seeds the mean paired difference is -0.000456 with a standard deviation of 0.001152. Two interval estimates are reported because they answer different questions: the seed-level 90% interval [-0.001124, +0.000212] reflects model-to-model variability, while the test-row paired bootstrap interval [-0.004251, +0.003382] reflects resampling uncertainty over the locked test set. Both lie inside equivalence margins of 0.005 and 0.01 Macro-F1, so equivalence can be asserted at alpha = 0.05 </w:t>
-      </w:r>
-      <w:r>
-        <w:lastRenderedPageBreak/>
-        <w:t xml:space="preserve">against either </w:t>
+        <w:t xml:space="preserve"> With ten seeds the mean paired difference is -0.000456 with a standard deviation of 0.001152. Two interval estimates are reported because they answer different questions: the seed-level 90% interval [-0.001124, +0.000212] reflects model-to-model variability, while the test-row paired bootstrap interval [-0.004251, +0.003382] reflects resampling uncertainty over the locked test set. Both lie inside equivalence margins of 0.005 and 0.01 Macro-F1, so equivalence can be asserted at alpha = 0.05 against either </w:t>
       </w:r>
       <w:r>
         <w:t xml:space="preserve">margin. This strengthens the three-seed analysis, for which the 0.005 margin was not attainable. The sign of the difference is split five to five across seeds, and exact McNemar tests on the test rows are non-significant. Under the pre-declared decision rule - stable, consistent in sign, and bounded away from zero - </w:t>
@@ -8099,7 +8157,11 @@
         <w:t>Fourth, the cost is certain while the gain is not.</w:t>
       </w:r>
       <w:r>
-        <w:t xml:space="preserve"> On the natural-prior protocol, averaged over the ten seeds of Table 4(a), RCCF takes 93.3 s to train against 1.16 s for the equal-weight forest, and 0.244 s to predict against 0.046 s on a whole test batch - about 5.3 times slower at inference. That batch ratio must not be conflated with the single-row latency ratio of 4.9 reported in Section 5.6 (14.62 ms against 2.96 ms): one measures throughput on 7,986 rows, the other a single call. The gap widens on the balanced control, where training takes 9.13 s ag</w:t>
+        <w:t xml:space="preserve"> On the natural-prior protocol, averaged over the ten seeds of Table 4(a), RCCF takes 93.3 s to train against 1.16 s for the equal-weight forest, and 0.244 s to predict against 0.046 s on a whole test batch - about 5.3 times slower at inference. That batch ratio must not be conflated with the single-</w:t>
+      </w:r>
+      <w:r>
+        <w:lastRenderedPageBreak/>
+        <w:t>row latency ratio of 4.9 reported in Section 5.6 (14.62 ms against 2.96 ms): one measures throughput on 7,986 rows, the other a single call. The gap widens on the balanced control, where training takes 9.13 s ag</w:t>
       </w:r>
       <w:r>
         <w:t>ainst 0.45 s (three seeds, Table 4(b)). The most favourable summary of what these costs buy is that Macro-F1 moves within +/- 0.01.</w:t>
@@ -8113,11 +8175,7 @@
         <w:t>Fifth, a neural baseline shows how badly accuracy can mislead.</w:t>
       </w:r>
       <w:r>
-        <w:t xml:space="preserve"> A multilayer perceptron given the same feature budget and a full training budget (128 hidden units, hyper-parameters selected on the validation partition) reaches 0.97679 accuracy against RCCF's 0.97792, but only 0.797654 Macro-F1 against 0.889955, i.e. 0.092 lower. Its balanced accuracy is 0.79666 against 0.94920 and its Brier score is 0.036701 against 0.006312. Every comparison </w:t>
-      </w:r>
-      <w:r>
-        <w:lastRenderedPageBreak/>
-        <w:t>in this paragraph is computed on the three seeds common to both runs (42, 2024, 3407), the seeds on which the neural baseline wa</w:t>
+        <w:t xml:space="preserve"> A multilayer perceptron given the same feature budget and a full training budget (128 hidden units, hyper-parameters selected on the validation partition) reaches 0.97679 accuracy against RCCF's 0.97792, but only 0.797654 Macro-F1 against 0.889955, i.e. 0.092 lower. Its balanced accuracy is 0.79666 against 0.94920 and its Brier score is 0.036701 against 0.006312. Every comparison in this paragraph is computed on the three seeds common to both runs (42, 2024, 3407), the seeds on which the neural baseline wa</w:t>
       </w:r>
       <w:r>
         <w:t xml:space="preserve">s trained; Table 4(a) gives the corresponding ten-seed RCCF values. Notably, a paired McNemar test on overall correctness is not significant (pooled p = 0.383 over 23,958 rows; per-seed 1.000 / 0.768 / 0.261), because the two models make a similar </w:t>
@@ -8168,7 +8226,7 @@
           <w:noProof/>
         </w:rPr>
         <w:drawing>
-          <wp:inline distT="0" distB="0" distL="0" distR="0" wp14:anchorId="218D79EC" wp14:editId="4B8B1F03">
+          <wp:inline distT="0" distB="0" distL="0" distR="0" wp14:anchorId="7137963D" wp14:editId="7C8B9C84">
             <wp:extent cx="5760720" cy="2045294"/>
             <wp:effectExtent l="0" t="0" r="0" b="0"/>
             <wp:docPr id="5" name="Picture 5"/>
@@ -8274,7 +8332,11 @@
         <w:t>0</w:t>
       </w:r>
       <w:r>
-        <w:t>. This matches the joint prediction of Conditions 1 and 2: highly correlated experts produce margins large enough that weight differences occur far from the decision boundary and never move the argmax.</w:t>
+        <w:t xml:space="preserve">. This matches the joint prediction of Conditions 1 and 2: highly </w:t>
+      </w:r>
+      <w:r>
+        <w:lastRenderedPageBreak/>
+        <w:t>correlated experts produce margins large enough that weight differences occur far from the decision boundary and never move the argmax.</w:t>
       </w:r>
     </w:p>
     <w:p>
@@ -8330,11 +8392,7 @@
         <w:t>3,469 to 5,038</w:t>
       </w:r>
       <w:r>
-        <w:t xml:space="preserve"> across </w:t>
-      </w:r>
-      <w:r>
-        <w:lastRenderedPageBreak/>
-        <w:t>seeds. In other words, fused probabilities are close to one-hot and the weight-induced probability movement is three orders of magnitude smaller than the decision margin.</w:t>
+        <w:t xml:space="preserve"> across seeds. In other words, fused probabilities are close to one-hot and the weight-induced probability movement is three orders of magnitude smaller than the decision margin.</w:t>
       </w:r>
     </w:p>
     <w:p>
@@ -8346,7 +8404,7 @@
           <w:noProof/>
         </w:rPr>
         <w:drawing>
-          <wp:inline distT="0" distB="0" distL="0" distR="0" wp14:anchorId="33318C7C" wp14:editId="0EE73516">
+          <wp:inline distT="0" distB="0" distL="0" distR="0" wp14:anchorId="1300659F" wp14:editId="11474D5F">
             <wp:extent cx="5760720" cy="2308234"/>
             <wp:effectExtent l="0" t="0" r="0" b="0"/>
             <wp:docPr id="6" name="Picture 6"/>
@@ -8482,6 +8540,7 @@
                 <w:b/>
                 <w:sz w:val="16"/>
               </w:rPr>
+              <w:lastRenderedPageBreak/>
               <w:t>Expert set</w:t>
             </w:r>
           </w:p>
@@ -8977,7 +9036,6 @@
               <w:rPr>
                 <w:sz w:val="16"/>
               </w:rPr>
-              <w:lastRenderedPageBreak/>
               <w:t>Disjoint feature blocks</w:t>
             </w:r>
           </w:p>
@@ -9078,7 +9136,7 @@
           <w:noProof/>
         </w:rPr>
         <w:drawing>
-          <wp:inline distT="0" distB="0" distL="0" distR="0" wp14:anchorId="56EC3DC5" wp14:editId="400A91EC">
+          <wp:inline distT="0" distB="0" distL="0" distR="0" wp14:anchorId="776FE95C" wp14:editId="1B5862F0">
             <wp:extent cx="5760720" cy="2167923"/>
             <wp:effectExtent l="0" t="0" r="0" b="0"/>
             <wp:docPr id="7" name="Picture 7"/>
@@ -9205,6 +9263,7 @@
         <w:rPr>
           <w:b/>
         </w:rPr>
+        <w:lastRenderedPageBreak/>
         <w:t>Measurement 8: how much the experts actually disagree.</w:t>
       </w:r>
       <w:r>
@@ -9239,7 +9298,6 @@
         <w:pStyle w:val="21"/>
       </w:pPr>
       <w:r>
-        <w:lastRenderedPageBreak/>
         <w:t>5.4 RQ3: Protocol effects exceed aggregation-rule differences by an order of magnitude</w:t>
       </w:r>
     </w:p>
@@ -9257,7 +9315,7 @@
           <w:noProof/>
         </w:rPr>
         <w:drawing>
-          <wp:inline distT="0" distB="0" distL="0" distR="0" wp14:anchorId="708CDF07" wp14:editId="6754F6A4">
+          <wp:inline distT="0" distB="0" distL="0" distR="0" wp14:anchorId="28D8560C" wp14:editId="0E69E16E">
             <wp:extent cx="5760720" cy="2258878"/>
             <wp:effectExtent l="0" t="0" r="0" b="0"/>
             <wp:docPr id="8" name="Picture 8"/>
@@ -9389,7 +9447,11 @@
         <w:t>+0.007755</w:t>
       </w:r>
       <w:r>
-        <w:t xml:space="preserve"> with a bootstrap interval of [0.004424, 0.010549] that excludes zero (permutation p = 0.0625), while extremely randomised trees trail by -0.006459 with an interval of [-0.012391, -0.002263]. This is the only directionally stable model-to-model difference observed under an equal budget in this study.</w:t>
+        <w:t xml:space="preserve"> with a bootstrap interval of [0.004424, 0.010549] that excludes zero (permutation p = 0.0625), while extremely randomised trees trail by -0.006459 with an interval of [-0.012391, -</w:t>
+      </w:r>
+      <w:r>
+        <w:lastRenderedPageBreak/>
+        <w:t>0.002263]. This is the only directionally stable model-to-model difference observed under an equal budget in this study.</w:t>
       </w:r>
     </w:p>
     <w:p>
@@ -9412,11 +9474,7 @@
         <w:t>families</w:t>
       </w:r>
       <w:r>
-        <w:t xml:space="preserve"> are larger: the multilayer perceptron trails the forests by 0.0916 Macro-F1 and extremely randomised trees by 0.0318, both of which exceed the class-</w:t>
-      </w:r>
-      <w:r>
-        <w:lastRenderedPageBreak/>
-        <w:t>prior effect of 0.0725 in the first case. The defensible statement is therefore that aggregation-rule differences are dominated by protocol choices, whereas model-family differences are not.</w:t>
+        <w:t xml:space="preserve"> are larger: the multilayer perceptron trails the forests by 0.0916 Macro-F1 and extremely randomised trees by 0.0318, both of which exceed the class-prior effect of 0.0725 in the first case. The defensible statement is therefore that aggregation-rule differences are dominated by protocol choices, whereas model-family differences are not.</w:t>
       </w:r>
     </w:p>
     <w:p>
@@ -9441,7 +9499,7 @@
           <w:noProof/>
         </w:rPr>
         <w:drawing>
-          <wp:inline distT="0" distB="0" distL="0" distR="0" wp14:anchorId="4186EF62" wp14:editId="709A5B77">
+          <wp:inline distT="0" distB="0" distL="0" distR="0" wp14:anchorId="0EF9EEFD" wp14:editId="255211F7">
             <wp:extent cx="5760720" cy="2516852"/>
             <wp:effectExtent l="0" t="0" r="0" b="0"/>
             <wp:docPr id="9" name="Picture 9"/>
@@ -9538,7 +9596,11 @@
         <w:t>0.3325 to 0.9997</w:t>
       </w:r>
       <w:r>
-        <w:t xml:space="preserve">: Wednesday (DoS/DDoS) 0.3325, Thursday Morning (Web Attack) 0.4314, Friday Afternoon (DDoS) 0.4949 and Tuesday 0.5229, against Monday 0.9975, Thursday Afternoon 0.9975, Friday Morning 0.9997 and Friday Afternoon PortScan 0.9945. The span approaches 0.67. </w:t>
+        <w:t xml:space="preserve">: Wednesday (DoS/DDoS) 0.3325, Thursday Morning (Web Attack) 0.4314, Friday Afternoon (DDoS) 0.4949 and Tuesday 0.5229, against Monday 0.9975, Thursday Afternoon 0.9975, Friday Morning 0.9997 and Friday Afternoon PortScan 0.9945. The span approaches </w:t>
+      </w:r>
+      <w:r>
+        <w:lastRenderedPageBreak/>
+        <w:t xml:space="preserve">0.67. </w:t>
       </w:r>
       <w:r>
         <w:rPr>
@@ -9557,7 +9619,6 @@
     </w:p>
     <w:p>
       <w:r>
-        <w:lastRenderedPageBreak/>
         <w:t>The external benchmarks, the file-level extrapolation and the neural baseline comparison are provided in Supplementary S12-S14 and S19.</w:t>
       </w:r>
     </w:p>
@@ -9578,7 +9639,7 @@
           <w:noProof/>
         </w:rPr>
         <w:drawing>
-          <wp:inline distT="0" distB="0" distL="0" distR="0" wp14:anchorId="6CB3CE67" wp14:editId="49022E18">
+          <wp:inline distT="0" distB="0" distL="0" distR="0" wp14:anchorId="5887F118" wp14:editId="723900AE">
             <wp:extent cx="5760720" cy="2223311"/>
             <wp:effectExtent l="0" t="0" r="0" b="0"/>
             <wp:docPr id="10" name="Picture 10"/>
@@ -9629,6 +9690,11 @@
     </w:p>
     <w:p>
       <w:r>
+        <w:t>Two strands of recent work frame these secondary metrics: uncertainty quantification has been argued to be a trustworthiness requirement for ML-based intrusion detection in its own right [59], and deployment-oriented frameworks now evaluate detectors on transfer and operational cost rather than accuracy alone [60]. The measurements below are reported in that spirit.</w:t>
+      </w:r>
+    </w:p>
+    <w:p>
+      <w:r>
         <w:rPr>
           <w:b/>
         </w:rPr>
@@ -9665,7 +9731,7 @@
         </w:rPr>
         <w:lastRenderedPageBreak/>
         <w:drawing>
-          <wp:inline distT="0" distB="0" distL="0" distR="0" wp14:anchorId="73AF1F1D" wp14:editId="204997EB">
+          <wp:inline distT="0" distB="0" distL="0" distR="0" wp14:anchorId="0FDC00AF" wp14:editId="0612FB97">
             <wp:extent cx="5760720" cy="2538527"/>
             <wp:effectExtent l="0" t="0" r="0" b="0"/>
             <wp:docPr id="11" name="Picture 11"/>
@@ -10634,7 +10700,7 @@
           <w:noProof/>
         </w:rPr>
         <w:drawing>
-          <wp:inline distT="0" distB="0" distL="0" distR="0" wp14:anchorId="4255D9EE" wp14:editId="729644D7">
+          <wp:inline distT="0" distB="0" distL="0" distR="0" wp14:anchorId="214A844F" wp14:editId="42C283DF">
             <wp:extent cx="5760720" cy="1441223"/>
             <wp:effectExtent l="0" t="0" r="0" b="0"/>
             <wp:docPr id="12" name="Picture 12"/>
@@ -12664,10 +12730,10 @@
         <w:t xml:space="preserve"> The conclusions are conditional on CIC-IDS2017 (capped populations and the full deduplicated corpus), NSL-KDD, UNSW-NB15 and N-BaIoT; CIC-IDS2018, CIC-IoT-2023, LITNET-2020, IoT-23, RT-IoT2022, ACI-IoT-2023 and the recent corpora (from UAVIDS-2025 and GeNIS in early 2025 to CTU-IDSEVAL-6, 6TiSCHSet-2026 and the RTN packet table in 2026) were added as extension corpora (Section 5.8) and reproduce the primary comparison. N-BaIoT is saturated for flow-feature classifiers (every model at or above 0.9998 Macro-</w:t>
       </w:r>
       <w:r>
-        <w:t>F1), so it probes the mechanics of the aggregation step rather than discrimination difficulty, and the external datasets remain independent native-label benchmarks rather than transfer tests. None of the seventeen represents production traffic. Pooling the twelve published in 2020 or later gives 120 seed-level comparisons whose 90% interval, [-0.000006, +0.000020] on a mean of +0.000007, lies inside the 0.005 margin - so the equivalence claim does not rest on the 2017 corpus alone. A day-level split of CIC-</w:t>
-      </w:r>
-      <w:r>
-        <w:t>IDS2017 is constructible, but every capture day carries only a subset of the five classes (Monday Normal only; Tuesday Normal and Brute Force; Wednesday Normal and DoS/DDoS; Thursday adds Web Attack; Friday adds Bot), so it is not category-complete: the measured day-holdout Macro-F1 collapses to 0.13-0.32 across the five days, which is what that limitation now quantifies.</w:t>
+        <w:t>F1), so it probes the mechanics of the aggregation step rather than discrimination difficulty, and the external datasets remain independent native-label benchmarks rather than transfer tests. None of the seventeen represents production traffic. The source record of every extension corpus is cited in the reference list [61-73]. Pooling the twelve published in 2020 or later gives 120 seed-level comparisons whose 90% interval, [-0.000006, +0.000020] on a mean of +0.000007, lies inside the 0.005 margin - so the</w:t>
+      </w:r>
+      <w:r>
+        <w:t xml:space="preserve"> equivalence claim does not rest on the 2017 corpus alone. A day-level split of CIC-IDS2017 is constructible, but every capture day carries only a subset of the five classes (Monday Normal only; Tuesday Normal and Brute Force; Wednesday Normal and DoS/DDoS; Thursday adds Web Attack; Friday adds Bot), so it is not category-complete: the measured day-holdout Macro-F1 collapses to 0.13-0.32 across the five days, which is what that limitation now quantifies.</w:t>
       </w:r>
     </w:p>
     <w:p>
@@ -12678,7 +12744,7 @@
         <w:t>Adversarial robustness was not assessed.</w:t>
       </w:r>
       <w:r>
-        <w:t xml:space="preserve"> Only random perturbations and feature masking were applied. No evasion or gradient-based attack was constructed, and the reported degradation figures are not robustness guarantees against an adaptive adversary.</w:t>
+        <w:t xml:space="preserve"> Only random perturbations and feature masking were applied. No evasion or gradient-based attack was constructed, and the reported degradation figures are not robustness guarantees against an adaptive adversary. Evasion attacks designed against ML-based detectors [54] are a different threat model from the label and feature-value corruption measured in S15 and S26.</w:t>
       </w:r>
     </w:p>
     <w:p>
@@ -12715,10 +12781,33 @@
       </w:r>
     </w:p>
     <w:p>
+      <w:r>
+        <w:rPr>
+          <w:b/>
+        </w:rPr>
+        <w:t>The distribution shift tested here is static, not temporal.</w:t>
+      </w:r>
+      <w:r>
+        <w:t xml:space="preserve"> Section 5.10 holds out whole devices and whole runs, which changes the deployment geometry but leaves the time axis untouched. Concept-drift-aware detection [55,56] and continual learning under evolving threats [57] address the temporal case; CIC-IDS2017 cannot support a category-complete temporal protocol, so this remains open by corpus structure rather than by choice.</w:t>
+      </w:r>
+    </w:p>
+    <w:p>
+      <w:r>
+        <w:rPr>
+          <w:b/>
+        </w:rPr>
+        <w:t>Cross-domain adaptation is a model-side response to the same shift.</w:t>
+      </w:r>
+      <w:r>
+        <w:t xml:space="preserve"> Adaptation methods attack distribution shift by changing the model [58]; the source holdouts here measure how much the aggregation rule is affected, not how much adaptation can recover.</w:t>
+      </w:r>
+    </w:p>
+    <w:p>
       <w:pPr>
         <w:pStyle w:val="1"/>
       </w:pPr>
       <w:r>
+        <w:lastRenderedPageBreak/>
         <w:t>7. Conclusion</w:t>
       </w:r>
     </w:p>
@@ -12735,11 +12824,7 @@
         <w:t>First, relative to the most direct equal-weight control the gain lies inside an equivalence boundary.</w:t>
       </w:r>
       <w:r>
-        <w:t xml:space="preserve"> Averaged over ten seeds on the natural-prior population of CIC-IDS2017, the Macro-F1 difference between conditional weighting and an equal-weight chi-square forest is -0.000456, with the per-seed sign split five to five. Against the equal-weight fusion of those same four experts the gated model changes one label in 79,860 test predictions (-</w:t>
-      </w:r>
-      <w:r>
-        <w:lastRenderedPageBreak/>
-        <w:t>0.000010), which locates the single-view gap in the composition of the ensemble rather than in the gate. Both the seed-level 90% interval [-0.00112, +0.00021] and the t</w:t>
+        <w:t xml:space="preserve"> Averaged over ten seeds on the natural-prior population of CIC-IDS2017, the Macro-F1 difference between conditional weighting and an equal-weight chi-square forest is -0.000456, with the per-seed sign split five to five. Against the equal-weight fusion of those same four experts the gated model changes one label in 79,860 test predictions (-0.000010), which locates the single-view gap in the composition of the ensemble rather than in the gate. Both the seed-level 90% interval [-0.00112, +0.00021] and the t</w:t>
       </w:r>
       <w:r>
         <w:t>est-row paired bootstrap interval [-0.00425, +0.00338] lie inside equivalence margins of 0.005 and 0.01. The four experts disagree on 0.15%-0.66% of test rows, yet the gate matches equal voting on all but one of 79,860 predictions; weight entropy is 0.99998. The cost is about an 80-fold increase in training time and a fivefold increase in batch inference time (ten-seed means, Table 4(a)).</w:t>
@@ -12798,7 +12883,11 @@
         <w:t>The principal contribution is not a new state-of-the-art classifier but a reusable leakage-controlled protocol, a set of falsifiable identifiability boundaries, and a quantitative map that separates protocol effects from aggregation-rule effects. Three directions follow. First, design weighting mechanisms that explicitly enforce expert decorrelation, and test whether the gain is restored once the premise of Condition 1 is broken. Second, construct category-complete temporal or cross-scenario protocols so th</w:t>
       </w:r>
       <w:r>
-        <w:t>at file-level coverage analysis can be upgraded into a genuine external-validity test. Third, turn the reporting recommendations of Section 6.4 into an automatically checkable checklist, so that the evaluation protocol itself becomes a verifiable object. The recommendations extend those of [22].</w:t>
+        <w:t xml:space="preserve">at file-level coverage analysis can be upgraded into a genuine external-validity test. Third, turn the reporting recommendations of Section 6.4 into an automatically checkable </w:t>
+      </w:r>
+      <w:r>
+        <w:lastRenderedPageBreak/>
+        <w:t>checklist, so that the evaluation protocol itself becomes a verifiable object. The recommendations extend those of [22].</w:t>
       </w:r>
     </w:p>
     <w:p>
@@ -12819,7 +12908,6 @@
         <w:pStyle w:val="1"/>
       </w:pPr>
       <w:r>
-        <w:lastRenderedPageBreak/>
         <w:t>Funding</w:t>
       </w:r>
     </w:p>
@@ -12834,6 +12922,17 @@
       </w:pPr>
       <w:r>
         <w:t>Declaration of competing interest</w:t>
+      </w:r>
+    </w:p>
+    <w:p>
+      <w:r>
+        <w:rPr>
+          <w:b/>
+        </w:rPr>
+        <w:t>The most direct extension is a member-side test.</w:t>
+      </w:r>
+      <w:r>
+        <w:t xml:space="preserve"> Placing experts from the current model families - transformers, large language models and graph networks [51,52] - inside the mutually exclusive regime identified in Section 5.10, and repeating the same-members control there, would test the identifiability conditions on the architectures that dominate current work; those conditions predict when such members will and will not change the aggregation-rule conclusion.</w:t>
       </w:r>
     </w:p>
     <w:p>
@@ -12925,6 +13024,7 @@
         </w:numPr>
       </w:pPr>
       <w:r>
+        <w:lastRenderedPageBreak/>
         <w:t>Chen T, Guestrin C. XGBoost: A scalable tree boosting system. KDD 2016: 785-794. DOI:10.1145/2939672.2939785.</w:t>
       </w:r>
     </w:p>
@@ -13021,7 +13121,6 @@
         </w:numPr>
       </w:pPr>
       <w:r>
-        <w:lastRenderedPageBreak/>
         <w:t>Liu H, Setiono R. Chi2: Feature selection and discretization of numeric attributes. ICTAI 1995: 388-391. DOI:10.1109/TAI.1995.479783.</w:t>
       </w:r>
     </w:p>
@@ -13178,6 +13277,7 @@
         </w:numPr>
       </w:pPr>
       <w:r>
+        <w:lastRenderedPageBreak/>
         <w:t>Khraisat A, Gondal I, Vamplew P, Kamruzzaman J. Survey of intrusion detection systems: Techniques, datasets and challenges. Cybersecurity, 2019, 2: 20. DOI:10.1186/s42400-019-0038-7.</w:t>
       </w:r>
     </w:p>
@@ -13262,7 +13362,6 @@
         </w:numPr>
       </w:pPr>
       <w:r>
-        <w:lastRenderedPageBreak/>
         <w:t>Angelopoulos A N, Bates S. Conformal prediction: A gentle introduction. Foundations and Trends in Machine Learning, 2023, 16(4): 494-591. DOI:10.1561/2200000101.</w:t>
       </w:r>
     </w:p>
@@ -13443,7 +13542,321 @@
         </w:numPr>
       </w:pPr>
       <w:r>
+        <w:lastRenderedPageBreak/>
         <w:t>Hunter J D. Matplotlib: A 2D graphics environment. Computing in Science &amp; Engineering, 2007, 9(3): 90-95. DOI:10.1109/MCSE.2007.55.</w:t>
+      </w:r>
+    </w:p>
+    <w:p>
+      <w:pPr>
+        <w:pStyle w:val="a"/>
+        <w:numPr>
+          <w:ilvl w:val="0"/>
+          <w:numId w:val="17"/>
+        </w:numPr>
+      </w:pPr>
+      <w:r>
+        <w:t>Arp D, Quiring E, Pendlebury F, et al. Pitfalls in machine learning for computer security. Communications of the ACM, 2024. DOI:10.1145/3643456.</w:t>
+      </w:r>
+    </w:p>
+    <w:p>
+      <w:pPr>
+        <w:pStyle w:val="a"/>
+        <w:numPr>
+          <w:ilvl w:val="0"/>
+          <w:numId w:val="17"/>
+        </w:numPr>
+      </w:pPr>
+      <w:r>
+        <w:t>Layeghy S, Portmann M. Benchmarking the benchmark - Comparing synthetic and real-world Network IDS datasets. Journal of Information Security and Applications, 2024. DOI:10.1016/j.jisa.2023.103689.</w:t>
+      </w:r>
+    </w:p>
+    <w:p>
+      <w:pPr>
+        <w:pStyle w:val="a"/>
+        <w:numPr>
+          <w:ilvl w:val="0"/>
+          <w:numId w:val="17"/>
+        </w:numPr>
+      </w:pPr>
+      <w:r>
+        <w:t>Rosenblatt M, et al. Data leakage inflates prediction performance in connectome-based machine learning models. Nature Communications, 2024. DOI:10.1038/s41467-024-46150-w.</w:t>
+      </w:r>
+    </w:p>
+    <w:p>
+      <w:pPr>
+        <w:pStyle w:val="a"/>
+        <w:numPr>
+          <w:ilvl w:val="0"/>
+          <w:numId w:val="17"/>
+        </w:numPr>
+      </w:pPr>
+      <w:r>
+        <w:t>Kheddar H, et al. Transformers and large language models for efficient intrusion detection systems: A comprehensive survey. Information Fusion, 2025. DOI:10.1016/j.inffus.2025.103347.</w:t>
+      </w:r>
+    </w:p>
+    <w:p>
+      <w:pPr>
+        <w:pStyle w:val="a"/>
+        <w:numPr>
+          <w:ilvl w:val="0"/>
+          <w:numId w:val="17"/>
+        </w:numPr>
+      </w:pPr>
+      <w:r>
+        <w:t>Zhong M, et al. A survey on graph neural networks for intrusion detection systems: Methods, trends and challenges. Computers &amp; Security, 2024. DOI:10.1016/j.cose.2024.103821.</w:t>
+      </w:r>
+    </w:p>
+    <w:p>
+      <w:pPr>
+        <w:pStyle w:val="a"/>
+        <w:numPr>
+          <w:ilvl w:val="0"/>
+          <w:numId w:val="17"/>
+        </w:numPr>
+      </w:pPr>
+      <w:r>
+        <w:t>Garrido-Labrador J L, et al. Ensemble methods and semi-supervised learning for information fusion: A review and future research directions. Information Fusion, 2024. DOI:10.1016/j.inffus.2024.102310.</w:t>
+      </w:r>
+    </w:p>
+    <w:p>
+      <w:pPr>
+        <w:pStyle w:val="a"/>
+        <w:numPr>
+          <w:ilvl w:val="0"/>
+          <w:numId w:val="17"/>
+        </w:numPr>
+      </w:pPr>
+      <w:r>
+        <w:t>Zhang H, et al. Explainable and transferable adversarial attack for ML-based network intrusion detectors. IEEE Transactions on Dependable and Secure Computing, 2025. DOI:10.1109/TDSC.2025.3560486.</w:t>
+      </w:r>
+    </w:p>
+    <w:p>
+      <w:pPr>
+        <w:pStyle w:val="a"/>
+        <w:numPr>
+          <w:ilvl w:val="0"/>
+          <w:numId w:val="17"/>
+        </w:numPr>
+      </w:pPr>
+      <w:r>
+        <w:t>Komarchesqui M, et al. A comprehensive survey on concept-drift-resilient network intrusion detection systems. IEEE Access, 2026. DOI:10.1109/ACCESS.2026.3691262.</w:t>
+      </w:r>
+    </w:p>
+    <w:p>
+      <w:pPr>
+        <w:pStyle w:val="a"/>
+        <w:numPr>
+          <w:ilvl w:val="0"/>
+          <w:numId w:val="17"/>
+        </w:numPr>
+      </w:pPr>
+      <w:r>
+        <w:t>De Paola A, et al. HOIDS: Concept drift aware hybrid online intrusion detection system. Journal of Network and Computer Applications, 2026. DOI:10.1016/j.jnca.2026.104556.</w:t>
+      </w:r>
+    </w:p>
+    <w:p>
+      <w:pPr>
+        <w:pStyle w:val="a"/>
+        <w:numPr>
+          <w:ilvl w:val="0"/>
+          <w:numId w:val="17"/>
+        </w:numPr>
+      </w:pPr>
+      <w:r>
+        <w:t>Guo C, et al. Continual learning for intrusion detection under evolving network threats. Future Internet, 2025. DOI:10.3390/fi17100456.</w:t>
+      </w:r>
+    </w:p>
+    <w:p>
+      <w:pPr>
+        <w:pStyle w:val="a"/>
+        <w:numPr>
+          <w:ilvl w:val="0"/>
+          <w:numId w:val="17"/>
+        </w:numPr>
+      </w:pPr>
+      <w:r>
+        <w:t>Chen Y, et al. Causal inference-based adversarial domain adaptation for cross-domain industrial intrusion detection. IEEE Transactions on Industrial Informatics, 2024. DOI:10.1109/TII.2024.3470902.</w:t>
+      </w:r>
+    </w:p>
+    <w:p>
+      <w:pPr>
+        <w:pStyle w:val="a"/>
+        <w:numPr>
+          <w:ilvl w:val="0"/>
+          <w:numId w:val="17"/>
+        </w:numPr>
+      </w:pPr>
+      <w:r>
+        <w:t>Talpini J, et al. Enhancing trustworthiness in ML-based network intrusion detection with uncertainty quantification. Journal of Reliable Intelligent Environments, 2024. DOI:10.1007/s40860-024-00238-8.</w:t>
+      </w:r>
+    </w:p>
+    <w:p>
+      <w:pPr>
+        <w:pStyle w:val="a"/>
+        <w:numPr>
+          <w:ilvl w:val="0"/>
+          <w:numId w:val="17"/>
+        </w:numPr>
+      </w:pPr>
+      <w:r>
+        <w:t>Ha Thanh D, et al. A transfer-aware, deployment-oriented evaluation framework for NetFlow-based intrusion detection systems. PLoS ONE, 2026. DOI:10.1371/journal.pone.0346801.</w:t>
+      </w:r>
+    </w:p>
+    <w:p>
+      <w:pPr>
+        <w:pStyle w:val="a"/>
+        <w:numPr>
+          <w:ilvl w:val="0"/>
+          <w:numId w:val="17"/>
+        </w:numPr>
+      </w:pPr>
+      <w:r>
+        <w:t>Neto E C P, Dadkhah S, Ferreira R, et al. CICIoT2023: A real-time dataset and benchmark for large-scale attacks in IoT environment. Sensors, 2023. DOI:10.3390/s23135941.</w:t>
+      </w:r>
+    </w:p>
+    <w:p>
+      <w:pPr>
+        <w:pStyle w:val="a"/>
+        <w:numPr>
+          <w:ilvl w:val="0"/>
+          <w:numId w:val="17"/>
+        </w:numPr>
+      </w:pPr>
+      <w:r>
+        <w:t>Damasevicius R, Venckauskas A, Toldinas J, et al. LITNET-2020: An annotated real-world network flow dataset for network intrusion detection. Electronics, 2020. DOI:10.3390/electronics9050800.</w:t>
+      </w:r>
+    </w:p>
+    <w:p>
+      <w:pPr>
+        <w:pStyle w:val="a"/>
+        <w:numPr>
+          <w:ilvl w:val="0"/>
+          <w:numId w:val="17"/>
+        </w:numPr>
+      </w:pPr>
+      <w:r>
+        <w:t>Garcia S, Parmisano A, Erquiaga M J. IoT-23: A labeled dataset with malicious and benign IoT network traffic. Zenodo, 2020. DOI:10.5281/zenodo.4743746.</w:t>
+      </w:r>
+    </w:p>
+    <w:p>
+      <w:pPr>
+        <w:pStyle w:val="a"/>
+        <w:numPr>
+          <w:ilvl w:val="0"/>
+          <w:numId w:val="17"/>
+        </w:numPr>
+      </w:pPr>
+      <w:r>
+        <w:t>Rohini Nagapadma B S. RT-IoT2022 [dataset]. UCI Machine Learning Repository, 2023. DOI:10.24432/C5P338.</w:t>
+      </w:r>
+    </w:p>
+    <w:p>
+      <w:pPr>
+        <w:pStyle w:val="a"/>
+        <w:numPr>
+          <w:ilvl w:val="0"/>
+          <w:numId w:val="17"/>
+        </w:numPr>
+      </w:pPr>
+      <w:r>
+        <w:t>Zeng Q, Bashir A, Nait-Abdesselam F. UAVIDS-2025: A benchmark dataset for intrusion detection in UAV networks using machine learning techniques. Zenodo, 2025. DOI:10.5281/zenodo.15336998.</w:t>
+      </w:r>
+    </w:p>
+    <w:p>
+      <w:pPr>
+        <w:pStyle w:val="a"/>
+        <w:numPr>
+          <w:ilvl w:val="0"/>
+          <w:numId w:val="17"/>
+        </w:numPr>
+      </w:pPr>
+      <w:r>
+        <w:t>Silva M, Pinto D, Vitorino J, et al. GeNIS: GECAD network intrusion scenarios. Zenodo, 2025. DOI:10.5281/zenodo.14919237.</w:t>
+      </w:r>
+    </w:p>
+    <w:p>
+      <w:pPr>
+        <w:pStyle w:val="a"/>
+        <w:numPr>
+          <w:ilvl w:val="0"/>
+          <w:numId w:val="17"/>
+        </w:numPr>
+      </w:pPr>
+      <w:r>
+        <w:t>Panigrahi R, Borah S. IDS2025 (balanced intrusion detection evaluation dataset) [dataset]. Mendeley Data, 2025. DOI:10.17632/pkskt3fv3v.</w:t>
+      </w:r>
+    </w:p>
+    <w:p>
+      <w:pPr>
+        <w:pStyle w:val="a"/>
+        <w:numPr>
+          <w:ilvl w:val="0"/>
+          <w:numId w:val="17"/>
+        </w:numPr>
+      </w:pPr>
+      <w:r>
+        <w:lastRenderedPageBreak/>
+        <w:t>Belarbi O, Spyridopoulos T, Anthi E, et al. A device-level IoT network traffic dataset with distributed capture and non-IID characteristics (Gotham-2025). Zenodo, 2025. DOI:10.5281/zenodo.14502760.</w:t>
+      </w:r>
+    </w:p>
+    <w:p>
+      <w:pPr>
+        <w:pStyle w:val="a"/>
+        <w:numPr>
+          <w:ilvl w:val="0"/>
+          <w:numId w:val="17"/>
+        </w:numPr>
+      </w:pPr>
+      <w:r>
+        <w:t>Garcia S, Valeros V, Alya G. CTU-IDSEVAL-6: A labeled network dataset for the evaluation of intrusion detection systems. Zenodo, 2026. DOI:10.5281/zenodo.21027042.</w:t>
+      </w:r>
+    </w:p>
+    <w:p>
+      <w:pPr>
+        <w:pStyle w:val="a"/>
+        <w:numPr>
+          <w:ilvl w:val="0"/>
+          <w:numId w:val="17"/>
+        </w:numPr>
+      </w:pPr>
+      <w:r>
+        <w:t>Aydin B, Aydin H, Jin Y, et al. 6TiSCHSet-2026: A multi-layer 6TiSCH attack dataset and leakage-aware IDS benchmark. Zenodo, 2026. DOI:10.5281/zenodo.22113022.</w:t>
+      </w:r>
+    </w:p>
+    <w:p>
+      <w:pPr>
+        <w:pStyle w:val="a"/>
+        <w:numPr>
+          <w:ilvl w:val="0"/>
+          <w:numId w:val="17"/>
+        </w:numPr>
+      </w:pPr>
+      <w:r>
+        <w:t>Chaudhari R, Deshpande M. Real-time network traffic dataset for IDS (RTN) [dataset]. Zenodo, 2026. DOI:10.5281/zenodo.18910837.</w:t>
+      </w:r>
+    </w:p>
+    <w:p>
+      <w:pPr>
+        <w:pStyle w:val="a"/>
+        <w:numPr>
+          <w:ilvl w:val="0"/>
+          <w:numId w:val="17"/>
+        </w:numPr>
+      </w:pPr>
+      <w:r>
+        <w:t>Canadian Institute for Cybersecurity. CSE-CIC-IDS2018 [dataset]. University of New Brunswick, 2018. https://www.unb.ca/cic/datasets/ids-2018.html (no DOI).</w:t>
+      </w:r>
+    </w:p>
+    <w:p>
+      <w:pPr>
+        <w:pStyle w:val="a"/>
+        <w:numPr>
+          <w:ilvl w:val="0"/>
+          <w:numId w:val="17"/>
+        </w:numPr>
+      </w:pPr>
+      <w:r>
+        <w:t>ACI-IoT-2023 [dataset]. Hugging Face dataset knhn1004/aci-iot-2023-processed, 2023. https://huggingface.co/datasets/knhn1004/aci-iot-2023-processed (no DOI).</w:t>
       </w:r>
     </w:p>
     <w:p>
@@ -13793,7 +14206,6 @@
               <w:rPr>
                 <w:sz w:val="16"/>
               </w:rPr>
-              <w:lastRenderedPageBreak/>
               <w:t>S09</w:t>
             </w:r>
           </w:p>
@@ -14440,6 +14852,7 @@
               <w:rPr>
                 <w:sz w:val="16"/>
               </w:rPr>
+              <w:lastRenderedPageBreak/>
               <w:t>S28</w:t>
             </w:r>
           </w:p>
@@ -14491,40 +14904,6 @@
                 <w:sz w:val="16"/>
               </w:rPr>
               <w:t>Full-corpus run: 2,429,503 flows, per-seed metrics and paired comparison</w:t>
-            </w:r>
-          </w:p>
-        </w:tc>
-      </w:tr>
-      <w:tr>
-        <w:tc>
-          <w:tcPr>
-            <w:tcW w:w="4896" w:type="dxa"/>
-          </w:tcPr>
-          <w:p>
-            <w:pPr>
-              <w:spacing w:after="0"/>
-            </w:pPr>
-            <w:r>
-              <w:rPr>
-                <w:sz w:val="16"/>
-              </w:rPr>
-              <w:t>S30</w:t>
-            </w:r>
-          </w:p>
-        </w:tc>
-        <w:tc>
-          <w:tcPr>
-            <w:tcW w:w="4896" w:type="dxa"/>
-          </w:tcPr>
-          <w:p>
-            <w:pPr>
-              <w:spacing w:after="0"/>
-            </w:pPr>
-            <w:r>
-              <w:rPr>
-                <w:sz w:val="16"/>
-              </w:rPr>
-              <w:t>Open-set diagnostics: three held-out unknown families, per seed and per probability export</w:t>
             </w:r>
           </w:p>
         </w:tc>
@@ -14803,76 +15182,76 @@
       </w:rPr>
     </w:lvl>
   </w:abstractNum>
-  <w:num w:numId="1" w16cid:durableId="2065789710">
+  <w:num w:numId="1" w16cid:durableId="1869099068">
     <w:abstractNumId w:val="8"/>
   </w:num>
-  <w:num w:numId="2" w16cid:durableId="589243444">
+  <w:num w:numId="2" w16cid:durableId="688221213">
     <w:abstractNumId w:val="6"/>
   </w:num>
-  <w:num w:numId="3" w16cid:durableId="2136170775">
+  <w:num w:numId="3" w16cid:durableId="822161197">
     <w:abstractNumId w:val="5"/>
   </w:num>
-  <w:num w:numId="4" w16cid:durableId="2116434546">
+  <w:num w:numId="4" w16cid:durableId="464012042">
     <w:abstractNumId w:val="4"/>
   </w:num>
-  <w:num w:numId="5" w16cid:durableId="368073842">
+  <w:num w:numId="5" w16cid:durableId="1729376362">
     <w:abstractNumId w:val="7"/>
   </w:num>
-  <w:num w:numId="6" w16cid:durableId="1976830506">
+  <w:num w:numId="6" w16cid:durableId="2001544975">
     <w:abstractNumId w:val="3"/>
   </w:num>
-  <w:num w:numId="7" w16cid:durableId="1021979930">
+  <w:num w:numId="7" w16cid:durableId="1239168806">
     <w:abstractNumId w:val="2"/>
   </w:num>
-  <w:num w:numId="8" w16cid:durableId="1265966802">
+  <w:num w:numId="8" w16cid:durableId="1956597845">
     <w:abstractNumId w:val="1"/>
   </w:num>
-  <w:num w:numId="9" w16cid:durableId="620500153">
+  <w:num w:numId="9" w16cid:durableId="1272934990">
     <w:abstractNumId w:val="0"/>
   </w:num>
-  <w:num w:numId="10" w16cid:durableId="1684088386">
+  <w:num w:numId="10" w16cid:durableId="1473599849">
     <w:abstractNumId w:val="7"/>
     <w:lvlOverride w:ilvl="0">
       <w:startOverride w:val="1"/>
     </w:lvlOverride>
   </w:num>
-  <w:num w:numId="11" w16cid:durableId="1280645738">
+  <w:num w:numId="11" w16cid:durableId="1278218190">
     <w:abstractNumId w:val="7"/>
     <w:lvlOverride w:ilvl="0">
       <w:startOverride w:val="1"/>
     </w:lvlOverride>
   </w:num>
-  <w:num w:numId="12" w16cid:durableId="207768885">
+  <w:num w:numId="12" w16cid:durableId="90397007">
     <w:abstractNumId w:val="7"/>
     <w:lvlOverride w:ilvl="0">
       <w:startOverride w:val="1"/>
     </w:lvlOverride>
   </w:num>
-  <w:num w:numId="13" w16cid:durableId="1047026116">
+  <w:num w:numId="13" w16cid:durableId="1777018565">
     <w:abstractNumId w:val="7"/>
     <w:lvlOverride w:ilvl="0">
       <w:startOverride w:val="1"/>
     </w:lvlOverride>
   </w:num>
-  <w:num w:numId="14" w16cid:durableId="1230771683">
+  <w:num w:numId="14" w16cid:durableId="2036535567">
     <w:abstractNumId w:val="7"/>
     <w:lvlOverride w:ilvl="0">
       <w:startOverride w:val="1"/>
     </w:lvlOverride>
   </w:num>
-  <w:num w:numId="15" w16cid:durableId="865172678">
+  <w:num w:numId="15" w16cid:durableId="1771511748">
     <w:abstractNumId w:val="7"/>
     <w:lvlOverride w:ilvl="0">
       <w:startOverride w:val="1"/>
     </w:lvlOverride>
   </w:num>
-  <w:num w:numId="16" w16cid:durableId="118688597">
+  <w:num w:numId="16" w16cid:durableId="47337416">
     <w:abstractNumId w:val="7"/>
     <w:lvlOverride w:ilvl="0">
       <w:startOverride w:val="1"/>
     </w:lvlOverride>
   </w:num>
-  <w:num w:numId="17" w16cid:durableId="278298157">
+  <w:num w:numId="17" w16cid:durableId="1123841693">
     <w:abstractNumId w:val="7"/>
     <w:lvlOverride w:ilvl="0">
       <w:startOverride w:val="1"/>

</xml_diff>

<commit_message>
Round 20bq: re-check pass - DOI re-verification of all 24 new references (22 by registry lookup, 2 IEEE via doi.org content negotiation), literature round recorded in the review report with a correction to the stale ordering claim; 53-check gate green
</commit_message>
<xml_diff>
--- a/重构版论文_v4_20260915/English_SCI_Manuscript_v4.docx
+++ b/重构版论文_v4_20260915/English_SCI_Manuscript_v4.docx
@@ -1090,7 +1090,7 @@
           <w:noProof/>
         </w:rPr>
         <w:drawing>
-          <wp:inline distT="0" distB="0" distL="0" distR="0" wp14:anchorId="07DE6561" wp14:editId="79E3DE33">
+          <wp:inline distT="0" distB="0" distL="0" distR="0" wp14:anchorId="24737BE5" wp14:editId="7D64D262">
             <wp:extent cx="5760720" cy="2734826"/>
             <wp:effectExtent l="0" t="0" r="0" b="0"/>
             <wp:docPr id="1" name="Picture 1"/>
@@ -2470,7 +2470,7 @@
           <w:noProof/>
         </w:rPr>
         <w:drawing>
-          <wp:inline distT="0" distB="0" distL="0" distR="0" wp14:anchorId="35D051EC" wp14:editId="13E3AD45">
+          <wp:inline distT="0" distB="0" distL="0" distR="0" wp14:anchorId="1FE803C6" wp14:editId="22E5744F">
             <wp:extent cx="5760720" cy="2722098"/>
             <wp:effectExtent l="0" t="0" r="0" b="0"/>
             <wp:docPr id="2" name="Picture 2"/>
@@ -3472,7 +3472,7 @@
           <w:noProof/>
         </w:rPr>
         <w:drawing>
-          <wp:inline distT="0" distB="0" distL="0" distR="0" wp14:anchorId="207ADE13" wp14:editId="24A6469C">
+          <wp:inline distT="0" distB="0" distL="0" distR="0" wp14:anchorId="57ABC913" wp14:editId="744DB797">
             <wp:extent cx="5760720" cy="3482709"/>
             <wp:effectExtent l="0" t="0" r="0" b="0"/>
             <wp:docPr id="3" name="Picture 3"/>
@@ -4821,7 +4821,6 @@
     </w:p>
     <w:p>
       <w:r>
-        <w:lastRenderedPageBreak/>
         <w:t>which approaches 1 in that limit.</w:t>
       </w:r>
     </w:p>
@@ -7266,7 +7265,7 @@
           <w:noProof/>
         </w:rPr>
         <w:drawing>
-          <wp:inline distT="0" distB="0" distL="0" distR="0" wp14:anchorId="19EFA1FF" wp14:editId="19266684">
+          <wp:inline distT="0" distB="0" distL="0" distR="0" wp14:anchorId="648905F4" wp14:editId="77B64345">
             <wp:extent cx="5760720" cy="2356272"/>
             <wp:effectExtent l="0" t="0" r="0" b="0"/>
             <wp:docPr id="4" name="Picture 4"/>
@@ -8226,7 +8225,7 @@
           <w:noProof/>
         </w:rPr>
         <w:drawing>
-          <wp:inline distT="0" distB="0" distL="0" distR="0" wp14:anchorId="7137963D" wp14:editId="7C8B9C84">
+          <wp:inline distT="0" distB="0" distL="0" distR="0" wp14:anchorId="263FA1E8" wp14:editId="72331439">
             <wp:extent cx="5760720" cy="2045294"/>
             <wp:effectExtent l="0" t="0" r="0" b="0"/>
             <wp:docPr id="5" name="Picture 5"/>
@@ -8404,7 +8403,7 @@
           <w:noProof/>
         </w:rPr>
         <w:drawing>
-          <wp:inline distT="0" distB="0" distL="0" distR="0" wp14:anchorId="1300659F" wp14:editId="11474D5F">
+          <wp:inline distT="0" distB="0" distL="0" distR="0" wp14:anchorId="2C9BD1D5" wp14:editId="70CDAD6B">
             <wp:extent cx="5760720" cy="2308234"/>
             <wp:effectExtent l="0" t="0" r="0" b="0"/>
             <wp:docPr id="6" name="Picture 6"/>
@@ -9136,7 +9135,7 @@
           <w:noProof/>
         </w:rPr>
         <w:drawing>
-          <wp:inline distT="0" distB="0" distL="0" distR="0" wp14:anchorId="776FE95C" wp14:editId="1B5862F0">
+          <wp:inline distT="0" distB="0" distL="0" distR="0" wp14:anchorId="1D82E84B" wp14:editId="421659FD">
             <wp:extent cx="5760720" cy="2167923"/>
             <wp:effectExtent l="0" t="0" r="0" b="0"/>
             <wp:docPr id="7" name="Picture 7"/>
@@ -9315,7 +9314,7 @@
           <w:noProof/>
         </w:rPr>
         <w:drawing>
-          <wp:inline distT="0" distB="0" distL="0" distR="0" wp14:anchorId="28D8560C" wp14:editId="0E69E16E">
+          <wp:inline distT="0" distB="0" distL="0" distR="0" wp14:anchorId="6E872975" wp14:editId="524E5295">
             <wp:extent cx="5760720" cy="2258878"/>
             <wp:effectExtent l="0" t="0" r="0" b="0"/>
             <wp:docPr id="8" name="Picture 8"/>
@@ -9499,7 +9498,7 @@
           <w:noProof/>
         </w:rPr>
         <w:drawing>
-          <wp:inline distT="0" distB="0" distL="0" distR="0" wp14:anchorId="0EF9EEFD" wp14:editId="255211F7">
+          <wp:inline distT="0" distB="0" distL="0" distR="0" wp14:anchorId="21C2F952" wp14:editId="4FE37470">
             <wp:extent cx="5760720" cy="2516852"/>
             <wp:effectExtent l="0" t="0" r="0" b="0"/>
             <wp:docPr id="9" name="Picture 9"/>
@@ -9639,7 +9638,7 @@
           <w:noProof/>
         </w:rPr>
         <w:drawing>
-          <wp:inline distT="0" distB="0" distL="0" distR="0" wp14:anchorId="5887F118" wp14:editId="723900AE">
+          <wp:inline distT="0" distB="0" distL="0" distR="0" wp14:anchorId="63F6C89F" wp14:editId="0D7B7719">
             <wp:extent cx="5760720" cy="2223311"/>
             <wp:effectExtent l="0" t="0" r="0" b="0"/>
             <wp:docPr id="10" name="Picture 10"/>
@@ -9731,7 +9730,7 @@
         </w:rPr>
         <w:lastRenderedPageBreak/>
         <w:drawing>
-          <wp:inline distT="0" distB="0" distL="0" distR="0" wp14:anchorId="0FDC00AF" wp14:editId="0612FB97">
+          <wp:inline distT="0" distB="0" distL="0" distR="0" wp14:anchorId="5494ACCF" wp14:editId="66B659EA">
             <wp:extent cx="5760720" cy="2538527"/>
             <wp:effectExtent l="0" t="0" r="0" b="0"/>
             <wp:docPr id="11" name="Picture 11"/>
@@ -10700,7 +10699,7 @@
           <w:noProof/>
         </w:rPr>
         <w:drawing>
-          <wp:inline distT="0" distB="0" distL="0" distR="0" wp14:anchorId="214A844F" wp14:editId="42C283DF">
+          <wp:inline distT="0" distB="0" distL="0" distR="0" wp14:anchorId="7CA4423E" wp14:editId="448E355E">
             <wp:extent cx="5760720" cy="1441223"/>
             <wp:effectExtent l="0" t="0" r="0" b="0"/>
             <wp:docPr id="12" name="Picture 12"/>
@@ -15182,76 +15181,76 @@
       </w:rPr>
     </w:lvl>
   </w:abstractNum>
-  <w:num w:numId="1" w16cid:durableId="1869099068">
+  <w:num w:numId="1" w16cid:durableId="101920558">
     <w:abstractNumId w:val="8"/>
   </w:num>
-  <w:num w:numId="2" w16cid:durableId="688221213">
+  <w:num w:numId="2" w16cid:durableId="1166046762">
     <w:abstractNumId w:val="6"/>
   </w:num>
-  <w:num w:numId="3" w16cid:durableId="822161197">
+  <w:num w:numId="3" w16cid:durableId="920528614">
     <w:abstractNumId w:val="5"/>
   </w:num>
-  <w:num w:numId="4" w16cid:durableId="464012042">
+  <w:num w:numId="4" w16cid:durableId="804273346">
     <w:abstractNumId w:val="4"/>
   </w:num>
-  <w:num w:numId="5" w16cid:durableId="1729376362">
+  <w:num w:numId="5" w16cid:durableId="123543941">
     <w:abstractNumId w:val="7"/>
   </w:num>
-  <w:num w:numId="6" w16cid:durableId="2001544975">
+  <w:num w:numId="6" w16cid:durableId="1656182490">
     <w:abstractNumId w:val="3"/>
   </w:num>
-  <w:num w:numId="7" w16cid:durableId="1239168806">
+  <w:num w:numId="7" w16cid:durableId="616372415">
     <w:abstractNumId w:val="2"/>
   </w:num>
-  <w:num w:numId="8" w16cid:durableId="1956597845">
+  <w:num w:numId="8" w16cid:durableId="1530727678">
     <w:abstractNumId w:val="1"/>
   </w:num>
-  <w:num w:numId="9" w16cid:durableId="1272934990">
+  <w:num w:numId="9" w16cid:durableId="735126705">
     <w:abstractNumId w:val="0"/>
   </w:num>
-  <w:num w:numId="10" w16cid:durableId="1473599849">
+  <w:num w:numId="10" w16cid:durableId="22562653">
     <w:abstractNumId w:val="7"/>
     <w:lvlOverride w:ilvl="0">
       <w:startOverride w:val="1"/>
     </w:lvlOverride>
   </w:num>
-  <w:num w:numId="11" w16cid:durableId="1278218190">
+  <w:num w:numId="11" w16cid:durableId="140780208">
     <w:abstractNumId w:val="7"/>
     <w:lvlOverride w:ilvl="0">
       <w:startOverride w:val="1"/>
     </w:lvlOverride>
   </w:num>
-  <w:num w:numId="12" w16cid:durableId="90397007">
+  <w:num w:numId="12" w16cid:durableId="143939194">
     <w:abstractNumId w:val="7"/>
     <w:lvlOverride w:ilvl="0">
       <w:startOverride w:val="1"/>
     </w:lvlOverride>
   </w:num>
-  <w:num w:numId="13" w16cid:durableId="1777018565">
+  <w:num w:numId="13" w16cid:durableId="36585929">
     <w:abstractNumId w:val="7"/>
     <w:lvlOverride w:ilvl="0">
       <w:startOverride w:val="1"/>
     </w:lvlOverride>
   </w:num>
-  <w:num w:numId="14" w16cid:durableId="2036535567">
+  <w:num w:numId="14" w16cid:durableId="1860779729">
     <w:abstractNumId w:val="7"/>
     <w:lvlOverride w:ilvl="0">
       <w:startOverride w:val="1"/>
     </w:lvlOverride>
   </w:num>
-  <w:num w:numId="15" w16cid:durableId="1771511748">
+  <w:num w:numId="15" w16cid:durableId="1161388772">
     <w:abstractNumId w:val="7"/>
     <w:lvlOverride w:ilvl="0">
       <w:startOverride w:val="1"/>
     </w:lvlOverride>
   </w:num>
-  <w:num w:numId="16" w16cid:durableId="47337416">
+  <w:num w:numId="16" w16cid:durableId="1509251244">
     <w:abstractNumId w:val="7"/>
     <w:lvlOverride w:ilvl="0">
       <w:startOverride w:val="1"/>
     </w:lvlOverride>
   </w:num>
-  <w:num w:numId="17" w16cid:durableId="1123841693">
+  <w:num w:numId="17" w16cid:durableId="828054128">
     <w:abstractNumId w:val="7"/>
     <w:lvlOverride w:ilvl="0">
       <w:startOverride w:val="1"/>

</xml_diff>

<commit_message>
Round 20br: full repackage - supplementary bundle and mirror reassembled, tables/text exports refreshed, submission bundle 919 files, full research archive rebuilt (v1.11.0_20261007, 387 files, 61.4 MB, exclusions documented), desktop sync now ships the archive and only the newest set; 53-check gate green
</commit_message>
<xml_diff>
--- a/重构版论文_v4_20260915/English_SCI_Manuscript_v4.docx
+++ b/重构版论文_v4_20260915/English_SCI_Manuscript_v4.docx
@@ -1090,7 +1090,7 @@
           <w:noProof/>
         </w:rPr>
         <w:drawing>
-          <wp:inline distT="0" distB="0" distL="0" distR="0" wp14:anchorId="24737BE5" wp14:editId="7D64D262">
+          <wp:inline distT="0" distB="0" distL="0" distR="0" wp14:anchorId="0B6DC383" wp14:editId="0CF23EA7">
             <wp:extent cx="5760720" cy="2734826"/>
             <wp:effectExtent l="0" t="0" r="0" b="0"/>
             <wp:docPr id="1" name="Picture 1"/>
@@ -2470,7 +2470,7 @@
           <w:noProof/>
         </w:rPr>
         <w:drawing>
-          <wp:inline distT="0" distB="0" distL="0" distR="0" wp14:anchorId="1FE803C6" wp14:editId="22E5744F">
+          <wp:inline distT="0" distB="0" distL="0" distR="0" wp14:anchorId="445A39C6" wp14:editId="5467481B">
             <wp:extent cx="5760720" cy="2722098"/>
             <wp:effectExtent l="0" t="0" r="0" b="0"/>
             <wp:docPr id="2" name="Picture 2"/>
@@ -3472,7 +3472,7 @@
           <w:noProof/>
         </w:rPr>
         <w:drawing>
-          <wp:inline distT="0" distB="0" distL="0" distR="0" wp14:anchorId="57ABC913" wp14:editId="744DB797">
+          <wp:inline distT="0" distB="0" distL="0" distR="0" wp14:anchorId="19461239" wp14:editId="3035C317">
             <wp:extent cx="5760720" cy="3482709"/>
             <wp:effectExtent l="0" t="0" r="0" b="0"/>
             <wp:docPr id="3" name="Picture 3"/>
@@ -4821,6 +4821,7 @@
     </w:p>
     <w:p>
       <w:r>
+        <w:lastRenderedPageBreak/>
         <w:t>which approaches 1 in that limit.</w:t>
       </w:r>
     </w:p>
@@ -7265,7 +7266,7 @@
           <w:noProof/>
         </w:rPr>
         <w:drawing>
-          <wp:inline distT="0" distB="0" distL="0" distR="0" wp14:anchorId="648905F4" wp14:editId="77B64345">
+          <wp:inline distT="0" distB="0" distL="0" distR="0" wp14:anchorId="198A0D8B" wp14:editId="60364C36">
             <wp:extent cx="5760720" cy="2356272"/>
             <wp:effectExtent l="0" t="0" r="0" b="0"/>
             <wp:docPr id="4" name="Picture 4"/>
@@ -8225,7 +8226,7 @@
           <w:noProof/>
         </w:rPr>
         <w:drawing>
-          <wp:inline distT="0" distB="0" distL="0" distR="0" wp14:anchorId="263FA1E8" wp14:editId="72331439">
+          <wp:inline distT="0" distB="0" distL="0" distR="0" wp14:anchorId="1E168EBB" wp14:editId="626E70FA">
             <wp:extent cx="5760720" cy="2045294"/>
             <wp:effectExtent l="0" t="0" r="0" b="0"/>
             <wp:docPr id="5" name="Picture 5"/>
@@ -8403,7 +8404,7 @@
           <w:noProof/>
         </w:rPr>
         <w:drawing>
-          <wp:inline distT="0" distB="0" distL="0" distR="0" wp14:anchorId="2C9BD1D5" wp14:editId="70CDAD6B">
+          <wp:inline distT="0" distB="0" distL="0" distR="0" wp14:anchorId="41F106E1" wp14:editId="56A1BA55">
             <wp:extent cx="5760720" cy="2308234"/>
             <wp:effectExtent l="0" t="0" r="0" b="0"/>
             <wp:docPr id="6" name="Picture 6"/>
@@ -9135,7 +9136,7 @@
           <w:noProof/>
         </w:rPr>
         <w:drawing>
-          <wp:inline distT="0" distB="0" distL="0" distR="0" wp14:anchorId="1D82E84B" wp14:editId="421659FD">
+          <wp:inline distT="0" distB="0" distL="0" distR="0" wp14:anchorId="15762B7E" wp14:editId="716F47BA">
             <wp:extent cx="5760720" cy="2167923"/>
             <wp:effectExtent l="0" t="0" r="0" b="0"/>
             <wp:docPr id="7" name="Picture 7"/>
@@ -9314,7 +9315,7 @@
           <w:noProof/>
         </w:rPr>
         <w:drawing>
-          <wp:inline distT="0" distB="0" distL="0" distR="0" wp14:anchorId="6E872975" wp14:editId="524E5295">
+          <wp:inline distT="0" distB="0" distL="0" distR="0" wp14:anchorId="551FAB4C" wp14:editId="3AFB5ED9">
             <wp:extent cx="5760720" cy="2258878"/>
             <wp:effectExtent l="0" t="0" r="0" b="0"/>
             <wp:docPr id="8" name="Picture 8"/>
@@ -9498,7 +9499,7 @@
           <w:noProof/>
         </w:rPr>
         <w:drawing>
-          <wp:inline distT="0" distB="0" distL="0" distR="0" wp14:anchorId="21C2F952" wp14:editId="4FE37470">
+          <wp:inline distT="0" distB="0" distL="0" distR="0" wp14:anchorId="5872754F" wp14:editId="3A0B46AB">
             <wp:extent cx="5760720" cy="2516852"/>
             <wp:effectExtent l="0" t="0" r="0" b="0"/>
             <wp:docPr id="9" name="Picture 9"/>
@@ -9638,7 +9639,7 @@
           <w:noProof/>
         </w:rPr>
         <w:drawing>
-          <wp:inline distT="0" distB="0" distL="0" distR="0" wp14:anchorId="63F6C89F" wp14:editId="0D7B7719">
+          <wp:inline distT="0" distB="0" distL="0" distR="0" wp14:anchorId="5DA2E855" wp14:editId="4DB7F964">
             <wp:extent cx="5760720" cy="2223311"/>
             <wp:effectExtent l="0" t="0" r="0" b="0"/>
             <wp:docPr id="10" name="Picture 10"/>
@@ -9730,7 +9731,7 @@
         </w:rPr>
         <w:lastRenderedPageBreak/>
         <w:drawing>
-          <wp:inline distT="0" distB="0" distL="0" distR="0" wp14:anchorId="5494ACCF" wp14:editId="66B659EA">
+          <wp:inline distT="0" distB="0" distL="0" distR="0" wp14:anchorId="25E75C7A" wp14:editId="37D3846B">
             <wp:extent cx="5760720" cy="2538527"/>
             <wp:effectExtent l="0" t="0" r="0" b="0"/>
             <wp:docPr id="11" name="Picture 11"/>
@@ -10699,7 +10700,7 @@
           <w:noProof/>
         </w:rPr>
         <w:drawing>
-          <wp:inline distT="0" distB="0" distL="0" distR="0" wp14:anchorId="7CA4423E" wp14:editId="448E355E">
+          <wp:inline distT="0" distB="0" distL="0" distR="0" wp14:anchorId="488BDD61" wp14:editId="38B8AA48">
             <wp:extent cx="5760720" cy="1441223"/>
             <wp:effectExtent l="0" t="0" r="0" b="0"/>
             <wp:docPr id="12" name="Picture 12"/>
@@ -15181,76 +15182,76 @@
       </w:rPr>
     </w:lvl>
   </w:abstractNum>
-  <w:num w:numId="1" w16cid:durableId="101920558">
+  <w:num w:numId="1" w16cid:durableId="890462887">
     <w:abstractNumId w:val="8"/>
   </w:num>
-  <w:num w:numId="2" w16cid:durableId="1166046762">
+  <w:num w:numId="2" w16cid:durableId="1324507479">
     <w:abstractNumId w:val="6"/>
   </w:num>
-  <w:num w:numId="3" w16cid:durableId="920528614">
+  <w:num w:numId="3" w16cid:durableId="361902852">
     <w:abstractNumId w:val="5"/>
   </w:num>
-  <w:num w:numId="4" w16cid:durableId="804273346">
+  <w:num w:numId="4" w16cid:durableId="1984845011">
     <w:abstractNumId w:val="4"/>
   </w:num>
-  <w:num w:numId="5" w16cid:durableId="123543941">
+  <w:num w:numId="5" w16cid:durableId="885524434">
     <w:abstractNumId w:val="7"/>
   </w:num>
-  <w:num w:numId="6" w16cid:durableId="1656182490">
+  <w:num w:numId="6" w16cid:durableId="2120756576">
     <w:abstractNumId w:val="3"/>
   </w:num>
-  <w:num w:numId="7" w16cid:durableId="616372415">
+  <w:num w:numId="7" w16cid:durableId="554701290">
     <w:abstractNumId w:val="2"/>
   </w:num>
-  <w:num w:numId="8" w16cid:durableId="1530727678">
+  <w:num w:numId="8" w16cid:durableId="323973396">
     <w:abstractNumId w:val="1"/>
   </w:num>
-  <w:num w:numId="9" w16cid:durableId="735126705">
+  <w:num w:numId="9" w16cid:durableId="1802337156">
     <w:abstractNumId w:val="0"/>
   </w:num>
-  <w:num w:numId="10" w16cid:durableId="22562653">
+  <w:num w:numId="10" w16cid:durableId="312099505">
     <w:abstractNumId w:val="7"/>
     <w:lvlOverride w:ilvl="0">
       <w:startOverride w:val="1"/>
     </w:lvlOverride>
   </w:num>
-  <w:num w:numId="11" w16cid:durableId="140780208">
+  <w:num w:numId="11" w16cid:durableId="339937659">
     <w:abstractNumId w:val="7"/>
     <w:lvlOverride w:ilvl="0">
       <w:startOverride w:val="1"/>
     </w:lvlOverride>
   </w:num>
-  <w:num w:numId="12" w16cid:durableId="143939194">
+  <w:num w:numId="12" w16cid:durableId="994143519">
     <w:abstractNumId w:val="7"/>
     <w:lvlOverride w:ilvl="0">
       <w:startOverride w:val="1"/>
     </w:lvlOverride>
   </w:num>
-  <w:num w:numId="13" w16cid:durableId="36585929">
+  <w:num w:numId="13" w16cid:durableId="501895279">
     <w:abstractNumId w:val="7"/>
     <w:lvlOverride w:ilvl="0">
       <w:startOverride w:val="1"/>
     </w:lvlOverride>
   </w:num>
-  <w:num w:numId="14" w16cid:durableId="1860779729">
+  <w:num w:numId="14" w16cid:durableId="792872364">
     <w:abstractNumId w:val="7"/>
     <w:lvlOverride w:ilvl="0">
       <w:startOverride w:val="1"/>
     </w:lvlOverride>
   </w:num>
-  <w:num w:numId="15" w16cid:durableId="1161388772">
+  <w:num w:numId="15" w16cid:durableId="1800411672">
     <w:abstractNumId w:val="7"/>
     <w:lvlOverride w:ilvl="0">
       <w:startOverride w:val="1"/>
     </w:lvlOverride>
   </w:num>
-  <w:num w:numId="16" w16cid:durableId="1509251244">
+  <w:num w:numId="16" w16cid:durableId="1137994586">
     <w:abstractNumId w:val="7"/>
     <w:lvlOverride w:ilvl="0">
       <w:startOverride w:val="1"/>
     </w:lvlOverride>
   </w:num>
-  <w:num w:numId="17" w16cid:durableId="828054128">
+  <w:num w:numId="17" w16cid:durableId="391395574">
     <w:abstractNumId w:val="7"/>
     <w:lvlOverride w:ilvl="0">
       <w:startOverride w:val="1"/>

</xml_diff>

<commit_message>
Round 20bs: 计算机学报 layout edition - the Chinese manuscript restyled to that journal's conventions (single-column front matter with 中/英 title-authors-affiliations-abstract-keywords, two-column body, 黑体 13.1/9.7pt headings, 图n/表n captions without a space, three-line tables, [n] references with // before proceedings and no DOI), rendered to DOCX via Word and verified page by page; added to the bundle as 11_计算机学报排版版; 53-check gate green
</commit_message>
<xml_diff>
--- a/重构版论文_v4_20260915/English_SCI_Manuscript_v4.docx
+++ b/重构版论文_v4_20260915/English_SCI_Manuscript_v4.docx
@@ -1090,7 +1090,7 @@
           <w:noProof/>
         </w:rPr>
         <w:drawing>
-          <wp:inline distT="0" distB="0" distL="0" distR="0" wp14:anchorId="0B6DC383" wp14:editId="0CF23EA7">
+          <wp:inline distT="0" distB="0" distL="0" distR="0" wp14:anchorId="520B667C" wp14:editId="1A67886D">
             <wp:extent cx="5760720" cy="2734826"/>
             <wp:effectExtent l="0" t="0" r="0" b="0"/>
             <wp:docPr id="1" name="Picture 1"/>
@@ -2470,7 +2470,7 @@
           <w:noProof/>
         </w:rPr>
         <w:drawing>
-          <wp:inline distT="0" distB="0" distL="0" distR="0" wp14:anchorId="445A39C6" wp14:editId="5467481B">
+          <wp:inline distT="0" distB="0" distL="0" distR="0" wp14:anchorId="10E98E39" wp14:editId="6B01E544">
             <wp:extent cx="5760720" cy="2722098"/>
             <wp:effectExtent l="0" t="0" r="0" b="0"/>
             <wp:docPr id="2" name="Picture 2"/>
@@ -3472,7 +3472,7 @@
           <w:noProof/>
         </w:rPr>
         <w:drawing>
-          <wp:inline distT="0" distB="0" distL="0" distR="0" wp14:anchorId="19461239" wp14:editId="3035C317">
+          <wp:inline distT="0" distB="0" distL="0" distR="0" wp14:anchorId="42C54343" wp14:editId="24B22800">
             <wp:extent cx="5760720" cy="3482709"/>
             <wp:effectExtent l="0" t="0" r="0" b="0"/>
             <wp:docPr id="3" name="Picture 3"/>
@@ -3596,6 +3596,7 @@
           <w:rFonts w:ascii="Consolas" w:hAnsi="Consolas"/>
           <w:sz w:val="17"/>
         </w:rPr>
+        <w:lastRenderedPageBreak/>
         <w:t xml:space="preserve">       fit the scaler and selector on the fold's training rows;</w:t>
       </w:r>
     </w:p>
@@ -3608,7 +3609,6 @@
           <w:rFonts w:ascii="Consolas" w:hAnsi="Consolas"/>
           <w:sz w:val="17"/>
         </w:rPr>
-        <w:lastRenderedPageBreak/>
         <w:t xml:space="preserve">       fit a T-tree forest;</w:t>
       </w:r>
     </w:p>
@@ -7266,7 +7266,7 @@
           <w:noProof/>
         </w:rPr>
         <w:drawing>
-          <wp:inline distT="0" distB="0" distL="0" distR="0" wp14:anchorId="198A0D8B" wp14:editId="60364C36">
+          <wp:inline distT="0" distB="0" distL="0" distR="0" wp14:anchorId="61B5467D" wp14:editId="025E15FC">
             <wp:extent cx="5760720" cy="2356272"/>
             <wp:effectExtent l="0" t="0" r="0" b="0"/>
             <wp:docPr id="4" name="Picture 4"/>
@@ -8226,7 +8226,7 @@
           <w:noProof/>
         </w:rPr>
         <w:drawing>
-          <wp:inline distT="0" distB="0" distL="0" distR="0" wp14:anchorId="1E168EBB" wp14:editId="626E70FA">
+          <wp:inline distT="0" distB="0" distL="0" distR="0" wp14:anchorId="6E7E1F96" wp14:editId="778EC2CA">
             <wp:extent cx="5760720" cy="2045294"/>
             <wp:effectExtent l="0" t="0" r="0" b="0"/>
             <wp:docPr id="5" name="Picture 5"/>
@@ -8404,7 +8404,7 @@
           <w:noProof/>
         </w:rPr>
         <w:drawing>
-          <wp:inline distT="0" distB="0" distL="0" distR="0" wp14:anchorId="41F106E1" wp14:editId="56A1BA55">
+          <wp:inline distT="0" distB="0" distL="0" distR="0" wp14:anchorId="3AD3B58C" wp14:editId="66E88091">
             <wp:extent cx="5760720" cy="2308234"/>
             <wp:effectExtent l="0" t="0" r="0" b="0"/>
             <wp:docPr id="6" name="Picture 6"/>
@@ -9136,7 +9136,7 @@
           <w:noProof/>
         </w:rPr>
         <w:drawing>
-          <wp:inline distT="0" distB="0" distL="0" distR="0" wp14:anchorId="15762B7E" wp14:editId="716F47BA">
+          <wp:inline distT="0" distB="0" distL="0" distR="0" wp14:anchorId="00992A2C" wp14:editId="0EF39841">
             <wp:extent cx="5760720" cy="2167923"/>
             <wp:effectExtent l="0" t="0" r="0" b="0"/>
             <wp:docPr id="7" name="Picture 7"/>
@@ -9315,7 +9315,7 @@
           <w:noProof/>
         </w:rPr>
         <w:drawing>
-          <wp:inline distT="0" distB="0" distL="0" distR="0" wp14:anchorId="551FAB4C" wp14:editId="3AFB5ED9">
+          <wp:inline distT="0" distB="0" distL="0" distR="0" wp14:anchorId="3224A6EB" wp14:editId="43245848">
             <wp:extent cx="5760720" cy="2258878"/>
             <wp:effectExtent l="0" t="0" r="0" b="0"/>
             <wp:docPr id="8" name="Picture 8"/>
@@ -9499,7 +9499,7 @@
           <w:noProof/>
         </w:rPr>
         <w:drawing>
-          <wp:inline distT="0" distB="0" distL="0" distR="0" wp14:anchorId="5872754F" wp14:editId="3A0B46AB">
+          <wp:inline distT="0" distB="0" distL="0" distR="0" wp14:anchorId="645B8840" wp14:editId="2686E95A">
             <wp:extent cx="5760720" cy="2516852"/>
             <wp:effectExtent l="0" t="0" r="0" b="0"/>
             <wp:docPr id="9" name="Picture 9"/>
@@ -9639,7 +9639,7 @@
           <w:noProof/>
         </w:rPr>
         <w:drawing>
-          <wp:inline distT="0" distB="0" distL="0" distR="0" wp14:anchorId="5DA2E855" wp14:editId="4DB7F964">
+          <wp:inline distT="0" distB="0" distL="0" distR="0" wp14:anchorId="20B2DCF7" wp14:editId="08D3BD36">
             <wp:extent cx="5760720" cy="2223311"/>
             <wp:effectExtent l="0" t="0" r="0" b="0"/>
             <wp:docPr id="10" name="Picture 10"/>
@@ -9731,7 +9731,7 @@
         </w:rPr>
         <w:lastRenderedPageBreak/>
         <w:drawing>
-          <wp:inline distT="0" distB="0" distL="0" distR="0" wp14:anchorId="25E75C7A" wp14:editId="37D3846B">
+          <wp:inline distT="0" distB="0" distL="0" distR="0" wp14:anchorId="3E0E6D0D" wp14:editId="4A7A5A8C">
             <wp:extent cx="5760720" cy="2538527"/>
             <wp:effectExtent l="0" t="0" r="0" b="0"/>
             <wp:docPr id="11" name="Picture 11"/>
@@ -10700,7 +10700,7 @@
           <w:noProof/>
         </w:rPr>
         <w:drawing>
-          <wp:inline distT="0" distB="0" distL="0" distR="0" wp14:anchorId="488BDD61" wp14:editId="38B8AA48">
+          <wp:inline distT="0" distB="0" distL="0" distR="0" wp14:anchorId="52F089FF" wp14:editId="70EACD02">
             <wp:extent cx="5760720" cy="1441223"/>
             <wp:effectExtent l="0" t="0" r="0" b="0"/>
             <wp:docPr id="12" name="Picture 12"/>
@@ -15182,76 +15182,76 @@
       </w:rPr>
     </w:lvl>
   </w:abstractNum>
-  <w:num w:numId="1" w16cid:durableId="890462887">
+  <w:num w:numId="1" w16cid:durableId="305352725">
     <w:abstractNumId w:val="8"/>
   </w:num>
-  <w:num w:numId="2" w16cid:durableId="1324507479">
+  <w:num w:numId="2" w16cid:durableId="2031684189">
     <w:abstractNumId w:val="6"/>
   </w:num>
-  <w:num w:numId="3" w16cid:durableId="361902852">
+  <w:num w:numId="3" w16cid:durableId="1398166033">
     <w:abstractNumId w:val="5"/>
   </w:num>
-  <w:num w:numId="4" w16cid:durableId="1984845011">
+  <w:num w:numId="4" w16cid:durableId="1434090208">
     <w:abstractNumId w:val="4"/>
   </w:num>
-  <w:num w:numId="5" w16cid:durableId="885524434">
+  <w:num w:numId="5" w16cid:durableId="1251935578">
     <w:abstractNumId w:val="7"/>
   </w:num>
-  <w:num w:numId="6" w16cid:durableId="2120756576">
+  <w:num w:numId="6" w16cid:durableId="800225244">
     <w:abstractNumId w:val="3"/>
   </w:num>
-  <w:num w:numId="7" w16cid:durableId="554701290">
+  <w:num w:numId="7" w16cid:durableId="547108254">
     <w:abstractNumId w:val="2"/>
   </w:num>
-  <w:num w:numId="8" w16cid:durableId="323973396">
+  <w:num w:numId="8" w16cid:durableId="944312696">
     <w:abstractNumId w:val="1"/>
   </w:num>
-  <w:num w:numId="9" w16cid:durableId="1802337156">
+  <w:num w:numId="9" w16cid:durableId="1515144136">
     <w:abstractNumId w:val="0"/>
   </w:num>
-  <w:num w:numId="10" w16cid:durableId="312099505">
+  <w:num w:numId="10" w16cid:durableId="1556744763">
     <w:abstractNumId w:val="7"/>
     <w:lvlOverride w:ilvl="0">
       <w:startOverride w:val="1"/>
     </w:lvlOverride>
   </w:num>
-  <w:num w:numId="11" w16cid:durableId="339937659">
+  <w:num w:numId="11" w16cid:durableId="1284724466">
     <w:abstractNumId w:val="7"/>
     <w:lvlOverride w:ilvl="0">
       <w:startOverride w:val="1"/>
     </w:lvlOverride>
   </w:num>
-  <w:num w:numId="12" w16cid:durableId="994143519">
+  <w:num w:numId="12" w16cid:durableId="142506997">
     <w:abstractNumId w:val="7"/>
     <w:lvlOverride w:ilvl="0">
       <w:startOverride w:val="1"/>
     </w:lvlOverride>
   </w:num>
-  <w:num w:numId="13" w16cid:durableId="501895279">
+  <w:num w:numId="13" w16cid:durableId="1889993002">
     <w:abstractNumId w:val="7"/>
     <w:lvlOverride w:ilvl="0">
       <w:startOverride w:val="1"/>
     </w:lvlOverride>
   </w:num>
-  <w:num w:numId="14" w16cid:durableId="792872364">
+  <w:num w:numId="14" w16cid:durableId="1452479965">
     <w:abstractNumId w:val="7"/>
     <w:lvlOverride w:ilvl="0">
       <w:startOverride w:val="1"/>
     </w:lvlOverride>
   </w:num>
-  <w:num w:numId="15" w16cid:durableId="1800411672">
+  <w:num w:numId="15" w16cid:durableId="489634534">
     <w:abstractNumId w:val="7"/>
     <w:lvlOverride w:ilvl="0">
       <w:startOverride w:val="1"/>
     </w:lvlOverride>
   </w:num>
-  <w:num w:numId="16" w16cid:durableId="1137994586">
+  <w:num w:numId="16" w16cid:durableId="102499616">
     <w:abstractNumId w:val="7"/>
     <w:lvlOverride w:ilvl="0">
       <w:startOverride w:val="1"/>
     </w:lvlOverride>
   </w:num>
-  <w:num w:numId="17" w16cid:durableId="391395574">
+  <w:num w:numId="17" w16cid:durableId="433400571">
     <w:abstractNumId w:val="7"/>
     <w:lvlOverride w:ilvl="0">
       <w:startOverride w:val="1"/>

</xml_diff>

<commit_message>
Round 22: add the EDG decorrelation intervention as a constructive follow-up
</commit_message>
<xml_diff>
--- a/重构版论文_v4_20260915/English_SCI_Manuscript_v4.docx
+++ b/重构版论文_v4_20260915/English_SCI_Manuscript_v4.docx
@@ -21,16 +21,16 @@
     </w:p>
     <w:p>
       <w:r>
-        <w:t>Reported performance differences between intrusion-detection models are usually attributed to the models, while the population on which they are measured is treated as neutral. We show that this assumption fails systematically. Under one leakage-controlled audit of CIC-IDS2017 we build a three-rung scale ladder - 53,237 flows (20,000 per class), 413,209 (200,000 per class) and the complete deduplicated corpus of 2,429,503 - and repeat a paired comparison between sample-conditional forest fusion (RCCF) and a</w:t>
-      </w:r>
-      <w:r>
-        <w:t>n equal-weight chi-square forest on every rung with ten seeds. On the first two rungs the models are equivalent: -0.000456 and -0.001137 Macro-F1, both inside a pre-specified 0.005 margin. On the third, equivalence breaks: -0.005533 (SD 0.002840; 90% interval [-0.007179, -0.003886]), all ten seeds negative, at 175-fold training cost. The reversal is not the gate: it changes one label in 79,860 predictions, weight entropy is 0.99998, and 99.91% of 23,958 test rows are provably invariant. It is member-quality</w:t>
-      </w:r>
-      <w:r>
-        <w:t xml:space="preserve"> dispersion that the cap removes: the full-feature view trails the chi-square view by 0.021397, and one such member in a four-way average predicts the entire deficit (0.005349). The pattern is not a law of scale: on modern corpora reaching 14,250,000 rows the arms differ by 0.000009, and twelve further corpora pool to +0.000007. Class prior (+0.0725), tuning budget (+0.0078) and deduplication order (+0.0060) exceed the aggregation effect (0.0005). On the full corpus, accuracy stays at 0.9958-0.9993 while Ma</w:t>
-      </w:r>
-      <w:r>
-        <w:t>cro-F1 is 0.754007-0.800255. An equivalence claim about ensemble aggregation is therefore a claim about a population.</w:t>
+        <w:t>Reported performance differences between intrusion-detection models are usually attributed to the models, while the population is treated as neutral. We show that this assumption fails systematically. Under one leakage-controlled audit of CIC-IDS2017 we build a three-rung scale ladder - 53,237 flows (20,000 per class), 413,209 (200,000 per class) and the complete deduplicated corpus of 2,429,503 - and repeat a paired comparison between sample-conditional forest fusion (RCCF) and an equal-weight chi-square f</w:t>
+      </w:r>
+      <w:r>
+        <w:t xml:space="preserve">orest on every rung with ten seeds. On the first two rungs the models are equivalent: -0.000456 and -0.001137 Macro-F1, both inside a pre-specified 0.005 margin. On the third, equivalence breaks: -0.005533 (SD 0.002840; 90% interval [-0.007179, -0.003886]), all ten seeds negative, at 175-fold training cost. The reversal is not the gate: it changes one label in 79,860 predictions, weight entropy is 0.99998, and 99.91% of 23,958 test rows are provably invariant. It is caused by member-quality dispersion that </w:t>
+      </w:r>
+      <w:r>
+        <w:t>capping removes: the full-feature view trails the chi-square view by 0.021397, and one such member in a four-way average predicts the deficit (0.005349). A constructive follow-up forces the views apart: the gain returns (+0.00736 under quality matching, +0.09768 on the full corpus, ten seeds each). The pattern is not a law of scale: modern corpora reaching 14,250,000 rows differ by 0.000009. Class prior (+0.0725), tuning budget (+0.0078) and deduplication order (+0.0060) exceed the aggregation effect (0.000</w:t>
+      </w:r>
+      <w:r>
+        <w:t>5). On the full corpus, accuracy stays at 0.9958-0.9993 while Macro-F1 is 0.754007-0.800255. An equivalence claim about ensemble aggregation is therefore a claim about a population.</w:t>
       </w:r>
     </w:p>
     <w:p>
@@ -76,7 +76,11 @@
         <w:t>duplicate and near-duplicate flows</w:t>
       </w:r>
       <w:r>
-        <w:t xml:space="preserve">: the same attack is recorded many times, and if duplicates are discovered only after splitting, the training and test partitions overlap substantially. Second, </w:t>
+        <w:t xml:space="preserve">: the same attack is recorded many times, and if duplicates are discovered </w:t>
+      </w:r>
+      <w:r>
+        <w:lastRenderedPageBreak/>
+        <w:t xml:space="preserve">only after splitting, the training and test partitions overlap substantially. Second, </w:t>
       </w:r>
       <w:r>
         <w:rPr>
@@ -85,11 +89,7 @@
         <w:t>conflicting labels</w:t>
       </w:r>
       <w:r>
-        <w:t xml:space="preserve">: identical feature </w:t>
-      </w:r>
-      <w:r>
-        <w:lastRenderedPageBreak/>
-        <w:t xml:space="preserve">vectors carry different labels, forcing the model to fit contradictory supervision. Third, </w:t>
+        <w:t xml:space="preserve">: identical feature vectors carry different labels, forcing the model to fit contradictory supervision. Third, </w:t>
       </w:r>
       <w:r>
         <w:rPr>
@@ -395,15 +395,33 @@
       </w:r>
     </w:p>
     <w:p>
-      <w:r>
-        <w:t xml:space="preserve">The contribution is deliberately not incremental. Adding another classifier to an existing benchmark would answer no open question, because the literature already contains many such comparisons and they disagree. What the field </w:t>
+      <w:pPr>
+        <w:pStyle w:val="a"/>
+        <w:numPr>
+          <w:ilvl w:val="0"/>
+          <w:numId w:val="10"/>
+        </w:numPr>
+      </w:pPr>
+      <w:r>
+        <w:rPr>
+          <w:b/>
+        </w:rPr>
+        <w:t>A constructive intervention that restores the gain.</w:t>
+      </w:r>
+      <w:r>
+        <w:t xml:space="preserve"> Holding the data, the members, the tree budget and the gate fixed, we vary only the fraction of features shared between members. Forcing four disjoint views moves </w:t>
       </w:r>
       <w:r>
         <w:lastRenderedPageBreak/>
-        <w:t>lacks is a way to decide whether a reported difference is attributable to the method or to the population and protocol that produced it. This paper supplies that decision procedure in three parts: a scale ladder that shows the verdict is population-relative, an auditable protocol that fixes the information boundary, and a set of identifiability conditions that predict when an aggregation mechanism cannot act at all. The result is falsifiable: Condition 1 predicts zero gain for the expert sets used here, the</w:t>
-      </w:r>
-      <w:r>
-        <w:t xml:space="preserve"> reverse experiment confirms that prediction, and Condition D predicts the sign and magnitude of the deficit on the uncapped rung.</w:t>
+        <w:t>pairwise disagreement from 0.65% to 3.54% and the ten-seed gain from +0.00030 to +0.02640. A quality-matched variant still gains +0.00736 with McNemar significance in ten of ten seeds, and the full corpus gains +0.09768; a quality gradient locates the peak at a member-F1 spread near 0.02.</w:t>
+      </w:r>
+    </w:p>
+    <w:p>
+      <w:r>
+        <w:t>The contribution is deliberately not incremental. Adding another classifier to an existing benchmark would answer no open question, because the literature already contains many such comparisons and they disagree. What the field lacks is a way to decide whether a reported difference is attributable to the method or to the population and protocol that produced it. This paper supplies that decision procedure in four parts: a scale ladder that shows the verdict is population-relative, an auditable protocol that</w:t>
+      </w:r>
+      <w:r>
+        <w:t xml:space="preserve"> fixes the information boundary, a set of identifiability conditions that predict when an aggregation mechanism cannot act, and a controlled intervention that shows how to break those conditions. The result is falsifiable: Condition 1 predicts zero gain for the expert sets used here, the reverse experiment confirms that prediction, Condition D predicts the sign and magnitude of the deficit on the uncapped rung, and the intervention turns the predicted diversity dependence into a measured gain.</w:t>
       </w:r>
     </w:p>
     <w:p>
@@ -464,7 +482,11 @@
         <w:t>Several structural defects are documented [19,49]. Class distributions are extremely skewed - in CIC-IDS2017 the Web Attack and Infiltration families are three to five orders of magnitude smaller than BENIGN. Feature tables contain constant columns and collection artefacts. Some attack families were generated by a single tool in a single time window and are therefore highly homogeneous. Training and test partitions may share duplicates. Engelen and Timmerman, and Liu et al., show that preprocessing order an</w:t>
       </w:r>
       <w:r>
-        <w:t>d splitting choices alone can materially change reported performance [20,21]. These findings motivate H3: if protocol choices change conclusions, the protocol itself must become a reported and tested object. This position is part of a wider methodological critique of machine learning in security [22,23,26].</w:t>
+        <w:t xml:space="preserve">d splitting choices alone can materially change reported performance [20,21]. These findings motivate H3: if protocol choices change conclusions, the protocol </w:t>
+      </w:r>
+      <w:r>
+        <w:lastRenderedPageBreak/>
+        <w:t>itself must become a reported and tested object. This position is part of a wider methodological critique of machine learning in security [22,23,26].</w:t>
       </w:r>
     </w:p>
     <w:p>
@@ -482,7 +504,6 @@
     </w:p>
     <w:p>
       <w:r>
-        <w:lastRenderedPageBreak/>
         <w:t>The difficulty is that these statistics depend on the label distribution. Fitting a selector before splitting leaks test-label information through the feature ranking. Such leakage is common and hard to detect from a methods paragraph [22]. Our protocol fits every selector inside the training partition and refits it inside each cross-fitting fold, so the selector is subject to the same information boundary as the model.</w:t>
       </w:r>
     </w:p>
@@ -536,7 +557,11 @@
     </w:p>
     <w:p>
       <w:r>
-        <w:t>Hard-label metrics such as accuracy and Macro-F1 say nothing about probability quality. For alert ranking, risk scoring and human-in-the-loop triage, Log Loss, the Brier score and expected calibration error (ECE) matter more [29]. Two models with identical hard labels can differ substantially in calibration, so discriminative and probabilistic metrics must be reported separately [30,31].</w:t>
+        <w:t xml:space="preserve">Hard-label metrics such as accuracy and Macro-F1 say nothing about probability quality. For alert ranking, risk scoring and human-in-the-loop triage, Log Loss, the Brier score and expected calibration error (ECE) matter more </w:t>
+      </w:r>
+      <w:r>
+        <w:lastRenderedPageBreak/>
+        <w:t>[29]. Two models with identical hard labels can differ substantially in calibration, so discriminative and probabilistic metrics must be reported separately [30,31].</w:t>
       </w:r>
     </w:p>
     <w:p>
@@ -549,7 +574,6 @@
         <w:pStyle w:val="21"/>
       </w:pPr>
       <w:r>
-        <w:lastRenderedPageBreak/>
         <w:t>2.5 Gap and positioning</w:t>
       </w:r>
     </w:p>
@@ -1118,6 +1142,7 @@
         <w:pStyle w:val="1"/>
       </w:pPr>
       <w:r>
+        <w:lastRenderedPageBreak/>
         <w:t>3. Data, Provenance and Protocol</w:t>
       </w:r>
     </w:p>
@@ -1130,7 +1155,7 @@
           <w:noProof/>
         </w:rPr>
         <w:drawing>
-          <wp:inline distT="0" distB="0" distL="0" distR="0" wp14:anchorId="619C9658" wp14:editId="4F40A853">
+          <wp:inline distT="0" distB="0" distL="0" distR="0" wp14:anchorId="3722B269" wp14:editId="49233A4A">
             <wp:extent cx="5760720" cy="2734826"/>
             <wp:effectExtent l="0" t="0" r="0" b="0"/>
             <wp:docPr id="1" name="Picture 1"/>
@@ -1181,7 +1206,6 @@
     </w:p>
     <w:p>
       <w:r>
-        <w:lastRenderedPageBreak/>
         <w:t>The section proceeds from provenance to population: 3.1 records the sources, retrieval dates and licences, 3.2 audits CIC-IDS2017 and defines the two research populations, 3.3 describes the two external corpora, 3.4 fixes the leakage-controlled protocol, 3.5 states the estimands and the statistical procedure, and 3.6 lists the threats the design already excludes, leaving the residual ones to 6.5.</w:t>
       </w:r>
     </w:p>
@@ -1565,7 +1589,14 @@
               <w:rPr>
                 <w:sz w:val="16"/>
               </w:rPr>
-              <w:t>UNSW Canberra Cyber, official project page</w:t>
+              <w:t xml:space="preserve">UNSW Canberra </w:t>
+            </w:r>
+            <w:r>
+              <w:rPr>
+                <w:sz w:val="16"/>
+              </w:rPr>
+              <w:lastRenderedPageBreak/>
+              <w:t>Cyber, official project page</w:t>
             </w:r>
           </w:p>
         </w:tc>
@@ -1581,7 +1612,15 @@
               <w:rPr>
                 <w:sz w:val="16"/>
               </w:rPr>
-              <w:t>Official training and testing CSV</w:t>
+              <w:lastRenderedPageBreak/>
+              <w:t xml:space="preserve">Official training and </w:t>
+            </w:r>
+            <w:r>
+              <w:rPr>
+                <w:sz w:val="16"/>
+              </w:rPr>
+              <w:lastRenderedPageBreak/>
+              <w:t>testing CSV</w:t>
             </w:r>
           </w:p>
         </w:tc>
@@ -1597,6 +1636,7 @@
               <w:rPr>
                 <w:sz w:val="16"/>
               </w:rPr>
+              <w:lastRenderedPageBreak/>
               <w:t>2026-09-04</w:t>
             </w:r>
           </w:p>
@@ -1613,7 +1653,14 @@
               <w:rPr>
                 <w:sz w:val="16"/>
               </w:rPr>
-              <w:t>Page requires citation of the original paper; no SPDX identifier</w:t>
+              <w:t xml:space="preserve">Page requires citation </w:t>
+            </w:r>
+            <w:r>
+              <w:rPr>
+                <w:sz w:val="16"/>
+              </w:rPr>
+              <w:lastRenderedPageBreak/>
+              <w:t>of the original paper; no SPDX identifier</w:t>
             </w:r>
           </w:p>
         </w:tc>
@@ -1629,7 +1676,15 @@
               <w:rPr>
                 <w:sz w:val="16"/>
               </w:rPr>
-              <w:t>SHA-256 recorded for both files</w:t>
+              <w:lastRenderedPageBreak/>
+              <w:t xml:space="preserve">SHA-256 recorded </w:t>
+            </w:r>
+            <w:r>
+              <w:rPr>
+                <w:sz w:val="16"/>
+              </w:rPr>
+              <w:lastRenderedPageBreak/>
+              <w:t>for both files</w:t>
             </w:r>
           </w:p>
         </w:tc>
@@ -1647,6 +1702,7 @@
               <w:rPr>
                 <w:sz w:val="16"/>
               </w:rPr>
+              <w:lastRenderedPageBreak/>
               <w:t>N-BaIoT</w:t>
             </w:r>
           </w:p>
@@ -1767,7 +1823,6 @@
         <w:rPr>
           <w:b/>
         </w:rPr>
-        <w:lastRenderedPageBreak/>
         <w:t>Stage 2, non-finite removal.</w:t>
       </w:r>
       <w:r>
@@ -2063,7 +2118,14 @@
               <w:rPr>
                 <w:sz w:val="16"/>
               </w:rPr>
-              <w:t>Five retained classes; PortScan, Infiltration and Heartbleed reserved for diagnostics</w:t>
+              <w:t xml:space="preserve">Five retained classes; PortScan, Infiltration and Heartbleed </w:t>
+            </w:r>
+            <w:r>
+              <w:rPr>
+                <w:sz w:val="16"/>
+              </w:rPr>
+              <w:lastRenderedPageBreak/>
+              <w:t>reserved for diagnostics</w:t>
             </w:r>
           </w:p>
         </w:tc>
@@ -2081,6 +2143,7 @@
               <w:rPr>
                 <w:sz w:val="16"/>
               </w:rPr>
+              <w:lastRenderedPageBreak/>
               <w:t>After non-finite removal</w:t>
             </w:r>
           </w:p>
@@ -2478,9 +2541,8 @@
         <w:rPr>
           <w:noProof/>
         </w:rPr>
-        <w:lastRenderedPageBreak/>
         <w:drawing>
-          <wp:inline distT="0" distB="0" distL="0" distR="0" wp14:anchorId="7E8669BD" wp14:editId="059385F4">
+          <wp:inline distT="0" distB="0" distL="0" distR="0" wp14:anchorId="6780020C" wp14:editId="34DB660B">
             <wp:extent cx="5760720" cy="2722098"/>
             <wp:effectExtent l="0" t="0" r="0" b="0"/>
             <wp:docPr id="2" name="Picture 2"/>
@@ -2570,6 +2632,7 @@
     </w:p>
     <w:p>
       <w:r>
+        <w:lastRenderedPageBreak/>
         <w:t>Because these label spaces are incompatible, the three sets of scores are never pooled or averaged here, and they are never interpreted as evidence of transfer. Their role is to act as pressure tests: a conclusion that holds only on CIC-IDS2017 should not be written as a general law.</w:t>
       </w:r>
     </w:p>
@@ -2609,7 +2672,6 @@
         <w:rPr>
           <w:b/>
         </w:rPr>
-        <w:lastRenderedPageBreak/>
         <w:t>Corpus-level audit precedes the split.</w:t>
       </w:r>
       <w:r>
@@ -2746,6 +2808,7 @@
     </w:p>
     <w:p>
       <w:r>
+        <w:lastRenderedPageBreak/>
         <w:t>Macro-F1 is the primary metric because Web Attack accounts for only 1.26% of the natural-prior population, so accuracy is dominated by the majority classes. Class-level reports, balanced accuracy and normalised confusion matrices are reported alongside it.</w:t>
       </w:r>
     </w:p>
@@ -2795,11 +2858,7 @@
         <w:t>cannot</w:t>
       </w:r>
       <w:r>
-        <w:t xml:space="preserve"> exclude are listed in Section 6.5, including </w:t>
-      </w:r>
-      <w:r>
-        <w:lastRenderedPageBreak/>
-        <w:t>the gap between the research populations and production traffic, the absence of a category-complete temporal holdout, and latency measurements that exclude packet capture and feature extraction.</w:t>
+        <w:t xml:space="preserve"> exclude are listed in Section 6.5, including the gap between the research populations and production traffic, the absence of a category-complete temporal holdout, and latency measurements that exclude packet capture and feature extraction.</w:t>
       </w:r>
     </w:p>
     <w:p>
@@ -2904,6 +2963,7 @@
         <w:rPr>
           <w:b/>
         </w:rPr>
+        <w:lastRenderedPageBreak/>
         <w:t>Step 2, risk models.</w:t>
       </w:r>
       <w:r>
@@ -3463,11 +3523,7 @@
         <w:t>unknown</w:t>
       </w:r>
       <w:r>
-        <w:t xml:space="preserve"> output at significance level alpha = 0.1. [32-35] The mechanism </w:t>
-      </w:r>
-      <w:r>
-        <w:lastRenderedPageBreak/>
-        <w:t>changes probabilities first; a hard label changes only if the fused argmax changes. "The probabilities moved" and "the prediction changed" are therefore distinct statements, and Sections 5.2 and 5.3 report them separately.</w:t>
+        <w:t xml:space="preserve"> output at significance level alpha = 0.1. [32-35] The mechanism changes probabilities first; a hard label changes only if the fused argmax changes. "The probabilities moved" and "the prediction changed" are therefore distinct statements, and Sections 5.2 and 5.3 report them separately.</w:t>
       </w:r>
     </w:p>
     <w:p>
@@ -3479,7 +3535,7 @@
           <w:noProof/>
         </w:rPr>
         <w:drawing>
-          <wp:inline distT="0" distB="0" distL="0" distR="0" wp14:anchorId="078692B9" wp14:editId="50B775B5">
+          <wp:inline distT="0" distB="0" distL="0" distR="0" wp14:anchorId="5FE68C1C" wp14:editId="2A99FF64">
             <wp:extent cx="5760720" cy="3482709"/>
             <wp:effectExtent l="0" t="0" r="0" b="0"/>
             <wp:docPr id="3" name="Picture 3"/>
@@ -3760,7 +3816,6 @@
         <w:rPr>
           <w:i/>
         </w:rPr>
-        <w:lastRenderedPageBreak/>
         <w:t>Proof.</w:t>
       </w:r>
       <w:r>
@@ -4846,6 +4901,7 @@
         <w:pStyle w:val="21"/>
       </w:pPr>
       <w:r>
+        <w:lastRenderedPageBreak/>
         <w:t>4.4 Complexity</w:t>
       </w:r>
     </w:p>
@@ -4854,11 +4910,7 @@
         <w:t>Let n be the number of training rows, d the original feature count, k the selected feature count, T the number of trees, K the number of cross-fitting folds and Q = 4 the number of experts. The dominant cost of the cross-fitting stage is approximately O(QK T n log n), the final refit stage costs O(QT n log n), and filter selection contributes O(Q n d). Inference requires one tree traversal per expert plus the risk models, about O(QT log n) per row. RCCF is therefore substantially more expensive than a singl</w:t>
       </w:r>
       <w:r>
-        <w:t xml:space="preserve">e equal-weight forest at both ends, and Section 5.6 quantifies that cost. All experiments ran on a single workstation with 8 physical cores (16 logical), 35.8 GB of RAM and Windows 10 </w:t>
-      </w:r>
-      <w:r>
-        <w:lastRenderedPageBreak/>
-        <w:t>(build 10.0.26200), using Python 3.11.4, scikit-learn 1.9.0, XGBoost 3.2.0, NumPy 2.4.6, pandas 3.0.5 and Matplotlib 3.11.1. The reported timings are single-machine measurements and are not portability claims. The software stack is documented in [44-47].</w:t>
+        <w:t>e equal-weight forest at both ends, and Section 5.6 quantifies that cost. All experiments ran on a single workstation with 8 physical cores (16 logical), 35.8 GB of RAM and Windows 10 (build 10.0.26200), using Python 3.11.4, scikit-learn 1.9.0, XGBoost 3.2.0, NumPy 2.4.6, pandas 3.0.5 and Matplotlib 3.11.1. The reported timings are single-machine measurements and are not portability claims. The software stack is documented in [44-47].</w:t>
       </w:r>
     </w:p>
     <w:p>
@@ -5013,6 +5065,7 @@
     </w:p>
     <w:p>
       <w:r>
+        <w:lastRenderedPageBreak/>
         <w:t>The chi-square budget k was fixed at 60 on the validation partition from a pre-specified candidate set: validation Macro-F1 was 0.9175 at k = 10, 0.9314 at k = 20, 0.9379 at both k = 30 and k = 40, and 0.9413 at k = 60, flattening between k = 30 and k = 40. This search was carried out on the balanced control protocol; the selected k was then frozen for every final run.</w:t>
       </w:r>
     </w:p>
@@ -5124,14 +5177,7 @@
               <w:rPr>
                 <w:sz w:val="16"/>
               </w:rPr>
-              <w:t xml:space="preserve">Natural-prior population (ten </w:t>
-            </w:r>
-            <w:r>
-              <w:rPr>
-                <w:sz w:val="16"/>
-              </w:rPr>
-              <w:lastRenderedPageBreak/>
-              <w:t>seeds)</w:t>
+              <w:t>Natural-prior population (ten seeds)</w:t>
             </w:r>
           </w:p>
         </w:tc>
@@ -5147,7 +5193,6 @@
               <w:rPr>
                 <w:sz w:val="16"/>
               </w:rPr>
-              <w:lastRenderedPageBreak/>
               <w:t>0.887666</w:t>
             </w:r>
           </w:p>
@@ -6777,6 +6822,7 @@
               <w:rPr>
                 <w:sz w:val="16"/>
               </w:rPr>
+              <w:lastRenderedPageBreak/>
               <w:t>Equal RF (full features)</w:t>
             </w:r>
           </w:p>
@@ -7275,7 +7321,7 @@
           <w:noProof/>
         </w:rPr>
         <w:drawing>
-          <wp:inline distT="0" distB="0" distL="0" distR="0" wp14:anchorId="292B8AEE" wp14:editId="067D8EB4">
+          <wp:inline distT="0" distB="0" distL="0" distR="0" wp14:anchorId="70E76469" wp14:editId="7803FC1D">
             <wp:extent cx="5760720" cy="2356272"/>
             <wp:effectExtent l="0" t="0" r="0" b="0"/>
             <wp:docPr id="4" name="Picture 4"/>
@@ -7337,7 +7383,11 @@
         <w:t>Second, the paired statistics establish equivalence at a strict margin.</w:t>
       </w:r>
       <w:r>
-        <w:t xml:space="preserve"> With ten seeds the mean paired difference is -0.000456 with a standard deviation of 0.001152. Two interval estimates are reported because they answer different questions: the seed-level 90% interval [-0.001124, +0.000212] reflects model-to-model variability, while the test-row paired bootstrap interval [-0.004251, +0.003382] reflects resampling uncertainty over the locked test set. Both lie inside equivalence margins of 0.005 and 0.01 Macro-F1, so equivalence can be asserted at alpha = 0.05 against either </w:t>
+        <w:t xml:space="preserve"> With ten seeds the mean paired difference is -0.000456 with a standard deviation of 0.001152. Two interval estimates are reported because they answer different questions: the seed-level 90% interval [-0.001124, +0.000212] reflects model-to-model variability, while the test-row paired bootstrap interval [-0.004251, +0.003382] reflects resampling uncertainty over the locked test set. Both lie inside equivalence margins of 0.005 and 0.01 Macro-F1, so equivalence can be asserted at alpha = 0.05 </w:t>
+      </w:r>
+      <w:r>
+        <w:lastRenderedPageBreak/>
+        <w:t xml:space="preserve">against either </w:t>
       </w:r>
       <w:r>
         <w:t xml:space="preserve">margin. This strengthens the three-seed analysis, for which the 0.005 margin was not attainable. The sign of the difference is split five to five across seeds, and exact McNemar tests on the test rows are non-significant. Under the pre-declared decision rule - stable, consistent in sign, and bounded away from zero - </w:t>
@@ -7520,15 +7570,24 @@
                 <w:b/>
                 <w:sz w:val="16"/>
               </w:rPr>
-              <w:t xml:space="preserve">Minimum detectable effect </w:t>
-            </w:r>
+              <w:t>Minimum detectable effect (80% power)</w:t>
+            </w:r>
+          </w:p>
+        </w:tc>
+        <w:tc>
+          <w:tcPr>
+            <w:tcW w:w="890" w:type="dxa"/>
+          </w:tcPr>
+          <w:p>
+            <w:pPr>
+              <w:spacing w:after="0"/>
+            </w:pPr>
             <w:r>
               <w:rPr>
                 <w:b/>
                 <w:sz w:val="16"/>
               </w:rPr>
-              <w:lastRenderedPageBreak/>
-              <w:t>(80% power)</w:t>
+              <w:t>Cohen's d_z</w:t>
             </w:r>
           </w:p>
         </w:tc>
@@ -7545,8 +7604,7 @@
                 <w:b/>
                 <w:sz w:val="16"/>
               </w:rPr>
-              <w:lastRenderedPageBreak/>
-              <w:t>Cohen's d_z</w:t>
+              <w:t>Holm-adjusted sign-flip p</w:t>
             </w:r>
           </w:p>
         </w:tc>
@@ -7563,41 +7621,7 @@
                 <w:b/>
                 <w:sz w:val="16"/>
               </w:rPr>
-              <w:t xml:space="preserve">Holm-adjusted sign-flip </w:t>
-            </w:r>
-            <w:r>
-              <w:rPr>
-                <w:b/>
-                <w:sz w:val="16"/>
-              </w:rPr>
-              <w:lastRenderedPageBreak/>
-              <w:t>p</w:t>
-            </w:r>
-          </w:p>
-        </w:tc>
-        <w:tc>
-          <w:tcPr>
-            <w:tcW w:w="890" w:type="dxa"/>
-          </w:tcPr>
-          <w:p>
-            <w:pPr>
-              <w:spacing w:after="0"/>
-            </w:pPr>
-            <w:r>
-              <w:rPr>
-                <w:b/>
-                <w:sz w:val="16"/>
-              </w:rPr>
-              <w:lastRenderedPageBreak/>
-              <w:t xml:space="preserve">Seeds favouring RCCF / </w:t>
-            </w:r>
-            <w:r>
-              <w:rPr>
-                <w:b/>
-                <w:sz w:val="16"/>
-              </w:rPr>
-              <w:lastRenderedPageBreak/>
-              <w:t>baseline</w:t>
+              <w:t>Seeds favouring RCCF / baseline</w:t>
             </w:r>
           </w:p>
         </w:tc>
@@ -7615,7 +7639,6 @@
               <w:rPr>
                 <w:sz w:val="16"/>
               </w:rPr>
-              <w:lastRenderedPageBreak/>
               <w:t>RCCF - equal RF (chi-square)</w:t>
             </w:r>
           </w:p>
@@ -8206,7 +8229,11 @@
         <w:t>Fifth, a neural baseline shows how badly accuracy can mislead.</w:t>
       </w:r>
       <w:r>
-        <w:t xml:space="preserve"> A multilayer perceptron given the same feature budget and a full training budget (128 hidden units, hyper-parameters selected on the validation partition) reaches 0.97679 accuracy against RCCF's 0.97792, but only 0.797654 Macro-F1 against 0.889955, i.e. 0.092 lower. Its balanced accuracy is 0.79666 against 0.94920 and its Brier score is 0.036701 against 0.006312. Every comparison in this paragraph is computed on the three seeds common to both runs (42, 2024, 3407), the seeds on which the neural baseline wa</w:t>
+        <w:t xml:space="preserve"> A multilayer perceptron given the same feature budget and a full training budget (128 hidden units, hyper-parameters selected on the validation partition) reaches 0.97679 accuracy against RCCF's 0.97792, but only 0.797654 Macro-F1 against 0.889955, i.e. 0.092 lower. Its balanced accuracy is 0.79666 against 0.94920 and its Brier score is 0.036701 against 0.006312. Every comparison </w:t>
+      </w:r>
+      <w:r>
+        <w:lastRenderedPageBreak/>
+        <w:t>in this paragraph is computed on the three seeds common to both runs (42, 2024, 3407), the seeds on which the neural baseline wa</w:t>
       </w:r>
       <w:r>
         <w:t xml:space="preserve">s trained; Table 4(a) gives the corresponding ten-seed RCCF values. Notably, a paired McNemar test on overall correctness is not significant (pooled p = 0.383 over 23,958 rows; per-seed 1.000 / 0.768 / 0.261), because the two models make a similar </w:t>
@@ -8232,7 +8259,6 @@
     </w:p>
     <w:p>
       <w:r>
-        <w:lastRenderedPageBreak/>
         <w:t>Per-seed metrics, per-class reports, normalised confusion matrices and the equivalence tests are provided in Supplementary S05-S07 and S20.</w:t>
       </w:r>
     </w:p>
@@ -8258,7 +8284,7 @@
           <w:noProof/>
         </w:rPr>
         <w:drawing>
-          <wp:inline distT="0" distB="0" distL="0" distR="0" wp14:anchorId="19D83263" wp14:editId="1611ACC6">
+          <wp:inline distT="0" distB="0" distL="0" distR="0" wp14:anchorId="4BEBDAFF" wp14:editId="323D4938">
             <wp:extent cx="5760720" cy="2045294"/>
             <wp:effectExtent l="0" t="0" r="0" b="0"/>
             <wp:docPr id="5" name="Picture 5"/>
@@ -8420,7 +8446,11 @@
         <w:t>3,469 to 5,038</w:t>
       </w:r>
       <w:r>
-        <w:t xml:space="preserve"> across seeds. In other words, fused probabilities are close to one-hot and the weight-induced probability movement is three orders of magnitude smaller than the decision margin.</w:t>
+        <w:t xml:space="preserve"> across </w:t>
+      </w:r>
+      <w:r>
+        <w:lastRenderedPageBreak/>
+        <w:t>seeds. In other words, fused probabilities are close to one-hot and the weight-induced probability movement is three orders of magnitude smaller than the decision margin.</w:t>
       </w:r>
     </w:p>
     <w:p>
@@ -8431,9 +8461,8 @@
         <w:rPr>
           <w:noProof/>
         </w:rPr>
-        <w:lastRenderedPageBreak/>
         <w:drawing>
-          <wp:inline distT="0" distB="0" distL="0" distR="0" wp14:anchorId="3F1DF33C" wp14:editId="7B090D53">
+          <wp:inline distT="0" distB="0" distL="0" distR="0" wp14:anchorId="742EC85A" wp14:editId="41C90AD3">
             <wp:extent cx="5760720" cy="2308234"/>
             <wp:effectExtent l="0" t="0" r="0" b="0"/>
             <wp:docPr id="6" name="Picture 6"/>
@@ -9064,6 +9093,7 @@
               <w:rPr>
                 <w:sz w:val="16"/>
               </w:rPr>
+              <w:lastRenderedPageBreak/>
               <w:t>Disjoint feature blocks</w:t>
             </w:r>
           </w:p>
@@ -9163,9 +9193,8 @@
         <w:rPr>
           <w:noProof/>
         </w:rPr>
-        <w:lastRenderedPageBreak/>
         <w:drawing>
-          <wp:inline distT="0" distB="0" distL="0" distR="0" wp14:anchorId="255122C3" wp14:editId="34AF6530">
+          <wp:inline distT="0" distB="0" distL="0" distR="0" wp14:anchorId="58B10A4E" wp14:editId="1AE54162">
             <wp:extent cx="5760720" cy="2167923"/>
             <wp:effectExtent l="0" t="0" r="0" b="0"/>
             <wp:docPr id="7" name="Picture 7"/>
@@ -9326,6 +9355,7 @@
         <w:pStyle w:val="21"/>
       </w:pPr>
       <w:r>
+        <w:lastRenderedPageBreak/>
         <w:t>5.4 RQ3: Protocol effects exceed aggregation-rule differences by an order of magnitude</w:t>
       </w:r>
     </w:p>
@@ -9342,9 +9372,8 @@
         <w:rPr>
           <w:noProof/>
         </w:rPr>
-        <w:lastRenderedPageBreak/>
         <w:drawing>
-          <wp:inline distT="0" distB="0" distL="0" distR="0" wp14:anchorId="47C9ADD1" wp14:editId="1F1DFA6D">
+          <wp:inline distT="0" distB="0" distL="0" distR="0" wp14:anchorId="680A076B" wp14:editId="63CB8443">
             <wp:extent cx="5760720" cy="2258878"/>
             <wp:effectExtent l="0" t="0" r="0" b="0"/>
             <wp:docPr id="8" name="Picture 8"/>
@@ -9499,7 +9528,11 @@
         <w:t>families</w:t>
       </w:r>
       <w:r>
-        <w:t xml:space="preserve"> are larger: the multilayer perceptron trails the forests by 0.0916 Macro-F1 and extremely randomised trees by 0.0318, both of which exceed the class-prior effect of 0.0725 in the first case. The defensible statement is therefore that aggregation-rule differences are dominated by protocol choices, whereas model-family differences are not.</w:t>
+        <w:t xml:space="preserve"> are larger: the multilayer perceptron trails the forests by 0.0916 Macro-F1 and extremely randomised trees by 0.0318, both of which exceed the class-</w:t>
+      </w:r>
+      <w:r>
+        <w:lastRenderedPageBreak/>
+        <w:t>prior effect of 0.0725 in the first case. The defensible statement is therefore that aggregation-rule differences are dominated by protocol choices, whereas model-family differences are not.</w:t>
       </w:r>
     </w:p>
     <w:p>
@@ -9512,7 +9545,6 @@
         <w:pStyle w:val="21"/>
       </w:pPr>
       <w:r>
-        <w:lastRenderedPageBreak/>
         <w:t>5.5 RQ4: External validity and file-level extrapolation</w:t>
       </w:r>
     </w:p>
@@ -9525,7 +9557,7 @@
           <w:noProof/>
         </w:rPr>
         <w:drawing>
-          <wp:inline distT="0" distB="0" distL="0" distR="0" wp14:anchorId="5C1CF6B8" wp14:editId="5E31E9DA">
+          <wp:inline distT="0" distB="0" distL="0" distR="0" wp14:anchorId="119DE9DD" wp14:editId="72218FDC">
             <wp:extent cx="5760720" cy="2516852"/>
             <wp:effectExtent l="0" t="0" r="0" b="0"/>
             <wp:docPr id="9" name="Picture 9"/>
@@ -9641,6 +9673,7 @@
     </w:p>
     <w:p>
       <w:r>
+        <w:lastRenderedPageBreak/>
         <w:t>The external benchmarks, the file-level extrapolation and the neural baseline comparison are provided in Supplementary S12-S14 and S19.</w:t>
       </w:r>
     </w:p>
@@ -9649,7 +9682,6 @@
         <w:pStyle w:val="21"/>
       </w:pPr>
       <w:r>
-        <w:lastRenderedPageBreak/>
         <w:t>5.6 Secondary metrics: calibration, robustness, latency and open-set behaviour</w:t>
       </w:r>
     </w:p>
@@ -9662,7 +9694,7 @@
           <w:noProof/>
         </w:rPr>
         <w:drawing>
-          <wp:inline distT="0" distB="0" distL="0" distR="0" wp14:anchorId="3BE53772" wp14:editId="638CF5CA">
+          <wp:inline distT="0" distB="0" distL="0" distR="0" wp14:anchorId="0C98DD31" wp14:editId="5F6A546D">
             <wp:extent cx="5760720" cy="2223311"/>
             <wp:effectExtent l="0" t="0" r="0" b="0"/>
             <wp:docPr id="10" name="Picture 10"/>
@@ -9754,7 +9786,7 @@
         </w:rPr>
         <w:lastRenderedPageBreak/>
         <w:drawing>
-          <wp:inline distT="0" distB="0" distL="0" distR="0" wp14:anchorId="31BE3D5F" wp14:editId="6A452A12">
+          <wp:inline distT="0" distB="0" distL="0" distR="0" wp14:anchorId="0D35B936" wp14:editId="610EF766">
             <wp:extent cx="5760720" cy="2538527"/>
             <wp:effectExtent l="0" t="0" r="0" b="0"/>
             <wp:docPr id="11" name="Picture 11"/>
@@ -10754,7 +10786,7 @@
           <w:noProof/>
         </w:rPr>
         <w:drawing>
-          <wp:inline distT="0" distB="0" distL="0" distR="0" wp14:anchorId="7A6BD618" wp14:editId="16014398">
+          <wp:inline distT="0" distB="0" distL="0" distR="0" wp14:anchorId="1635F965" wp14:editId="2FAD5C67">
             <wp:extent cx="5760720" cy="1441223"/>
             <wp:effectExtent l="0" t="0" r="0" b="0"/>
             <wp:docPr id="12" name="Picture 12"/>
@@ -11691,6 +11723,733 @@
     </w:p>
     <w:p>
       <w:pPr>
+        <w:pStyle w:val="21"/>
+      </w:pPr>
+      <w:r>
+        <w:t>5.11 A constructive follow-up: explicit decorrelation restores the gate</w:t>
+      </w:r>
+    </w:p>
+    <w:p>
+      <w:r>
+        <w:t>The preceding sections diagnose why the gate is inert, but they do not test whether the diagnosis is actionable. If the failure is caused by near-identical views, then forcing the views apart should restore a gain. We test this directly by holding the data, the member count, the tree budget, the gate and the seeds fixed, and changing only the fraction of features shared between members.</w:t>
+      </w:r>
+    </w:p>
+    <w:p>
+      <w:r>
+        <w:rPr>
+          <w:b/>
+        </w:rPr>
+        <w:t>Intervention.</w:t>
+      </w:r>
+      <w:r>
+        <w:t xml:space="preserve"> Four forests are trained on feature views of 15 columns each. At overlap 1.0 all four views are the same chi-square top-15 set, which reproduces the shared-view regime of Sections 5.2-5.4. At overlap 0.0 the views </w:t>
+      </w:r>
+      <w:r>
+        <w:lastRenderedPageBreak/>
+        <w:t xml:space="preserve">are four disjoint blocks of the chi-square ranking. The gate is unchanged: four risk models on out-of-fold probabilities and descriptors, weights </w:t>
+      </w:r>
+      <w:r>
+        <w:rPr>
+          <w:rFonts w:ascii="Consolas" w:hAnsi="Consolas"/>
+        </w:rPr>
+        <w:t>exp(-risk/T)</w:t>
+      </w:r>
+      <w:r>
+        <w:t xml:space="preserve"> projected into an entropy band of at most 0.95 and a KL band of at most 0.10, with T chosen on validation. The control is the equal-weight fusion of exactly the same four members.</w:t>
+      </w:r>
+    </w:p>
+    <w:p>
+      <w:r>
+        <w:rPr>
+          <w:b/>
+        </w:rPr>
+        <w:t>Result.</w:t>
+      </w:r>
+      <w:r>
+        <w:t xml:space="preserve"> The intervention moves both quantities in the predicted direction. On the 53,237-flow population, overlap 1.0 gives 0.65% pairwise disagreement and a ten-seed gain of +0.00030; overlap 0.0 gives 3.54% disagreement and +0.02640 (SD 0.00177; 90% interval [0.02538, 0.02743]; ten of ten seeds positive). A quality-matched variant, which selects four candidate views whose validation Macro-F1 lies within a 0.005 band (observed spread 0.0015-0.0072), still gains +0.00736 (SD 0.00476; interval [0.00460, 0.01011]; M</w:t>
+      </w:r>
+      <w:r>
+        <w:t>cNemar significant in ten of ten seeds). The matched variant is the conservative estimate of the diversity effect; the automatic variant also exploits the quality gap between blocks.</w:t>
+      </w:r>
+    </w:p>
+    <w:p>
+      <w:r>
+        <w:rPr>
+          <w:b/>
+        </w:rPr>
+        <w:t>Scale and external validity.</w:t>
+      </w:r>
+      <w:r>
+        <w:t xml:space="preserve"> On the complete 2,429,503-flow corpus the automatic intervention gains +0.09768 (SD 0.01038; interval [0.09166, 0.10370]; ten of ten seeds), but the gate (0.81928) is only 0.0031 above the best single member (0.81615) while the equal-weight fusion is 0.72160: most of the gain is the avoidance of a weak block, not complementarity. The same distinction appears on UNSW-NB15: the automatic version gains +0.00904 (interval [0.00586, 0.01222]; ten of ten), whereas the quality-matched version gains +0.00350 over </w:t>
+      </w:r>
+      <w:r>
+        <w:t>two seeds. The two regimes are therefore different in kind: when members are comparable, the gate gains by combining complementary errors; when they are unequal, it gains mainly by down-weighting the weak members, and its ceiling is the best member.</w:t>
+      </w:r>
+    </w:p>
+    <w:p>
+      <w:r>
+        <w:rPr>
+          <w:b/>
+        </w:rPr>
+        <w:t>Quality gradient.</w:t>
+      </w:r>
+      <w:r>
+        <w:t xml:space="preserve"> To separate the two, we fix the disagreement rate at 3.2%-3.7% and vary the validation-F1 spread of the four members. On CIC the gain is +0.0058, +0.0158, +0.0094 and +0.0037 at spreads 0.005, 0.020, 0.040 and 0.060; the gate exceeds the best member by +0.0068, +0.0133 and +0.0149 at the first three spreads, and falls 0.0081 below it at 0.060. The relation is an inverted U with a peak near 0.02. On UNSW the same peak appears at 0.02 (+0.0047) but the curve is flat within its uncertainty. Table 8 collects t</w:t>
+      </w:r>
+      <w:r>
+        <w:t>he intervention results; the gradient is discussed in the text because it is a diagnostic surface rather than a deployment comparison.</w:t>
+      </w:r>
+    </w:p>
+    <w:p>
+      <w:r>
+        <w:rPr>
+          <w:b/>
+        </w:rPr>
+        <w:t>Table 8. Explicit-decorrelation intervention: gain over the equal-weight fusion of the same members</w:t>
+      </w:r>
+    </w:p>
+    <w:tbl>
+      <w:tblPr>
+        <w:tblStyle w:val="aff1"/>
+        <w:tblW w:w="0" w:type="auto"/>
+        <w:tblBorders>
+          <w:top w:val="single" w:sz="6" w:space="0" w:color="000000"/>
+          <w:left w:val="none" w:sz="0" w:space="0" w:color="auto"/>
+          <w:bottom w:val="single" w:sz="6" w:space="0" w:color="000000"/>
+          <w:right w:val="none" w:sz="0" w:space="0" w:color="auto"/>
+          <w:insideH w:val="single" w:sz="6" w:space="0" w:color="000000"/>
+          <w:insideV w:val="none" w:sz="0" w:space="0" w:color="auto"/>
+        </w:tblBorders>
+        <w:tblLook w:val="04A0" w:firstRow="1" w:lastRow="0" w:firstColumn="1" w:lastColumn="0" w:noHBand="0" w:noVBand="1"/>
+      </w:tblPr>
+      <w:tblGrid>
+        <w:gridCol w:w="1632"/>
+        <w:gridCol w:w="1632"/>
+        <w:gridCol w:w="1632"/>
+        <w:gridCol w:w="1632"/>
+        <w:gridCol w:w="1632"/>
+        <w:gridCol w:w="1632"/>
+      </w:tblGrid>
+      <w:tr>
+        <w:tc>
+          <w:tcPr>
+            <w:tcW w:w="1632" w:type="dxa"/>
+          </w:tcPr>
+          <w:p>
+            <w:pPr>
+              <w:spacing w:after="0"/>
+            </w:pPr>
+            <w:r>
+              <w:rPr>
+                <w:b/>
+                <w:sz w:val="16"/>
+              </w:rPr>
+              <w:t>Setting</w:t>
+            </w:r>
+          </w:p>
+        </w:tc>
+        <w:tc>
+          <w:tcPr>
+            <w:tcW w:w="1632" w:type="dxa"/>
+          </w:tcPr>
+          <w:p>
+            <w:pPr>
+              <w:spacing w:after="0"/>
+            </w:pPr>
+            <w:r>
+              <w:rPr>
+                <w:b/>
+                <w:sz w:val="16"/>
+              </w:rPr>
+              <w:t>Population</w:t>
+            </w:r>
+          </w:p>
+        </w:tc>
+        <w:tc>
+          <w:tcPr>
+            <w:tcW w:w="1632" w:type="dxa"/>
+          </w:tcPr>
+          <w:p>
+            <w:pPr>
+              <w:spacing w:after="0"/>
+            </w:pPr>
+            <w:r>
+              <w:rPr>
+                <w:b/>
+                <w:sz w:val="16"/>
+              </w:rPr>
+              <w:t>Seeds</w:t>
+            </w:r>
+          </w:p>
+        </w:tc>
+        <w:tc>
+          <w:tcPr>
+            <w:tcW w:w="1632" w:type="dxa"/>
+          </w:tcPr>
+          <w:p>
+            <w:pPr>
+              <w:spacing w:after="0"/>
+            </w:pPr>
+            <w:r>
+              <w:rPr>
+                <w:b/>
+                <w:sz w:val="16"/>
+              </w:rPr>
+              <w:t>Gain</w:t>
+            </w:r>
+          </w:p>
+        </w:tc>
+        <w:tc>
+          <w:tcPr>
+            <w:tcW w:w="1632" w:type="dxa"/>
+          </w:tcPr>
+          <w:p>
+            <w:pPr>
+              <w:spacing w:after="0"/>
+            </w:pPr>
+            <w:r>
+              <w:rPr>
+                <w:b/>
+                <w:sz w:val="16"/>
+              </w:rPr>
+              <w:t>90% interval</w:t>
+            </w:r>
+          </w:p>
+        </w:tc>
+        <w:tc>
+          <w:tcPr>
+            <w:tcW w:w="1632" w:type="dxa"/>
+          </w:tcPr>
+          <w:p>
+            <w:pPr>
+              <w:spacing w:after="0"/>
+            </w:pPr>
+            <w:r>
+              <w:rPr>
+                <w:b/>
+                <w:sz w:val="16"/>
+              </w:rPr>
+              <w:t>Positive</w:t>
+            </w:r>
+          </w:p>
+        </w:tc>
+      </w:tr>
+      <w:tr>
+        <w:tc>
+          <w:tcPr>
+            <w:tcW w:w="1632" w:type="dxa"/>
+          </w:tcPr>
+          <w:p>
+            <w:pPr>
+              <w:spacing w:after="0"/>
+            </w:pPr>
+            <w:r>
+              <w:rPr>
+                <w:sz w:val="16"/>
+              </w:rPr>
+              <w:t>Automatic EDG</w:t>
+            </w:r>
+          </w:p>
+        </w:tc>
+        <w:tc>
+          <w:tcPr>
+            <w:tcW w:w="1632" w:type="dxa"/>
+          </w:tcPr>
+          <w:p>
+            <w:pPr>
+              <w:spacing w:after="0"/>
+            </w:pPr>
+            <w:r>
+              <w:rPr>
+                <w:sz w:val="16"/>
+              </w:rPr>
+              <w:t>CIC, 53,237 flows</w:t>
+            </w:r>
+          </w:p>
+        </w:tc>
+        <w:tc>
+          <w:tcPr>
+            <w:tcW w:w="1632" w:type="dxa"/>
+          </w:tcPr>
+          <w:p>
+            <w:pPr>
+              <w:spacing w:after="0"/>
+            </w:pPr>
+            <w:r>
+              <w:rPr>
+                <w:sz w:val="16"/>
+              </w:rPr>
+              <w:t>10</w:t>
+            </w:r>
+          </w:p>
+        </w:tc>
+        <w:tc>
+          <w:tcPr>
+            <w:tcW w:w="1632" w:type="dxa"/>
+          </w:tcPr>
+          <w:p>
+            <w:pPr>
+              <w:spacing w:after="0"/>
+            </w:pPr>
+            <w:r>
+              <w:rPr>
+                <w:sz w:val="16"/>
+              </w:rPr>
+              <w:t>+0.02640</w:t>
+            </w:r>
+          </w:p>
+        </w:tc>
+        <w:tc>
+          <w:tcPr>
+            <w:tcW w:w="1632" w:type="dxa"/>
+          </w:tcPr>
+          <w:p>
+            <w:pPr>
+              <w:spacing w:after="0"/>
+            </w:pPr>
+            <w:r>
+              <w:rPr>
+                <w:sz w:val="16"/>
+              </w:rPr>
+              <w:t>[0.02538, 0.02743]</w:t>
+            </w:r>
+          </w:p>
+        </w:tc>
+        <w:tc>
+          <w:tcPr>
+            <w:tcW w:w="1632" w:type="dxa"/>
+          </w:tcPr>
+          <w:p>
+            <w:pPr>
+              <w:spacing w:after="0"/>
+            </w:pPr>
+            <w:r>
+              <w:rPr>
+                <w:sz w:val="16"/>
+              </w:rPr>
+              <w:t>10/10</w:t>
+            </w:r>
+          </w:p>
+        </w:tc>
+      </w:tr>
+      <w:tr>
+        <w:tc>
+          <w:tcPr>
+            <w:tcW w:w="1632" w:type="dxa"/>
+          </w:tcPr>
+          <w:p>
+            <w:pPr>
+              <w:spacing w:after="0"/>
+            </w:pPr>
+            <w:r>
+              <w:rPr>
+                <w:sz w:val="16"/>
+              </w:rPr>
+              <w:t>Quality-matched EDG</w:t>
+            </w:r>
+          </w:p>
+        </w:tc>
+        <w:tc>
+          <w:tcPr>
+            <w:tcW w:w="1632" w:type="dxa"/>
+          </w:tcPr>
+          <w:p>
+            <w:pPr>
+              <w:spacing w:after="0"/>
+            </w:pPr>
+            <w:r>
+              <w:rPr>
+                <w:sz w:val="16"/>
+              </w:rPr>
+              <w:t>CIC, 53,237 flows</w:t>
+            </w:r>
+          </w:p>
+        </w:tc>
+        <w:tc>
+          <w:tcPr>
+            <w:tcW w:w="1632" w:type="dxa"/>
+          </w:tcPr>
+          <w:p>
+            <w:pPr>
+              <w:spacing w:after="0"/>
+            </w:pPr>
+            <w:r>
+              <w:rPr>
+                <w:sz w:val="16"/>
+              </w:rPr>
+              <w:t>10</w:t>
+            </w:r>
+          </w:p>
+        </w:tc>
+        <w:tc>
+          <w:tcPr>
+            <w:tcW w:w="1632" w:type="dxa"/>
+          </w:tcPr>
+          <w:p>
+            <w:pPr>
+              <w:spacing w:after="0"/>
+            </w:pPr>
+            <w:r>
+              <w:rPr>
+                <w:sz w:val="16"/>
+              </w:rPr>
+              <w:t>+0.00736</w:t>
+            </w:r>
+          </w:p>
+        </w:tc>
+        <w:tc>
+          <w:tcPr>
+            <w:tcW w:w="1632" w:type="dxa"/>
+          </w:tcPr>
+          <w:p>
+            <w:pPr>
+              <w:spacing w:after="0"/>
+            </w:pPr>
+            <w:r>
+              <w:rPr>
+                <w:sz w:val="16"/>
+              </w:rPr>
+              <w:t>[0.00460, 0.01011]</w:t>
+            </w:r>
+          </w:p>
+        </w:tc>
+        <w:tc>
+          <w:tcPr>
+            <w:tcW w:w="1632" w:type="dxa"/>
+          </w:tcPr>
+          <w:p>
+            <w:pPr>
+              <w:spacing w:after="0"/>
+            </w:pPr>
+            <w:r>
+              <w:rPr>
+                <w:sz w:val="16"/>
+              </w:rPr>
+              <w:t>10/10</w:t>
+            </w:r>
+          </w:p>
+        </w:tc>
+      </w:tr>
+      <w:tr>
+        <w:tc>
+          <w:tcPr>
+            <w:tcW w:w="1632" w:type="dxa"/>
+          </w:tcPr>
+          <w:p>
+            <w:pPr>
+              <w:spacing w:after="0"/>
+            </w:pPr>
+            <w:r>
+              <w:rPr>
+                <w:sz w:val="16"/>
+              </w:rPr>
+              <w:t>Automatic EDG</w:t>
+            </w:r>
+          </w:p>
+        </w:tc>
+        <w:tc>
+          <w:tcPr>
+            <w:tcW w:w="1632" w:type="dxa"/>
+          </w:tcPr>
+          <w:p>
+            <w:pPr>
+              <w:spacing w:after="0"/>
+            </w:pPr>
+            <w:r>
+              <w:rPr>
+                <w:sz w:val="16"/>
+              </w:rPr>
+              <w:t>CIC, 2,429,503 flows</w:t>
+            </w:r>
+          </w:p>
+        </w:tc>
+        <w:tc>
+          <w:tcPr>
+            <w:tcW w:w="1632" w:type="dxa"/>
+          </w:tcPr>
+          <w:p>
+            <w:pPr>
+              <w:spacing w:after="0"/>
+            </w:pPr>
+            <w:r>
+              <w:rPr>
+                <w:sz w:val="16"/>
+              </w:rPr>
+              <w:t>10</w:t>
+            </w:r>
+          </w:p>
+        </w:tc>
+        <w:tc>
+          <w:tcPr>
+            <w:tcW w:w="1632" w:type="dxa"/>
+          </w:tcPr>
+          <w:p>
+            <w:pPr>
+              <w:spacing w:after="0"/>
+            </w:pPr>
+            <w:r>
+              <w:rPr>
+                <w:sz w:val="16"/>
+              </w:rPr>
+              <w:t>+0.09768</w:t>
+            </w:r>
+          </w:p>
+        </w:tc>
+        <w:tc>
+          <w:tcPr>
+            <w:tcW w:w="1632" w:type="dxa"/>
+          </w:tcPr>
+          <w:p>
+            <w:pPr>
+              <w:spacing w:after="0"/>
+            </w:pPr>
+            <w:r>
+              <w:rPr>
+                <w:sz w:val="16"/>
+              </w:rPr>
+              <w:t>[0.09166, 0.10370]</w:t>
+            </w:r>
+          </w:p>
+        </w:tc>
+        <w:tc>
+          <w:tcPr>
+            <w:tcW w:w="1632" w:type="dxa"/>
+          </w:tcPr>
+          <w:p>
+            <w:pPr>
+              <w:spacing w:after="0"/>
+            </w:pPr>
+            <w:r>
+              <w:rPr>
+                <w:sz w:val="16"/>
+              </w:rPr>
+              <w:t>10/10</w:t>
+            </w:r>
+          </w:p>
+        </w:tc>
+      </w:tr>
+      <w:tr>
+        <w:tc>
+          <w:tcPr>
+            <w:tcW w:w="1632" w:type="dxa"/>
+          </w:tcPr>
+          <w:p>
+            <w:pPr>
+              <w:spacing w:after="0"/>
+            </w:pPr>
+            <w:r>
+              <w:rPr>
+                <w:sz w:val="16"/>
+              </w:rPr>
+              <w:t>Automatic EDG</w:t>
+            </w:r>
+          </w:p>
+        </w:tc>
+        <w:tc>
+          <w:tcPr>
+            <w:tcW w:w="1632" w:type="dxa"/>
+          </w:tcPr>
+          <w:p>
+            <w:pPr>
+              <w:spacing w:after="0"/>
+            </w:pPr>
+            <w:r>
+              <w:rPr>
+                <w:sz w:val="16"/>
+              </w:rPr>
+              <w:t>UNSW-NB15, 82,332 test flows</w:t>
+            </w:r>
+          </w:p>
+        </w:tc>
+        <w:tc>
+          <w:tcPr>
+            <w:tcW w:w="1632" w:type="dxa"/>
+          </w:tcPr>
+          <w:p>
+            <w:pPr>
+              <w:spacing w:after="0"/>
+            </w:pPr>
+            <w:r>
+              <w:rPr>
+                <w:sz w:val="16"/>
+              </w:rPr>
+              <w:t>10</w:t>
+            </w:r>
+          </w:p>
+        </w:tc>
+        <w:tc>
+          <w:tcPr>
+            <w:tcW w:w="1632" w:type="dxa"/>
+          </w:tcPr>
+          <w:p>
+            <w:pPr>
+              <w:spacing w:after="0"/>
+            </w:pPr>
+            <w:r>
+              <w:rPr>
+                <w:sz w:val="16"/>
+              </w:rPr>
+              <w:t>+0.00904</w:t>
+            </w:r>
+          </w:p>
+        </w:tc>
+        <w:tc>
+          <w:tcPr>
+            <w:tcW w:w="1632" w:type="dxa"/>
+          </w:tcPr>
+          <w:p>
+            <w:pPr>
+              <w:spacing w:after="0"/>
+            </w:pPr>
+            <w:r>
+              <w:rPr>
+                <w:sz w:val="16"/>
+              </w:rPr>
+              <w:t>[0.00586, 0.01222]</w:t>
+            </w:r>
+          </w:p>
+        </w:tc>
+        <w:tc>
+          <w:tcPr>
+            <w:tcW w:w="1632" w:type="dxa"/>
+          </w:tcPr>
+          <w:p>
+            <w:pPr>
+              <w:spacing w:after="0"/>
+            </w:pPr>
+            <w:r>
+              <w:rPr>
+                <w:sz w:val="16"/>
+              </w:rPr>
+              <w:t>10/10</w:t>
+            </w:r>
+          </w:p>
+        </w:tc>
+      </w:tr>
+      <w:tr>
+        <w:tc>
+          <w:tcPr>
+            <w:tcW w:w="1632" w:type="dxa"/>
+          </w:tcPr>
+          <w:p>
+            <w:pPr>
+              <w:spacing w:after="0"/>
+            </w:pPr>
+            <w:r>
+              <w:rPr>
+                <w:sz w:val="16"/>
+              </w:rPr>
+              <w:t>Quality-matched EDG</w:t>
+            </w:r>
+          </w:p>
+        </w:tc>
+        <w:tc>
+          <w:tcPr>
+            <w:tcW w:w="1632" w:type="dxa"/>
+          </w:tcPr>
+          <w:p>
+            <w:pPr>
+              <w:spacing w:after="0"/>
+            </w:pPr>
+            <w:r>
+              <w:rPr>
+                <w:sz w:val="16"/>
+              </w:rPr>
+              <w:t>UNSW-NB15</w:t>
+            </w:r>
+          </w:p>
+        </w:tc>
+        <w:tc>
+          <w:tcPr>
+            <w:tcW w:w="1632" w:type="dxa"/>
+          </w:tcPr>
+          <w:p>
+            <w:pPr>
+              <w:spacing w:after="0"/>
+            </w:pPr>
+            <w:r>
+              <w:rPr>
+                <w:sz w:val="16"/>
+              </w:rPr>
+              <w:t>2</w:t>
+            </w:r>
+          </w:p>
+        </w:tc>
+        <w:tc>
+          <w:tcPr>
+            <w:tcW w:w="1632" w:type="dxa"/>
+          </w:tcPr>
+          <w:p>
+            <w:pPr>
+              <w:spacing w:after="0"/>
+            </w:pPr>
+            <w:r>
+              <w:rPr>
+                <w:sz w:val="16"/>
+              </w:rPr>
+              <w:t>+0.00350</w:t>
+            </w:r>
+          </w:p>
+        </w:tc>
+        <w:tc>
+          <w:tcPr>
+            <w:tcW w:w="1632" w:type="dxa"/>
+          </w:tcPr>
+          <w:p>
+            <w:pPr>
+              <w:spacing w:after="0"/>
+            </w:pPr>
+            <w:r>
+              <w:rPr>
+                <w:sz w:val="16"/>
+              </w:rPr>
+              <w:t>n/a</w:t>
+            </w:r>
+          </w:p>
+        </w:tc>
+        <w:tc>
+          <w:tcPr>
+            <w:tcW w:w="1632" w:type="dxa"/>
+          </w:tcPr>
+          <w:p>
+            <w:pPr>
+              <w:spacing w:after="0"/>
+            </w:pPr>
+            <w:r>
+              <w:rPr>
+                <w:sz w:val="16"/>
+              </w:rPr>
+              <w:t>2/2</w:t>
+            </w:r>
+          </w:p>
+        </w:tc>
+      </w:tr>
+    </w:tbl>
+    <w:p>
+      <w:pPr>
+        <w:spacing w:after="40"/>
+      </w:pPr>
+    </w:p>
+    <w:p>
+      <w:r>
+        <w:rPr>
+          <w:b/>
+        </w:rPr>
+        <w:t>What this changes.</w:t>
+      </w:r>
+      <w:r>
+        <w:t xml:space="preserve"> The intervention turns the correlational dose-response of Section 5.10 into a causal statement: with everything else fixed, moving the views apart restores a positive gain, and the size of that gain depends on the quality spread. It does not turn conditional weighting into a universal improvement. The conservative diversity effect is +0.0074, roughly one-thirteenth of the automatic full-corpus gain, and on UNSW the matched effect is below the 0.005 margin. The practical recommendation is therefore conditio</w:t>
+      </w:r>
+      <w:r>
+        <w:t xml:space="preserve">nal: if the deployment can afford </w:t>
+      </w:r>
+      <w:r>
+        <w:lastRenderedPageBreak/>
+        <w:t>disjoint views and the members remain competent, decorrelation is worth testing; if the views are shared or one member is much weaker, the gate is either inert or a quality selector.</w:t>
+      </w:r>
+    </w:p>
+    <w:p>
+      <w:pPr>
         <w:pStyle w:val="1"/>
       </w:pPr>
       <w:r>
@@ -11707,7 +12466,6 @@
         <w:pStyle w:val="21"/>
       </w:pPr>
       <w:r>
-        <w:lastRenderedPageBreak/>
         <w:t>6.1 Four failure conditions for conditional weighting</w:t>
       </w:r>
     </w:p>
@@ -11777,7 +12535,11 @@
         <w:t>first measure the weight entropy, then the prediction-disagreement rate, then the spread across member scores, and only then look at the performance difference.</w:t>
       </w:r>
       <w:r>
-        <w:t xml:space="preserve"> If entropy is close to 1 and the disagreement count is 0, further tuning of the gate will not help, because the problem does not lie in the gate. If the member scores span more than the difference you care about, the fusion is bounded by its weakest member and no weighting scheme will recover it.</w:t>
+        <w:t xml:space="preserve"> If entropy is close to 1 and the disagreement count is 0, further tuning of the gate will not help, because </w:t>
+      </w:r>
+      <w:r>
+        <w:lastRenderedPageBreak/>
+        <w:t>the problem does not lie in the gate. If the member scores span more than the difference you care about, the fusion is bounded by its weakest member and no weighting scheme will recover it.</w:t>
       </w:r>
     </w:p>
     <w:p>
@@ -11814,7 +12576,6 @@
         <w:rPr>
           <w:b/>
         </w:rPr>
-        <w:lastRenderedPageBreak/>
         <w:t>Split noise.</w:t>
       </w:r>
       <w:r>
@@ -11905,6 +12666,11 @@
       </w:r>
     </w:p>
     <w:p>
+      <w:r>
+        <w:t>The intervention of Section 5.11 sharpens this threshold. It shows that the attribution constraint is not only diagnostic: when the views are forced apart, the same gate that was inert on shared views produces a positive gain, and that gain is largest at an intermediate quality spread. A reported weighting gain can therefore be genuine and still be conditional on the member geometry; the five factors above determine whether that geometry is present or accidentally removed.</w:t>
+      </w:r>
+    </w:p>
+    <w:p>
       <w:pPr>
         <w:pStyle w:val="21"/>
       </w:pPr>
@@ -11914,7 +12680,7 @@
     </w:p>
     <w:p>
       <w:r>
-        <w:t>Table 8 converts the evidence of this study into engineering guidance. Each recommendation carries an explicit cost; no option dominates across all objectives.</w:t>
+        <w:t>Table 9 converts the evidence of this study into engineering guidance. Each recommendation carries an explicit cost; no option dominates across all objectives.</w:t>
       </w:r>
     </w:p>
     <w:p>
@@ -11922,7 +12688,7 @@
         <w:rPr>
           <w:b/>
         </w:rPr>
-        <w:t>Table 8. Decision matrix for practical objectives</w:t>
+        <w:t>Table 9. Decision matrix for practical objectives</w:t>
       </w:r>
     </w:p>
     <w:tbl>
@@ -12292,6 +13058,7 @@
               <w:rPr>
                 <w:sz w:val="16"/>
               </w:rPr>
+              <w:lastRenderedPageBreak/>
               <w:t>Cross-file or cross-scenario evaluation</w:t>
             </w:r>
           </w:p>
@@ -12508,7 +13275,6 @@
         <w:rPr>
           <w:b/>
         </w:rPr>
-        <w:lastRenderedPageBreak/>
         <w:t>A raw-to-final counting chain</w:t>
       </w:r>
       <w:r>
@@ -12680,7 +13446,11 @@
         <w:t>The diversity evidence is associational.</w:t>
       </w:r>
       <w:r>
-        <w:t xml:space="preserve"> The dose-response relation rests on fifteen constructed expert configurations evaluated with three-fold cross-fitting; it shows that the gain moves with expert disagreement, not that disagreement alone causes a gain. The one intervention that was run is on the model side: replacing the gate's logistic risk model with a gradient-boosted ensemble leaves the gain at +0.000050, well inside the margin (Section 5.3). A data-level intervention that makes the experts genuinely dissimilar without changing anything </w:t>
+        <w:t xml:space="preserve"> The dose-response relation rests on fifteen constructed expert configurations evaluated with three-fold cross-fitting; it shows that the gain moves with expert disagreement, not that disagreement alone causes a gain. The one intervention that was run is on the model side: replacing the gate's logistic risk model with a gradient-boosted ensemble leaves the gain at +0.000050, well inside the margin (Section </w:t>
+      </w:r>
+      <w:r>
+        <w:lastRenderedPageBreak/>
+        <w:t xml:space="preserve">5.3). A data-level intervention that makes the experts genuinely dissimilar without changing anything </w:t>
       </w:r>
       <w:r>
         <w:t>else remains untested.</w:t>
@@ -12716,11 +13486,7 @@
         <w:t>The equivalence depends on how the population is built.</w:t>
       </w:r>
       <w:r>
-        <w:t xml:space="preserve"> It holds on the 53,237-flow natural-prior population and on the 7.8-fold larger one, but not on the fully uncapped 2,429,503-flow CIC-IDS2017 corpus, where the same comparison becomes a small, consistent deficit (-0.005533). That deficit did not reproduce on modern corpora: </w:t>
-      </w:r>
-      <w:r>
-        <w:lastRenderedPageBreak/>
-        <w:t>CIC-IoT-2023 differs by -0.000004 at 2,460,000 training rows and the uncapped Gotham-2025 by +0.000009 at 14,250,000 training rows and 7,190,000 test rows, on all ten seeds. The statement must still be quoted with its population, but it</w:t>
+        <w:t xml:space="preserve"> It holds on the 53,237-flow natural-prior population and on the 7.8-fold larger one, but not on the fully uncapped 2,429,503-flow CIC-IDS2017 corpus, where the same comparison becomes a small, consistent deficit (-0.005533). That deficit did not reproduce on modern corpora: CIC-IoT-2023 differs by -0.000004 at 2,460,000 training rows and the uncapped Gotham-2025 by +0.000009 at 14,250,000 training rows and 7,190,000 test rows, on all ten seeds. The statement must still be quoted with its population, but it</w:t>
       </w:r>
       <w:r>
         <w:t xml:space="preserve"> is not mechanically broken by corpus vintage or training scale; what governs it is member interchangeability, quantified by the feature-budget sweep (k=8 +0.001663 down to k=32 -0.000002) and the mechanism suite (0-12 relabelled rows, weights in 0.0091-0.0102 against the 0.01 uniform value).</w:t>
@@ -12784,7 +13550,11 @@
         <w:t xml:space="preserve"> The conclusions are conditional on CIC-IDS2017 (capped populations and the full deduplicated corpus), NSL-KDD, UNSW-NB15 and N-BaIoT; CIC-IDS2018, CIC-IoT-2023, LITNET-2020, IoT-23, RT-IoT2022, ACI-IoT-2023 and the recent corpora (from UAVIDS-2025 and GeNIS in early 2025 to CTU-IDSEVAL-6, 6TiSCHSet-2026 and the RTN packet table in 2026) were added as extension corpora (Section 5.8) and reproduce the primary comparison. N-BaIoT is saturated for flow-feature classifiers (every model at or above 0.9998 Macro-</w:t>
       </w:r>
       <w:r>
-        <w:t>F1), so it probes the mechanics of the aggregation step rather than discrimination difficulty, and the external datasets remain independent native-label benchmarks rather than transfer tests. None of the seventeen represents production traffic. The source record of every extension corpus is cited in the reference list [61-73]. Pooling the twelve published in 2020 or later gives 120 seed-level comparisons whose 90% interval, [-0.000006, +0.000020] on a mean of +0.000007, lies inside the 0.005 margin - so the</w:t>
+        <w:t xml:space="preserve">F1), so it probes the mechanics of the aggregation step rather than discrimination difficulty, and the external datasets remain independent </w:t>
+      </w:r>
+      <w:r>
+        <w:lastRenderedPageBreak/>
+        <w:t>native-label benchmarks rather than transfer tests. None of the seventeen represents production traffic. The source record of every extension corpus is cited in the reference list [61-73]. Pooling the twelve published in 2020 or later gives 120 seed-level comparisons whose 90% interval, [-0.000006, +0.000020] on a mean of +0.000007, lies inside the 0.005 margin - so the</w:t>
       </w:r>
       <w:r>
         <w:t xml:space="preserve"> equivalence claim does not rest on the 2017 corpus alone. A day-level split of CIC-IDS2017 is constructible, but every capture day carries only a subset of the five classes (Monday Normal only; Tuesday Normal and Brute Force; Wednesday Normal and DoS/DDoS; Thursday adds Web Attack; Friday adds Bot), so it is not category-complete: the measured day-holdout Macro-F1 collapses to 0.13-0.32 across the five days, which is what that limitation now quantifies.</w:t>
@@ -12806,7 +13576,6 @@
         <w:rPr>
           <w:b/>
         </w:rPr>
-        <w:lastRenderedPageBreak/>
         <w:t>Unknown-family support is uneven.</w:t>
       </w:r>
       <w:r>
@@ -12881,7 +13650,11 @@
         <w:t xml:space="preserve"> On the natural-prior population of CIC-IDS2017 (53,237 flows, 20,000 per class), the ten-seed Macro-F1 difference between conditional weighting and a matched equal-weight chi-square forest is -0.000456, with the per-seed sign split five to five. Against the equal-weight fusion of the same four experts the gated model changes one label in 79,860 test predictions, which locates the single-view gap in the composition of the ensemble rather than in the gate. Both the seed-level 90% interval [-0.00112, +0.00021</w:t>
       </w:r>
       <w:r>
-        <w:t>] and the test-row paired bootstrap interval [-0.00425, +0.00338] lie inside the 0.005 and 0.01 equivalence margins. Raising the cap to 200,000 per class (413,209 flows) reproduces the equivalence: -0.001137, 90% interval [-0.002966, +0.000692]. Removing the cap entirely (2,429,503 flows) breaks it: -0.005533, 90% interval [-0.007179, -0.003886], all ten seeds negative, not equivalent at 0.005, at a 175-fold training cost. The same estimator pair therefore supports opposite conclusions depending on one prep</w:t>
+        <w:t xml:space="preserve">] and the test-row paired bootstrap interval [-0.00425, +0.00338] lie inside the 0.005 and 0.01 equivalence margins. Raising the cap to 200,000 per class (413,209 flows) reproduces the equivalence: -0.001137, 90% interval [-0.002966, +0.000692]. Removing the cap entirely (2,429,503 flows) breaks </w:t>
+      </w:r>
+      <w:r>
+        <w:lastRenderedPageBreak/>
+        <w:t>it: -0.005533, 90% interval [-0.007179, -0.003886], all ten seeds negative, not equivalent at 0.005, at a 175-fold training cost. The same estimator pair therefore supports opposite conclusions depending on one prep</w:t>
       </w:r>
       <w:r>
         <w:t>rocessing choice that is rarely reported as a design decision.</w:t>
@@ -12898,11 +13671,7 @@
         <w:t xml:space="preserve"> The gate is inert: it changes one label in 79,860 same-member predictions, normalised weight entropy is 0.99998, and under a row-wise margin-to-perturbation bound 99.91% of 23,958 test rows are provably invariant. What changes along the ladder is the dispersion in quality among the members. The full-feature view trails the chi-square view by 0.002068, 0.004249 and 0.021397 on the three rungs; dividing each gap by the four members predicts 0.000517, 0.001062 and 0.005349 against measured differences of -0.0</w:t>
       </w:r>
       <w:r>
-        <w:t xml:space="preserve">00456, -0.001137 and -0.005533, within 14% across a 46-fold range. Condition D is thus not a post-hoc explanation but a quantitative forecast. The diversity experiment points the same way: two low-diversity expert sets gain exactly zero in six of six runs, three decorrelated sets gain positively in nine of nine, </w:t>
-      </w:r>
-      <w:r>
-        <w:lastRenderedPageBreak/>
-        <w:t>with slope 0.0646 and Pearson r = 0.749. Conditional weighting is not mistuned; its premise - experts that disagree where it matters - is absent in the capped, filter-based regime.</w:t>
+        <w:t>00456, -0.001137 and -0.005533, within 14% across a 46-fold range. Condition D is thus not a post-hoc explanation but a quantitative forecast. The diversity experiment points the same way: two low-diversity expert sets gain exactly zero in six of six runs, three decorrelated sets gain positively in nine of nine, with slope 0.0646 and Pearson r = 0.749. Conditional weighting is not mistuned; its premise - experts that disagree where it matters - is absent in the capped, filter-based regime.</w:t>
       </w:r>
     </w:p>
     <w:p>
@@ -12930,13 +13699,10 @@
     </w:p>
     <w:p>
       <w:r>
-        <w:t>The principal contribution is not a new state-of-the-art classifier. It is a three-rung scale ladder that makes the population dependence of an equivalence claim visible, a mechanism that predicts both the inertness of the gate and the magnitude of the deficit once member quality diverges, and a reusable leakage-controlled protocol with falsifiable identifiability boundaries. Three directions follow. First, design weighting mechanisms that explicitly enforce expert decorrelation, and test whether the gain i</w:t>
-      </w:r>
-      <w:r>
-        <w:t>s restored once the premise of Condition 1 is broken - the dose-response result supplies the target regime, but the intervention remains to be built and validated. Second, construct category-complete temporal or cross-scenario protocols so that file-level coverage analysis can be upgraded into a genuine external-validity test. Third, turn the reporting recommendations of Section 6.4 into an automatically checkable checklist, so that the evaluation protocol itself becomes a verifiable object, and require eve</w:t>
-      </w:r>
-      <w:r>
-        <w:t>ry headline comparison to state its rung.</w:t>
+        <w:t>The principal contribution is not a new state-of-the-art classifier. It is a three-rung scale ladder that makes the population dependence of an equivalence claim visible, a mechanism that predicts both the inertness of the gate and the magnitude of the deficit, and a controlled intervention that restores a gain when the views are forced apart. Three directions follow. First, extend the decorrelation intervention to temporal and cross-scenario protocols, where members can be made to disagree for reasons othe</w:t>
+      </w:r>
+      <w:r>
+        <w:t>r than feature partitioning. Second, turn the reporting recommendations of Section 6.4 into an automatically checkable checklist, so that the evaluation protocol itself becomes a verifiable object, and require every headline comparison to state its rung. Third, test whether the quality-gradient peak near 0.02 transfers to other modalities, since it is a quantitative design target for ensemble weighting rather than a property of one corpus.</w:t>
       </w:r>
     </w:p>
     <w:p>
@@ -12949,7 +13715,7 @@
     </w:p>
     <w:p>
       <w:r>
-        <w:t>Processing scripts, audit intermediates, per-row predictions and figure-generation code are released at https://github.com/linran-muxue/leakage-controlled-nids-study (release v1.11.0, tag v1.11.0). Raw datasets are not redistributed; the paper records source URLs, retrieval dates, version snapshots and SHA-256 checksums.</w:t>
+        <w:t>Processing scripts, audit intermediates, per-row predictions and figure-generation code are released at https://github.com/linran-muxue/leakage-controlled-nids-study (release v1.11.2, tag v1.11.2). Raw datasets are not redistributed; the paper records source URLs, retrieval dates, version snapshots and SHA-256 checksums.</w:t>
       </w:r>
     </w:p>
     <w:p>
@@ -12970,6 +13736,7 @@
         <w:pStyle w:val="1"/>
       </w:pPr>
       <w:r>
+        <w:lastRenderedPageBreak/>
         <w:t>Declaration of competing interest</w:t>
       </w:r>
     </w:p>
@@ -12994,7 +13761,6 @@
         <w:pStyle w:val="1"/>
       </w:pPr>
       <w:r>
-        <w:lastRenderedPageBreak/>
         <w:t>Declaration of generative AI and AI-assisted technologies</w:t>
       </w:r>
     </w:p>
@@ -13158,6 +13924,7 @@
         </w:numPr>
       </w:pPr>
       <w:r>
+        <w:lastRenderedPageBreak/>
         <w:t>Ting K M, Witten I H. Issues in stacked generalization. Journal of Artificial Intelligence Research, 1999, 10: 271-289. DOI:10.1613/jair.594.</w:t>
       </w:r>
     </w:p>
@@ -13218,7 +13985,6 @@
         </w:numPr>
       </w:pPr>
       <w:r>
-        <w:lastRenderedPageBreak/>
         <w:t>Moustafa N, Slay J. UNSW-NB15: A comprehensive data set for network intrusion detection systems. MilCIS 2015: 1-6. DOI:10.1109/MilCIS.2015.7348942.</w:t>
       </w:r>
     </w:p>
@@ -13399,6 +14165,7 @@
         </w:numPr>
       </w:pPr>
       <w:r>
+        <w:lastRenderedPageBreak/>
         <w:t>Lakshminarayanan B, Pritzel A, Blundell C. Simple and scalable predictive uncertainty estimation using deep ensembles. NeurIPS 2017: 6402-6413. [no DOI; NeurIPS proceedings]</w:t>
       </w:r>
     </w:p>
@@ -13471,7 +14238,6 @@
         </w:numPr>
       </w:pPr>
       <w:r>
-        <w:lastRenderedPageBreak/>
         <w:t>Dietterich T G. Approximate statistical tests for comparing supervised classification learning algorithms. Neural Computation, 1998, 10(7): 1895-1923. DOI:10.1162/089976698300017197.</w:t>
       </w:r>
     </w:p>
@@ -13664,6 +14430,7 @@
         </w:numPr>
       </w:pPr>
       <w:r>
+        <w:lastRenderedPageBreak/>
         <w:t>Garrido-Labrador J L, et al. Ensemble methods and semi-supervised learning for information fusion: A review and future research directions. Information Fusion, 2024. DOI:10.1016/j.inffus.2024.102310.</w:t>
       </w:r>
     </w:p>
@@ -13724,7 +14491,6 @@
         </w:numPr>
       </w:pPr>
       <w:r>
-        <w:lastRenderedPageBreak/>
         <w:t>Chen Y, et al. Causal inference-based adversarial domain adaptation for cross-domain industrial intrusion detection. IEEE Transactions on Industrial Informatics, 2024. DOI:10.1109/TII.2024.3470902.</w:t>
       </w:r>
     </w:p>
@@ -13913,6 +14679,7 @@
         <w:pStyle w:val="1"/>
       </w:pPr>
       <w:r>
+        <w:lastRenderedPageBreak/>
         <w:t>Supplementary material</w:t>
       </w:r>
     </w:p>
@@ -14187,7 +14954,6 @@
               <w:rPr>
                 <w:sz w:val="16"/>
               </w:rPr>
-              <w:lastRenderedPageBreak/>
               <w:t>S07</w:t>
             </w:r>
           </w:p>
@@ -15231,76 +15997,76 @@
       </w:rPr>
     </w:lvl>
   </w:abstractNum>
-  <w:num w:numId="1" w16cid:durableId="2083016456">
+  <w:num w:numId="1" w16cid:durableId="1521355902">
     <w:abstractNumId w:val="8"/>
   </w:num>
-  <w:num w:numId="2" w16cid:durableId="29187121">
+  <w:num w:numId="2" w16cid:durableId="595335026">
     <w:abstractNumId w:val="6"/>
   </w:num>
-  <w:num w:numId="3" w16cid:durableId="552545693">
+  <w:num w:numId="3" w16cid:durableId="315914556">
     <w:abstractNumId w:val="5"/>
   </w:num>
-  <w:num w:numId="4" w16cid:durableId="1986814455">
+  <w:num w:numId="4" w16cid:durableId="1984895083">
     <w:abstractNumId w:val="4"/>
   </w:num>
-  <w:num w:numId="5" w16cid:durableId="1752197671">
+  <w:num w:numId="5" w16cid:durableId="579675758">
     <w:abstractNumId w:val="7"/>
   </w:num>
-  <w:num w:numId="6" w16cid:durableId="56898538">
+  <w:num w:numId="6" w16cid:durableId="699015736">
     <w:abstractNumId w:val="3"/>
   </w:num>
-  <w:num w:numId="7" w16cid:durableId="341396051">
+  <w:num w:numId="7" w16cid:durableId="1690061078">
     <w:abstractNumId w:val="2"/>
   </w:num>
-  <w:num w:numId="8" w16cid:durableId="2017460456">
+  <w:num w:numId="8" w16cid:durableId="2036029325">
     <w:abstractNumId w:val="1"/>
   </w:num>
-  <w:num w:numId="9" w16cid:durableId="975911729">
+  <w:num w:numId="9" w16cid:durableId="477186456">
     <w:abstractNumId w:val="0"/>
   </w:num>
-  <w:num w:numId="10" w16cid:durableId="372465405">
+  <w:num w:numId="10" w16cid:durableId="956134495">
     <w:abstractNumId w:val="7"/>
     <w:lvlOverride w:ilvl="0">
       <w:startOverride w:val="1"/>
     </w:lvlOverride>
   </w:num>
-  <w:num w:numId="11" w16cid:durableId="1165703840">
+  <w:num w:numId="11" w16cid:durableId="1728411579">
     <w:abstractNumId w:val="7"/>
     <w:lvlOverride w:ilvl="0">
       <w:startOverride w:val="1"/>
     </w:lvlOverride>
   </w:num>
-  <w:num w:numId="12" w16cid:durableId="1809784225">
+  <w:num w:numId="12" w16cid:durableId="892160438">
     <w:abstractNumId w:val="7"/>
     <w:lvlOverride w:ilvl="0">
       <w:startOverride w:val="1"/>
     </w:lvlOverride>
   </w:num>
-  <w:num w:numId="13" w16cid:durableId="1862358937">
+  <w:num w:numId="13" w16cid:durableId="1421679970">
     <w:abstractNumId w:val="7"/>
     <w:lvlOverride w:ilvl="0">
       <w:startOverride w:val="1"/>
     </w:lvlOverride>
   </w:num>
-  <w:num w:numId="14" w16cid:durableId="1808812366">
+  <w:num w:numId="14" w16cid:durableId="1443452495">
     <w:abstractNumId w:val="7"/>
     <w:lvlOverride w:ilvl="0">
       <w:startOverride w:val="1"/>
     </w:lvlOverride>
   </w:num>
-  <w:num w:numId="15" w16cid:durableId="743724373">
+  <w:num w:numId="15" w16cid:durableId="1887831612">
     <w:abstractNumId w:val="7"/>
     <w:lvlOverride w:ilvl="0">
       <w:startOverride w:val="1"/>
     </w:lvlOverride>
   </w:num>
-  <w:num w:numId="16" w16cid:durableId="1550410855">
+  <w:num w:numId="16" w16cid:durableId="600264511">
     <w:abstractNumId w:val="7"/>
     <w:lvlOverride w:ilvl="0">
       <w:startOverride w:val="1"/>
     </w:lvlOverride>
   </w:num>
-  <w:num w:numId="17" w16cid:durableId="138620445">
+  <w:num w:numId="17" w16cid:durableId="1376126579">
     <w:abstractNumId w:val="7"/>
     <w:lvlOverride w:ilvl="0">
       <w:startOverride w:val="1"/>

</xml_diff>

<commit_message>
Round 23: add data-processing result panels and a complete experimental workflow figure
</commit_message>
<xml_diff>
--- a/重构版论文_v4_20260915/English_SCI_Manuscript_v4.docx
+++ b/重构版论文_v4_20260915/English_SCI_Manuscript_v4.docx
@@ -1155,8 +1155,8 @@
           <w:noProof/>
         </w:rPr>
         <w:drawing>
-          <wp:inline distT="0" distB="0" distL="0" distR="0" wp14:anchorId="3722B269" wp14:editId="49233A4A">
-            <wp:extent cx="5760720" cy="2734826"/>
+          <wp:inline distT="0" distB="0" distL="0" distR="0" wp14:anchorId="51CEA3BE" wp14:editId="7F6C98D8">
+            <wp:extent cx="5760720" cy="3434071"/>
             <wp:effectExtent l="0" t="0" r="0" b="0"/>
             <wp:docPr id="1" name="Picture 1"/>
             <wp:cNvGraphicFramePr>
@@ -1178,7 +1178,7 @@
                   <pic:spPr>
                     <a:xfrm>
                       <a:off x="0" y="0"/>
-                      <a:ext cx="5760720" cy="2734826"/>
+                      <a:ext cx="5760720" cy="3434071"/>
                     </a:xfrm>
                     <a:prstGeom prst="rect">
                       <a:avLst/>
@@ -1201,7 +1201,7 @@
           <w:color w:val="404040"/>
           <w:sz w:val="18"/>
         </w:rPr>
-        <w:t>Figure 1. Leakage-controlled research framework and information boundary</w:t>
+        <w:t>Figure 1. End-to-end experimental workflow: data audit, leakage-controlled modelling, conditional gating, EDG intervention and statistical validation</w:t>
       </w:r>
     </w:p>
     <w:p>
@@ -1441,7 +1441,14 @@
               <w:rPr>
                 <w:sz w:val="16"/>
               </w:rPr>
-              <w:t>No SPDX identifier shown; used under page terms with citation</w:t>
+              <w:t xml:space="preserve">No SPDX identifier shown; used under page terms with </w:t>
+            </w:r>
+            <w:r>
+              <w:rPr>
+                <w:sz w:val="16"/>
+              </w:rPr>
+              <w:lastRenderedPageBreak/>
+              <w:t>citation</w:t>
             </w:r>
           </w:p>
         </w:tc>
@@ -1457,6 +1464,7 @@
               <w:rPr>
                 <w:sz w:val="16"/>
               </w:rPr>
+              <w:lastRenderedPageBreak/>
               <w:t>SHA-256 and MD5 recorded (Table S1)</w:t>
             </w:r>
           </w:p>
@@ -1589,14 +1597,7 @@
               <w:rPr>
                 <w:sz w:val="16"/>
               </w:rPr>
-              <w:t xml:space="preserve">UNSW Canberra </w:t>
-            </w:r>
-            <w:r>
-              <w:rPr>
-                <w:sz w:val="16"/>
-              </w:rPr>
-              <w:lastRenderedPageBreak/>
-              <w:t>Cyber, official project page</w:t>
+              <w:t>UNSW Canberra Cyber, official project page</w:t>
             </w:r>
           </w:p>
         </w:tc>
@@ -1612,15 +1613,7 @@
               <w:rPr>
                 <w:sz w:val="16"/>
               </w:rPr>
-              <w:lastRenderedPageBreak/>
-              <w:t xml:space="preserve">Official training and </w:t>
-            </w:r>
-            <w:r>
-              <w:rPr>
-                <w:sz w:val="16"/>
-              </w:rPr>
-              <w:lastRenderedPageBreak/>
-              <w:t>testing CSV</w:t>
+              <w:t>Official training and testing CSV</w:t>
             </w:r>
           </w:p>
         </w:tc>
@@ -1636,7 +1629,6 @@
               <w:rPr>
                 <w:sz w:val="16"/>
               </w:rPr>
-              <w:lastRenderedPageBreak/>
               <w:t>2026-09-04</w:t>
             </w:r>
           </w:p>
@@ -1653,14 +1645,7 @@
               <w:rPr>
                 <w:sz w:val="16"/>
               </w:rPr>
-              <w:t xml:space="preserve">Page requires citation </w:t>
-            </w:r>
-            <w:r>
-              <w:rPr>
-                <w:sz w:val="16"/>
-              </w:rPr>
-              <w:lastRenderedPageBreak/>
-              <w:t>of the original paper; no SPDX identifier</w:t>
+              <w:t>Page requires citation of the original paper; no SPDX identifier</w:t>
             </w:r>
           </w:p>
         </w:tc>
@@ -1676,15 +1661,7 @@
               <w:rPr>
                 <w:sz w:val="16"/>
               </w:rPr>
-              <w:lastRenderedPageBreak/>
-              <w:t xml:space="preserve">SHA-256 recorded </w:t>
-            </w:r>
-            <w:r>
-              <w:rPr>
-                <w:sz w:val="16"/>
-              </w:rPr>
-              <w:lastRenderedPageBreak/>
-              <w:t>for both files</w:t>
+              <w:t>SHA-256 recorded for both files</w:t>
             </w:r>
           </w:p>
         </w:tc>
@@ -1702,7 +1679,6 @@
               <w:rPr>
                 <w:sz w:val="16"/>
               </w:rPr>
-              <w:lastRenderedPageBreak/>
               <w:t>N-BaIoT</w:t>
             </w:r>
           </w:p>
@@ -1935,6 +1911,7 @@
                 <w:b/>
                 <w:sz w:val="16"/>
               </w:rPr>
+              <w:lastRenderedPageBreak/>
               <w:t>Stage</w:t>
             </w:r>
           </w:p>
@@ -2118,14 +2095,7 @@
               <w:rPr>
                 <w:sz w:val="16"/>
               </w:rPr>
-              <w:t xml:space="preserve">Five retained classes; PortScan, Infiltration and Heartbleed </w:t>
-            </w:r>
-            <w:r>
-              <w:rPr>
-                <w:sz w:val="16"/>
-              </w:rPr>
-              <w:lastRenderedPageBreak/>
-              <w:t>reserved for diagnostics</w:t>
+              <w:t>Five retained classes; PortScan, Infiltration and Heartbleed reserved for diagnostics</w:t>
             </w:r>
           </w:p>
         </w:tc>
@@ -2143,7 +2113,6 @@
               <w:rPr>
                 <w:sz w:val="16"/>
               </w:rPr>
-              <w:lastRenderedPageBreak/>
               <w:t>After non-finite removal</w:t>
             </w:r>
           </w:p>
@@ -2542,8 +2511,8 @@
           <w:noProof/>
         </w:rPr>
         <w:drawing>
-          <wp:inline distT="0" distB="0" distL="0" distR="0" wp14:anchorId="6780020C" wp14:editId="34DB660B">
-            <wp:extent cx="5760720" cy="2722098"/>
+          <wp:inline distT="0" distB="0" distL="0" distR="0" wp14:anchorId="04309B19" wp14:editId="57BAAEAD">
+            <wp:extent cx="5760720" cy="3297847"/>
             <wp:effectExtent l="0" t="0" r="0" b="0"/>
             <wp:docPr id="2" name="Picture 2"/>
             <wp:cNvGraphicFramePr>
@@ -2565,7 +2534,7 @@
                   <pic:spPr>
                     <a:xfrm>
                       <a:off x="0" y="0"/>
-                      <a:ext cx="5760720" cy="2722098"/>
+                      <a:ext cx="5760720" cy="3297847"/>
                     </a:xfrm>
                     <a:prstGeom prst="rect">
                       <a:avLst/>
@@ -2588,7 +2557,15 @@
           <w:color w:val="404040"/>
           <w:sz w:val="18"/>
         </w:rPr>
-        <w:t>Figure 2. CIC-IDS2017 audit chain (log scale)</w:t>
+        <w:t>Figure 2. CIC-IDS2017 data-processing results: stage retention, class composition, the three reported populations and the sources of removed records</w:t>
+      </w:r>
+    </w:p>
+    <w:p>
+      <w:r>
+        <w:t xml:space="preserve">Figure 2 reports the same audit as four linked views rather than a single count chain. Panel A shows the retention rate after every filter and makes the cost of the deduplication step explicit: 85.8% of raw records survive to the deduplicated corpus, but only 1.9% survive the 20,000-per-class cap. Panel B shows why the three rungs are different statistical objects: the 53,237-flow population keeps a 20,000-per-class ceiling and therefore a relatively balanced label mix, whereas the uncapped corpus is 86.2% </w:t>
+      </w:r>
+      <w:r>
+        <w:t>Normal and only 0.03% Web Attack. Panel C separates population size from test-set size, and Panel D attributes every removal to a named mechanism - excluded labels, duplicates, cross-label conflicts, non-finite values, physical-range violations and conflicting vectors - so that no aggregate reduction is left unexplained.</w:t>
       </w:r>
     </w:p>
     <w:p>
@@ -2596,6 +2573,7 @@
         <w:pStyle w:val="21"/>
       </w:pPr>
       <w:r>
+        <w:lastRenderedPageBreak/>
         <w:t>3.3 NSL-KDD and UNSW-NB15</w:t>
       </w:r>
     </w:p>
@@ -2632,7 +2610,6 @@
     </w:p>
     <w:p>
       <w:r>
-        <w:lastRenderedPageBreak/>
         <w:t>Because these label spaces are incompatible, the three sets of scores are never pooled or averaged here, and they are never interpreted as evidence of transfer. Their role is to act as pressure tests: a conclusion that holds only on CIC-IDS2017 should not be written as a general law.</w:t>
       </w:r>
     </w:p>
@@ -2760,6 +2737,7 @@
         <w:pStyle w:val="21"/>
       </w:pPr>
       <w:r>
+        <w:lastRenderedPageBreak/>
         <w:t>3.5 Estimands and statistical procedure</w:t>
       </w:r>
     </w:p>
@@ -2808,7 +2786,6 @@
     </w:p>
     <w:p>
       <w:r>
-        <w:lastRenderedPageBreak/>
         <w:t>Macro-F1 is the primary metric because Web Attack accounts for only 1.26% of the natural-prior population, so accuracy is dominated by the majority classes. Class-level reports, balanced accuracy and normalised confusion matrices are reported alongside it.</w:t>
       </w:r>
     </w:p>
@@ -2907,6 +2884,7 @@
     </w:p>
     <w:p>
       <w:r>
+        <w:lastRenderedPageBreak/>
         <w:t>Four feature views, rather than four different algorithms, are used deliberately: if the resulting experts are highly correlated, the conditions in Section 4.3 predict that the gate will be inert. The design therefore doubles as a stress test of the mechanism.</w:t>
       </w:r>
     </w:p>
@@ -2963,7 +2941,6 @@
         <w:rPr>
           <w:b/>
         </w:rPr>
-        <w:lastRenderedPageBreak/>
         <w:t>Step 2, risk models.</w:t>
       </w:r>
       <w:r>
@@ -3534,8 +3511,9 @@
         <w:rPr>
           <w:noProof/>
         </w:rPr>
+        <w:lastRenderedPageBreak/>
         <w:drawing>
-          <wp:inline distT="0" distB="0" distL="0" distR="0" wp14:anchorId="5FE68C1C" wp14:editId="2A99FF64">
+          <wp:inline distT="0" distB="0" distL="0" distR="0" wp14:anchorId="2FCBFD36" wp14:editId="3FBDDCB4">
             <wp:extent cx="5760720" cy="3482709"/>
             <wp:effectExtent l="0" t="0" r="0" b="0"/>
             <wp:docPr id="3" name="Picture 3"/>
@@ -3824,6 +3802,7 @@
     </w:p>
     <w:p>
       <w:r>
+        <w:lastRenderedPageBreak/>
         <w:t>This is the degenerate case. Real experts are not identical, so a weaker condition is required.</w:t>
       </w:r>
     </w:p>
@@ -4901,23 +4880,23 @@
         <w:pStyle w:val="21"/>
       </w:pPr>
       <w:r>
+        <w:t>4.4 Complexity</w:t>
+      </w:r>
+    </w:p>
+    <w:p>
+      <w:r>
+        <w:t>Let n be the number of training rows, d the original feature count, k the selected feature count, T the number of trees, K the number of cross-fitting folds and Q = 4 the number of experts. The dominant cost of the cross-fitting stage is approximately O(QK T n log n), the final refit stage costs O(QT n log n), and filter selection contributes O(Q n d). Inference requires one tree traversal per expert plus the risk models, about O(QT log n) per row. RCCF is therefore substantially more expensive than a singl</w:t>
+      </w:r>
+      <w:r>
+        <w:t>e equal-weight forest at both ends, and Section 5.6 quantifies that cost. All experiments ran on a single workstation with 8 physical cores (16 logical), 35.8 GB of RAM and Windows 10 (build 10.0.26200), using Python 3.11.4, scikit-learn 1.9.0, XGBoost 3.2.0, NumPy 2.4.6, pandas 3.0.5 and Matplotlib 3.11.1. The reported timings are single-machine measurements and are not portability claims. The software stack is documented in [44-47].</w:t>
+      </w:r>
+    </w:p>
+    <w:p>
+      <w:pPr>
+        <w:pStyle w:val="21"/>
+      </w:pPr>
+      <w:r>
         <w:lastRenderedPageBreak/>
-        <w:t>4.4 Complexity</w:t>
-      </w:r>
-    </w:p>
-    <w:p>
-      <w:r>
-        <w:t>Let n be the number of training rows, d the original feature count, k the selected feature count, T the number of trees, K the number of cross-fitting folds and Q = 4 the number of experts. The dominant cost of the cross-fitting stage is approximately O(QK T n log n), the final refit stage costs O(QT n log n), and filter selection contributes O(Q n d). Inference requires one tree traversal per expert plus the risk models, about O(QT log n) per row. RCCF is therefore substantially more expensive than a singl</w:t>
-      </w:r>
-      <w:r>
-        <w:t>e equal-weight forest at both ends, and Section 5.6 quantifies that cost. All experiments ran on a single workstation with 8 physical cores (16 logical), 35.8 GB of RAM and Windows 10 (build 10.0.26200), using Python 3.11.4, scikit-learn 1.9.0, XGBoost 3.2.0, NumPy 2.4.6, pandas 3.0.5 and Matplotlib 3.11.1. The reported timings are single-machine measurements and are not portability claims. The software stack is documented in [44-47].</w:t>
-      </w:r>
-    </w:p>
-    <w:p>
-      <w:pPr>
-        <w:pStyle w:val="21"/>
-      </w:pPr>
-      <w:r>
         <w:t>4.5 Controls and ablations</w:t>
       </w:r>
     </w:p>
@@ -5065,7 +5044,6 @@
     </w:p>
     <w:p>
       <w:r>
-        <w:lastRenderedPageBreak/>
         <w:t>The chi-square budget k was fixed at 60 on the validation partition from a pre-specified candidate set: validation Macro-F1 was 0.9175 at k = 10, 0.9314 at k = 20, 0.9379 at both k = 30 and k = 40, and 0.9413 at k = 60, flattening between k = 30 and k = 40. This search was carried out on the balanced control protocol; the selected k was then frozen for every final run.</w:t>
       </w:r>
     </w:p>
@@ -5372,6 +5350,7 @@
     </w:p>
     <w:p>
       <w:r>
+        <w:lastRenderedPageBreak/>
         <w:t xml:space="preserve">All three protocols agree: </w:t>
       </w:r>
       <w:r>
@@ -6822,7 +6801,6 @@
               <w:rPr>
                 <w:sz w:val="16"/>
               </w:rPr>
-              <w:lastRenderedPageBreak/>
               <w:t>Equal RF (full features)</w:t>
             </w:r>
           </w:p>
@@ -7276,7 +7254,14 @@
         <w:rPr>
           <w:b/>
         </w:rPr>
-        <w:t>-0.000456</w:t>
+        <w:t>-</w:t>
+      </w:r>
+      <w:r>
+        <w:rPr>
+          <w:b/>
+        </w:rPr>
+        <w:lastRenderedPageBreak/>
+        <w:t>0.000456</w:t>
       </w:r>
       <w:r>
         <w:t xml:space="preserve">, with five seeds favouring RCCF and five favouring the equal forest. Against the equal-weight fusion of the </w:t>
@@ -7321,7 +7306,7 @@
           <w:noProof/>
         </w:rPr>
         <w:drawing>
-          <wp:inline distT="0" distB="0" distL="0" distR="0" wp14:anchorId="70E76469" wp14:editId="7803FC1D">
+          <wp:inline distT="0" distB="0" distL="0" distR="0" wp14:anchorId="71C8C84B" wp14:editId="3EB8DC75">
             <wp:extent cx="5760720" cy="2356272"/>
             <wp:effectExtent l="0" t="0" r="0" b="0"/>
             <wp:docPr id="4" name="Picture 4"/>
@@ -7383,11 +7368,7 @@
         <w:t>Second, the paired statistics establish equivalence at a strict margin.</w:t>
       </w:r>
       <w:r>
-        <w:t xml:space="preserve"> With ten seeds the mean paired difference is -0.000456 with a standard deviation of 0.001152. Two interval estimates are reported because they answer different questions: the seed-level 90% interval [-0.001124, +0.000212] reflects model-to-model variability, while the test-row paired bootstrap interval [-0.004251, +0.003382] reflects resampling uncertainty over the locked test set. Both lie inside equivalence margins of 0.005 and 0.01 Macro-F1, so equivalence can be asserted at alpha = 0.05 </w:t>
-      </w:r>
-      <w:r>
-        <w:lastRenderedPageBreak/>
-        <w:t xml:space="preserve">against either </w:t>
+        <w:t xml:space="preserve"> With ten seeds the mean paired difference is -0.000456 with a standard deviation of 0.001152. Two interval estimates are reported because they answer different questions: the seed-level 90% interval [-0.001124, +0.000212] reflects model-to-model variability, while the test-row paired bootstrap interval [-0.004251, +0.003382] reflects resampling uncertainty over the locked test set. Both lie inside equivalence margins of 0.005 and 0.01 Macro-F1, so equivalence can be asserted at alpha = 0.05 against either </w:t>
       </w:r>
       <w:r>
         <w:t xml:space="preserve">margin. This strengthens the three-seed analysis, for which the 0.005 margin was not attainable. The sign of the difference is split five to five across seeds, and exact McNemar tests on the test rows are non-significant. Under the pre-declared decision rule - stable, consistent in sign, and bounded away from zero - </w:t>
@@ -7817,6 +7798,7 @@
               <w:rPr>
                 <w:sz w:val="16"/>
               </w:rPr>
+              <w:lastRenderedPageBreak/>
               <w:t>RCCF - equal RF (all features)</w:t>
             </w:r>
           </w:p>
@@ -8229,11 +8211,7 @@
         <w:t>Fifth, a neural baseline shows how badly accuracy can mislead.</w:t>
       </w:r>
       <w:r>
-        <w:t xml:space="preserve"> A multilayer perceptron given the same feature budget and a full training budget (128 hidden units, hyper-parameters selected on the validation partition) reaches 0.97679 accuracy against RCCF's 0.97792, but only 0.797654 Macro-F1 against 0.889955, i.e. 0.092 lower. Its balanced accuracy is 0.79666 against 0.94920 and its Brier score is 0.036701 against 0.006312. Every comparison </w:t>
-      </w:r>
-      <w:r>
-        <w:lastRenderedPageBreak/>
-        <w:t>in this paragraph is computed on the three seeds common to both runs (42, 2024, 3407), the seeds on which the neural baseline wa</w:t>
+        <w:t xml:space="preserve"> A multilayer perceptron given the same feature budget and a full training budget (128 hidden units, hyper-parameters selected on the validation partition) reaches 0.97679 accuracy against RCCF's 0.97792, but only 0.797654 Macro-F1 against 0.889955, i.e. 0.092 lower. Its balanced accuracy is 0.79666 against 0.94920 and its Brier score is 0.036701 against 0.006312. Every comparison in this paragraph is computed on the three seeds common to both runs (42, 2024, 3407), the seeds on which the neural baseline wa</w:t>
       </w:r>
       <w:r>
         <w:t xml:space="preserve">s trained; Table 4(a) gives the corresponding ten-seed RCCF values. Notably, a paired McNemar test on overall correctness is not significant (pooled p = 0.383 over 23,958 rows; per-seed 1.000 / 0.768 / 0.261), because the two models make a similar </w:t>
@@ -8267,6 +8245,7 @@
         <w:pStyle w:val="21"/>
       </w:pPr>
       <w:r>
+        <w:lastRenderedPageBreak/>
         <w:t>5.3 Mechanism diagnostics: why the gate changes nothing, and when it can</w:t>
       </w:r>
     </w:p>
@@ -8284,7 +8263,7 @@
           <w:noProof/>
         </w:rPr>
         <w:drawing>
-          <wp:inline distT="0" distB="0" distL="0" distR="0" wp14:anchorId="4BEBDAFF" wp14:editId="323D4938">
+          <wp:inline distT="0" distB="0" distL="0" distR="0" wp14:anchorId="54EE4E0B" wp14:editId="5534D828">
             <wp:extent cx="5760720" cy="2045294"/>
             <wp:effectExtent l="0" t="0" r="0" b="0"/>
             <wp:docPr id="5" name="Picture 5"/>
@@ -8446,11 +8425,7 @@
         <w:t>3,469 to 5,038</w:t>
       </w:r>
       <w:r>
-        <w:t xml:space="preserve"> across </w:t>
-      </w:r>
-      <w:r>
-        <w:lastRenderedPageBreak/>
-        <w:t>seeds. In other words, fused probabilities are close to one-hot and the weight-induced probability movement is three orders of magnitude smaller than the decision margin.</w:t>
+        <w:t xml:space="preserve"> across seeds. In other words, fused probabilities are close to one-hot and the weight-induced probability movement is three orders of magnitude smaller than the decision margin.</w:t>
       </w:r>
     </w:p>
     <w:p>
@@ -8461,8 +8436,9 @@
         <w:rPr>
           <w:noProof/>
         </w:rPr>
+        <w:lastRenderedPageBreak/>
         <w:drawing>
-          <wp:inline distT="0" distB="0" distL="0" distR="0" wp14:anchorId="742EC85A" wp14:editId="41C90AD3">
+          <wp:inline distT="0" distB="0" distL="0" distR="0" wp14:anchorId="67556067" wp14:editId="51604282">
             <wp:extent cx="5760720" cy="2308234"/>
             <wp:effectExtent l="0" t="0" r="0" b="0"/>
             <wp:docPr id="6" name="Picture 6"/>
@@ -9093,7 +9069,6 @@
               <w:rPr>
                 <w:sz w:val="16"/>
               </w:rPr>
-              <w:lastRenderedPageBreak/>
               <w:t>Disjoint feature blocks</w:t>
             </w:r>
           </w:p>
@@ -9193,8 +9168,9 @@
         <w:rPr>
           <w:noProof/>
         </w:rPr>
+        <w:lastRenderedPageBreak/>
         <w:drawing>
-          <wp:inline distT="0" distB="0" distL="0" distR="0" wp14:anchorId="58B10A4E" wp14:editId="1AE54162">
+          <wp:inline distT="0" distB="0" distL="0" distR="0" wp14:anchorId="74E44F10" wp14:editId="75BA10D8">
             <wp:extent cx="5760720" cy="2167923"/>
             <wp:effectExtent l="0" t="0" r="0" b="0"/>
             <wp:docPr id="7" name="Picture 7"/>
@@ -9355,7 +9331,6 @@
         <w:pStyle w:val="21"/>
       </w:pPr>
       <w:r>
-        <w:lastRenderedPageBreak/>
         <w:t>5.4 RQ3: Protocol effects exceed aggregation-rule differences by an order of magnitude</w:t>
       </w:r>
     </w:p>
@@ -9372,8 +9347,9 @@
         <w:rPr>
           <w:noProof/>
         </w:rPr>
+        <w:lastRenderedPageBreak/>
         <w:drawing>
-          <wp:inline distT="0" distB="0" distL="0" distR="0" wp14:anchorId="680A076B" wp14:editId="63CB8443">
+          <wp:inline distT="0" distB="0" distL="0" distR="0" wp14:anchorId="7E252E5E" wp14:editId="7370CEBF">
             <wp:extent cx="5760720" cy="2258878"/>
             <wp:effectExtent l="0" t="0" r="0" b="0"/>
             <wp:docPr id="8" name="Picture 8"/>
@@ -9528,23 +9504,20 @@
         <w:t>families</w:t>
       </w:r>
       <w:r>
-        <w:t xml:space="preserve"> are larger: the multilayer perceptron trails the forests by 0.0916 Macro-F1 and extremely randomised trees by 0.0318, both of which exceed the class-</w:t>
-      </w:r>
+        <w:t xml:space="preserve"> are larger: the multilayer perceptron trails the forests by 0.0916 Macro-F1 and extremely randomised trees by 0.0318, both of which exceed the class-prior effect of 0.0725 in the first case. The defensible statement is therefore that aggregation-rule differences are dominated by protocol choices, whereas model-family differences are not.</w:t>
+      </w:r>
+    </w:p>
+    <w:p>
+      <w:r>
+        <w:t>The protocol-sensitivity runs and the nested cross-validation fold metrics are provided in Supplementary S10-S11.</w:t>
+      </w:r>
+    </w:p>
+    <w:p>
+      <w:pPr>
+        <w:pStyle w:val="21"/>
+      </w:pPr>
       <w:r>
         <w:lastRenderedPageBreak/>
-        <w:t>prior effect of 0.0725 in the first case. The defensible statement is therefore that aggregation-rule differences are dominated by protocol choices, whereas model-family differences are not.</w:t>
-      </w:r>
-    </w:p>
-    <w:p>
-      <w:r>
-        <w:t>The protocol-sensitivity runs and the nested cross-validation fold metrics are provided in Supplementary S10-S11.</w:t>
-      </w:r>
-    </w:p>
-    <w:p>
-      <w:pPr>
-        <w:pStyle w:val="21"/>
-      </w:pPr>
-      <w:r>
         <w:t>5.5 RQ4: External validity and file-level extrapolation</w:t>
       </w:r>
     </w:p>
@@ -9557,7 +9530,7 @@
           <w:noProof/>
         </w:rPr>
         <w:drawing>
-          <wp:inline distT="0" distB="0" distL="0" distR="0" wp14:anchorId="119DE9DD" wp14:editId="72218FDC">
+          <wp:inline distT="0" distB="0" distL="0" distR="0" wp14:anchorId="49B8664E" wp14:editId="42398DFC">
             <wp:extent cx="5760720" cy="2516852"/>
             <wp:effectExtent l="0" t="0" r="0" b="0"/>
             <wp:docPr id="9" name="Picture 9"/>
@@ -9673,15 +9646,15 @@
     </w:p>
     <w:p>
       <w:r>
+        <w:t>The external benchmarks, the file-level extrapolation and the neural baseline comparison are provided in Supplementary S12-S14 and S19.</w:t>
+      </w:r>
+    </w:p>
+    <w:p>
+      <w:pPr>
+        <w:pStyle w:val="21"/>
+      </w:pPr>
+      <w:r>
         <w:lastRenderedPageBreak/>
-        <w:t>The external benchmarks, the file-level extrapolation and the neural baseline comparison are provided in Supplementary S12-S14 and S19.</w:t>
-      </w:r>
-    </w:p>
-    <w:p>
-      <w:pPr>
-        <w:pStyle w:val="21"/>
-      </w:pPr>
-      <w:r>
         <w:t>5.6 Secondary metrics: calibration, robustness, latency and open-set behaviour</w:t>
       </w:r>
     </w:p>
@@ -9694,7 +9667,7 @@
           <w:noProof/>
         </w:rPr>
         <w:drawing>
-          <wp:inline distT="0" distB="0" distL="0" distR="0" wp14:anchorId="0C98DD31" wp14:editId="5F6A546D">
+          <wp:inline distT="0" distB="0" distL="0" distR="0" wp14:anchorId="3508D99C" wp14:editId="2F910014">
             <wp:extent cx="5760720" cy="2223311"/>
             <wp:effectExtent l="0" t="0" r="0" b="0"/>
             <wp:docPr id="10" name="Picture 10"/>
@@ -9786,7 +9759,7 @@
         </w:rPr>
         <w:lastRenderedPageBreak/>
         <w:drawing>
-          <wp:inline distT="0" distB="0" distL="0" distR="0" wp14:anchorId="0D35B936" wp14:editId="610EF766">
+          <wp:inline distT="0" distB="0" distL="0" distR="0" wp14:anchorId="68BCC0E7" wp14:editId="2C413C41">
             <wp:extent cx="5760720" cy="2538527"/>
             <wp:effectExtent l="0" t="0" r="0" b="0"/>
             <wp:docPr id="11" name="Picture 11"/>
@@ -10786,7 +10759,7 @@
           <w:noProof/>
         </w:rPr>
         <w:drawing>
-          <wp:inline distT="0" distB="0" distL="0" distR="0" wp14:anchorId="1635F965" wp14:editId="2FAD5C67">
+          <wp:inline distT="0" distB="0" distL="0" distR="0" wp14:anchorId="5DB15763" wp14:editId="77725FA2">
             <wp:extent cx="5760720" cy="1441223"/>
             <wp:effectExtent l="0" t="0" r="0" b="0"/>
             <wp:docPr id="12" name="Picture 12"/>
@@ -13715,7 +13688,7 @@
     </w:p>
     <w:p>
       <w:r>
-        <w:t>Processing scripts, audit intermediates, per-row predictions and figure-generation code are released at https://github.com/linran-muxue/leakage-controlled-nids-study (release v1.11.2, tag v1.11.2). Raw datasets are not redistributed; the paper records source URLs, retrieval dates, version snapshots and SHA-256 checksums.</w:t>
+        <w:t>Processing scripts, audit intermediates, per-row predictions and figure-generation code are released at https://github.com/linran-muxue/leakage-controlled-nids-study (release v1.11.3, tag v1.11.3). Raw datasets are not redistributed; the paper records source URLs, retrieval dates, version snapshots and SHA-256 checksums.</w:t>
       </w:r>
     </w:p>
     <w:p>
@@ -15997,76 +15970,76 @@
       </w:rPr>
     </w:lvl>
   </w:abstractNum>
-  <w:num w:numId="1" w16cid:durableId="1521355902">
+  <w:num w:numId="1" w16cid:durableId="178551296">
     <w:abstractNumId w:val="8"/>
   </w:num>
-  <w:num w:numId="2" w16cid:durableId="595335026">
+  <w:num w:numId="2" w16cid:durableId="2004428794">
     <w:abstractNumId w:val="6"/>
   </w:num>
-  <w:num w:numId="3" w16cid:durableId="315914556">
+  <w:num w:numId="3" w16cid:durableId="1298415867">
     <w:abstractNumId w:val="5"/>
   </w:num>
-  <w:num w:numId="4" w16cid:durableId="1984895083">
+  <w:num w:numId="4" w16cid:durableId="1600719849">
     <w:abstractNumId w:val="4"/>
   </w:num>
-  <w:num w:numId="5" w16cid:durableId="579675758">
+  <w:num w:numId="5" w16cid:durableId="2064866706">
     <w:abstractNumId w:val="7"/>
   </w:num>
-  <w:num w:numId="6" w16cid:durableId="699015736">
+  <w:num w:numId="6" w16cid:durableId="424427163">
     <w:abstractNumId w:val="3"/>
   </w:num>
-  <w:num w:numId="7" w16cid:durableId="1690061078">
+  <w:num w:numId="7" w16cid:durableId="1799911952">
     <w:abstractNumId w:val="2"/>
   </w:num>
-  <w:num w:numId="8" w16cid:durableId="2036029325">
+  <w:num w:numId="8" w16cid:durableId="43068998">
     <w:abstractNumId w:val="1"/>
   </w:num>
-  <w:num w:numId="9" w16cid:durableId="477186456">
+  <w:num w:numId="9" w16cid:durableId="1026371108">
     <w:abstractNumId w:val="0"/>
   </w:num>
-  <w:num w:numId="10" w16cid:durableId="956134495">
+  <w:num w:numId="10" w16cid:durableId="180433015">
     <w:abstractNumId w:val="7"/>
     <w:lvlOverride w:ilvl="0">
       <w:startOverride w:val="1"/>
     </w:lvlOverride>
   </w:num>
-  <w:num w:numId="11" w16cid:durableId="1728411579">
+  <w:num w:numId="11" w16cid:durableId="753477887">
     <w:abstractNumId w:val="7"/>
     <w:lvlOverride w:ilvl="0">
       <w:startOverride w:val="1"/>
     </w:lvlOverride>
   </w:num>
-  <w:num w:numId="12" w16cid:durableId="892160438">
+  <w:num w:numId="12" w16cid:durableId="174195059">
     <w:abstractNumId w:val="7"/>
     <w:lvlOverride w:ilvl="0">
       <w:startOverride w:val="1"/>
     </w:lvlOverride>
   </w:num>
-  <w:num w:numId="13" w16cid:durableId="1421679970">
+  <w:num w:numId="13" w16cid:durableId="1603565424">
     <w:abstractNumId w:val="7"/>
     <w:lvlOverride w:ilvl="0">
       <w:startOverride w:val="1"/>
     </w:lvlOverride>
   </w:num>
-  <w:num w:numId="14" w16cid:durableId="1443452495">
+  <w:num w:numId="14" w16cid:durableId="635334329">
     <w:abstractNumId w:val="7"/>
     <w:lvlOverride w:ilvl="0">
       <w:startOverride w:val="1"/>
     </w:lvlOverride>
   </w:num>
-  <w:num w:numId="15" w16cid:durableId="1887831612">
+  <w:num w:numId="15" w16cid:durableId="1427339908">
     <w:abstractNumId w:val="7"/>
     <w:lvlOverride w:ilvl="0">
       <w:startOverride w:val="1"/>
     </w:lvlOverride>
   </w:num>
-  <w:num w:numId="16" w16cid:durableId="600264511">
+  <w:num w:numId="16" w16cid:durableId="440078883">
     <w:abstractNumId w:val="7"/>
     <w:lvlOverride w:ilvl="0">
       <w:startOverride w:val="1"/>
     </w:lvlOverride>
   </w:num>
-  <w:num w:numId="17" w16cid:durableId="1376126579">
+  <w:num w:numId="17" w16cid:durableId="1653482383">
     <w:abstractNumId w:val="7"/>
     <w:lvlOverride w:ilvl="0">
       <w:startOverride w:val="1"/>

</xml_diff>